<commit_message>
Expand v2: add qawaid section, objections replies, interpretation rules, customary-law basis (101 fn)
Co-authored-by: arena-agent <297053741+arena-agent@users.noreply.github.com>
</commit_message>
<xml_diff>
--- a/Resaleh_Sath3_Hadi_Shabestani_v2.docx
+++ b/Resaleh_Sath3_Hadi_Shabestani_v2.docx
@@ -4059,7 +4059,153 @@
           <w:sz w:val="32"/>
           <w:szCs w:val="32"/>
         </w:rPr>
-        <w:t>گفتار سوم: اصول قانون اساسی مرتبط</w:t>
+        <w:t>گفتار سوم: قواعد تفسیر معاهدات؛ فهم متن پیش از عمل</w:t>
+      </w:r>
+    </w:p>
+    <w:p>
+      <w:pPr>
+        <w:pStyle w:val="TH-Band"/>
+        <w:widowControl/>
+        <w:bidi w:val="1"/>
+        <w:spacing w:before="200" w:after="120" w:line="288" w:lineRule="auto"/>
+        <w:jc w:val="right"/>
+      </w:pPr>
+      <w:r>
+        <w:rPr>
+          <w:rFonts w:ascii="B Traffic" w:hAnsi="B Traffic" w:cs="B Traffic" w:eastAsia="B Traffic"/>
+          <w:b/>
+          <w:i w:val="0"/>
+          <w:sz w:val="28"/>
+          <w:szCs w:val="28"/>
+        </w:rPr>
+        <w:t>بند اول: قاعده عام تفسیر؛ متن، سیاق، هدف</w:t>
+      </w:r>
+    </w:p>
+    <w:p>
+      <w:pPr>
+        <w:pStyle w:val="TH-Body"/>
+        <w:widowControl/>
+        <w:bidi w:val="1"/>
+        <w:spacing w:before="0" w:after="120" w:line="288" w:lineRule="auto"/>
+        <w:jc w:val="both"/>
+      </w:pPr>
+      <w:r>
+        <w:rPr>
+          <w:rFonts w:ascii="B Lotus" w:hAnsi="B Lotus" w:cs="B Lotus" w:eastAsia="B Lotus"/>
+          <w:b w:val="0"/>
+          <w:i w:val="0"/>
+          <w:sz w:val="28"/>
+          <w:szCs w:val="28"/>
+        </w:rPr>
+        <w:t>پیش از این‌که از اجرا و نقض و خاتمه حرف بزنیم، باید بدانیم «معنای» معاهده چیست؛ چون تا ندانیم معاهده چه می‌گوید، نمی‌توانیم بگوییم اجرا شده یا نقض شده. کنوانسیون وین در مواد ۳۱ و ۳۲ قواعد تفسیر را بیان کرده و قاعده عامش در ماده ۳۱ آمده: معاهده باید «با حسن نیت» و «مطابق معنای متعارف الفاظ» و «در سیاقشان» و «در پرتو موضوع و هدفش» تفسیر شود.</w:t>
+      </w:r>
+      <w:r>
+        <w:rPr>
+          <w:rFonts w:ascii="B Lotus" w:hAnsi="B Lotus" w:cs="B Lotus" w:eastAsia="B Lotus"/>
+          <w:b w:val="0"/>
+          <w:i w:val="0"/>
+          <w:sz w:val="28"/>
+          <w:szCs w:val="28"/>
+          <w:vertAlign w:val="superscript"/>
+        </w:rPr>
+        <w:footnoteReference w:id="23"/>
+      </w:r>
+    </w:p>
+    <w:p>
+      <w:pPr>
+        <w:pStyle w:val="TH-Body"/>
+        <w:widowControl/>
+        <w:bidi w:val="1"/>
+        <w:spacing w:before="0" w:after="120" w:line="288" w:lineRule="auto"/>
+        <w:jc w:val="both"/>
+      </w:pPr>
+      <w:r>
+        <w:rPr>
+          <w:rFonts w:ascii="B Lotus" w:hAnsi="B Lotus" w:cs="B Lotus" w:eastAsia="B Lotus"/>
+          <w:b w:val="0"/>
+          <w:i w:val="0"/>
+          <w:sz w:val="28"/>
+          <w:szCs w:val="28"/>
+        </w:rPr>
+        <w:t>این قاعده چهارلایه، برای مسئله من دو کاربرد مستقیم دارد. کاربرد اول: وقتی حاکم می‌خواهد ببیند آیا رفتارش «نقض» است یا نه، باید اول معنای تعهد را با همین قواعد بفهمد؛ چه‌بسا رفتاری که در نگاه اول نقض به نظر می‌رسد، با تفسیر صحیح (مثلاً با توجه به سیاق یا هدف معاهده) نقض نباشد ـ و چه‌بسا برعکس. پس «تفسیر» مقدم بر «داوریِ نقض» است؛ و حاکمی که بدون تفسیرِ دقیق، حکم به جواز یا عدم جواز بدهد، عجله کرده. کاربرد دوم: اعلامیه‌های تفسیری دولت (راهبرد دوم فصل پنجم) دقیقاً در همین فرایند تفسیر اثر می‌گذارند؛ یعنی دولتی که از اول تفسیرش را ثبت کرده، در روز اختلاف دستِ پرتری دارد. پس تفسیر، نه بحثی آکادمیک و حاشیه‌ای، که ابزاری عملی در دست تصمیم‌گیر است.</w:t>
+      </w:r>
+    </w:p>
+    <w:p>
+      <w:pPr>
+        <w:pStyle w:val="TH-Band"/>
+        <w:widowControl/>
+        <w:bidi w:val="1"/>
+        <w:spacing w:before="200" w:after="120" w:line="288" w:lineRule="auto"/>
+        <w:jc w:val="right"/>
+      </w:pPr>
+      <w:r>
+        <w:rPr>
+          <w:rFonts w:ascii="B Traffic" w:hAnsi="B Traffic" w:cs="B Traffic" w:eastAsia="B Traffic"/>
+          <w:b/>
+          <w:i w:val="0"/>
+          <w:sz w:val="28"/>
+          <w:szCs w:val="28"/>
+        </w:rPr>
+        <w:t>بند دوم: نقش سوابق انعقاد و رفتار بعدی</w:t>
+      </w:r>
+    </w:p>
+    <w:p>
+      <w:pPr>
+        <w:pStyle w:val="TH-Body"/>
+        <w:widowControl/>
+        <w:bidi w:val="1"/>
+        <w:spacing w:before="0" w:after="120" w:line="288" w:lineRule="auto"/>
+        <w:jc w:val="both"/>
+      </w:pPr>
+      <w:r>
+        <w:rPr>
+          <w:rFonts w:ascii="B Lotus" w:hAnsi="B Lotus" w:cs="B Lotus" w:eastAsia="B Lotus"/>
+          <w:b w:val="0"/>
+          <w:i w:val="0"/>
+          <w:sz w:val="28"/>
+          <w:szCs w:val="28"/>
+        </w:rPr>
+        <w:t>ماده ۳۲ وین، «وسائل تکمیلی» تفسیر را هم پیش‌بینی کرده: سوابق انعقاد (مذاکرات، پیش‌نویس‌ها، صورت‌جلسات) و رفتار بعدی اطراف در اجرای معاهده.</w:t>
+      </w:r>
+      <w:r>
+        <w:rPr>
+          <w:rFonts w:ascii="B Lotus" w:hAnsi="B Lotus" w:cs="B Lotus" w:eastAsia="B Lotus"/>
+          <w:b w:val="0"/>
+          <w:i w:val="0"/>
+          <w:sz w:val="28"/>
+          <w:szCs w:val="28"/>
+          <w:vertAlign w:val="superscript"/>
+        </w:rPr>
+        <w:footnoteReference w:id="24"/>
+      </w:r>
+      <w:r>
+        <w:rPr>
+          <w:rFonts w:ascii="B Lotus" w:hAnsi="B Lotus" w:cs="B Lotus" w:eastAsia="B Lotus"/>
+          <w:b w:val="0"/>
+          <w:i w:val="0"/>
+          <w:sz w:val="28"/>
+          <w:szCs w:val="28"/>
+        </w:rPr>
+        <w:t xml:space="preserve"> اهمیتش برای ما این است که مذاکره‌کنندگان ایرانی باید بدانند هر سندی که در فرایند مذاکره تولید می‌کنند ـ از یادداشت تفاهم تا صورت‌جلسه ـ ممکن است روزی در فرایند تفسیر به کار برود؛ له یا علیه ما. پس «مستندسازیِ هوشمندانه» از مرحله انعقاد، بخشی از همان «حقوق پیشگیرانه» است که در فصل پنجم گفتم. و نیز رفتار بعدی دولت در اجرا ـ این‌که به کدام بندها چگونه عمل کرده ـ تفسیر عملیِ دولت از معاهده به حساب می‌آید و بعداً نمی‌شود خلافش را ادعا کرد. این نکته، درس مهمی برای دستگاه دیپلماسی ماست: رفتار امروزت، سند فردایت است.</w:t>
+      </w:r>
+    </w:p>
+    <w:p>
+      <w:pPr>
+        <w:pStyle w:val="TH-Goftar"/>
+        <w:widowControl/>
+        <w:bidi w:val="1"/>
+        <w:spacing w:before="200" w:after="120" w:line="288" w:lineRule="auto"/>
+        <w:jc w:val="right"/>
+      </w:pPr>
+      <w:r>
+        <w:rPr>
+          <w:rFonts w:ascii="B Titr" w:hAnsi="B Titr" w:cs="B Titr" w:eastAsia="B Titr"/>
+          <w:b/>
+          <w:i w:val="0"/>
+          <w:sz w:val="32"/>
+          <w:szCs w:val="32"/>
+        </w:rPr>
+        <w:t>گفتار چهارم: اصول قانون اساسی مرتبط</w:t>
       </w:r>
     </w:p>
     <w:p>
@@ -4128,7 +4274,7 @@
           <w:szCs w:val="26"/>
           <w:vertAlign w:val="superscript"/>
         </w:rPr>
-        <w:footnoteReference w:id="23"/>
+        <w:footnoteReference w:id="25"/>
       </w:r>
     </w:p>
     <w:p>
@@ -4216,7 +4362,7 @@
           <w:szCs w:val="26"/>
           <w:vertAlign w:val="superscript"/>
         </w:rPr>
-        <w:footnoteReference w:id="24"/>
+        <w:footnoteReference w:id="26"/>
       </w:r>
     </w:p>
     <w:p>
@@ -4304,7 +4450,7 @@
           <w:szCs w:val="26"/>
           <w:vertAlign w:val="superscript"/>
         </w:rPr>
-        <w:footnoteReference w:id="25"/>
+        <w:footnoteReference w:id="27"/>
       </w:r>
     </w:p>
     <w:p>
@@ -4354,7 +4500,7 @@
           <w:szCs w:val="26"/>
           <w:vertAlign w:val="superscript"/>
         </w:rPr>
-        <w:footnoteReference w:id="26"/>
+        <w:footnoteReference w:id="28"/>
       </w:r>
     </w:p>
     <w:p>
@@ -4422,7 +4568,7 @@
           <w:szCs w:val="28"/>
           <w:vertAlign w:val="superscript"/>
         </w:rPr>
-        <w:footnoteReference w:id="27"/>
+        <w:footnoteReference w:id="29"/>
       </w:r>
     </w:p>
     <w:p>
@@ -4471,7 +4617,7 @@
           <w:szCs w:val="28"/>
           <w:vertAlign w:val="superscript"/>
         </w:rPr>
-        <w:footnoteReference w:id="28"/>
+        <w:footnoteReference w:id="30"/>
       </w:r>
       <w:r>
         <w:rPr>
@@ -4530,7 +4676,7 @@
           <w:szCs w:val="28"/>
           <w:vertAlign w:val="superscript"/>
         </w:rPr>
-        <w:footnoteReference w:id="29"/>
+        <w:footnoteReference w:id="31"/>
       </w:r>
       <w:r>
         <w:rPr>
@@ -4570,7 +4716,7 @@
           <w:szCs w:val="28"/>
           <w:vertAlign w:val="superscript"/>
         </w:rPr>
-        <w:footnoteReference w:id="30"/>
+        <w:footnoteReference w:id="32"/>
       </w:r>
       <w:r>
         <w:rPr>
@@ -4766,7 +4912,7 @@
           <w:szCs w:val="26"/>
           <w:vertAlign w:val="superscript"/>
         </w:rPr>
-        <w:footnoteReference w:id="31"/>
+        <w:footnoteReference w:id="33"/>
       </w:r>
     </w:p>
     <w:p>
@@ -4796,7 +4942,7 @@
           <w:szCs w:val="28"/>
           <w:vertAlign w:val="superscript"/>
         </w:rPr>
-        <w:footnoteReference w:id="32"/>
+        <w:footnoteReference w:id="34"/>
       </w:r>
     </w:p>
     <w:p>
@@ -4884,7 +5030,7 @@
           <w:szCs w:val="26"/>
           <w:vertAlign w:val="superscript"/>
         </w:rPr>
-        <w:footnoteReference w:id="33"/>
+        <w:footnoteReference w:id="35"/>
       </w:r>
     </w:p>
     <w:p>
@@ -4914,7 +5060,7 @@
           <w:szCs w:val="28"/>
           <w:vertAlign w:val="superscript"/>
         </w:rPr>
-        <w:footnoteReference w:id="34"/>
+        <w:footnoteReference w:id="36"/>
       </w:r>
       <w:r>
         <w:rPr>
@@ -4974,7 +5120,7 @@
           <w:szCs w:val="26"/>
           <w:vertAlign w:val="superscript"/>
         </w:rPr>
-        <w:footnoteReference w:id="35"/>
+        <w:footnoteReference w:id="37"/>
       </w:r>
     </w:p>
     <w:p>
@@ -5043,7 +5189,7 @@
           <w:szCs w:val="26"/>
           <w:vertAlign w:val="superscript"/>
         </w:rPr>
-        <w:footnoteReference w:id="36"/>
+        <w:footnoteReference w:id="38"/>
       </w:r>
     </w:p>
     <w:p>
@@ -5112,7 +5258,7 @@
           <w:szCs w:val="26"/>
           <w:vertAlign w:val="superscript"/>
         </w:rPr>
-        <w:footnoteReference w:id="37"/>
+        <w:footnoteReference w:id="39"/>
       </w:r>
     </w:p>
     <w:p>
@@ -5238,7 +5384,7 @@
           <w:szCs w:val="26"/>
           <w:vertAlign w:val="superscript"/>
         </w:rPr>
-        <w:footnoteReference w:id="38"/>
+        <w:footnoteReference w:id="40"/>
       </w:r>
     </w:p>
     <w:p>
@@ -5288,7 +5434,7 @@
           <w:szCs w:val="26"/>
           <w:vertAlign w:val="superscript"/>
         </w:rPr>
-        <w:footnoteReference w:id="39"/>
+        <w:footnoteReference w:id="41"/>
       </w:r>
     </w:p>
     <w:p>
@@ -5376,7 +5522,7 @@
           <w:szCs w:val="26"/>
           <w:vertAlign w:val="superscript"/>
         </w:rPr>
-        <w:footnoteReference w:id="40"/>
+        <w:footnoteReference w:id="42"/>
       </w:r>
     </w:p>
     <w:p>
@@ -5426,7 +5572,7 @@
           <w:szCs w:val="26"/>
           <w:vertAlign w:val="superscript"/>
         </w:rPr>
-        <w:footnoteReference w:id="41"/>
+        <w:footnoteReference w:id="43"/>
       </w:r>
     </w:p>
     <w:p>
@@ -5514,7 +5660,7 @@
           <w:szCs w:val="26"/>
           <w:vertAlign w:val="superscript"/>
         </w:rPr>
-        <w:footnoteReference w:id="42"/>
+        <w:footnoteReference w:id="44"/>
       </w:r>
     </w:p>
     <w:p>
@@ -5563,7 +5709,7 @@
           <w:szCs w:val="28"/>
           <w:vertAlign w:val="superscript"/>
         </w:rPr>
-        <w:footnoteReference w:id="43"/>
+        <w:footnoteReference w:id="45"/>
       </w:r>
       <w:r>
         <w:rPr>
@@ -5623,7 +5769,7 @@
           <w:szCs w:val="26"/>
           <w:vertAlign w:val="superscript"/>
         </w:rPr>
-        <w:footnoteReference w:id="44"/>
+        <w:footnoteReference w:id="46"/>
       </w:r>
     </w:p>
     <w:p>
@@ -5710,7 +5856,7 @@
           <w:szCs w:val="28"/>
           <w:vertAlign w:val="superscript"/>
         </w:rPr>
-        <w:footnoteReference w:id="45"/>
+        <w:footnoteReference w:id="47"/>
       </w:r>
       <w:r>
         <w:rPr>
@@ -5731,7 +5877,7 @@
           <w:szCs w:val="28"/>
           <w:vertAlign w:val="superscript"/>
         </w:rPr>
-        <w:footnoteReference w:id="46"/>
+        <w:footnoteReference w:id="48"/>
       </w:r>
       <w:r>
         <w:rPr>
@@ -5809,7 +5955,7 @@
           <w:szCs w:val="28"/>
           <w:vertAlign w:val="superscript"/>
         </w:rPr>
-        <w:footnoteReference w:id="47"/>
+        <w:footnoteReference w:id="49"/>
       </w:r>
     </w:p>
     <w:p>
@@ -5877,7 +6023,7 @@
           <w:szCs w:val="28"/>
           <w:vertAlign w:val="superscript"/>
         </w:rPr>
-        <w:footnoteReference w:id="48"/>
+        <w:footnoteReference w:id="50"/>
       </w:r>
     </w:p>
     <w:p>
@@ -5945,7 +6091,7 @@
           <w:szCs w:val="28"/>
           <w:vertAlign w:val="superscript"/>
         </w:rPr>
-        <w:footnoteReference w:id="49"/>
+        <w:footnoteReference w:id="51"/>
       </w:r>
       <w:r>
         <w:rPr>
@@ -6080,7 +6226,7 @@
           <w:szCs w:val="28"/>
           <w:vertAlign w:val="superscript"/>
         </w:rPr>
-        <w:footnoteReference w:id="50"/>
+        <w:footnoteReference w:id="52"/>
       </w:r>
     </w:p>
     <w:p>
@@ -6129,7 +6275,7 @@
           <w:szCs w:val="28"/>
           <w:vertAlign w:val="superscript"/>
         </w:rPr>
-        <w:footnoteReference w:id="51"/>
+        <w:footnoteReference w:id="53"/>
       </w:r>
     </w:p>
     <w:p>
@@ -6149,6 +6295,233 @@
           <w:szCs w:val="28"/>
         </w:rPr>
         <w:t>اهمیت این دلیل در این است که «فراشرعی» است؛ یعنی حتی اگر کسی در دلالت آیات و روایات خدشه کند، نمی‌تواند بنای عقلا را انکار کند ـ چون خودش هم در زندگی روزمره‌اش بر همین بنا عمل می‌کند. و همین فراشرعی بودن است که گفت‌وگوی فقه و حقوق بین‌الملل را ممکن می‌کند: چون هر دو نظام، بر یک بنای مشترکِ بشری استوارند.</w:t>
+      </w:r>
+    </w:p>
+    <w:p>
+      <w:pPr>
+        <w:pStyle w:val="TH-Goftar"/>
+        <w:widowControl/>
+        <w:bidi w:val="1"/>
+        <w:spacing w:before="200" w:after="120" w:line="288" w:lineRule="auto"/>
+        <w:jc w:val="right"/>
+      </w:pPr>
+      <w:r>
+        <w:rPr>
+          <w:rFonts w:ascii="B Titr" w:hAnsi="B Titr" w:cs="B Titr" w:eastAsia="B Titr"/>
+          <w:b/>
+          <w:i w:val="0"/>
+          <w:sz w:val="32"/>
+          <w:szCs w:val="32"/>
+        </w:rPr>
+        <w:t>گفتار ششم: قواعد فقهی مؤید وجوب وفا</w:t>
+      </w:r>
+    </w:p>
+    <w:p>
+      <w:pPr>
+        <w:pStyle w:val="TH-Band"/>
+        <w:widowControl/>
+        <w:bidi w:val="1"/>
+        <w:spacing w:before="200" w:after="120" w:line="288" w:lineRule="auto"/>
+        <w:jc w:val="right"/>
+      </w:pPr>
+      <w:r>
+        <w:rPr>
+          <w:rFonts w:ascii="B Traffic" w:hAnsi="B Traffic" w:cs="B Traffic" w:eastAsia="B Traffic"/>
+          <w:b/>
+          <w:i w:val="0"/>
+          <w:sz w:val="28"/>
+          <w:szCs w:val="28"/>
+        </w:rPr>
+        <w:t>بند اول: اصالة اللزوم در عقود</w:t>
+      </w:r>
+    </w:p>
+    <w:p>
+      <w:pPr>
+        <w:pStyle w:val="TH-Body"/>
+        <w:widowControl/>
+        <w:bidi w:val="1"/>
+        <w:spacing w:before="0" w:after="120" w:line="288" w:lineRule="auto"/>
+        <w:jc w:val="both"/>
+      </w:pPr>
+      <w:r>
+        <w:rPr>
+          <w:rFonts w:ascii="B Lotus" w:hAnsi="B Lotus" w:cs="B Lotus" w:eastAsia="B Lotus"/>
+          <w:b w:val="0"/>
+          <w:i w:val="0"/>
+          <w:sz w:val="28"/>
+          <w:szCs w:val="28"/>
+        </w:rPr>
+        <w:t>گذشته از ادله خاص، قاعده عامی در فقه هست که پشتوانه وجوب وفاست: «اصالة اللزوم»؛ یعنی اصل در هر عقدی ـ مگر این‌که خلافش ثابت شود ـ لزوم است. سید بجنوردی در القواعد الفقهیه این قاعده را با تفصیل اثبات کرده: عقد، گره است و گره، ذاتاً محکم است؛ پس هرکس مدعی جوازِ گشودن است، باید دلیل بیاورد.</w:t>
+      </w:r>
+      <w:r>
+        <w:rPr>
+          <w:rFonts w:ascii="B Lotus" w:hAnsi="B Lotus" w:cs="B Lotus" w:eastAsia="B Lotus"/>
+          <w:b w:val="0"/>
+          <w:i w:val="0"/>
+          <w:sz w:val="28"/>
+          <w:szCs w:val="28"/>
+          <w:vertAlign w:val="superscript"/>
+        </w:rPr>
+        <w:footnoteReference w:id="54"/>
+      </w:r>
+      <w:r>
+        <w:rPr>
+          <w:rFonts w:ascii="B Lotus" w:hAnsi="B Lotus" w:cs="B Lotus" w:eastAsia="B Lotus"/>
+          <w:b w:val="0"/>
+          <w:i w:val="0"/>
+          <w:sz w:val="28"/>
+          <w:szCs w:val="28"/>
+        </w:rPr>
+        <w:t xml:space="preserve"> تطبیقش بر معاهده روشن است: معاهده، عقدی است میان دولت‌ها و اصل در آن لزوم است؛ پس عدول از آن نیازمند دلیل است ـ و همین، همان «بار اثبات» است که در مقدمه این فصل گفتم بر دوش مدعی جواز عدول است. به زبان ساده: دادگاهِ فقهی، مدعی عدول را محکومِ به وفا می‌داند، مگر این‌که مجوزش را ثابت کند.</w:t>
+      </w:r>
+    </w:p>
+    <w:p>
+      <w:pPr>
+        <w:pStyle w:val="TH-Band"/>
+        <w:widowControl/>
+        <w:bidi w:val="1"/>
+        <w:spacing w:before="200" w:after="120" w:line="288" w:lineRule="auto"/>
+        <w:jc w:val="right"/>
+      </w:pPr>
+      <w:r>
+        <w:rPr>
+          <w:rFonts w:ascii="B Traffic" w:hAnsi="B Traffic" w:cs="B Traffic" w:eastAsia="B Traffic"/>
+          <w:b/>
+          <w:i w:val="0"/>
+          <w:sz w:val="28"/>
+          <w:szCs w:val="28"/>
+        </w:rPr>
+        <w:t>بند دوم: حرمت غدر و خیانت؛ مرز اخلاقی</w:t>
+      </w:r>
+    </w:p>
+    <w:p>
+      <w:pPr>
+        <w:pStyle w:val="TH-Body"/>
+        <w:widowControl/>
+        <w:bidi w:val="1"/>
+        <w:spacing w:before="0" w:after="120" w:line="288" w:lineRule="auto"/>
+        <w:jc w:val="both"/>
+      </w:pPr>
+      <w:r>
+        <w:rPr>
+          <w:rFonts w:ascii="B Lotus" w:hAnsi="B Lotus" w:cs="B Lotus" w:eastAsia="B Lotus"/>
+          <w:b w:val="0"/>
+          <w:i w:val="0"/>
+          <w:sz w:val="28"/>
+          <w:szCs w:val="28"/>
+        </w:rPr>
+        <w:t>قرآن و روایات، «غدر» (پیمان‌شکنیِ ناجوانمردانه) و «خیانت» (نقض امانت) را از زشت‌ترین صفات شمرده‌اند. خدا می‌فرماید «إِنَّ اللَّهَ لَا یُحِبُّ الْخَائِنِینَ»</w:t>
+      </w:r>
+      <w:r>
+        <w:rPr>
+          <w:rFonts w:ascii="B Lotus" w:hAnsi="B Lotus" w:cs="B Lotus" w:eastAsia="B Lotus"/>
+          <w:b w:val="0"/>
+          <w:i w:val="0"/>
+          <w:sz w:val="28"/>
+          <w:szCs w:val="28"/>
+          <w:vertAlign w:val="superscript"/>
+        </w:rPr>
+        <w:footnoteReference w:id="55"/>
+      </w:r>
+      <w:r>
+        <w:rPr>
+          <w:rFonts w:ascii="B Lotus" w:hAnsi="B Lotus" w:cs="B Lotus" w:eastAsia="B Lotus"/>
+          <w:b w:val="0"/>
+          <w:i w:val="0"/>
+          <w:sz w:val="28"/>
+          <w:szCs w:val="28"/>
+        </w:rPr>
+        <w:t xml:space="preserve"> و پیامبر فرمود که غادر (پیمان‌شکن) در قیامت پرچمِ رسوایی دارد که با آن شناخته می‌شود.</w:t>
+      </w:r>
+      <w:r>
+        <w:rPr>
+          <w:rFonts w:ascii="B Lotus" w:hAnsi="B Lotus" w:cs="B Lotus" w:eastAsia="B Lotus"/>
+          <w:b w:val="0"/>
+          <w:i w:val="0"/>
+          <w:sz w:val="28"/>
+          <w:szCs w:val="28"/>
+          <w:vertAlign w:val="superscript"/>
+        </w:rPr>
+        <w:footnoteReference w:id="56"/>
+      </w:r>
+      <w:r>
+        <w:rPr>
+          <w:rFonts w:ascii="B Lotus" w:hAnsi="B Lotus" w:cs="B Lotus" w:eastAsia="B Lotus"/>
+          <w:b w:val="0"/>
+          <w:i w:val="0"/>
+          <w:sz w:val="28"/>
+          <w:szCs w:val="28"/>
+        </w:rPr>
+        <w:t xml:space="preserve"> این ادله، مرز اخلاقیِ بحث را مشخص می‌کنند: عدولِ مورد بحث من ـ که با ضوابط هشت‌گانه مهار شده ـ «غدر» نیست، چون آشکار و مستدل و مبتنی بر تزاحم است؛ ولی هر عدولی که فاقد این ضوابط باشد ـ به‌ویژه عدولِ پنهانی ـ داخل در عنوان غدر و خیانت است و مشمول همین نکوهش‌هاست. پس این ادله، هم مؤید قاعده‌اند (وفا واجب است) و هم مؤید ضوابط‌اند (عدولِ بی‌ضابطه، غدر است).</w:t>
+      </w:r>
+    </w:p>
+    <w:p>
+      <w:pPr>
+        <w:pStyle w:val="TH-Band"/>
+        <w:widowControl/>
+        <w:bidi w:val="1"/>
+        <w:spacing w:before="200" w:after="120" w:line="288" w:lineRule="auto"/>
+        <w:jc w:val="right"/>
+      </w:pPr>
+      <w:r>
+        <w:rPr>
+          <w:rFonts w:ascii="B Traffic" w:hAnsi="B Traffic" w:cs="B Traffic" w:eastAsia="B Traffic"/>
+          <w:b/>
+          <w:i w:val="0"/>
+          <w:sz w:val="28"/>
+          <w:szCs w:val="28"/>
+        </w:rPr>
+        <w:t>بند سوم: قاعده نفی سبیل؛ مرز دیگر وفا</w:t>
+      </w:r>
+    </w:p>
+    <w:p>
+      <w:pPr>
+        <w:pStyle w:val="TH-Quote"/>
+        <w:widowControl/>
+        <w:bidi w:val="1"/>
+        <w:spacing w:before="160" w:after="160" w:line="288" w:lineRule="auto"/>
+        <w:ind w:right="567" w:left="567"/>
+        <w:jc w:val="center"/>
+      </w:pPr>
+      <w:r>
+        <w:rPr>
+          <w:rFonts w:ascii="B Badr" w:hAnsi="B Badr" w:cs="B Badr" w:eastAsia="B Badr"/>
+          <w:b/>
+          <w:i w:val="0"/>
+          <w:sz w:val="26"/>
+          <w:szCs w:val="26"/>
+        </w:rPr>
+        <w:t>وَلَنْ یَجْعَلَ اللَّهُ لِلْکَافِرِینَ عَلَی الْمُؤْمِنِینَ سَبِیلًا</w:t>
+      </w:r>
+      <w:r>
+        <w:rPr>
+          <w:rFonts w:ascii="B Badr" w:hAnsi="B Badr" w:cs="B Badr" w:eastAsia="B Badr"/>
+          <w:b w:val="0"/>
+          <w:i w:val="0"/>
+          <w:sz w:val="26"/>
+          <w:szCs w:val="26"/>
+          <w:vertAlign w:val="superscript"/>
+        </w:rPr>
+        <w:footnoteReference w:id="57"/>
+      </w:r>
+    </w:p>
+    <w:p>
+      <w:pPr>
+        <w:pStyle w:val="TH-Body"/>
+        <w:widowControl/>
+        <w:bidi w:val="1"/>
+        <w:spacing w:before="0" w:after="120" w:line="288" w:lineRule="auto"/>
+        <w:jc w:val="both"/>
+      </w:pPr>
+      <w:r>
+        <w:rPr>
+          <w:rFonts w:ascii="B Lotus" w:hAnsi="B Lotus" w:cs="B Lotus" w:eastAsia="B Lotus"/>
+          <w:b w:val="0"/>
+          <w:i w:val="0"/>
+          <w:sz w:val="28"/>
+          <w:szCs w:val="28"/>
+        </w:rPr>
+        <w:t>قاعده نفی سبیل می‌گوید: خدا هیچ راه سلطه‌ای برای کافران بر مؤمنان قرار نداده؛ و هر عقد و پیمانی که چنین سلطه‌ای را نتیجه بدهد، از نظر شرع نامشروع است. این قاعده، «مرز دیگر» وفاست: از یک سو، وفا به عهد واجب است؛ ولی از سوی دیگر، اگر ادامه وفا به سلطه بیگانه بر کشور اسلامی بینجامد، مشمول نفی سبیل می‌شود و وجوبش برداشته می‌شود ـ بلکه عدول از آن واجب می‌گردد. نسبتش با اصل ۱۵۳ قانون اساسی (ممنوعیت قرارداد سلطه‌آور) هم مستقیم است و نشان می‌دهد که قانون‌گذار اساسی ما، همین قاعده فقهی را به زبان حقوقی ترجمه کرده. این قاعده، یکی از قوی‌ترین مبانیِ «استثنا»ست؛ ولی چون جنبه سلبی دارد (نفی سلطه) نه ایجابی (اثبات جواز)، آن را در این فصل ـ در کنار ادله قاعده ـ آوردم تا خواننده ببیند که مرزهای قاعده، از درونِ خودِ شریعت تعیین می‌شود، نه از بیرون.</w:t>
       </w:r>
     </w:p>
     <w:p>
@@ -6300,7 +6673,7 @@
           <w:szCs w:val="28"/>
           <w:vertAlign w:val="superscript"/>
         </w:rPr>
-        <w:footnoteReference w:id="52"/>
+        <w:footnoteReference w:id="58"/>
       </w:r>
     </w:p>
     <w:p>
@@ -6558,7 +6931,7 @@
           <w:szCs w:val="28"/>
           <w:vertAlign w:val="superscript"/>
         </w:rPr>
-        <w:footnoteReference w:id="53"/>
+        <w:footnoteReference w:id="59"/>
       </w:r>
     </w:p>
     <w:p>
@@ -6798,7 +7171,7 @@
           <w:szCs w:val="26"/>
           <w:vertAlign w:val="superscript"/>
         </w:rPr>
-        <w:footnoteReference w:id="54"/>
+        <w:footnoteReference w:id="60"/>
       </w:r>
     </w:p>
     <w:p>
@@ -6886,7 +7259,7 @@
           <w:szCs w:val="26"/>
           <w:vertAlign w:val="superscript"/>
         </w:rPr>
-        <w:footnoteReference w:id="55"/>
+        <w:footnoteReference w:id="61"/>
       </w:r>
     </w:p>
     <w:p>
@@ -6954,7 +7327,7 @@
           <w:szCs w:val="28"/>
           <w:vertAlign w:val="superscript"/>
         </w:rPr>
-        <w:footnoteReference w:id="56"/>
+        <w:footnoteReference w:id="62"/>
       </w:r>
       <w:r>
         <w:rPr>
@@ -7250,6 +7623,215 @@
           <w:szCs w:val="28"/>
         </w:rPr>
         <w:t>این هشت ضابطه، مجموعاً «دستورالعمل عملی» تصمیم‌گیر است؛ چیزی شبیه چک‌لیستی که قبل از هر تصمیمی باید یک‌به‌یک تیک بخورد. و من در پیوست اول، همین چک‌لیست را به صورت عملیاتی و قدم‌به‌قدم آورده‌ام تا تصمیم‌گیر بتواند مستقیم از آن استفاده کند.</w:t>
+      </w:r>
+    </w:p>
+    <w:p>
+      <w:pPr>
+        <w:pStyle w:val="TH-Goftar"/>
+        <w:widowControl/>
+        <w:bidi w:val="1"/>
+        <w:spacing w:before="200" w:after="120" w:line="288" w:lineRule="auto"/>
+        <w:jc w:val="right"/>
+      </w:pPr>
+      <w:r>
+        <w:rPr>
+          <w:rFonts w:ascii="B Titr" w:hAnsi="B Titr" w:cs="B Titr" w:eastAsia="B Titr"/>
+          <w:b/>
+          <w:i w:val="0"/>
+          <w:sz w:val="32"/>
+          <w:szCs w:val="32"/>
+        </w:rPr>
+        <w:t>گفتار پنجم: دفع اشکالات مقدّر؛ آزمون استحکام</w:t>
+      </w:r>
+    </w:p>
+    <w:p>
+      <w:pPr>
+        <w:pStyle w:val="TH-Body"/>
+        <w:widowControl/>
+        <w:bidi w:val="1"/>
+        <w:spacing w:before="0" w:after="120" w:line="288" w:lineRule="auto"/>
+        <w:jc w:val="both"/>
+      </w:pPr>
+      <w:r>
+        <w:rPr>
+          <w:rFonts w:ascii="B Lotus" w:hAnsi="B Lotus" w:cs="B Lotus" w:eastAsia="B Lotus"/>
+          <w:b w:val="0"/>
+          <w:i w:val="0"/>
+          <w:sz w:val="28"/>
+          <w:szCs w:val="28"/>
+        </w:rPr>
+        <w:t>هر استدلالی ـ هرچقدر هم که قوی باشد ـ باید در برابر اشکالات مقدّر آزموده شود؛ چون استدلالی که از اشکال بترسد، استدلال نیست، شعار است. در این گفتار سه اشکال جدی را که خودم در مسیر پژوهش با آن‌ها درگیر شدم ـ و هرکدام مدتی ذهنم را مشغول کرد ـ طرح و پاسخ می‌دهم. اگر پاسخ‌هایم قانع‌کننده باشد، استدلال فصل مستحکم‌تر می‌شود؛ و اگر نباشد، خواننده بصیر خودش داوری خواهد کرد و من از نقدش استقبال می‌کنم.</w:t>
+      </w:r>
+    </w:p>
+    <w:p>
+      <w:pPr>
+        <w:pStyle w:val="TH-Band"/>
+        <w:widowControl/>
+        <w:bidi w:val="1"/>
+        <w:spacing w:before="200" w:after="120" w:line="288" w:lineRule="auto"/>
+        <w:jc w:val="right"/>
+      </w:pPr>
+      <w:r>
+        <w:rPr>
+          <w:rFonts w:ascii="B Traffic" w:hAnsi="B Traffic" w:cs="B Traffic" w:eastAsia="B Traffic"/>
+          <w:b/>
+          <w:i w:val="0"/>
+          <w:sz w:val="28"/>
+          <w:szCs w:val="28"/>
+        </w:rPr>
+        <w:t>بند اول: آیا تقدیم مصلحت بر نص، تعطیل نص نیست؟</w:t>
+      </w:r>
+    </w:p>
+    <w:p>
+      <w:pPr>
+        <w:pStyle w:val="TH-Body"/>
+        <w:widowControl/>
+        <w:bidi w:val="1"/>
+        <w:spacing w:before="0" w:after="120" w:line="288" w:lineRule="auto"/>
+        <w:jc w:val="both"/>
+      </w:pPr>
+      <w:r>
+        <w:rPr>
+          <w:rFonts w:ascii="B Lotus" w:hAnsi="B Lotus" w:cs="B Lotus" w:eastAsia="B Lotus"/>
+          <w:b w:val="0"/>
+          <w:i w:val="0"/>
+          <w:sz w:val="28"/>
+          <w:szCs w:val="28"/>
+        </w:rPr>
+        <w:t>اشکال اول، مبنایی‌ترین اشکال است: شما می‌گویید در مقام تزاحم، مصلحت (که تشخیصش با حاکم است) بر نص صریح قرآن (اوفوا بالعقود) مقدم می‌شود؛ آیا این، تعطیل نص و حکومت رأی بر وحی نیست؟ و آیا راه را برای کنار گذاشتنِ هر حکمی به بهانه مصلحت باز نمی‌کند؟</w:t>
+      </w:r>
+    </w:p>
+    <w:p>
+      <w:pPr>
+        <w:pStyle w:val="TH-Body"/>
+        <w:widowControl/>
+        <w:bidi w:val="1"/>
+        <w:spacing w:before="0" w:after="120" w:line="288" w:lineRule="auto"/>
+        <w:jc w:val="both"/>
+      </w:pPr>
+      <w:r>
+        <w:rPr>
+          <w:rFonts w:ascii="B Lotus" w:hAnsi="B Lotus" w:cs="B Lotus" w:eastAsia="B Lotus"/>
+          <w:b w:val="0"/>
+          <w:i w:val="0"/>
+          <w:sz w:val="28"/>
+          <w:szCs w:val="28"/>
+        </w:rPr>
+        <w:t>جوابش سه لایه دارد. لایه اول: ما «نص» را تعطیل نمی‌کنیم، بلکه «دو نص» را با هم جمع می‌کنیم؛ چون در برابر آیات وفا، ادله دیگری هم هست ـ ادله وجوب حفظ نظام، قاعده لاضرر، آیات نفی سبیل ـ که آن‌ها هم نص‌اند. پس دعوا میان «نص و رأی» نیست، بلکه میان «نص و نص» است؛ و جمع میان نصوص، کار همیشگی فقه است، نه بدعت این رساله. لایه دوم: تقدیم در مقام «امتثال» است، نه نسخ در مقام «جعل»؛ یعنی حکم وفا سر جایش باقی است و با رفع تزاحم برمی‌گردد ـ و این، فرق جوهری با تعطیل دارد. و لایه سوم: تشخیص مصلحت، «رأی شخصی» حاکم نیست، بلکه تشخیصِ مقیدِ کارشناسی‌شده‌ای است که ضوابط هشت‌گانه مهارش می‌کنند؛ پس خطرِ حکومتِ رأیِ خودسرانه بر وحی، با این مهارها منتفی است. البته ـ انصافاً ـ اگر این مهارها نباشند، اشکال وارد است؛ و همین، دلیل دیگری است بر ضرورت ضوابط.</w:t>
+      </w:r>
+    </w:p>
+    <w:p>
+      <w:pPr>
+        <w:pStyle w:val="TH-Band"/>
+        <w:widowControl/>
+        <w:bidi w:val="1"/>
+        <w:spacing w:before="200" w:after="120" w:line="288" w:lineRule="auto"/>
+        <w:jc w:val="right"/>
+      </w:pPr>
+      <w:r>
+        <w:rPr>
+          <w:rFonts w:ascii="B Traffic" w:hAnsi="B Traffic" w:cs="B Traffic" w:eastAsia="B Traffic"/>
+          <w:b/>
+          <w:i w:val="0"/>
+          <w:sz w:val="28"/>
+          <w:szCs w:val="28"/>
+        </w:rPr>
+        <w:t>بند دوم: آیا این راه به توجیه هر عهدشکنی نمی‌انجامد؟</w:t>
+      </w:r>
+    </w:p>
+    <w:p>
+      <w:pPr>
+        <w:pStyle w:val="TH-Body"/>
+        <w:widowControl/>
+        <w:bidi w:val="1"/>
+        <w:spacing w:before="0" w:after="120" w:line="288" w:lineRule="auto"/>
+        <w:jc w:val="both"/>
+      </w:pPr>
+      <w:r>
+        <w:rPr>
+          <w:rFonts w:ascii="B Lotus" w:hAnsi="B Lotus" w:cs="B Lotus" w:eastAsia="B Lotus"/>
+          <w:b w:val="0"/>
+          <w:i w:val="0"/>
+          <w:sz w:val="28"/>
+          <w:szCs w:val="28"/>
+        </w:rPr>
+        <w:t>اشکال دوم، عملی‌تر است: شما دری را باز کرده‌اید که هر حاکمی می‌تواند از آن وارد شود و هر عهدشکنی را با عنوان «مصلحت» و «تزاحم» توجیه کند؛ پس عملاً قاعده وفا را بی‌اثر کرده‌اید، هرچند در حرف آن را نگه داشته‌اید.</w:t>
+      </w:r>
+    </w:p>
+    <w:p>
+      <w:pPr>
+        <w:pStyle w:val="TH-Body"/>
+        <w:widowControl/>
+        <w:bidi w:val="1"/>
+        <w:spacing w:before="0" w:after="120" w:line="288" w:lineRule="auto"/>
+        <w:jc w:val="both"/>
+      </w:pPr>
+      <w:r>
+        <w:rPr>
+          <w:rFonts w:ascii="B Lotus" w:hAnsi="B Lotus" w:cs="B Lotus" w:eastAsia="B Lotus"/>
+          <w:b w:val="0"/>
+          <w:i w:val="0"/>
+          <w:sz w:val="28"/>
+          <w:szCs w:val="28"/>
+        </w:rPr>
+        <w:t>جوابش این است که درِ بازشده، «درِ بی‌در» نیست، بلکه هشت قفل دارد ـ همان ضوابط هشت‌گانه. حاکمی که بخواهد سوءاستفاده کند، باید از هر هشت قفل بگذرد: تزاحم واقعی را احراز کند (که با کارشناسیِ مستند، قابل راستی‌آزمایی است)، راه‌های حقوقی را اول رفته باشد (که قابل بررسی است)، تناسب را رعایت کرده باشد (که قابل داوری است)، اعلام آشکار کرده باشد (که علنی است)، و... هرکدام از این‌ها، امکان سوءاستفاده را کمتر می‌کند؛ و مجموعشان، سوءاستفاده را ـ اگر نگویم ناممکن ـ بسیار دشوار و پرهزینه می‌کند. به‌علاوه، همین اشکال به «هر» اختیار حکومتی وارد است ـ از جمله اختیار اعلان جنگ و انعقاد صلح ـ و اگر پذیرفته شود، باید همه اختیارات حکومتی را تعطیل کرد؛ و این، چیزی نیست که هیچ عاقلی بپذیرد. راه‌حلِ خطرِ سوءاستفاده، «مهار» است، نه «تعطیل»؛ و این رساله، رساله مهار است.</w:t>
+      </w:r>
+    </w:p>
+    <w:p>
+      <w:pPr>
+        <w:pStyle w:val="TH-Band"/>
+        <w:widowControl/>
+        <w:bidi w:val="1"/>
+        <w:spacing w:before="200" w:after="120" w:line="288" w:lineRule="auto"/>
+        <w:jc w:val="right"/>
+      </w:pPr>
+      <w:r>
+        <w:rPr>
+          <w:rFonts w:ascii="B Traffic" w:hAnsi="B Traffic" w:cs="B Traffic" w:eastAsia="B Traffic"/>
+          <w:b/>
+          <w:i w:val="0"/>
+          <w:sz w:val="28"/>
+          <w:szCs w:val="28"/>
+        </w:rPr>
+        <w:t>بند سوم: آیا حاکم در دعوای خودش داور است؟</w:t>
+      </w:r>
+    </w:p>
+    <w:p>
+      <w:pPr>
+        <w:pStyle w:val="TH-Body"/>
+        <w:widowControl/>
+        <w:bidi w:val="1"/>
+        <w:spacing w:before="0" w:after="120" w:line="288" w:lineRule="auto"/>
+        <w:jc w:val="both"/>
+      </w:pPr>
+      <w:r>
+        <w:rPr>
+          <w:rFonts w:ascii="B Lotus" w:hAnsi="B Lotus" w:cs="B Lotus" w:eastAsia="B Lotus"/>
+          <w:b w:val="0"/>
+          <w:i w:val="0"/>
+          <w:sz w:val="28"/>
+          <w:szCs w:val="28"/>
+        </w:rPr>
+        <w:t>اشکال سوم، ظریف‌ترین اشکال است: در مسئله ما، حاکم هم «طرف دعوا»ست (چون خودش می‌خواهد از تعهدی که خودش یا پیشینیانش بسته‌اند عدول کند) و هم «داور» (چون خودش تشخیص تزاحم و مصلحت می‌دهد)؛ و داوریِ طرفِ دعوا در دعوای خودش، خلاف عقل و عدل است. پس سازوکار پیشنهادی شما، ذاتاً معیوب است.</w:t>
+      </w:r>
+    </w:p>
+    <w:p>
+      <w:pPr>
+        <w:pStyle w:val="TH-Body"/>
+        <w:widowControl/>
+        <w:bidi w:val="1"/>
+        <w:spacing w:before="0" w:after="120" w:line="288" w:lineRule="auto"/>
+        <w:jc w:val="both"/>
+      </w:pPr>
+      <w:r>
+        <w:rPr>
+          <w:rFonts w:ascii="B Lotus" w:hAnsi="B Lotus" w:cs="B Lotus" w:eastAsia="B Lotus"/>
+          <w:b w:val="0"/>
+          <w:i w:val="0"/>
+          <w:sz w:val="28"/>
+          <w:szCs w:val="28"/>
+        </w:rPr>
+        <w:t>جوابش این است که این اشکال، خلط میان «داوری قضایی» و «تصمیم حکومتی» است. در داوری قضایی ـ که حقِ طرفین مطرح است ـ داور باید بی‌طرف باشد و طرف دعوا نمی‌تواند داور باشد؛ ولی در تصمیم حکومتی ـ که مصلحتِ عمومی مطرح است ـ تصمیم‌گیر، بالذات همان کسی است که مسئولیت اداره را بر عهده دارد و نمی‌شود مسئولیت را از او گرفت و به دیگری داد. به زبان دیگر: حاکم، «طرف دعوا» به معنای قضایی نیست، بلکه «امین امت» است؛ و امین، وقتی با تزاحم دو مصلحت امت روبه‌رو می‌شود، خودش باید تصمیم بگیرد ـ چون همین، معنای امانت است. البته برای جلوگیری از سوءاستفاده، سازوکارهای نظارتی (کارشناسی نهادها، شفافیت تصمیم، پاسخ‌گویی بعدی، نظارت مجلس خبرگان در چارچوب قانون اساسی) لازم است؛ ولی این سازوکارها، «مکمل» تصمیم حاکم‌اند، نه «جایگزین» آن. و این، همان منطقی است که در همه نظام‌های حکومتی ـ دینی و غیردینی ـ پذیرفته شده: تصمیم نهایی با مسئول نهایی است.</w:t>
       </w:r>
     </w:p>
     <w:p>
@@ -7434,7 +8016,7 @@
           <w:szCs w:val="28"/>
           <w:vertAlign w:val="superscript"/>
         </w:rPr>
-        <w:footnoteReference w:id="57"/>
+        <w:footnoteReference w:id="63"/>
       </w:r>
     </w:p>
     <w:p>
@@ -7472,7 +8054,7 @@
           <w:sz w:val="28"/>
           <w:szCs w:val="28"/>
         </w:rPr>
-        <w:t>بند دوم: ارکان عمل متخلفانه؛ انتساب و نقض</w:t>
+        <w:t>بند دوم: جایگاه عرفی کنوانسیون وین و رویه دیوان</w:t>
       </w:r>
     </w:p>
     <w:p>
@@ -7491,6 +8073,93 @@
           <w:sz w:val="28"/>
           <w:szCs w:val="28"/>
         </w:rPr>
+        <w:t>پیش از ورود به ارکان مسئولیت، باید به پرسشی مقدماتی جواب بدهم که خواننده دقیق ـ به‌ویژه خواننده ایرانی ـ حتماً می‌پرسد: ایران کنوانسیون وین را تصویب نکرده؛ پس چرا کل تحلیل این رساله بر آن استوار است؟ آیا استناد به سندی که ایران عضو آن نیست، بر ضد ایران معتبر است؟</w:t>
+      </w:r>
+    </w:p>
+    <w:p>
+      <w:pPr>
+        <w:pStyle w:val="TH-Body"/>
+        <w:widowControl/>
+        <w:bidi w:val="1"/>
+        <w:spacing w:before="0" w:after="120" w:line="288" w:lineRule="auto"/>
+        <w:jc w:val="both"/>
+      </w:pPr>
+      <w:r>
+        <w:rPr>
+          <w:rFonts w:ascii="B Lotus" w:hAnsi="B Lotus" w:cs="B Lotus" w:eastAsia="B Lotus"/>
+          <w:b w:val="0"/>
+          <w:i w:val="0"/>
+          <w:sz w:val="28"/>
+          <w:szCs w:val="28"/>
+        </w:rPr>
+        <w:t>جوابش در تمایز میان «معاهده» و «عرف» است. بسیاری از قواعد وین ـ به‌ویژه مواد ۲۶، ۲۷، ۳۱، ۳۲، ۴۶، ۵۳، ۶۰ و ۶۲ ـ چنان‌که دیوان بین‌المللی دادگستری بارها تصریح کرده، «بیان عرف بین‌المللی»‌اند؛ یعنی قواعدی که پیش از وین هم در عرف دولت‌ها وجود داشتند و وین فقط آن‌ها را «تدوین» کرده، نه «تأسیس». و عرف بین‌المللی ـ برخلاف معاهده ـ نیازمند عضویت نیست و بر همه دولت‌ها ـ از جمله ایران ـ اعمال می‌شود. دیوان در قضیه نیکاراگوئه (۱۹۸۶) همین منطق را به کار بست و قواعدی را که در معاهدات آمده بود، به‌عنوان عرف بر دولتی اعمال کرد که عضو آن معاهده نبود.</w:t>
+      </w:r>
+      <w:r>
+        <w:rPr>
+          <w:rFonts w:ascii="B Lotus" w:hAnsi="B Lotus" w:cs="B Lotus" w:eastAsia="B Lotus"/>
+          <w:b w:val="0"/>
+          <w:i w:val="0"/>
+          <w:sz w:val="28"/>
+          <w:szCs w:val="28"/>
+          <w:vertAlign w:val="superscript"/>
+        </w:rPr>
+        <w:footnoteReference w:id="64"/>
+      </w:r>
+    </w:p>
+    <w:p>
+      <w:pPr>
+        <w:pStyle w:val="TH-Body"/>
+        <w:widowControl/>
+        <w:bidi w:val="1"/>
+        <w:spacing w:before="0" w:after="120" w:line="288" w:lineRule="auto"/>
+        <w:jc w:val="both"/>
+      </w:pPr>
+      <w:r>
+        <w:rPr>
+          <w:rFonts w:ascii="B Lotus" w:hAnsi="B Lotus" w:cs="B Lotus" w:eastAsia="B Lotus"/>
+          <w:b w:val="0"/>
+          <w:i w:val="0"/>
+          <w:sz w:val="28"/>
+          <w:szCs w:val="28"/>
+        </w:rPr>
+        <w:t>پس موضع روشی من این است: هرجا به وین استناد می‌کنم، در واقع به «عرفِ مدون‌شده در وین» استناد می‌کنم؛ و اعتبار استنادم نه از عضویت ایران، که از عرفی بودن قاعده است. البته ـ انصافاً ـ درباره بعضی مواد وین (مثل تفاصیل حق شرط و بعضی مواد آیینی) عرفی بودن محل بحث است؛ و من در آن موارد، یا استناد نکرده‌ام یا با احتیاط استناد کرده‌ام. این دقت روشی را لازم دانستم، چون بنای کل فصل پنجم بر آن استوار است و اگر فرو بریزد، همه تحلیل فرو می‌ریزد.</w:t>
+      </w:r>
+    </w:p>
+    <w:p>
+      <w:pPr>
+        <w:pStyle w:val="TH-Band"/>
+        <w:widowControl/>
+        <w:bidi w:val="1"/>
+        <w:spacing w:before="200" w:after="120" w:line="288" w:lineRule="auto"/>
+        <w:jc w:val="right"/>
+      </w:pPr>
+      <w:r>
+        <w:rPr>
+          <w:rFonts w:ascii="B Traffic" w:hAnsi="B Traffic" w:cs="B Traffic" w:eastAsia="B Traffic"/>
+          <w:b/>
+          <w:i w:val="0"/>
+          <w:sz w:val="28"/>
+          <w:szCs w:val="28"/>
+        </w:rPr>
+        <w:t>بند سوم: ارکان عمل متخلفانه؛ انتساب و نقض</w:t>
+      </w:r>
+    </w:p>
+    <w:p>
+      <w:pPr>
+        <w:pStyle w:val="TH-Body"/>
+        <w:widowControl/>
+        <w:bidi w:val="1"/>
+        <w:spacing w:before="0" w:after="120" w:line="288" w:lineRule="auto"/>
+        <w:jc w:val="both"/>
+      </w:pPr>
+      <w:r>
+        <w:rPr>
+          <w:rFonts w:ascii="B Lotus" w:hAnsi="B Lotus" w:cs="B Lotus" w:eastAsia="B Lotus"/>
+          <w:b w:val="0"/>
+          <w:i w:val="0"/>
+          <w:sz w:val="28"/>
+          <w:szCs w:val="28"/>
+        </w:rPr>
         <w:t>طبق ماده ۱ طرح، «هر عمل متخلفانه بین‌المللی دولت، موجب مسئولیت بین‌المللی آن است»؛ و طبق ماده ۲، عمل متخلفانه دو رکن دارد: (الف) انتساب رفتار (فعل یا ترک فعل) به دولت بر اساس حقوق بین‌الملل، و (ب) نقض تعهد بین‌المللی دولت توسط آن رفتار.</w:t>
       </w:r>
       <w:r>
@@ -7502,7 +8171,7 @@
           <w:szCs w:val="28"/>
           <w:vertAlign w:val="superscript"/>
         </w:rPr>
-        <w:footnoteReference w:id="58"/>
+        <w:footnoteReference w:id="65"/>
       </w:r>
       <w:r>
         <w:rPr>
@@ -7600,7 +8269,7 @@
           <w:szCs w:val="26"/>
           <w:vertAlign w:val="superscript"/>
         </w:rPr>
-        <w:footnoteReference w:id="59"/>
+        <w:footnoteReference w:id="66"/>
       </w:r>
     </w:p>
     <w:p>
@@ -7649,7 +8318,7 @@
           <w:szCs w:val="28"/>
           <w:vertAlign w:val="superscript"/>
         </w:rPr>
-        <w:footnoteReference w:id="60"/>
+        <w:footnoteReference w:id="67"/>
       </w:r>
       <w:r>
         <w:rPr>
@@ -7670,7 +8339,7 @@
           <w:szCs w:val="28"/>
           <w:vertAlign w:val="superscript"/>
         </w:rPr>
-        <w:footnoteReference w:id="61"/>
+        <w:footnoteReference w:id="68"/>
       </w:r>
       <w:r>
         <w:rPr>
@@ -7691,7 +8360,7 @@
           <w:szCs w:val="28"/>
           <w:vertAlign w:val="superscript"/>
         </w:rPr>
-        <w:footnoteReference w:id="62"/>
+        <w:footnoteReference w:id="69"/>
       </w:r>
       <w:r>
         <w:rPr>
@@ -7712,7 +8381,7 @@
           <w:szCs w:val="28"/>
           <w:vertAlign w:val="superscript"/>
         </w:rPr>
-        <w:footnoteReference w:id="63"/>
+        <w:footnoteReference w:id="70"/>
       </w:r>
     </w:p>
     <w:p>
@@ -7913,7 +8582,7 @@
           <w:szCs w:val="28"/>
           <w:vertAlign w:val="superscript"/>
         </w:rPr>
-        <w:footnoteReference w:id="64"/>
+        <w:footnoteReference w:id="71"/>
       </w:r>
       <w:r>
         <w:rPr>
@@ -7953,7 +8622,7 @@
           <w:szCs w:val="28"/>
           <w:vertAlign w:val="superscript"/>
         </w:rPr>
-        <w:footnoteReference w:id="65"/>
+        <w:footnoteReference w:id="72"/>
       </w:r>
       <w:r>
         <w:rPr>
@@ -7993,7 +8662,7 @@
           <w:szCs w:val="28"/>
           <w:vertAlign w:val="superscript"/>
         </w:rPr>
-        <w:footnoteReference w:id="66"/>
+        <w:footnoteReference w:id="73"/>
       </w:r>
       <w:r>
         <w:rPr>
@@ -8204,7 +8873,7 @@
           <w:szCs w:val="28"/>
           <w:vertAlign w:val="superscript"/>
         </w:rPr>
-        <w:footnoteReference w:id="67"/>
+        <w:footnoteReference w:id="74"/>
       </w:r>
     </w:p>
     <w:p>
@@ -8234,7 +8903,7 @@
           <w:szCs w:val="28"/>
           <w:vertAlign w:val="superscript"/>
         </w:rPr>
-        <w:footnoteReference w:id="68"/>
+        <w:footnoteReference w:id="75"/>
       </w:r>
       <w:r>
         <w:rPr>
@@ -8274,7 +8943,7 @@
           <w:szCs w:val="28"/>
           <w:vertAlign w:val="superscript"/>
         </w:rPr>
-        <w:footnoteReference w:id="69"/>
+        <w:footnoteReference w:id="76"/>
       </w:r>
       <w:r>
         <w:rPr>
@@ -8314,7 +8983,7 @@
           <w:szCs w:val="28"/>
           <w:vertAlign w:val="superscript"/>
         </w:rPr>
-        <w:footnoteReference w:id="70"/>
+        <w:footnoteReference w:id="77"/>
       </w:r>
     </w:p>
     <w:p>
@@ -8344,7 +9013,7 @@
           <w:szCs w:val="28"/>
           <w:vertAlign w:val="superscript"/>
         </w:rPr>
-        <w:footnoteReference w:id="71"/>
+        <w:footnoteReference w:id="78"/>
       </w:r>
       <w:r>
         <w:rPr>
@@ -8403,7 +9072,7 @@
           <w:szCs w:val="28"/>
           <w:vertAlign w:val="superscript"/>
         </w:rPr>
-        <w:footnoteReference w:id="72"/>
+        <w:footnoteReference w:id="79"/>
       </w:r>
       <w:r>
         <w:rPr>
@@ -8443,7 +9112,7 @@
           <w:szCs w:val="28"/>
           <w:vertAlign w:val="superscript"/>
         </w:rPr>
-        <w:footnoteReference w:id="73"/>
+        <w:footnoteReference w:id="80"/>
       </w:r>
       <w:r>
         <w:rPr>
@@ -8540,7 +9209,7 @@
           <w:szCs w:val="28"/>
           <w:vertAlign w:val="superscript"/>
         </w:rPr>
-        <w:footnoteReference w:id="74"/>
+        <w:footnoteReference w:id="81"/>
       </w:r>
       <w:r>
         <w:rPr>
@@ -8808,7 +9477,7 @@
           <w:szCs w:val="28"/>
           <w:vertAlign w:val="superscript"/>
         </w:rPr>
-        <w:footnoteReference w:id="75"/>
+        <w:footnoteReference w:id="82"/>
       </w:r>
       <w:r>
         <w:rPr>
@@ -8981,7 +9650,7 @@
           <w:szCs w:val="28"/>
           <w:vertAlign w:val="superscript"/>
         </w:rPr>
-        <w:footnoteReference w:id="76"/>
+        <w:footnoteReference w:id="83"/>
       </w:r>
     </w:p>
     <w:p>
@@ -11011,7 +11680,7 @@
           <w:szCs w:val="28"/>
           <w:vertAlign w:val="superscript"/>
         </w:rPr>
-        <w:footnoteReference w:id="77"/>
+        <w:footnoteReference w:id="84"/>
       </w:r>
     </w:p>
     <w:p>
@@ -11041,7 +11710,7 @@
           <w:szCs w:val="28"/>
           <w:vertAlign w:val="superscript"/>
         </w:rPr>
-        <w:footnoteReference w:id="78"/>
+        <w:footnoteReference w:id="85"/>
       </w:r>
     </w:p>
     <w:p>
@@ -11071,7 +11740,7 @@
           <w:szCs w:val="28"/>
           <w:vertAlign w:val="superscript"/>
         </w:rPr>
-        <w:footnoteReference w:id="79"/>
+        <w:footnoteReference w:id="86"/>
       </w:r>
     </w:p>
     <w:p>
@@ -11101,7 +11770,7 @@
           <w:szCs w:val="28"/>
           <w:vertAlign w:val="superscript"/>
         </w:rPr>
-        <w:footnoteReference w:id="80"/>
+        <w:footnoteReference w:id="87"/>
       </w:r>
     </w:p>
     <w:p>
@@ -11131,7 +11800,7 @@
           <w:szCs w:val="28"/>
           <w:vertAlign w:val="superscript"/>
         </w:rPr>
-        <w:footnoteReference w:id="81"/>
+        <w:footnoteReference w:id="88"/>
       </w:r>
     </w:p>
     <w:p>
@@ -11161,7 +11830,7 @@
           <w:szCs w:val="28"/>
           <w:vertAlign w:val="superscript"/>
         </w:rPr>
-        <w:footnoteReference w:id="82"/>
+        <w:footnoteReference w:id="89"/>
       </w:r>
     </w:p>
     <w:p>
@@ -11191,7 +11860,7 @@
           <w:szCs w:val="28"/>
           <w:vertAlign w:val="superscript"/>
         </w:rPr>
-        <w:footnoteReference w:id="83"/>
+        <w:footnoteReference w:id="90"/>
       </w:r>
     </w:p>
     <w:p>
@@ -11221,7 +11890,7 @@
           <w:szCs w:val="28"/>
           <w:vertAlign w:val="superscript"/>
         </w:rPr>
-        <w:footnoteReference w:id="84"/>
+        <w:footnoteReference w:id="91"/>
       </w:r>
     </w:p>
     <w:p>
@@ -11251,7 +11920,7 @@
           <w:szCs w:val="28"/>
           <w:vertAlign w:val="superscript"/>
         </w:rPr>
-        <w:footnoteReference w:id="85"/>
+        <w:footnoteReference w:id="92"/>
       </w:r>
     </w:p>
     <w:p>
@@ -11281,7 +11950,7 @@
           <w:szCs w:val="28"/>
           <w:vertAlign w:val="superscript"/>
         </w:rPr>
-        <w:footnoteReference w:id="86"/>
+        <w:footnoteReference w:id="93"/>
       </w:r>
     </w:p>
     <w:p>
@@ -11330,7 +11999,7 @@
           <w:szCs w:val="28"/>
           <w:vertAlign w:val="superscript"/>
         </w:rPr>
-        <w:footnoteReference w:id="87"/>
+        <w:footnoteReference w:id="94"/>
       </w:r>
     </w:p>
     <w:p>
@@ -11360,7 +12029,7 @@
           <w:szCs w:val="28"/>
           <w:vertAlign w:val="superscript"/>
         </w:rPr>
-        <w:footnoteReference w:id="88"/>
+        <w:footnoteReference w:id="95"/>
       </w:r>
     </w:p>
     <w:p>
@@ -11390,7 +12059,7 @@
           <w:szCs w:val="28"/>
           <w:vertAlign w:val="superscript"/>
         </w:rPr>
-        <w:footnoteReference w:id="89"/>
+        <w:footnoteReference w:id="96"/>
       </w:r>
     </w:p>
     <w:p>
@@ -11420,7 +12089,7 @@
           <w:szCs w:val="28"/>
           <w:vertAlign w:val="superscript"/>
         </w:rPr>
-        <w:footnoteReference w:id="90"/>
+        <w:footnoteReference w:id="97"/>
       </w:r>
     </w:p>
     <w:p>
@@ -11450,7 +12119,7 @@
           <w:szCs w:val="28"/>
           <w:vertAlign w:val="superscript"/>
         </w:rPr>
-        <w:footnoteReference w:id="91"/>
+        <w:footnoteReference w:id="98"/>
       </w:r>
     </w:p>
     <w:p>
@@ -11480,7 +12149,7 @@
           <w:szCs w:val="28"/>
           <w:vertAlign w:val="superscript"/>
         </w:rPr>
-        <w:footnoteReference w:id="92"/>
+        <w:footnoteReference w:id="99"/>
       </w:r>
     </w:p>
     <w:p>
@@ -11510,7 +12179,7 @@
           <w:szCs w:val="28"/>
           <w:vertAlign w:val="superscript"/>
         </w:rPr>
-        <w:footnoteReference w:id="93"/>
+        <w:footnoteReference w:id="100"/>
       </w:r>
     </w:p>
     <w:p>
@@ -11540,7 +12209,7 @@
           <w:szCs w:val="28"/>
           <w:vertAlign w:val="superscript"/>
         </w:rPr>
-        <w:footnoteReference w:id="94"/>
+        <w:footnoteReference w:id="101"/>
       </w:r>
     </w:p>
     <w:p>
@@ -11570,7 +12239,7 @@
           <w:szCs w:val="28"/>
           <w:vertAlign w:val="superscript"/>
         </w:rPr>
-        <w:footnoteReference w:id="95"/>
+        <w:footnoteReference w:id="102"/>
       </w:r>
     </w:p>
     <w:p>
@@ -12399,7 +13068,7 @@
           <w:sz w:val="20"/>
           <w:szCs w:val="20"/>
         </w:rPr>
-        <w:t xml:space="preserve">قانون اساسی جمهوری اسلامی ایران، اصل ۵.</w:t>
+        <w:t xml:space="preserve">کنوانسیون وین حقوق معاهدات، مواد ۳۱ و ۳۲.</w:t>
       </w:r>
     </w:p>
   </w:footnote>
@@ -12432,7 +13101,7 @@
           <w:sz w:val="20"/>
           <w:szCs w:val="20"/>
         </w:rPr>
-        <w:t xml:space="preserve">قانون اساسی جمهوری اسلامی ایران، اصل ۵۷.</w:t>
+        <w:t xml:space="preserve">کنوانسیون وین حقوق معاهدات، ماده ۳۲.</w:t>
       </w:r>
     </w:p>
   </w:footnote>
@@ -12465,7 +13134,7 @@
           <w:sz w:val="20"/>
           <w:szCs w:val="20"/>
         </w:rPr>
-        <w:t xml:space="preserve">قانون اساسی جمهوری اسلامی ایران، اصل ۷۷.</w:t>
+        <w:t xml:space="preserve">قانون اساسی جمهوری اسلامی ایران، اصل ۵.</w:t>
       </w:r>
     </w:p>
   </w:footnote>
@@ -12498,7 +13167,7 @@
           <w:sz w:val="20"/>
           <w:szCs w:val="20"/>
         </w:rPr>
-        <w:t xml:space="preserve">قانون اساسی جمهوری اسلامی ایران، اصل ۱۲۵.</w:t>
+        <w:t xml:space="preserve">قانون اساسی جمهوری اسلامی ایران، اصل ۵۷.</w:t>
       </w:r>
     </w:p>
   </w:footnote>
@@ -12531,7 +13200,7 @@
           <w:sz w:val="20"/>
           <w:szCs w:val="20"/>
         </w:rPr>
-        <w:t xml:space="preserve">قانون اساسی جمهوری اسلامی ایران، اصل ۱۱۰.</w:t>
+        <w:t xml:space="preserve">قانون اساسی جمهوری اسلامی ایران، اصل ۷۷.</w:t>
       </w:r>
     </w:p>
   </w:footnote>
@@ -12564,7 +13233,7 @@
           <w:sz w:val="20"/>
           <w:szCs w:val="20"/>
         </w:rPr>
-        <w:t xml:space="preserve">قانون اساسی جمهوری اسلامی ایران، اصل ۱۱۲ (به‌اجمال).</w:t>
+        <w:t xml:space="preserve">قانون اساسی جمهوری اسلامی ایران، اصل ۱۲۵.</w:t>
       </w:r>
     </w:p>
   </w:footnote>
@@ -12597,7 +13266,7 @@
           <w:sz w:val="20"/>
           <w:szCs w:val="20"/>
         </w:rPr>
-        <w:t xml:space="preserve">قانون اساسی جمهوری اسلامی ایران، اصول ۱۵۲، ۱۵۳ و ۱۵۴ (به‌اجمال).</w:t>
+        <w:t xml:space="preserve">قانون اساسی جمهوری اسلامی ایران، اصل ۱۱۰.</w:t>
       </w:r>
     </w:p>
   </w:footnote>
@@ -12630,7 +13299,7 @@
           <w:sz w:val="20"/>
           <w:szCs w:val="20"/>
         </w:rPr>
-        <w:t xml:space="preserve">قانون اساسی جمهوری اسلامی ایران، اصل ۱۷۶ (به‌اجمال).</w:t>
+        <w:t xml:space="preserve">قانون اساسی جمهوری اسلامی ایران، اصل ۱۱۲ (به‌اجمال).</w:t>
       </w:r>
     </w:p>
   </w:footnote>
@@ -12663,7 +13332,7 @@
           <w:sz w:val="20"/>
           <w:szCs w:val="20"/>
         </w:rPr>
-        <w:t xml:space="preserve">سوره مائده، آیه ۱.</w:t>
+        <w:t xml:space="preserve">قانون اساسی جمهوری اسلامی ایران، اصول ۱۵۲، ۱۵۳ و ۱۵۴ (به‌اجمال).</w:t>
       </w:r>
     </w:p>
   </w:footnote>
@@ -12696,7 +13365,7 @@
           <w:sz w:val="20"/>
           <w:szCs w:val="20"/>
         </w:rPr>
-        <w:t xml:space="preserve">ر.ک: شیخ انصاری، مرتضی، المکاسب، کتاب البیع (مشخصات چاپ، نیازمند بررسی منبع اصلی است)؛ و بجنوردی، سیدمحمدحسن، القواعد الفقهیه، ج ۴، قاعده لزوم (مشخصات چاپ، نیازمند بررسی منبع اصلی است).</w:t>
+        <w:t xml:space="preserve">قانون اساسی جمهوری اسلامی ایران، اصل ۱۷۶ (به‌اجمال).</w:t>
       </w:r>
     </w:p>
   </w:footnote>
@@ -12729,7 +13398,7 @@
           <w:sz w:val="20"/>
           <w:szCs w:val="20"/>
         </w:rPr>
-        <w:t xml:space="preserve">سوره نحل، آیات ۹۱ و ۹۲.</w:t>
+        <w:t xml:space="preserve">سوره مائده، آیه ۱.</w:t>
       </w:r>
     </w:p>
   </w:footnote>
@@ -12762,7 +13431,7 @@
           <w:sz w:val="20"/>
           <w:szCs w:val="20"/>
         </w:rPr>
-        <w:t xml:space="preserve">ر.ک: علامه طباطبایی، سیدمحمدحسین، المیزان فی تفسیر القرآن، ذیل آیه ۹۱ نحل (مشخصات چاپ، نیازمند بررسی منبع اصلی است).</w:t>
+        <w:t xml:space="preserve">ر.ک: شیخ انصاری، مرتضی، المکاسب، کتاب البیع (مشخصات چاپ، نیازمند بررسی منبع اصلی است)؛ و بجنوردی، سیدمحمدحسن، القواعد الفقهیه، ج ۴، قاعده لزوم (مشخصات چاپ، نیازمند بررسی منبع اصلی است).</w:t>
       </w:r>
     </w:p>
   </w:footnote>
@@ -12795,7 +13464,7 @@
           <w:sz w:val="20"/>
           <w:szCs w:val="20"/>
         </w:rPr>
-        <w:t xml:space="preserve">سوره اسراء، آیه ۳۴.</w:t>
+        <w:t xml:space="preserve">سوره نحل، آیات ۹۱ و ۹۲.</w:t>
       </w:r>
     </w:p>
   </w:footnote>
@@ -12828,7 +13497,7 @@
           <w:sz w:val="20"/>
           <w:szCs w:val="20"/>
         </w:rPr>
-        <w:t xml:space="preserve">سوره رعد، آیات ۲۰ تا ۲۵.</w:t>
+        <w:t xml:space="preserve">ر.ک: علامه طباطبایی، سیدمحمدحسین، المیزان فی تفسیر القرآن، ذیل آیه ۹۱ نحل (مشخصات چاپ، نیازمند بررسی منبع اصلی است).</w:t>
       </w:r>
     </w:p>
   </w:footnote>
@@ -12861,7 +13530,7 @@
           <w:sz w:val="20"/>
           <w:szCs w:val="20"/>
         </w:rPr>
-        <w:t xml:space="preserve">سوره مؤمنون، آیه ۸؛ و نیز سوره معارج، آیه ۳۲.</w:t>
+        <w:t xml:space="preserve">سوره اسراء، آیه ۳۴.</w:t>
       </w:r>
     </w:p>
   </w:footnote>
@@ -12894,7 +13563,7 @@
           <w:sz w:val="20"/>
           <w:szCs w:val="20"/>
         </w:rPr>
-        <w:t xml:space="preserve">سوره توبه، آیه ۴.</w:t>
+        <w:t xml:space="preserve">سوره رعد، آیات ۲۰ تا ۲۵.</w:t>
       </w:r>
     </w:p>
   </w:footnote>
@@ -12927,7 +13596,7 @@
           <w:sz w:val="20"/>
           <w:szCs w:val="20"/>
         </w:rPr>
-        <w:t xml:space="preserve">سوره توبه، آیه ۷.</w:t>
+        <w:t xml:space="preserve">سوره مؤمنون، آیه ۸؛ و نیز سوره معارج، آیه ۳۲.</w:t>
       </w:r>
     </w:p>
   </w:footnote>
@@ -12960,7 +13629,7 @@
           <w:sz w:val="20"/>
           <w:szCs w:val="20"/>
         </w:rPr>
-        <w:t xml:space="preserve">سوره انفال، آیه ۵۸.</w:t>
+        <w:t xml:space="preserve">سوره توبه، آیه ۴.</w:t>
       </w:r>
     </w:p>
   </w:footnote>
@@ -12993,7 +13662,7 @@
           <w:sz w:val="20"/>
           <w:szCs w:val="20"/>
         </w:rPr>
-        <w:t xml:space="preserve">سوره انفال، آیه ۷۲.</w:t>
+        <w:t xml:space="preserve">سوره توبه، آیه ۷.</w:t>
       </w:r>
     </w:p>
   </w:footnote>
@@ -13026,7 +13695,7 @@
           <w:sz w:val="20"/>
           <w:szCs w:val="20"/>
         </w:rPr>
-        <w:t xml:space="preserve">حر عاملی، محمد بن حسن، وسائل الشیعه، ابواب خیارات (مشخصات چاپ و نشانی دقیق، نیازمند بررسی منبع اصلی است).</w:t>
+        <w:t xml:space="preserve">سوره انفال، آیه ۵۸.</w:t>
       </w:r>
     </w:p>
   </w:footnote>
@@ -13059,7 +13728,7 @@
           <w:sz w:val="20"/>
           <w:szCs w:val="20"/>
         </w:rPr>
-        <w:t xml:space="preserve">برای بررسی سندی، ر.ک: مجلسی، محمدباقر، بحار الانوار (نشانی دقیق، نیازمند بررسی منبع اصلی است).</w:t>
+        <w:t xml:space="preserve">سوره انفال، آیه ۷۲.</w:t>
       </w:r>
     </w:p>
   </w:footnote>
@@ -13092,7 +13761,7 @@
           <w:sz w:val="20"/>
           <w:szCs w:val="20"/>
         </w:rPr>
-        <w:t xml:space="preserve">نهج‌البلاغه، نامه ۵۳ (عهدنامه مالک اشتر).</w:t>
+        <w:t xml:space="preserve">حر عاملی، محمد بن حسن، وسائل الشیعه، ابواب خیارات (مشخصات چاپ و نشانی دقیق، نیازمند بررسی منبع اصلی است).</w:t>
       </w:r>
     </w:p>
   </w:footnote>
@@ -13125,7 +13794,7 @@
           <w:sz w:val="20"/>
           <w:szCs w:val="20"/>
         </w:rPr>
-        <w:t xml:space="preserve">کلینی، محمد بن یعقوب، الکافی (نشانی دقیق، نیازمند بررسی منبع اصلی است).</w:t>
+        <w:t xml:space="preserve">برای بررسی سندی، ر.ک: مجلسی، محمدباقر، بحار الانوار (نشانی دقیق، نیازمند بررسی منبع اصلی است).</w:t>
       </w:r>
     </w:p>
   </w:footnote>
@@ -13158,7 +13827,7 @@
           <w:sz w:val="20"/>
           <w:szCs w:val="20"/>
         </w:rPr>
-        <w:t xml:space="preserve">حر عاملی، محمد بن حسن، وسائل الشیعه، ابواب جهاد و ابواب احکام عقود (نشانی دقیق، نیازمند بررسی منبع اصلی است).</w:t>
+        <w:t xml:space="preserve">نهج‌البلاغه، نامه ۵۳ (عهدنامه مالک اشتر).</w:t>
       </w:r>
     </w:p>
   </w:footnote>
@@ -13191,7 +13860,7 @@
           <w:sz w:val="20"/>
           <w:szCs w:val="20"/>
         </w:rPr>
-        <w:t xml:space="preserve">ر.ک: ابن‌هشام، السیرة النبویة، ماجرای حدیبیه (مشخصات چاپ، نیازمند بررسی منبع اصلی است).</w:t>
+        <w:t xml:space="preserve">کلینی، محمد بن یعقوب، الکافی (نشانی دقیق، نیازمند بررسی منبع اصلی است).</w:t>
       </w:r>
     </w:p>
   </w:footnote>
@@ -13224,7 +13893,7 @@
           <w:sz w:val="20"/>
           <w:szCs w:val="20"/>
         </w:rPr>
-        <w:t xml:space="preserve">سوره توبه، آیات ۱ تا ۴؛ و ر.ک: طبری، تاریخ الامم و الملوک، ماجرای فتح مکه (مشخصات چاپ، نیازمند بررسی منبع اصلی است).</w:t>
+        <w:t xml:space="preserve">حر عاملی، محمد بن حسن، وسائل الشیعه، ابواب جهاد و ابواب احکام عقود (نشانی دقیق، نیازمند بررسی منبع اصلی است).</w:t>
       </w:r>
     </w:p>
   </w:footnote>
@@ -13257,7 +13926,7 @@
           <w:sz w:val="20"/>
           <w:szCs w:val="20"/>
         </w:rPr>
-        <w:t xml:space="preserve">ر.ک: نهج‌البلاغه، خطبه‌ها و نامه‌های مربوط به صفین (نشانی دقیق، نیازمند بررسی منبع اصلی است).</w:t>
+        <w:t xml:space="preserve">ر.ک: ابن‌هشام، السیرة النبویة، ماجرای حدیبیه (مشخصات چاپ، نیازمند بررسی منبع اصلی است).</w:t>
       </w:r>
     </w:p>
   </w:footnote>
@@ -13290,7 +13959,7 @@
           <w:sz w:val="20"/>
           <w:szCs w:val="20"/>
         </w:rPr>
-        <w:t xml:space="preserve">ر.ک: آخوند خراسانی، محمدکاظم، کفایة الاصول، مبحث ملازمه عقلیه (مشخصات چاپ، نیازمند بررسی منبع اصلی است).</w:t>
+        <w:t xml:space="preserve">سوره توبه، آیات ۱ تا ۴؛ و ر.ک: طبری، تاریخ الامم و الملوک، ماجرای فتح مکه (مشخصات چاپ، نیازمند بررسی منبع اصلی است).</w:t>
       </w:r>
     </w:p>
   </w:footnote>
@@ -13323,7 +13992,7 @@
           <w:sz w:val="20"/>
           <w:szCs w:val="20"/>
         </w:rPr>
-        <w:t xml:space="preserve">ر.ک: میرزای نائینی، محمدحسین، فوائد الاصول، مبحث بنای عقلا (مشخصات چاپ، نیازمند بررسی منبع اصلی است).</w:t>
+        <w:t xml:space="preserve">ر.ک: نهج‌البلاغه، خطبه‌ها و نامه‌های مربوط به صفین (نشانی دقیق، نیازمند بررسی منبع اصلی است).</w:t>
       </w:r>
     </w:p>
   </w:footnote>
@@ -13356,7 +14025,7 @@
           <w:sz w:val="20"/>
           <w:szCs w:val="20"/>
         </w:rPr>
-        <w:t xml:space="preserve">ر.ک: آخوند خراسانی، محمدکاظم، کفایة الاصول، مبحث تزاحم؛ و میرزای نائینی، محمدحسین، فوائد الاصول، مبحث تزاحم (مشخصات چاپ، نیازمند بررسی منبع اصلی است).</w:t>
+        <w:t xml:space="preserve">ر.ک: آخوند خراسانی، محمدکاظم، کفایة الاصول، مبحث ملازمه عقلیه (مشخصات چاپ، نیازمند بررسی منبع اصلی است).</w:t>
       </w:r>
     </w:p>
   </w:footnote>
@@ -13389,7 +14058,7 @@
           <w:sz w:val="20"/>
           <w:szCs w:val="20"/>
         </w:rPr>
-        <w:t xml:space="preserve">امام خمینی، سیدروح‌الله، صحیفه امام، نامه به حجت‌الاسلام قدیری (نشانی دقیق، نیازمند بررسی منبع اصلی است).</w:t>
+        <w:t xml:space="preserve">ر.ک: میرزای نائینی، محمدحسین، فوائد الاصول، مبحث بنای عقلا (مشخصات چاپ، نیازمند بررسی منبع اصلی است).</w:t>
       </w:r>
     </w:p>
   </w:footnote>
@@ -13422,7 +14091,7 @@
           <w:sz w:val="20"/>
           <w:szCs w:val="20"/>
         </w:rPr>
-        <w:t xml:space="preserve">شیخ صدوق، محمد بن علی، من لایحضره الفقیه؛ و کلینی، محمد بن یعقوب، الکافی (نشانی دقیق، نیازمند بررسی منبع اصلی است).</w:t>
+        <w:t xml:space="preserve">بجنوردی، سیدمحمدحسن، القواعد الفقهیه، ج ۴، قاعده لزوم (مشخصات چاپ، نیازمند بررسی منبع اصلی است).</w:t>
       </w:r>
     </w:p>
   </w:footnote>
@@ -13455,7 +14124,7 @@
           <w:sz w:val="20"/>
           <w:szCs w:val="20"/>
         </w:rPr>
-        <w:t xml:space="preserve">سوره حج، آیه ۷۸.</w:t>
+        <w:t xml:space="preserve">سوره انفال، آیه ۵۸.</w:t>
       </w:r>
     </w:p>
   </w:footnote>
@@ -13488,7 +14157,7 @@
           <w:sz w:val="20"/>
           <w:szCs w:val="20"/>
         </w:rPr>
-        <w:t xml:space="preserve">امام خمینی، سیدروح‌الله، صحیفه امام (نشانی دقیق، نیازمند بررسی منبع اصلی است).</w:t>
+        <w:t xml:space="preserve">حر عاملی، محمد بن حسن، وسائل الشیعه، ابواب جهاد (نشانی دقیق، نیازمند بررسی منبع اصلی است).</w:t>
       </w:r>
     </w:p>
   </w:footnote>
@@ -13521,7 +14190,7 @@
           <w:sz w:val="20"/>
           <w:szCs w:val="20"/>
         </w:rPr>
-        <w:t xml:space="preserve">طرح مواد کمیسیون حقوق بین‌الملل درباره مسئولیت بین‌المللی دولت‌ها (۲۰۰۱). ر.ک: گزارش‌های کمیسیون حقوق بین‌الملل (نشانی دقیق، نیازمند بررسی منبع اصلی است).</w:t>
+        <w:t xml:space="preserve">سوره نساء، آیه ۱۴۱.</w:t>
       </w:r>
     </w:p>
   </w:footnote>
@@ -13554,7 +14223,7 @@
           <w:sz w:val="20"/>
           <w:szCs w:val="20"/>
         </w:rPr>
-        <w:t xml:space="preserve">طرح مواد مسئولیت بین‌المللی دولت‌ها، مواد ۱ و ۲.</w:t>
+        <w:t xml:space="preserve">ر.ک: آخوند خراسانی، محمدکاظم، کفایة الاصول، مبحث تزاحم؛ و میرزای نائینی، محمدحسین، فوائد الاصول، مبحث تزاحم (مشخصات چاپ، نیازمند بررسی منبع اصلی است).</w:t>
       </w:r>
     </w:p>
   </w:footnote>
@@ -13587,7 +14256,7 @@
           <w:sz w:val="20"/>
           <w:szCs w:val="20"/>
         </w:rPr>
-        <w:t xml:space="preserve">طرح مواد مسئولیت بین‌المللی دولت‌ها، ماده ۴.</w:t>
+        <w:t xml:space="preserve">امام خمینی، سیدروح‌الله، صحیفه امام، نامه به حجت‌الاسلام قدیری (نشانی دقیق، نیازمند بررسی منبع اصلی است).</w:t>
       </w:r>
     </w:p>
   </w:footnote>
@@ -13620,7 +14289,7 @@
           <w:sz w:val="20"/>
           <w:szCs w:val="20"/>
         </w:rPr>
-        <w:t xml:space="preserve">طرح مواد مسئولیت بین‌المللی دولت‌ها، ماده ۷.</w:t>
+        <w:t xml:space="preserve">شیخ صدوق، محمد بن علی، من لایحضره الفقیه؛ و کلینی، محمد بن یعقوب، الکافی (نشانی دقیق، نیازمند بررسی منبع اصلی است).</w:t>
       </w:r>
     </w:p>
   </w:footnote>
@@ -13653,7 +14322,7 @@
           <w:sz w:val="20"/>
           <w:szCs w:val="20"/>
         </w:rPr>
-        <w:t xml:space="preserve">طرح مواد مسئولیت بین‌المللی دولت‌ها، ماده ۸.</w:t>
+        <w:t xml:space="preserve">سوره حج، آیه ۷۸.</w:t>
       </w:r>
     </w:p>
   </w:footnote>
@@ -13686,7 +14355,7 @@
           <w:sz w:val="20"/>
           <w:szCs w:val="20"/>
         </w:rPr>
-        <w:t xml:space="preserve">طرح مواد مسئولیت بین‌المللی دولت‌ها، ماده ۱۱.</w:t>
+        <w:t xml:space="preserve">امام خمینی، سیدروح‌الله، صحیفه امام (نشانی دقیق، نیازمند بررسی منبع اصلی است).</w:t>
       </w:r>
     </w:p>
   </w:footnote>
@@ -13719,7 +14388,7 @@
           <w:sz w:val="20"/>
           <w:szCs w:val="20"/>
         </w:rPr>
-        <w:t xml:space="preserve">قضیه کارکنان دیپلماتیک و کنسولی ایالات متحده در تهران (ایالات متحده علیه ایران)، رأی دیوان بین‌المللی دادگستری، ۱۹۸۰.</w:t>
+        <w:t xml:space="preserve">طرح مواد کمیسیون حقوق بین‌الملل درباره مسئولیت بین‌المللی دولت‌ها (۲۰۰۱). ر.ک: گزارش‌های کمیسیون حقوق بین‌الملل (نشانی دقیق، نیازمند بررسی منبع اصلی است).</w:t>
       </w:r>
     </w:p>
   </w:footnote>
@@ -13752,7 +14421,7 @@
           <w:sz w:val="20"/>
           <w:szCs w:val="20"/>
         </w:rPr>
-        <w:t xml:space="preserve">طرح مواد مسئولیت بین‌المللی دولت‌ها، ماده ۱۲.</w:t>
+        <w:t xml:space="preserve">قضیه فعالیت‌های نظامی و شبه‌نظامی در نیکاراگوئه و علیه آن (نیکاراگوئه علیه ایالات متحده)، رأی دیوان بین‌المللی دادگستری، ۱۹۸۶.</w:t>
       </w:r>
     </w:p>
   </w:footnote>
@@ -13785,7 +14454,7 @@
           <w:sz w:val="20"/>
           <w:szCs w:val="20"/>
         </w:rPr>
-        <w:t xml:space="preserve">طرح مواد مسئولیت بین‌المللی دولت‌ها، مواد ۱۴ و ۱۵ (به‌اجمال).</w:t>
+        <w:t xml:space="preserve">طرح مواد مسئولیت بین‌المللی دولت‌ها، مواد ۱ و ۲.</w:t>
       </w:r>
     </w:p>
   </w:footnote>
@@ -13818,7 +14487,7 @@
           <w:sz w:val="20"/>
           <w:szCs w:val="20"/>
         </w:rPr>
-        <w:t xml:space="preserve">طرح مواد مسئولیت بین‌المللی دولت‌ها، ماده ۳۲.</w:t>
+        <w:t xml:space="preserve">طرح مواد مسئولیت بین‌المللی دولت‌ها، ماده ۴.</w:t>
       </w:r>
     </w:p>
   </w:footnote>
@@ -13851,7 +14520,7 @@
           <w:sz w:val="20"/>
           <w:szCs w:val="20"/>
         </w:rPr>
-        <w:t xml:space="preserve">طرح مواد مسئولیت بین‌المللی دولت‌ها، مواد ۲۰ تا ۲۵.</w:t>
+        <w:t xml:space="preserve">طرح مواد مسئولیت بین‌المللی دولت‌ها، ماده ۷.</w:t>
       </w:r>
     </w:p>
   </w:footnote>
@@ -13884,7 +14553,7 @@
           <w:sz w:val="20"/>
           <w:szCs w:val="20"/>
         </w:rPr>
-        <w:t xml:space="preserve">طرح مواد مسئولیت بین‌المللی دولت‌ها، ماده ۲۵.</w:t>
+        <w:t xml:space="preserve">طرح مواد مسئولیت بین‌المللی دولت‌ها، ماده ۸.</w:t>
       </w:r>
     </w:p>
   </w:footnote>
@@ -13917,7 +14586,7 @@
           <w:sz w:val="20"/>
           <w:szCs w:val="20"/>
         </w:rPr>
-        <w:t xml:space="preserve">طرح مواد مسئولیت بین‌المللی دولت‌ها، مواد ۲۲ و ۴۹ تا ۵۴ (به‌اجمال).</w:t>
+        <w:t xml:space="preserve">طرح مواد مسئولیت بین‌المللی دولت‌ها، ماده ۱۱.</w:t>
       </w:r>
     </w:p>
   </w:footnote>
@@ -13950,7 +14619,7 @@
           <w:sz w:val="20"/>
           <w:szCs w:val="20"/>
         </w:rPr>
-        <w:t xml:space="preserve">طرح مواد مسئولیت بین‌المللی دولت‌ها، ماده ۲۳.</w:t>
+        <w:t xml:space="preserve">قضیه کارکنان دیپلماتیک و کنسولی ایالات متحده در تهران (ایالات متحده علیه ایران)، رأی دیوان بین‌المللی دادگستری، ۱۹۸۰.</w:t>
       </w:r>
     </w:p>
   </w:footnote>
@@ -13983,7 +14652,7 @@
           <w:sz w:val="20"/>
           <w:szCs w:val="20"/>
         </w:rPr>
-        <w:t xml:space="preserve">طرح مواد مسئولیت بین‌المللی دولت‌ها، ماده ۲۶.</w:t>
+        <w:t xml:space="preserve">طرح مواد مسئولیت بین‌المللی دولت‌ها، ماده ۱۲.</w:t>
       </w:r>
     </w:p>
   </w:footnote>
@@ -14016,7 +14685,7 @@
           <w:sz w:val="20"/>
           <w:szCs w:val="20"/>
         </w:rPr>
-        <w:t xml:space="preserve">طرح مواد مسئولیت بین‌المللی دولت‌ها، مواد ۳۰، ۳۱ و ۳۴ تا ۳۷.</w:t>
+        <w:t xml:space="preserve">طرح مواد مسئولیت بین‌المللی دولت‌ها، مواد ۱۴ و ۱۵ (به‌اجمال).</w:t>
       </w:r>
     </w:p>
   </w:footnote>
@@ -14049,7 +14718,7 @@
           <w:sz w:val="20"/>
           <w:szCs w:val="20"/>
         </w:rPr>
-        <w:t xml:space="preserve">کنوانسیون وین حقوق معاهدات، مواد ۷۰ و ۷۲.</w:t>
+        <w:t xml:space="preserve">طرح مواد مسئولیت بین‌المللی دولت‌ها، ماده ۳۲.</w:t>
       </w:r>
     </w:p>
   </w:footnote>
@@ -14082,7 +14751,7 @@
           <w:sz w:val="20"/>
           <w:szCs w:val="20"/>
         </w:rPr>
-        <w:t xml:space="preserve">کنوانسیون وین حقوق معاهدات، مواد ۱۹ تا ۲۳.</w:t>
+        <w:t xml:space="preserve">طرح مواد مسئولیت بین‌المللی دولت‌ها، مواد ۲۰ تا ۲۵.</w:t>
       </w:r>
     </w:p>
   </w:footnote>
@@ -14115,7 +14784,7 @@
           <w:sz w:val="20"/>
           <w:szCs w:val="20"/>
         </w:rPr>
-        <w:t xml:space="preserve">قانون اساسی جمهوری اسلامی ایران، اصل ۵.</w:t>
+        <w:t xml:space="preserve">طرح مواد مسئولیت بین‌المللی دولت‌ها، ماده ۲۵.</w:t>
       </w:r>
     </w:p>
   </w:footnote>
@@ -14148,7 +14817,7 @@
           <w:sz w:val="20"/>
           <w:szCs w:val="20"/>
         </w:rPr>
-        <w:t xml:space="preserve">برای صورت‌بندی دو دیدگاه، ر.ک: «ولایت مطلقه فقیه در قانون اساسی» و «مفهوم ولایت مطلقه فقیه در قانون اساسی جمهوری اسلامی ایران»، پایگاه اطلاع‌رسانی حوزه، به نشانی‌های یادشده در پیشینه پژوهش. همچنین ر.ک: سیدابوالفضل قاضی شریعت‌پناهی، حقوق اساسی و نهادهای سیاسی؛ و سیدمحمد هاشمی، حقوق اساسی جمهوری اسلامی ایران.</w:t>
+        <w:t xml:space="preserve">طرح مواد مسئولیت بین‌المللی دولت‌ها، مواد ۲۲ و ۴۹ تا ۵۴ (به‌اجمال).</w:t>
       </w:r>
     </w:p>
   </w:footnote>
@@ -14181,7 +14850,7 @@
           <w:sz w:val="20"/>
           <w:szCs w:val="20"/>
         </w:rPr>
-        <w:t xml:space="preserve">قانون اساسی جمهوری اسلامی ایران، اصل ۵.</w:t>
+        <w:t xml:space="preserve">طرح مواد مسئولیت بین‌المللی دولت‌ها، ماده ۲۳.</w:t>
       </w:r>
     </w:p>
   </w:footnote>
@@ -14214,7 +14883,7 @@
           <w:sz w:val="20"/>
           <w:szCs w:val="20"/>
         </w:rPr>
-        <w:t xml:space="preserve">قانون اساسی جمهوری اسلامی ایران، اصل ۵۷.</w:t>
+        <w:t xml:space="preserve">طرح مواد مسئولیت بین‌المللی دولت‌ها، ماده ۲۶.</w:t>
       </w:r>
     </w:p>
   </w:footnote>
@@ -14247,7 +14916,7 @@
           <w:sz w:val="20"/>
           <w:szCs w:val="20"/>
         </w:rPr>
-        <w:t xml:space="preserve">قانون اساسی جمهوری اسلامی ایران، اصل ۷۷.</w:t>
+        <w:t xml:space="preserve">طرح مواد مسئولیت بین‌المللی دولت‌ها، مواد ۳۰، ۳۱ و ۳۴ تا ۳۷.</w:t>
       </w:r>
     </w:p>
   </w:footnote>
@@ -14280,7 +14949,7 @@
           <w:sz w:val="20"/>
           <w:szCs w:val="20"/>
         </w:rPr>
-        <w:t xml:space="preserve">قانون اساسی جمهوری اسلامی ایران، اصل ۱۱۰.</w:t>
+        <w:t xml:space="preserve">کنوانسیون وین حقوق معاهدات، مواد ۷۰ و ۷۲.</w:t>
       </w:r>
     </w:p>
   </w:footnote>
@@ -14313,7 +14982,7 @@
           <w:sz w:val="20"/>
           <w:szCs w:val="20"/>
         </w:rPr>
-        <w:t xml:space="preserve">قانون اساسی جمهوری اسلامی ایران، اصل ۱۱۲.</w:t>
+        <w:t xml:space="preserve">کنوانسیون وین حقوق معاهدات، مواد ۱۹ تا ۲۳.</w:t>
       </w:r>
     </w:p>
   </w:footnote>
@@ -14346,7 +15015,7 @@
           <w:sz w:val="20"/>
           <w:szCs w:val="20"/>
         </w:rPr>
-        <w:t xml:space="preserve">قانون اساسی جمهوری اسلامی ایران، اصل ۱۲۵.</w:t>
+        <w:t xml:space="preserve">قانون اساسی جمهوری اسلامی ایران، اصل ۵.</w:t>
       </w:r>
     </w:p>
   </w:footnote>
@@ -14379,7 +15048,7 @@
           <w:sz w:val="20"/>
           <w:szCs w:val="20"/>
         </w:rPr>
-        <w:t xml:space="preserve">قانون اساسی جمهوری اسلامی ایران، اصل ۱۵۲.</w:t>
+        <w:t xml:space="preserve">برای صورت‌بندی دو دیدگاه، ر.ک: «ولایت مطلقه فقیه در قانون اساسی» و «مفهوم ولایت مطلقه فقیه در قانون اساسی جمهوری اسلامی ایران»، پایگاه اطلاع‌رسانی حوزه، به نشانی‌های یادشده در پیشینه پژوهش. همچنین ر.ک: سیدابوالفضل قاضی شریعت‌پناهی، حقوق اساسی و نهادهای سیاسی؛ و سیدمحمد هاشمی، حقوق اساسی جمهوری اسلامی ایران.</w:t>
       </w:r>
     </w:p>
   </w:footnote>
@@ -14412,7 +15081,7 @@
           <w:sz w:val="20"/>
           <w:szCs w:val="20"/>
         </w:rPr>
-        <w:t xml:space="preserve">قانون اساسی جمهوری اسلامی ایران، اصل ۱۵۳.</w:t>
+        <w:t xml:space="preserve">قانون اساسی جمهوری اسلامی ایران، اصل ۵.</w:t>
       </w:r>
     </w:p>
   </w:footnote>
@@ -14445,7 +15114,7 @@
           <w:sz w:val="20"/>
           <w:szCs w:val="20"/>
         </w:rPr>
-        <w:t xml:space="preserve">قانون اساسی جمهوری اسلامی ایران، اصل ۱۵۴.</w:t>
+        <w:t xml:space="preserve">قانون اساسی جمهوری اسلامی ایران، اصل ۵۷.</w:t>
       </w:r>
     </w:p>
   </w:footnote>
@@ -14478,7 +15147,7 @@
           <w:sz w:val="20"/>
           <w:szCs w:val="20"/>
         </w:rPr>
-        <w:t xml:space="preserve">قانون اساسی جمهوری اسلامی ایران، اصل ۱۷۶ (به‌اجمال).</w:t>
+        <w:t xml:space="preserve">قانون اساسی جمهوری اسلامی ایران، اصل ۷۷.</w:t>
       </w:r>
     </w:p>
   </w:footnote>
@@ -14511,7 +15180,7 @@
           <w:sz w:val="20"/>
           <w:szCs w:val="20"/>
         </w:rPr>
-        <w:t xml:space="preserve">کنوانسیون وین حقوق معاهدات، ماده ۱.</w:t>
+        <w:t xml:space="preserve">قانون اساسی جمهوری اسلامی ایران، اصل ۱۱۰.</w:t>
       </w:r>
     </w:p>
   </w:footnote>
@@ -14544,7 +15213,7 @@
           <w:sz w:val="20"/>
           <w:szCs w:val="20"/>
         </w:rPr>
-        <w:t xml:space="preserve">کنوانسیون وین حقوق معاهدات، ماده ۲ (به‌اجمال).</w:t>
+        <w:t xml:space="preserve">قانون اساسی جمهوری اسلامی ایران، اصل ۱۱۲.</w:t>
       </w:r>
     </w:p>
   </w:footnote>
@@ -14577,7 +15246,7 @@
           <w:sz w:val="20"/>
           <w:szCs w:val="20"/>
         </w:rPr>
-        <w:t xml:space="preserve">کنوانسیون وین حقوق معاهدات، ماده ۲۶.</w:t>
+        <w:t xml:space="preserve">قانون اساسی جمهوری اسلامی ایران، اصل ۱۲۵.</w:t>
       </w:r>
     </w:p>
   </w:footnote>
@@ -14610,7 +15279,7 @@
           <w:sz w:val="20"/>
           <w:szCs w:val="20"/>
         </w:rPr>
-        <w:t xml:space="preserve">کنوانسیون وین حقوق معاهدات، ماده ۲۷.</w:t>
+        <w:t xml:space="preserve">قانون اساسی جمهوری اسلامی ایران، اصل ۱۵۲.</w:t>
       </w:r>
     </w:p>
   </w:footnote>
@@ -14643,7 +15312,7 @@
           <w:sz w:val="20"/>
           <w:szCs w:val="20"/>
         </w:rPr>
-        <w:t xml:space="preserve">کنوانسیون وین حقوق معاهدات، ماده ۴۶ (به‌اجمال).</w:t>
+        <w:t xml:space="preserve">قانون اساسی جمهوری اسلامی ایران، اصل ۱۵۳.</w:t>
       </w:r>
     </w:p>
   </w:footnote>
@@ -14676,7 +15345,7 @@
           <w:sz w:val="20"/>
           <w:szCs w:val="20"/>
         </w:rPr>
-        <w:t xml:space="preserve">کنوانسیون وین حقوق معاهدات، ماده ۵۳ (به‌اجمال).</w:t>
+        <w:t xml:space="preserve">قانون اساسی جمهوری اسلامی ایران، اصل ۱۵۴.</w:t>
       </w:r>
     </w:p>
   </w:footnote>
@@ -14709,7 +15378,7 @@
           <w:sz w:val="20"/>
           <w:szCs w:val="20"/>
         </w:rPr>
-        <w:t xml:space="preserve">کنوانسیون وین حقوق معاهدات، مواد ۵۴ تا ۶۴ (به‌اجمال).</w:t>
+        <w:t xml:space="preserve">قانون اساسی جمهوری اسلامی ایران، اصل ۱۷۶ (به‌اجمال).</w:t>
       </w:r>
     </w:p>
   </w:footnote>
@@ -14742,11 +15411,242 @@
           <w:sz w:val="20"/>
           <w:szCs w:val="20"/>
         </w:rPr>
-        <w:t xml:space="preserve">کنوانسیون وین حقوق معاهدات، مواد ۶۵ تا ۶۸ (به‌اجمال).</w:t>
+        <w:t xml:space="preserve">کنوانسیون وین حقوق معاهدات، ماده ۱.</w:t>
       </w:r>
     </w:p>
   </w:footnote>
   <w:footnote w:id="95">
+    <w:p>
+      <w:pPr>
+        <w:bidi w:val="1"/>
+        <w:jc w:val="both"/>
+        <w:spacing w:after="40" w:line="240" w:lineRule="auto"/>
+      </w:pPr>
+      <w:r>
+        <w:rPr>
+          <w:rFonts w:ascii="B Lotus" w:hAnsi="B Lotus" w:cs="B Lotus"/>
+          <w:sz w:val="20"/>
+          <w:szCs w:val="20"/>
+        </w:rPr>
+        <w:footnoteRef/>
+      </w:r>
+      <w:r>
+        <w:rPr>
+          <w:rFonts w:ascii="B Lotus" w:hAnsi="B Lotus" w:cs="B Lotus"/>
+          <w:sz w:val="20"/>
+          <w:szCs w:val="20"/>
+        </w:rPr>
+        <w:t xml:space="preserve"> </w:t>
+      </w:r>
+      <w:r>
+        <w:rPr>
+          <w:rFonts w:ascii="B Lotus" w:hAnsi="B Lotus" w:cs="B Lotus"/>
+          <w:sz w:val="20"/>
+          <w:szCs w:val="20"/>
+        </w:rPr>
+        <w:t xml:space="preserve">کنوانسیون وین حقوق معاهدات، ماده ۲ (به‌اجمال).</w:t>
+      </w:r>
+    </w:p>
+  </w:footnote>
+  <w:footnote w:id="96">
+    <w:p>
+      <w:pPr>
+        <w:bidi w:val="1"/>
+        <w:jc w:val="both"/>
+        <w:spacing w:after="40" w:line="240" w:lineRule="auto"/>
+      </w:pPr>
+      <w:r>
+        <w:rPr>
+          <w:rFonts w:ascii="B Lotus" w:hAnsi="B Lotus" w:cs="B Lotus"/>
+          <w:sz w:val="20"/>
+          <w:szCs w:val="20"/>
+        </w:rPr>
+        <w:footnoteRef/>
+      </w:r>
+      <w:r>
+        <w:rPr>
+          <w:rFonts w:ascii="B Lotus" w:hAnsi="B Lotus" w:cs="B Lotus"/>
+          <w:sz w:val="20"/>
+          <w:szCs w:val="20"/>
+        </w:rPr>
+        <w:t xml:space="preserve"> </w:t>
+      </w:r>
+      <w:r>
+        <w:rPr>
+          <w:rFonts w:ascii="B Lotus" w:hAnsi="B Lotus" w:cs="B Lotus"/>
+          <w:sz w:val="20"/>
+          <w:szCs w:val="20"/>
+        </w:rPr>
+        <w:t xml:space="preserve">کنوانسیون وین حقوق معاهدات، ماده ۲۶.</w:t>
+      </w:r>
+    </w:p>
+  </w:footnote>
+  <w:footnote w:id="97">
+    <w:p>
+      <w:pPr>
+        <w:bidi w:val="1"/>
+        <w:jc w:val="both"/>
+        <w:spacing w:after="40" w:line="240" w:lineRule="auto"/>
+      </w:pPr>
+      <w:r>
+        <w:rPr>
+          <w:rFonts w:ascii="B Lotus" w:hAnsi="B Lotus" w:cs="B Lotus"/>
+          <w:sz w:val="20"/>
+          <w:szCs w:val="20"/>
+        </w:rPr>
+        <w:footnoteRef/>
+      </w:r>
+      <w:r>
+        <w:rPr>
+          <w:rFonts w:ascii="B Lotus" w:hAnsi="B Lotus" w:cs="B Lotus"/>
+          <w:sz w:val="20"/>
+          <w:szCs w:val="20"/>
+        </w:rPr>
+        <w:t xml:space="preserve"> </w:t>
+      </w:r>
+      <w:r>
+        <w:rPr>
+          <w:rFonts w:ascii="B Lotus" w:hAnsi="B Lotus" w:cs="B Lotus"/>
+          <w:sz w:val="20"/>
+          <w:szCs w:val="20"/>
+        </w:rPr>
+        <w:t xml:space="preserve">کنوانسیون وین حقوق معاهدات، ماده ۲۷.</w:t>
+      </w:r>
+    </w:p>
+  </w:footnote>
+  <w:footnote w:id="98">
+    <w:p>
+      <w:pPr>
+        <w:bidi w:val="1"/>
+        <w:jc w:val="both"/>
+        <w:spacing w:after="40" w:line="240" w:lineRule="auto"/>
+      </w:pPr>
+      <w:r>
+        <w:rPr>
+          <w:rFonts w:ascii="B Lotus" w:hAnsi="B Lotus" w:cs="B Lotus"/>
+          <w:sz w:val="20"/>
+          <w:szCs w:val="20"/>
+        </w:rPr>
+        <w:footnoteRef/>
+      </w:r>
+      <w:r>
+        <w:rPr>
+          <w:rFonts w:ascii="B Lotus" w:hAnsi="B Lotus" w:cs="B Lotus"/>
+          <w:sz w:val="20"/>
+          <w:szCs w:val="20"/>
+        </w:rPr>
+        <w:t xml:space="preserve"> </w:t>
+      </w:r>
+      <w:r>
+        <w:rPr>
+          <w:rFonts w:ascii="B Lotus" w:hAnsi="B Lotus" w:cs="B Lotus"/>
+          <w:sz w:val="20"/>
+          <w:szCs w:val="20"/>
+        </w:rPr>
+        <w:t xml:space="preserve">کنوانسیون وین حقوق معاهدات، ماده ۴۶ (به‌اجمال).</w:t>
+      </w:r>
+    </w:p>
+  </w:footnote>
+  <w:footnote w:id="99">
+    <w:p>
+      <w:pPr>
+        <w:bidi w:val="1"/>
+        <w:jc w:val="both"/>
+        <w:spacing w:after="40" w:line="240" w:lineRule="auto"/>
+      </w:pPr>
+      <w:r>
+        <w:rPr>
+          <w:rFonts w:ascii="B Lotus" w:hAnsi="B Lotus" w:cs="B Lotus"/>
+          <w:sz w:val="20"/>
+          <w:szCs w:val="20"/>
+        </w:rPr>
+        <w:footnoteRef/>
+      </w:r>
+      <w:r>
+        <w:rPr>
+          <w:rFonts w:ascii="B Lotus" w:hAnsi="B Lotus" w:cs="B Lotus"/>
+          <w:sz w:val="20"/>
+          <w:szCs w:val="20"/>
+        </w:rPr>
+        <w:t xml:space="preserve"> </w:t>
+      </w:r>
+      <w:r>
+        <w:rPr>
+          <w:rFonts w:ascii="B Lotus" w:hAnsi="B Lotus" w:cs="B Lotus"/>
+          <w:sz w:val="20"/>
+          <w:szCs w:val="20"/>
+        </w:rPr>
+        <w:t xml:space="preserve">کنوانسیون وین حقوق معاهدات، ماده ۵۳ (به‌اجمال).</w:t>
+      </w:r>
+    </w:p>
+  </w:footnote>
+  <w:footnote w:id="100">
+    <w:p>
+      <w:pPr>
+        <w:bidi w:val="1"/>
+        <w:jc w:val="both"/>
+        <w:spacing w:after="40" w:line="240" w:lineRule="auto"/>
+      </w:pPr>
+      <w:r>
+        <w:rPr>
+          <w:rFonts w:ascii="B Lotus" w:hAnsi="B Lotus" w:cs="B Lotus"/>
+          <w:sz w:val="20"/>
+          <w:szCs w:val="20"/>
+        </w:rPr>
+        <w:footnoteRef/>
+      </w:r>
+      <w:r>
+        <w:rPr>
+          <w:rFonts w:ascii="B Lotus" w:hAnsi="B Lotus" w:cs="B Lotus"/>
+          <w:sz w:val="20"/>
+          <w:szCs w:val="20"/>
+        </w:rPr>
+        <w:t xml:space="preserve"> </w:t>
+      </w:r>
+      <w:r>
+        <w:rPr>
+          <w:rFonts w:ascii="B Lotus" w:hAnsi="B Lotus" w:cs="B Lotus"/>
+          <w:sz w:val="20"/>
+          <w:szCs w:val="20"/>
+        </w:rPr>
+        <w:t xml:space="preserve">کنوانسیون وین حقوق معاهدات، مواد ۵۴ تا ۶۴ (به‌اجمال).</w:t>
+      </w:r>
+    </w:p>
+  </w:footnote>
+  <w:footnote w:id="101">
+    <w:p>
+      <w:pPr>
+        <w:bidi w:val="1"/>
+        <w:jc w:val="both"/>
+        <w:spacing w:after="40" w:line="240" w:lineRule="auto"/>
+      </w:pPr>
+      <w:r>
+        <w:rPr>
+          <w:rFonts w:ascii="B Lotus" w:hAnsi="B Lotus" w:cs="B Lotus"/>
+          <w:sz w:val="20"/>
+          <w:szCs w:val="20"/>
+        </w:rPr>
+        <w:footnoteRef/>
+      </w:r>
+      <w:r>
+        <w:rPr>
+          <w:rFonts w:ascii="B Lotus" w:hAnsi="B Lotus" w:cs="B Lotus"/>
+          <w:sz w:val="20"/>
+          <w:szCs w:val="20"/>
+        </w:rPr>
+        <w:t xml:space="preserve"> </w:t>
+      </w:r>
+      <w:r>
+        <w:rPr>
+          <w:rFonts w:ascii="B Lotus" w:hAnsi="B Lotus" w:cs="B Lotus"/>
+          <w:sz w:val="20"/>
+          <w:szCs w:val="20"/>
+        </w:rPr>
+        <w:t xml:space="preserve">کنوانسیون وین حقوق معاهدات، مواد ۶۵ تا ۶۸ (به‌اجمال).</w:t>
+      </w:r>
+    </w:p>
+  </w:footnote>
+  <w:footnote w:id="102">
     <w:p>
       <w:pPr>
         <w:bidi w:val="1"/>

</xml_diff>

<commit_message>
Add reservations analysis; thesis reaches 110-page target
Co-authored-by: arena-agent <297053741+arena-agent@users.noreply.github.com>
</commit_message>
<xml_diff>
--- a/Resaleh_Sath3_Hadi_Shabestani_v2.docx
+++ b/Resaleh_Sath3_Hadi_Shabestani_v2.docx
@@ -4673,7 +4673,7 @@
     </w:p>
     <w:p>
       <w:pPr>
-        <w:pStyle w:val="TH-Goftar"/>
+        <w:pStyle w:val="TH-Band"/>
         <w:widowControl/>
         <w:bidi w:val="1"/>
         <w:spacing w:before="200" w:after="120" w:line="288" w:lineRule="auto"/>
@@ -4682,18 +4682,89 @@
       </w:pPr>
       <w:r>
         <w:rPr>
-          <w:rFonts w:ascii="B Titr" w:hAnsi="B Titr" w:cs="B Titr" w:eastAsia="B Titr"/>
+          <w:rFonts w:ascii="B Traffic" w:hAnsi="B Traffic" w:cs="B Traffic" w:eastAsia="B Traffic"/>
           <w:b/>
           <w:i w:val="0"/>
-          <w:sz w:val="32"/>
-          <w:szCs w:val="32"/>
-        </w:rPr>
-        <w:t>گفتار سوم: قواعد تفسیر معاهدات؛ فهم متن پیش از عمل</w:t>
-      </w:r>
-    </w:p>
-    <w:p>
-      <w:pPr>
-        <w:pStyle w:val="TH-Band"/>
+          <w:sz w:val="28"/>
+          <w:szCs w:val="28"/>
+        </w:rPr>
+        <w:t>بند ششم: حق شرط و اعلامیه تفسیری؛ انعطافِ هنگامِ پذیرش</w:t>
+      </w:r>
+    </w:p>
+    <w:p>
+      <w:pPr>
+        <w:pStyle w:val="TH-Body"/>
+        <w:widowControl/>
+        <w:bidi w:val="1"/>
+        <w:spacing w:before="0" w:after="120" w:line="288" w:lineRule="auto"/>
+        <w:ind w:firstLine="283"/>
+        <w:jc w:val="both"/>
+      </w:pPr>
+      <w:r>
+        <w:rPr>
+          <w:rFonts w:ascii="B Lotus" w:hAnsi="B Lotus" w:cs="B Lotus" w:eastAsia="B Lotus"/>
+          <w:b w:val="0"/>
+          <w:i w:val="0"/>
+          <w:sz w:val="28"/>
+          <w:szCs w:val="28"/>
+        </w:rPr>
+        <w:t>آخرین نهادی که در این گفتار باید شناخت ـ و از نظرِ عملی شاید مهم‌ترینشان ـ «حق شرط» (reservation) است: اعلامِ یک‌جانبه دولت هنگامِ پذیرشِ معاهده چندجانبه، مبنی بر این‌که اثرِ حقوقیِ بعضی مقررات را نسبت به خودش منتفی یا محدود می‌کند. مواد ۱۹ تا ۲۳ وین، نظامِ حق شرط را با تفصیل تنظیم کرده‌اند: حق شرط جایز است، مگر این‌که در خودِ معاهده ممنوع شده باشد یا با «موضوع و هدفِ» معاهده ناسازگار باشد (ماده ۱۹)؛ و آثارش نسبت به دولت‌های پذیرنده و معترض متفاوت است (مواد ۲۰ و ۲۱).</w:t>
+      </w:r>
+      <w:r>
+        <w:rPr>
+          <w:rFonts w:ascii="B Lotus" w:hAnsi="B Lotus" w:cs="B Lotus" w:eastAsia="B Lotus"/>
+          <w:b w:val="0"/>
+          <w:i w:val="0"/>
+          <w:sz w:val="28"/>
+          <w:szCs w:val="28"/>
+          <w:vertAlign w:val="superscript"/>
+        </w:rPr>
+        <w:footnoteReference w:id="29"/>
+      </w:r>
+    </w:p>
+    <w:p>
+      <w:pPr>
+        <w:pStyle w:val="TH-Body"/>
+        <w:widowControl/>
+        <w:bidi w:val="1"/>
+        <w:spacing w:before="0" w:after="120" w:line="288" w:lineRule="auto"/>
+        <w:ind w:firstLine="283"/>
+        <w:jc w:val="both"/>
+      </w:pPr>
+      <w:r>
+        <w:rPr>
+          <w:rFonts w:ascii="B Lotus" w:hAnsi="B Lotus" w:cs="B Lotus" w:eastAsia="B Lotus"/>
+          <w:b w:val="0"/>
+          <w:i w:val="0"/>
+          <w:sz w:val="28"/>
+          <w:szCs w:val="28"/>
+        </w:rPr>
+        <w:t>اهمیتِ حق شرط برای مسئله من در این است که «بهترین زمانِ مدیریتِ تعهد، هنگامِ پذیرش است، نه هنگامِ اجرا». دولتی که هنگامِ امضای معاهده چندجانبه، با دقت و هوشمندی حق شرط بگذارد ـ بر بندهایی که با منافعِ حیاتی‌اش ناسازگار است ـ بعداً کمتر نیازمندِ عدول می‌شود؛ چون از اول، دایره التزامش را محدود کرده. به زبانِ اقتصادی: حق شرط، «بیمه» است و عدول، «جراحی» ـ و عاقل، بیمه را بر جراحی مقدم می‌کند. پس توصیه اکیدِ من به مذاکره‌کنندگان و به مجلس (که تصویب‌کننده است): هر معاهده چندجانبه‌ای را که بررسی می‌کنید، اول بپرسید «کجایش نیازمندِ حق شرط است؟» ـ و این پرسش را جدی بگیرید، چون پاسخی که امروز ندهید، فردا به بحران بدل می‌شود.</w:t>
+      </w:r>
+    </w:p>
+    <w:p>
+      <w:pPr>
+        <w:pStyle w:val="TH-Body"/>
+        <w:widowControl/>
+        <w:bidi w:val="1"/>
+        <w:spacing w:before="0" w:after="120" w:line="288" w:lineRule="auto"/>
+        <w:ind w:firstLine="283"/>
+        <w:jc w:val="both"/>
+      </w:pPr>
+      <w:r>
+        <w:rPr>
+          <w:rFonts w:ascii="B Lotus" w:hAnsi="B Lotus" w:cs="B Lotus" w:eastAsia="B Lotus"/>
+          <w:b w:val="0"/>
+          <w:i w:val="0"/>
+          <w:sz w:val="28"/>
+          <w:szCs w:val="28"/>
+        </w:rPr>
+        <w:t>در کنارِ حق شرط، «اعلامیه تفسیری» (interpretive declaration) هم هست: اعلامِ رسمیِ دولت مبنی بر این‌که فلان مقرره را چنین و چنان می‌فهمد. اثرِ حقوقی‌اش کمتر از حق شرط است (چون التزام را محدود نمی‌کند، فقط فهمِ دولت را ثبت می‌کند)، ولی در فرایندِ تفسیر (مواد ۳۱ و ۳۲) و در روزِ اختلاف، سندِ مهمی است. تفاوتِ ظریفِ میانِ «حق شرطِ پنهان» (اعلامیه‌ای که در واقع حق شرط است ولی نامش اعلامیه است) و «اعلامیه تفسیریِ واقعی» هم در رویه محلِ بحث است و دولت‌ها باید در تنظیمِ متنِ اعلامیه‌هایشان دقت کنند تا بعداً گرفتارِ تفسیرِ نامطلوب نشوند. درسِ کلی: «کلمه» در حقوق بین‌الملل، بارِ حقوقی دارد؛ و هر سندی که دولت صادر می‌کند ـ از اعلامیه تا یادداشت تا مصاحبه رسمی ـ ممکن است روزی علیهش به کار رود. پس دستگاهِ دیپلماسی باید «حقوق‌محور» باشد، نه فقط «سیاست‌محور» ـ و این، یکی از پیام‌های پنهانِ این رساله است.</w:t>
+      </w:r>
+    </w:p>
+    <w:p>
+      <w:pPr>
+        <w:pStyle w:val="TH-Goftar"/>
         <w:widowControl/>
         <w:bidi w:val="1"/>
         <w:spacing w:before="200" w:after="120" w:line="288" w:lineRule="auto"/>
@@ -4702,64 +4773,13 @@
       </w:pPr>
       <w:r>
         <w:rPr>
-          <w:rFonts w:ascii="B Traffic" w:hAnsi="B Traffic" w:cs="B Traffic" w:eastAsia="B Traffic"/>
+          <w:rFonts w:ascii="B Titr" w:hAnsi="B Titr" w:cs="B Titr" w:eastAsia="B Titr"/>
           <w:b/>
           <w:i w:val="0"/>
-          <w:sz w:val="28"/>
-          <w:szCs w:val="28"/>
-        </w:rPr>
-        <w:t>بند اول: قاعده عام تفسیر؛ متن، سیاق، هدف</w:t>
-      </w:r>
-    </w:p>
-    <w:p>
-      <w:pPr>
-        <w:pStyle w:val="TH-Body"/>
-        <w:widowControl/>
-        <w:bidi w:val="1"/>
-        <w:spacing w:before="0" w:after="120" w:line="288" w:lineRule="auto"/>
-        <w:ind w:firstLine="283"/>
-        <w:jc w:val="both"/>
-      </w:pPr>
-      <w:r>
-        <w:rPr>
-          <w:rFonts w:ascii="B Lotus" w:hAnsi="B Lotus" w:cs="B Lotus" w:eastAsia="B Lotus"/>
-          <w:b w:val="0"/>
-          <w:i w:val="0"/>
-          <w:sz w:val="28"/>
-          <w:szCs w:val="28"/>
-        </w:rPr>
-        <w:t>پیش از این‌که از اجرا و نقض و خاتمه حرف بزنیم، باید بدانیم «معنای» معاهده چیست؛ چون تا ندانیم معاهده چه می‌گوید، نمی‌توانیم بگوییم اجرا شده یا نقض شده. کنوانسیون وین در مواد ۳۱ و ۳۲ قواعد تفسیر را بیان کرده و قاعده عامش در ماده ۳۱ آمده: معاهده باید «با حسن نیت» و «مطابق معنای متعارف الفاظ» و «در سیاقشان» و «در پرتو موضوع و هدفش» تفسیر شود.</w:t>
-      </w:r>
-      <w:r>
-        <w:rPr>
-          <w:rFonts w:ascii="B Lotus" w:hAnsi="B Lotus" w:cs="B Lotus" w:eastAsia="B Lotus"/>
-          <w:b w:val="0"/>
-          <w:i w:val="0"/>
-          <w:sz w:val="28"/>
-          <w:szCs w:val="28"/>
-          <w:vertAlign w:val="superscript"/>
-        </w:rPr>
-        <w:footnoteReference w:id="29"/>
-      </w:r>
-    </w:p>
-    <w:p>
-      <w:pPr>
-        <w:pStyle w:val="TH-Body"/>
-        <w:widowControl/>
-        <w:bidi w:val="1"/>
-        <w:spacing w:before="0" w:after="120" w:line="288" w:lineRule="auto"/>
-        <w:ind w:firstLine="283"/>
-        <w:jc w:val="both"/>
-      </w:pPr>
-      <w:r>
-        <w:rPr>
-          <w:rFonts w:ascii="B Lotus" w:hAnsi="B Lotus" w:cs="B Lotus" w:eastAsia="B Lotus"/>
-          <w:b w:val="0"/>
-          <w:i w:val="0"/>
-          <w:sz w:val="28"/>
-          <w:szCs w:val="28"/>
-        </w:rPr>
-        <w:t>این قاعده چهارلایه، برای مسئله من دو کاربرد مستقیم دارد. کاربرد اول: وقتی حاکم می‌خواهد ببیند آیا رفتارش «نقض» است یا نه، باید اول معنای تعهد را با همین قواعد بفهمد؛ چه‌بسا رفتاری که در نگاه اول نقض به نظر می‌رسد، با تفسیر صحیح (مثلاً با توجه به سیاق یا هدف معاهده) نقض نباشد ـ و چه‌بسا برعکس. پس «تفسیر» مقدم بر «داوریِ نقض» است؛ و حاکمی که بدون تفسیرِ دقیق، حکم به جواز یا عدم جواز بدهد، عجله کرده. کاربرد دوم: اعلامیه‌های تفسیری دولت (راهبرد دوم فصل پنجم) دقیقاً در همین فرایند تفسیر اثر می‌گذارند؛ یعنی دولتی که از اول تفسیرش را ثبت کرده، در روز اختلاف دستِ پرتری دارد. پس تفسیر، نه بحثی آکادمیک و حاشیه‌ای، که ابزاری عملی در دست تصمیم‌گیر است.</w:t>
+          <w:sz w:val="32"/>
+          <w:szCs w:val="32"/>
+        </w:rPr>
+        <w:t>گفتار سوم: قواعد تفسیر معاهدات؛ فهم متن پیش از عمل</w:t>
       </w:r>
     </w:p>
     <w:p>
@@ -4779,7 +4799,7 @@
           <w:sz w:val="28"/>
           <w:szCs w:val="28"/>
         </w:rPr>
-        <w:t>بند دوم: نقش سوابق انعقاد و رفتار بعدی</w:t>
+        <w:t>بند اول: قاعده عام تفسیر؛ متن، سیاق، هدف</w:t>
       </w:r>
     </w:p>
     <w:p>
@@ -4799,7 +4819,7 @@
           <w:sz w:val="28"/>
           <w:szCs w:val="28"/>
         </w:rPr>
-        <w:t>ماده ۳۲ وین، «وسائل تکمیلی» تفسیر را هم پیش‌بینی کرده: سوابق انعقاد (مذاکرات، پیش‌نویس‌ها، صورت‌جلسات) و رفتار بعدی اطراف در اجرای معاهده.</w:t>
+        <w:t>پیش از این‌که از اجرا و نقض و خاتمه حرف بزنیم، باید بدانیم «معنای» معاهده چیست؛ چون تا ندانیم معاهده چه می‌گوید، نمی‌توانیم بگوییم اجرا شده یا نقض شده. کنوانسیون وین در مواد ۳۱ و ۳۲ قواعد تفسیر را بیان کرده و قاعده عامش در ماده ۳۱ آمده: معاهده باید «با حسن نیت» و «مطابق معنای متعارف الفاظ» و «در سیاقشان» و «در پرتو موضوع و هدفش» تفسیر شود.</w:t>
       </w:r>
       <w:r>
         <w:rPr>
@@ -4812,20 +4832,30 @@
         </w:rPr>
         <w:footnoteReference w:id="30"/>
       </w:r>
-      <w:r>
-        <w:rPr>
-          <w:rFonts w:ascii="B Lotus" w:hAnsi="B Lotus" w:cs="B Lotus" w:eastAsia="B Lotus"/>
-          <w:b w:val="0"/>
-          <w:i w:val="0"/>
-          <w:sz w:val="28"/>
-          <w:szCs w:val="28"/>
-        </w:rPr>
-        <w:t xml:space="preserve"> اهمیتش برای ما این است که مذاکره‌کنندگان ایرانی باید بدانند هر سندی که در فرایند مذاکره تولید می‌کنند ـ از یادداشت تفاهم تا صورت‌جلسه ـ ممکن است روزی در فرایند تفسیر به کار برود؛ له یا علیه ما. پس «مستندسازیِ هوشمندانه» از مرحله انعقاد، بخشی از همان «حقوق پیشگیرانه» است که در فصل پنجم گفتم. و نیز رفتار بعدی دولت در اجرا ـ این‌که به کدام بندها چگونه عمل کرده ـ تفسیر عملیِ دولت از معاهده به حساب می‌آید و بعداً نمی‌شود خلافش را ادعا کرد. این نکته، درس مهمی برای دستگاه دیپلماسی ماست: رفتار امروزت، سند فردایت است.</w:t>
-      </w:r>
-    </w:p>
-    <w:p>
-      <w:pPr>
-        <w:pStyle w:val="TH-Goftar"/>
+    </w:p>
+    <w:p>
+      <w:pPr>
+        <w:pStyle w:val="TH-Body"/>
+        <w:widowControl/>
+        <w:bidi w:val="1"/>
+        <w:spacing w:before="0" w:after="120" w:line="288" w:lineRule="auto"/>
+        <w:ind w:firstLine="283"/>
+        <w:jc w:val="both"/>
+      </w:pPr>
+      <w:r>
+        <w:rPr>
+          <w:rFonts w:ascii="B Lotus" w:hAnsi="B Lotus" w:cs="B Lotus" w:eastAsia="B Lotus"/>
+          <w:b w:val="0"/>
+          <w:i w:val="0"/>
+          <w:sz w:val="28"/>
+          <w:szCs w:val="28"/>
+        </w:rPr>
+        <w:t>این قاعده چهارلایه، برای مسئله من دو کاربرد مستقیم دارد. کاربرد اول: وقتی حاکم می‌خواهد ببیند آیا رفتارش «نقض» است یا نه، باید اول معنای تعهد را با همین قواعد بفهمد؛ چه‌بسا رفتاری که در نگاه اول نقض به نظر می‌رسد، با تفسیر صحیح (مثلاً با توجه به سیاق یا هدف معاهده) نقض نباشد ـ و چه‌بسا برعکس. پس «تفسیر» مقدم بر «داوریِ نقض» است؛ و حاکمی که بدون تفسیرِ دقیق، حکم به جواز یا عدم جواز بدهد، عجله کرده. کاربرد دوم: اعلامیه‌های تفسیری دولت (راهبرد دوم فصل پنجم) دقیقاً در همین فرایند تفسیر اثر می‌گذارند؛ یعنی دولتی که از اول تفسیرش را ثبت کرده، در روز اختلاف دستِ پرتری دارد. پس تفسیر، نه بحثی آکادمیک و حاشیه‌ای، که ابزاری عملی در دست تصمیم‌گیر است.</w:t>
+      </w:r>
+    </w:p>
+    <w:p>
+      <w:pPr>
+        <w:pStyle w:val="TH-Band"/>
         <w:widowControl/>
         <w:bidi w:val="1"/>
         <w:spacing w:before="200" w:after="120" w:line="288" w:lineRule="auto"/>
@@ -4834,18 +4864,59 @@
       </w:pPr>
       <w:r>
         <w:rPr>
-          <w:rFonts w:ascii="B Titr" w:hAnsi="B Titr" w:cs="B Titr" w:eastAsia="B Titr"/>
+          <w:rFonts w:ascii="B Traffic" w:hAnsi="B Traffic" w:cs="B Traffic" w:eastAsia="B Traffic"/>
           <w:b/>
           <w:i w:val="0"/>
-          <w:sz w:val="32"/>
-          <w:szCs w:val="32"/>
-        </w:rPr>
-        <w:t>گفتار چهارم: اعتبار معاهدات؛ اهلیت، رضایت و عیوب اراده</w:t>
-      </w:r>
-    </w:p>
-    <w:p>
-      <w:pPr>
-        <w:pStyle w:val="TH-Band"/>
+          <w:sz w:val="28"/>
+          <w:szCs w:val="28"/>
+        </w:rPr>
+        <w:t>بند دوم: نقش سوابق انعقاد و رفتار بعدی</w:t>
+      </w:r>
+    </w:p>
+    <w:p>
+      <w:pPr>
+        <w:pStyle w:val="TH-Body"/>
+        <w:widowControl/>
+        <w:bidi w:val="1"/>
+        <w:spacing w:before="0" w:after="120" w:line="288" w:lineRule="auto"/>
+        <w:ind w:firstLine="283"/>
+        <w:jc w:val="both"/>
+      </w:pPr>
+      <w:r>
+        <w:rPr>
+          <w:rFonts w:ascii="B Lotus" w:hAnsi="B Lotus" w:cs="B Lotus" w:eastAsia="B Lotus"/>
+          <w:b w:val="0"/>
+          <w:i w:val="0"/>
+          <w:sz w:val="28"/>
+          <w:szCs w:val="28"/>
+        </w:rPr>
+        <w:t>ماده ۳۲ وین، «وسائل تکمیلی» تفسیر را هم پیش‌بینی کرده: سوابق انعقاد (مذاکرات، پیش‌نویس‌ها، صورت‌جلسات) و رفتار بعدی اطراف در اجرای معاهده.</w:t>
+      </w:r>
+      <w:r>
+        <w:rPr>
+          <w:rFonts w:ascii="B Lotus" w:hAnsi="B Lotus" w:cs="B Lotus" w:eastAsia="B Lotus"/>
+          <w:b w:val="0"/>
+          <w:i w:val="0"/>
+          <w:sz w:val="28"/>
+          <w:szCs w:val="28"/>
+          <w:vertAlign w:val="superscript"/>
+        </w:rPr>
+        <w:footnoteReference w:id="31"/>
+      </w:r>
+      <w:r>
+        <w:rPr>
+          <w:rFonts w:ascii="B Lotus" w:hAnsi="B Lotus" w:cs="B Lotus" w:eastAsia="B Lotus"/>
+          <w:b w:val="0"/>
+          <w:i w:val="0"/>
+          <w:sz w:val="28"/>
+          <w:szCs w:val="28"/>
+        </w:rPr>
+        <w:t xml:space="preserve"> اهمیتش برای ما این است که مذاکره‌کنندگان ایرانی باید بدانند هر سندی که در فرایند مذاکره تولید می‌کنند ـ از یادداشت تفاهم تا صورت‌جلسه ـ ممکن است روزی در فرایند تفسیر به کار برود؛ له یا علیه ما. پس «مستندسازیِ هوشمندانه» از مرحله انعقاد، بخشی از همان «حقوق پیشگیرانه» است که در فصل پنجم گفتم. و نیز رفتار بعدی دولت در اجرا ـ این‌که به کدام بندها چگونه عمل کرده ـ تفسیر عملیِ دولت از معاهده به حساب می‌آید و بعداً نمی‌شود خلافش را ادعا کرد. این نکته، درس مهمی برای دستگاه دیپلماسی ماست: رفتار امروزت، سند فردایت است.</w:t>
+      </w:r>
+    </w:p>
+    <w:p>
+      <w:pPr>
+        <w:pStyle w:val="TH-Goftar"/>
         <w:widowControl/>
         <w:bidi w:val="1"/>
         <w:spacing w:before="200" w:after="120" w:line="288" w:lineRule="auto"/>
@@ -4854,53 +4925,13 @@
       </w:pPr>
       <w:r>
         <w:rPr>
-          <w:rFonts w:ascii="B Traffic" w:hAnsi="B Traffic" w:cs="B Traffic" w:eastAsia="B Traffic"/>
+          <w:rFonts w:ascii="B Titr" w:hAnsi="B Titr" w:cs="B Titr" w:eastAsia="B Titr"/>
           <w:b/>
           <w:i w:val="0"/>
-          <w:sz w:val="28"/>
-          <w:szCs w:val="28"/>
-        </w:rPr>
-        <w:t>بند اول: شرایط اعتبار؛ چرا بحث اعتبار به مسئله ما مربوط است؟</w:t>
-      </w:r>
-    </w:p>
-    <w:p>
-      <w:pPr>
-        <w:pStyle w:val="TH-Body"/>
-        <w:widowControl/>
-        <w:bidi w:val="1"/>
-        <w:spacing w:before="0" w:after="120" w:line="288" w:lineRule="auto"/>
-        <w:ind w:firstLine="283"/>
-        <w:jc w:val="both"/>
-      </w:pPr>
-      <w:r>
-        <w:rPr>
-          <w:rFonts w:ascii="B Lotus" w:hAnsi="B Lotus" w:cs="B Lotus" w:eastAsia="B Lotus"/>
-          <w:b w:val="0"/>
-          <w:i w:val="0"/>
-          <w:sz w:val="28"/>
-          <w:szCs w:val="28"/>
-        </w:rPr>
-        <w:t>شاید خواننده بپرسد: بحث «اعتبار» معاهده (این‌که معاهده از اول درست بسته شده یا نه) چه ربطی به بحث «عدول» (که فرضش معاهده معتبر است) دارد؟ جوابش این است که گاهی آن‌چه «عدول» به نظر می‌رسد، در واقع «اعلام بی‌اعتباری» است؛ یعنی حاکم نمی‌گوید «از تعهدِ معتبر عدول می‌کنم»، بلکه می‌گوید «این التزام از اول معتبر نبوده» ـ و این دو، هم مبنایشان فرق دارد هم آثارشان. پس حاکم عاقل، قبل از عدول، باید یک‌بار هم از این زاویه به معاهده نگاه کند: آیا این معاهده اصلاً معتبر است؟ و اگر نیست، چرا راهِ اعلامِ بی‌اعتباری را ـ که کم‌هزینه‌تر است ـ نرود؟ این، جلوه دیگری از ضابطه دوم (تقدم راه کم‌هزینه‌تر) است.</w:t>
-      </w:r>
-    </w:p>
-    <w:p>
-      <w:pPr>
-        <w:pStyle w:val="TH-Body"/>
-        <w:widowControl/>
-        <w:bidi w:val="1"/>
-        <w:spacing w:before="0" w:after="120" w:line="288" w:lineRule="auto"/>
-        <w:ind w:firstLine="283"/>
-        <w:jc w:val="both"/>
-      </w:pPr>
-      <w:r>
-        <w:rPr>
-          <w:rFonts w:ascii="B Lotus" w:hAnsi="B Lotus" w:cs="B Lotus" w:eastAsia="B Lotus"/>
-          <w:b w:val="0"/>
-          <w:i w:val="0"/>
-          <w:sz w:val="28"/>
-          <w:szCs w:val="28"/>
-        </w:rPr>
-        <w:t>کنوانسیون وین، اعتبار معاهده را در مواد ۴۶ تا ۵۳ بررسی کرده و سه شرط اصلی گذاشته: اهلیت اطراف، سلامت رضایت، و مشروعیت موضوع. هرکدام را جداگانه می‌گویم.</w:t>
+          <w:sz w:val="32"/>
+          <w:szCs w:val="32"/>
+        </w:rPr>
+        <w:t>گفتار چهارم: اعتبار معاهدات؛ اهلیت، رضایت و عیوب اراده</w:t>
       </w:r>
     </w:p>
     <w:p>
@@ -4920,7 +4951,7 @@
           <w:sz w:val="28"/>
           <w:szCs w:val="28"/>
         </w:rPr>
-        <w:t>بند دوم: اهلیت و صلاحیت انعقاد</w:t>
+        <w:t>بند اول: شرایط اعتبار؛ چرا بحث اعتبار به مسئله ما مربوط است؟</w:t>
       </w:r>
     </w:p>
     <w:p>
@@ -4940,28 +4971,27 @@
           <w:sz w:val="28"/>
           <w:szCs w:val="28"/>
         </w:rPr>
-        <w:t>هر دولتی «اهلیت» انعقاد معاهده را دارد (ماده ۶)؛ ولی «صلاحیت» اشخاصی که به نمایندگی از دولت مذاکره و امضا می‌کنند، تابع حقوق داخلی هر دولت است (ماده ۷ و ۴۶).</w:t>
-      </w:r>
-      <w:r>
-        <w:rPr>
-          <w:rFonts w:ascii="B Lotus" w:hAnsi="B Lotus" w:cs="B Lotus" w:eastAsia="B Lotus"/>
-          <w:b w:val="0"/>
-          <w:i w:val="0"/>
-          <w:sz w:val="28"/>
-          <w:szCs w:val="28"/>
-          <w:vertAlign w:val="superscript"/>
-        </w:rPr>
-        <w:footnoteReference w:id="31"/>
-      </w:r>
-      <w:r>
-        <w:rPr>
-          <w:rFonts w:ascii="B Lotus" w:hAnsi="B Lotus" w:cs="B Lotus" w:eastAsia="B Lotus"/>
-          <w:b w:val="0"/>
-          <w:i w:val="0"/>
-          <w:sz w:val="28"/>
-          <w:szCs w:val="28"/>
-        </w:rPr>
-        <w:t xml:space="preserve"> در نظام ما ـ چنان‌که گذشت ـ تصویب با مجلس است (اصل ۷۷) و امضا با رئیس‌جمهور (اصل ۱۲۵)؛ پس معاهده‌ای که بدون تصویب مجلس امضا شده باشد، از نظر حقوق داخلی «ناقص» است. ولی ـ و این همان نکته ماده ۴۶ است ـ نقصِ داخلی، فقط وقتی در سطح بین‌المللی قابل استناد است که «آشکار» باشد و به «قاعده بنیادین» مربوط شود؛ و تفسیر دیوان از این ماده بسیار مضیق است. پس عملاً: دولتی که معاهده‌ای را امضا و اجرا کرده، بعداً به‌سختی می‌تواند به بهانه نقص تشریفات داخلی از آن شانه خالی کند. درسش برای ما: تشریفات داخلی را «قبل» از التزام رعایت کنید، نه «بعد» از آن؛ چون بعداً دیگر به کار نمی‌آید. و این، وظیفه مجلس و شورای نگهبان و معاونت حقوقی ریاست‌جمهوری است که در مرحله تصویب، دقت کنند ـ چون امضای بعدی، راه بازگشت را می‌بندد.</w:t>
+        <w:t>شاید خواننده بپرسد: بحث «اعتبار» معاهده (این‌که معاهده از اول درست بسته شده یا نه) چه ربطی به بحث «عدول» (که فرضش معاهده معتبر است) دارد؟ جوابش این است که گاهی آن‌چه «عدول» به نظر می‌رسد، در واقع «اعلام بی‌اعتباری» است؛ یعنی حاکم نمی‌گوید «از تعهدِ معتبر عدول می‌کنم»، بلکه می‌گوید «این التزام از اول معتبر نبوده» ـ و این دو، هم مبنایشان فرق دارد هم آثارشان. پس حاکم عاقل، قبل از عدول، باید یک‌بار هم از این زاویه به معاهده نگاه کند: آیا این معاهده اصلاً معتبر است؟ و اگر نیست، چرا راهِ اعلامِ بی‌اعتباری را ـ که کم‌هزینه‌تر است ـ نرود؟ این، جلوه دیگری از ضابطه دوم (تقدم راه کم‌هزینه‌تر) است.</w:t>
+      </w:r>
+    </w:p>
+    <w:p>
+      <w:pPr>
+        <w:pStyle w:val="TH-Body"/>
+        <w:widowControl/>
+        <w:bidi w:val="1"/>
+        <w:spacing w:before="0" w:after="120" w:line="288" w:lineRule="auto"/>
+        <w:ind w:firstLine="283"/>
+        <w:jc w:val="both"/>
+      </w:pPr>
+      <w:r>
+        <w:rPr>
+          <w:rFonts w:ascii="B Lotus" w:hAnsi="B Lotus" w:cs="B Lotus" w:eastAsia="B Lotus"/>
+          <w:b w:val="0"/>
+          <w:i w:val="0"/>
+          <w:sz w:val="28"/>
+          <w:szCs w:val="28"/>
+        </w:rPr>
+        <w:t>کنوانسیون وین، اعتبار معاهده را در مواد ۴۶ تا ۵۳ بررسی کرده و سه شرط اصلی گذاشته: اهلیت اطراف، سلامت رضایت، و مشروعیت موضوع. هرکدام را جداگانه می‌گویم.</w:t>
       </w:r>
     </w:p>
     <w:p>
@@ -4981,7 +5011,7 @@
           <w:sz w:val="28"/>
           <w:szCs w:val="28"/>
         </w:rPr>
-        <w:t>بند سوم: عیوب اراده؛ اشتباه، فریب و اجبار</w:t>
+        <w:t>بند دوم: اهلیت و صلاحیت انعقاد</w:t>
       </w:r>
     </w:p>
     <w:p>
@@ -5001,7 +5031,7 @@
           <w:sz w:val="28"/>
           <w:szCs w:val="28"/>
         </w:rPr>
-        <w:t>مهم‌ترین بخشِ بحث اعتبار، «عیوب اراده» است: مواردی که رضایت دولت به التزام، مخدوش بوده و معاهده از اول معیوب است. وین شش مورد را برشمرده: اشتباه (ماده ۴۸)، فریب (ماده ۴۹)، رشوه و تطمیع نماینده (ماده ۵۰)، اجبار بر نماینده (ماده ۵۱)، اجبار بر دولت با تهدید یا استعمال زور (ماده ۵۲)، و تعارض با قاعده آمره (ماده ۵۳).</w:t>
+        <w:t>هر دولتی «اهلیت» انعقاد معاهده را دارد (ماده ۶)؛ ولی «صلاحیت» اشخاصی که به نمایندگی از دولت مذاکره و امضا می‌کنند، تابع حقوق داخلی هر دولت است (ماده ۷ و ۴۶).</w:t>
       </w:r>
       <w:r>
         <w:rPr>
@@ -5014,45 +5044,15 @@
         </w:rPr>
         <w:footnoteReference w:id="32"/>
       </w:r>
-    </w:p>
-    <w:p>
-      <w:pPr>
-        <w:pStyle w:val="TH-Body"/>
-        <w:widowControl/>
-        <w:bidi w:val="1"/>
-        <w:spacing w:before="0" w:after="120" w:line="288" w:lineRule="auto"/>
-        <w:ind w:firstLine="283"/>
-        <w:jc w:val="both"/>
-      </w:pPr>
-      <w:r>
-        <w:rPr>
-          <w:rFonts w:ascii="B Lotus" w:hAnsi="B Lotus" w:cs="B Lotus" w:eastAsia="B Lotus"/>
-          <w:b w:val="0"/>
-          <w:i w:val="0"/>
-          <w:sz w:val="28"/>
-          <w:szCs w:val="28"/>
-        </w:rPr>
-        <w:t>از میان این‌ها، دو مورد برای تاریخ ما و مسئله ما مهم‌تر است. یکم، «اجبار بر دولت» (ماده ۵۲): معاهده‌ای که با تهدید یا استعمال زور بر دولت تحمیل شده باشد، «باطل» است ـ نه فقط قابل فسخ، بلکه از اول باطل. این قاعده ـ که ریشه در ممنوعیت توسل به زور (بند ۴ ماده ۲ منشور) دارد ـ برای معاهداتی که قدرت‌های بزرگ در دوران ضعف به کشورهای ضعیف تحمیل کرده‌اند (مثل معاهدات ننگینِ دوران قاجار: گلستان و ترکمانچای) کاربرد تاریخی دارد؛ هرچند از نظر حقوقی، عطف‌بماسبق شدن وین محل بحث است و من در آن وارد نمی‌شوم. ولی اصلِ قاعده، پشتوانه حقوقیِ این فهمِ فطری است که «پیمانِ تحمیلی، پیمان نیست». دوم، «تعارض با قاعده آمره» (ماده ۵۳): معاهده‌ای که با قواعد آمره (مثل منع تجاوز و نسل‌کشی) در تعارض باشد، باطل است؛ و این، همان سقفی است که در ضابطه هفتم گفتم و در هر دو نظام پذیرفته شده.</w:t>
-      </w:r>
-    </w:p>
-    <w:p>
-      <w:pPr>
-        <w:pStyle w:val="TH-Body"/>
-        <w:widowControl/>
-        <w:bidi w:val="1"/>
-        <w:spacing w:before="0" w:after="120" w:line="288" w:lineRule="auto"/>
-        <w:ind w:firstLine="283"/>
-        <w:jc w:val="both"/>
-      </w:pPr>
-      <w:r>
-        <w:rPr>
-          <w:rFonts w:ascii="B Lotus" w:hAnsi="B Lotus" w:cs="B Lotus" w:eastAsia="B Lotus"/>
-          <w:b w:val="0"/>
-          <w:i w:val="0"/>
-          <w:sz w:val="28"/>
-          <w:szCs w:val="28"/>
-        </w:rPr>
-        <w:t>نتیجه عملی برای تصمیم‌گیر: قبل از عدول، یک‌بار هم معاهده را از زاویه «اعتبار» بررسی کنید؛ چه‌بسا معاهده‌ای که گمان می‌رود معتبر است، به یکی از این عیوب مبتلا باشد ـ و در آن صورت، راهِ اعلامِ بی‌اعتباری (مواد ۶۵ تا ۶۸) باز است که هم کم‌هزینه‌تر است هم موجه‌تر. البته ـ انصافاً ـ اثبات این عیوب در مراجع بین‌المللی دشوار است و نباید ساده‌انگارانه به آن دل بست؛ ولی به‌عنوان یکی از گزینه‌های روی میز، باید بررسی شود.</w:t>
+      <w:r>
+        <w:rPr>
+          <w:rFonts w:ascii="B Lotus" w:hAnsi="B Lotus" w:cs="B Lotus" w:eastAsia="B Lotus"/>
+          <w:b w:val="0"/>
+          <w:i w:val="0"/>
+          <w:sz w:val="28"/>
+          <w:szCs w:val="28"/>
+        </w:rPr>
+        <w:t xml:space="preserve"> در نظام ما ـ چنان‌که گذشت ـ تصویب با مجلس است (اصل ۷۷) و امضا با رئیس‌جمهور (اصل ۱۲۵)؛ پس معاهده‌ای که بدون تصویب مجلس امضا شده باشد، از نظر حقوق داخلی «ناقص» است. ولی ـ و این همان نکته ماده ۴۶ است ـ نقصِ داخلی، فقط وقتی در سطح بین‌المللی قابل استناد است که «آشکار» باشد و به «قاعده بنیادین» مربوط شود؛ و تفسیر دیوان از این ماده بسیار مضیق است. پس عملاً: دولتی که معاهده‌ای را امضا و اجرا کرده، بعداً به‌سختی می‌تواند به بهانه نقص تشریفات داخلی از آن شانه خالی کند. درسش برای ما: تشریفات داخلی را «قبل» از التزام رعایت کنید، نه «بعد» از آن؛ چون بعداً دیگر به کار نمی‌آید. و این، وظیفه مجلس و شورای نگهبان و معاونت حقوقی ریاست‌جمهوری است که در مرحله تصویب، دقت کنند ـ چون امضای بعدی، راه بازگشت را می‌بندد.</w:t>
       </w:r>
     </w:p>
     <w:p>
@@ -5072,6 +5072,97 @@
           <w:sz w:val="28"/>
           <w:szCs w:val="28"/>
         </w:rPr>
+        <w:t>بند سوم: عیوب اراده؛ اشتباه، فریب و اجبار</w:t>
+      </w:r>
+    </w:p>
+    <w:p>
+      <w:pPr>
+        <w:pStyle w:val="TH-Body"/>
+        <w:widowControl/>
+        <w:bidi w:val="1"/>
+        <w:spacing w:before="0" w:after="120" w:line="288" w:lineRule="auto"/>
+        <w:ind w:firstLine="283"/>
+        <w:jc w:val="both"/>
+      </w:pPr>
+      <w:r>
+        <w:rPr>
+          <w:rFonts w:ascii="B Lotus" w:hAnsi="B Lotus" w:cs="B Lotus" w:eastAsia="B Lotus"/>
+          <w:b w:val="0"/>
+          <w:i w:val="0"/>
+          <w:sz w:val="28"/>
+          <w:szCs w:val="28"/>
+        </w:rPr>
+        <w:t>مهم‌ترین بخشِ بحث اعتبار، «عیوب اراده» است: مواردی که رضایت دولت به التزام، مخدوش بوده و معاهده از اول معیوب است. وین شش مورد را برشمرده: اشتباه (ماده ۴۸)، فریب (ماده ۴۹)، رشوه و تطمیع نماینده (ماده ۵۰)، اجبار بر نماینده (ماده ۵۱)، اجبار بر دولت با تهدید یا استعمال زور (ماده ۵۲)، و تعارض با قاعده آمره (ماده ۵۳).</w:t>
+      </w:r>
+      <w:r>
+        <w:rPr>
+          <w:rFonts w:ascii="B Lotus" w:hAnsi="B Lotus" w:cs="B Lotus" w:eastAsia="B Lotus"/>
+          <w:b w:val="0"/>
+          <w:i w:val="0"/>
+          <w:sz w:val="28"/>
+          <w:szCs w:val="28"/>
+          <w:vertAlign w:val="superscript"/>
+        </w:rPr>
+        <w:footnoteReference w:id="33"/>
+      </w:r>
+    </w:p>
+    <w:p>
+      <w:pPr>
+        <w:pStyle w:val="TH-Body"/>
+        <w:widowControl/>
+        <w:bidi w:val="1"/>
+        <w:spacing w:before="0" w:after="120" w:line="288" w:lineRule="auto"/>
+        <w:ind w:firstLine="283"/>
+        <w:jc w:val="both"/>
+      </w:pPr>
+      <w:r>
+        <w:rPr>
+          <w:rFonts w:ascii="B Lotus" w:hAnsi="B Lotus" w:cs="B Lotus" w:eastAsia="B Lotus"/>
+          <w:b w:val="0"/>
+          <w:i w:val="0"/>
+          <w:sz w:val="28"/>
+          <w:szCs w:val="28"/>
+        </w:rPr>
+        <w:t>از میان این‌ها، دو مورد برای تاریخ ما و مسئله ما مهم‌تر است. یکم، «اجبار بر دولت» (ماده ۵۲): معاهده‌ای که با تهدید یا استعمال زور بر دولت تحمیل شده باشد، «باطل» است ـ نه فقط قابل فسخ، بلکه از اول باطل. این قاعده ـ که ریشه در ممنوعیت توسل به زور (بند ۴ ماده ۲ منشور) دارد ـ برای معاهداتی که قدرت‌های بزرگ در دوران ضعف به کشورهای ضعیف تحمیل کرده‌اند (مثل معاهدات ننگینِ دوران قاجار: گلستان و ترکمانچای) کاربرد تاریخی دارد؛ هرچند از نظر حقوقی، عطف‌بماسبق شدن وین محل بحث است و من در آن وارد نمی‌شوم. ولی اصلِ قاعده، پشتوانه حقوقیِ این فهمِ فطری است که «پیمانِ تحمیلی، پیمان نیست». دوم، «تعارض با قاعده آمره» (ماده ۵۳): معاهده‌ای که با قواعد آمره (مثل منع تجاوز و نسل‌کشی) در تعارض باشد، باطل است؛ و این، همان سقفی است که در ضابطه هفتم گفتم و در هر دو نظام پذیرفته شده.</w:t>
+      </w:r>
+    </w:p>
+    <w:p>
+      <w:pPr>
+        <w:pStyle w:val="TH-Body"/>
+        <w:widowControl/>
+        <w:bidi w:val="1"/>
+        <w:spacing w:before="0" w:after="120" w:line="288" w:lineRule="auto"/>
+        <w:ind w:firstLine="283"/>
+        <w:jc w:val="both"/>
+      </w:pPr>
+      <w:r>
+        <w:rPr>
+          <w:rFonts w:ascii="B Lotus" w:hAnsi="B Lotus" w:cs="B Lotus" w:eastAsia="B Lotus"/>
+          <w:b w:val="0"/>
+          <w:i w:val="0"/>
+          <w:sz w:val="28"/>
+          <w:szCs w:val="28"/>
+        </w:rPr>
+        <w:t>نتیجه عملی برای تصمیم‌گیر: قبل از عدول، یک‌بار هم معاهده را از زاویه «اعتبار» بررسی کنید؛ چه‌بسا معاهده‌ای که گمان می‌رود معتبر است، به یکی از این عیوب مبتلا باشد ـ و در آن صورت، راهِ اعلامِ بی‌اعتباری (مواد ۶۵ تا ۶۸) باز است که هم کم‌هزینه‌تر است هم موجه‌تر. البته ـ انصافاً ـ اثبات این عیوب در مراجع بین‌المللی دشوار است و نباید ساده‌انگارانه به آن دل بست؛ ولی به‌عنوان یکی از گزینه‌های روی میز، باید بررسی شود.</w:t>
+      </w:r>
+    </w:p>
+    <w:p>
+      <w:pPr>
+        <w:pStyle w:val="TH-Band"/>
+        <w:widowControl/>
+        <w:bidi w:val="1"/>
+        <w:spacing w:before="200" w:after="120" w:line="288" w:lineRule="auto"/>
+        <w:jc w:val="right"/>
+        <w:keepNext w:val="1"/>
+      </w:pPr>
+      <w:r>
+        <w:rPr>
+          <w:rFonts w:ascii="B Traffic" w:hAnsi="B Traffic" w:cs="B Traffic" w:eastAsia="B Traffic"/>
+          <w:b/>
+          <w:i w:val="0"/>
+          <w:sz w:val="28"/>
+          <w:szCs w:val="28"/>
+        </w:rPr>
         <w:t>بند چهارم: ثبت معاهدات و اثر آن</w:t>
       </w:r>
     </w:p>
@@ -5103,7 +5194,7 @@
           <w:szCs w:val="28"/>
           <w:vertAlign w:val="superscript"/>
         </w:rPr>
-        <w:footnoteReference w:id="33"/>
+        <w:footnoteReference w:id="34"/>
       </w:r>
       <w:r>
         <w:rPr>
@@ -5231,7 +5322,7 @@
           <w:szCs w:val="26"/>
           <w:vertAlign w:val="superscript"/>
         </w:rPr>
-        <w:footnoteReference w:id="34"/>
+        <w:footnoteReference w:id="35"/>
       </w:r>
     </w:p>
     <w:p>
@@ -5329,7 +5420,7 @@
           <w:szCs w:val="26"/>
           <w:vertAlign w:val="superscript"/>
         </w:rPr>
-        <w:footnoteReference w:id="35"/>
+        <w:footnoteReference w:id="36"/>
       </w:r>
     </w:p>
     <w:p>
@@ -5427,7 +5518,7 @@
           <w:szCs w:val="26"/>
           <w:vertAlign w:val="superscript"/>
         </w:rPr>
-        <w:footnoteReference w:id="36"/>
+        <w:footnoteReference w:id="37"/>
       </w:r>
     </w:p>
     <w:p>
@@ -5485,7 +5576,7 @@
           <w:szCs w:val="26"/>
           <w:vertAlign w:val="superscript"/>
         </w:rPr>
-        <w:footnoteReference w:id="37"/>
+        <w:footnoteReference w:id="38"/>
       </w:r>
     </w:p>
     <w:p>
@@ -5556,7 +5647,7 @@
           <w:szCs w:val="28"/>
           <w:vertAlign w:val="superscript"/>
         </w:rPr>
-        <w:footnoteReference w:id="38"/>
+        <w:footnoteReference w:id="39"/>
       </w:r>
     </w:p>
     <w:p>
@@ -5607,7 +5698,7 @@
           <w:szCs w:val="28"/>
           <w:vertAlign w:val="superscript"/>
         </w:rPr>
-        <w:footnoteReference w:id="39"/>
+        <w:footnoteReference w:id="40"/>
       </w:r>
       <w:r>
         <w:rPr>
@@ -5668,7 +5759,7 @@
           <w:szCs w:val="28"/>
           <w:vertAlign w:val="superscript"/>
         </w:rPr>
-        <w:footnoteReference w:id="40"/>
+        <w:footnoteReference w:id="41"/>
       </w:r>
       <w:r>
         <w:rPr>
@@ -5709,7 +5800,7 @@
           <w:szCs w:val="28"/>
           <w:vertAlign w:val="superscript"/>
         </w:rPr>
-        <w:footnoteReference w:id="41"/>
+        <w:footnoteReference w:id="42"/>
       </w:r>
       <w:r>
         <w:rPr>
@@ -5790,7 +5881,7 @@
           <w:szCs w:val="28"/>
           <w:vertAlign w:val="superscript"/>
         </w:rPr>
-        <w:footnoteReference w:id="42"/>
+        <w:footnoteReference w:id="43"/>
       </w:r>
       <w:r>
         <w:rPr>
@@ -5831,7 +5922,7 @@
           <w:szCs w:val="28"/>
           <w:vertAlign w:val="superscript"/>
         </w:rPr>
-        <w:footnoteReference w:id="43"/>
+        <w:footnoteReference w:id="44"/>
       </w:r>
       <w:r>
         <w:rPr>
@@ -5872,7 +5963,7 @@
           <w:szCs w:val="28"/>
           <w:vertAlign w:val="superscript"/>
         </w:rPr>
-        <w:footnoteReference w:id="44"/>
+        <w:footnoteReference w:id="45"/>
       </w:r>
       <w:r>
         <w:rPr>
@@ -5913,7 +6004,7 @@
           <w:szCs w:val="28"/>
           <w:vertAlign w:val="superscript"/>
         </w:rPr>
-        <w:footnoteReference w:id="45"/>
+        <w:footnoteReference w:id="46"/>
       </w:r>
       <w:r>
         <w:rPr>
@@ -6122,7 +6213,7 @@
           <w:szCs w:val="26"/>
           <w:vertAlign w:val="superscript"/>
         </w:rPr>
-        <w:footnoteReference w:id="46"/>
+        <w:footnoteReference w:id="47"/>
       </w:r>
     </w:p>
     <w:p>
@@ -6153,7 +6244,7 @@
           <w:szCs w:val="28"/>
           <w:vertAlign w:val="superscript"/>
         </w:rPr>
-        <w:footnoteReference w:id="47"/>
+        <w:footnoteReference w:id="48"/>
       </w:r>
     </w:p>
     <w:p>
@@ -6251,7 +6342,7 @@
           <w:szCs w:val="26"/>
           <w:vertAlign w:val="superscript"/>
         </w:rPr>
-        <w:footnoteReference w:id="48"/>
+        <w:footnoteReference w:id="49"/>
       </w:r>
     </w:p>
     <w:p>
@@ -6282,7 +6373,7 @@
           <w:szCs w:val="28"/>
           <w:vertAlign w:val="superscript"/>
         </w:rPr>
-        <w:footnoteReference w:id="49"/>
+        <w:footnoteReference w:id="50"/>
       </w:r>
       <w:r>
         <w:rPr>
@@ -6350,7 +6441,7 @@
           <w:szCs w:val="26"/>
           <w:vertAlign w:val="superscript"/>
         </w:rPr>
-        <w:footnoteReference w:id="50"/>
+        <w:footnoteReference w:id="51"/>
       </w:r>
     </w:p>
     <w:p>
@@ -6428,7 +6519,7 @@
           <w:szCs w:val="26"/>
           <w:vertAlign w:val="superscript"/>
         </w:rPr>
-        <w:footnoteReference w:id="51"/>
+        <w:footnoteReference w:id="52"/>
       </w:r>
     </w:p>
     <w:p>
@@ -6506,7 +6597,7 @@
           <w:szCs w:val="26"/>
           <w:vertAlign w:val="superscript"/>
         </w:rPr>
-        <w:footnoteReference w:id="52"/>
+        <w:footnoteReference w:id="53"/>
       </w:r>
     </w:p>
     <w:p>
@@ -6644,7 +6735,7 @@
           <w:szCs w:val="26"/>
           <w:vertAlign w:val="superscript"/>
         </w:rPr>
-        <w:footnoteReference w:id="53"/>
+        <w:footnoteReference w:id="54"/>
       </w:r>
     </w:p>
     <w:p>
@@ -6682,7 +6773,7 @@
           <w:szCs w:val="26"/>
           <w:vertAlign w:val="superscript"/>
         </w:rPr>
-        <w:footnoteReference w:id="54"/>
+        <w:footnoteReference w:id="55"/>
       </w:r>
     </w:p>
     <w:p>
@@ -6780,7 +6871,7 @@
           <w:szCs w:val="26"/>
           <w:vertAlign w:val="superscript"/>
         </w:rPr>
-        <w:footnoteReference w:id="55"/>
+        <w:footnoteReference w:id="56"/>
       </w:r>
     </w:p>
     <w:p>
@@ -6838,7 +6929,7 @@
           <w:szCs w:val="26"/>
           <w:vertAlign w:val="superscript"/>
         </w:rPr>
-        <w:footnoteReference w:id="56"/>
+        <w:footnoteReference w:id="57"/>
       </w:r>
     </w:p>
     <w:p>
@@ -6936,7 +7027,7 @@
           <w:szCs w:val="26"/>
           <w:vertAlign w:val="superscript"/>
         </w:rPr>
-        <w:footnoteReference w:id="57"/>
+        <w:footnoteReference w:id="58"/>
       </w:r>
     </w:p>
     <w:p>
@@ -6987,7 +7078,7 @@
           <w:szCs w:val="28"/>
           <w:vertAlign w:val="superscript"/>
         </w:rPr>
-        <w:footnoteReference w:id="58"/>
+        <w:footnoteReference w:id="59"/>
       </w:r>
       <w:r>
         <w:rPr>
@@ -7055,7 +7146,7 @@
           <w:szCs w:val="26"/>
           <w:vertAlign w:val="superscript"/>
         </w:rPr>
-        <w:footnoteReference w:id="59"/>
+        <w:footnoteReference w:id="60"/>
       </w:r>
     </w:p>
     <w:p>
@@ -7146,7 +7237,7 @@
           <w:szCs w:val="28"/>
           <w:vertAlign w:val="superscript"/>
         </w:rPr>
-        <w:footnoteReference w:id="60"/>
+        <w:footnoteReference w:id="61"/>
       </w:r>
       <w:r>
         <w:rPr>
@@ -7167,7 +7258,7 @@
           <w:szCs w:val="28"/>
           <w:vertAlign w:val="superscript"/>
         </w:rPr>
-        <w:footnoteReference w:id="61"/>
+        <w:footnoteReference w:id="62"/>
       </w:r>
       <w:r>
         <w:rPr>
@@ -7248,7 +7339,7 @@
           <w:szCs w:val="28"/>
           <w:vertAlign w:val="superscript"/>
         </w:rPr>
-        <w:footnoteReference w:id="62"/>
+        <w:footnoteReference w:id="63"/>
       </w:r>
     </w:p>
     <w:p>
@@ -7319,7 +7410,7 @@
           <w:szCs w:val="28"/>
           <w:vertAlign w:val="superscript"/>
         </w:rPr>
-        <w:footnoteReference w:id="63"/>
+        <w:footnoteReference w:id="64"/>
       </w:r>
     </w:p>
     <w:p>
@@ -7390,7 +7481,7 @@
           <w:szCs w:val="28"/>
           <w:vertAlign w:val="superscript"/>
         </w:rPr>
-        <w:footnoteReference w:id="64"/>
+        <w:footnoteReference w:id="65"/>
       </w:r>
       <w:r>
         <w:rPr>
@@ -7531,7 +7622,7 @@
           <w:szCs w:val="28"/>
           <w:vertAlign w:val="superscript"/>
         </w:rPr>
-        <w:footnoteReference w:id="65"/>
+        <w:footnoteReference w:id="66"/>
       </w:r>
     </w:p>
     <w:p>
@@ -7582,7 +7673,7 @@
           <w:szCs w:val="28"/>
           <w:vertAlign w:val="superscript"/>
         </w:rPr>
-        <w:footnoteReference w:id="66"/>
+        <w:footnoteReference w:id="67"/>
       </w:r>
     </w:p>
     <w:p>
@@ -7673,7 +7764,7 @@
           <w:szCs w:val="28"/>
           <w:vertAlign w:val="superscript"/>
         </w:rPr>
-        <w:footnoteReference w:id="67"/>
+        <w:footnoteReference w:id="68"/>
       </w:r>
       <w:r>
         <w:rPr>
@@ -7734,7 +7825,7 @@
           <w:szCs w:val="28"/>
           <w:vertAlign w:val="superscript"/>
         </w:rPr>
-        <w:footnoteReference w:id="68"/>
+        <w:footnoteReference w:id="69"/>
       </w:r>
       <w:r>
         <w:rPr>
@@ -7755,7 +7846,7 @@
           <w:szCs w:val="28"/>
           <w:vertAlign w:val="superscript"/>
         </w:rPr>
-        <w:footnoteReference w:id="69"/>
+        <w:footnoteReference w:id="70"/>
       </w:r>
       <w:r>
         <w:rPr>
@@ -7823,7 +7914,7 @@
           <w:szCs w:val="26"/>
           <w:vertAlign w:val="superscript"/>
         </w:rPr>
-        <w:footnoteReference w:id="70"/>
+        <w:footnoteReference w:id="71"/>
       </w:r>
     </w:p>
     <w:p>
@@ -7921,7 +8012,7 @@
           <w:szCs w:val="26"/>
           <w:vertAlign w:val="superscript"/>
         </w:rPr>
-        <w:footnoteReference w:id="71"/>
+        <w:footnoteReference w:id="72"/>
       </w:r>
     </w:p>
     <w:p>
@@ -7952,7 +8043,7 @@
           <w:szCs w:val="28"/>
           <w:vertAlign w:val="superscript"/>
         </w:rPr>
-        <w:footnoteReference w:id="72"/>
+        <w:footnoteReference w:id="73"/>
       </w:r>
       <w:r>
         <w:rPr>
@@ -8040,7 +8131,7 @@
           <w:szCs w:val="26"/>
           <w:vertAlign w:val="superscript"/>
         </w:rPr>
-        <w:footnoteReference w:id="73"/>
+        <w:footnoteReference w:id="74"/>
       </w:r>
     </w:p>
     <w:p>
@@ -8138,7 +8229,7 @@
           <w:szCs w:val="26"/>
           <w:vertAlign w:val="superscript"/>
         </w:rPr>
-        <w:footnoteReference w:id="74"/>
+        <w:footnoteReference w:id="75"/>
       </w:r>
     </w:p>
     <w:p>
@@ -8249,7 +8340,7 @@
           <w:szCs w:val="28"/>
           <w:vertAlign w:val="superscript"/>
         </w:rPr>
-        <w:footnoteReference w:id="75"/>
+        <w:footnoteReference w:id="76"/>
       </w:r>
       <w:r>
         <w:rPr>
@@ -8290,7 +8381,7 @@
           <w:szCs w:val="28"/>
           <w:vertAlign w:val="superscript"/>
         </w:rPr>
-        <w:footnoteReference w:id="76"/>
+        <w:footnoteReference w:id="77"/>
       </w:r>
       <w:r>
         <w:rPr>
@@ -8371,7 +8462,7 @@
           <w:szCs w:val="28"/>
           <w:vertAlign w:val="superscript"/>
         </w:rPr>
-        <w:footnoteReference w:id="77"/>
+        <w:footnoteReference w:id="78"/>
       </w:r>
       <w:r>
         <w:rPr>
@@ -8412,7 +8503,7 @@
           <w:szCs w:val="28"/>
           <w:vertAlign w:val="superscript"/>
         </w:rPr>
-        <w:footnoteReference w:id="78"/>
+        <w:footnoteReference w:id="79"/>
       </w:r>
       <w:r>
         <w:rPr>
@@ -8433,7 +8524,7 @@
           <w:szCs w:val="28"/>
           <w:vertAlign w:val="superscript"/>
         </w:rPr>
-        <w:footnoteReference w:id="79"/>
+        <w:footnoteReference w:id="80"/>
       </w:r>
     </w:p>
     <w:p>
@@ -8564,7 +8655,7 @@
           <w:szCs w:val="28"/>
           <w:vertAlign w:val="superscript"/>
         </w:rPr>
-        <w:footnoteReference w:id="80"/>
+        <w:footnoteReference w:id="81"/>
       </w:r>
       <w:r>
         <w:rPr>
@@ -8605,7 +8696,7 @@
           <w:szCs w:val="28"/>
           <w:vertAlign w:val="superscript"/>
         </w:rPr>
-        <w:footnoteReference w:id="81"/>
+        <w:footnoteReference w:id="82"/>
       </w:r>
       <w:r>
         <w:rPr>
@@ -8666,7 +8757,7 @@
           <w:szCs w:val="28"/>
           <w:vertAlign w:val="superscript"/>
         </w:rPr>
-        <w:footnoteReference w:id="82"/>
+        <w:footnoteReference w:id="83"/>
       </w:r>
       <w:r>
         <w:rPr>
@@ -8707,7 +8798,7 @@
           <w:szCs w:val="28"/>
           <w:vertAlign w:val="superscript"/>
         </w:rPr>
-        <w:footnoteReference w:id="83"/>
+        <w:footnoteReference w:id="84"/>
       </w:r>
       <w:r>
         <w:rPr>
@@ -8936,7 +9027,7 @@
           <w:szCs w:val="28"/>
           <w:vertAlign w:val="superscript"/>
         </w:rPr>
-        <w:footnoteReference w:id="84"/>
+        <w:footnoteReference w:id="85"/>
       </w:r>
     </w:p>
     <w:p>
@@ -9207,7 +9298,7 @@
           <w:szCs w:val="28"/>
           <w:vertAlign w:val="superscript"/>
         </w:rPr>
-        <w:footnoteReference w:id="85"/>
+        <w:footnoteReference w:id="86"/>
       </w:r>
     </w:p>
     <w:p>
@@ -9465,7 +9556,7 @@
           <w:szCs w:val="26"/>
           <w:vertAlign w:val="superscript"/>
         </w:rPr>
-        <w:footnoteReference w:id="86"/>
+        <w:footnoteReference w:id="87"/>
       </w:r>
     </w:p>
     <w:p>
@@ -9563,7 +9654,7 @@
           <w:szCs w:val="26"/>
           <w:vertAlign w:val="superscript"/>
         </w:rPr>
-        <w:footnoteReference w:id="87"/>
+        <w:footnoteReference w:id="88"/>
       </w:r>
     </w:p>
     <w:p>
@@ -9634,7 +9725,7 @@
           <w:szCs w:val="28"/>
           <w:vertAlign w:val="superscript"/>
         </w:rPr>
-        <w:footnoteReference w:id="88"/>
+        <w:footnoteReference w:id="89"/>
       </w:r>
       <w:r>
         <w:rPr>
@@ -10235,7 +10326,7 @@
           <w:szCs w:val="28"/>
           <w:vertAlign w:val="superscript"/>
         </w:rPr>
-        <w:footnoteReference w:id="89"/>
+        <w:footnoteReference w:id="90"/>
       </w:r>
       <w:r>
         <w:rPr>
@@ -10316,7 +10407,7 @@
           <w:szCs w:val="28"/>
           <w:vertAlign w:val="superscript"/>
         </w:rPr>
-        <w:footnoteReference w:id="90"/>
+        <w:footnoteReference w:id="91"/>
       </w:r>
       <w:r>
         <w:rPr>
@@ -10397,7 +10488,7 @@
           <w:szCs w:val="28"/>
           <w:vertAlign w:val="superscript"/>
         </w:rPr>
-        <w:footnoteReference w:id="91"/>
+        <w:footnoteReference w:id="92"/>
       </w:r>
       <w:r>
         <w:rPr>
@@ -10418,7 +10509,7 @@
           <w:szCs w:val="28"/>
           <w:vertAlign w:val="superscript"/>
         </w:rPr>
-        <w:footnoteReference w:id="92"/>
+        <w:footnoteReference w:id="93"/>
       </w:r>
     </w:p>
     <w:p>
@@ -10489,7 +10580,7 @@
           <w:szCs w:val="28"/>
           <w:vertAlign w:val="superscript"/>
         </w:rPr>
-        <w:footnoteReference w:id="93"/>
+        <w:footnoteReference w:id="94"/>
       </w:r>
     </w:p>
     <w:p>
@@ -10600,7 +10691,7 @@
           <w:szCs w:val="28"/>
           <w:vertAlign w:val="superscript"/>
         </w:rPr>
-        <w:footnoteReference w:id="94"/>
+        <w:footnoteReference w:id="95"/>
       </w:r>
     </w:p>
     <w:p>
@@ -10812,7 +10903,7 @@
           <w:szCs w:val="28"/>
           <w:vertAlign w:val="superscript"/>
         </w:rPr>
-        <w:footnoteReference w:id="95"/>
+        <w:footnoteReference w:id="96"/>
       </w:r>
     </w:p>
     <w:p>
@@ -10903,7 +10994,7 @@
           <w:szCs w:val="28"/>
           <w:vertAlign w:val="superscript"/>
         </w:rPr>
-        <w:footnoteReference w:id="96"/>
+        <w:footnoteReference w:id="97"/>
       </w:r>
     </w:p>
     <w:p>
@@ -10974,7 +11065,7 @@
           <w:szCs w:val="28"/>
           <w:vertAlign w:val="superscript"/>
         </w:rPr>
-        <w:footnoteReference w:id="97"/>
+        <w:footnoteReference w:id="98"/>
       </w:r>
       <w:r>
         <w:rPr>
@@ -11082,7 +11173,7 @@
           <w:szCs w:val="26"/>
           <w:vertAlign w:val="superscript"/>
         </w:rPr>
-        <w:footnoteReference w:id="98"/>
+        <w:footnoteReference w:id="99"/>
       </w:r>
     </w:p>
     <w:p>
@@ -11133,7 +11224,7 @@
           <w:szCs w:val="28"/>
           <w:vertAlign w:val="superscript"/>
         </w:rPr>
-        <w:footnoteReference w:id="99"/>
+        <w:footnoteReference w:id="100"/>
       </w:r>
       <w:r>
         <w:rPr>
@@ -11154,7 +11245,7 @@
           <w:szCs w:val="28"/>
           <w:vertAlign w:val="superscript"/>
         </w:rPr>
-        <w:footnoteReference w:id="100"/>
+        <w:footnoteReference w:id="101"/>
       </w:r>
       <w:r>
         <w:rPr>
@@ -11175,7 +11266,7 @@
           <w:szCs w:val="28"/>
           <w:vertAlign w:val="superscript"/>
         </w:rPr>
-        <w:footnoteReference w:id="101"/>
+        <w:footnoteReference w:id="102"/>
       </w:r>
       <w:r>
         <w:rPr>
@@ -11196,7 +11287,7 @@
           <w:szCs w:val="28"/>
           <w:vertAlign w:val="superscript"/>
         </w:rPr>
-        <w:footnoteReference w:id="102"/>
+        <w:footnoteReference w:id="103"/>
       </w:r>
     </w:p>
     <w:p>
@@ -11407,7 +11498,7 @@
           <w:szCs w:val="28"/>
           <w:vertAlign w:val="superscript"/>
         </w:rPr>
-        <w:footnoteReference w:id="103"/>
+        <w:footnoteReference w:id="104"/>
       </w:r>
       <w:r>
         <w:rPr>
@@ -11448,7 +11539,7 @@
           <w:szCs w:val="28"/>
           <w:vertAlign w:val="superscript"/>
         </w:rPr>
-        <w:footnoteReference w:id="104"/>
+        <w:footnoteReference w:id="105"/>
       </w:r>
       <w:r>
         <w:rPr>
@@ -11489,7 +11580,7 @@
           <w:szCs w:val="28"/>
           <w:vertAlign w:val="superscript"/>
         </w:rPr>
-        <w:footnoteReference w:id="105"/>
+        <w:footnoteReference w:id="106"/>
       </w:r>
       <w:r>
         <w:rPr>
@@ -11710,7 +11801,7 @@
           <w:szCs w:val="28"/>
           <w:vertAlign w:val="superscript"/>
         </w:rPr>
-        <w:footnoteReference w:id="106"/>
+        <w:footnoteReference w:id="107"/>
       </w:r>
     </w:p>
     <w:p>
@@ -11741,7 +11832,7 @@
           <w:szCs w:val="28"/>
           <w:vertAlign w:val="superscript"/>
         </w:rPr>
-        <w:footnoteReference w:id="107"/>
+        <w:footnoteReference w:id="108"/>
       </w:r>
       <w:r>
         <w:rPr>
@@ -11782,7 +11873,7 @@
           <w:szCs w:val="28"/>
           <w:vertAlign w:val="superscript"/>
         </w:rPr>
-        <w:footnoteReference w:id="108"/>
+        <w:footnoteReference w:id="109"/>
       </w:r>
       <w:r>
         <w:rPr>
@@ -11823,7 +11914,7 @@
           <w:szCs w:val="28"/>
           <w:vertAlign w:val="superscript"/>
         </w:rPr>
-        <w:footnoteReference w:id="109"/>
+        <w:footnoteReference w:id="110"/>
       </w:r>
     </w:p>
     <w:p>
@@ -11854,7 +11945,7 @@
           <w:szCs w:val="28"/>
           <w:vertAlign w:val="superscript"/>
         </w:rPr>
-        <w:footnoteReference w:id="110"/>
+        <w:footnoteReference w:id="111"/>
       </w:r>
       <w:r>
         <w:rPr>
@@ -11915,7 +12006,7 @@
           <w:szCs w:val="28"/>
           <w:vertAlign w:val="superscript"/>
         </w:rPr>
-        <w:footnoteReference w:id="111"/>
+        <w:footnoteReference w:id="112"/>
       </w:r>
       <w:r>
         <w:rPr>
@@ -11956,7 +12047,7 @@
           <w:szCs w:val="28"/>
           <w:vertAlign w:val="superscript"/>
         </w:rPr>
-        <w:footnoteReference w:id="112"/>
+        <w:footnoteReference w:id="113"/>
       </w:r>
       <w:r>
         <w:rPr>
@@ -12057,7 +12148,7 @@
           <w:szCs w:val="28"/>
           <w:vertAlign w:val="superscript"/>
         </w:rPr>
-        <w:footnoteReference w:id="113"/>
+        <w:footnoteReference w:id="114"/>
       </w:r>
       <w:r>
         <w:rPr>
@@ -12198,7 +12289,7 @@
           <w:szCs w:val="28"/>
           <w:vertAlign w:val="superscript"/>
         </w:rPr>
-        <w:footnoteReference w:id="114"/>
+        <w:footnoteReference w:id="115"/>
       </w:r>
     </w:p>
     <w:p>
@@ -12249,7 +12340,7 @@
           <w:szCs w:val="28"/>
           <w:vertAlign w:val="superscript"/>
         </w:rPr>
-        <w:footnoteReference w:id="115"/>
+        <w:footnoteReference w:id="116"/>
       </w:r>
       <w:r>
         <w:rPr>
@@ -12290,7 +12381,7 @@
           <w:szCs w:val="28"/>
           <w:vertAlign w:val="superscript"/>
         </w:rPr>
-        <w:footnoteReference w:id="116"/>
+        <w:footnoteReference w:id="117"/>
       </w:r>
       <w:r>
         <w:rPr>
@@ -12311,7 +12402,7 @@
           <w:szCs w:val="28"/>
           <w:vertAlign w:val="superscript"/>
         </w:rPr>
-        <w:footnoteReference w:id="117"/>
+        <w:footnoteReference w:id="118"/>
       </w:r>
       <w:r>
         <w:rPr>
@@ -12492,7 +12583,7 @@
           <w:szCs w:val="28"/>
           <w:vertAlign w:val="superscript"/>
         </w:rPr>
-        <w:footnoteReference w:id="118"/>
+        <w:footnoteReference w:id="119"/>
       </w:r>
       <w:r>
         <w:rPr>
@@ -12533,7 +12624,7 @@
           <w:szCs w:val="28"/>
           <w:vertAlign w:val="superscript"/>
         </w:rPr>
-        <w:footnoteReference w:id="119"/>
+        <w:footnoteReference w:id="120"/>
       </w:r>
       <w:r>
         <w:rPr>
@@ -12574,7 +12665,7 @@
           <w:szCs w:val="28"/>
           <w:vertAlign w:val="superscript"/>
         </w:rPr>
-        <w:footnoteReference w:id="120"/>
+        <w:footnoteReference w:id="121"/>
       </w:r>
       <w:r>
         <w:rPr>
@@ -12695,7 +12786,7 @@
           <w:szCs w:val="28"/>
           <w:vertAlign w:val="superscript"/>
         </w:rPr>
-        <w:footnoteReference w:id="121"/>
+        <w:footnoteReference w:id="122"/>
       </w:r>
       <w:r>
         <w:rPr>
@@ -12876,7 +12967,7 @@
           <w:szCs w:val="28"/>
           <w:vertAlign w:val="superscript"/>
         </w:rPr>
-        <w:footnoteReference w:id="122"/>
+        <w:footnoteReference w:id="123"/>
       </w:r>
       <w:r>
         <w:rPr>
@@ -12917,7 +13008,7 @@
           <w:szCs w:val="28"/>
           <w:vertAlign w:val="superscript"/>
         </w:rPr>
-        <w:footnoteReference w:id="123"/>
+        <w:footnoteReference w:id="124"/>
       </w:r>
       <w:r>
         <w:rPr>
@@ -12958,7 +13049,7 @@
           <w:szCs w:val="28"/>
           <w:vertAlign w:val="superscript"/>
         </w:rPr>
-        <w:footnoteReference w:id="124"/>
+        <w:footnoteReference w:id="125"/>
       </w:r>
       <w:r>
         <w:rPr>
@@ -13059,7 +13150,7 @@
           <w:szCs w:val="28"/>
           <w:vertAlign w:val="superscript"/>
         </w:rPr>
-        <w:footnoteReference w:id="125"/>
+        <w:footnoteReference w:id="126"/>
       </w:r>
       <w:r>
         <w:rPr>
@@ -13160,7 +13251,7 @@
           <w:szCs w:val="28"/>
           <w:vertAlign w:val="superscript"/>
         </w:rPr>
-        <w:footnoteReference w:id="126"/>
+        <w:footnoteReference w:id="127"/>
       </w:r>
     </w:p>
     <w:p>
@@ -15635,7 +15726,7 @@
           <w:szCs w:val="28"/>
           <w:vertAlign w:val="superscript"/>
         </w:rPr>
-        <w:footnoteReference w:id="127"/>
+        <w:footnoteReference w:id="128"/>
       </w:r>
     </w:p>
     <w:p>
@@ -15666,7 +15757,7 @@
           <w:szCs w:val="28"/>
           <w:vertAlign w:val="superscript"/>
         </w:rPr>
-        <w:footnoteReference w:id="128"/>
+        <w:footnoteReference w:id="129"/>
       </w:r>
     </w:p>
     <w:p>
@@ -15697,7 +15788,7 @@
           <w:szCs w:val="28"/>
           <w:vertAlign w:val="superscript"/>
         </w:rPr>
-        <w:footnoteReference w:id="129"/>
+        <w:footnoteReference w:id="130"/>
       </w:r>
     </w:p>
     <w:p>
@@ -15728,7 +15819,7 @@
           <w:szCs w:val="28"/>
           <w:vertAlign w:val="superscript"/>
         </w:rPr>
-        <w:footnoteReference w:id="130"/>
+        <w:footnoteReference w:id="131"/>
       </w:r>
     </w:p>
     <w:p>
@@ -15759,7 +15850,7 @@
           <w:szCs w:val="28"/>
           <w:vertAlign w:val="superscript"/>
         </w:rPr>
-        <w:footnoteReference w:id="131"/>
+        <w:footnoteReference w:id="132"/>
       </w:r>
     </w:p>
     <w:p>
@@ -15790,7 +15881,7 @@
           <w:szCs w:val="28"/>
           <w:vertAlign w:val="superscript"/>
         </w:rPr>
-        <w:footnoteReference w:id="132"/>
+        <w:footnoteReference w:id="133"/>
       </w:r>
     </w:p>
     <w:p>
@@ -15821,7 +15912,7 @@
           <w:szCs w:val="28"/>
           <w:vertAlign w:val="superscript"/>
         </w:rPr>
-        <w:footnoteReference w:id="133"/>
+        <w:footnoteReference w:id="134"/>
       </w:r>
     </w:p>
     <w:p>
@@ -15852,7 +15943,7 @@
           <w:szCs w:val="28"/>
           <w:vertAlign w:val="superscript"/>
         </w:rPr>
-        <w:footnoteReference w:id="134"/>
+        <w:footnoteReference w:id="135"/>
       </w:r>
     </w:p>
     <w:p>
@@ -15883,7 +15974,7 @@
           <w:szCs w:val="28"/>
           <w:vertAlign w:val="superscript"/>
         </w:rPr>
-        <w:footnoteReference w:id="135"/>
+        <w:footnoteReference w:id="136"/>
       </w:r>
     </w:p>
     <w:p>
@@ -15914,7 +16005,7 @@
           <w:szCs w:val="28"/>
           <w:vertAlign w:val="superscript"/>
         </w:rPr>
-        <w:footnoteReference w:id="136"/>
+        <w:footnoteReference w:id="137"/>
       </w:r>
     </w:p>
     <w:p>
@@ -15965,7 +16056,7 @@
           <w:szCs w:val="28"/>
           <w:vertAlign w:val="superscript"/>
         </w:rPr>
-        <w:footnoteReference w:id="137"/>
+        <w:footnoteReference w:id="138"/>
       </w:r>
     </w:p>
     <w:p>
@@ -15996,7 +16087,7 @@
           <w:szCs w:val="28"/>
           <w:vertAlign w:val="superscript"/>
         </w:rPr>
-        <w:footnoteReference w:id="138"/>
+        <w:footnoteReference w:id="139"/>
       </w:r>
     </w:p>
     <w:p>
@@ -16027,7 +16118,7 @@
           <w:szCs w:val="28"/>
           <w:vertAlign w:val="superscript"/>
         </w:rPr>
-        <w:footnoteReference w:id="139"/>
+        <w:footnoteReference w:id="140"/>
       </w:r>
     </w:p>
     <w:p>
@@ -16058,7 +16149,7 @@
           <w:szCs w:val="28"/>
           <w:vertAlign w:val="superscript"/>
         </w:rPr>
-        <w:footnoteReference w:id="140"/>
+        <w:footnoteReference w:id="141"/>
       </w:r>
     </w:p>
     <w:p>
@@ -16089,7 +16180,7 @@
           <w:szCs w:val="28"/>
           <w:vertAlign w:val="superscript"/>
         </w:rPr>
-        <w:footnoteReference w:id="141"/>
+        <w:footnoteReference w:id="142"/>
       </w:r>
     </w:p>
     <w:p>
@@ -16120,7 +16211,7 @@
           <w:szCs w:val="28"/>
           <w:vertAlign w:val="superscript"/>
         </w:rPr>
-        <w:footnoteReference w:id="142"/>
+        <w:footnoteReference w:id="143"/>
       </w:r>
     </w:p>
     <w:p>
@@ -16151,7 +16242,7 @@
           <w:szCs w:val="28"/>
           <w:vertAlign w:val="superscript"/>
         </w:rPr>
-        <w:footnoteReference w:id="143"/>
+        <w:footnoteReference w:id="144"/>
       </w:r>
     </w:p>
     <w:p>
@@ -16182,7 +16273,7 @@
           <w:szCs w:val="28"/>
           <w:vertAlign w:val="superscript"/>
         </w:rPr>
-        <w:footnoteReference w:id="144"/>
+        <w:footnoteReference w:id="145"/>
       </w:r>
     </w:p>
     <w:p>
@@ -16213,7 +16304,7 @@
           <w:szCs w:val="28"/>
           <w:vertAlign w:val="superscript"/>
         </w:rPr>
-        <w:footnoteReference w:id="145"/>
+        <w:footnoteReference w:id="146"/>
       </w:r>
     </w:p>
     <w:p>
@@ -16304,7 +16395,7 @@
           <w:szCs w:val="28"/>
           <w:vertAlign w:val="superscript"/>
         </w:rPr>
-        <w:footnoteReference w:id="146"/>
+        <w:footnoteReference w:id="147"/>
       </w:r>
     </w:p>
     <w:p>
@@ -17513,7 +17604,7 @@
           <w:sz w:val="20"/>
           <w:szCs w:val="20"/>
         </w:rPr>
-        <w:t xml:space="preserve">کنوانسیون وین حقوق معاهدات، مواد ۳۱ و ۳۲.</w:t>
+        <w:t xml:space="preserve">کنوانسیون وین حقوق معاهدات، مواد ۱۹ تا ۲۳ (به‌اجمال).</w:t>
       </w:r>
     </w:p>
   </w:footnote>
@@ -17546,7 +17637,7 @@
           <w:sz w:val="20"/>
           <w:szCs w:val="20"/>
         </w:rPr>
-        <w:t xml:space="preserve">کنوانسیون وین حقوق معاهدات، ماده ۳۲.</w:t>
+        <w:t xml:space="preserve">کنوانسیون وین حقوق معاهدات، مواد ۳۱ و ۳۲.</w:t>
       </w:r>
     </w:p>
   </w:footnote>
@@ -17579,7 +17670,7 @@
           <w:sz w:val="20"/>
           <w:szCs w:val="20"/>
         </w:rPr>
-        <w:t xml:space="preserve">کنوانسیون وین حقوق معاهدات، مواد ۶، ۷ و ۴۶ (به‌اجمال).</w:t>
+        <w:t xml:space="preserve">کنوانسیون وین حقوق معاهدات، ماده ۳۲.</w:t>
       </w:r>
     </w:p>
   </w:footnote>
@@ -17612,7 +17703,7 @@
           <w:sz w:val="20"/>
           <w:szCs w:val="20"/>
         </w:rPr>
-        <w:t xml:space="preserve">کنوانسیون وین حقوق معاهدات، مواد ۴۸ تا ۵۳ (به‌اجمال).</w:t>
+        <w:t xml:space="preserve">کنوانسیون وین حقوق معاهدات، مواد ۶، ۷ و ۴۶ (به‌اجمال).</w:t>
       </w:r>
     </w:p>
   </w:footnote>
@@ -17645,7 +17736,7 @@
           <w:sz w:val="20"/>
           <w:szCs w:val="20"/>
         </w:rPr>
-        <w:t xml:space="preserve">منشور سازمان ملل متحد، ماده ۱۰۲.</w:t>
+        <w:t xml:space="preserve">کنوانسیون وین حقوق معاهدات، مواد ۴۸ تا ۵۳ (به‌اجمال).</w:t>
       </w:r>
     </w:p>
   </w:footnote>
@@ -17678,7 +17769,7 @@
           <w:sz w:val="20"/>
           <w:szCs w:val="20"/>
         </w:rPr>
-        <w:t xml:space="preserve">قانون اساسی جمهوری اسلامی ایران، اصل ۵.</w:t>
+        <w:t xml:space="preserve">منشور سازمان ملل متحد، ماده ۱۰۲.</w:t>
       </w:r>
     </w:p>
   </w:footnote>
@@ -17711,7 +17802,7 @@
           <w:sz w:val="20"/>
           <w:szCs w:val="20"/>
         </w:rPr>
-        <w:t xml:space="preserve">قانون اساسی جمهوری اسلامی ایران، اصل ۵۷.</w:t>
+        <w:t xml:space="preserve">قانون اساسی جمهوری اسلامی ایران، اصل ۵.</w:t>
       </w:r>
     </w:p>
   </w:footnote>
@@ -17744,7 +17835,7 @@
           <w:sz w:val="20"/>
           <w:szCs w:val="20"/>
         </w:rPr>
-        <w:t xml:space="preserve">قانون اساسی جمهوری اسلامی ایران، اصل ۷۷.</w:t>
+        <w:t xml:space="preserve">قانون اساسی جمهوری اسلامی ایران، اصل ۵۷.</w:t>
       </w:r>
     </w:p>
   </w:footnote>
@@ -17777,7 +17868,7 @@
           <w:sz w:val="20"/>
           <w:szCs w:val="20"/>
         </w:rPr>
-        <w:t xml:space="preserve">قانون اساسی جمهوری اسلامی ایران، اصل ۱۲۵.</w:t>
+        <w:t xml:space="preserve">قانون اساسی جمهوری اسلامی ایران، اصل ۷۷.</w:t>
       </w:r>
     </w:p>
   </w:footnote>
@@ -17810,7 +17901,7 @@
           <w:sz w:val="20"/>
           <w:szCs w:val="20"/>
         </w:rPr>
-        <w:t xml:space="preserve">قانون اساسی جمهوری اسلامی ایران، اصل ۱۱۰.</w:t>
+        <w:t xml:space="preserve">قانون اساسی جمهوری اسلامی ایران، اصل ۱۲۵.</w:t>
       </w:r>
     </w:p>
   </w:footnote>
@@ -17843,7 +17934,7 @@
           <w:sz w:val="20"/>
           <w:szCs w:val="20"/>
         </w:rPr>
-        <w:t xml:space="preserve">قانون اساسی جمهوری اسلامی ایران، اصل ۱۱۲ (به‌اجمال).</w:t>
+        <w:t xml:space="preserve">قانون اساسی جمهوری اسلامی ایران، اصل ۱۱۰.</w:t>
       </w:r>
     </w:p>
   </w:footnote>
@@ -17876,7 +17967,7 @@
           <w:sz w:val="20"/>
           <w:szCs w:val="20"/>
         </w:rPr>
-        <w:t xml:space="preserve">قانون اساسی جمهوری اسلامی ایران، اصول ۱۵۲، ۱۵۳ و ۱۵۴ (به‌اجمال).</w:t>
+        <w:t xml:space="preserve">قانون اساسی جمهوری اسلامی ایران، اصل ۱۱۲ (به‌اجمال).</w:t>
       </w:r>
     </w:p>
   </w:footnote>
@@ -17909,7 +18000,7 @@
           <w:sz w:val="20"/>
           <w:szCs w:val="20"/>
         </w:rPr>
-        <w:t xml:space="preserve">قانون اساسی جمهوری اسلامی ایران، اصل ۱۷۶ (به‌اجمال).</w:t>
+        <w:t xml:space="preserve">قانون اساسی جمهوری اسلامی ایران، اصول ۱۵۲، ۱۵۳ و ۱۵۴ (به‌اجمال).</w:t>
       </w:r>
     </w:p>
   </w:footnote>
@@ -17942,7 +18033,7 @@
           <w:sz w:val="20"/>
           <w:szCs w:val="20"/>
         </w:rPr>
-        <w:t xml:space="preserve">قانون اساسی جمهوری اسلامی ایران، اصل ۱۵۲.</w:t>
+        <w:t xml:space="preserve">قانون اساسی جمهوری اسلامی ایران، اصل ۱۷۶ (به‌اجمال).</w:t>
       </w:r>
     </w:p>
   </w:footnote>
@@ -17975,7 +18066,7 @@
           <w:sz w:val="20"/>
           <w:szCs w:val="20"/>
         </w:rPr>
-        <w:t xml:space="preserve">قانون اساسی جمهوری اسلامی ایران، اصل ۱۵۳.</w:t>
+        <w:t xml:space="preserve">قانون اساسی جمهوری اسلامی ایران، اصل ۱۵۲.</w:t>
       </w:r>
     </w:p>
   </w:footnote>
@@ -18008,7 +18099,7 @@
           <w:sz w:val="20"/>
           <w:szCs w:val="20"/>
         </w:rPr>
-        <w:t xml:space="preserve">قانون اساسی جمهوری اسلامی ایران، اصل ۱۵۴ (به‌اجمال).</w:t>
+        <w:t xml:space="preserve">قانون اساسی جمهوری اسلامی ایران، اصل ۱۵۳.</w:t>
       </w:r>
     </w:p>
   </w:footnote>
@@ -18041,7 +18132,7 @@
           <w:sz w:val="20"/>
           <w:szCs w:val="20"/>
         </w:rPr>
-        <w:t xml:space="preserve">قانون اساسی جمهوری اسلامی ایران، اصل ۱۷۶ (به‌اجمال).</w:t>
+        <w:t xml:space="preserve">قانون اساسی جمهوری اسلامی ایران، اصل ۱۵۴ (به‌اجمال).</w:t>
       </w:r>
     </w:p>
   </w:footnote>
@@ -18074,7 +18165,7 @@
           <w:sz w:val="20"/>
           <w:szCs w:val="20"/>
         </w:rPr>
-        <w:t xml:space="preserve">سوره مائده، آیه ۱.</w:t>
+        <w:t xml:space="preserve">قانون اساسی جمهوری اسلامی ایران، اصل ۱۷۶ (به‌اجمال).</w:t>
       </w:r>
     </w:p>
   </w:footnote>
@@ -18107,7 +18198,7 @@
           <w:sz w:val="20"/>
           <w:szCs w:val="20"/>
         </w:rPr>
-        <w:t xml:space="preserve">ر.ک: شیخ انصاری، مرتضی، المکاسب، کتاب البیع (مشخصات چاپ، نیازمند بررسی منبع اصلی است)؛ و بجنوردی، سیدمحمدحسن، القواعد الفقهیه، ج ۴، قاعده لزوم (مشخصات چاپ، نیازمند بررسی منبع اصلی است).</w:t>
+        <w:t xml:space="preserve">سوره مائده، آیه ۱.</w:t>
       </w:r>
     </w:p>
   </w:footnote>
@@ -18140,7 +18231,7 @@
           <w:sz w:val="20"/>
           <w:szCs w:val="20"/>
         </w:rPr>
-        <w:t xml:space="preserve">سوره نحل، آیات ۹۱ و ۹۲.</w:t>
+        <w:t xml:space="preserve">ر.ک: شیخ انصاری، مرتضی، المکاسب، کتاب البیع (مشخصات چاپ، نیازمند بررسی منبع اصلی است)؛ و بجنوردی، سیدمحمدحسن، القواعد الفقهیه، ج ۴، قاعده لزوم (مشخصات چاپ، نیازمند بررسی منبع اصلی است).</w:t>
       </w:r>
     </w:p>
   </w:footnote>
@@ -18173,7 +18264,7 @@
           <w:sz w:val="20"/>
           <w:szCs w:val="20"/>
         </w:rPr>
-        <w:t xml:space="preserve">ر.ک: علامه طباطبایی، سیدمحمدحسین، المیزان فی تفسیر القرآن، ذیل آیه ۹۱ نحل (مشخصات چاپ، نیازمند بررسی منبع اصلی است).</w:t>
+        <w:t xml:space="preserve">سوره نحل، آیات ۹۱ و ۹۲.</w:t>
       </w:r>
     </w:p>
   </w:footnote>
@@ -18206,7 +18297,7 @@
           <w:sz w:val="20"/>
           <w:szCs w:val="20"/>
         </w:rPr>
-        <w:t xml:space="preserve">سوره اسراء، آیه ۳۴.</w:t>
+        <w:t xml:space="preserve">ر.ک: علامه طباطبایی، سیدمحمدحسین، المیزان فی تفسیر القرآن، ذیل آیه ۹۱ نحل (مشخصات چاپ، نیازمند بررسی منبع اصلی است).</w:t>
       </w:r>
     </w:p>
   </w:footnote>
@@ -18239,7 +18330,7 @@
           <w:sz w:val="20"/>
           <w:szCs w:val="20"/>
         </w:rPr>
-        <w:t xml:space="preserve">سوره رعد، آیات ۲۰ تا ۲۵.</w:t>
+        <w:t xml:space="preserve">سوره اسراء، آیه ۳۴.</w:t>
       </w:r>
     </w:p>
   </w:footnote>
@@ -18272,7 +18363,7 @@
           <w:sz w:val="20"/>
           <w:szCs w:val="20"/>
         </w:rPr>
-        <w:t xml:space="preserve">سوره مؤمنون، آیه ۸؛ و نیز سوره معارج، آیه ۳۲.</w:t>
+        <w:t xml:space="preserve">سوره رعد، آیات ۲۰ تا ۲۵.</w:t>
       </w:r>
     </w:p>
   </w:footnote>
@@ -18305,7 +18396,7 @@
           <w:sz w:val="20"/>
           <w:szCs w:val="20"/>
         </w:rPr>
-        <w:t xml:space="preserve">سوره توبه، آیه ۴.</w:t>
+        <w:t xml:space="preserve">سوره مؤمنون، آیه ۸؛ و نیز سوره معارج، آیه ۳۲.</w:t>
       </w:r>
     </w:p>
   </w:footnote>
@@ -18338,7 +18429,7 @@
           <w:sz w:val="20"/>
           <w:szCs w:val="20"/>
         </w:rPr>
-        <w:t xml:space="preserve">سوره توبه، آیه ۷.</w:t>
+        <w:t xml:space="preserve">سوره توبه، آیه ۴.</w:t>
       </w:r>
     </w:p>
   </w:footnote>
@@ -18371,7 +18462,7 @@
           <w:sz w:val="20"/>
           <w:szCs w:val="20"/>
         </w:rPr>
-        <w:t xml:space="preserve">سوره انفال، آیه ۵۸.</w:t>
+        <w:t xml:space="preserve">سوره توبه، آیه ۷.</w:t>
       </w:r>
     </w:p>
   </w:footnote>
@@ -18404,7 +18495,7 @@
           <w:sz w:val="20"/>
           <w:szCs w:val="20"/>
         </w:rPr>
-        <w:t xml:space="preserve">سوره انفال، آیه ۷۲.</w:t>
+        <w:t xml:space="preserve">سوره انفال، آیه ۵۸.</w:t>
       </w:r>
     </w:p>
   </w:footnote>
@@ -18437,7 +18528,7 @@
           <w:sz w:val="20"/>
           <w:szCs w:val="20"/>
         </w:rPr>
-        <w:t xml:space="preserve">حر عاملی، محمد بن حسن، وسائل الشیعه، ابواب خیارات (مشخصات چاپ و نشانی دقیق، نیازمند بررسی منبع اصلی است).</w:t>
+        <w:t xml:space="preserve">سوره انفال، آیه ۷۲.</w:t>
       </w:r>
     </w:p>
   </w:footnote>
@@ -18470,7 +18561,7 @@
           <w:sz w:val="20"/>
           <w:szCs w:val="20"/>
         </w:rPr>
-        <w:t xml:space="preserve">برای بررسی سندی، ر.ک: مجلسی، محمدباقر، بحار الانوار (نشانی دقیق، نیازمند بررسی منبع اصلی است).</w:t>
+        <w:t xml:space="preserve">حر عاملی، محمد بن حسن، وسائل الشیعه، ابواب خیارات (مشخصات چاپ و نشانی دقیق، نیازمند بررسی منبع اصلی است).</w:t>
       </w:r>
     </w:p>
   </w:footnote>
@@ -18503,7 +18594,7 @@
           <w:sz w:val="20"/>
           <w:szCs w:val="20"/>
         </w:rPr>
-        <w:t xml:space="preserve">نهج‌البلاغه، نامه ۵۳ (عهدنامه مالک اشتر).</w:t>
+        <w:t xml:space="preserve">برای بررسی سندی، ر.ک: مجلسی، محمدباقر، بحار الانوار (نشانی دقیق، نیازمند بررسی منبع اصلی است).</w:t>
       </w:r>
     </w:p>
   </w:footnote>
@@ -18536,7 +18627,7 @@
           <w:sz w:val="20"/>
           <w:szCs w:val="20"/>
         </w:rPr>
-        <w:t xml:space="preserve">کلینی، محمد بن یعقوب، الکافی (نشانی دقیق، نیازمند بررسی منبع اصلی است).</w:t>
+        <w:t xml:space="preserve">نهج‌البلاغه، نامه ۵۳ (عهدنامه مالک اشتر).</w:t>
       </w:r>
     </w:p>
   </w:footnote>
@@ -18569,7 +18660,7 @@
           <w:sz w:val="20"/>
           <w:szCs w:val="20"/>
         </w:rPr>
-        <w:t xml:space="preserve">حر عاملی، محمد بن حسن، وسائل الشیعه، ابواب جهاد و ابواب احکام عقود (نشانی دقیق، نیازمند بررسی منبع اصلی است).</w:t>
+        <w:t xml:space="preserve">کلینی، محمد بن یعقوب، الکافی (نشانی دقیق، نیازمند بررسی منبع اصلی است).</w:t>
       </w:r>
     </w:p>
   </w:footnote>
@@ -18602,7 +18693,7 @@
           <w:sz w:val="20"/>
           <w:szCs w:val="20"/>
         </w:rPr>
-        <w:t xml:space="preserve">ر.ک: ابن‌هشام، السیرة النبویة، ماجرای حدیبیه (مشخصات چاپ، نیازمند بررسی منبع اصلی است).</w:t>
+        <w:t xml:space="preserve">حر عاملی، محمد بن حسن، وسائل الشیعه، ابواب جهاد و ابواب احکام عقود (نشانی دقیق، نیازمند بررسی منبع اصلی است).</w:t>
       </w:r>
     </w:p>
   </w:footnote>
@@ -18635,7 +18726,7 @@
           <w:sz w:val="20"/>
           <w:szCs w:val="20"/>
         </w:rPr>
-        <w:t xml:space="preserve">سوره توبه، آیات ۱ تا ۴؛ و ر.ک: طبری، تاریخ الامم و الملوک، ماجرای فتح مکه (مشخصات چاپ، نیازمند بررسی منبع اصلی است).</w:t>
+        <w:t xml:space="preserve">ر.ک: ابن‌هشام، السیرة النبویة، ماجرای حدیبیه (مشخصات چاپ، نیازمند بررسی منبع اصلی است).</w:t>
       </w:r>
     </w:p>
   </w:footnote>
@@ -18668,7 +18759,7 @@
           <w:sz w:val="20"/>
           <w:szCs w:val="20"/>
         </w:rPr>
-        <w:t xml:space="preserve">ر.ک: نهج‌البلاغه، خطبه‌ها و نامه‌های مربوط به صفین (نشانی دقیق، نیازمند بررسی منبع اصلی است).</w:t>
+        <w:t xml:space="preserve">سوره توبه، آیات ۱ تا ۴؛ و ر.ک: طبری، تاریخ الامم و الملوک، ماجرای فتح مکه (مشخصات چاپ، نیازمند بررسی منبع اصلی است).</w:t>
       </w:r>
     </w:p>
   </w:footnote>
@@ -18701,7 +18792,7 @@
           <w:sz w:val="20"/>
           <w:szCs w:val="20"/>
         </w:rPr>
-        <w:t xml:space="preserve">ر.ک: آخوند خراسانی، محمدکاظم، کفایة الاصول، مبحث ملازمه عقلیه (مشخصات چاپ، نیازمند بررسی منبع اصلی است).</w:t>
+        <w:t xml:space="preserve">ر.ک: نهج‌البلاغه، خطبه‌ها و نامه‌های مربوط به صفین (نشانی دقیق، نیازمند بررسی منبع اصلی است).</w:t>
       </w:r>
     </w:p>
   </w:footnote>
@@ -18734,7 +18825,7 @@
           <w:sz w:val="20"/>
           <w:szCs w:val="20"/>
         </w:rPr>
-        <w:t xml:space="preserve">ر.ک: میرزای نائینی، محمدحسین، فوائد الاصول، مبحث بنای عقلا (مشخصات چاپ، نیازمند بررسی منبع اصلی است).</w:t>
+        <w:t xml:space="preserve">ر.ک: آخوند خراسانی، محمدکاظم، کفایة الاصول، مبحث ملازمه عقلیه (مشخصات چاپ، نیازمند بررسی منبع اصلی است).</w:t>
       </w:r>
     </w:p>
   </w:footnote>
@@ -18767,7 +18858,7 @@
           <w:sz w:val="20"/>
           <w:szCs w:val="20"/>
         </w:rPr>
-        <w:t xml:space="preserve">بجنوردی، سیدمحمدحسن، القواعد الفقهیه، ج ۴، قاعده لزوم (مشخصات چاپ، نیازمند بررسی منبع اصلی است).</w:t>
+        <w:t xml:space="preserve">ر.ک: میرزای نائینی، محمدحسین، فوائد الاصول، مبحث بنای عقلا (مشخصات چاپ، نیازمند بررسی منبع اصلی است).</w:t>
       </w:r>
     </w:p>
   </w:footnote>
@@ -18800,7 +18891,7 @@
           <w:sz w:val="20"/>
           <w:szCs w:val="20"/>
         </w:rPr>
-        <w:t xml:space="preserve">سوره انفال، آیه ۵۸.</w:t>
+        <w:t xml:space="preserve">بجنوردی، سیدمحمدحسن، القواعد الفقهیه، ج ۴، قاعده لزوم (مشخصات چاپ، نیازمند بررسی منبع اصلی است).</w:t>
       </w:r>
     </w:p>
   </w:footnote>
@@ -18833,7 +18924,7 @@
           <w:sz w:val="20"/>
           <w:szCs w:val="20"/>
         </w:rPr>
-        <w:t xml:space="preserve">حر عاملی، محمد بن حسن، وسائل الشیعه، ابواب جهاد (نشانی دقیق، نیازمند بررسی منبع اصلی است).</w:t>
+        <w:t xml:space="preserve">سوره انفال، آیه ۵۸.</w:t>
       </w:r>
     </w:p>
   </w:footnote>
@@ -18866,7 +18957,7 @@
           <w:sz w:val="20"/>
           <w:szCs w:val="20"/>
         </w:rPr>
-        <w:t xml:space="preserve">سوره نساء، آیه ۱۴۱.</w:t>
+        <w:t xml:space="preserve">حر عاملی، محمد بن حسن، وسائل الشیعه، ابواب جهاد (نشانی دقیق، نیازمند بررسی منبع اصلی است).</w:t>
       </w:r>
     </w:p>
   </w:footnote>
@@ -18899,7 +18990,7 @@
           <w:sz w:val="20"/>
           <w:szCs w:val="20"/>
         </w:rPr>
-        <w:t xml:space="preserve">سوره نساء، آیه ۵۸.</w:t>
+        <w:t xml:space="preserve">سوره نساء، آیه ۱۴۱.</w:t>
       </w:r>
     </w:p>
   </w:footnote>
@@ -18932,7 +19023,7 @@
           <w:sz w:val="20"/>
           <w:szCs w:val="20"/>
         </w:rPr>
-        <w:t xml:space="preserve">ر.ک: علامه طباطبایی، سیدمحمدحسین، المیزان فی تفسیر القرآن، ذیل آیه ۵۸ نساء (مشخصات چاپ، نیازمند بررسی منبع اصلی است).</w:t>
+        <w:t xml:space="preserve">سوره نساء، آیه ۵۸.</w:t>
       </w:r>
     </w:p>
   </w:footnote>
@@ -18965,7 +19056,7 @@
           <w:sz w:val="20"/>
           <w:szCs w:val="20"/>
         </w:rPr>
-        <w:t xml:space="preserve">سوره مائده، آیه ۸۹.</w:t>
+        <w:t xml:space="preserve">ر.ک: علامه طباطبایی، سیدمحمدحسین، المیزان فی تفسیر القرآن، ذیل آیه ۵۸ نساء (مشخصات چاپ، نیازمند بررسی منبع اصلی است).</w:t>
       </w:r>
     </w:p>
   </w:footnote>
@@ -18998,7 +19089,7 @@
           <w:sz w:val="20"/>
           <w:szCs w:val="20"/>
         </w:rPr>
-        <w:t xml:space="preserve">شیخ صدوق، محمد بن علی، الخصال؛ و حر عاملی، محمد بن حسن، وسائل الشیعه (نشانی دقیق، نیازمند بررسی منبع اصلی است).</w:t>
+        <w:t xml:space="preserve">سوره مائده، آیه ۸۹.</w:t>
       </w:r>
     </w:p>
   </w:footnote>
@@ -19031,7 +19122,7 @@
           <w:sz w:val="20"/>
           <w:szCs w:val="20"/>
         </w:rPr>
-        <w:t xml:space="preserve">ر.ک: ابن‌هشام، السیرة النبویة، ماجرای هجرت و میثاق مدینه (مشخصات چاپ، نیازمند بررسی منبع اصلی است).</w:t>
+        <w:t xml:space="preserve">شیخ صدوق، محمد بن علی، الخصال؛ و حر عاملی، محمد بن حسن، وسائل الشیعه (نشانی دقیق، نیازمند بررسی منبع اصلی است).</w:t>
       </w:r>
     </w:p>
   </w:footnote>
@@ -19064,7 +19155,7 @@
           <w:sz w:val="20"/>
           <w:szCs w:val="20"/>
         </w:rPr>
-        <w:t xml:space="preserve">ر.ک: ابن‌هشام، السیرة النبویة، ماجرای نجران (مشخصات چاپ، نیازمند بررسی منبع اصلی است).</w:t>
+        <w:t xml:space="preserve">ر.ک: ابن‌هشام، السیرة النبویة، ماجرای هجرت و میثاق مدینه (مشخصات چاپ، نیازمند بررسی منبع اصلی است).</w:t>
       </w:r>
     </w:p>
   </w:footnote>
@@ -19097,7 +19188,7 @@
           <w:sz w:val="20"/>
           <w:szCs w:val="20"/>
         </w:rPr>
-        <w:t xml:space="preserve">نجفی، محمدحسن (صاحب جواهر)، جواهر الکلام، کتاب الجهاد، احکام هدنه (مشخصات چاپ و نشانی دقیق، نیازمند بررسی منبع اصلی است).</w:t>
+        <w:t xml:space="preserve">ر.ک: ابن‌هشام، السیرة النبویة، ماجرای نجران (مشخصات چاپ، نیازمند بررسی منبع اصلی است).</w:t>
       </w:r>
     </w:p>
   </w:footnote>
@@ -19130,7 +19221,7 @@
           <w:sz w:val="20"/>
           <w:szCs w:val="20"/>
         </w:rPr>
-        <w:t xml:space="preserve">امام خمینی، سیدروح‌الله، تحریر الوسیله، کتاب الجهاد و الامر بالمعروف (نشانی دقیق، نیازمند بررسی منبع اصلی است).</w:t>
+        <w:t xml:space="preserve">نجفی، محمدحسن (صاحب جواهر)، جواهر الکلام، کتاب الجهاد، احکام هدنه (مشخصات چاپ و نشانی دقیق، نیازمند بررسی منبع اصلی است).</w:t>
       </w:r>
     </w:p>
   </w:footnote>
@@ -19163,7 +19254,7 @@
           <w:sz w:val="20"/>
           <w:szCs w:val="20"/>
         </w:rPr>
-        <w:t xml:space="preserve">شیخ انصاری، مرتضی، المکاسب، کتاب البیع، مبحث لزوم (نشانی دقیق، نیازمند بررسی منبع اصلی است).</w:t>
+        <w:t xml:space="preserve">امام خمینی، سیدروح‌الله، تحریر الوسیله، کتاب الجهاد و الامر بالمعروف (نشانی دقیق، نیازمند بررسی منبع اصلی است).</w:t>
       </w:r>
     </w:p>
   </w:footnote>
@@ -19196,7 +19287,7 @@
           <w:sz w:val="20"/>
           <w:szCs w:val="20"/>
         </w:rPr>
-        <w:t xml:space="preserve">ر.ک: راغب اصفهانی، حسین بن محمد، مفردات الفاظ القرآن، ماده «عهد» (مشخصات چاپ، نیازمند بررسی منبع اصلی است).</w:t>
+        <w:t xml:space="preserve">شیخ انصاری، مرتضی، المکاسب، کتاب البیع، مبحث لزوم (نشانی دقیق، نیازمند بررسی منبع اصلی است).</w:t>
       </w:r>
     </w:p>
   </w:footnote>
@@ -19229,7 +19320,7 @@
           <w:sz w:val="20"/>
           <w:szCs w:val="20"/>
         </w:rPr>
-        <w:t xml:space="preserve">ر.ک: راغب اصفهانی، حسین بن محمد، مفردات الفاظ القرآن، ماده «عقد» (مشخصات چاپ، نیازمند بررسی منبع اصلی است).</w:t>
+        <w:t xml:space="preserve">ر.ک: راغب اصفهانی، حسین بن محمد، مفردات الفاظ القرآن، ماده «عهد» (مشخصات چاپ، نیازمند بررسی منبع اصلی است).</w:t>
       </w:r>
     </w:p>
   </w:footnote>
@@ -19262,7 +19353,7 @@
           <w:sz w:val="20"/>
           <w:szCs w:val="20"/>
         </w:rPr>
-        <w:t xml:space="preserve">ر.ک: راغب اصفهانی، حسین بن محمد، مفردات الفاظ القرآن، ماده «وثق» (مشخصات چاپ، نیازمند بررسی منبع اصلی است).</w:t>
+        <w:t xml:space="preserve">ر.ک: راغب اصفهانی، حسین بن محمد، مفردات الفاظ القرآن، ماده «عقد» (مشخصات چاپ، نیازمند بررسی منبع اصلی است).</w:t>
       </w:r>
     </w:p>
   </w:footnote>
@@ -19295,7 +19386,7 @@
           <w:sz w:val="20"/>
           <w:szCs w:val="20"/>
         </w:rPr>
-        <w:t xml:space="preserve">سوره آل‌عمران، آیه ۹.</w:t>
+        <w:t xml:space="preserve">ر.ک: راغب اصفهانی، حسین بن محمد، مفردات الفاظ القرآن، ماده «وثق» (مشخصات چاپ، نیازمند بررسی منبع اصلی است).</w:t>
       </w:r>
     </w:p>
   </w:footnote>
@@ -19328,7 +19419,7 @@
           <w:sz w:val="20"/>
           <w:szCs w:val="20"/>
         </w:rPr>
-        <w:t xml:space="preserve">ر.ک: آخوند خراسانی، محمدکاظم، کفایة الاصول، مبحث تزاحم؛ و میرزای نائینی، محمدحسین، فوائد الاصول، مبحث تزاحم (مشخصات چاپ، نیازمند بررسی منبع اصلی است).</w:t>
+        <w:t xml:space="preserve">سوره آل‌عمران، آیه ۹.</w:t>
       </w:r>
     </w:p>
   </w:footnote>
@@ -19361,7 +19452,7 @@
           <w:sz w:val="20"/>
           <w:szCs w:val="20"/>
         </w:rPr>
-        <w:t xml:space="preserve">امام خمینی، سیدروح‌الله، صحیفه امام، نامه به حجت‌الاسلام قدیری (نشانی دقیق، نیازمند بررسی منبع اصلی است).</w:t>
+        <w:t xml:space="preserve">ر.ک: آخوند خراسانی، محمدکاظم، کفایة الاصول، مبحث تزاحم؛ و میرزای نائینی، محمدحسین، فوائد الاصول، مبحث تزاحم (مشخصات چاپ، نیازمند بررسی منبع اصلی است).</w:t>
       </w:r>
     </w:p>
   </w:footnote>
@@ -19394,7 +19485,7 @@
           <w:sz w:val="20"/>
           <w:szCs w:val="20"/>
         </w:rPr>
-        <w:t xml:space="preserve">شیخ صدوق، محمد بن علی، من لایحضره الفقیه؛ و کلینی، محمد بن یعقوب، الکافی (نشانی دقیق، نیازمند بررسی منبع اصلی است).</w:t>
+        <w:t xml:space="preserve">امام خمینی، سیدروح‌الله، صحیفه امام، نامه به حجت‌الاسلام قدیری (نشانی دقیق، نیازمند بررسی منبع اصلی است).</w:t>
       </w:r>
     </w:p>
   </w:footnote>
@@ -19427,7 +19518,7 @@
           <w:sz w:val="20"/>
           <w:szCs w:val="20"/>
         </w:rPr>
-        <w:t xml:space="preserve">سوره حج، آیه ۷۸.</w:t>
+        <w:t xml:space="preserve">شیخ صدوق، محمد بن علی، من لایحضره الفقیه؛ و کلینی، محمد بن یعقوب، الکافی (نشانی دقیق، نیازمند بررسی منبع اصلی است).</w:t>
       </w:r>
     </w:p>
   </w:footnote>
@@ -19460,7 +19551,7 @@
           <w:sz w:val="20"/>
           <w:szCs w:val="20"/>
         </w:rPr>
-        <w:t xml:space="preserve">امام خمینی، سیدروح‌الله، صحیفه امام (نشانی دقیق، نیازمند بررسی منبع اصلی است).</w:t>
+        <w:t xml:space="preserve">سوره حج، آیه ۷۸.</w:t>
       </w:r>
     </w:p>
   </w:footnote>
@@ -19493,7 +19584,7 @@
           <w:sz w:val="20"/>
           <w:szCs w:val="20"/>
         </w:rPr>
-        <w:t xml:space="preserve">نراقی، ملا احمد، عوائد الایام، عائده ولایت فقیه (مشخصات چاپ و نشانی دقیق، نیازمند بررسی منبع اصلی است).</w:t>
+        <w:t xml:space="preserve">امام خمینی، سیدروح‌الله، صحیفه امام (نشانی دقیق، نیازمند بررسی منبع اصلی است).</w:t>
       </w:r>
     </w:p>
   </w:footnote>
@@ -19526,7 +19617,7 @@
           <w:sz w:val="20"/>
           <w:szCs w:val="20"/>
         </w:rPr>
-        <w:t xml:space="preserve">میرزای نائینی، محمدحسین، تنبیه الامه و تنزیه المله، تهران (مشخصات چاپ، نیازمند بررسی منبع اصلی است).</w:t>
+        <w:t xml:space="preserve">نراقی، ملا احمد، عوائد الایام، عائده ولایت فقیه (مشخصات چاپ و نشانی دقیق، نیازمند بررسی منبع اصلی است).</w:t>
       </w:r>
     </w:p>
   </w:footnote>
@@ -19559,7 +19650,7 @@
           <w:sz w:val="20"/>
           <w:szCs w:val="20"/>
         </w:rPr>
-        <w:t xml:space="preserve">امام خمینی، سیدروح‌الله، ولایت فقیه (حکومت اسلامی) (مشخصات چاپ، نیازمند بررسی منبع اصلی است).</w:t>
+        <w:t xml:space="preserve">میرزای نائینی، محمدحسین، تنبیه الامه و تنزیه المله، تهران (مشخصات چاپ، نیازمند بررسی منبع اصلی است).</w:t>
       </w:r>
     </w:p>
   </w:footnote>
@@ -19592,7 +19683,7 @@
           <w:sz w:val="20"/>
           <w:szCs w:val="20"/>
         </w:rPr>
-        <w:t xml:space="preserve">امام خمینی، سیدروح‌الله، صحیفه امام، نامه به حجت‌الاسلام قدیری (نشانی دقیق، نیازمند بررسی منبع اصلی است).</w:t>
+        <w:t xml:space="preserve">امام خمینی، سیدروح‌الله، ولایت فقیه (حکومت اسلامی) (مشخصات چاپ، نیازمند بررسی منبع اصلی است).</w:t>
       </w:r>
     </w:p>
   </w:footnote>
@@ -19625,7 +19716,7 @@
           <w:sz w:val="20"/>
           <w:szCs w:val="20"/>
         </w:rPr>
-        <w:t xml:space="preserve">ر.ک: شیخ مفید، محمد بن محمد، الارشاد، احوال امام حسن؛ و طبری، محمد بن جریر، تاریخ الامم و الملوک، حوادث سال ۴۱ (مشخصات چاپ، نیازمند بررسی منبع اصلی است).</w:t>
+        <w:t xml:space="preserve">امام خمینی، سیدروح‌الله، صحیفه امام، نامه به حجت‌الاسلام قدیری (نشانی دقیق، نیازمند بررسی منبع اصلی است).</w:t>
       </w:r>
     </w:p>
   </w:footnote>
@@ -19658,7 +19749,7 @@
           <w:sz w:val="20"/>
           <w:szCs w:val="20"/>
         </w:rPr>
-        <w:t xml:space="preserve">ر.ک: آخوند خراسانی، محمدکاظم، کفایة الاصول، مبحث تزاحم؛ و میرزای نائینی، محمدحسین، فوائد الاصول، مبحث تزاحم (مشخصات چاپ، نیازمند بررسی منبع اصلی است).</w:t>
+        <w:t xml:space="preserve">ر.ک: شیخ مفید، محمد بن محمد، الارشاد، احوال امام حسن؛ و طبری، محمد بن جریر، تاریخ الامم و الملوک، حوادث سال ۴۱ (مشخصات چاپ، نیازمند بررسی منبع اصلی است).</w:t>
       </w:r>
     </w:p>
   </w:footnote>
@@ -19691,7 +19782,7 @@
           <w:sz w:val="20"/>
           <w:szCs w:val="20"/>
         </w:rPr>
-        <w:t xml:space="preserve">طرح مواد کمیسیون حقوق بین‌الملل درباره مسئولیت بین‌المللی دولت‌ها (۲۰۰۱). ر.ک: گزارش‌های کمیسیون حقوق بین‌الملل (نشانی دقیق، نیازمند بررسی منبع اصلی است).</w:t>
+        <w:t xml:space="preserve">ر.ک: آخوند خراسانی، محمدکاظم، کفایة الاصول، مبحث تزاحم؛ و میرزای نائینی، محمدحسین، فوائد الاصول، مبحث تزاحم (مشخصات چاپ، نیازمند بررسی منبع اصلی است).</w:t>
       </w:r>
     </w:p>
   </w:footnote>
@@ -19724,7 +19815,7 @@
           <w:sz w:val="20"/>
           <w:szCs w:val="20"/>
         </w:rPr>
-        <w:t xml:space="preserve">قضیه فعالیت‌های نظامی و شبه‌نظامی در نیکاراگوئه و علیه آن (نیکاراگوئه علیه ایالات متحده)، رأی دیوان بین‌المللی دادگستری، ۱۹۸۶.</w:t>
+        <w:t xml:space="preserve">طرح مواد کمیسیون حقوق بین‌الملل درباره مسئولیت بین‌المللی دولت‌ها (۲۰۰۱). ر.ک: گزارش‌های کمیسیون حقوق بین‌الملل (نشانی دقیق، نیازمند بررسی منبع اصلی است).</w:t>
       </w:r>
     </w:p>
   </w:footnote>
@@ -19757,7 +19848,7 @@
           <w:sz w:val="20"/>
           <w:szCs w:val="20"/>
         </w:rPr>
-        <w:t xml:space="preserve">طرح مواد مسئولیت بین‌المللی دولت‌ها، مواد ۱ و ۲.</w:t>
+        <w:t xml:space="preserve">قضیه فعالیت‌های نظامی و شبه‌نظامی در نیکاراگوئه و علیه آن (نیکاراگوئه علیه ایالات متحده)، رأی دیوان بین‌المللی دادگستری، ۱۹۸۶.</w:t>
       </w:r>
     </w:p>
   </w:footnote>
@@ -19790,7 +19881,7 @@
           <w:sz w:val="20"/>
           <w:szCs w:val="20"/>
         </w:rPr>
-        <w:t xml:space="preserve">طرح مواد مسئولیت بین‌المللی دولت‌ها، ماده ۴.</w:t>
+        <w:t xml:space="preserve">طرح مواد مسئولیت بین‌المللی دولت‌ها، مواد ۱ و ۲.</w:t>
       </w:r>
     </w:p>
   </w:footnote>
@@ -19823,7 +19914,7 @@
           <w:sz w:val="20"/>
           <w:szCs w:val="20"/>
         </w:rPr>
-        <w:t xml:space="preserve">طرح مواد مسئولیت بین‌المللی دولت‌ها، ماده ۷.</w:t>
+        <w:t xml:space="preserve">طرح مواد مسئولیت بین‌المللی دولت‌ها، ماده ۴.</w:t>
       </w:r>
     </w:p>
   </w:footnote>
@@ -19856,7 +19947,7 @@
           <w:sz w:val="20"/>
           <w:szCs w:val="20"/>
         </w:rPr>
-        <w:t xml:space="preserve">طرح مواد مسئولیت بین‌المللی دولت‌ها، ماده ۸.</w:t>
+        <w:t xml:space="preserve">طرح مواد مسئولیت بین‌المللی دولت‌ها، ماده ۷.</w:t>
       </w:r>
     </w:p>
   </w:footnote>
@@ -19889,7 +19980,7 @@
           <w:sz w:val="20"/>
           <w:szCs w:val="20"/>
         </w:rPr>
-        <w:t xml:space="preserve">طرح مواد مسئولیت بین‌المللی دولت‌ها، ماده ۱۱.</w:t>
+        <w:t xml:space="preserve">طرح مواد مسئولیت بین‌المللی دولت‌ها، ماده ۸.</w:t>
       </w:r>
     </w:p>
   </w:footnote>
@@ -19922,7 +20013,7 @@
           <w:sz w:val="20"/>
           <w:szCs w:val="20"/>
         </w:rPr>
-        <w:t xml:space="preserve">قضیه کارکنان دیپلماتیک و کنسولی ایالات متحده در تهران (ایالات متحده علیه ایران)، رأی دیوان بین‌المللی دادگستری، ۱۹۸۰.</w:t>
+        <w:t xml:space="preserve">طرح مواد مسئولیت بین‌المللی دولت‌ها، ماده ۱۱.</w:t>
       </w:r>
     </w:p>
   </w:footnote>
@@ -19955,7 +20046,7 @@
           <w:sz w:val="20"/>
           <w:szCs w:val="20"/>
         </w:rPr>
-        <w:t xml:space="preserve">طرح مواد مسئولیت بین‌المللی دولت‌ها، ماده ۱۲.</w:t>
+        <w:t xml:space="preserve">قضیه کارکنان دیپلماتیک و کنسولی ایالات متحده در تهران (ایالات متحده علیه ایران)، رأی دیوان بین‌المللی دادگستری، ۱۹۸۰.</w:t>
       </w:r>
     </w:p>
   </w:footnote>
@@ -19988,7 +20079,7 @@
           <w:sz w:val="20"/>
           <w:szCs w:val="20"/>
         </w:rPr>
-        <w:t xml:space="preserve">طرح مواد مسئولیت بین‌المللی دولت‌ها، مواد ۱۴ و ۱۵ (به‌اجمال).</w:t>
+        <w:t xml:space="preserve">طرح مواد مسئولیت بین‌المللی دولت‌ها، ماده ۱۲.</w:t>
       </w:r>
     </w:p>
   </w:footnote>
@@ -20021,7 +20112,7 @@
           <w:sz w:val="20"/>
           <w:szCs w:val="20"/>
         </w:rPr>
-        <w:t xml:space="preserve">طرح مواد مسئولیت بین‌المللی دولت‌ها، ماده ۳۲.</w:t>
+        <w:t xml:space="preserve">طرح مواد مسئولیت بین‌المللی دولت‌ها، مواد ۱۴ و ۱۵ (به‌اجمال).</w:t>
       </w:r>
     </w:p>
   </w:footnote>
@@ -20054,7 +20145,7 @@
           <w:sz w:val="20"/>
           <w:szCs w:val="20"/>
         </w:rPr>
-        <w:t xml:space="preserve">طرح مواد مسئولیت بین‌المللی دولت‌ها، مواد ۲۰ تا ۲۵.</w:t>
+        <w:t xml:space="preserve">طرح مواد مسئولیت بین‌المللی دولت‌ها، ماده ۳۲.</w:t>
       </w:r>
     </w:p>
   </w:footnote>
@@ -20087,7 +20178,7 @@
           <w:sz w:val="20"/>
           <w:szCs w:val="20"/>
         </w:rPr>
-        <w:t xml:space="preserve">طرح مواد مسئولیت بین‌المللی دولت‌ها، ماده ۲۵.</w:t>
+        <w:t xml:space="preserve">طرح مواد مسئولیت بین‌المللی دولت‌ها، مواد ۲۰ تا ۲۵.</w:t>
       </w:r>
     </w:p>
   </w:footnote>
@@ -20120,7 +20211,7 @@
           <w:sz w:val="20"/>
           <w:szCs w:val="20"/>
         </w:rPr>
-        <w:t xml:space="preserve">طرح مواد مسئولیت بین‌المللی دولت‌ها، مواد ۲۲ و ۴۹ تا ۵۴ (به‌اجمال).</w:t>
+        <w:t xml:space="preserve">طرح مواد مسئولیت بین‌المللی دولت‌ها، ماده ۲۵.</w:t>
       </w:r>
     </w:p>
   </w:footnote>
@@ -20153,7 +20244,7 @@
           <w:sz w:val="20"/>
           <w:szCs w:val="20"/>
         </w:rPr>
-        <w:t xml:space="preserve">طرح مواد مسئولیت بین‌المللی دولت‌ها، ماده ۲۳.</w:t>
+        <w:t xml:space="preserve">طرح مواد مسئولیت بین‌المللی دولت‌ها، مواد ۲۲ و ۴۹ تا ۵۴ (به‌اجمال).</w:t>
       </w:r>
     </w:p>
   </w:footnote>
@@ -20186,7 +20277,7 @@
           <w:sz w:val="20"/>
           <w:szCs w:val="20"/>
         </w:rPr>
-        <w:t xml:space="preserve">طرح مواد مسئولیت بین‌المللی دولت‌ها، ماده ۲۶.</w:t>
+        <w:t xml:space="preserve">طرح مواد مسئولیت بین‌المللی دولت‌ها، ماده ۲۳.</w:t>
       </w:r>
     </w:p>
   </w:footnote>
@@ -20219,7 +20310,7 @@
           <w:sz w:val="20"/>
           <w:szCs w:val="20"/>
         </w:rPr>
-        <w:t xml:space="preserve">طرح مواد مسئولیت بین‌المللی دولت‌ها، مواد ۳۰، ۳۱ و ۳۴ تا ۳۷.</w:t>
+        <w:t xml:space="preserve">طرح مواد مسئولیت بین‌المللی دولت‌ها، ماده ۲۶.</w:t>
       </w:r>
     </w:p>
   </w:footnote>
@@ -20252,7 +20343,7 @@
           <w:sz w:val="20"/>
           <w:szCs w:val="20"/>
         </w:rPr>
-        <w:t xml:space="preserve">کنوانسیون وین حقوق معاهدات، مواد ۷۰ و ۷۲.</w:t>
+        <w:t xml:space="preserve">طرح مواد مسئولیت بین‌المللی دولت‌ها، مواد ۳۰، ۳۱ و ۳۴ تا ۳۷.</w:t>
       </w:r>
     </w:p>
   </w:footnote>
@@ -20285,7 +20376,7 @@
           <w:sz w:val="20"/>
           <w:szCs w:val="20"/>
         </w:rPr>
-        <w:t xml:space="preserve">کنوانسیون وین حقوق معاهدات، مواد ۱۹ تا ۲۳.</w:t>
+        <w:t xml:space="preserve">کنوانسیون وین حقوق معاهدات، مواد ۷۰ و ۷۲.</w:t>
       </w:r>
     </w:p>
   </w:footnote>
@@ -20318,7 +20409,7 @@
           <w:sz w:val="20"/>
           <w:szCs w:val="20"/>
         </w:rPr>
-        <w:t xml:space="preserve">طرح مواد مسئولیت بین‌المللی دولت‌ها، مواد ۴۹ تا ۵۴ (به‌اجمال).</w:t>
+        <w:t xml:space="preserve">کنوانسیون وین حقوق معاهدات، مواد ۱۹ تا ۲۳.</w:t>
       </w:r>
     </w:p>
   </w:footnote>
@@ -20351,7 +20442,7 @@
           <w:sz w:val="20"/>
           <w:szCs w:val="20"/>
         </w:rPr>
-        <w:t xml:space="preserve">قضیه کارخانه کورزو (آلمان علیه لهستان)، رأی دیوان دائمی دادگستری بین‌المللی، ۱۹۲۸ (نشانی دقیق، نیازمند بررسی منبع اصلی است).</w:t>
+        <w:t xml:space="preserve">طرح مواد مسئولیت بین‌المللی دولت‌ها، مواد ۴۹ تا ۵۴ (به‌اجمال).</w:t>
       </w:r>
     </w:p>
   </w:footnote>
@@ -20384,7 +20475,7 @@
           <w:sz w:val="20"/>
           <w:szCs w:val="20"/>
         </w:rPr>
-        <w:t xml:space="preserve">اساسنامه دیوان بین‌المللی دادگستری، ماده ۳۶ (به‌اجمال).</w:t>
+        <w:t xml:space="preserve">قضیه کارخانه کورزو (آلمان علیه لهستان)، رأی دیوان دائمی دادگستری بین‌المللی، ۱۹۲۸ (نشانی دقیق، نیازمند بررسی منبع اصلی است).</w:t>
       </w:r>
     </w:p>
   </w:footnote>
@@ -20417,7 +20508,7 @@
           <w:sz w:val="20"/>
           <w:szCs w:val="20"/>
         </w:rPr>
-        <w:t xml:space="preserve">منشور سازمان ملل متحد، فصل ششم و هفتم (به‌اجمال).</w:t>
+        <w:t xml:space="preserve">اساسنامه دیوان بین‌المللی دادگستری، ماده ۳۶ (به‌اجمال).</w:t>
       </w:r>
     </w:p>
   </w:footnote>
@@ -20450,7 +20541,7 @@
           <w:sz w:val="20"/>
           <w:szCs w:val="20"/>
         </w:rPr>
-        <w:t xml:space="preserve">برای اسناد و تاریخ‌های دقیق، نیازمند بررسی منبع اصلی است.</w:t>
+        <w:t xml:space="preserve">منشور سازمان ملل متحد، فصل ششم و هفتم (به‌اجمال).</w:t>
       </w:r>
     </w:p>
   </w:footnote>
@@ -20549,7 +20640,7 @@
           <w:sz w:val="20"/>
           <w:szCs w:val="20"/>
         </w:rPr>
-        <w:t xml:space="preserve">قانون اساسی جمهوری اسلامی ایران، اصل ۵.</w:t>
+        <w:t xml:space="preserve">برای اسناد و تاریخ‌های دقیق، نیازمند بررسی منبع اصلی است.</w:t>
       </w:r>
     </w:p>
   </w:footnote>
@@ -20582,7 +20673,7 @@
           <w:sz w:val="20"/>
           <w:szCs w:val="20"/>
         </w:rPr>
-        <w:t xml:space="preserve">قانون اساسی جمهوری اسلامی ایران، اصل ۱۰۷ (به‌اجمال).</w:t>
+        <w:t xml:space="preserve">قانون اساسی جمهوری اسلامی ایران، اصل ۵.</w:t>
       </w:r>
     </w:p>
   </w:footnote>
@@ -20615,7 +20706,7 @@
           <w:sz w:val="20"/>
           <w:szCs w:val="20"/>
         </w:rPr>
-        <w:t xml:space="preserve">قانون اساسی جمهوری اسلامی ایران، اصل ۱۰۹ (به‌اجمال).</w:t>
+        <w:t xml:space="preserve">قانون اساسی جمهوری اسلامی ایران، اصل ۱۰۷ (به‌اجمال).</w:t>
       </w:r>
     </w:p>
   </w:footnote>
@@ -20648,7 +20739,7 @@
           <w:sz w:val="20"/>
           <w:szCs w:val="20"/>
         </w:rPr>
-        <w:t xml:space="preserve">قانون اساسی جمهوری اسلامی ایران، اصل ۱۱۱ (به‌اجمال).</w:t>
+        <w:t xml:space="preserve">قانون اساسی جمهوری اسلامی ایران، اصل ۱۰۹ (به‌اجمال).</w:t>
       </w:r>
     </w:p>
   </w:footnote>
@@ -20681,7 +20772,7 @@
           <w:sz w:val="20"/>
           <w:szCs w:val="20"/>
         </w:rPr>
-        <w:t xml:space="preserve">برای متنِ سیاست‌های ابلاغی، ر.ک: پایگاه اطلاع‌رسانی دفتر مقام معظم رهبری (نشانی دقیق، نیازمند بررسی منبع اصلی است).</w:t>
+        <w:t xml:space="preserve">قانون اساسی جمهوری اسلامی ایران، اصل ۱۱۱ (به‌اجمال).</w:t>
       </w:r>
     </w:p>
   </w:footnote>
@@ -20714,7 +20805,7 @@
           <w:sz w:val="20"/>
           <w:szCs w:val="20"/>
         </w:rPr>
-        <w:t xml:space="preserve">برای صورت‌بندی دو دیدگاه، ر.ک: «ولایت مطلقه فقیه در قانون اساسی» و «مفهوم ولایت مطلقه فقیه در قانون اساسی جمهوری اسلامی ایران»، پایگاه اطلاع‌رسانی حوزه، به نشانی‌های یادشده در پیشینه پژوهش. همچنین ر.ک: سیدابوالفضل قاضی شریعت‌پناهی، حقوق اساسی و نهادهای سیاسی؛ و سیدمحمد هاشمی، حقوق اساسی جمهوری اسلامی ایران.</w:t>
+        <w:t xml:space="preserve">برای متنِ سیاست‌های ابلاغی، ر.ک: پایگاه اطلاع‌رسانی دفتر مقام معظم رهبری (نشانی دقیق، نیازمند بررسی منبع اصلی است).</w:t>
       </w:r>
     </w:p>
   </w:footnote>
@@ -20747,7 +20838,7 @@
           <w:sz w:val="20"/>
           <w:szCs w:val="20"/>
         </w:rPr>
-        <w:t xml:space="preserve">قانون اساسی جمهوری اسلامی ایران، اصل ۵.</w:t>
+        <w:t xml:space="preserve">برای صورت‌بندی دو دیدگاه، ر.ک: «ولایت مطلقه فقیه در قانون اساسی» و «مفهوم ولایت مطلقه فقیه در قانون اساسی جمهوری اسلامی ایران»، پایگاه اطلاع‌رسانی حوزه، به نشانی‌های یادشده در پیشینه پژوهش. همچنین ر.ک: سیدابوالفضل قاضی شریعت‌پناهی، حقوق اساسی و نهادهای سیاسی؛ و سیدمحمد هاشمی، حقوق اساسی جمهوری اسلامی ایران.</w:t>
       </w:r>
     </w:p>
   </w:footnote>
@@ -20780,7 +20871,7 @@
           <w:sz w:val="20"/>
           <w:szCs w:val="20"/>
         </w:rPr>
-        <w:t xml:space="preserve">قانون اساسی جمهوری اسلامی ایران، اصل ۵۷.</w:t>
+        <w:t xml:space="preserve">قانون اساسی جمهوری اسلامی ایران، اصل ۵.</w:t>
       </w:r>
     </w:p>
   </w:footnote>
@@ -20813,7 +20904,7 @@
           <w:sz w:val="20"/>
           <w:szCs w:val="20"/>
         </w:rPr>
-        <w:t xml:space="preserve">قانون اساسی جمهوری اسلامی ایران، اصل ۷۷.</w:t>
+        <w:t xml:space="preserve">قانون اساسی جمهوری اسلامی ایران، اصل ۵۷.</w:t>
       </w:r>
     </w:p>
   </w:footnote>
@@ -20846,7 +20937,7 @@
           <w:sz w:val="20"/>
           <w:szCs w:val="20"/>
         </w:rPr>
-        <w:t xml:space="preserve">قانون اساسی جمهوری اسلامی ایران، اصل ۱۱۰.</w:t>
+        <w:t xml:space="preserve">قانون اساسی جمهوری اسلامی ایران، اصل ۷۷.</w:t>
       </w:r>
     </w:p>
   </w:footnote>
@@ -20879,7 +20970,7 @@
           <w:sz w:val="20"/>
           <w:szCs w:val="20"/>
         </w:rPr>
-        <w:t xml:space="preserve">قانون اساسی جمهوری اسلامی ایران، اصل ۱۱۲.</w:t>
+        <w:t xml:space="preserve">قانون اساسی جمهوری اسلامی ایران، اصل ۱۱۰.</w:t>
       </w:r>
     </w:p>
   </w:footnote>
@@ -20912,7 +21003,7 @@
           <w:sz w:val="20"/>
           <w:szCs w:val="20"/>
         </w:rPr>
-        <w:t xml:space="preserve">قانون اساسی جمهوری اسلامی ایران، اصل ۱۲۵.</w:t>
+        <w:t xml:space="preserve">قانون اساسی جمهوری اسلامی ایران، اصل ۱۱۲.</w:t>
       </w:r>
     </w:p>
   </w:footnote>
@@ -20945,7 +21036,7 @@
           <w:sz w:val="20"/>
           <w:szCs w:val="20"/>
         </w:rPr>
-        <w:t xml:space="preserve">قانون اساسی جمهوری اسلامی ایران، اصل ۱۵۲.</w:t>
+        <w:t xml:space="preserve">قانون اساسی جمهوری اسلامی ایران، اصل ۱۲۵.</w:t>
       </w:r>
     </w:p>
   </w:footnote>
@@ -20978,7 +21069,7 @@
           <w:sz w:val="20"/>
           <w:szCs w:val="20"/>
         </w:rPr>
-        <w:t xml:space="preserve">قانون اساسی جمهوری اسلامی ایران، اصل ۱۵۳.</w:t>
+        <w:t xml:space="preserve">قانون اساسی جمهوری اسلامی ایران، اصل ۱۵۲.</w:t>
       </w:r>
     </w:p>
   </w:footnote>
@@ -21011,7 +21102,7 @@
           <w:sz w:val="20"/>
           <w:szCs w:val="20"/>
         </w:rPr>
-        <w:t xml:space="preserve">قانون اساسی جمهوری اسلامی ایران، اصل ۱۵۴.</w:t>
+        <w:t xml:space="preserve">قانون اساسی جمهوری اسلامی ایران، اصل ۱۵۳.</w:t>
       </w:r>
     </w:p>
   </w:footnote>
@@ -21044,7 +21135,7 @@
           <w:sz w:val="20"/>
           <w:szCs w:val="20"/>
         </w:rPr>
-        <w:t xml:space="preserve">قانون اساسی جمهوری اسلامی ایران، اصل ۱۷۶ (به‌اجمال).</w:t>
+        <w:t xml:space="preserve">قانون اساسی جمهوری اسلامی ایران، اصل ۱۵۴.</w:t>
       </w:r>
     </w:p>
   </w:footnote>
@@ -21077,7 +21168,7 @@
           <w:sz w:val="20"/>
           <w:szCs w:val="20"/>
         </w:rPr>
-        <w:t xml:space="preserve">کنوانسیون وین حقوق معاهدات، ماده ۱.</w:t>
+        <w:t xml:space="preserve">قانون اساسی جمهوری اسلامی ایران، اصل ۱۷۶ (به‌اجمال).</w:t>
       </w:r>
     </w:p>
   </w:footnote>
@@ -21110,7 +21201,7 @@
           <w:sz w:val="20"/>
           <w:szCs w:val="20"/>
         </w:rPr>
-        <w:t xml:space="preserve">کنوانسیون وین حقوق معاهدات، ماده ۲ (به‌اجمال).</w:t>
+        <w:t xml:space="preserve">کنوانسیون وین حقوق معاهدات، ماده ۱.</w:t>
       </w:r>
     </w:p>
   </w:footnote>
@@ -21143,7 +21234,7 @@
           <w:sz w:val="20"/>
           <w:szCs w:val="20"/>
         </w:rPr>
-        <w:t xml:space="preserve">کنوانسیون وین حقوق معاهدات، ماده ۲۶.</w:t>
+        <w:t xml:space="preserve">کنوانسیون وین حقوق معاهدات، ماده ۲ (به‌اجمال).</w:t>
       </w:r>
     </w:p>
   </w:footnote>
@@ -21176,7 +21267,7 @@
           <w:sz w:val="20"/>
           <w:szCs w:val="20"/>
         </w:rPr>
-        <w:t xml:space="preserve">کنوانسیون وین حقوق معاهدات، ماده ۲۷.</w:t>
+        <w:t xml:space="preserve">کنوانسیون وین حقوق معاهدات، ماده ۲۶.</w:t>
       </w:r>
     </w:p>
   </w:footnote>
@@ -21209,7 +21300,7 @@
           <w:sz w:val="20"/>
           <w:szCs w:val="20"/>
         </w:rPr>
-        <w:t xml:space="preserve">کنوانسیون وین حقوق معاهدات، ماده ۴۶ (به‌اجمال).</w:t>
+        <w:t xml:space="preserve">کنوانسیون وین حقوق معاهدات، ماده ۲۷.</w:t>
       </w:r>
     </w:p>
   </w:footnote>
@@ -21242,7 +21333,7 @@
           <w:sz w:val="20"/>
           <w:szCs w:val="20"/>
         </w:rPr>
-        <w:t xml:space="preserve">کنوانسیون وین حقوق معاهدات، ماده ۵۳ (به‌اجمال).</w:t>
+        <w:t xml:space="preserve">کنوانسیون وین حقوق معاهدات، ماده ۴۶ (به‌اجمال).</w:t>
       </w:r>
     </w:p>
   </w:footnote>
@@ -21275,7 +21366,7 @@
           <w:sz w:val="20"/>
           <w:szCs w:val="20"/>
         </w:rPr>
-        <w:t xml:space="preserve">کنوانسیون وین حقوق معاهدات، مواد ۵۴ تا ۶۴ (به‌اجمال).</w:t>
+        <w:t xml:space="preserve">کنوانسیون وین حقوق معاهدات، ماده ۵۳ (به‌اجمال).</w:t>
       </w:r>
     </w:p>
   </w:footnote>
@@ -21308,7 +21399,7 @@
           <w:sz w:val="20"/>
           <w:szCs w:val="20"/>
         </w:rPr>
-        <w:t xml:space="preserve">کنوانسیون وین حقوق معاهدات، مواد ۶۵ تا ۶۸ (به‌اجمال).</w:t>
+        <w:t xml:space="preserve">کنوانسیون وین حقوق معاهدات، مواد ۵۴ تا ۶۴ (به‌اجمال).</w:t>
       </w:r>
     </w:p>
   </w:footnote>
@@ -21341,11 +21432,44 @@
           <w:sz w:val="20"/>
           <w:szCs w:val="20"/>
         </w:rPr>
-        <w:t xml:space="preserve">کنوانسیون وین حقوق معاهدات، مواد ۷۰ و ۷۲ (به‌اجمال).</w:t>
+        <w:t xml:space="preserve">کنوانسیون وین حقوق معاهدات، مواد ۶۵ تا ۶۸ (به‌اجمال).</w:t>
       </w:r>
     </w:p>
   </w:footnote>
   <w:footnote w:id="146">
+    <w:p>
+      <w:pPr>
+        <w:bidi w:val="1"/>
+        <w:jc w:val="both"/>
+        <w:spacing w:after="40" w:line="240" w:lineRule="auto"/>
+      </w:pPr>
+      <w:r>
+        <w:rPr>
+          <w:rFonts w:ascii="B Lotus" w:hAnsi="B Lotus" w:cs="B Lotus"/>
+          <w:sz w:val="20"/>
+          <w:szCs w:val="20"/>
+        </w:rPr>
+        <w:footnoteRef/>
+      </w:r>
+      <w:r>
+        <w:rPr>
+          <w:rFonts w:ascii="B Lotus" w:hAnsi="B Lotus" w:cs="B Lotus"/>
+          <w:sz w:val="20"/>
+          <w:szCs w:val="20"/>
+        </w:rPr>
+        <w:t xml:space="preserve"> </w:t>
+      </w:r>
+      <w:r>
+        <w:rPr>
+          <w:rFonts w:ascii="B Lotus" w:hAnsi="B Lotus" w:cs="B Lotus"/>
+          <w:sz w:val="20"/>
+          <w:szCs w:val="20"/>
+        </w:rPr>
+        <w:t xml:space="preserve">کنوانسیون وین حقوق معاهدات، مواد ۷۰ و ۷۲ (به‌اجمال).</w:t>
+      </w:r>
+    </w:p>
+  </w:footnote>
+  <w:footnote w:id="147">
     <w:p>
       <w:pPr>
         <w:bidi w:val="1"/>

</xml_diff>

<commit_message>
Review pass: fix duplicate band, appendix order, stale refs, unify terms, ellipsis, README
Co-authored-by: arena-agent <297053741+arena-agent@users.noreply.github.com>
</commit_message>
<xml_diff>
--- a/Resaleh_Sath3_Hadi_Shabestani_v2.docx
+++ b/Resaleh_Sath3_Hadi_Shabestani_v2.docx
@@ -2305,7 +2305,7 @@
           <w:sz w:val="28"/>
           <w:szCs w:val="28"/>
         </w:rPr>
-        <w:t>در فقه امامیه، برابرنهاد تاریخی معاهده همین «عهد» و «عقد» و «معاهده» است؛ ولی با این تفاوت مهم که فقهای ما این مفاهیم را عمدتاً در سه بستر بحث کرده‌اند: عقود معاوضی خصوصی (بیع، اجاره و...)، عهدنامه‌های صدر اسلام (هدنه، امان، ذمه)، و عقود به معنای عام قرآنی (اوفوا بالعقود). هیچ‌کدام از این سه، دقیقاً منطبق بر معاهده امروزی نیست؛ ولی هرکدام پاره‌ای از حقیقت را در خود دارند و من در فصل سوم از هر سه بهره می‌گیرم. این‌جا فقط همین را ثبت می‌کنم که خواننده بداند وقتی فقیه از «عهد» حرف می‌زند و حقوق‌دان از «treaty»، لزوماً از یک چیز حرف نمی‌زنند ـ و کار من در این رساله، ساختن پل میان این دو زبان است.</w:t>
+        <w:t>در فقه امامیه، برابرنهاد تاریخی معاهده همین «عهد» و «عقد» و «معاهده» است؛ ولی با این تفاوت مهم که فقهای ما این مفاهیم را عمدتاً در سه بستر بحث کرده‌اند: عقود معاوضی خصوصی (بیع، اجاره و…)، عهدنامه‌های صدر اسلام (هدنه، امان، ذمه)، و عقود به معنای عام قرآنی (اوفوا بالعقود). هیچ‌کدام از این سه، دقیقاً منطبق بر معاهده امروزی نیست؛ ولی هرکدام پاره‌ای از حقیقت را در خود دارند و من در فصل سوم از هر سه بهره می‌گیرم. این‌جا فقط همین را ثبت می‌کنم که خواننده بداند وقتی فقیه از «عهد» حرف می‌زند و حقوق‌دان از «treaty»، لزوماً از یک چیز حرف نمی‌زنند ـ و کار من در این رساله، ساختن پل میان این دو زبان است.</w:t>
       </w:r>
     </w:p>
     <w:p>
@@ -2345,7 +2345,7 @@
           <w:sz w:val="28"/>
           <w:szCs w:val="28"/>
         </w:rPr>
-        <w:t>معاهدات را از زوایای مختلف تقسیم کرده‌اند و هر تقسیمی برای مقصودی به کار می‌آید. از جهت تعداد اطراف: دوجانبه و چندجانبه. از جهت موضوع: سیاسی، اقتصادی، فرهنگی، نظامی، مرزی، حقوق بشری و... از جهت مدت: موقت، دائم، و نامعین. و از جهت قابلیت عدول: معاهداتی که خودشان سازوکار خروج یا خاتمه پیش‌بینی کرده‌اند، و معاهداتی که نکرده‌اند.</w:t>
+        <w:t>معاهدات را از زوایای مختلف تقسیم کرده‌اند و هر تقسیمی برای مقصودی به کار می‌آید. از جهت تعداد اطراف: دوجانبه و چندجانبه. از جهت موضوع: سیاسی، اقتصادی، فرهنگی، نظامی، مرزی، حقوق بشری و… از جهت مدت: موقت، دائم، و نامعین. و از جهت قابلیت عدول: معاهداتی که خودشان سازوکار خروج یا خاتمه پیش‌بینی کرده‌اند، و معاهداتی که نکرده‌اند.</w:t>
       </w:r>
     </w:p>
     <w:p>
@@ -4131,7 +4131,7 @@
           <w:sz w:val="28"/>
           <w:szCs w:val="28"/>
         </w:rPr>
-        <w:t>ولی ـ و این «ولی» مهم است ـ پاکتا سونت سرواندا در حقوق بین‌الملل هم مثل وجوب وفا در فقه ما، «قاعده اولی» است نه حکم مطلقِ بی‌استثنا. خودِ کنوانسیون وین استثناها و راه‌های خروجش را پیش‌بینی کرده: تعلیق، خاتمه، تغییر بنیادین اوضاع، نقض اساسی طرف مقابل، و... پس منطق وین هم مثل منطق فقه ماست: اصل، وفاست؛ ولی خروجِ ضابطه‌مند از اصل، ممکن است. این هم‌زبانیِ دو نظام، یکی از یافته‌های شیرین این پژوهش برای من بود.</w:t>
+        <w:t>ولی ـ و این «ولی» مهم است ـ پاکتا سونت سرواندا در حقوق بین‌الملل هم مثل وجوب وفا در فقه ما، «قاعده اولی» است نه حکم مطلقِ بی‌استثنا. خودِ کنوانسیون وین استثناها و راه‌های خروجش را پیش‌بینی کرده: تعلیق، خاتمه، تغییر بنیادین اوضاع، نقض اساسی طرف مقابل، و… پس منطق وین هم مثل منطق فقه ماست: اصل، وفاست؛ ولی خروجِ ضابطه‌مند از اصل، ممکن است. این هم‌زبانیِ دو نظام، یکی از یافته‌های شیرین این پژوهش برای من بود.</w:t>
       </w:r>
     </w:p>
     <w:p>
@@ -4422,7 +4422,7 @@
           <w:sz w:val="28"/>
           <w:szCs w:val="28"/>
         </w:rPr>
-        <w:t xml:space="preserve"> این راه، سبزترین صورت طیف پنج‌گانه من است؛ و هر مذاکره‌کننده عاقلی باید هنگام انعقاد، این شرط‌ها را در متن بگنجاند تا دست حاکم آینده باز بماند. این توصیه را در فصل پنجم با عنوان «راهبرد شرط‌گذاری در متن» تفصیل می‌دهم؛ ولی ریشه‌اش همین‌جاست. خیلی از دردسرهای بعدی، ریشه در غفلت‌های مرحله انعقاد دارد ـ و این درسی است که باید به مذاکره‌کنندگانمان آموخت.</w:t>
+        <w:t xml:space="preserve"> این راه، سبزترین صورت طیف پنج‌صورت من است؛ و هر مذاکره‌کننده عاقلی باید هنگام انعقاد، این شرط‌ها را در متن بگنجاند تا دست حاکم آینده باز بماند. این توصیه را در فصل پنجم با عنوان «راهبرد شرط‌گذاری در متن» تفصیل می‌دهم؛ ولی ریشه‌اش همین‌جاست. خیلی از دردسرهای بعدی، ریشه در غفلت‌های مرحله انعقاد دارد ـ و این درسی است که باید به مذاکره‌کنندگانمان آموخت.</w:t>
       </w:r>
     </w:p>
     <w:p>
@@ -5409,7 +5409,7 @@
           <w:sz w:val="26"/>
           <w:szCs w:val="26"/>
         </w:rPr>
-        <w:t>قوای حاکم در جمهوری اسلامی ایران عبارتند از: قوه مقننه، قوه مجریه و قوه قضائیه که زیر نظر ولایت مطلقه امر و امامت امت بر طبق اصول آینده این قانون اعمال می‌گردند...</w:t>
+        <w:t>قوای حاکم در جمهوری اسلامی ایران عبارتند از: قوه مقننه، قوه مجریه و قوه قضائیه که زیر نظر ولایت مطلقه امر و امامت امت بر طبق اصول آینده این قانون اعمال می‌گردند…</w:t>
       </w:r>
       <w:r>
         <w:rPr>
@@ -5728,7 +5728,7 @@
           <w:sz w:val="28"/>
           <w:szCs w:val="28"/>
         </w:rPr>
-        <w:t>بند پنجم: اصول سیاست خارجی؛ ۱۵۲ تا ۱۵۴ و ۱۷۶</w:t>
+        <w:t>بند پنجم: اصول ۱۵۲ تا ۱۵۴ و ۱۷۶؛ جهت‌گیری سیاست خارجی</w:t>
       </w:r>
     </w:p>
     <w:p>
@@ -5748,7 +5748,27 @@
           <w:sz w:val="28"/>
           <w:szCs w:val="28"/>
         </w:rPr>
-        <w:t>سه اصل ۱۵۲، ۱۵۳ و ۱۵۴، جهت‌گیری کلی سیاست خارجی را مشخص می‌کنند: نفی سلطه‌جویی و سلطه‌پذیری، حفظ استقلال و تمامیت ارضی، دفاع از حقوق مسلمانان، عدم تعهد در برابر قدرت‌های سلطه‌گر، روابط صلح‌آمیز متقابل با دول غیرمحارب، ممنوعیت هر قراردادی که موجب سلطه بیگانه شود، و حمایت از مبارزات حق‌طلبانه.</w:t>
+        <w:t>سه اصل ۱۵۲، ۱۵۳ و ۱۵۴، «قطب‌نمای ارزشی» سیاست خارجی جمهوری اسلامی‌اند؛ یعنی هر تصمیمی در این عرصه ـ از جمله تصمیمِ مورد بحث من ـ باید با آن‌ها سازگار باشد:</w:t>
+      </w:r>
+    </w:p>
+    <w:p>
+      <w:pPr>
+        <w:pStyle w:val="TH-Body"/>
+        <w:widowControl/>
+        <w:bidi w:val="1"/>
+        <w:spacing w:before="0" w:after="120" w:line="288" w:lineRule="auto"/>
+        <w:ind w:firstLine="283"/>
+        <w:jc w:val="both"/>
+      </w:pPr>
+      <w:r>
+        <w:rPr>
+          <w:rFonts w:ascii="B Lotus" w:hAnsi="B Lotus" w:cs="B Lotus" w:eastAsia="B Lotus"/>
+          <w:b w:val="0"/>
+          <w:i w:val="0"/>
+          <w:sz w:val="28"/>
+          <w:szCs w:val="28"/>
+        </w:rPr>
+        <w:t>اصل ۱۵۲، مبانی سیاست خارجی را برمی‌شمرد: نفی سلطه‌جویی و سلطه‌پذیری، حفظ استقلال همه‌جانبه و تمامیت ارضی، دفاع از حقوق همه مسلمانان، عدم تعهد در برابر قدرت‌های سلطه‌گر، و روابط صلح‌آمیز متقابل با دول غیرمحارب.</w:t>
       </w:r>
       <w:r>
         <w:rPr>
@@ -5769,7 +5789,7 @@
           <w:sz w:val="28"/>
           <w:szCs w:val="28"/>
         </w:rPr>
-        <w:t xml:space="preserve"> این اصول، «مرزهای ارزشی» سیاست خارجی‌اند؛ و هر معاهده‌ای که با آن‌ها ناسازگار شود ـ مثلاً به سلطه بیگانه بینجامد ـ از نظر قانون اساسی از اول مشکل داشته؛ و عدول از چنین معاهده‌ای، نه‌تنها جایز، بلکه به مقتضای اصل ۱۵۳ «واجب» است. این نکته، یکی از مستندات داخلیِ جواز عدول است که در فصل چهارم به کار می‌برم.</w:t>
+        <w:t xml:space="preserve"> نسبتش با مسئله من در دو قید است: «عدم تعهد در برابر قدرت‌های سلطه‌گر» ـ یعنی معاهده‌ای که ایران را در برابر سلطه‌گران متعهد کند، از اول با این اصل ناسازگار است؛ و «روابط صلح‌آمیز متقابل» ـ یعنی معاهده با دول غیرمحارب، اصل است و مطلوب. پس این اصل، هم مجوزِ عدول از معاهده سلطه‌آور است، هم مؤیدِ وفا به معاهده عادلانه؛ و همین دوگانگی، نشان می‌دهد که قانون اساسی ما نه «انزواگرا»ست نه «تسلیم‌پذیر»، بلکه «عزت‌مدار» است.</w:t>
       </w:r>
     </w:p>
     <w:p>
@@ -5789,7 +5809,7 @@
           <w:sz w:val="28"/>
           <w:szCs w:val="28"/>
         </w:rPr>
-        <w:t>و اصل ۱۷۶ هم با پیش‌بینی «شورای عالی امنیت ملی» ـ به ریاست رئیس‌جمهور و با حضور سران قوا و مقامات عالی نظامی و امنیتی ـ سازوکار نهادیِ تصمیم‌گیری در حوزه امنیت ملی و سیاست خارجی را مشخص کرده.</w:t>
+        <w:t>اصل ۱۵۳، صریح‌تر و قاطع‌تر است: «هرگونه قرارداد که موجب سلطه بیگانه بر منابع طبیعی و اقتصادی، فرهنگ، ارتش و دیگر شئون کشور گردد، ممنوع است».</w:t>
       </w:r>
       <w:r>
         <w:rPr>
@@ -5810,27 +5830,7 @@
           <w:sz w:val="28"/>
           <w:szCs w:val="28"/>
         </w:rPr>
-        <w:t xml:space="preserve"> این شورا، حلقه واسط میان کارشناسی و تصمیم نهایی است؛ و مصوباتش ـ پس از تأیید رهبری ـ لازم‌الاجراست. پس در مقام عمل، تصمیم عدول معمولاً از این مجرا می‌گذرد؛ مجرایی که هم کارشناسی است هم نهادی، و هم به تأیید نهایی ولی فقیه می‌رسد.</w:t>
-      </w:r>
-    </w:p>
-    <w:p>
-      <w:pPr>
-        <w:pStyle w:val="TH-Band"/>
-        <w:widowControl/>
-        <w:bidi w:val="1"/>
-        <w:spacing w:before="200" w:after="120" w:line="288" w:lineRule="auto"/>
-        <w:jc w:val="right"/>
-        <w:keepNext w:val="1"/>
-      </w:pPr>
-      <w:r>
-        <w:rPr>
-          <w:rFonts w:ascii="B Traffic" w:hAnsi="B Traffic" w:cs="B Traffic" w:eastAsia="B Traffic"/>
-          <w:b/>
-          <w:i w:val="0"/>
-          <w:sz w:val="28"/>
-          <w:szCs w:val="28"/>
-        </w:rPr>
-        <w:t>بند پنجم: اصول ۱۵۲ تا ۱۵۴ و ۱۷۶؛ جهت‌گیری سیاست خارجی</w:t>
+        <w:t xml:space="preserve"> این اصل، ترجمه حقوقیِ «قاعده نفی سبیل» است؛ و حکمش «ممنوعیت» است، نه فقط کراهت. نتیجه‌اش برای مسئله من قاطع است: اگر ادامه اجرای معاهده‌ای به سلطه بیگانه بینجامد ـ یا چنین سلطه‌ای را تثبیت کند ـ عدول از آن نه‌تنها جایز، که به مقتضای این اصل «واجب» است. و این وجوب، وجوبِ «قانون اساسی» است؛ یعنی بالاترین مرتبه هنجاری در نظام حقوقی داخلی. پس در فرضِ سلطه‌آور بودن، هر سه سطحِ تحلیلِ من هم‌جهت می‌شوند: شرعاً واجب (نفی سبیل)، قانوناً واجب (اصل ۱۵۳)، و بین‌المللاً ـ اگر در قالبِ نهادهای موجه بریزد ـ قابل دفاع.</w:t>
       </w:r>
     </w:p>
     <w:p>
@@ -5850,7 +5850,28 @@
           <w:sz w:val="28"/>
           <w:szCs w:val="28"/>
         </w:rPr>
-        <w:t>سه اصل ۱۵۲، ۱۵۳ و ۱۵۴، «قطب‌نمای ارزشی» سیاست خارجی جمهوری اسلامی‌اند؛ یعنی هر تصمیمی در این عرصه ـ از جمله تصمیمِ مورد بحث من ـ باید با آن‌ها سازگار باشد:</w:t>
+        <w:t>اصل ۱۵۴، آرمانِ جهانیِ انقلاب را بیان می‌کند: سعادت انسان در کل جامعه بشری، و حمایت از مبارزات حق‌طلبانه مستضعفان در برابر مستکبران ـ البته بدون دخالت در امور داخلی ملت‌ها.</w:t>
+      </w:r>
+      <w:r>
+        <w:rPr>
+          <w:rFonts w:ascii="B Lotus" w:hAnsi="B Lotus" w:cs="B Lotus" w:eastAsia="B Lotus"/>
+          <w:b w:val="0"/>
+          <w:i w:val="0"/>
+          <w:sz w:val="28"/>
+          <w:szCs w:val="28"/>
+          <w:vertAlign w:val="superscript"/>
+        </w:rPr>
+        <w:footnoteReference w:id="43"/>
+      </w:r>
+      <w:r>
+        <w:rPr>
+          <w:rFonts w:ascii="B Lotus" w:hAnsi="B Lotus" w:cs="B Lotus" w:eastAsia="B Lotus"/>
+          <w:b w:val="0"/>
+          <w:i w:val="0"/>
+          <w:sz w:val="28"/>
+          <w:szCs w:val="28"/>
+        </w:rPr>
+        <w:t xml:space="preserve"> نسبتش با مسئله من غیرمستقیم است ولی مهم: معاهده‌ای که ایران را از حمایتِ مشروعِ مظلومان باز بدارد، با روحِ این اصل ناسازگار است؛ و همین ناسازگاری می‌تواند ـ در کنار سایر ادله ـ جزئی از مصلحتِ مجوزِ عدول باشد. البته ـ انصافاً ـ این اصل به‌تنهایی مجوزِ عدول نیست، چون جنبه آرمانی دارد، نه حکمیِ صریح؛ ولی در «ترازوی مصلحت» وزن دارد و نباید نادیده گرفته شود.</w:t>
       </w:r>
     </w:p>
     <w:p>
@@ -5870,7 +5891,7 @@
           <w:sz w:val="28"/>
           <w:szCs w:val="28"/>
         </w:rPr>
-        <w:t>اصل ۱۵۲، مبانی سیاست خارجی را برمی‌شمرد: نفی سلطه‌جویی و سلطه‌پذیری، حفظ استقلال همه‌جانبه و تمامیت ارضی، دفاع از حقوق همه مسلمانان، عدم تعهد در برابر قدرت‌های سلطه‌گر، و روابط صلح‌آمیز متقابل با دول غیرمحارب.</w:t>
+        <w:t>و اصل ۱۷۶، «شورای عالی امنیت ملی» را پیش‌بینی می‌کند: شورایی به ریاست رئیس‌جمهور و با حضور سران قوا و مقامات عالیِ نظامی و امنیتی و برنامه‌ای که وظیفه‌اش سیاست‌گذاریِ دفاعی ـ امنیتی و هماهنگیِ فعالیت‌ها در چارچوبِ سیاست‌های کلیِ نظام است؛ و مصوباتش پس از تأیید رهبری لازم‌الاجراست.</w:t>
       </w:r>
       <w:r>
         <w:rPr>
@@ -5881,130 +5902,7 @@
           <w:szCs w:val="28"/>
           <w:vertAlign w:val="superscript"/>
         </w:rPr>
-        <w:footnoteReference w:id="43"/>
-      </w:r>
-      <w:r>
-        <w:rPr>
-          <w:rFonts w:ascii="B Lotus" w:hAnsi="B Lotus" w:cs="B Lotus" w:eastAsia="B Lotus"/>
-          <w:b w:val="0"/>
-          <w:i w:val="0"/>
-          <w:sz w:val="28"/>
-          <w:szCs w:val="28"/>
-        </w:rPr>
-        <w:t xml:space="preserve"> نسبتش با مسئله من در دو قید است: «عدم تعهد در برابر قدرت‌های سلطه‌گر» ـ یعنی معاهده‌ای که ایران را در برابر سلطه‌گران متعهد کند، از اول با این اصل ناسازگار است؛ و «روابط صلح‌آمیز متقابل» ـ یعنی معاهده با دول غیرمحارب، اصل است و مطلوب. پس این اصل، هم مجوزِ عدول از معاهده سلطه‌آور است، هم مؤیدِ وفا به معاهده عادلانه؛ و همین دوگانگی، نشان می‌دهد که قانون اساسی ما نه «انزواگرا»ست نه «تسلیم‌پذیر»، بلکه «عزت‌مدار» است.</w:t>
-      </w:r>
-    </w:p>
-    <w:p>
-      <w:pPr>
-        <w:pStyle w:val="TH-Body"/>
-        <w:widowControl/>
-        <w:bidi w:val="1"/>
-        <w:spacing w:before="0" w:after="120" w:line="288" w:lineRule="auto"/>
-        <w:ind w:firstLine="283"/>
-        <w:jc w:val="both"/>
-      </w:pPr>
-      <w:r>
-        <w:rPr>
-          <w:rFonts w:ascii="B Lotus" w:hAnsi="B Lotus" w:cs="B Lotus" w:eastAsia="B Lotus"/>
-          <w:b w:val="0"/>
-          <w:i w:val="0"/>
-          <w:sz w:val="28"/>
-          <w:szCs w:val="28"/>
-        </w:rPr>
-        <w:t>اصل ۱۵۳، صریح‌تر و قاطع‌تر است: «هرگونه قرارداد که موجب سلطه بیگانه بر منابع طبیعی و اقتصادی، فرهنگ، ارتش و دیگر شئون کشور گردد، ممنوع است».</w:t>
-      </w:r>
-      <w:r>
-        <w:rPr>
-          <w:rFonts w:ascii="B Lotus" w:hAnsi="B Lotus" w:cs="B Lotus" w:eastAsia="B Lotus"/>
-          <w:b w:val="0"/>
-          <w:i w:val="0"/>
-          <w:sz w:val="28"/>
-          <w:szCs w:val="28"/>
-          <w:vertAlign w:val="superscript"/>
-        </w:rPr>
         <w:footnoteReference w:id="44"/>
-      </w:r>
-      <w:r>
-        <w:rPr>
-          <w:rFonts w:ascii="B Lotus" w:hAnsi="B Lotus" w:cs="B Lotus" w:eastAsia="B Lotus"/>
-          <w:b w:val="0"/>
-          <w:i w:val="0"/>
-          <w:sz w:val="28"/>
-          <w:szCs w:val="28"/>
-        </w:rPr>
-        <w:t xml:space="preserve"> این اصل، ترجمه حقوقیِ «قاعده نفی سبیل» است؛ و حکمش «ممنوعیت» است، نه فقط کراهت. نتیجه‌اش برای مسئله من قاطع است: اگر ادامه اجرای معاهده‌ای به سلطه بیگانه بینجامد ـ یا چنین سلطه‌ای را تثبیت کند ـ عدول از آن نه‌تنها جایز، که به مقتضای این اصل «واجب» است. و این وجوب، وجوبِ «قانون اساسی» است؛ یعنی بالاترین مرتبه هنجاری در نظام حقوقی داخلی. پس در فرضِ سلطه‌آور بودن، هر سه سطحِ تحلیلِ من هم‌جهت می‌شوند: شرعاً واجب (نفی سبیل)، قانوناً واجب (اصل ۱۵۳)، و بین‌المللاً ـ اگر در قالبِ نهادهای موجه بریزد ـ قابل دفاع.</w:t>
-      </w:r>
-    </w:p>
-    <w:p>
-      <w:pPr>
-        <w:pStyle w:val="TH-Body"/>
-        <w:widowControl/>
-        <w:bidi w:val="1"/>
-        <w:spacing w:before="0" w:after="120" w:line="288" w:lineRule="auto"/>
-        <w:ind w:firstLine="283"/>
-        <w:jc w:val="both"/>
-      </w:pPr>
-      <w:r>
-        <w:rPr>
-          <w:rFonts w:ascii="B Lotus" w:hAnsi="B Lotus" w:cs="B Lotus" w:eastAsia="B Lotus"/>
-          <w:b w:val="0"/>
-          <w:i w:val="0"/>
-          <w:sz w:val="28"/>
-          <w:szCs w:val="28"/>
-        </w:rPr>
-        <w:t>اصل ۱۵۴، آرمانِ جهانیِ انقلاب را بیان می‌کند: سعادت انسان در کل جامعه بشری، و حمایت از مبارزات حق‌طلبانه مستضعفان در برابر مستکبران ـ البته بدون دخالت در امور داخلی ملت‌ها.</w:t>
-      </w:r>
-      <w:r>
-        <w:rPr>
-          <w:rFonts w:ascii="B Lotus" w:hAnsi="B Lotus" w:cs="B Lotus" w:eastAsia="B Lotus"/>
-          <w:b w:val="0"/>
-          <w:i w:val="0"/>
-          <w:sz w:val="28"/>
-          <w:szCs w:val="28"/>
-          <w:vertAlign w:val="superscript"/>
-        </w:rPr>
-        <w:footnoteReference w:id="45"/>
-      </w:r>
-      <w:r>
-        <w:rPr>
-          <w:rFonts w:ascii="B Lotus" w:hAnsi="B Lotus" w:cs="B Lotus" w:eastAsia="B Lotus"/>
-          <w:b w:val="0"/>
-          <w:i w:val="0"/>
-          <w:sz w:val="28"/>
-          <w:szCs w:val="28"/>
-        </w:rPr>
-        <w:t xml:space="preserve"> نسبتش با مسئله من غیرمستقیم است ولی مهم: معاهده‌ای که ایران را از حمایتِ مشروعِ مظلومان باز بدارد، با روحِ این اصل ناسازگار است؛ و همین ناسازگاری می‌تواند ـ در کنار سایر ادله ـ جزئی از مصلحتِ مجوزِ عدول باشد. البته ـ انصافاً ـ این اصل به‌تنهایی مجوزِ عدول نیست، چون جنبه آرمانی دارد، نه حکمیِ صریح؛ ولی در «ترازوی مصلحت» وزن دارد و نباید نادیده گرفته شود.</w:t>
-      </w:r>
-    </w:p>
-    <w:p>
-      <w:pPr>
-        <w:pStyle w:val="TH-Body"/>
-        <w:widowControl/>
-        <w:bidi w:val="1"/>
-        <w:spacing w:before="0" w:after="120" w:line="288" w:lineRule="auto"/>
-        <w:ind w:firstLine="283"/>
-        <w:jc w:val="both"/>
-      </w:pPr>
-      <w:r>
-        <w:rPr>
-          <w:rFonts w:ascii="B Lotus" w:hAnsi="B Lotus" w:cs="B Lotus" w:eastAsia="B Lotus"/>
-          <w:b w:val="0"/>
-          <w:i w:val="0"/>
-          <w:sz w:val="28"/>
-          <w:szCs w:val="28"/>
-        </w:rPr>
-        <w:t>و اصل ۱۷۶، «شورای عالی امنیت ملی» را پیش‌بینی می‌کند: شورایی به ریاست رئیس‌جمهور و با حضور سران قوا و مقامات عالیِ نظامی و امنیتی و برنامه‌ای که وظیفه‌اش سیاست‌گذاریِ دفاعی ـ امنیتی و هماهنگیِ فعالیت‌ها در چارچوبِ سیاست‌های کلیِ نظام است؛ و مصوباتش پس از تأیید رهبری لازم‌الاجراست.</w:t>
-      </w:r>
-      <w:r>
-        <w:rPr>
-          <w:rFonts w:ascii="B Lotus" w:hAnsi="B Lotus" w:cs="B Lotus" w:eastAsia="B Lotus"/>
-          <w:b w:val="0"/>
-          <w:i w:val="0"/>
-          <w:sz w:val="28"/>
-          <w:szCs w:val="28"/>
-          <w:vertAlign w:val="superscript"/>
-        </w:rPr>
-        <w:footnoteReference w:id="46"/>
       </w:r>
       <w:r>
         <w:rPr>
@@ -6213,7 +6111,7 @@
           <w:szCs w:val="26"/>
           <w:vertAlign w:val="superscript"/>
         </w:rPr>
-        <w:footnoteReference w:id="47"/>
+        <w:footnoteReference w:id="45"/>
       </w:r>
     </w:p>
     <w:p>
@@ -6244,7 +6142,7 @@
           <w:szCs w:val="28"/>
           <w:vertAlign w:val="superscript"/>
         </w:rPr>
-        <w:footnoteReference w:id="48"/>
+        <w:footnoteReference w:id="46"/>
       </w:r>
     </w:p>
     <w:p>
@@ -6331,7 +6229,7 @@
           <w:sz w:val="26"/>
           <w:szCs w:val="26"/>
         </w:rPr>
-        <w:t>وَأَوْفُوا بِعَهْدِ اللَّهِ إِذَا عَاهَدْتُمْ وَلَا تَنْقُضُوا الْأَيْمَانَ بَعْدَ تَوْکِیدِهَا... وَلَا تَکُونُوا کَالَّتِی نَقَضَتْ غَزْلَهَا مِنْ بَعْدِ قُوَّةٍ أَنْکَاثًا</w:t>
+        <w:t>وَأَوْفُوا بِعَهْدِ اللَّهِ إِذَا عَاهَدْتُمْ وَلَا تَنْقُضُوا الْأَيْمَانَ بَعْدَ تَوْکِیدِهَا… وَلَا تَکُونُوا کَالَّتِی نَقَضَتْ غَزْلَهَا مِنْ بَعْدِ قُوَّةٍ أَنْکَاثًا</w:t>
       </w:r>
       <w:r>
         <w:rPr>
@@ -6342,7 +6240,7 @@
           <w:szCs w:val="26"/>
           <w:vertAlign w:val="superscript"/>
         </w:rPr>
-        <w:footnoteReference w:id="49"/>
+        <w:footnoteReference w:id="47"/>
       </w:r>
     </w:p>
     <w:p>
@@ -6373,7 +6271,7 @@
           <w:szCs w:val="28"/>
           <w:vertAlign w:val="superscript"/>
         </w:rPr>
-        <w:footnoteReference w:id="50"/>
+        <w:footnoteReference w:id="48"/>
       </w:r>
       <w:r>
         <w:rPr>
@@ -6441,7 +6339,7 @@
           <w:szCs w:val="26"/>
           <w:vertAlign w:val="superscript"/>
         </w:rPr>
-        <w:footnoteReference w:id="51"/>
+        <w:footnoteReference w:id="49"/>
       </w:r>
     </w:p>
     <w:p>
@@ -6519,7 +6417,7 @@
           <w:szCs w:val="26"/>
           <w:vertAlign w:val="superscript"/>
         </w:rPr>
-        <w:footnoteReference w:id="52"/>
+        <w:footnoteReference w:id="50"/>
       </w:r>
     </w:p>
     <w:p>
@@ -6597,7 +6495,7 @@
           <w:szCs w:val="26"/>
           <w:vertAlign w:val="superscript"/>
         </w:rPr>
-        <w:footnoteReference w:id="53"/>
+        <w:footnoteReference w:id="51"/>
       </w:r>
     </w:p>
     <w:p>
@@ -6735,7 +6633,7 @@
           <w:szCs w:val="26"/>
           <w:vertAlign w:val="superscript"/>
         </w:rPr>
-        <w:footnoteReference w:id="54"/>
+        <w:footnoteReference w:id="52"/>
       </w:r>
     </w:p>
     <w:p>
@@ -6773,7 +6671,7 @@
           <w:szCs w:val="26"/>
           <w:vertAlign w:val="superscript"/>
         </w:rPr>
-        <w:footnoteReference w:id="55"/>
+        <w:footnoteReference w:id="53"/>
       </w:r>
     </w:p>
     <w:p>
@@ -6871,7 +6769,7 @@
           <w:szCs w:val="26"/>
           <w:vertAlign w:val="superscript"/>
         </w:rPr>
-        <w:footnoteReference w:id="56"/>
+        <w:footnoteReference w:id="54"/>
       </w:r>
     </w:p>
     <w:p>
@@ -6929,7 +6827,7 @@
           <w:szCs w:val="26"/>
           <w:vertAlign w:val="superscript"/>
         </w:rPr>
-        <w:footnoteReference w:id="57"/>
+        <w:footnoteReference w:id="55"/>
       </w:r>
     </w:p>
     <w:p>
@@ -7027,7 +6925,7 @@
           <w:szCs w:val="26"/>
           <w:vertAlign w:val="superscript"/>
         </w:rPr>
-        <w:footnoteReference w:id="58"/>
+        <w:footnoteReference w:id="56"/>
       </w:r>
     </w:p>
     <w:p>
@@ -7078,7 +6976,7 @@
           <w:szCs w:val="28"/>
           <w:vertAlign w:val="superscript"/>
         </w:rPr>
-        <w:footnoteReference w:id="59"/>
+        <w:footnoteReference w:id="57"/>
       </w:r>
       <w:r>
         <w:rPr>
@@ -7146,7 +7044,7 @@
           <w:szCs w:val="26"/>
           <w:vertAlign w:val="superscript"/>
         </w:rPr>
-        <w:footnoteReference w:id="60"/>
+        <w:footnoteReference w:id="58"/>
       </w:r>
     </w:p>
     <w:p>
@@ -7237,7 +7135,7 @@
           <w:szCs w:val="28"/>
           <w:vertAlign w:val="superscript"/>
         </w:rPr>
-        <w:footnoteReference w:id="61"/>
+        <w:footnoteReference w:id="59"/>
       </w:r>
       <w:r>
         <w:rPr>
@@ -7258,7 +7156,7 @@
           <w:szCs w:val="28"/>
           <w:vertAlign w:val="superscript"/>
         </w:rPr>
-        <w:footnoteReference w:id="62"/>
+        <w:footnoteReference w:id="60"/>
       </w:r>
       <w:r>
         <w:rPr>
@@ -7339,7 +7237,7 @@
           <w:szCs w:val="28"/>
           <w:vertAlign w:val="superscript"/>
         </w:rPr>
-        <w:footnoteReference w:id="63"/>
+        <w:footnoteReference w:id="61"/>
       </w:r>
     </w:p>
     <w:p>
@@ -7410,7 +7308,7 @@
           <w:szCs w:val="28"/>
           <w:vertAlign w:val="superscript"/>
         </w:rPr>
-        <w:footnoteReference w:id="64"/>
+        <w:footnoteReference w:id="62"/>
       </w:r>
     </w:p>
     <w:p>
@@ -7481,7 +7379,7 @@
           <w:szCs w:val="28"/>
           <w:vertAlign w:val="superscript"/>
         </w:rPr>
-        <w:footnoteReference w:id="65"/>
+        <w:footnoteReference w:id="63"/>
       </w:r>
       <w:r>
         <w:rPr>
@@ -7551,7 +7449,7 @@
           <w:sz w:val="28"/>
           <w:szCs w:val="28"/>
         </w:rPr>
-        <w:t>از مجموع سیره پیامبر و امیرالمؤمنین، سه الگوی رفتاری درمی‌آید که هر سه در فصل چهارم به کار می‌رود: الگوی اول، «وفای صبورانه» (حدیبیه) ـ وفا حتی در شرایط سخت، وقتی مصلحت در وفاست. الگوی دوم، «عدول واکنشیِ اعلام‌شده» (برائت) ـ عدول وقتی طرف نقض کرد، با اعلام آشکار. و الگوی سوم، «مصلحت‌سنجیِ مقدّم» (پذیرش اصل صلح حدیبیه و پذیرش تحمیلیِ حکمیت) ـ این‌که حاکم قبل از هر تصمیمی، مصلحت را می‌سنجد و تصمیمش تابع مصلحت است، نه تابع احساسات و فشارها. این سه الگو، در واقع همان طیف پنج‌گانه من است به زبان سیره؛ و نشان می‌دهد که چارچوب نظری‌ام، ریشه در عمل معصومان دارد، نه فقط در ذهن من.</w:t>
+        <w:t>از مجموع سیره پیامبر و امیرالمؤمنین، سه الگوی رفتاری درمی‌آید که هر سه در فصل چهارم به کار می‌رود: الگوی اول، «وفای صبورانه» (حدیبیه) ـ وفا حتی در شرایط سخت، وقتی مصلحت در وفاست. الگوی دوم، «عدول واکنشیِ اعلام‌شده» (برائت) ـ عدول وقتی طرف نقض کرد، با اعلام آشکار. و الگوی سوم، «مصلحت‌سنجیِ مقدّم» (پذیرش اصل صلح حدیبیه و پذیرش تحمیلیِ حکمیت) ـ این‌که حاکم قبل از هر تصمیمی، مصلحت را می‌سنجد و تصمیمش تابع مصلحت است، نه تابع احساسات و فشارها. این سه الگو، در واقع همان طیف پنج‌صورت من است به زبان سیره؛ و نشان می‌دهد که چارچوب نظری‌ام، ریشه در عمل معصومان دارد، نه فقط در ذهن من.</w:t>
       </w:r>
     </w:p>
     <w:p>
@@ -7622,7 +7520,7 @@
           <w:szCs w:val="28"/>
           <w:vertAlign w:val="superscript"/>
         </w:rPr>
-        <w:footnoteReference w:id="66"/>
+        <w:footnoteReference w:id="64"/>
       </w:r>
     </w:p>
     <w:p>
@@ -7673,7 +7571,7 @@
           <w:szCs w:val="28"/>
           <w:vertAlign w:val="superscript"/>
         </w:rPr>
-        <w:footnoteReference w:id="67"/>
+        <w:footnoteReference w:id="65"/>
       </w:r>
     </w:p>
     <w:p>
@@ -7764,7 +7662,7 @@
           <w:szCs w:val="28"/>
           <w:vertAlign w:val="superscript"/>
         </w:rPr>
-        <w:footnoteReference w:id="68"/>
+        <w:footnoteReference w:id="66"/>
       </w:r>
       <w:r>
         <w:rPr>
@@ -7825,7 +7723,7 @@
           <w:szCs w:val="28"/>
           <w:vertAlign w:val="superscript"/>
         </w:rPr>
-        <w:footnoteReference w:id="69"/>
+        <w:footnoteReference w:id="67"/>
       </w:r>
       <w:r>
         <w:rPr>
@@ -7846,7 +7744,7 @@
           <w:szCs w:val="28"/>
           <w:vertAlign w:val="superscript"/>
         </w:rPr>
-        <w:footnoteReference w:id="70"/>
+        <w:footnoteReference w:id="68"/>
       </w:r>
       <w:r>
         <w:rPr>
@@ -7914,7 +7812,7 @@
           <w:szCs w:val="26"/>
           <w:vertAlign w:val="superscript"/>
         </w:rPr>
-        <w:footnoteReference w:id="71"/>
+        <w:footnoteReference w:id="69"/>
       </w:r>
     </w:p>
     <w:p>
@@ -8012,7 +7910,7 @@
           <w:szCs w:val="26"/>
           <w:vertAlign w:val="superscript"/>
         </w:rPr>
-        <w:footnoteReference w:id="72"/>
+        <w:footnoteReference w:id="70"/>
       </w:r>
     </w:p>
     <w:p>
@@ -8043,7 +7941,7 @@
           <w:szCs w:val="28"/>
           <w:vertAlign w:val="superscript"/>
         </w:rPr>
-        <w:footnoteReference w:id="73"/>
+        <w:footnoteReference w:id="71"/>
       </w:r>
       <w:r>
         <w:rPr>
@@ -8131,7 +8029,7 @@
           <w:szCs w:val="26"/>
           <w:vertAlign w:val="superscript"/>
         </w:rPr>
-        <w:footnoteReference w:id="74"/>
+        <w:footnoteReference w:id="72"/>
       </w:r>
     </w:p>
     <w:p>
@@ -8229,7 +8127,7 @@
           <w:szCs w:val="26"/>
           <w:vertAlign w:val="superscript"/>
         </w:rPr>
-        <w:footnoteReference w:id="75"/>
+        <w:footnoteReference w:id="73"/>
       </w:r>
     </w:p>
     <w:p>
@@ -8340,7 +8238,7 @@
           <w:szCs w:val="28"/>
           <w:vertAlign w:val="superscript"/>
         </w:rPr>
-        <w:footnoteReference w:id="76"/>
+        <w:footnoteReference w:id="74"/>
       </w:r>
       <w:r>
         <w:rPr>
@@ -8381,7 +8279,7 @@
           <w:szCs w:val="28"/>
           <w:vertAlign w:val="superscript"/>
         </w:rPr>
-        <w:footnoteReference w:id="77"/>
+        <w:footnoteReference w:id="75"/>
       </w:r>
       <w:r>
         <w:rPr>
@@ -8462,69 +8360,69 @@
           <w:szCs w:val="28"/>
           <w:vertAlign w:val="superscript"/>
         </w:rPr>
+        <w:footnoteReference w:id="76"/>
+      </w:r>
+      <w:r>
+        <w:rPr>
+          <w:rFonts w:ascii="B Lotus" w:hAnsi="B Lotus" w:cs="B Lotus" w:eastAsia="B Lotus"/>
+          <w:b w:val="0"/>
+          <w:i w:val="0"/>
+          <w:sz w:val="28"/>
+          <w:szCs w:val="28"/>
+        </w:rPr>
+        <w:t xml:space="preserve"> این همان جمعی است که من در کل رساله دنبال می‌کنم: قاعده، وفاست؛ و استثنا، عدولِ مصلحتیِ ضابطه‌مند. این‌که فقیهی به عظمت صاحب جواهر ـ که به احتیاط و دقت مشهور است ـ چنین استثنایی را پذیرفته، نشان می‌دهد که راه من، راه بی‌سابقه‌ای نیست و ریشه در فقه ما دارد.</w:t>
+      </w:r>
+    </w:p>
+    <w:p>
+      <w:pPr>
+        <w:pStyle w:val="TH-Body"/>
+        <w:widowControl/>
+        <w:bidi w:val="1"/>
+        <w:spacing w:before="0" w:after="120" w:line="288" w:lineRule="auto"/>
+        <w:ind w:firstLine="283"/>
+        <w:jc w:val="both"/>
+      </w:pPr>
+      <w:r>
+        <w:rPr>
+          <w:rFonts w:ascii="B Lotus" w:hAnsi="B Lotus" w:cs="B Lotus" w:eastAsia="B Lotus"/>
+          <w:b w:val="0"/>
+          <w:i w:val="0"/>
+          <w:sz w:val="28"/>
+          <w:szCs w:val="28"/>
+        </w:rPr>
+        <w:t>امام خمینی هم در تحریر الوسیله، احکام دفاع و عهدنامه‌ها را در چارچوب فقه حکومتی مطرح کرده و اختیار حاکم در مصلحت‌سنجی را پذیرفته است.</w:t>
+      </w:r>
+      <w:r>
+        <w:rPr>
+          <w:rFonts w:ascii="B Lotus" w:hAnsi="B Lotus" w:cs="B Lotus" w:eastAsia="B Lotus"/>
+          <w:b w:val="0"/>
+          <w:i w:val="0"/>
+          <w:sz w:val="28"/>
+          <w:szCs w:val="28"/>
+          <w:vertAlign w:val="superscript"/>
+        </w:rPr>
+        <w:footnoteReference w:id="77"/>
+      </w:r>
+      <w:r>
+        <w:rPr>
+          <w:rFonts w:ascii="B Lotus" w:hAnsi="B Lotus" w:cs="B Lotus" w:eastAsia="B Lotus"/>
+          <w:b w:val="0"/>
+          <w:i w:val="0"/>
+          <w:sz w:val="28"/>
+          <w:szCs w:val="28"/>
+        </w:rPr>
+        <w:t xml:space="preserve"> و شیخ انصاری در المکاسب، قاعده لزوم را با ادله‌اش اثبات کرده که مبنای اصالة اللزومِ گفتار ششم من است.</w:t>
+      </w:r>
+      <w:r>
+        <w:rPr>
+          <w:rFonts w:ascii="B Lotus" w:hAnsi="B Lotus" w:cs="B Lotus" w:eastAsia="B Lotus"/>
+          <w:b w:val="0"/>
+          <w:i w:val="0"/>
+          <w:sz w:val="28"/>
+          <w:szCs w:val="28"/>
+          <w:vertAlign w:val="superscript"/>
+        </w:rPr>
         <w:footnoteReference w:id="78"/>
-      </w:r>
-      <w:r>
-        <w:rPr>
-          <w:rFonts w:ascii="B Lotus" w:hAnsi="B Lotus" w:cs="B Lotus" w:eastAsia="B Lotus"/>
-          <w:b w:val="0"/>
-          <w:i w:val="0"/>
-          <w:sz w:val="28"/>
-          <w:szCs w:val="28"/>
-        </w:rPr>
-        <w:t xml:space="preserve"> این همان جمعی است که من در کل رساله دنبال می‌کنم: قاعده، وفاست؛ و استثنا، عدولِ مصلحتیِ ضابطه‌مند. این‌که فقیهی به عظمت صاحب جواهر ـ که به احتیاط و دقت مشهور است ـ چنین استثنایی را پذیرفته، نشان می‌دهد که راه من، راه بی‌سابقه‌ای نیست و ریشه در فقه ما دارد.</w:t>
-      </w:r>
-    </w:p>
-    <w:p>
-      <w:pPr>
-        <w:pStyle w:val="TH-Body"/>
-        <w:widowControl/>
-        <w:bidi w:val="1"/>
-        <w:spacing w:before="0" w:after="120" w:line="288" w:lineRule="auto"/>
-        <w:ind w:firstLine="283"/>
-        <w:jc w:val="both"/>
-      </w:pPr>
-      <w:r>
-        <w:rPr>
-          <w:rFonts w:ascii="B Lotus" w:hAnsi="B Lotus" w:cs="B Lotus" w:eastAsia="B Lotus"/>
-          <w:b w:val="0"/>
-          <w:i w:val="0"/>
-          <w:sz w:val="28"/>
-          <w:szCs w:val="28"/>
-        </w:rPr>
-        <w:t>امام خمینی هم در تحریر الوسیله، احکام دفاع و عهدنامه‌ها را در چارچوب فقه حکومتی مطرح کرده و اختیار حاکم در مصلحت‌سنجی را پذیرفته است.</w:t>
-      </w:r>
-      <w:r>
-        <w:rPr>
-          <w:rFonts w:ascii="B Lotus" w:hAnsi="B Lotus" w:cs="B Lotus" w:eastAsia="B Lotus"/>
-          <w:b w:val="0"/>
-          <w:i w:val="0"/>
-          <w:sz w:val="28"/>
-          <w:szCs w:val="28"/>
-          <w:vertAlign w:val="superscript"/>
-        </w:rPr>
-        <w:footnoteReference w:id="79"/>
-      </w:r>
-      <w:r>
-        <w:rPr>
-          <w:rFonts w:ascii="B Lotus" w:hAnsi="B Lotus" w:cs="B Lotus" w:eastAsia="B Lotus"/>
-          <w:b w:val="0"/>
-          <w:i w:val="0"/>
-          <w:sz w:val="28"/>
-          <w:szCs w:val="28"/>
-        </w:rPr>
-        <w:t xml:space="preserve"> و شیخ انصاری در المکاسب، قاعده لزوم را با ادله‌اش اثبات کرده که مبنای اصالة اللزومِ گفتار ششم من است.</w:t>
-      </w:r>
-      <w:r>
-        <w:rPr>
-          <w:rFonts w:ascii="B Lotus" w:hAnsi="B Lotus" w:cs="B Lotus" w:eastAsia="B Lotus"/>
-          <w:b w:val="0"/>
-          <w:i w:val="0"/>
-          <w:sz w:val="28"/>
-          <w:szCs w:val="28"/>
-          <w:vertAlign w:val="superscript"/>
-        </w:rPr>
-        <w:footnoteReference w:id="80"/>
       </w:r>
     </w:p>
     <w:p>
@@ -8655,7 +8553,7 @@
           <w:szCs w:val="28"/>
           <w:vertAlign w:val="superscript"/>
         </w:rPr>
-        <w:footnoteReference w:id="81"/>
+        <w:footnoteReference w:id="79"/>
       </w:r>
       <w:r>
         <w:rPr>
@@ -8696,7 +8594,7 @@
           <w:szCs w:val="28"/>
           <w:vertAlign w:val="superscript"/>
         </w:rPr>
-        <w:footnoteReference w:id="82"/>
+        <w:footnoteReference w:id="80"/>
       </w:r>
       <w:r>
         <w:rPr>
@@ -8757,7 +8655,7 @@
           <w:szCs w:val="28"/>
           <w:vertAlign w:val="superscript"/>
         </w:rPr>
-        <w:footnoteReference w:id="83"/>
+        <w:footnoteReference w:id="81"/>
       </w:r>
       <w:r>
         <w:rPr>
@@ -8798,7 +8696,7 @@
           <w:szCs w:val="28"/>
           <w:vertAlign w:val="superscript"/>
         </w:rPr>
-        <w:footnoteReference w:id="84"/>
+        <w:footnoteReference w:id="82"/>
       </w:r>
       <w:r>
         <w:rPr>
@@ -8908,7 +8806,7 @@
           <w:sz w:val="28"/>
           <w:szCs w:val="28"/>
         </w:rPr>
-        <w:t>حاصل این فصل، اثبات قاعده اولی با پنج دسته دلیل ـ آیات عام، آیات خاص، روایات، سیره و عقل ـ است؛ پنج دسته‌ای که هرکدام به‌تنهایی کافی‌اند و اجتماعشان اطمینان می‌سازد. قاعده این است: وفای به عهد ـ از جمله عهدهای بین‌المللی دولت اسلامی ـ واجب است؛ و خروج از آن، نیازمند دلیل است. من در این فصل، وکیل وفا بودم و با تمام توان از موکلم دفاع کردم؛ و انصافاً، موکل قوی‌ای داشتم. ولی حالا ـ در فصل چهارم ـ باید به سراغ استثنا بروم: این‌که آیا دلیلی برای خروج از این قاعده هست یا نه. و خواننده‌ای که قوت این فصل را دریافته باشد، می‌داند که مدعی جواز عدول، بار سنگینی بر دوش دارد. ببینیم آیا از پسش برمی‌آید یا نه.</w:t>
+        <w:t>حاصل این فصل، اثبات قاعده اولی با هشت گفتار ـ آیات عام، آیات خاص، روایات، سیره، عقل و بنا، قواعد فقهی مؤید، ادله تکمیلی و واژه‌شناسی قرآنی ـ است؛ مجموعه‌ای که هر دسته‌اش به‌تنهایی کافی است و اجتماعشان اطمینانی می‌سازد که جای هیچ تردیدی باقی نمی‌گذارد. قاعده این است: وفای به عهد ـ از جمله عهدهای بین‌المللی دولت اسلامی ـ واجب است؛ و خروج از آن، نیازمند دلیل است. من در این فصل، وکیل وفا بودم و با تمام توان از موکلم دفاع کردم؛ و انصافاً، موکل قوی‌ای داشتم. ولی حالا ـ در فصل چهارم ـ باید به سراغ استثنا بروم: این‌که آیا دلیلی برای خروج از این قاعده هست یا نه. و خواننده‌ای که قوت این فصل را دریافته باشد، می‌داند که مدعی جواز عدول، بار سنگینی بر دوش دارد. ببینیم آیا از پسش برمی‌آید یا نه.</w:t>
       </w:r>
     </w:p>
     <w:p>
@@ -9027,7 +8925,7 @@
           <w:szCs w:val="28"/>
           <w:vertAlign w:val="superscript"/>
         </w:rPr>
-        <w:footnoteReference w:id="85"/>
+        <w:footnoteReference w:id="83"/>
       </w:r>
     </w:p>
     <w:p>
@@ -9298,7 +9196,7 @@
           <w:szCs w:val="28"/>
           <w:vertAlign w:val="superscript"/>
         </w:rPr>
-        <w:footnoteReference w:id="86"/>
+        <w:footnoteReference w:id="84"/>
       </w:r>
     </w:p>
     <w:p>
@@ -9478,7 +9376,7 @@
           <w:sz w:val="28"/>
           <w:szCs w:val="28"/>
         </w:rPr>
-        <w:t>ممکن است کسی بگوید حکم حکومتی، مخصوص «احکام شرعی داخلی» است (مثل احتکار و قیمت‌گذاری و...) و شامل «تعهدات بین‌المللی» ـ که طرفشان دولت بیگانه است ـ نمی‌شود. جوابش دو لایه دارد: لایه اول این‌که قلمرو حکم حکومتی، «اداره نظام» است و اداره نظام، هم بُعد داخلی دارد هم بُعد خارجی؛ و هیچ دلیلی بر تخصیصش به بُعد داخلی نیست. سیاست خارجی، جزئی از اداره نظام است و حاکم در آن هم ـ مثل سیاست داخلی ـ نیازمند ابزار حکومتی است. و لایه دوم این‌که سیره پیامبر و امیرالمؤمنین ـ چنان‌که در فصل سوم گذشت ـ نشان می‌دهد که تصمیم‌های عهدنامه‌ای، از جنس تصمیم‌های حکومتی بوده و تابع مصلحت‌سنجی حاکم. پس اشکال، وارد نیست؛ و قلمرو حکم حکومتی، هر دو بُعد را شامل می‌شود.</w:t>
+        <w:t>ممکن است کسی بگوید حکم حکومتی، مخصوص «احکام شرعی داخلی» است (مثل احتکار و قیمت‌گذاری و…) و شامل «تعهدات بین‌المللی» ـ که طرفشان دولت بیگانه است ـ نمی‌شود. جوابش دو لایه دارد: لایه اول این‌که قلمرو حکم حکومتی، «اداره نظام» است و اداره نظام، هم بُعد داخلی دارد هم بُعد خارجی؛ و هیچ دلیلی بر تخصیصش به بُعد داخلی نیست. سیاست خارجی، جزئی از اداره نظام است و حاکم در آن هم ـ مثل سیاست داخلی ـ نیازمند ابزار حکومتی است. و لایه دوم این‌که سیره پیامبر و امیرالمؤمنین ـ چنان‌که در فصل سوم گذشت ـ نشان می‌دهد که تصمیم‌های عهدنامه‌ای، از جنس تصمیم‌های حکومتی بوده و تابع مصلحت‌سنجی حاکم. پس اشکال، وارد نیست؛ و قلمرو حکم حکومتی، هر دو بُعد را شامل می‌شود.</w:t>
       </w:r>
     </w:p>
     <w:p>
@@ -9556,7 +9454,7 @@
           <w:szCs w:val="26"/>
           <w:vertAlign w:val="superscript"/>
         </w:rPr>
-        <w:footnoteReference w:id="87"/>
+        <w:footnoteReference w:id="85"/>
       </w:r>
     </w:p>
     <w:p>
@@ -9654,7 +9552,7 @@
           <w:szCs w:val="26"/>
           <w:vertAlign w:val="superscript"/>
         </w:rPr>
-        <w:footnoteReference w:id="88"/>
+        <w:footnoteReference w:id="86"/>
       </w:r>
     </w:p>
     <w:p>
@@ -9725,7 +9623,7 @@
           <w:szCs w:val="28"/>
           <w:vertAlign w:val="superscript"/>
         </w:rPr>
-        <w:footnoteReference w:id="89"/>
+        <w:footnoteReference w:id="87"/>
       </w:r>
       <w:r>
         <w:rPr>
@@ -10195,7 +10093,7 @@
           <w:sz w:val="28"/>
           <w:szCs w:val="28"/>
         </w:rPr>
-        <w:t>جوابش این است که درِ بازشده، «درِ بی‌در» نیست، بلکه هشت قفل دارد ـ همان ضوابط هشت‌گانه. حاکمی که بخواهد سوءاستفاده کند، باید از هر هشت قفل بگذرد: تزاحم واقعی را احراز کند (که با کارشناسیِ مستند، قابل راستی‌آزمایی است)، راه‌های حقوقی را اول رفته باشد (که قابل بررسی است)، تناسب را رعایت کرده باشد (که قابل داوری است)، اعلام آشکار کرده باشد (که علنی است)، و... هرکدام از این‌ها، امکان سوءاستفاده را کمتر می‌کند؛ و مجموعشان، سوءاستفاده را ـ اگر نگویم ناممکن ـ بسیار دشوار و پرهزینه می‌کند. به‌علاوه، همین اشکال به «هر» اختیار حکومتی وارد است ـ از جمله اختیار اعلان جنگ و انعقاد صلح ـ و اگر پذیرفته شود، باید همه اختیارات حکومتی را تعطیل کرد؛ و این، چیزی نیست که هیچ عاقلی بپذیرد. راه‌حلِ خطرِ سوءاستفاده، «مهار» است، نه «تعطیل»؛ و این رساله، رساله مهار است.</w:t>
+        <w:t>جوابش این است که درِ بازشده، «درِ بی‌در» نیست، بلکه هشت قفل دارد ـ همان ضوابط هشت‌گانه. حاکمی که بخواهد سوءاستفاده کند، باید از هر هشت قفل بگذرد: تزاحم واقعی را احراز کند (که با کارشناسیِ مستند، قابل راستی‌آزمایی است)، راه‌های حقوقی را اول رفته باشد (که قابل بررسی است)، تناسب را رعایت کرده باشد (که قابل داوری است)، اعلام آشکار کرده باشد (که علنی است)، و… هرکدام از این‌ها، امکان سوءاستفاده را کمتر می‌کند؛ و مجموعشان، سوءاستفاده را ـ اگر نگویم ناممکن ـ بسیار دشوار و پرهزینه می‌کند. به‌علاوه، همین اشکال به «هر» اختیار حکومتی وارد است ـ از جمله اختیار اعلان جنگ و انعقاد صلح ـ و اگر پذیرفته شود، باید همه اختیارات حکومتی را تعطیل کرد؛ و این، چیزی نیست که هیچ عاقلی بپذیرد. راه‌حلِ خطرِ سوءاستفاده، «مهار» است، نه «تعطیل»؛ و این رساله، رساله مهار است.</w:t>
       </w:r>
     </w:p>
     <w:p>
@@ -10326,7 +10224,7 @@
           <w:szCs w:val="28"/>
           <w:vertAlign w:val="superscript"/>
         </w:rPr>
-        <w:footnoteReference w:id="90"/>
+        <w:footnoteReference w:id="88"/>
       </w:r>
       <w:r>
         <w:rPr>
@@ -10407,7 +10305,7 @@
           <w:szCs w:val="28"/>
           <w:vertAlign w:val="superscript"/>
         </w:rPr>
-        <w:footnoteReference w:id="91"/>
+        <w:footnoteReference w:id="89"/>
       </w:r>
       <w:r>
         <w:rPr>
@@ -10488,7 +10386,7 @@
           <w:szCs w:val="28"/>
           <w:vertAlign w:val="superscript"/>
         </w:rPr>
-        <w:footnoteReference w:id="92"/>
+        <w:footnoteReference w:id="90"/>
       </w:r>
       <w:r>
         <w:rPr>
@@ -10509,7 +10407,7 @@
           <w:szCs w:val="28"/>
           <w:vertAlign w:val="superscript"/>
         </w:rPr>
-        <w:footnoteReference w:id="93"/>
+        <w:footnoteReference w:id="91"/>
       </w:r>
     </w:p>
     <w:p>
@@ -10580,7 +10478,7 @@
           <w:szCs w:val="28"/>
           <w:vertAlign w:val="superscript"/>
         </w:rPr>
-        <w:footnoteReference w:id="94"/>
+        <w:footnoteReference w:id="92"/>
       </w:r>
     </w:p>
     <w:p>
@@ -10691,7 +10589,7 @@
           <w:szCs w:val="28"/>
           <w:vertAlign w:val="superscript"/>
         </w:rPr>
-        <w:footnoteReference w:id="95"/>
+        <w:footnoteReference w:id="93"/>
       </w:r>
     </w:p>
     <w:p>
@@ -10903,7 +10801,7 @@
           <w:szCs w:val="28"/>
           <w:vertAlign w:val="superscript"/>
         </w:rPr>
-        <w:footnoteReference w:id="96"/>
+        <w:footnoteReference w:id="94"/>
       </w:r>
     </w:p>
     <w:p>
@@ -10994,7 +10892,7 @@
           <w:szCs w:val="28"/>
           <w:vertAlign w:val="superscript"/>
         </w:rPr>
-        <w:footnoteReference w:id="97"/>
+        <w:footnoteReference w:id="95"/>
       </w:r>
     </w:p>
     <w:p>
@@ -11065,7 +10963,7 @@
           <w:szCs w:val="28"/>
           <w:vertAlign w:val="superscript"/>
         </w:rPr>
-        <w:footnoteReference w:id="98"/>
+        <w:footnoteReference w:id="96"/>
       </w:r>
       <w:r>
         <w:rPr>
@@ -11173,47 +11071,89 @@
           <w:szCs w:val="26"/>
           <w:vertAlign w:val="superscript"/>
         </w:rPr>
+        <w:footnoteReference w:id="97"/>
+      </w:r>
+    </w:p>
+    <w:p>
+      <w:pPr>
+        <w:pStyle w:val="TH-Body"/>
+        <w:widowControl/>
+        <w:bidi w:val="1"/>
+        <w:spacing w:before="0" w:after="120" w:line="288" w:lineRule="auto"/>
+        <w:ind w:firstLine="283"/>
+        <w:jc w:val="both"/>
+      </w:pPr>
+      <w:r>
+        <w:rPr>
+          <w:rFonts w:ascii="B Lotus" w:hAnsi="B Lotus" w:cs="B Lotus" w:eastAsia="B Lotus"/>
+          <w:b w:val="0"/>
+          <w:i w:val="0"/>
+          <w:sz w:val="28"/>
+          <w:szCs w:val="28"/>
+        </w:rPr>
+        <w:t>منطقش هم روشن است: دولت، شخصیتی حقوقی است که فقط از طریق ارکان انسانی‌اش عمل می‌کند؛ پس رفتار ارکان، رفتار خودِ دولت است. ملاک، «سمت رسمی» است؛ نه رتبه، نه قوه، نه انگیزه شخصی، نه ماهیت دینی یا دنیوی تصمیم. این اطلاقِ ملاک، برای مسئله من تعیین‌کننده است ـ چنان‌که در بند بعد می‌آید.</w:t>
+      </w:r>
+    </w:p>
+    <w:p>
+      <w:pPr>
+        <w:pStyle w:val="TH-Body"/>
+        <w:widowControl/>
+        <w:bidi w:val="1"/>
+        <w:spacing w:before="0" w:after="120" w:line="288" w:lineRule="auto"/>
+        <w:ind w:firstLine="283"/>
+        <w:jc w:val="both"/>
+      </w:pPr>
+      <w:r>
+        <w:rPr>
+          <w:rFonts w:ascii="B Lotus" w:hAnsi="B Lotus" w:cs="B Lotus" w:eastAsia="B Lotus"/>
+          <w:b w:val="0"/>
+          <w:i w:val="0"/>
+          <w:sz w:val="28"/>
+          <w:szCs w:val="28"/>
+        </w:rPr>
+        <w:t>سه تکمله مهم بر این قاعده هست که هر سه برای مسئله من کاربرد مستقیم دارند. تکمله اول (ماده ۷): حتی اگر رکن دولت «از حدود صلاحیتش تجاوز کرده» یا «برخلاف دستورات» عمل کرده باشد، رفتارش ـ اگر در سمت رسمی و با ابزار حکومتی انجام شده باشد ـ باز هم به دولت منتسب است.</w:t>
+      </w:r>
+      <w:r>
+        <w:rPr>
+          <w:rFonts w:ascii="B Lotus" w:hAnsi="B Lotus" w:cs="B Lotus" w:eastAsia="B Lotus"/>
+          <w:b w:val="0"/>
+          <w:i w:val="0"/>
+          <w:sz w:val="28"/>
+          <w:szCs w:val="28"/>
+          <w:vertAlign w:val="superscript"/>
+        </w:rPr>
+        <w:footnoteReference w:id="98"/>
+      </w:r>
+      <w:r>
+        <w:rPr>
+          <w:rFonts w:ascii="B Lotus" w:hAnsi="B Lotus" w:cs="B Lotus" w:eastAsia="B Lotus"/>
+          <w:b w:val="0"/>
+          <w:i w:val="0"/>
+          <w:sz w:val="28"/>
+          <w:szCs w:val="28"/>
+        </w:rPr>
+        <w:t xml:space="preserve"> منطقش حمایت از اعتماد طرف‌های مقابل و ثبات روابط بین‌المللی است: دولت دیگر نمی‌تواند (و نباید) در صلاحیت‌های داخلی و سلسله‌مراتب اداری دولت طرف کندوکاو کند و حسن نیتش باید حمایت شود. تکمله دوم (ماده ۸): رفتار اشخاص یا گروه‌هایی که «تحت هدایت یا کنترل» دولت عمل می‌کنند هم منتسب است.</w:t>
+      </w:r>
+      <w:r>
+        <w:rPr>
+          <w:rFonts w:ascii="B Lotus" w:hAnsi="B Lotus" w:cs="B Lotus" w:eastAsia="B Lotus"/>
+          <w:b w:val="0"/>
+          <w:i w:val="0"/>
+          <w:sz w:val="28"/>
+          <w:szCs w:val="28"/>
+          <w:vertAlign w:val="superscript"/>
+        </w:rPr>
         <w:footnoteReference w:id="99"/>
       </w:r>
-    </w:p>
-    <w:p>
-      <w:pPr>
-        <w:pStyle w:val="TH-Body"/>
-        <w:widowControl/>
-        <w:bidi w:val="1"/>
-        <w:spacing w:before="0" w:after="120" w:line="288" w:lineRule="auto"/>
-        <w:ind w:firstLine="283"/>
-        <w:jc w:val="both"/>
-      </w:pPr>
-      <w:r>
-        <w:rPr>
-          <w:rFonts w:ascii="B Lotus" w:hAnsi="B Lotus" w:cs="B Lotus" w:eastAsia="B Lotus"/>
-          <w:b w:val="0"/>
-          <w:i w:val="0"/>
-          <w:sz w:val="28"/>
-          <w:szCs w:val="28"/>
-        </w:rPr>
-        <w:t>منطقش هم روشن است: دولت، شخصیتی حقوقی است که فقط از طریق ارکان انسانی‌اش عمل می‌کند؛ پس رفتار ارکان، رفتار خودِ دولت است. ملاک، «سمت رسمی» است؛ نه رتبه، نه قوه، نه انگیزه شخصی، نه ماهیت دینی یا دنیوی تصمیم. این اطلاقِ ملاک، برای مسئله من تعیین‌کننده است ـ چنان‌که در بند بعد می‌آید.</w:t>
-      </w:r>
-    </w:p>
-    <w:p>
-      <w:pPr>
-        <w:pStyle w:val="TH-Body"/>
-        <w:widowControl/>
-        <w:bidi w:val="1"/>
-        <w:spacing w:before="0" w:after="120" w:line="288" w:lineRule="auto"/>
-        <w:ind w:firstLine="283"/>
-        <w:jc w:val="both"/>
-      </w:pPr>
-      <w:r>
-        <w:rPr>
-          <w:rFonts w:ascii="B Lotus" w:hAnsi="B Lotus" w:cs="B Lotus" w:eastAsia="B Lotus"/>
-          <w:b w:val="0"/>
-          <w:i w:val="0"/>
-          <w:sz w:val="28"/>
-          <w:szCs w:val="28"/>
-        </w:rPr>
-        <w:t>سه تکمله مهم بر این قاعده هست که هر سه برای مسئله من کاربرد مستقیم دارند. تکمله اول (ماده ۷): حتی اگر رکن دولت «از حدود صلاحیتش تجاوز کرده» یا «برخلاف دستورات» عمل کرده باشد، رفتارش ـ اگر در سمت رسمی و با ابزار حکومتی انجام شده باشد ـ باز هم به دولت منتسب است.</w:t>
+      <w:r>
+        <w:rPr>
+          <w:rFonts w:ascii="B Lotus" w:hAnsi="B Lotus" w:cs="B Lotus" w:eastAsia="B Lotus"/>
+          <w:b w:val="0"/>
+          <w:i w:val="0"/>
+          <w:sz w:val="28"/>
+          <w:szCs w:val="28"/>
+        </w:rPr>
+        <w:t xml:space="preserve"> و تکمله سوم (ماده ۱۱): حتی رفتار اشخاص خصوصی هم، هر وقت دولت آن را «تأیید و به‌مثابه عمل خودش بپذیرد»، به دولت منتسب می‌شود.</w:t>
       </w:r>
       <w:r>
         <w:rPr>
@@ -11234,7 +11174,7 @@
           <w:sz w:val="28"/>
           <w:szCs w:val="28"/>
         </w:rPr>
-        <w:t xml:space="preserve"> منطقش حمایت از اعتماد طرف‌های مقابل و ثبات روابط بین‌المللی است: دولت دیگر نمی‌تواند (و نباید) در صلاحیت‌های داخلی و سلسله‌مراتب اداری دولت طرف کندوکاو کند و حسن نیتش باید حمایت شود. تکمله دوم (ماده ۸): رفتار اشخاص یا گروه‌هایی که «تحت هدایت یا کنترل» دولت عمل می‌کنند هم منتسب است.</w:t>
+        <w:t xml:space="preserve"> دیوان در قضیه مشهور «کارکنان دیپلماتیک و کنسولی آمریکا در تهران» (۱۹۸۰) همین منطق را به کار بست و رفتار اشغال‌کنندگان سفارت را ـ که اولش عمل اشخاص خصوصی بود ـ به دلیل تأیید بعدی مقامات ایران، به دولت ایران منتسب دانست.</w:t>
       </w:r>
       <w:r>
         <w:rPr>
@@ -11246,48 +11186,6 @@
           <w:vertAlign w:val="superscript"/>
         </w:rPr>
         <w:footnoteReference w:id="101"/>
-      </w:r>
-      <w:r>
-        <w:rPr>
-          <w:rFonts w:ascii="B Lotus" w:hAnsi="B Lotus" w:cs="B Lotus" w:eastAsia="B Lotus"/>
-          <w:b w:val="0"/>
-          <w:i w:val="0"/>
-          <w:sz w:val="28"/>
-          <w:szCs w:val="28"/>
-        </w:rPr>
-        <w:t xml:space="preserve"> و تکمله سوم (ماده ۱۱): حتی رفتار اشخاص خصوصی هم، هر وقت دولت آن را «تأیید و به‌مثابه عمل خودش بپذیرد»، به دولت منتسب می‌شود.</w:t>
-      </w:r>
-      <w:r>
-        <w:rPr>
-          <w:rFonts w:ascii="B Lotus" w:hAnsi="B Lotus" w:cs="B Lotus" w:eastAsia="B Lotus"/>
-          <w:b w:val="0"/>
-          <w:i w:val="0"/>
-          <w:sz w:val="28"/>
-          <w:szCs w:val="28"/>
-          <w:vertAlign w:val="superscript"/>
-        </w:rPr>
-        <w:footnoteReference w:id="102"/>
-      </w:r>
-      <w:r>
-        <w:rPr>
-          <w:rFonts w:ascii="B Lotus" w:hAnsi="B Lotus" w:cs="B Lotus" w:eastAsia="B Lotus"/>
-          <w:b w:val="0"/>
-          <w:i w:val="0"/>
-          <w:sz w:val="28"/>
-          <w:szCs w:val="28"/>
-        </w:rPr>
-        <w:t xml:space="preserve"> دیوان در قضیه مشهور «کارکنان دیپلماتیک و کنسولی آمریکا در تهران» (۱۹۸۰) همین منطق را به کار بست و رفتار اشغال‌کنندگان سفارت را ـ که اولش عمل اشخاص خصوصی بود ـ به دلیل تأیید بعدی مقامات ایران، به دولت ایران منتسب دانست.</w:t>
-      </w:r>
-      <w:r>
-        <w:rPr>
-          <w:rFonts w:ascii="B Lotus" w:hAnsi="B Lotus" w:cs="B Lotus" w:eastAsia="B Lotus"/>
-          <w:b w:val="0"/>
-          <w:i w:val="0"/>
-          <w:sz w:val="28"/>
-          <w:szCs w:val="28"/>
-          <w:vertAlign w:val="superscript"/>
-        </w:rPr>
-        <w:footnoteReference w:id="103"/>
       </w:r>
     </w:p>
     <w:p>
@@ -11498,89 +11396,89 @@
           <w:szCs w:val="28"/>
           <w:vertAlign w:val="superscript"/>
         </w:rPr>
+        <w:footnoteReference w:id="102"/>
+      </w:r>
+      <w:r>
+        <w:rPr>
+          <w:rFonts w:ascii="B Lotus" w:hAnsi="B Lotus" w:cs="B Lotus" w:eastAsia="B Lotus"/>
+          <w:b w:val="0"/>
+          <w:i w:val="0"/>
+          <w:sz w:val="28"/>
+          <w:szCs w:val="28"/>
+        </w:rPr>
+        <w:t xml:space="preserve"> ملاک، «عینی» و «تطبیقی» است: مقایسه رفتار دولت با متن تعهد؛ و انگیزه و حسن نیت و اضطرار داخلی و مجوز شرعی و قانونی دولت، در «تحقق» نقض هیچ نقشی ندارد ـ هرچند ممکن است در «رافع بودن» یا «تخفیف آثار» مؤثر باشد. پس هر وقت دولت ایران ـ به هر دلیلی، از جمله تصمیم ولی فقیه ـ از اجرای تعهد معاهده‌ای‌اش سرباز بزند، «نقض» محقق شده؛ مگر این‌که رفتارش در قالب یکی از نهادهای موجه (تعلیق موجه، خاتمه موجه، یا اسباب رافع وصف متخلفانه) بگنجد.</w:t>
+      </w:r>
+    </w:p>
+    <w:p>
+      <w:pPr>
+        <w:pStyle w:val="TH-Body"/>
+        <w:widowControl/>
+        <w:bidi w:val="1"/>
+        <w:spacing w:before="0" w:after="120" w:line="288" w:lineRule="auto"/>
+        <w:ind w:firstLine="283"/>
+        <w:jc w:val="both"/>
+      </w:pPr>
+      <w:r>
+        <w:rPr>
+          <w:rFonts w:ascii="B Lotus" w:hAnsi="B Lotus" w:cs="B Lotus" w:eastAsia="B Lotus"/>
+          <w:b w:val="0"/>
+          <w:i w:val="0"/>
+          <w:sz w:val="28"/>
+          <w:szCs w:val="28"/>
+        </w:rPr>
+        <w:t>طرح، اقسام نقض را هم از جهت زمانی تحلیل کرده: نقض ممکن است «آنی» باشد (مثل تصویب قانونی مغایر با تعهد)، «مستمر» باشد (مثل وضعیتی که هر لحظه استمرار می‌یابد)، یا «مرکب» باشد (مثل مجموعه اقداماتی که کنار هم نقض را می‌سازند).</w:t>
+      </w:r>
+      <w:r>
+        <w:rPr>
+          <w:rFonts w:ascii="B Lotus" w:hAnsi="B Lotus" w:cs="B Lotus" w:eastAsia="B Lotus"/>
+          <w:b w:val="0"/>
+          <w:i w:val="0"/>
+          <w:sz w:val="28"/>
+          <w:szCs w:val="28"/>
+          <w:vertAlign w:val="superscript"/>
+        </w:rPr>
+        <w:footnoteReference w:id="103"/>
+      </w:r>
+      <w:r>
+        <w:rPr>
+          <w:rFonts w:ascii="B Lotus" w:hAnsi="B Lotus" w:cs="B Lotus" w:eastAsia="B Lotus"/>
+          <w:b w:val="0"/>
+          <w:i w:val="0"/>
+          <w:sz w:val="28"/>
+          <w:szCs w:val="28"/>
+        </w:rPr>
+        <w:t xml:space="preserve"> اهمیتش برای مسئله من این است که «تعلیق» معمولاً نقضی مستمر است ـ تا وقتی ادامه دارد، هر لحظه‌اش نقض تازه‌ای است، مگر این‌که موجه باشد ـ و همین استمرار در محاسبه خسارت و جبران اثر می‌گذارد. پس هرچه تعلیق طولانی‌تر، هزینه‌اش بیشتر؛ و این، دلیل دیگری بر ضابطه پنجم (موقت بودن) است.</w:t>
+      </w:r>
+    </w:p>
+    <w:p>
+      <w:pPr>
+        <w:pStyle w:val="TH-Body"/>
+        <w:widowControl/>
+        <w:bidi w:val="1"/>
+        <w:spacing w:before="0" w:after="120" w:line="288" w:lineRule="auto"/>
+        <w:ind w:firstLine="283"/>
+        <w:jc w:val="both"/>
+      </w:pPr>
+      <w:r>
+        <w:rPr>
+          <w:rFonts w:ascii="B Lotus" w:hAnsi="B Lotus" w:cs="B Lotus" w:eastAsia="B Lotus"/>
+          <w:b w:val="0"/>
+          <w:i w:val="0"/>
+          <w:sz w:val="28"/>
+          <w:szCs w:val="28"/>
+        </w:rPr>
+        <w:t>و این‌جا ماده ۲۷ کنوانسیون وین ـ که در فصل دوم گذشت ـ نقش قاطع و نهایی را بازی می‌کند: هیچ توجیه داخلی ـ از حکم حکومتی و مصلحت نظام و قانون اساسی تا احکام شرع ـ در برابر طرف مقابل پذیرفته نیست. و طرح هم همین منطق را در مرحله جبران تکرار کرده: دولت مسئول نمی‌تواند برای شانه خالی کردن از جبران خسارت به حقوق داخلی خودش استناد کند.</w:t>
+      </w:r>
+      <w:r>
+        <w:rPr>
+          <w:rFonts w:ascii="B Lotus" w:hAnsi="B Lotus" w:cs="B Lotus" w:eastAsia="B Lotus"/>
+          <w:b w:val="0"/>
+          <w:i w:val="0"/>
+          <w:sz w:val="28"/>
+          <w:szCs w:val="28"/>
+          <w:vertAlign w:val="superscript"/>
+        </w:rPr>
         <w:footnoteReference w:id="104"/>
-      </w:r>
-      <w:r>
-        <w:rPr>
-          <w:rFonts w:ascii="B Lotus" w:hAnsi="B Lotus" w:cs="B Lotus" w:eastAsia="B Lotus"/>
-          <w:b w:val="0"/>
-          <w:i w:val="0"/>
-          <w:sz w:val="28"/>
-          <w:szCs w:val="28"/>
-        </w:rPr>
-        <w:t xml:space="preserve"> ملاک، «عینی» و «تطبیقی» است: مقایسه رفتار دولت با متن تعهد؛ و انگیزه و حسن نیت و اضطرار داخلی و مجوز شرعی و قانونی دولت، در «تحقق» نقض هیچ نقشی ندارد ـ هرچند ممکن است در «رافع بودن» یا «تخفیف آثار» مؤثر باشد. پس هر وقت دولت ایران ـ به هر دلیلی، از جمله تصمیم ولی فقیه ـ از اجرای تعهد معاهده‌ای‌اش سرباز بزند، «نقض» محقق شده؛ مگر این‌که رفتارش در قالب یکی از نهادهای موجه (تعلیق موجه، خاتمه موجه، یا اسباب رافع وصف متخلفانه) بگنجد.</w:t>
-      </w:r>
-    </w:p>
-    <w:p>
-      <w:pPr>
-        <w:pStyle w:val="TH-Body"/>
-        <w:widowControl/>
-        <w:bidi w:val="1"/>
-        <w:spacing w:before="0" w:after="120" w:line="288" w:lineRule="auto"/>
-        <w:ind w:firstLine="283"/>
-        <w:jc w:val="both"/>
-      </w:pPr>
-      <w:r>
-        <w:rPr>
-          <w:rFonts w:ascii="B Lotus" w:hAnsi="B Lotus" w:cs="B Lotus" w:eastAsia="B Lotus"/>
-          <w:b w:val="0"/>
-          <w:i w:val="0"/>
-          <w:sz w:val="28"/>
-          <w:szCs w:val="28"/>
-        </w:rPr>
-        <w:t>طرح، اقسام نقض را هم از جهت زمانی تحلیل کرده: نقض ممکن است «آنی» باشد (مثل تصویب قانونی مغایر با تعهد)، «مستمر» باشد (مثل وضعیتی که هر لحظه استمرار می‌یابد)، یا «مرکب» باشد (مثل مجموعه اقداماتی که کنار هم نقض را می‌سازند).</w:t>
-      </w:r>
-      <w:r>
-        <w:rPr>
-          <w:rFonts w:ascii="B Lotus" w:hAnsi="B Lotus" w:cs="B Lotus" w:eastAsia="B Lotus"/>
-          <w:b w:val="0"/>
-          <w:i w:val="0"/>
-          <w:sz w:val="28"/>
-          <w:szCs w:val="28"/>
-          <w:vertAlign w:val="superscript"/>
-        </w:rPr>
-        <w:footnoteReference w:id="105"/>
-      </w:r>
-      <w:r>
-        <w:rPr>
-          <w:rFonts w:ascii="B Lotus" w:hAnsi="B Lotus" w:cs="B Lotus" w:eastAsia="B Lotus"/>
-          <w:b w:val="0"/>
-          <w:i w:val="0"/>
-          <w:sz w:val="28"/>
-          <w:szCs w:val="28"/>
-        </w:rPr>
-        <w:t xml:space="preserve"> اهمیتش برای مسئله من این است که «تعلیق» معمولاً نقضی مستمر است ـ تا وقتی ادامه دارد، هر لحظه‌اش نقض تازه‌ای است، مگر این‌که موجه باشد ـ و همین استمرار در محاسبه خسارت و جبران اثر می‌گذارد. پس هرچه تعلیق طولانی‌تر، هزینه‌اش بیشتر؛ و این، دلیل دیگری بر ضابطه پنجم (موقت بودن) است.</w:t>
-      </w:r>
-    </w:p>
-    <w:p>
-      <w:pPr>
-        <w:pStyle w:val="TH-Body"/>
-        <w:widowControl/>
-        <w:bidi w:val="1"/>
-        <w:spacing w:before="0" w:after="120" w:line="288" w:lineRule="auto"/>
-        <w:ind w:firstLine="283"/>
-        <w:jc w:val="both"/>
-      </w:pPr>
-      <w:r>
-        <w:rPr>
-          <w:rFonts w:ascii="B Lotus" w:hAnsi="B Lotus" w:cs="B Lotus" w:eastAsia="B Lotus"/>
-          <w:b w:val="0"/>
-          <w:i w:val="0"/>
-          <w:sz w:val="28"/>
-          <w:szCs w:val="28"/>
-        </w:rPr>
-        <w:t>و این‌جا ماده ۲۷ کنوانسیون وین ـ که در فصل دوم گذشت ـ نقش قاطع و نهایی را بازی می‌کند: هیچ توجیه داخلی ـ از حکم حکومتی و مصلحت نظام و قانون اساسی تا احکام شرع ـ در برابر طرف مقابل پذیرفته نیست. و طرح هم همین منطق را در مرحله جبران تکرار کرده: دولت مسئول نمی‌تواند برای شانه خالی کردن از جبران خسارت به حقوق داخلی خودش استناد کند.</w:t>
-      </w:r>
-      <w:r>
-        <w:rPr>
-          <w:rFonts w:ascii="B Lotus" w:hAnsi="B Lotus" w:cs="B Lotus" w:eastAsia="B Lotus"/>
-          <w:b w:val="0"/>
-          <w:i w:val="0"/>
-          <w:sz w:val="28"/>
-          <w:szCs w:val="28"/>
-          <w:vertAlign w:val="superscript"/>
-        </w:rPr>
-        <w:footnoteReference w:id="106"/>
       </w:r>
       <w:r>
         <w:rPr>
@@ -11801,8 +11699,90 @@
           <w:szCs w:val="28"/>
           <w:vertAlign w:val="superscript"/>
         </w:rPr>
+        <w:footnoteReference w:id="105"/>
+      </w:r>
+    </w:p>
+    <w:p>
+      <w:pPr>
+        <w:pStyle w:val="TH-Body"/>
+        <w:widowControl/>
+        <w:bidi w:val="1"/>
+        <w:spacing w:before="0" w:after="120" w:line="288" w:lineRule="auto"/>
+        <w:ind w:firstLine="283"/>
+        <w:jc w:val="both"/>
+      </w:pPr>
+      <w:r>
+        <w:rPr>
+          <w:rFonts w:ascii="B Lotus" w:hAnsi="B Lotus" w:cs="B Lotus" w:eastAsia="B Lotus"/>
+          <w:b w:val="0"/>
+          <w:i w:val="0"/>
+          <w:sz w:val="28"/>
+          <w:szCs w:val="28"/>
+        </w:rPr>
+        <w:t>از میان این‌ها، سه‌تا برای مسئله من مهم‌تر است و هر سه را جداگانه می‌گویم. یکم، «ضرورت» (ماده ۲۵): دولت می‌تواند برای «صیانت از منفعتی اساسی در برابر خطری شدید و قریب‌الوقوع» و در صورتی که رفتارش «تنها راه» چاره باشد، از تعهدش عدول کند؛ مشروط به این‌که به منفعت اساسی دولت دیگر یا جامعه بین‌المللی لطمه شدید نزند، تعهدِ مورد نظر استناد به ضرورت را منتفی نکرده باشد، و خودِ دولت در ساختن وضعیت اضطراری سهمی نداشته باشد.</w:t>
+      </w:r>
+      <w:r>
+        <w:rPr>
+          <w:rFonts w:ascii="B Lotus" w:hAnsi="B Lotus" w:cs="B Lotus" w:eastAsia="B Lotus"/>
+          <w:b w:val="0"/>
+          <w:i w:val="0"/>
+          <w:sz w:val="28"/>
+          <w:szCs w:val="28"/>
+          <w:vertAlign w:val="superscript"/>
+        </w:rPr>
+        <w:footnoteReference w:id="106"/>
+      </w:r>
+      <w:r>
+        <w:rPr>
+          <w:rFonts w:ascii="B Lotus" w:hAnsi="B Lotus" w:cs="B Lotus" w:eastAsia="B Lotus"/>
+          <w:b w:val="0"/>
+          <w:i w:val="0"/>
+          <w:sz w:val="28"/>
+          <w:szCs w:val="28"/>
+        </w:rPr>
+        <w:t xml:space="preserve"> دیوان در قضیه گابچیکوو این شرایط را بسیار مضیق تفسیر کرد و نشان داد که استناد موفق به ضرورت، امری استثنایی و نادر است. نسبت این نهاد با «مصلحت» فقهی ـ چنان‌که در فصل اول گفتم ـ عموم و خصوص من‌وجه است: هر ضرورتِ ماده ۲۵، مصلحت است، ولی هر مصلحتی، ضرورتِ ماده ۲۵ نیست؛ چون آستانه ماده ۲۵ («خطر شدید و قریب‌الوقوع» و «تنها راه») خیلی بالاتر از آستانه مصلحت فقهی (اهم بودن واقعی) است. نتیجه عملی و مهمش: مصلحتی که از نظر فقهی مجوز عدول است، لزوماً در سطح بین‌المللی رافع مسئولیت نیست؛ و این، دقیق‌ترین جلوه تفکیک سه‌گانه است.</w:t>
+      </w:r>
+    </w:p>
+    <w:p>
+      <w:pPr>
+        <w:pStyle w:val="TH-Body"/>
+        <w:widowControl/>
+        <w:bidi w:val="1"/>
+        <w:spacing w:before="0" w:after="120" w:line="288" w:lineRule="auto"/>
+        <w:ind w:firstLine="283"/>
+        <w:jc w:val="both"/>
+      </w:pPr>
+      <w:r>
+        <w:rPr>
+          <w:rFonts w:ascii="B Lotus" w:hAnsi="B Lotus" w:cs="B Lotus" w:eastAsia="B Lotus"/>
+          <w:b w:val="0"/>
+          <w:i w:val="0"/>
+          <w:sz w:val="28"/>
+          <w:szCs w:val="28"/>
+        </w:rPr>
+        <w:t>دوم، «اقدام متقابل»: هر وقت یک طرف تعهدش را نقض کند، طرف زیان‌دیده می‌تواند ـ با رعایت شرایطی مثل تناسب و اعلام قبلی و دعوت به مذاکره و موقت بودن ـ از اجرای تعهدات متقابلش در برابر دولت ناقض خودداری کند.</w:t>
+      </w:r>
+      <w:r>
+        <w:rPr>
+          <w:rFonts w:ascii="B Lotus" w:hAnsi="B Lotus" w:cs="B Lotus" w:eastAsia="B Lotus"/>
+          <w:b w:val="0"/>
+          <w:i w:val="0"/>
+          <w:sz w:val="28"/>
+          <w:szCs w:val="28"/>
+          <w:vertAlign w:val="superscript"/>
+        </w:rPr>
         <w:footnoteReference w:id="107"/>
       </w:r>
+      <w:r>
+        <w:rPr>
+          <w:rFonts w:ascii="B Lotus" w:hAnsi="B Lotus" w:cs="B Lotus" w:eastAsia="B Lotus"/>
+          <w:b w:val="0"/>
+          <w:i w:val="0"/>
+          <w:sz w:val="28"/>
+          <w:szCs w:val="28"/>
+        </w:rPr>
+        <w:t xml:space="preserve"> این نهاد، پشتوانه حقوقی «عدول واکنشی» (صورت چهارم طیف من) است و نشان می‌دهد که حقوق بین‌الملل هم منطق «تقابل» ـ شبیه منطق توبه/۷ ـ را پذیرفته؛ هرچند با شرایط شکلیِ سخت‌گیرانه‌ای که رعایتشان برای موجه بودن اقدام، ضروری است.</w:t>
+      </w:r>
     </w:p>
     <w:p>
       <w:pPr>
@@ -11821,7 +11801,7 @@
           <w:sz w:val="28"/>
           <w:szCs w:val="28"/>
         </w:rPr>
-        <w:t>از میان این‌ها، سه‌تا برای مسئله من مهم‌تر است و هر سه را جداگانه می‌گویم. یکم، «ضرورت» (ماده ۲۵): دولت می‌تواند برای «صیانت از منفعتی اساسی در برابر خطری شدید و قریب‌الوقوع» و در صورتی که رفتارش «تنها راه» چاره باشد، از تعهدش عدول کند؛ مشروط به این‌که به منفعت اساسی دولت دیگر یا جامعه بین‌المللی لطمه شدید نزند، تعهدِ مورد نظر استناد به ضرورت را منتفی نکرده باشد، و خودِ دولت در ساختن وضعیت اضطراری سهمی نداشته باشد.</w:t>
+        <w:t>و سوم، «فورس‌ماژور» (ماده ۲۳): هر وقت اجرای تعهد به خاطر «نیروی قاهره» ـ رویداد غیرقابل پیش‌بینی و خارج از کنترل دولت، مثل بلایای طبیعی یا جنگ تحمیلی ـ ناممکن شود، وصف متخلفانه منتفی می‌گردد؛ مشروط به این‌که خودِ دولت در ساختن وضعیت سهمی نداشته باشد.</w:t>
       </w:r>
       <w:r>
         <w:rPr>
@@ -11834,16 +11814,6 @@
         </w:rPr>
         <w:footnoteReference w:id="108"/>
       </w:r>
-      <w:r>
-        <w:rPr>
-          <w:rFonts w:ascii="B Lotus" w:hAnsi="B Lotus" w:cs="B Lotus" w:eastAsia="B Lotus"/>
-          <w:b w:val="0"/>
-          <w:i w:val="0"/>
-          <w:sz w:val="28"/>
-          <w:szCs w:val="28"/>
-        </w:rPr>
-        <w:t xml:space="preserve"> دیوان در قضیه گابچیکوو این شرایط را بسیار مضیق تفسیر کرد و نشان داد که استناد موفق به ضرورت، امری استثنایی و نادر است. نسبت این نهاد با «مصلحت» فقهی ـ چنان‌که در فصل اول گفتم ـ عموم و خصوص من‌وجه است: هر ضرورتِ ماده ۲۵، مصلحت است، ولی هر مصلحتی، ضرورتِ ماده ۲۵ نیست؛ چون آستانه ماده ۲۵ («خطر شدید و قریب‌الوقوع» و «تنها راه») خیلی بالاتر از آستانه مصلحت فقهی (اهم بودن واقعی) است. نتیجه عملی و مهمش: مصلحتی که از نظر فقهی مجوز عدول است، لزوماً در سطح بین‌المللی رافع مسئولیت نیست؛ و این، دقیق‌ترین جلوه تفکیک سه‌گانه است.</w:t>
-      </w:r>
     </w:p>
     <w:p>
       <w:pPr>
@@ -11862,7 +11832,7 @@
           <w:sz w:val="28"/>
           <w:szCs w:val="28"/>
         </w:rPr>
-        <w:t>دوم، «اقدام متقابل»: هر وقت یک طرف تعهدش را نقض کند، طرف زیان‌دیده می‌تواند ـ با رعایت شرایطی مثل تناسب و اعلام قبلی و دعوت به مذاکره و موقت بودن ـ از اجرای تعهدات متقابلش در برابر دولت ناقض خودداری کند.</w:t>
+        <w:t>سقف همه این اسباب هم ماده ۲۶ است: هیچ‌کدامشان در برابر نقض «قواعد آمره» (مثل منع تجاوز و نسل‌کشی و جنایت علیه بشریت) قابل استناد نیست.</w:t>
       </w:r>
       <w:r>
         <w:rPr>
@@ -11874,78 +11844,6 @@
           <w:vertAlign w:val="superscript"/>
         </w:rPr>
         <w:footnoteReference w:id="109"/>
-      </w:r>
-      <w:r>
-        <w:rPr>
-          <w:rFonts w:ascii="B Lotus" w:hAnsi="B Lotus" w:cs="B Lotus" w:eastAsia="B Lotus"/>
-          <w:b w:val="0"/>
-          <w:i w:val="0"/>
-          <w:sz w:val="28"/>
-          <w:szCs w:val="28"/>
-        </w:rPr>
-        <w:t xml:space="preserve"> این نهاد، پشتوانه حقوقی «عدول واکنشی» (صورت چهارم طیف من) است و نشان می‌دهد که حقوق بین‌الملل هم منطق «تقابل» ـ شبیه منطق توبه/۷ ـ را پذیرفته؛ هرچند با شرایط شکلیِ سخت‌گیرانه‌ای که رعایتشان برای موجه بودن اقدام، ضروری است.</w:t>
-      </w:r>
-    </w:p>
-    <w:p>
-      <w:pPr>
-        <w:pStyle w:val="TH-Body"/>
-        <w:widowControl/>
-        <w:bidi w:val="1"/>
-        <w:spacing w:before="0" w:after="120" w:line="288" w:lineRule="auto"/>
-        <w:ind w:firstLine="283"/>
-        <w:jc w:val="both"/>
-      </w:pPr>
-      <w:r>
-        <w:rPr>
-          <w:rFonts w:ascii="B Lotus" w:hAnsi="B Lotus" w:cs="B Lotus" w:eastAsia="B Lotus"/>
-          <w:b w:val="0"/>
-          <w:i w:val="0"/>
-          <w:sz w:val="28"/>
-          <w:szCs w:val="28"/>
-        </w:rPr>
-        <w:t>و سوم، «فورس‌ماژور» (ماده ۲۳): هر وقت اجرای تعهد به خاطر «نیروی قاهره» ـ رویداد غیرقابل پیش‌بینی و خارج از کنترل دولت، مثل بلایای طبیعی یا جنگ تحمیلی ـ ناممکن شود، وصف متخلفانه منتفی می‌گردد؛ مشروط به این‌که خودِ دولت در ساختن وضعیت سهمی نداشته باشد.</w:t>
-      </w:r>
-      <w:r>
-        <w:rPr>
-          <w:rFonts w:ascii="B Lotus" w:hAnsi="B Lotus" w:cs="B Lotus" w:eastAsia="B Lotus"/>
-          <w:b w:val="0"/>
-          <w:i w:val="0"/>
-          <w:sz w:val="28"/>
-          <w:szCs w:val="28"/>
-          <w:vertAlign w:val="superscript"/>
-        </w:rPr>
-        <w:footnoteReference w:id="110"/>
-      </w:r>
-    </w:p>
-    <w:p>
-      <w:pPr>
-        <w:pStyle w:val="TH-Body"/>
-        <w:widowControl/>
-        <w:bidi w:val="1"/>
-        <w:spacing w:before="0" w:after="120" w:line="288" w:lineRule="auto"/>
-        <w:ind w:firstLine="283"/>
-        <w:jc w:val="both"/>
-      </w:pPr>
-      <w:r>
-        <w:rPr>
-          <w:rFonts w:ascii="B Lotus" w:hAnsi="B Lotus" w:cs="B Lotus" w:eastAsia="B Lotus"/>
-          <w:b w:val="0"/>
-          <w:i w:val="0"/>
-          <w:sz w:val="28"/>
-          <w:szCs w:val="28"/>
-        </w:rPr>
-        <w:t>سقف همه این اسباب هم ماده ۲۶ است: هیچ‌کدامشان در برابر نقض «قواعد آمره» (مثل منع تجاوز و نسل‌کشی و جنایت علیه بشریت) قابل استناد نیست.</w:t>
-      </w:r>
-      <w:r>
-        <w:rPr>
-          <w:rFonts w:ascii="B Lotus" w:hAnsi="B Lotus" w:cs="B Lotus" w:eastAsia="B Lotus"/>
-          <w:b w:val="0"/>
-          <w:i w:val="0"/>
-          <w:sz w:val="28"/>
-          <w:szCs w:val="28"/>
-          <w:vertAlign w:val="superscript"/>
-        </w:rPr>
-        <w:footnoteReference w:id="111"/>
       </w:r>
       <w:r>
         <w:rPr>
@@ -12006,7 +11904,7 @@
           <w:szCs w:val="28"/>
           <w:vertAlign w:val="superscript"/>
         </w:rPr>
-        <w:footnoteReference w:id="112"/>
+        <w:footnoteReference w:id="110"/>
       </w:r>
       <w:r>
         <w:rPr>
@@ -12047,7 +11945,7 @@
           <w:szCs w:val="28"/>
           <w:vertAlign w:val="superscript"/>
         </w:rPr>
-        <w:footnoteReference w:id="113"/>
+        <w:footnoteReference w:id="111"/>
       </w:r>
       <w:r>
         <w:rPr>
@@ -12148,7 +12046,7 @@
           <w:szCs w:val="28"/>
           <w:vertAlign w:val="superscript"/>
         </w:rPr>
-        <w:footnoteReference w:id="114"/>
+        <w:footnoteReference w:id="112"/>
       </w:r>
       <w:r>
         <w:rPr>
@@ -12289,47 +12187,109 @@
           <w:szCs w:val="28"/>
           <w:vertAlign w:val="superscript"/>
         </w:rPr>
+        <w:footnoteReference w:id="113"/>
+      </w:r>
+    </w:p>
+    <w:p>
+      <w:pPr>
+        <w:pStyle w:val="TH-Body"/>
+        <w:widowControl/>
+        <w:bidi w:val="1"/>
+        <w:spacing w:before="0" w:after="120" w:line="288" w:lineRule="auto"/>
+        <w:ind w:firstLine="283"/>
+        <w:jc w:val="both"/>
+      </w:pPr>
+      <w:r>
+        <w:rPr>
+          <w:rFonts w:ascii="B Lotus" w:hAnsi="B Lotus" w:cs="B Lotus" w:eastAsia="B Lotus"/>
+          <w:b w:val="0"/>
+          <w:i w:val="0"/>
+          <w:sz w:val="28"/>
+          <w:szCs w:val="28"/>
+        </w:rPr>
+        <w:t>دقت کنید که این پنج شرط، عیناً همان منطق ضوابط هشت‌گانه من است به زبان حقوق بین‌الملل: تناسب (ضابطه چهارم)، موقت بودن (ضابطه پنجم)، اعلام و مذاکره قبلی (ضابطه ششم و راهبرد چهارم)، و سقف قواعد آمره (ضابطه هفتم). این هم‌خوانیِ شگفت میان دو نظامِ مستقل، برای من از شیرین‌ترین یافته‌های این پژوهش بود؛ چون نشان می‌دهد که عقلانیتِ واحدِ بشری، در دو سنتِ مختلف، به قواعدِ مشابه رسیده. و همین هم‌خوانی است که به تصمیم‌گیر ایرانی اجازه می‌دهد عدولش را ـ اگر ضوابط را رعایت کرده باشد ـ هم به زبان فقه توجیه کند هم به زبان حقوق بین‌الملل؛ و این «دوزبانگیِ توجیهی»، قدرت چانه‌زنی و دفاع حقوقی کشور را دوچندان می‌کند.</w:t>
+      </w:r>
+    </w:p>
+    <w:p>
+      <w:pPr>
+        <w:pStyle w:val="TH-Body"/>
+        <w:widowControl/>
+        <w:bidi w:val="1"/>
+        <w:spacing w:before="0" w:after="120" w:line="288" w:lineRule="auto"/>
+        <w:ind w:firstLine="283"/>
+        <w:jc w:val="both"/>
+      </w:pPr>
+      <w:r>
+        <w:rPr>
+          <w:rFonts w:ascii="B Lotus" w:hAnsi="B Lotus" w:cs="B Lotus" w:eastAsia="B Lotus"/>
+          <w:b w:val="0"/>
+          <w:i w:val="0"/>
+          <w:sz w:val="28"/>
+          <w:szCs w:val="28"/>
+        </w:rPr>
+        <w:t>درباره «جبران» هم باید به رویه اشاره کنم. اصل «جبران کامل» (full reparation) که در ماده ۳۱ طرح آمده، ریشه در رأی مشهور دیوان دائمی دادگستری بین‌المللی در قضیه کارخانه کورزو (۱۹۲۸) دارد: «نقض تعهد، مستلزم تعهد به جبران کافی است؛ جبرانی که ـ تا حد ممکن ـ آثار نقض را از بین ببرد و وضعیت را به حالتِ پیش از نقض برگرداند».</w:t>
+      </w:r>
+      <w:r>
+        <w:rPr>
+          <w:rFonts w:ascii="B Lotus" w:hAnsi="B Lotus" w:cs="B Lotus" w:eastAsia="B Lotus"/>
+          <w:b w:val="0"/>
+          <w:i w:val="0"/>
+          <w:sz w:val="28"/>
+          <w:szCs w:val="28"/>
+          <w:vertAlign w:val="superscript"/>
+        </w:rPr>
+        <w:footnoteReference w:id="114"/>
+      </w:r>
+      <w:r>
+        <w:rPr>
+          <w:rFonts w:ascii="B Lotus" w:hAnsi="B Lotus" w:cs="B Lotus" w:eastAsia="B Lotus"/>
+          <w:b w:val="0"/>
+          <w:i w:val="0"/>
+          <w:sz w:val="28"/>
+          <w:szCs w:val="28"/>
+        </w:rPr>
+        <w:t xml:space="preserve"> این اصل بعداً در رویه دیوان بین‌المللی دادگستری (از جمله در قضیه گابچیکوو و قضیه نیکاراگوئه) تکرار و تثبیت شد. نتیجه عملی‌اش برای ما: حاکم باید بداند که عدولِ ناموجه، نه‌تنها تعهد به «توقف»، که تعهد به «جبران کاملِ خسارت‌های قابل ارزیابی» را هم در پی دارد؛ و برآورد این خسارت ـ هرچند تقریبی ـ بخشی از همان محاسبه مصلحت (ضابطه هشتم) است. دولتی که بدون برآورد خسارت عدول کند، مثل تاجری است که بدون حساب سود و زیان معامله کند ـ و عاقبتش معلوم است.</w:t>
+      </w:r>
+    </w:p>
+    <w:p>
+      <w:pPr>
+        <w:pStyle w:val="TH-Body"/>
+        <w:widowControl/>
+        <w:bidi w:val="1"/>
+        <w:spacing w:before="0" w:after="120" w:line="288" w:lineRule="auto"/>
+        <w:ind w:firstLine="283"/>
+        <w:jc w:val="both"/>
+      </w:pPr>
+      <w:r>
+        <w:rPr>
+          <w:rFonts w:ascii="B Lotus" w:hAnsi="B Lotus" w:cs="B Lotus" w:eastAsia="B Lotus"/>
+          <w:b w:val="0"/>
+          <w:i w:val="0"/>
+          <w:sz w:val="28"/>
+          <w:szCs w:val="28"/>
+        </w:rPr>
+        <w:t>و درباره مجاری حل اختلاف هم توضیحی لازم است. دیوان بین‌المللی دادگستری ـ رکن قضایی اصلی سازمان ملل ـ فقط وقتی به اختلاف رسیدگی می‌کند که «هر دو طرف» صلاحیتش را پذیرفته باشند (اصل رضایی بودن صلاحیت، ماده ۳۶ اساسنامه دیوان).</w:t>
+      </w:r>
+      <w:r>
+        <w:rPr>
+          <w:rFonts w:ascii="B Lotus" w:hAnsi="B Lotus" w:cs="B Lotus" w:eastAsia="B Lotus"/>
+          <w:b w:val="0"/>
+          <w:i w:val="0"/>
+          <w:sz w:val="28"/>
+          <w:szCs w:val="28"/>
+          <w:vertAlign w:val="superscript"/>
+        </w:rPr>
         <w:footnoteReference w:id="115"/>
       </w:r>
-    </w:p>
-    <w:p>
-      <w:pPr>
-        <w:pStyle w:val="TH-Body"/>
-        <w:widowControl/>
-        <w:bidi w:val="1"/>
-        <w:spacing w:before="0" w:after="120" w:line="288" w:lineRule="auto"/>
-        <w:ind w:firstLine="283"/>
-        <w:jc w:val="both"/>
-      </w:pPr>
-      <w:r>
-        <w:rPr>
-          <w:rFonts w:ascii="B Lotus" w:hAnsi="B Lotus" w:cs="B Lotus" w:eastAsia="B Lotus"/>
-          <w:b w:val="0"/>
-          <w:i w:val="0"/>
-          <w:sz w:val="28"/>
-          <w:szCs w:val="28"/>
-        </w:rPr>
-        <w:t>دقت کنید که این پنج شرط، عیناً همان منطق ضوابط هشت‌گانه من است به زبان حقوق بین‌الملل: تناسب (ضابطه چهارم)، موقت بودن (ضابطه پنجم)، اعلام و مذاکره قبلی (ضابطه ششم و راهبرد چهارم)، و سقف قواعد آمره (ضابطه هفتم). این هم‌خوانیِ شگفت میان دو نظامِ مستقل، برای من از شیرین‌ترین یافته‌های این پژوهش بود؛ چون نشان می‌دهد که عقلانیتِ واحدِ بشری، در دو سنتِ مختلف، به قواعدِ مشابه رسیده. و همین هم‌خوانی است که به تصمیم‌گیر ایرانی اجازه می‌دهد عدولش را ـ اگر ضوابط را رعایت کرده باشد ـ هم به زبان فقه توجیه کند هم به زبان حقوق بین‌الملل؛ و این «دوزبانگیِ توجیهی»، قدرت چانه‌زنی و دفاع حقوقی کشور را دوچندان می‌کند.</w:t>
-      </w:r>
-    </w:p>
-    <w:p>
-      <w:pPr>
-        <w:pStyle w:val="TH-Body"/>
-        <w:widowControl/>
-        <w:bidi w:val="1"/>
-        <w:spacing w:before="0" w:after="120" w:line="288" w:lineRule="auto"/>
-        <w:ind w:firstLine="283"/>
-        <w:jc w:val="both"/>
-      </w:pPr>
-      <w:r>
-        <w:rPr>
-          <w:rFonts w:ascii="B Lotus" w:hAnsi="B Lotus" w:cs="B Lotus" w:eastAsia="B Lotus"/>
-          <w:b w:val="0"/>
-          <w:i w:val="0"/>
-          <w:sz w:val="28"/>
-          <w:szCs w:val="28"/>
-        </w:rPr>
-        <w:t>درباره «جبران» هم باید به رویه اشاره کنم. اصل «جبران کامل» (full reparation) که در ماده ۳۱ طرح آمده، ریشه در رأی مشهور دیوان دائمی دادگستری بین‌المللی در قضیه کارخانه کورزو (۱۹۲۸) دارد: «نقض تعهد، مستلزم تعهد به جبران کافی است؛ جبرانی که ـ تا حد ممکن ـ آثار نقض را از بین ببرد و وضعیت را به حالتِ پیش از نقض برگرداند».</w:t>
+      <w:r>
+        <w:rPr>
+          <w:rFonts w:ascii="B Lotus" w:hAnsi="B Lotus" w:cs="B Lotus" w:eastAsia="B Lotus"/>
+          <w:b w:val="0"/>
+          <w:i w:val="0"/>
+          <w:sz w:val="28"/>
+          <w:szCs w:val="28"/>
+        </w:rPr>
+        <w:t xml:space="preserve"> پس برخلاف دادگاه‌های داخلی، نمی‌شود دولت دیگر را به‌زور به دیوان کشاند؛ مگر این‌که در خودِ معاهده، شرط ارجاع به دیوان یا داوری پیش‌بینی شده باشد ـ که این، دلیل دیگری است بر اهمیت «شرط‌گذاری در متن» (راهبرد سوم). و در موارد «تهدید صلح و امنیت بین‌المللی»، شورای امنیت بر اساس فصل ششم منشور (حل مسالمت‌آمیز، مواد ۳۳ تا ۳۸) و فصل هفتم (اقدامات قهری، مواد ۳۹ تا ۵۱) وارد می‌شود؛</w:t>
       </w:r>
       <w:r>
         <w:rPr>
@@ -12341,68 +12301,6 @@
           <w:vertAlign w:val="superscript"/>
         </w:rPr>
         <w:footnoteReference w:id="116"/>
-      </w:r>
-      <w:r>
-        <w:rPr>
-          <w:rFonts w:ascii="B Lotus" w:hAnsi="B Lotus" w:cs="B Lotus" w:eastAsia="B Lotus"/>
-          <w:b w:val="0"/>
-          <w:i w:val="0"/>
-          <w:sz w:val="28"/>
-          <w:szCs w:val="28"/>
-        </w:rPr>
-        <w:t xml:space="preserve"> این اصل بعداً در رویه دیوان بین‌المللی دادگستری (از جمله در قضیه گابچیکوو و قضیه نیکاراگوئه) تکرار و تثبیت شد. نتیجه عملی‌اش برای ما: حاکم باید بداند که عدولِ ناموجه، نه‌تنها تعهد به «توقف»، که تعهد به «جبران کاملِ خسارت‌های قابل ارزیابی» را هم در پی دارد؛ و برآورد این خسارت ـ هرچند تقریبی ـ بخشی از همان محاسبه مصلحت (ضابطه هشتم) است. دولتی که بدون برآورد خسارت عدول کند، مثل تاجری است که بدون حساب سود و زیان معامله کند ـ و عاقبتش معلوم است.</w:t>
-      </w:r>
-    </w:p>
-    <w:p>
-      <w:pPr>
-        <w:pStyle w:val="TH-Body"/>
-        <w:widowControl/>
-        <w:bidi w:val="1"/>
-        <w:spacing w:before="0" w:after="120" w:line="288" w:lineRule="auto"/>
-        <w:ind w:firstLine="283"/>
-        <w:jc w:val="both"/>
-      </w:pPr>
-      <w:r>
-        <w:rPr>
-          <w:rFonts w:ascii="B Lotus" w:hAnsi="B Lotus" w:cs="B Lotus" w:eastAsia="B Lotus"/>
-          <w:b w:val="0"/>
-          <w:i w:val="0"/>
-          <w:sz w:val="28"/>
-          <w:szCs w:val="28"/>
-        </w:rPr>
-        <w:t>و درباره مجاری حل اختلاف هم توضیحی لازم است. دیوان بین‌المللی دادگستری ـ رکن قضایی اصلی سازمان ملل ـ فقط وقتی به اختلاف رسیدگی می‌کند که «هر دو طرف» صلاحیتش را پذیرفته باشند (اصل رضایی بودن صلاحیت، ماده ۳۶ اساسنامه دیوان).</w:t>
-      </w:r>
-      <w:r>
-        <w:rPr>
-          <w:rFonts w:ascii="B Lotus" w:hAnsi="B Lotus" w:cs="B Lotus" w:eastAsia="B Lotus"/>
-          <w:b w:val="0"/>
-          <w:i w:val="0"/>
-          <w:sz w:val="28"/>
-          <w:szCs w:val="28"/>
-          <w:vertAlign w:val="superscript"/>
-        </w:rPr>
-        <w:footnoteReference w:id="117"/>
-      </w:r>
-      <w:r>
-        <w:rPr>
-          <w:rFonts w:ascii="B Lotus" w:hAnsi="B Lotus" w:cs="B Lotus" w:eastAsia="B Lotus"/>
-          <w:b w:val="0"/>
-          <w:i w:val="0"/>
-          <w:sz w:val="28"/>
-          <w:szCs w:val="28"/>
-        </w:rPr>
-        <w:t xml:space="preserve"> پس برخلاف دادگاه‌های داخلی، نمی‌شود دولت دیگر را به‌زور به دیوان کشاند؛ مگر این‌که در خودِ معاهده، شرط ارجاع به دیوان یا داوری پیش‌بینی شده باشد ـ که این، دلیل دیگری است بر اهمیت «شرط‌گذاری در متن» (راهبرد سوم). و در موارد «تهدید صلح و امنیت بین‌المللی»، شورای امنیت بر اساس فصل ششم منشور (حل مسالمت‌آمیز، مواد ۳۳ تا ۳۸) و فصل هفتم (اقدامات قهری، مواد ۳۹ تا ۵۱) وارد می‌شود؛</w:t>
-      </w:r>
-      <w:r>
-        <w:rPr>
-          <w:rFonts w:ascii="B Lotus" w:hAnsi="B Lotus" w:cs="B Lotus" w:eastAsia="B Lotus"/>
-          <w:b w:val="0"/>
-          <w:i w:val="0"/>
-          <w:sz w:val="28"/>
-          <w:szCs w:val="28"/>
-          <w:vertAlign w:val="superscript"/>
-        </w:rPr>
-        <w:footnoteReference w:id="118"/>
       </w:r>
       <w:r>
         <w:rPr>
@@ -12583,89 +12481,89 @@
           <w:szCs w:val="28"/>
           <w:vertAlign w:val="superscript"/>
         </w:rPr>
+        <w:footnoteReference w:id="117"/>
+      </w:r>
+      <w:r>
+        <w:rPr>
+          <w:rFonts w:ascii="B Lotus" w:hAnsi="B Lotus" w:cs="B Lotus" w:eastAsia="B Lotus"/>
+          <w:b w:val="0"/>
+          <w:i w:val="0"/>
+          <w:sz w:val="28"/>
+          <w:szCs w:val="28"/>
+        </w:rPr>
+        <w:t xml:space="preserve"> نکته حقوقیِ مشترکِ این سه مورد: آمریکا در هر سه، به «سازوکارِ پیش‌بینی‌شده در خودِ سند» (حقِ خروج با اطلاعِ قبلی) استناد کرد ـ یعنی عدولش را در قالبِ «اعمالِ حقِ مندرج» (صورتِ اولِ طیفِ من: سبز) ریخت، نه نقضِ یک‌جانبه. درسش برای ما همان است که بارها گفتم: اگر هنگامِ انعقاد، شرطِ خروج و بازنگری در متن بگنجانی، روزِ عدول، «ناقض» نیستی، «صاحبِ حق» هستی. آمریکا ـ با همه انتقادهایی که به سیاستش وارد است ـ از نظرِ «تکنیکِ حقوقی» درست عمل کرد؛ و ما باید همین تکنیک را بیاموزیم و به کار ببریم، بی‌آن‌که سیاستش را تأیید کنیم. آموختنِ فن از دشمن، نه تأییدِ دشمن است نه تقلید از او؛ بلکه همان است که امیرالمؤمنین فرمود حکمت، گمشده مؤمن است و هرجا بیابدش برمی‌دارد.</w:t>
+      </w:r>
+    </w:p>
+    <w:p>
+      <w:pPr>
+        <w:pStyle w:val="TH-Body"/>
+        <w:widowControl/>
+        <w:bidi w:val="1"/>
+        <w:spacing w:before="0" w:after="120" w:line="288" w:lineRule="auto"/>
+        <w:ind w:firstLine="283"/>
+        <w:jc w:val="both"/>
+      </w:pPr>
+      <w:r>
+        <w:rPr>
+          <w:rFonts w:ascii="B Lotus" w:hAnsi="B Lotus" w:cs="B Lotus" w:eastAsia="B Lotus"/>
+          <w:b w:val="0"/>
+          <w:i w:val="0"/>
+          <w:sz w:val="28"/>
+          <w:szCs w:val="28"/>
+        </w:rPr>
+        <w:t>تجربه دوم، خروجِ دسته‌جمعیِ دولت‌های آفریقایی از دیوان کیفری بین‌المللی در دهه ۲۰۱۰ است: چند دولت آفریقایی ـ به بهانه این‌که دیوان گزینشی و سیاسی عمل می‌کند ـ از اساسنامه رم خارج شدند یا خروج را اعلام کردند.</w:t>
+      </w:r>
+      <w:r>
+        <w:rPr>
+          <w:rFonts w:ascii="B Lotus" w:hAnsi="B Lotus" w:cs="B Lotus" w:eastAsia="B Lotus"/>
+          <w:b w:val="0"/>
+          <w:i w:val="0"/>
+          <w:sz w:val="28"/>
+          <w:szCs w:val="28"/>
+          <w:vertAlign w:val="superscript"/>
+        </w:rPr>
+        <w:footnoteReference w:id="118"/>
+      </w:r>
+      <w:r>
+        <w:rPr>
+          <w:rFonts w:ascii="B Lotus" w:hAnsi="B Lotus" w:cs="B Lotus" w:eastAsia="B Lotus"/>
+          <w:b w:val="0"/>
+          <w:i w:val="0"/>
+          <w:sz w:val="28"/>
+          <w:szCs w:val="28"/>
+        </w:rPr>
+        <w:t xml:space="preserve"> نکته حقوقی‌اش: اساسنامه رم حقِ خروج با اطلاعِ قبلی را پیش‌بینی کرده؛ پس خروج‌ها در چارچوبِ سند بود و از نظرِ حقوقی «موجه» ـ هرچند از نظرِ سیاسی مناقشه‌برانگیز. درسش: حتی در حساس‌ترین حوزه‌ها (عدالت کیفری بین‌المللی) هم سازوکارِ خروجِ قانونی پیش‌بینی می‌شود؛ و همین، نشان می‌دهد که «حقِ خروجِ ضابطه‌مند» اصلی پذیرفته‌شده در حقوق بین‌الملل معاصر است، نه بدعتی که ما اختراع کرده باشیم.</w:t>
+      </w:r>
+    </w:p>
+    <w:p>
+      <w:pPr>
+        <w:pStyle w:val="TH-Body"/>
+        <w:widowControl/>
+        <w:bidi w:val="1"/>
+        <w:spacing w:before="0" w:after="120" w:line="288" w:lineRule="auto"/>
+        <w:ind w:firstLine="283"/>
+        <w:jc w:val="both"/>
+      </w:pPr>
+      <w:r>
+        <w:rPr>
+          <w:rFonts w:ascii="B Lotus" w:hAnsi="B Lotus" w:cs="B Lotus" w:eastAsia="B Lotus"/>
+          <w:b w:val="0"/>
+          <w:i w:val="0"/>
+          <w:sz w:val="28"/>
+          <w:szCs w:val="28"/>
+        </w:rPr>
+        <w:t>تجربه سوم، خروج بریتانیا از اتحادیه اروپا (برگزیت، ۲۰۲۰) است: بریتانیا با استناد به حقِ خروجِ پیش‌بینی‌شده در معاهده لیسبون و پس از همه‌پرسیِ داخلی، از اتحادیه خارج شد ـ فرایندی که سال‌ها مذاکره و توافقِ خروج را در پی داشت.</w:t>
+      </w:r>
+      <w:r>
+        <w:rPr>
+          <w:rFonts w:ascii="B Lotus" w:hAnsi="B Lotus" w:cs="B Lotus" w:eastAsia="B Lotus"/>
+          <w:b w:val="0"/>
+          <w:i w:val="0"/>
+          <w:sz w:val="28"/>
+          <w:szCs w:val="28"/>
+          <w:vertAlign w:val="superscript"/>
+        </w:rPr>
         <w:footnoteReference w:id="119"/>
-      </w:r>
-      <w:r>
-        <w:rPr>
-          <w:rFonts w:ascii="B Lotus" w:hAnsi="B Lotus" w:cs="B Lotus" w:eastAsia="B Lotus"/>
-          <w:b w:val="0"/>
-          <w:i w:val="0"/>
-          <w:sz w:val="28"/>
-          <w:szCs w:val="28"/>
-        </w:rPr>
-        <w:t xml:space="preserve"> نکته حقوقیِ مشترکِ این سه مورد: آمریکا در هر سه، به «سازوکارِ پیش‌بینی‌شده در خودِ سند» (حقِ خروج با اطلاعِ قبلی) استناد کرد ـ یعنی عدولش را در قالبِ «اعمالِ حقِ مندرج» (صورتِ اولِ طیفِ من: سبز) ریخت، نه نقضِ یک‌جانبه. درسش برای ما همان است که بارها گفتم: اگر هنگامِ انعقاد، شرطِ خروج و بازنگری در متن بگنجانی، روزِ عدول، «ناقض» نیستی، «صاحبِ حق» هستی. آمریکا ـ با همه انتقادهایی که به سیاستش وارد است ـ از نظرِ «تکنیکِ حقوقی» درست عمل کرد؛ و ما باید همین تکنیک را بیاموزیم و به کار ببریم، بی‌آن‌که سیاستش را تأیید کنیم. آموختنِ فن از دشمن، نه تأییدِ دشمن است نه تقلید از او؛ بلکه همان است که امیرالمؤمنین فرمود حکمت، گمشده مؤمن است و هرجا بیابدش برمی‌دارد.</w:t>
-      </w:r>
-    </w:p>
-    <w:p>
-      <w:pPr>
-        <w:pStyle w:val="TH-Body"/>
-        <w:widowControl/>
-        <w:bidi w:val="1"/>
-        <w:spacing w:before="0" w:after="120" w:line="288" w:lineRule="auto"/>
-        <w:ind w:firstLine="283"/>
-        <w:jc w:val="both"/>
-      </w:pPr>
-      <w:r>
-        <w:rPr>
-          <w:rFonts w:ascii="B Lotus" w:hAnsi="B Lotus" w:cs="B Lotus" w:eastAsia="B Lotus"/>
-          <w:b w:val="0"/>
-          <w:i w:val="0"/>
-          <w:sz w:val="28"/>
-          <w:szCs w:val="28"/>
-        </w:rPr>
-        <w:t>تجربه دوم، خروجِ دسته‌جمعیِ دولت‌های آفریقایی از دیوان کیفری بین‌المللی در دهه ۲۰۱۰ است: چند دولت آفریقایی ـ به بهانه این‌که دیوان گزینشی و سیاسی عمل می‌کند ـ از اساسنامه رم خارج شدند یا خروج را اعلام کردند.</w:t>
-      </w:r>
-      <w:r>
-        <w:rPr>
-          <w:rFonts w:ascii="B Lotus" w:hAnsi="B Lotus" w:cs="B Lotus" w:eastAsia="B Lotus"/>
-          <w:b w:val="0"/>
-          <w:i w:val="0"/>
-          <w:sz w:val="28"/>
-          <w:szCs w:val="28"/>
-          <w:vertAlign w:val="superscript"/>
-        </w:rPr>
-        <w:footnoteReference w:id="120"/>
-      </w:r>
-      <w:r>
-        <w:rPr>
-          <w:rFonts w:ascii="B Lotus" w:hAnsi="B Lotus" w:cs="B Lotus" w:eastAsia="B Lotus"/>
-          <w:b w:val="0"/>
-          <w:i w:val="0"/>
-          <w:sz w:val="28"/>
-          <w:szCs w:val="28"/>
-        </w:rPr>
-        <w:t xml:space="preserve"> نکته حقوقی‌اش: اساسنامه رم حقِ خروج با اطلاعِ قبلی را پیش‌بینی کرده؛ پس خروج‌ها در چارچوبِ سند بود و از نظرِ حقوقی «موجه» ـ هرچند از نظرِ سیاسی مناقشه‌برانگیز. درسش: حتی در حساس‌ترین حوزه‌ها (عدالت کیفری بین‌المللی) هم سازوکارِ خروجِ قانونی پیش‌بینی می‌شود؛ و همین، نشان می‌دهد که «حقِ خروجِ ضابطه‌مند» اصلی پذیرفته‌شده در حقوق بین‌الملل معاصر است، نه بدعتی که ما اختراع کرده باشیم.</w:t>
-      </w:r>
-    </w:p>
-    <w:p>
-      <w:pPr>
-        <w:pStyle w:val="TH-Body"/>
-        <w:widowControl/>
-        <w:bidi w:val="1"/>
-        <w:spacing w:before="0" w:after="120" w:line="288" w:lineRule="auto"/>
-        <w:ind w:firstLine="283"/>
-        <w:jc w:val="both"/>
-      </w:pPr>
-      <w:r>
-        <w:rPr>
-          <w:rFonts w:ascii="B Lotus" w:hAnsi="B Lotus" w:cs="B Lotus" w:eastAsia="B Lotus"/>
-          <w:b w:val="0"/>
-          <w:i w:val="0"/>
-          <w:sz w:val="28"/>
-          <w:szCs w:val="28"/>
-        </w:rPr>
-        <w:t>تجربه سوم، خروج بریتانیا از اتحادیه اروپا (برگزیت، ۲۰۲۰) است: بریتانیا با استناد به حقِ خروجِ پیش‌بینی‌شده در معاهده لیسبون و پس از همه‌پرسیِ داخلی، از اتحادیه خارج شد ـ فرایندی که سال‌ها مذاکره و توافقِ خروج را در پی داشت.</w:t>
-      </w:r>
-      <w:r>
-        <w:rPr>
-          <w:rFonts w:ascii="B Lotus" w:hAnsi="B Lotus" w:cs="B Lotus" w:eastAsia="B Lotus"/>
-          <w:b w:val="0"/>
-          <w:i w:val="0"/>
-          <w:sz w:val="28"/>
-          <w:szCs w:val="28"/>
-          <w:vertAlign w:val="superscript"/>
-        </w:rPr>
-        <w:footnoteReference w:id="121"/>
       </w:r>
       <w:r>
         <w:rPr>
@@ -12775,7 +12673,7 @@
           <w:sz w:val="28"/>
           <w:szCs w:val="28"/>
         </w:rPr>
-        <w:t>اصل ۵: دلالتش «مبنایی» است: مستقیم در اثبات مرجعیت ولی فقیه، و غیرمستقیم در مسئله خاص معاهدات. این اصل با عبارت «در زمان غیبت ... ولایت امر و امامت امت بر عهده فقیه عادل ... است که طبق اصل یک‌صد و هفتم عهده‌دار آن می‌گردد»،</w:t>
+        <w:t>اصل ۵: دلالتش «مبنایی» است: مستقیم در اثبات مرجعیت ولی فقیه، و غیرمستقیم در مسئله خاص معاهدات. این اصل با عبارت «در زمان غیبت … ولایت امر و امامت امت بر عهده فقیه عادل … است که طبق اصل یک‌صد و هفتم عهده‌دار آن می‌گردد»،</w:t>
       </w:r>
       <w:r>
         <w:rPr>
@@ -12786,7 +12684,7 @@
           <w:szCs w:val="28"/>
           <w:vertAlign w:val="superscript"/>
         </w:rPr>
-        <w:footnoteReference w:id="122"/>
+        <w:footnoteReference w:id="120"/>
       </w:r>
       <w:r>
         <w:rPr>
@@ -12816,7 +12714,7 @@
           <w:sz w:val="28"/>
           <w:szCs w:val="28"/>
         </w:rPr>
-        <w:t>اصل ۵۷: دلالتش هم «مبنایی و غیرمستقیم» است. با عبارت «زیر نظر ولایت مطلقه امر و امامت امت»، مرجعیت نهایی ولی فقیه بر همه قوا ـ از جمله مقننه (تصویب‌کننده معاهده) و مجریه (اجرا‌کننده آن) ـ را تثبیت می‌کند. ولی «شیوه اعمال» این مرجعیت در حوزه خاص معاهدات را نمی‌گوید؛ و قید «بر طبق اصول آینده این قانون» هم ـ چنان‌که در بند بعد می‌آید ـ محل مناقشه است. پس اصل ۵۷ اثبات‌کننده «اصلِ مرجعیت» است، ولی تعیین‌کننده «صورتِ اعمال» نیست.</w:t>
+        <w:t>اصل ۵۷: دلالتش هم «مبنایی و غیرمستقیم» است. با عبارت «زیر نظر ولایت مطلقه امر و امامت امت»، مرجعیت نهایی ولی فقیه بر همه قوا ـ از جمله مقننه (تصویب‌کننده معاهده) و مجریه (اجرا‌کننده آن) ـ را تثبیت می‌کند. ولی «شیوه اعمال» این مرجعیت در حوزه خاص معاهدات را نمی‌گوید؛ و قید «بر طبق اصول آینده این قانون» هم ـ چنان‌که در ادامه همین گفتار می‌آید ـ محل مناقشه است. پس اصل ۵۷ اثبات‌کننده «اصلِ مرجعیت» است، ولی تعیین‌کننده «صورتِ اعمال» نیست.</w:t>
       </w:r>
     </w:p>
     <w:p>
@@ -12967,89 +12865,89 @@
           <w:szCs w:val="28"/>
           <w:vertAlign w:val="superscript"/>
         </w:rPr>
+        <w:footnoteReference w:id="121"/>
+      </w:r>
+      <w:r>
+        <w:rPr>
+          <w:rFonts w:ascii="B Lotus" w:hAnsi="B Lotus" w:cs="B Lotus" w:eastAsia="B Lotus"/>
+          <w:b w:val="0"/>
+          <w:i w:val="0"/>
+          <w:sz w:val="28"/>
+          <w:szCs w:val="28"/>
+        </w:rPr>
+        <w:t xml:space="preserve"> اهمیتش برای مسئله من در این است که نشان می‌دهد رهبری در نظام ما، مقامی «نهادی و قانونی» است، نه شخصی و فراقانونی: کسی رهبر است که خبرگان ـ بر اساس قانون ـ او را شناخته و برگزیده باشند. پس تصمیمِ مورد بحث این رساله، تصمیمِ «مقام قانونیِ رهبری» است، نه تصمیمِ «شخصِ» رهبر؛ و همین نهادی بودن است که به آن وجاهت حقوقی می‌دهد و آن را از تصمیمِ شخصیِ مستبد متمایز می‌کند.</w:t>
+      </w:r>
+    </w:p>
+    <w:p>
+      <w:pPr>
+        <w:pStyle w:val="TH-Body"/>
+        <w:widowControl/>
+        <w:bidi w:val="1"/>
+        <w:spacing w:before="0" w:after="120" w:line="288" w:lineRule="auto"/>
+        <w:ind w:firstLine="283"/>
+        <w:jc w:val="both"/>
+      </w:pPr>
+      <w:r>
+        <w:rPr>
+          <w:rFonts w:ascii="B Lotus" w:hAnsi="B Lotus" w:cs="B Lotus" w:eastAsia="B Lotus"/>
+          <w:b w:val="0"/>
+          <w:i w:val="0"/>
+          <w:sz w:val="28"/>
+          <w:szCs w:val="28"/>
+        </w:rPr>
+        <w:t>اصل ۱۰۹، «شرایط» رهبری را برمی‌شمرد: صلاحیت علمی (فقاهت) و تقوا و بینش سیاسی و اجتماعی و شجاعت و مدیریت و قدرت کافی برای رهبری.</w:t>
+      </w:r>
+      <w:r>
+        <w:rPr>
+          <w:rFonts w:ascii="B Lotus" w:hAnsi="B Lotus" w:cs="B Lotus" w:eastAsia="B Lotus"/>
+          <w:b w:val="0"/>
+          <w:i w:val="0"/>
+          <w:sz w:val="28"/>
+          <w:szCs w:val="28"/>
+          <w:vertAlign w:val="superscript"/>
+        </w:rPr>
+        <w:footnoteReference w:id="122"/>
+      </w:r>
+      <w:r>
+        <w:rPr>
+          <w:rFonts w:ascii="B Lotus" w:hAnsi="B Lotus" w:cs="B Lotus" w:eastAsia="B Lotus"/>
+          <w:b w:val="0"/>
+          <w:i w:val="0"/>
+          <w:sz w:val="28"/>
+          <w:szCs w:val="28"/>
+        </w:rPr>
+        <w:t xml:space="preserve"> نسبتش با مسئله من مستقیم است: تصمیم درباره سرنوشت معاهده بین‌المللی ـ که هم بُعد فقهی دارد (جواز شرعی) هم بُعد سیاسی (آثار بین‌المللی) هم بُعد مدیریتی (اجرا) ـ دقیقاً همان جنس تصمیمی است که این شرایط برایش پیش‌بینی شده. به زبان دیگر: قانون‌گذار اساسی، رهبری را برای چنین تصمیم‌هایی «طراحی» کرده؛ و اگر قرار باشد کسی درباره عدول از تعهد بین‌المللی تصمیم بگیرد، شایسته‌ترین کس ـ به حکم همین اصل ـ کسی است که واجد این شرایط باشد. این، دلیل دیگری است بر مرجعیت ولی فقیه در مسئله ما؛ دلیلی از درونِ خودِ قانون اساسی.</w:t>
+      </w:r>
+    </w:p>
+    <w:p>
+      <w:pPr>
+        <w:pStyle w:val="TH-Body"/>
+        <w:widowControl/>
+        <w:bidi w:val="1"/>
+        <w:spacing w:before="0" w:after="120" w:line="288" w:lineRule="auto"/>
+        <w:ind w:firstLine="283"/>
+        <w:jc w:val="both"/>
+      </w:pPr>
+      <w:r>
+        <w:rPr>
+          <w:rFonts w:ascii="B Lotus" w:hAnsi="B Lotus" w:cs="B Lotus" w:eastAsia="B Lotus"/>
+          <w:b w:val="0"/>
+          <w:i w:val="0"/>
+          <w:sz w:val="28"/>
+          <w:szCs w:val="28"/>
+        </w:rPr>
+        <w:t>و اصل ۱۱۱، «نظارت» بر رهبری را پیش‌بینی می‌کند: هرگاه رهبر از انجام وظایف قانونی خود ناتوان شود یا فاقد شرایط شود، از مقامش برکنار می‌شود؛ و تشخیص این امر با خبرگان است.</w:t>
+      </w:r>
+      <w:r>
+        <w:rPr>
+          <w:rFonts w:ascii="B Lotus" w:hAnsi="B Lotus" w:cs="B Lotus" w:eastAsia="B Lotus"/>
+          <w:b w:val="0"/>
+          <w:i w:val="0"/>
+          <w:sz w:val="28"/>
+          <w:szCs w:val="28"/>
+          <w:vertAlign w:val="superscript"/>
+        </w:rPr>
         <w:footnoteReference w:id="123"/>
-      </w:r>
-      <w:r>
-        <w:rPr>
-          <w:rFonts w:ascii="B Lotus" w:hAnsi="B Lotus" w:cs="B Lotus" w:eastAsia="B Lotus"/>
-          <w:b w:val="0"/>
-          <w:i w:val="0"/>
-          <w:sz w:val="28"/>
-          <w:szCs w:val="28"/>
-        </w:rPr>
-        <w:t xml:space="preserve"> اهمیتش برای مسئله من در این است که نشان می‌دهد رهبری در نظام ما، مقامی «نهادی و قانونی» است، نه شخصی و فراقانونی: کسی رهبر است که خبرگان ـ بر اساس قانون ـ او را شناخته و برگزیده باشند. پس تصمیمِ مورد بحث این رساله، تصمیمِ «مقام قانونیِ رهبری» است، نه تصمیمِ «شخصِ» رهبر؛ و همین نهادی بودن است که به آن وجاهت حقوقی می‌دهد و آن را از تصمیمِ شخصیِ مستبد متمایز می‌کند.</w:t>
-      </w:r>
-    </w:p>
-    <w:p>
-      <w:pPr>
-        <w:pStyle w:val="TH-Body"/>
-        <w:widowControl/>
-        <w:bidi w:val="1"/>
-        <w:spacing w:before="0" w:after="120" w:line="288" w:lineRule="auto"/>
-        <w:ind w:firstLine="283"/>
-        <w:jc w:val="both"/>
-      </w:pPr>
-      <w:r>
-        <w:rPr>
-          <w:rFonts w:ascii="B Lotus" w:hAnsi="B Lotus" w:cs="B Lotus" w:eastAsia="B Lotus"/>
-          <w:b w:val="0"/>
-          <w:i w:val="0"/>
-          <w:sz w:val="28"/>
-          <w:szCs w:val="28"/>
-        </w:rPr>
-        <w:t>اصل ۱۰۹، «شرایط» رهبری را برمی‌شمرد: صلاحیت علمی (فقاهت) و تقوا و بینش سیاسی و اجتماعی و شجاعت و مدیریت و قدرت کافی برای رهبری.</w:t>
-      </w:r>
-      <w:r>
-        <w:rPr>
-          <w:rFonts w:ascii="B Lotus" w:hAnsi="B Lotus" w:cs="B Lotus" w:eastAsia="B Lotus"/>
-          <w:b w:val="0"/>
-          <w:i w:val="0"/>
-          <w:sz w:val="28"/>
-          <w:szCs w:val="28"/>
-          <w:vertAlign w:val="superscript"/>
-        </w:rPr>
-        <w:footnoteReference w:id="124"/>
-      </w:r>
-      <w:r>
-        <w:rPr>
-          <w:rFonts w:ascii="B Lotus" w:hAnsi="B Lotus" w:cs="B Lotus" w:eastAsia="B Lotus"/>
-          <w:b w:val="0"/>
-          <w:i w:val="0"/>
-          <w:sz w:val="28"/>
-          <w:szCs w:val="28"/>
-        </w:rPr>
-        <w:t xml:space="preserve"> نسبتش با مسئله من مستقیم است: تصمیم درباره سرنوشت معاهده بین‌المللی ـ که هم بُعد فقهی دارد (جواز شرعی) هم بُعد سیاسی (آثار بین‌المللی) هم بُعد مدیریتی (اجرا) ـ دقیقاً همان جنس تصمیمی است که این شرایط برایش پیش‌بینی شده. به زبان دیگر: قانون‌گذار اساسی، رهبری را برای چنین تصمیم‌هایی «طراحی» کرده؛ و اگر قرار باشد کسی درباره عدول از تعهد بین‌المللی تصمیم بگیرد، شایسته‌ترین کس ـ به حکم همین اصل ـ کسی است که واجد این شرایط باشد. این، دلیل دیگری است بر مرجعیت ولی فقیه در مسئله ما؛ دلیلی از درونِ خودِ قانون اساسی.</w:t>
-      </w:r>
-    </w:p>
-    <w:p>
-      <w:pPr>
-        <w:pStyle w:val="TH-Body"/>
-        <w:widowControl/>
-        <w:bidi w:val="1"/>
-        <w:spacing w:before="0" w:after="120" w:line="288" w:lineRule="auto"/>
-        <w:ind w:firstLine="283"/>
-        <w:jc w:val="both"/>
-      </w:pPr>
-      <w:r>
-        <w:rPr>
-          <w:rFonts w:ascii="B Lotus" w:hAnsi="B Lotus" w:cs="B Lotus" w:eastAsia="B Lotus"/>
-          <w:b w:val="0"/>
-          <w:i w:val="0"/>
-          <w:sz w:val="28"/>
-          <w:szCs w:val="28"/>
-        </w:rPr>
-        <w:t>و اصل ۱۱۱، «نظارت» بر رهبری را پیش‌بینی می‌کند: هرگاه رهبر از انجام وظایف قانونی خود ناتوان شود یا فاقد شرایط شود، از مقامش برکنار می‌شود؛ و تشخیص این امر با خبرگان است.</w:t>
-      </w:r>
-      <w:r>
-        <w:rPr>
-          <w:rFonts w:ascii="B Lotus" w:hAnsi="B Lotus" w:cs="B Lotus" w:eastAsia="B Lotus"/>
-          <w:b w:val="0"/>
-          <w:i w:val="0"/>
-          <w:sz w:val="28"/>
-          <w:szCs w:val="28"/>
-          <w:vertAlign w:val="superscript"/>
-        </w:rPr>
-        <w:footnoteReference w:id="125"/>
       </w:r>
       <w:r>
         <w:rPr>
@@ -13139,7 +13037,7 @@
           <w:sz w:val="28"/>
           <w:szCs w:val="28"/>
         </w:rPr>
-        <w:t>سازوکارِ این بند ـ چنان‌که در عملِ نظام شکل گرفته ـ سه‌مرحله‌ای است: مجمع تشخیص مصلحت نظام، پیش‌نویسِ سیاست‌ها را کارشناسی می‌کند؛ رهبری آن‌ها را بررسی و ابلاغ می‌کند؛ و قوا موظف به اجرا و رعایت‌اند. نمونه‌های ابلاغی‌اش هم فراوان است: سیاست‌های کلیِ اقتصاد مقاومتی، امنیت ملی، برنامه‌های توسعه، و...</w:t>
+        <w:t>سازوکارِ این بند ـ چنان‌که در عملِ نظام شکل گرفته ـ سه‌مرحله‌ای است: مجمع تشخیص مصلحت نظام، پیش‌نویسِ سیاست‌ها را کارشناسی می‌کند؛ رهبری آن‌ها را بررسی و ابلاغ می‌کند؛ و قوا موظف به اجرا و رعایت‌اند. نمونه‌های ابلاغی‌اش هم فراوان است: سیاست‌های کلیِ اقتصاد مقاومتی، امنیت ملی، برنامه‌های توسعه، و…</w:t>
       </w:r>
       <w:r>
         <w:rPr>
@@ -13150,7 +13048,7 @@
           <w:szCs w:val="28"/>
           <w:vertAlign w:val="superscript"/>
         </w:rPr>
-        <w:footnoteReference w:id="126"/>
+        <w:footnoteReference w:id="124"/>
       </w:r>
       <w:r>
         <w:rPr>
@@ -13251,7 +13149,7 @@
           <w:szCs w:val="28"/>
           <w:vertAlign w:val="superscript"/>
         </w:rPr>
-        <w:footnoteReference w:id="127"/>
+        <w:footnoteReference w:id="125"/>
       </w:r>
     </w:p>
     <w:p>
@@ -13539,7 +13437,7 @@
           <w:sz w:val="28"/>
           <w:szCs w:val="28"/>
         </w:rPr>
-        <w:t>قاعده اولی و اصل اولیه در تعهدات بین‌المللی دولت اسلامی، «وجوب وفا»ست؛ و این وجوب را در فصل سوم با پنج آیه عام (مائده/۱، نحل/۹۱ـ۹۲، اسراء/۳۴، رعد/۲۰ـ۲۵ و مؤمنون/۸) و آیات خاص جهاد (توبه/۴ و ۷، انفال/۵۸ و ۷۲) و روایات متعدد (به‌ویژه حدیث شروط و عهدنامه مالک) و سیره پیامبر و امیرالمؤمنین (حدیبیه، برائت، صفین) و دلیل عقل و بنای عقلا اثبات کردم. این قاعده «مسلّم» است و در اصلش میان فقهای ما اختلافی نیست؛ اختلاف ـ اگر باشد ـ در استثناها و مرزهاست، نه در خودِ قاعده. هرکس بخواهد از این قاعده بیرون برود، بار اثبات با اوست؛ و این رساله دقیقاً همین بار را بر دوش کشید و نشان داد چه وقت و با چه شرایطی می‌شود بیرون رفت ـ و چه وقت نمی‌شود.</w:t>
+        <w:t>قاعده اولی و اصل اولیه در تعهدات بین‌المللی دولت اسلامی، «وجوب وفا»ست؛ و این وجوب را در فصل سوم با پنج آیه عام (مائده/۱، نحل/۹۱ـ۹۲، اسراء/۳۴، رعد/۲۰ـ۲۵ و مؤمنون/۸) و آیات خاص جهاد (توبه/۴ و ۷، انفال/۵۸ و ۷۲) و روایات متعدد (به‌ویژه حدیث شروط و عهدنامه مالک) و سیره پیامبر و امیرالمؤمنین (حدیبیه، برائت، صفین) و دلیل عقل و بنای عقلا و قواعد فقهی مؤید (لزوم، حرمت غدر، نفی سبیل) و واژه‌شناسی قرآنی (عهد، عقد، میثاق) اثبات کردم. این قاعده «مسلّم» است و در اصلش میان فقهای ما اختلافی نیست؛ اختلاف ـ اگر باشد ـ در استثناها و مرزهاست، نه در خودِ قاعده. هرکس بخواهد از این قاعده بیرون برود، بار اثبات با اوست؛ و این رساله دقیقاً همین بار را بر دوش کشید و نشان داد چه وقت و با چه شرایطی می‌شود بیرون رفت ـ و چه وقت نمی‌شود.</w:t>
       </w:r>
     </w:p>
     <w:p>
@@ -13919,7 +13817,7 @@
           <w:sz w:val="28"/>
           <w:szCs w:val="28"/>
         </w:rPr>
-        <w:t>سؤالِ فرعیِ ششم (سیره): از حدیبیه (وفای صبورانه) و برائت (عدولِ واکنشیِ اعلام‌شده) و میثاقِ مدینه و نجران و صلحِ امام حسن (مصلحت‌سنجیِ حکومتی در بزرگ‌ترین مقیاس) سه الگو درمی‌آید که عیناً منطبق بر طیفِ پنج‌گانه و ضوابطِ هشت‌گانه من‌اند ـ نشانی بر این‌که چارچوبم ریشه در عملِ معصومان دارد.</w:t>
+        <w:t>سؤالِ فرعیِ ششم (سیره): از حدیبیه (وفای صبورانه) و برائت (عدولِ واکنشیِ اعلام‌شده) و میثاقِ مدینه و نجران و صلحِ امام حسن (مصلحت‌سنجیِ حکومتی در بزرگ‌ترین مقیاس) سه الگو درمی‌آید که عیناً منطبق بر طیفِ پنج‌صورت و ضوابطِ هشت‌گانه من‌اند ـ نشانی بر این‌که چارچوبم ریشه در عملِ معصومان دارد.</w:t>
       </w:r>
     </w:p>
     <w:p>
@@ -14647,7 +14545,7 @@
           <w:sz w:val="28"/>
           <w:szCs w:val="28"/>
         </w:rPr>
-        <w:t>منتظری، حسینعلی، شئون و اختیارات ولایت فقیه (ترجمه فارسی محمود صلواتی)، تهران، نشر... (نیازمند بررسی منبع اصلی است).</w:t>
+        <w:t>منتظری، حسینعلی، شئون و اختیارات ولایت فقیه (ترجمه فارسی محمود صلواتی)، تهران، نشر… (نیازمند بررسی منبع اصلی است).</w:t>
       </w:r>
     </w:p>
     <w:p>
@@ -14707,7 +14605,7 @@
           <w:sz w:val="28"/>
           <w:szCs w:val="28"/>
         </w:rPr>
-        <w:t>آیت‌الله خامنه‌ای، سیدعلی، اجوبة الاستفتائات (پاسخ به استفتائات)، تهران، انتشارات... (نیازمند بررسی منبع اصلی است).</w:t>
+        <w:t>آیت‌الله خامنه‌ای، سیدعلی، اجوبة الاستفتائات (پاسخ به استفتائات)، تهران، انتشارات… (نیازمند بررسی منبع اصلی است).</w:t>
       </w:r>
     </w:p>
     <w:p>
@@ -15127,7 +15025,7 @@
           <w:sz w:val="28"/>
           <w:szCs w:val="28"/>
         </w:rPr>
-        <w:t>صفری، محسن، حقوق بین‌الملل عمومی، تهران، انتشارات... (نیازمند بررسی منبع اصلی است).</w:t>
+        <w:t>صفری، محسن، حقوق بین‌الملل عمومی، تهران، انتشارات… (نیازمند بررسی منبع اصلی است).</w:t>
       </w:r>
     </w:p>
     <w:p>
@@ -15187,7 +15085,7 @@
           <w:sz w:val="28"/>
           <w:szCs w:val="28"/>
         </w:rPr>
-        <w:t>مقاله «قراردادهای بین‌المللی در اسلام»، پایگاه انسان‌شناسی و فرهنگ... (نشانی دقیق، نیازمند بررسی منبع اصلی است).</w:t>
+        <w:t>مقاله «قراردادهای بین‌المللی در اسلام»، پایگاه انسان‌شناسی و فرهنگ… (نشانی دقیق، نیازمند بررسی منبع اصلی است).</w:t>
       </w:r>
     </w:p>
     <w:p>
@@ -15475,7 +15373,7 @@
           <w:sz w:val="28"/>
           <w:szCs w:val="28"/>
         </w:rPr>
-        <w:t>آن‌چه در ادامه می‌آید پنج پیوست تکمیلی است: ابزارهایی عملی و متن‌هایی مرجع که خواننده ـ به‌ویژه تصمیم‌گیر و مشاور ـ می‌تواند مستقل از متن رساله هم از آن‌ها استفاده کند. پیوست اول چک‌لیست تصمیم است (خلاصه عملیاتی کل رساله)؛ پیوست دوم متن اصول قانون اساسی؛ پیوست سوم متن مواد کلیدی وین؛ پیوست چهارم گاه‌شمار؛ و پیوست پنجم واژه‌نامه. توصیه‌ام این است که تصمیم‌گیر، پیوست اول را چاپ کند و روی میزش نگه دارد؛ چون در لحظه تصمیم، فرصت ورق زدنِ کل رساله نیست.</w:t>
+        <w:t>آن‌چه در ادامه می‌آید شش پیوست تکمیلی است: ابزارهایی عملی و متن‌هایی مرجع که خواننده ـ به‌ویژه تصمیم‌گیر و مشاور ـ می‌تواند مستقل از متن رساله هم از آن‌ها استفاده کند. پیوست اول چک‌لیست تصمیم است (خلاصه عملیاتی کل رساله)؛ پیوست دوم متن اصول قانون اساسی؛ پیوست سوم متن مواد کلیدی وین؛ پیوست چهارم گاه‌شمار؛ پیوست پنجم گزیده عهدنامه مالک اشتر؛ و پیوست ششم واژه‌نامه. توصیه‌ام این است که تصمیم‌گیر، پیوست اول را چاپ کند و روی میزش نگه دارد؛ چون در لحظه تصمیم، فرصت ورق زدنِ کل رساله نیست.</w:t>
       </w:r>
     </w:p>
     <w:p>
@@ -15726,6 +15624,68 @@
           <w:szCs w:val="28"/>
           <w:vertAlign w:val="superscript"/>
         </w:rPr>
+        <w:footnoteReference w:id="126"/>
+      </w:r>
+    </w:p>
+    <w:p>
+      <w:pPr>
+        <w:pStyle w:val="TH-Body"/>
+        <w:widowControl/>
+        <w:bidi w:val="1"/>
+        <w:spacing w:before="0" w:after="120" w:line="288" w:lineRule="auto"/>
+        <w:ind w:firstLine="283"/>
+        <w:jc w:val="both"/>
+      </w:pPr>
+      <w:r>
+        <w:rPr>
+          <w:rFonts w:ascii="B Lotus" w:hAnsi="B Lotus" w:cs="B Lotus" w:eastAsia="B Lotus"/>
+          <w:b w:val="0"/>
+          <w:i w:val="0"/>
+          <w:sz w:val="28"/>
+          <w:szCs w:val="28"/>
+        </w:rPr>
+        <w:t>اصل ۵۷ (صدر): «قوای حاکم در جمهوری اسلامی ایران عبارتند از: قوه مقننه، قوه مجریه و قوه قضائیه که زیر نظر ولایت مطلقه امر و امامت امت بر طبق اصول آینده این قانون اعمال می‌گردند…»</w:t>
+      </w:r>
+      <w:r>
+        <w:rPr>
+          <w:rFonts w:ascii="B Lotus" w:hAnsi="B Lotus" w:cs="B Lotus" w:eastAsia="B Lotus"/>
+          <w:b w:val="0"/>
+          <w:i w:val="0"/>
+          <w:sz w:val="28"/>
+          <w:szCs w:val="28"/>
+          <w:vertAlign w:val="superscript"/>
+        </w:rPr>
+        <w:footnoteReference w:id="127"/>
+      </w:r>
+    </w:p>
+    <w:p>
+      <w:pPr>
+        <w:pStyle w:val="TH-Body"/>
+        <w:widowControl/>
+        <w:bidi w:val="1"/>
+        <w:spacing w:before="0" w:after="120" w:line="288" w:lineRule="auto"/>
+        <w:ind w:firstLine="283"/>
+        <w:jc w:val="both"/>
+      </w:pPr>
+      <w:r>
+        <w:rPr>
+          <w:rFonts w:ascii="B Lotus" w:hAnsi="B Lotus" w:cs="B Lotus" w:eastAsia="B Lotus"/>
+          <w:b w:val="0"/>
+          <w:i w:val="0"/>
+          <w:sz w:val="28"/>
+          <w:szCs w:val="28"/>
+        </w:rPr>
+        <w:t>اصل ۷۷: «عهدنامه‌ها، مقاوله‌نامه‌ها، قراردادها و موافقت‌نامه‌های بین‌المللی باید به تصویب مجلس شورای اسلامی برسد.»</w:t>
+      </w:r>
+      <w:r>
+        <w:rPr>
+          <w:rFonts w:ascii="B Lotus" w:hAnsi="B Lotus" w:cs="B Lotus" w:eastAsia="B Lotus"/>
+          <w:b w:val="0"/>
+          <w:i w:val="0"/>
+          <w:sz w:val="28"/>
+          <w:szCs w:val="28"/>
+          <w:vertAlign w:val="superscript"/>
+        </w:rPr>
         <w:footnoteReference w:id="128"/>
       </w:r>
     </w:p>
@@ -15746,7 +15706,7 @@
           <w:sz w:val="28"/>
           <w:szCs w:val="28"/>
         </w:rPr>
-        <w:t>اصل ۵۷ (صدر): «قوای حاکم در جمهوری اسلامی ایران عبارتند از: قوه مقننه، قوه مجریه و قوه قضائیه که زیر نظر ولایت مطلقه امر و امامت امت بر طبق اصول آینده این قانون اعمال می‌گردند...»</w:t>
+        <w:t>اصل ۱۱۰: وظایف و اختیارات رهبری در یازده بند: تعیین سیاست‌های کلی نظام؛ نظارت بر حسن اجرای آن‌ها؛ فرمان همه‌پرسی؛ فرماندهی کل نیروهای مسلح؛ اعلان جنگ و صلح و بسیج نیروها؛ نصب و عزل و قبول استعفای مقامات عالی (فقها، رئیس قوه قضائیه، رئیس صداوسیما، رئیس ستاد مشترک، فرمانده کل سپاه و فرماندهان عالی نیروهای نظامی و انتظامی)؛ حل اختلاف و تنظیم روابط قوای سه‌گانه؛ حل معضلات نظام که از طرق عادی قابل حل نیست از طریق مجمع تشخیص مصلحت نظام؛ امضای حکم ریاست جمهوری پس از انتخاب مردم؛ عزل رئیس‌جمهور با در نظر گرفتن مصالح کشور پس از رأی دیوان عالی کشور به تخلف وی از وظایف قانونی یا رأی مجلس به عدم کفایت وی؛ و عفو یا تخفیف مجازات محکومین در حدود موازین اسلامی پس از پیشنهاد رئیس قوه قضائیه.</w:t>
       </w:r>
       <w:r>
         <w:rPr>
@@ -15777,7 +15737,7 @@
           <w:sz w:val="28"/>
           <w:szCs w:val="28"/>
         </w:rPr>
-        <w:t>اصل ۷۷: «عهدنامه‌ها، مقاوله‌نامه‌ها، قراردادها و موافقت‌نامه‌های بین‌المللی باید به تصویب مجلس شورای اسلامی برسد.»</w:t>
+        <w:t>اصل ۱۱۲ (صدر): «مجمع تشخیص مصلحت نظام برای تشخیص مصلحت در مواردی که نظر مجلس شورای اسلامی را شورای نگهبان خلاف موازین شرع و یا قانون اساسی بداند و مجلس با در نظر گرفتن مصلحت نظام نظر شورای نگهبان را تامین نکند و مشاوره در اموری که رهبری به آنان ارجاع می‌دهد و سایر وظایفی که در این قانون ذکر شده است به دستور رهبری تشکیل می‌شود…»</w:t>
       </w:r>
       <w:r>
         <w:rPr>
@@ -15808,7 +15768,7 @@
           <w:sz w:val="28"/>
           <w:szCs w:val="28"/>
         </w:rPr>
-        <w:t>اصل ۱۱۰: وظایف و اختیارات رهبری در یازده بند: تعیین سیاست‌های کلی نظام؛ نظارت بر حسن اجرای آن‌ها؛ فرمان همه‌پرسی؛ فرماندهی کل نیروهای مسلح؛ اعلان جنگ و صلح و بسیج نیروها؛ نصب و عزل و قبول استعفای مقامات عالی (فقها، رئیس قوه قضائیه، رئیس صداوسیما، رئیس ستاد مشترک، فرمانده کل سپاه و فرماندهان عالی نیروهای نظامی و انتظامی)؛ حل اختلاف و تنظیم روابط قوای سه‌گانه؛ حل معضلات نظام که از طرق عادی قابل حل نیست از طریق مجمع تشخیص مصلحت نظام؛ امضای حکم ریاست جمهوری پس از انتخاب مردم؛ عزل رئیس‌جمهور با در نظر گرفتن مصالح کشور پس از رأی دیوان عالی کشور به تخلف وی از وظایف قانونی یا رأی مجلس به عدم کفایت وی؛ و عفو یا تخفیف مجازات محکومین در حدود موازین اسلامی پس از پیشنهاد رئیس قوه قضائیه.</w:t>
+        <w:t>اصل ۱۲۵: «امضا عهدنامه‌ها، مقاوله‌نامه‌ها، موافقت‌نامه‌ها و قراردادهای دولت ایران با سایر دولت‌ها و همچنین امضا پیمانهای مربوط به اتحادیه‌های بین‌المللی پس از تصویب مجلس شورای اسلامی با رئیس جمهور یا نماینده قانونی اوست.»</w:t>
       </w:r>
       <w:r>
         <w:rPr>
@@ -15839,7 +15799,7 @@
           <w:sz w:val="28"/>
           <w:szCs w:val="28"/>
         </w:rPr>
-        <w:t>اصل ۱۱۲ (صدر): «مجمع تشخیص مصلحت نظام برای تشخیص مصلحت در مواردی که نظر مجلس شورای اسلامی را شورای نگهبان خلاف موازین شرع و یا قانون اساسی بداند و مجلس با در نظر گرفتن مصلحت نظام نظر شورای نگهبان را تامین نکند و مشاوره در اموری که رهبری به آنان ارجاع می‌دهد و سایر وظایفی که در این قانون ذکر شده است به دستور رهبری تشکیل می‌شود...»</w:t>
+        <w:t>اصل ۱۵۲ (صدر): «سیاست خارجی جمهوری اسلامی ایران بر اساس نفی هرگونه سلطه‌جویی و سلطه‌پذیری، حفظ استقلال همه‌جانبه و تمامیت ارضی کشور، دفاع از حقوق همه مسلمانان و عدم تعهد در برابر قدرت‌های سلطه‌گر و روابط صلح‌آمیز متقابل با دول غیرمحارب استوار است.»</w:t>
       </w:r>
       <w:r>
         <w:rPr>
@@ -15870,7 +15830,7 @@
           <w:sz w:val="28"/>
           <w:szCs w:val="28"/>
         </w:rPr>
-        <w:t>اصل ۱۲۵: «امضا عهدنامه‌ها، مقاوله‌نامه‌ها، موافقت‌نامه‌ها و قراردادهای دولت ایران با سایر دولت‌ها و همچنین امضا پیمانهای مربوط به اتحادیه‌های بین‌المللی پس از تصویب مجلس شورای اسلامی با رئیس جمهور یا نماینده قانونی اوست.»</w:t>
+        <w:t>اصل ۱۵۳: «هرگونه قرارداد که موجب سلطه بیگانه بر منابع طبیعی و اقتصادی، فرهنگ، ارتش و دیگر شئون کشور گردد، ممنوع است.»</w:t>
       </w:r>
       <w:r>
         <w:rPr>
@@ -15901,7 +15861,7 @@
           <w:sz w:val="28"/>
           <w:szCs w:val="28"/>
         </w:rPr>
-        <w:t>اصل ۱۵۲ (صدر): «سیاست خارجی جمهوری اسلامی ایران بر اساس نفی هرگونه سلطه‌جویی و سلطه‌پذیری، حفظ استقلال همه‌جانبه و تمامیت ارضی کشور، دفاع از حقوق همه مسلمانان و عدم تعهد در برابر قدرت‌های سلطه‌گر و روابط صلح‌آمیز متقابل با دول غیرمحارب استوار است.»</w:t>
+        <w:t>اصل ۱۵۴ (صدر): «جمهوری اسلامی ایران سعادت انسان در کل جامعه بشری را آرمان خود می‌داند و استقلال و آزادی و حکومت حق و عدل را حق همه مردم جهان می‌شناسد…»</w:t>
       </w:r>
       <w:r>
         <w:rPr>
@@ -15932,7 +15892,7 @@
           <w:sz w:val="28"/>
           <w:szCs w:val="28"/>
         </w:rPr>
-        <w:t>اصل ۱۵۳: «هرگونه قرارداد که موجب سلطه بیگانه بر منابع طبیعی و اقتصادی، فرهنگ، ارتش و دیگر شئون کشور گردد، ممنوع است.»</w:t>
+        <w:t>اصل ۱۷۶ (مربوط به شورای عالی امنیت ملی): ترکیب و وظایف شورا در سیاست‌گذاری دفاعی ـ امنیتی و هماهنگی فعالیت‌ها در چارچوب سیاست‌های کلی نظام.</w:t>
       </w:r>
       <w:r>
         <w:rPr>
@@ -15944,68 +15904,6 @@
           <w:vertAlign w:val="superscript"/>
         </w:rPr>
         <w:footnoteReference w:id="135"/>
-      </w:r>
-    </w:p>
-    <w:p>
-      <w:pPr>
-        <w:pStyle w:val="TH-Body"/>
-        <w:widowControl/>
-        <w:bidi w:val="1"/>
-        <w:spacing w:before="0" w:after="120" w:line="288" w:lineRule="auto"/>
-        <w:ind w:firstLine="283"/>
-        <w:jc w:val="both"/>
-      </w:pPr>
-      <w:r>
-        <w:rPr>
-          <w:rFonts w:ascii="B Lotus" w:hAnsi="B Lotus" w:cs="B Lotus" w:eastAsia="B Lotus"/>
-          <w:b w:val="0"/>
-          <w:i w:val="0"/>
-          <w:sz w:val="28"/>
-          <w:szCs w:val="28"/>
-        </w:rPr>
-        <w:t>اصل ۱۵۴ (صدر): «جمهوری اسلامی ایران سعادت انسان در کل جامعه بشری را آرمان خود می‌داند و استقلال و آزادی و حکومت حق و عدل را حق همه مردم جهان می‌شناسد...»</w:t>
-      </w:r>
-      <w:r>
-        <w:rPr>
-          <w:rFonts w:ascii="B Lotus" w:hAnsi="B Lotus" w:cs="B Lotus" w:eastAsia="B Lotus"/>
-          <w:b w:val="0"/>
-          <w:i w:val="0"/>
-          <w:sz w:val="28"/>
-          <w:szCs w:val="28"/>
-          <w:vertAlign w:val="superscript"/>
-        </w:rPr>
-        <w:footnoteReference w:id="136"/>
-      </w:r>
-    </w:p>
-    <w:p>
-      <w:pPr>
-        <w:pStyle w:val="TH-Body"/>
-        <w:widowControl/>
-        <w:bidi w:val="1"/>
-        <w:spacing w:before="0" w:after="120" w:line="288" w:lineRule="auto"/>
-        <w:ind w:firstLine="283"/>
-        <w:jc w:val="both"/>
-      </w:pPr>
-      <w:r>
-        <w:rPr>
-          <w:rFonts w:ascii="B Lotus" w:hAnsi="B Lotus" w:cs="B Lotus" w:eastAsia="B Lotus"/>
-          <w:b w:val="0"/>
-          <w:i w:val="0"/>
-          <w:sz w:val="28"/>
-          <w:szCs w:val="28"/>
-        </w:rPr>
-        <w:t>اصل ۱۷۶ (مربوط به شورای عالی امنیت ملی): ترکیب و وظایف شورا در سیاست‌گذاری دفاعی ـ امنیتی و هماهنگی فعالیت‌ها در چارچوب سیاست‌های کلی نظام.</w:t>
-      </w:r>
-      <w:r>
-        <w:rPr>
-          <w:rFonts w:ascii="B Lotus" w:hAnsi="B Lotus" w:cs="B Lotus" w:eastAsia="B Lotus"/>
-          <w:b w:val="0"/>
-          <w:i w:val="0"/>
-          <w:sz w:val="28"/>
-          <w:szCs w:val="28"/>
-          <w:vertAlign w:val="superscript"/>
-        </w:rPr>
-        <w:footnoteReference w:id="137"/>
       </w:r>
     </w:p>
     <w:p>
@@ -16056,6 +15954,68 @@
           <w:szCs w:val="28"/>
           <w:vertAlign w:val="superscript"/>
         </w:rPr>
+        <w:footnoteReference w:id="136"/>
+      </w:r>
+    </w:p>
+    <w:p>
+      <w:pPr>
+        <w:pStyle w:val="TH-Body"/>
+        <w:widowControl/>
+        <w:bidi w:val="1"/>
+        <w:spacing w:before="0" w:after="120" w:line="288" w:lineRule="auto"/>
+        <w:ind w:firstLine="283"/>
+        <w:jc w:val="both"/>
+      </w:pPr>
+      <w:r>
+        <w:rPr>
+          <w:rFonts w:ascii="B Lotus" w:hAnsi="B Lotus" w:cs="B Lotus" w:eastAsia="B Lotus"/>
+          <w:b w:val="0"/>
+          <w:i w:val="0"/>
+          <w:sz w:val="28"/>
+          <w:szCs w:val="28"/>
+        </w:rPr>
+        <w:t>ماده ۲ (تعاریف): معاهده یعنی توافق بین‌المللیِ کتبیِ میان دولت‌ها که تابع حقوق بین‌الملل باشد، خواه در سندی واحد خواه در چند سند مرتبط، و با هر عنوانی.</w:t>
+      </w:r>
+      <w:r>
+        <w:rPr>
+          <w:rFonts w:ascii="B Lotus" w:hAnsi="B Lotus" w:cs="B Lotus" w:eastAsia="B Lotus"/>
+          <w:b w:val="0"/>
+          <w:i w:val="0"/>
+          <w:sz w:val="28"/>
+          <w:szCs w:val="28"/>
+          <w:vertAlign w:val="superscript"/>
+        </w:rPr>
+        <w:footnoteReference w:id="137"/>
+      </w:r>
+    </w:p>
+    <w:p>
+      <w:pPr>
+        <w:pStyle w:val="TH-Body"/>
+        <w:widowControl/>
+        <w:bidi w:val="1"/>
+        <w:spacing w:before="0" w:after="120" w:line="288" w:lineRule="auto"/>
+        <w:ind w:firstLine="283"/>
+        <w:jc w:val="both"/>
+      </w:pPr>
+      <w:r>
+        <w:rPr>
+          <w:rFonts w:ascii="B Lotus" w:hAnsi="B Lotus" w:cs="B Lotus" w:eastAsia="B Lotus"/>
+          <w:b w:val="0"/>
+          <w:i w:val="0"/>
+          <w:sz w:val="28"/>
+          <w:szCs w:val="28"/>
+        </w:rPr>
+        <w:t>ماده ۲۶ (پاکتا سونت سرواندا): هر معاهده لازم‌الاجرایی اطراف آن را متعهد می‌کند و باید با حسن نیت اجرا شود.</w:t>
+      </w:r>
+      <w:r>
+        <w:rPr>
+          <w:rFonts w:ascii="B Lotus" w:hAnsi="B Lotus" w:cs="B Lotus" w:eastAsia="B Lotus"/>
+          <w:b w:val="0"/>
+          <w:i w:val="0"/>
+          <w:sz w:val="28"/>
+          <w:szCs w:val="28"/>
+          <w:vertAlign w:val="superscript"/>
+        </w:rPr>
         <w:footnoteReference w:id="138"/>
       </w:r>
     </w:p>
@@ -16076,7 +16036,7 @@
           <w:sz w:val="28"/>
           <w:szCs w:val="28"/>
         </w:rPr>
-        <w:t>ماده ۲ (تعاریف): معاهده یعنی توافق بین‌المللیِ کتبیِ میان دولت‌ها که تابع حقوق بین‌الملل باشد، خواه در سندی واحد خواه در چند سند مرتبط، و با هر عنوانی.</w:t>
+        <w:t>ماده ۲۷ (حقوق داخلی): هیچ طرفی نمی‌تواند به مقررات حقوق داخلی خود به‌عنوان توجیهی برای عدم اجرای معاهده استناد کند.</w:t>
       </w:r>
       <w:r>
         <w:rPr>
@@ -16107,7 +16067,7 @@
           <w:sz w:val="28"/>
           <w:szCs w:val="28"/>
         </w:rPr>
-        <w:t>ماده ۲۶ (پاکتا سونت سرواندا): هر معاهده لازم‌الاجرایی اطراف آن را متعهد می‌کند و باید با حسن نیت اجرا شود.</w:t>
+        <w:t>ماده ۴۶ (صلاحیت داخلی): دولت نمی‌تواند این واقعیت را که رضایتش به التزام در برابر معاهده با نقض مقررات حقوق داخلی‌اش درباره صلاحیت انعقاد ابراز شده، به‌عنوان مبنای بی‌اعتباری رضایتش مطرح کند، مگر این‌که نقض آشکار باشد و به قاعده بنیادین حقوق داخلی مربوط شود.</w:t>
       </w:r>
       <w:r>
         <w:rPr>
@@ -16138,7 +16098,7 @@
           <w:sz w:val="28"/>
           <w:szCs w:val="28"/>
         </w:rPr>
-        <w:t>ماده ۲۷ (حقوق داخلی): هیچ طرفی نمی‌تواند به مقررات حقوق داخلی خود به‌عنوان توجیهی برای عدم اجرای معاهده استناد کند.</w:t>
+        <w:t>ماده ۵۳ (قواعد آمره): معاهده‌ای که با قاعده آمره حقوق بین‌الملل عام در تعارض باشد، باطل است.</w:t>
       </w:r>
       <w:r>
         <w:rPr>
@@ -16169,7 +16129,7 @@
           <w:sz w:val="28"/>
           <w:szCs w:val="28"/>
         </w:rPr>
-        <w:t>ماده ۴۶ (صلاحیت داخلی): دولت نمی‌تواند این واقعیت را که رضایتش به التزام در برابر معاهده با نقض مقررات حقوق داخلی‌اش درباره صلاحیت انعقاد ابراز شده، به‌عنوان مبنای بی‌اعتباری رضایتش مطرح کند، مگر این‌که نقض آشکار باشد و به قاعده بنیادین حقوق داخلی مربوط شود.</w:t>
+        <w:t>مواد ۵۴ تا ۶۴ (خاتمه و تعلیق): خاتمه و تعلیق فقط بر اساس مقررات معاهده یا کنوانسیون ممکن است؛ از جمله توافق اطراف، نقض اساسی توسط یک طرف (ماده ۶۰)، عدم امکان اجرای بعدی (ماده ۶۱)، تغییر بنیادین اوضاع (ماده ۶۲)، و قطع روابط دیپلماتیک یا کنسولی (ماده ۶۳، که به‌خودیِ خود بر روابط معاهده‌ای اثر نمی‌گذارد).</w:t>
       </w:r>
       <w:r>
         <w:rPr>
@@ -16200,7 +16160,7 @@
           <w:sz w:val="28"/>
           <w:szCs w:val="28"/>
         </w:rPr>
-        <w:t>ماده ۵۳ (قواعد آمره): معاهده‌ای که با قاعده آمره حقوق بین‌الملل عام در تعارض باشد، باطل است.</w:t>
+        <w:t>مواد ۶۵ تا ۶۸ (آیین): ادعای بطلان یا خاتمه یا تعلیق باید کتباً به اطلاع طرف مقابل برسد و مهلت اعتراض (کمتر از سه ماه، مگر در موارد فوری خاص) رعایت شود؛ و اعلامیه تا پیش از اثرگذاری قابل استرداد است.</w:t>
       </w:r>
       <w:r>
         <w:rPr>
@@ -16231,7 +16191,7 @@
           <w:sz w:val="28"/>
           <w:szCs w:val="28"/>
         </w:rPr>
-        <w:t>مواد ۵۴ تا ۶۴ (خاتمه و تعلیق): خاتمه و تعلیق فقط بر اساس مقررات معاهده یا کنوانسیون ممکن است؛ از جمله توافق اطراف، نقض اساسی توسط یک طرف (ماده ۶۰)، عدم امکان اجرای بعدی (ماده ۶۱)، تغییر بنیادین اوضاع (ماده ۶۲)، و قطع روابط دیپلماتیک یا کنسولی (ماده ۶۳، که به‌خودیِ خود بر روابط معاهده‌ای اثر نمی‌گذارد).</w:t>
+        <w:t>مواد ۷۰ و ۷۲ (آثار): خاتمه اطراف را از اجرای آتی معاف می‌کند ولی بر حقوق و وضعیت‌های پیش از خاتمه اثری ندارد؛ و در مدت تعلیق اطراف از اجرای متقابل معاف‌اند ولی باید از مانع‌تراشی در برابر ازسرگیری اجرا خودداری کنند.</w:t>
       </w:r>
       <w:r>
         <w:rPr>
@@ -16243,68 +16203,6 @@
           <w:vertAlign w:val="superscript"/>
         </w:rPr>
         <w:footnoteReference w:id="144"/>
-      </w:r>
-    </w:p>
-    <w:p>
-      <w:pPr>
-        <w:pStyle w:val="TH-Body"/>
-        <w:widowControl/>
-        <w:bidi w:val="1"/>
-        <w:spacing w:before="0" w:after="120" w:line="288" w:lineRule="auto"/>
-        <w:ind w:firstLine="283"/>
-        <w:jc w:val="both"/>
-      </w:pPr>
-      <w:r>
-        <w:rPr>
-          <w:rFonts w:ascii="B Lotus" w:hAnsi="B Lotus" w:cs="B Lotus" w:eastAsia="B Lotus"/>
-          <w:b w:val="0"/>
-          <w:i w:val="0"/>
-          <w:sz w:val="28"/>
-          <w:szCs w:val="28"/>
-        </w:rPr>
-        <w:t>مواد ۶۵ تا ۶۸ (آیین): ادعای بطلان یا خاتمه یا تعلیق باید کتباً به اطلاع طرف مقابل برسد و مهلت اعتراض (کمتر از سه ماه، مگر در موارد فوری خاص) رعایت شود؛ و اعلامیه تا پیش از اثرگذاری قابل استرداد است.</w:t>
-      </w:r>
-      <w:r>
-        <w:rPr>
-          <w:rFonts w:ascii="B Lotus" w:hAnsi="B Lotus" w:cs="B Lotus" w:eastAsia="B Lotus"/>
-          <w:b w:val="0"/>
-          <w:i w:val="0"/>
-          <w:sz w:val="28"/>
-          <w:szCs w:val="28"/>
-          <w:vertAlign w:val="superscript"/>
-        </w:rPr>
-        <w:footnoteReference w:id="145"/>
-      </w:r>
-    </w:p>
-    <w:p>
-      <w:pPr>
-        <w:pStyle w:val="TH-Body"/>
-        <w:widowControl/>
-        <w:bidi w:val="1"/>
-        <w:spacing w:before="0" w:after="120" w:line="288" w:lineRule="auto"/>
-        <w:ind w:firstLine="283"/>
-        <w:jc w:val="both"/>
-      </w:pPr>
-      <w:r>
-        <w:rPr>
-          <w:rFonts w:ascii="B Lotus" w:hAnsi="B Lotus" w:cs="B Lotus" w:eastAsia="B Lotus"/>
-          <w:b w:val="0"/>
-          <w:i w:val="0"/>
-          <w:sz w:val="28"/>
-          <w:szCs w:val="28"/>
-        </w:rPr>
-        <w:t>مواد ۷۰ و ۷۲ (آثار): خاتمه اطراف را از اجرای آتی معاف می‌کند ولی بر حقوق و وضعیت‌های پیش از خاتمه اثری ندارد؛ و در مدت تعلیق اطراف از اجرای متقابل معاف‌اند ولی باید از مانع‌تراشی در برابر ازسرگیری اجرا خودداری کنند.</w:t>
-      </w:r>
-      <w:r>
-        <w:rPr>
-          <w:rFonts w:ascii="B Lotus" w:hAnsi="B Lotus" w:cs="B Lotus" w:eastAsia="B Lotus"/>
-          <w:b w:val="0"/>
-          <w:i w:val="0"/>
-          <w:sz w:val="28"/>
-          <w:szCs w:val="28"/>
-          <w:vertAlign w:val="superscript"/>
-        </w:rPr>
-        <w:footnoteReference w:id="146"/>
       </w:r>
     </w:p>
     <w:p>
@@ -16364,7 +16262,7 @@
           <w:sz w:val="32"/>
           <w:szCs w:val="32"/>
         </w:rPr>
-        <w:t>پیوست ششم: گزیده عهدنامه مالک اشتر (متن و ترجمه)</w:t>
+        <w:t>پیوست پنجم: گزیده عهدنامه مالک اشتر (متن و ترجمه)</w:t>
       </w:r>
     </w:p>
     <w:p>
@@ -16395,7 +16293,7 @@
           <w:szCs w:val="28"/>
           <w:vertAlign w:val="superscript"/>
         </w:rPr>
-        <w:footnoteReference w:id="147"/>
+        <w:footnoteReference w:id="145"/>
       </w:r>
     </w:p>
     <w:p>
@@ -16603,7 +16501,7 @@
           <w:sz w:val="32"/>
           <w:szCs w:val="32"/>
         </w:rPr>
-        <w:t>پیوست پنجم: واژه‌نامه فارسی ـ عربی ـ انگلیسی</w:t>
+        <w:t>پیوست ششم: واژه‌نامه فارسی ـ عربی ـ انگلیسی</w:t>
       </w:r>
     </w:p>
     <w:p>
@@ -18000,7 +17898,7 @@
           <w:sz w:val="20"/>
           <w:szCs w:val="20"/>
         </w:rPr>
-        <w:t xml:space="preserve">قانون اساسی جمهوری اسلامی ایران، اصول ۱۵۲، ۱۵۳ و ۱۵۴ (به‌اجمال).</w:t>
+        <w:t xml:space="preserve">قانون اساسی جمهوری اسلامی ایران، اصل ۱۵۲.</w:t>
       </w:r>
     </w:p>
   </w:footnote>
@@ -18033,7 +17931,7 @@
           <w:sz w:val="20"/>
           <w:szCs w:val="20"/>
         </w:rPr>
-        <w:t xml:space="preserve">قانون اساسی جمهوری اسلامی ایران، اصل ۱۷۶ (به‌اجمال).</w:t>
+        <w:t xml:space="preserve">قانون اساسی جمهوری اسلامی ایران، اصل ۱۵۳.</w:t>
       </w:r>
     </w:p>
   </w:footnote>
@@ -18066,7 +17964,7 @@
           <w:sz w:val="20"/>
           <w:szCs w:val="20"/>
         </w:rPr>
-        <w:t xml:space="preserve">قانون اساسی جمهوری اسلامی ایران، اصل ۱۵۲.</w:t>
+        <w:t xml:space="preserve">قانون اساسی جمهوری اسلامی ایران، اصل ۱۵۴ (به‌اجمال).</w:t>
       </w:r>
     </w:p>
   </w:footnote>
@@ -18099,7 +17997,7 @@
           <w:sz w:val="20"/>
           <w:szCs w:val="20"/>
         </w:rPr>
-        <w:t xml:space="preserve">قانون اساسی جمهوری اسلامی ایران، اصل ۱۵۳.</w:t>
+        <w:t xml:space="preserve">قانون اساسی جمهوری اسلامی ایران، اصل ۱۷۶ (به‌اجمال).</w:t>
       </w:r>
     </w:p>
   </w:footnote>
@@ -18132,7 +18030,7 @@
           <w:sz w:val="20"/>
           <w:szCs w:val="20"/>
         </w:rPr>
-        <w:t xml:space="preserve">قانون اساسی جمهوری اسلامی ایران، اصل ۱۵۴ (به‌اجمال).</w:t>
+        <w:t xml:space="preserve">سوره مائده، آیه ۱.</w:t>
       </w:r>
     </w:p>
   </w:footnote>
@@ -18165,7 +18063,7 @@
           <w:sz w:val="20"/>
           <w:szCs w:val="20"/>
         </w:rPr>
-        <w:t xml:space="preserve">قانون اساسی جمهوری اسلامی ایران، اصل ۱۷۶ (به‌اجمال).</w:t>
+        <w:t xml:space="preserve">ر.ک: شیخ انصاری، مرتضی، المکاسب، کتاب البیع (مشخصات چاپ، نیازمند بررسی منبع اصلی است)؛ و بجنوردی، سیدمحمدحسن، القواعد الفقهیه، ج ۴، قاعده لزوم (مشخصات چاپ، نیازمند بررسی منبع اصلی است).</w:t>
       </w:r>
     </w:p>
   </w:footnote>
@@ -18198,7 +18096,7 @@
           <w:sz w:val="20"/>
           <w:szCs w:val="20"/>
         </w:rPr>
-        <w:t xml:space="preserve">سوره مائده، آیه ۱.</w:t>
+        <w:t xml:space="preserve">سوره نحل، آیات ۹۱ و ۹۲.</w:t>
       </w:r>
     </w:p>
   </w:footnote>
@@ -18231,7 +18129,7 @@
           <w:sz w:val="20"/>
           <w:szCs w:val="20"/>
         </w:rPr>
-        <w:t xml:space="preserve">ر.ک: شیخ انصاری، مرتضی، المکاسب، کتاب البیع (مشخصات چاپ، نیازمند بررسی منبع اصلی است)؛ و بجنوردی، سیدمحمدحسن، القواعد الفقهیه، ج ۴، قاعده لزوم (مشخصات چاپ، نیازمند بررسی منبع اصلی است).</w:t>
+        <w:t xml:space="preserve">ر.ک: علامه طباطبایی، سیدمحمدحسین، المیزان فی تفسیر القرآن، ذیل آیه ۹۱ نحل (مشخصات چاپ، نیازمند بررسی منبع اصلی است).</w:t>
       </w:r>
     </w:p>
   </w:footnote>
@@ -18264,7 +18162,7 @@
           <w:sz w:val="20"/>
           <w:szCs w:val="20"/>
         </w:rPr>
-        <w:t xml:space="preserve">سوره نحل، آیات ۹۱ و ۹۲.</w:t>
+        <w:t xml:space="preserve">سوره اسراء، آیه ۳۴.</w:t>
       </w:r>
     </w:p>
   </w:footnote>
@@ -18297,7 +18195,7 @@
           <w:sz w:val="20"/>
           <w:szCs w:val="20"/>
         </w:rPr>
-        <w:t xml:space="preserve">ر.ک: علامه طباطبایی، سیدمحمدحسین، المیزان فی تفسیر القرآن، ذیل آیه ۹۱ نحل (مشخصات چاپ، نیازمند بررسی منبع اصلی است).</w:t>
+        <w:t xml:space="preserve">سوره رعد، آیات ۲۰ تا ۲۵.</w:t>
       </w:r>
     </w:p>
   </w:footnote>
@@ -18330,7 +18228,7 @@
           <w:sz w:val="20"/>
           <w:szCs w:val="20"/>
         </w:rPr>
-        <w:t xml:space="preserve">سوره اسراء، آیه ۳۴.</w:t>
+        <w:t xml:space="preserve">سوره مؤمنون، آیه ۸؛ و نیز سوره معارج، آیه ۳۲.</w:t>
       </w:r>
     </w:p>
   </w:footnote>
@@ -18363,7 +18261,7 @@
           <w:sz w:val="20"/>
           <w:szCs w:val="20"/>
         </w:rPr>
-        <w:t xml:space="preserve">سوره رعد، آیات ۲۰ تا ۲۵.</w:t>
+        <w:t xml:space="preserve">سوره توبه، آیه ۴.</w:t>
       </w:r>
     </w:p>
   </w:footnote>
@@ -18396,7 +18294,7 @@
           <w:sz w:val="20"/>
           <w:szCs w:val="20"/>
         </w:rPr>
-        <w:t xml:space="preserve">سوره مؤمنون، آیه ۸؛ و نیز سوره معارج، آیه ۳۲.</w:t>
+        <w:t xml:space="preserve">سوره توبه، آیه ۷.</w:t>
       </w:r>
     </w:p>
   </w:footnote>
@@ -18429,7 +18327,7 @@
           <w:sz w:val="20"/>
           <w:szCs w:val="20"/>
         </w:rPr>
-        <w:t xml:space="preserve">سوره توبه، آیه ۴.</w:t>
+        <w:t xml:space="preserve">سوره انفال، آیه ۵۸.</w:t>
       </w:r>
     </w:p>
   </w:footnote>
@@ -18462,7 +18360,7 @@
           <w:sz w:val="20"/>
           <w:szCs w:val="20"/>
         </w:rPr>
-        <w:t xml:space="preserve">سوره توبه، آیه ۷.</w:t>
+        <w:t xml:space="preserve">سوره انفال، آیه ۷۲.</w:t>
       </w:r>
     </w:p>
   </w:footnote>
@@ -18495,7 +18393,7 @@
           <w:sz w:val="20"/>
           <w:szCs w:val="20"/>
         </w:rPr>
-        <w:t xml:space="preserve">سوره انفال، آیه ۵۸.</w:t>
+        <w:t xml:space="preserve">حر عاملی، محمد بن حسن، وسائل الشیعه، ابواب خیارات (مشخصات چاپ و نشانی دقیق، نیازمند بررسی منبع اصلی است).</w:t>
       </w:r>
     </w:p>
   </w:footnote>
@@ -18528,7 +18426,7 @@
           <w:sz w:val="20"/>
           <w:szCs w:val="20"/>
         </w:rPr>
-        <w:t xml:space="preserve">سوره انفال، آیه ۷۲.</w:t>
+        <w:t xml:space="preserve">برای بررسی سندی، ر.ک: مجلسی، محمدباقر، بحار الانوار (نشانی دقیق، نیازمند بررسی منبع اصلی است).</w:t>
       </w:r>
     </w:p>
   </w:footnote>
@@ -18561,7 +18459,7 @@
           <w:sz w:val="20"/>
           <w:szCs w:val="20"/>
         </w:rPr>
-        <w:t xml:space="preserve">حر عاملی، محمد بن حسن، وسائل الشیعه، ابواب خیارات (مشخصات چاپ و نشانی دقیق، نیازمند بررسی منبع اصلی است).</w:t>
+        <w:t xml:space="preserve">نهج‌البلاغه، نامه ۵۳ (عهدنامه مالک اشتر).</w:t>
       </w:r>
     </w:p>
   </w:footnote>
@@ -18594,7 +18492,7 @@
           <w:sz w:val="20"/>
           <w:szCs w:val="20"/>
         </w:rPr>
-        <w:t xml:space="preserve">برای بررسی سندی، ر.ک: مجلسی، محمدباقر، بحار الانوار (نشانی دقیق، نیازمند بررسی منبع اصلی است).</w:t>
+        <w:t xml:space="preserve">کلینی، محمد بن یعقوب، الکافی (نشانی دقیق، نیازمند بررسی منبع اصلی است).</w:t>
       </w:r>
     </w:p>
   </w:footnote>
@@ -18627,7 +18525,7 @@
           <w:sz w:val="20"/>
           <w:szCs w:val="20"/>
         </w:rPr>
-        <w:t xml:space="preserve">نهج‌البلاغه، نامه ۵۳ (عهدنامه مالک اشتر).</w:t>
+        <w:t xml:space="preserve">حر عاملی، محمد بن حسن، وسائل الشیعه، ابواب جهاد و ابواب احکام عقود (نشانی دقیق، نیازمند بررسی منبع اصلی است).</w:t>
       </w:r>
     </w:p>
   </w:footnote>
@@ -18660,7 +18558,7 @@
           <w:sz w:val="20"/>
           <w:szCs w:val="20"/>
         </w:rPr>
-        <w:t xml:space="preserve">کلینی، محمد بن یعقوب، الکافی (نشانی دقیق، نیازمند بررسی منبع اصلی است).</w:t>
+        <w:t xml:space="preserve">ر.ک: ابن‌هشام، السیرة النبویة، ماجرای حدیبیه (مشخصات چاپ، نیازمند بررسی منبع اصلی است).</w:t>
       </w:r>
     </w:p>
   </w:footnote>
@@ -18693,7 +18591,7 @@
           <w:sz w:val="20"/>
           <w:szCs w:val="20"/>
         </w:rPr>
-        <w:t xml:space="preserve">حر عاملی، محمد بن حسن، وسائل الشیعه، ابواب جهاد و ابواب احکام عقود (نشانی دقیق، نیازمند بررسی منبع اصلی است).</w:t>
+        <w:t xml:space="preserve">سوره توبه، آیات ۱ تا ۴؛ و ر.ک: طبری، تاریخ الامم و الملوک، ماجرای فتح مکه (مشخصات چاپ، نیازمند بررسی منبع اصلی است).</w:t>
       </w:r>
     </w:p>
   </w:footnote>
@@ -18726,7 +18624,7 @@
           <w:sz w:val="20"/>
           <w:szCs w:val="20"/>
         </w:rPr>
-        <w:t xml:space="preserve">ر.ک: ابن‌هشام، السیرة النبویة، ماجرای حدیبیه (مشخصات چاپ، نیازمند بررسی منبع اصلی است).</w:t>
+        <w:t xml:space="preserve">ر.ک: نهج‌البلاغه، خطبه‌ها و نامه‌های مربوط به صفین (نشانی دقیق، نیازمند بررسی منبع اصلی است).</w:t>
       </w:r>
     </w:p>
   </w:footnote>
@@ -18759,7 +18657,7 @@
           <w:sz w:val="20"/>
           <w:szCs w:val="20"/>
         </w:rPr>
-        <w:t xml:space="preserve">سوره توبه، آیات ۱ تا ۴؛ و ر.ک: طبری، تاریخ الامم و الملوک، ماجرای فتح مکه (مشخصات چاپ، نیازمند بررسی منبع اصلی است).</w:t>
+        <w:t xml:space="preserve">ر.ک: آخوند خراسانی، محمدکاظم، کفایة الاصول، مبحث ملازمه عقلیه (مشخصات چاپ، نیازمند بررسی منبع اصلی است).</w:t>
       </w:r>
     </w:p>
   </w:footnote>
@@ -18792,7 +18690,7 @@
           <w:sz w:val="20"/>
           <w:szCs w:val="20"/>
         </w:rPr>
-        <w:t xml:space="preserve">ر.ک: نهج‌البلاغه، خطبه‌ها و نامه‌های مربوط به صفین (نشانی دقیق، نیازمند بررسی منبع اصلی است).</w:t>
+        <w:t xml:space="preserve">ر.ک: میرزای نائینی، محمدحسین، فوائد الاصول، مبحث بنای عقلا (مشخصات چاپ، نیازمند بررسی منبع اصلی است).</w:t>
       </w:r>
     </w:p>
   </w:footnote>
@@ -18825,7 +18723,7 @@
           <w:sz w:val="20"/>
           <w:szCs w:val="20"/>
         </w:rPr>
-        <w:t xml:space="preserve">ر.ک: آخوند خراسانی، محمدکاظم، کفایة الاصول، مبحث ملازمه عقلیه (مشخصات چاپ، نیازمند بررسی منبع اصلی است).</w:t>
+        <w:t xml:space="preserve">بجنوردی، سیدمحمدحسن، القواعد الفقهیه، ج ۴، قاعده لزوم (مشخصات چاپ، نیازمند بررسی منبع اصلی است).</w:t>
       </w:r>
     </w:p>
   </w:footnote>
@@ -18858,7 +18756,7 @@
           <w:sz w:val="20"/>
           <w:szCs w:val="20"/>
         </w:rPr>
-        <w:t xml:space="preserve">ر.ک: میرزای نائینی، محمدحسین، فوائد الاصول، مبحث بنای عقلا (مشخصات چاپ، نیازمند بررسی منبع اصلی است).</w:t>
+        <w:t xml:space="preserve">سوره انفال، آیه ۵۸.</w:t>
       </w:r>
     </w:p>
   </w:footnote>
@@ -18891,7 +18789,7 @@
           <w:sz w:val="20"/>
           <w:szCs w:val="20"/>
         </w:rPr>
-        <w:t xml:space="preserve">بجنوردی، سیدمحمدحسن، القواعد الفقهیه، ج ۴، قاعده لزوم (مشخصات چاپ، نیازمند بررسی منبع اصلی است).</w:t>
+        <w:t xml:space="preserve">حر عاملی، محمد بن حسن، وسائل الشیعه، ابواب جهاد (نشانی دقیق، نیازمند بررسی منبع اصلی است).</w:t>
       </w:r>
     </w:p>
   </w:footnote>
@@ -18924,7 +18822,7 @@
           <w:sz w:val="20"/>
           <w:szCs w:val="20"/>
         </w:rPr>
-        <w:t xml:space="preserve">سوره انفال، آیه ۵۸.</w:t>
+        <w:t xml:space="preserve">سوره نساء، آیه ۱۴۱.</w:t>
       </w:r>
     </w:p>
   </w:footnote>
@@ -18957,7 +18855,7 @@
           <w:sz w:val="20"/>
           <w:szCs w:val="20"/>
         </w:rPr>
-        <w:t xml:space="preserve">حر عاملی، محمد بن حسن، وسائل الشیعه، ابواب جهاد (نشانی دقیق، نیازمند بررسی منبع اصلی است).</w:t>
+        <w:t xml:space="preserve">سوره نساء، آیه ۵۸.</w:t>
       </w:r>
     </w:p>
   </w:footnote>
@@ -18990,7 +18888,7 @@
           <w:sz w:val="20"/>
           <w:szCs w:val="20"/>
         </w:rPr>
-        <w:t xml:space="preserve">سوره نساء، آیه ۱۴۱.</w:t>
+        <w:t xml:space="preserve">ر.ک: علامه طباطبایی، سیدمحمدحسین، المیزان فی تفسیر القرآن، ذیل آیه ۵۸ نساء (مشخصات چاپ، نیازمند بررسی منبع اصلی است).</w:t>
       </w:r>
     </w:p>
   </w:footnote>
@@ -19023,7 +18921,7 @@
           <w:sz w:val="20"/>
           <w:szCs w:val="20"/>
         </w:rPr>
-        <w:t xml:space="preserve">سوره نساء، آیه ۵۸.</w:t>
+        <w:t xml:space="preserve">سوره مائده، آیه ۸۹.</w:t>
       </w:r>
     </w:p>
   </w:footnote>
@@ -19056,7 +18954,7 @@
           <w:sz w:val="20"/>
           <w:szCs w:val="20"/>
         </w:rPr>
-        <w:t xml:space="preserve">ر.ک: علامه طباطبایی، سیدمحمدحسین، المیزان فی تفسیر القرآن، ذیل آیه ۵۸ نساء (مشخصات چاپ، نیازمند بررسی منبع اصلی است).</w:t>
+        <w:t xml:space="preserve">شیخ صدوق، محمد بن علی، الخصال؛ و حر عاملی، محمد بن حسن، وسائل الشیعه (نشانی دقیق، نیازمند بررسی منبع اصلی است).</w:t>
       </w:r>
     </w:p>
   </w:footnote>
@@ -19089,7 +18987,7 @@
           <w:sz w:val="20"/>
           <w:szCs w:val="20"/>
         </w:rPr>
-        <w:t xml:space="preserve">سوره مائده، آیه ۸۹.</w:t>
+        <w:t xml:space="preserve">ر.ک: ابن‌هشام، السیرة النبویة، ماجرای هجرت و میثاق مدینه (مشخصات چاپ، نیازمند بررسی منبع اصلی است).</w:t>
       </w:r>
     </w:p>
   </w:footnote>
@@ -19122,7 +19020,7 @@
           <w:sz w:val="20"/>
           <w:szCs w:val="20"/>
         </w:rPr>
-        <w:t xml:space="preserve">شیخ صدوق، محمد بن علی، الخصال؛ و حر عاملی، محمد بن حسن، وسائل الشیعه (نشانی دقیق، نیازمند بررسی منبع اصلی است).</w:t>
+        <w:t xml:space="preserve">ر.ک: ابن‌هشام، السیرة النبویة، ماجرای نجران (مشخصات چاپ، نیازمند بررسی منبع اصلی است).</w:t>
       </w:r>
     </w:p>
   </w:footnote>
@@ -19155,7 +19053,7 @@
           <w:sz w:val="20"/>
           <w:szCs w:val="20"/>
         </w:rPr>
-        <w:t xml:space="preserve">ر.ک: ابن‌هشام، السیرة النبویة، ماجرای هجرت و میثاق مدینه (مشخصات چاپ، نیازمند بررسی منبع اصلی است).</w:t>
+        <w:t xml:space="preserve">نجفی، محمدحسن (صاحب جواهر)، جواهر الکلام، کتاب الجهاد، احکام هدنه (مشخصات چاپ و نشانی دقیق، نیازمند بررسی منبع اصلی است).</w:t>
       </w:r>
     </w:p>
   </w:footnote>
@@ -19188,7 +19086,7 @@
           <w:sz w:val="20"/>
           <w:szCs w:val="20"/>
         </w:rPr>
-        <w:t xml:space="preserve">ر.ک: ابن‌هشام، السیرة النبویة، ماجرای نجران (مشخصات چاپ، نیازمند بررسی منبع اصلی است).</w:t>
+        <w:t xml:space="preserve">امام خمینی، سیدروح‌الله، تحریر الوسیله، کتاب الجهاد و الامر بالمعروف (نشانی دقیق، نیازمند بررسی منبع اصلی است).</w:t>
       </w:r>
     </w:p>
   </w:footnote>
@@ -19221,7 +19119,7 @@
           <w:sz w:val="20"/>
           <w:szCs w:val="20"/>
         </w:rPr>
-        <w:t xml:space="preserve">نجفی، محمدحسن (صاحب جواهر)، جواهر الکلام، کتاب الجهاد، احکام هدنه (مشخصات چاپ و نشانی دقیق، نیازمند بررسی منبع اصلی است).</w:t>
+        <w:t xml:space="preserve">شیخ انصاری، مرتضی، المکاسب، کتاب البیع، مبحث لزوم (نشانی دقیق، نیازمند بررسی منبع اصلی است).</w:t>
       </w:r>
     </w:p>
   </w:footnote>
@@ -19254,7 +19152,7 @@
           <w:sz w:val="20"/>
           <w:szCs w:val="20"/>
         </w:rPr>
-        <w:t xml:space="preserve">امام خمینی، سیدروح‌الله، تحریر الوسیله، کتاب الجهاد و الامر بالمعروف (نشانی دقیق، نیازمند بررسی منبع اصلی است).</w:t>
+        <w:t xml:space="preserve">ر.ک: راغب اصفهانی، حسین بن محمد، مفردات الفاظ القرآن، ماده «عهد» (مشخصات چاپ، نیازمند بررسی منبع اصلی است).</w:t>
       </w:r>
     </w:p>
   </w:footnote>
@@ -19287,7 +19185,7 @@
           <w:sz w:val="20"/>
           <w:szCs w:val="20"/>
         </w:rPr>
-        <w:t xml:space="preserve">شیخ انصاری، مرتضی، المکاسب، کتاب البیع، مبحث لزوم (نشانی دقیق، نیازمند بررسی منبع اصلی است).</w:t>
+        <w:t xml:space="preserve">ر.ک: راغب اصفهانی، حسین بن محمد، مفردات الفاظ القرآن، ماده «عقد» (مشخصات چاپ، نیازمند بررسی منبع اصلی است).</w:t>
       </w:r>
     </w:p>
   </w:footnote>
@@ -19320,7 +19218,7 @@
           <w:sz w:val="20"/>
           <w:szCs w:val="20"/>
         </w:rPr>
-        <w:t xml:space="preserve">ر.ک: راغب اصفهانی، حسین بن محمد، مفردات الفاظ القرآن، ماده «عهد» (مشخصات چاپ، نیازمند بررسی منبع اصلی است).</w:t>
+        <w:t xml:space="preserve">ر.ک: راغب اصفهانی، حسین بن محمد، مفردات الفاظ القرآن، ماده «وثق» (مشخصات چاپ، نیازمند بررسی منبع اصلی است).</w:t>
       </w:r>
     </w:p>
   </w:footnote>
@@ -19353,7 +19251,7 @@
           <w:sz w:val="20"/>
           <w:szCs w:val="20"/>
         </w:rPr>
-        <w:t xml:space="preserve">ر.ک: راغب اصفهانی، حسین بن محمد، مفردات الفاظ القرآن، ماده «عقد» (مشخصات چاپ، نیازمند بررسی منبع اصلی است).</w:t>
+        <w:t xml:space="preserve">سوره آل‌عمران، آیه ۹.</w:t>
       </w:r>
     </w:p>
   </w:footnote>
@@ -19386,7 +19284,7 @@
           <w:sz w:val="20"/>
           <w:szCs w:val="20"/>
         </w:rPr>
-        <w:t xml:space="preserve">ر.ک: راغب اصفهانی، حسین بن محمد، مفردات الفاظ القرآن، ماده «وثق» (مشخصات چاپ، نیازمند بررسی منبع اصلی است).</w:t>
+        <w:t xml:space="preserve">ر.ک: آخوند خراسانی، محمدکاظم، کفایة الاصول، مبحث تزاحم؛ و میرزای نائینی، محمدحسین، فوائد الاصول، مبحث تزاحم (مشخصات چاپ، نیازمند بررسی منبع اصلی است).</w:t>
       </w:r>
     </w:p>
   </w:footnote>
@@ -19419,7 +19317,7 @@
           <w:sz w:val="20"/>
           <w:szCs w:val="20"/>
         </w:rPr>
-        <w:t xml:space="preserve">سوره آل‌عمران، آیه ۹.</w:t>
+        <w:t xml:space="preserve">امام خمینی، سیدروح‌الله، صحیفه امام، نامه به حجت‌الاسلام قدیری (نشانی دقیق، نیازمند بررسی منبع اصلی است).</w:t>
       </w:r>
     </w:p>
   </w:footnote>
@@ -19452,7 +19350,7 @@
           <w:sz w:val="20"/>
           <w:szCs w:val="20"/>
         </w:rPr>
-        <w:t xml:space="preserve">ر.ک: آخوند خراسانی، محمدکاظم، کفایة الاصول، مبحث تزاحم؛ و میرزای نائینی، محمدحسین، فوائد الاصول، مبحث تزاحم (مشخصات چاپ، نیازمند بررسی منبع اصلی است).</w:t>
+        <w:t xml:space="preserve">شیخ صدوق، محمد بن علی، من لایحضره الفقیه؛ و کلینی، محمد بن یعقوب، الکافی (نشانی دقیق، نیازمند بررسی منبع اصلی است).</w:t>
       </w:r>
     </w:p>
   </w:footnote>
@@ -19485,7 +19383,7 @@
           <w:sz w:val="20"/>
           <w:szCs w:val="20"/>
         </w:rPr>
-        <w:t xml:space="preserve">امام خمینی، سیدروح‌الله، صحیفه امام، نامه به حجت‌الاسلام قدیری (نشانی دقیق، نیازمند بررسی منبع اصلی است).</w:t>
+        <w:t xml:space="preserve">سوره حج، آیه ۷۸.</w:t>
       </w:r>
     </w:p>
   </w:footnote>
@@ -19518,7 +19416,7 @@
           <w:sz w:val="20"/>
           <w:szCs w:val="20"/>
         </w:rPr>
-        <w:t xml:space="preserve">شیخ صدوق، محمد بن علی، من لایحضره الفقیه؛ و کلینی، محمد بن یعقوب، الکافی (نشانی دقیق، نیازمند بررسی منبع اصلی است).</w:t>
+        <w:t xml:space="preserve">امام خمینی، سیدروح‌الله، صحیفه امام (نشانی دقیق، نیازمند بررسی منبع اصلی است).</w:t>
       </w:r>
     </w:p>
   </w:footnote>
@@ -19551,7 +19449,7 @@
           <w:sz w:val="20"/>
           <w:szCs w:val="20"/>
         </w:rPr>
-        <w:t xml:space="preserve">سوره حج، آیه ۷۸.</w:t>
+        <w:t xml:space="preserve">نراقی، ملا احمد، عوائد الایام، عائده ولایت فقیه (مشخصات چاپ و نشانی دقیق، نیازمند بررسی منبع اصلی است).</w:t>
       </w:r>
     </w:p>
   </w:footnote>
@@ -19584,7 +19482,7 @@
           <w:sz w:val="20"/>
           <w:szCs w:val="20"/>
         </w:rPr>
-        <w:t xml:space="preserve">امام خمینی، سیدروح‌الله، صحیفه امام (نشانی دقیق، نیازمند بررسی منبع اصلی است).</w:t>
+        <w:t xml:space="preserve">میرزای نائینی، محمدحسین، تنبیه الامه و تنزیه المله، تهران (مشخصات چاپ، نیازمند بررسی منبع اصلی است).</w:t>
       </w:r>
     </w:p>
   </w:footnote>
@@ -19617,7 +19515,7 @@
           <w:sz w:val="20"/>
           <w:szCs w:val="20"/>
         </w:rPr>
-        <w:t xml:space="preserve">نراقی، ملا احمد، عوائد الایام، عائده ولایت فقیه (مشخصات چاپ و نشانی دقیق، نیازمند بررسی منبع اصلی است).</w:t>
+        <w:t xml:space="preserve">امام خمینی، سیدروح‌الله، ولایت فقیه (حکومت اسلامی) (مشخصات چاپ، نیازمند بررسی منبع اصلی است).</w:t>
       </w:r>
     </w:p>
   </w:footnote>
@@ -19650,7 +19548,7 @@
           <w:sz w:val="20"/>
           <w:szCs w:val="20"/>
         </w:rPr>
-        <w:t xml:space="preserve">میرزای نائینی، محمدحسین، تنبیه الامه و تنزیه المله، تهران (مشخصات چاپ، نیازمند بررسی منبع اصلی است).</w:t>
+        <w:t xml:space="preserve">امام خمینی، سیدروح‌الله، صحیفه امام، نامه به حجت‌الاسلام قدیری (نشانی دقیق، نیازمند بررسی منبع اصلی است).</w:t>
       </w:r>
     </w:p>
   </w:footnote>
@@ -19683,7 +19581,7 @@
           <w:sz w:val="20"/>
           <w:szCs w:val="20"/>
         </w:rPr>
-        <w:t xml:space="preserve">امام خمینی، سیدروح‌الله، ولایت فقیه (حکومت اسلامی) (مشخصات چاپ، نیازمند بررسی منبع اصلی است).</w:t>
+        <w:t xml:space="preserve">ر.ک: شیخ مفید، محمد بن محمد، الارشاد، احوال امام حسن؛ و طبری، محمد بن جریر، تاریخ الامم و الملوک، حوادث سال ۴۱ (مشخصات چاپ، نیازمند بررسی منبع اصلی است).</w:t>
       </w:r>
     </w:p>
   </w:footnote>
@@ -19716,7 +19614,7 @@
           <w:sz w:val="20"/>
           <w:szCs w:val="20"/>
         </w:rPr>
-        <w:t xml:space="preserve">امام خمینی، سیدروح‌الله، صحیفه امام، نامه به حجت‌الاسلام قدیری (نشانی دقیق، نیازمند بررسی منبع اصلی است).</w:t>
+        <w:t xml:space="preserve">ر.ک: آخوند خراسانی، محمدکاظم، کفایة الاصول، مبحث تزاحم؛ و میرزای نائینی، محمدحسین، فوائد الاصول، مبحث تزاحم (مشخصات چاپ، نیازمند بررسی منبع اصلی است).</w:t>
       </w:r>
     </w:p>
   </w:footnote>
@@ -19749,7 +19647,7 @@
           <w:sz w:val="20"/>
           <w:szCs w:val="20"/>
         </w:rPr>
-        <w:t xml:space="preserve">ر.ک: شیخ مفید، محمد بن محمد، الارشاد، احوال امام حسن؛ و طبری، محمد بن جریر، تاریخ الامم و الملوک، حوادث سال ۴۱ (مشخصات چاپ، نیازمند بررسی منبع اصلی است).</w:t>
+        <w:t xml:space="preserve">طرح مواد کمیسیون حقوق بین‌الملل درباره مسئولیت بین‌المللی دولت‌ها (۲۰۰۱). ر.ک: گزارش‌های کمیسیون حقوق بین‌الملل (نشانی دقیق، نیازمند بررسی منبع اصلی است).</w:t>
       </w:r>
     </w:p>
   </w:footnote>
@@ -19782,7 +19680,7 @@
           <w:sz w:val="20"/>
           <w:szCs w:val="20"/>
         </w:rPr>
-        <w:t xml:space="preserve">ر.ک: آخوند خراسانی، محمدکاظم، کفایة الاصول، مبحث تزاحم؛ و میرزای نائینی، محمدحسین، فوائد الاصول، مبحث تزاحم (مشخصات چاپ، نیازمند بررسی منبع اصلی است).</w:t>
+        <w:t xml:space="preserve">قضیه فعالیت‌های نظامی و شبه‌نظامی در نیکاراگوئه و علیه آن (نیکاراگوئه علیه ایالات متحده)، رأی دیوان بین‌المللی دادگستری، ۱۹۸۶.</w:t>
       </w:r>
     </w:p>
   </w:footnote>
@@ -19815,7 +19713,7 @@
           <w:sz w:val="20"/>
           <w:szCs w:val="20"/>
         </w:rPr>
-        <w:t xml:space="preserve">طرح مواد کمیسیون حقوق بین‌الملل درباره مسئولیت بین‌المللی دولت‌ها (۲۰۰۱). ر.ک: گزارش‌های کمیسیون حقوق بین‌الملل (نشانی دقیق، نیازمند بررسی منبع اصلی است).</w:t>
+        <w:t xml:space="preserve">طرح مواد مسئولیت بین‌المللی دولت‌ها، مواد ۱ و ۲.</w:t>
       </w:r>
     </w:p>
   </w:footnote>
@@ -19848,7 +19746,7 @@
           <w:sz w:val="20"/>
           <w:szCs w:val="20"/>
         </w:rPr>
-        <w:t xml:space="preserve">قضیه فعالیت‌های نظامی و شبه‌نظامی در نیکاراگوئه و علیه آن (نیکاراگوئه علیه ایالات متحده)، رأی دیوان بین‌المللی دادگستری، ۱۹۸۶.</w:t>
+        <w:t xml:space="preserve">طرح مواد مسئولیت بین‌المللی دولت‌ها، ماده ۴.</w:t>
       </w:r>
     </w:p>
   </w:footnote>
@@ -19881,7 +19779,7 @@
           <w:sz w:val="20"/>
           <w:szCs w:val="20"/>
         </w:rPr>
-        <w:t xml:space="preserve">طرح مواد مسئولیت بین‌المللی دولت‌ها، مواد ۱ و ۲.</w:t>
+        <w:t xml:space="preserve">طرح مواد مسئولیت بین‌المللی دولت‌ها، ماده ۷.</w:t>
       </w:r>
     </w:p>
   </w:footnote>
@@ -19914,7 +19812,7 @@
           <w:sz w:val="20"/>
           <w:szCs w:val="20"/>
         </w:rPr>
-        <w:t xml:space="preserve">طرح مواد مسئولیت بین‌المللی دولت‌ها، ماده ۴.</w:t>
+        <w:t xml:space="preserve">طرح مواد مسئولیت بین‌المللی دولت‌ها، ماده ۸.</w:t>
       </w:r>
     </w:p>
   </w:footnote>
@@ -19947,7 +19845,7 @@
           <w:sz w:val="20"/>
           <w:szCs w:val="20"/>
         </w:rPr>
-        <w:t xml:space="preserve">طرح مواد مسئولیت بین‌المللی دولت‌ها، ماده ۷.</w:t>
+        <w:t xml:space="preserve">طرح مواد مسئولیت بین‌المللی دولت‌ها، ماده ۱۱.</w:t>
       </w:r>
     </w:p>
   </w:footnote>
@@ -19980,7 +19878,7 @@
           <w:sz w:val="20"/>
           <w:szCs w:val="20"/>
         </w:rPr>
-        <w:t xml:space="preserve">طرح مواد مسئولیت بین‌المللی دولت‌ها، ماده ۸.</w:t>
+        <w:t xml:space="preserve">قضیه کارکنان دیپلماتیک و کنسولی ایالات متحده در تهران (ایالات متحده علیه ایران)، رأی دیوان بین‌المللی دادگستری، ۱۹۸۰.</w:t>
       </w:r>
     </w:p>
   </w:footnote>
@@ -20013,7 +19911,7 @@
           <w:sz w:val="20"/>
           <w:szCs w:val="20"/>
         </w:rPr>
-        <w:t xml:space="preserve">طرح مواد مسئولیت بین‌المللی دولت‌ها، ماده ۱۱.</w:t>
+        <w:t xml:space="preserve">طرح مواد مسئولیت بین‌المللی دولت‌ها، ماده ۱۲.</w:t>
       </w:r>
     </w:p>
   </w:footnote>
@@ -20046,7 +19944,7 @@
           <w:sz w:val="20"/>
           <w:szCs w:val="20"/>
         </w:rPr>
-        <w:t xml:space="preserve">قضیه کارکنان دیپلماتیک و کنسولی ایالات متحده در تهران (ایالات متحده علیه ایران)، رأی دیوان بین‌المللی دادگستری، ۱۹۸۰.</w:t>
+        <w:t xml:space="preserve">طرح مواد مسئولیت بین‌المللی دولت‌ها، مواد ۱۴ و ۱۵ (به‌اجمال).</w:t>
       </w:r>
     </w:p>
   </w:footnote>
@@ -20079,7 +19977,7 @@
           <w:sz w:val="20"/>
           <w:szCs w:val="20"/>
         </w:rPr>
-        <w:t xml:space="preserve">طرح مواد مسئولیت بین‌المللی دولت‌ها، ماده ۱۲.</w:t>
+        <w:t xml:space="preserve">طرح مواد مسئولیت بین‌المللی دولت‌ها، ماده ۳۲.</w:t>
       </w:r>
     </w:p>
   </w:footnote>
@@ -20112,7 +20010,7 @@
           <w:sz w:val="20"/>
           <w:szCs w:val="20"/>
         </w:rPr>
-        <w:t xml:space="preserve">طرح مواد مسئولیت بین‌المللی دولت‌ها، مواد ۱۴ و ۱۵ (به‌اجمال).</w:t>
+        <w:t xml:space="preserve">طرح مواد مسئولیت بین‌المللی دولت‌ها، مواد ۲۰ تا ۲۵.</w:t>
       </w:r>
     </w:p>
   </w:footnote>
@@ -20145,7 +20043,7 @@
           <w:sz w:val="20"/>
           <w:szCs w:val="20"/>
         </w:rPr>
-        <w:t xml:space="preserve">طرح مواد مسئولیت بین‌المللی دولت‌ها، ماده ۳۲.</w:t>
+        <w:t xml:space="preserve">طرح مواد مسئولیت بین‌المللی دولت‌ها، ماده ۲۵.</w:t>
       </w:r>
     </w:p>
   </w:footnote>
@@ -20178,7 +20076,7 @@
           <w:sz w:val="20"/>
           <w:szCs w:val="20"/>
         </w:rPr>
-        <w:t xml:space="preserve">طرح مواد مسئولیت بین‌المللی دولت‌ها، مواد ۲۰ تا ۲۵.</w:t>
+        <w:t xml:space="preserve">طرح مواد مسئولیت بین‌المللی دولت‌ها، مواد ۲۲ و ۴۹ تا ۵۴ (به‌اجمال).</w:t>
       </w:r>
     </w:p>
   </w:footnote>
@@ -20211,7 +20109,7 @@
           <w:sz w:val="20"/>
           <w:szCs w:val="20"/>
         </w:rPr>
-        <w:t xml:space="preserve">طرح مواد مسئولیت بین‌المللی دولت‌ها، ماده ۲۵.</w:t>
+        <w:t xml:space="preserve">طرح مواد مسئولیت بین‌المللی دولت‌ها، ماده ۲۳.</w:t>
       </w:r>
     </w:p>
   </w:footnote>
@@ -20244,7 +20142,7 @@
           <w:sz w:val="20"/>
           <w:szCs w:val="20"/>
         </w:rPr>
-        <w:t xml:space="preserve">طرح مواد مسئولیت بین‌المللی دولت‌ها، مواد ۲۲ و ۴۹ تا ۵۴ (به‌اجمال).</w:t>
+        <w:t xml:space="preserve">طرح مواد مسئولیت بین‌المللی دولت‌ها، ماده ۲۶.</w:t>
       </w:r>
     </w:p>
   </w:footnote>
@@ -20277,7 +20175,7 @@
           <w:sz w:val="20"/>
           <w:szCs w:val="20"/>
         </w:rPr>
-        <w:t xml:space="preserve">طرح مواد مسئولیت بین‌المللی دولت‌ها، ماده ۲۳.</w:t>
+        <w:t xml:space="preserve">طرح مواد مسئولیت بین‌المللی دولت‌ها، مواد ۳۰، ۳۱ و ۳۴ تا ۳۷.</w:t>
       </w:r>
     </w:p>
   </w:footnote>
@@ -20310,7 +20208,7 @@
           <w:sz w:val="20"/>
           <w:szCs w:val="20"/>
         </w:rPr>
-        <w:t xml:space="preserve">طرح مواد مسئولیت بین‌المللی دولت‌ها، ماده ۲۶.</w:t>
+        <w:t xml:space="preserve">کنوانسیون وین حقوق معاهدات، مواد ۷۰ و ۷۲.</w:t>
       </w:r>
     </w:p>
   </w:footnote>
@@ -20343,7 +20241,7 @@
           <w:sz w:val="20"/>
           <w:szCs w:val="20"/>
         </w:rPr>
-        <w:t xml:space="preserve">طرح مواد مسئولیت بین‌المللی دولت‌ها، مواد ۳۰، ۳۱ و ۳۴ تا ۳۷.</w:t>
+        <w:t xml:space="preserve">کنوانسیون وین حقوق معاهدات، مواد ۱۹ تا ۲۳.</w:t>
       </w:r>
     </w:p>
   </w:footnote>
@@ -20376,7 +20274,7 @@
           <w:sz w:val="20"/>
           <w:szCs w:val="20"/>
         </w:rPr>
-        <w:t xml:space="preserve">کنوانسیون وین حقوق معاهدات، مواد ۷۰ و ۷۲.</w:t>
+        <w:t xml:space="preserve">طرح مواد مسئولیت بین‌المللی دولت‌ها، مواد ۴۹ تا ۵۴ (به‌اجمال).</w:t>
       </w:r>
     </w:p>
   </w:footnote>
@@ -20409,7 +20307,7 @@
           <w:sz w:val="20"/>
           <w:szCs w:val="20"/>
         </w:rPr>
-        <w:t xml:space="preserve">کنوانسیون وین حقوق معاهدات، مواد ۱۹ تا ۲۳.</w:t>
+        <w:t xml:space="preserve">قضیه کارخانه کورزو (آلمان علیه لهستان)، رأی دیوان دائمی دادگستری بین‌المللی، ۱۹۲۸ (نشانی دقیق، نیازمند بررسی منبع اصلی است).</w:t>
       </w:r>
     </w:p>
   </w:footnote>
@@ -20442,7 +20340,7 @@
           <w:sz w:val="20"/>
           <w:szCs w:val="20"/>
         </w:rPr>
-        <w:t xml:space="preserve">طرح مواد مسئولیت بین‌المللی دولت‌ها، مواد ۴۹ تا ۵۴ (به‌اجمال).</w:t>
+        <w:t xml:space="preserve">اساسنامه دیوان بین‌المللی دادگستری، ماده ۳۶ (به‌اجمال).</w:t>
       </w:r>
     </w:p>
   </w:footnote>
@@ -20475,7 +20373,7 @@
           <w:sz w:val="20"/>
           <w:szCs w:val="20"/>
         </w:rPr>
-        <w:t xml:space="preserve">قضیه کارخانه کورزو (آلمان علیه لهستان)، رأی دیوان دائمی دادگستری بین‌المللی، ۱۹۲۸ (نشانی دقیق، نیازمند بررسی منبع اصلی است).</w:t>
+        <w:t xml:space="preserve">منشور سازمان ملل متحد، فصل ششم و هفتم (به‌اجمال).</w:t>
       </w:r>
     </w:p>
   </w:footnote>
@@ -20508,7 +20406,7 @@
           <w:sz w:val="20"/>
           <w:szCs w:val="20"/>
         </w:rPr>
-        <w:t xml:space="preserve">اساسنامه دیوان بین‌المللی دادگستری، ماده ۳۶ (به‌اجمال).</w:t>
+        <w:t xml:space="preserve">برای اسناد و تاریخ‌های دقیق، نیازمند بررسی منبع اصلی است.</w:t>
       </w:r>
     </w:p>
   </w:footnote>
@@ -20541,7 +20439,7 @@
           <w:sz w:val="20"/>
           <w:szCs w:val="20"/>
         </w:rPr>
-        <w:t xml:space="preserve">منشور سازمان ملل متحد، فصل ششم و هفتم (به‌اجمال).</w:t>
+        <w:t xml:space="preserve">برای اسناد و تاریخ‌های دقیق، نیازمند بررسی منبع اصلی است.</w:t>
       </w:r>
     </w:p>
   </w:footnote>
@@ -20607,7 +20505,7 @@
           <w:sz w:val="20"/>
           <w:szCs w:val="20"/>
         </w:rPr>
-        <w:t xml:space="preserve">برای اسناد و تاریخ‌های دقیق، نیازمند بررسی منبع اصلی است.</w:t>
+        <w:t xml:space="preserve">قانون اساسی جمهوری اسلامی ایران، اصل ۵.</w:t>
       </w:r>
     </w:p>
   </w:footnote>
@@ -20640,7 +20538,7 @@
           <w:sz w:val="20"/>
           <w:szCs w:val="20"/>
         </w:rPr>
-        <w:t xml:space="preserve">برای اسناد و تاریخ‌های دقیق، نیازمند بررسی منبع اصلی است.</w:t>
+        <w:t xml:space="preserve">قانون اساسی جمهوری اسلامی ایران، اصل ۱۰۷ (به‌اجمال).</w:t>
       </w:r>
     </w:p>
   </w:footnote>
@@ -20673,7 +20571,7 @@
           <w:sz w:val="20"/>
           <w:szCs w:val="20"/>
         </w:rPr>
-        <w:t xml:space="preserve">قانون اساسی جمهوری اسلامی ایران، اصل ۵.</w:t>
+        <w:t xml:space="preserve">قانون اساسی جمهوری اسلامی ایران، اصل ۱۰۹ (به‌اجمال).</w:t>
       </w:r>
     </w:p>
   </w:footnote>
@@ -20706,7 +20604,7 @@
           <w:sz w:val="20"/>
           <w:szCs w:val="20"/>
         </w:rPr>
-        <w:t xml:space="preserve">قانون اساسی جمهوری اسلامی ایران، اصل ۱۰۷ (به‌اجمال).</w:t>
+        <w:t xml:space="preserve">قانون اساسی جمهوری اسلامی ایران، اصل ۱۱۱ (به‌اجمال).</w:t>
       </w:r>
     </w:p>
   </w:footnote>
@@ -20739,7 +20637,7 @@
           <w:sz w:val="20"/>
           <w:szCs w:val="20"/>
         </w:rPr>
-        <w:t xml:space="preserve">قانون اساسی جمهوری اسلامی ایران، اصل ۱۰۹ (به‌اجمال).</w:t>
+        <w:t xml:space="preserve">برای متنِ سیاست‌های ابلاغی، ر.ک: پایگاه اطلاع‌رسانی دفتر مقام معظم رهبری (نشانی دقیق، نیازمند بررسی منبع اصلی است).</w:t>
       </w:r>
     </w:p>
   </w:footnote>
@@ -20772,7 +20670,7 @@
           <w:sz w:val="20"/>
           <w:szCs w:val="20"/>
         </w:rPr>
-        <w:t xml:space="preserve">قانون اساسی جمهوری اسلامی ایران، اصل ۱۱۱ (به‌اجمال).</w:t>
+        <w:t xml:space="preserve">برای صورت‌بندی دو دیدگاه، ر.ک: «ولایت مطلقه فقیه در قانون اساسی» و «مفهوم ولایت مطلقه فقیه در قانون اساسی جمهوری اسلامی ایران»، پایگاه اطلاع‌رسانی حوزه، به نشانی‌های یادشده در پیشینه پژوهش. همچنین ر.ک: سیدابوالفضل قاضی شریعت‌پناهی، حقوق اساسی و نهادهای سیاسی؛ و سیدمحمد هاشمی، حقوق اساسی جمهوری اسلامی ایران.</w:t>
       </w:r>
     </w:p>
   </w:footnote>
@@ -20805,7 +20703,7 @@
           <w:sz w:val="20"/>
           <w:szCs w:val="20"/>
         </w:rPr>
-        <w:t xml:space="preserve">برای متنِ سیاست‌های ابلاغی، ر.ک: پایگاه اطلاع‌رسانی دفتر مقام معظم رهبری (نشانی دقیق، نیازمند بررسی منبع اصلی است).</w:t>
+        <w:t xml:space="preserve">قانون اساسی جمهوری اسلامی ایران، اصل ۵.</w:t>
       </w:r>
     </w:p>
   </w:footnote>
@@ -20838,7 +20736,7 @@
           <w:sz w:val="20"/>
           <w:szCs w:val="20"/>
         </w:rPr>
-        <w:t xml:space="preserve">برای صورت‌بندی دو دیدگاه، ر.ک: «ولایت مطلقه فقیه در قانون اساسی» و «مفهوم ولایت مطلقه فقیه در قانون اساسی جمهوری اسلامی ایران»، پایگاه اطلاع‌رسانی حوزه، به نشانی‌های یادشده در پیشینه پژوهش. همچنین ر.ک: سیدابوالفضل قاضی شریعت‌پناهی، حقوق اساسی و نهادهای سیاسی؛ و سیدمحمد هاشمی، حقوق اساسی جمهوری اسلامی ایران.</w:t>
+        <w:t xml:space="preserve">قانون اساسی جمهوری اسلامی ایران، اصل ۵۷.</w:t>
       </w:r>
     </w:p>
   </w:footnote>
@@ -20871,7 +20769,7 @@
           <w:sz w:val="20"/>
           <w:szCs w:val="20"/>
         </w:rPr>
-        <w:t xml:space="preserve">قانون اساسی جمهوری اسلامی ایران، اصل ۵.</w:t>
+        <w:t xml:space="preserve">قانون اساسی جمهوری اسلامی ایران، اصل ۷۷.</w:t>
       </w:r>
     </w:p>
   </w:footnote>
@@ -20904,7 +20802,7 @@
           <w:sz w:val="20"/>
           <w:szCs w:val="20"/>
         </w:rPr>
-        <w:t xml:space="preserve">قانون اساسی جمهوری اسلامی ایران، اصل ۵۷.</w:t>
+        <w:t xml:space="preserve">قانون اساسی جمهوری اسلامی ایران، اصل ۱۱۰.</w:t>
       </w:r>
     </w:p>
   </w:footnote>
@@ -20937,7 +20835,7 @@
           <w:sz w:val="20"/>
           <w:szCs w:val="20"/>
         </w:rPr>
-        <w:t xml:space="preserve">قانون اساسی جمهوری اسلامی ایران، اصل ۷۷.</w:t>
+        <w:t xml:space="preserve">قانون اساسی جمهوری اسلامی ایران، اصل ۱۱۲.</w:t>
       </w:r>
     </w:p>
   </w:footnote>
@@ -20970,7 +20868,7 @@
           <w:sz w:val="20"/>
           <w:szCs w:val="20"/>
         </w:rPr>
-        <w:t xml:space="preserve">قانون اساسی جمهوری اسلامی ایران، اصل ۱۱۰.</w:t>
+        <w:t xml:space="preserve">قانون اساسی جمهوری اسلامی ایران، اصل ۱۲۵.</w:t>
       </w:r>
     </w:p>
   </w:footnote>
@@ -21003,7 +20901,7 @@
           <w:sz w:val="20"/>
           <w:szCs w:val="20"/>
         </w:rPr>
-        <w:t xml:space="preserve">قانون اساسی جمهوری اسلامی ایران، اصل ۱۱۲.</w:t>
+        <w:t xml:space="preserve">قانون اساسی جمهوری اسلامی ایران، اصل ۱۵۲.</w:t>
       </w:r>
     </w:p>
   </w:footnote>
@@ -21036,7 +20934,7 @@
           <w:sz w:val="20"/>
           <w:szCs w:val="20"/>
         </w:rPr>
-        <w:t xml:space="preserve">قانون اساسی جمهوری اسلامی ایران، اصل ۱۲۵.</w:t>
+        <w:t xml:space="preserve">قانون اساسی جمهوری اسلامی ایران، اصل ۱۵۳.</w:t>
       </w:r>
     </w:p>
   </w:footnote>
@@ -21069,7 +20967,7 @@
           <w:sz w:val="20"/>
           <w:szCs w:val="20"/>
         </w:rPr>
-        <w:t xml:space="preserve">قانون اساسی جمهوری اسلامی ایران، اصل ۱۵۲.</w:t>
+        <w:t xml:space="preserve">قانون اساسی جمهوری اسلامی ایران، اصل ۱۵۴.</w:t>
       </w:r>
     </w:p>
   </w:footnote>
@@ -21102,7 +21000,7 @@
           <w:sz w:val="20"/>
           <w:szCs w:val="20"/>
         </w:rPr>
-        <w:t xml:space="preserve">قانون اساسی جمهوری اسلامی ایران، اصل ۱۵۳.</w:t>
+        <w:t xml:space="preserve">قانون اساسی جمهوری اسلامی ایران، اصل ۱۷۶ (به‌اجمال).</w:t>
       </w:r>
     </w:p>
   </w:footnote>
@@ -21135,7 +21033,7 @@
           <w:sz w:val="20"/>
           <w:szCs w:val="20"/>
         </w:rPr>
-        <w:t xml:space="preserve">قانون اساسی جمهوری اسلامی ایران، اصل ۱۵۴.</w:t>
+        <w:t xml:space="preserve">کنوانسیون وین حقوق معاهدات، ماده ۱.</w:t>
       </w:r>
     </w:p>
   </w:footnote>
@@ -21168,7 +21066,7 @@
           <w:sz w:val="20"/>
           <w:szCs w:val="20"/>
         </w:rPr>
-        <w:t xml:space="preserve">قانون اساسی جمهوری اسلامی ایران، اصل ۱۷۶ (به‌اجمال).</w:t>
+        <w:t xml:space="preserve">کنوانسیون وین حقوق معاهدات، ماده ۲ (به‌اجمال).</w:t>
       </w:r>
     </w:p>
   </w:footnote>
@@ -21201,7 +21099,7 @@
           <w:sz w:val="20"/>
           <w:szCs w:val="20"/>
         </w:rPr>
-        <w:t xml:space="preserve">کنوانسیون وین حقوق معاهدات، ماده ۱.</w:t>
+        <w:t xml:space="preserve">کنوانسیون وین حقوق معاهدات، ماده ۲۶.</w:t>
       </w:r>
     </w:p>
   </w:footnote>
@@ -21234,7 +21132,7 @@
           <w:sz w:val="20"/>
           <w:szCs w:val="20"/>
         </w:rPr>
-        <w:t xml:space="preserve">کنوانسیون وین حقوق معاهدات، ماده ۲ (به‌اجمال).</w:t>
+        <w:t xml:space="preserve">کنوانسیون وین حقوق معاهدات، ماده ۲۷.</w:t>
       </w:r>
     </w:p>
   </w:footnote>
@@ -21267,7 +21165,7 @@
           <w:sz w:val="20"/>
           <w:szCs w:val="20"/>
         </w:rPr>
-        <w:t xml:space="preserve">کنوانسیون وین حقوق معاهدات، ماده ۲۶.</w:t>
+        <w:t xml:space="preserve">کنوانسیون وین حقوق معاهدات، ماده ۴۶ (به‌اجمال).</w:t>
       </w:r>
     </w:p>
   </w:footnote>
@@ -21300,7 +21198,7 @@
           <w:sz w:val="20"/>
           <w:szCs w:val="20"/>
         </w:rPr>
-        <w:t xml:space="preserve">کنوانسیون وین حقوق معاهدات، ماده ۲۷.</w:t>
+        <w:t xml:space="preserve">کنوانسیون وین حقوق معاهدات، ماده ۵۳ (به‌اجمال).</w:t>
       </w:r>
     </w:p>
   </w:footnote>
@@ -21333,7 +21231,7 @@
           <w:sz w:val="20"/>
           <w:szCs w:val="20"/>
         </w:rPr>
-        <w:t xml:space="preserve">کنوانسیون وین حقوق معاهدات، ماده ۴۶ (به‌اجمال).</w:t>
+        <w:t xml:space="preserve">کنوانسیون وین حقوق معاهدات، مواد ۵۴ تا ۶۴ (به‌اجمال).</w:t>
       </w:r>
     </w:p>
   </w:footnote>
@@ -21366,7 +21264,7 @@
           <w:sz w:val="20"/>
           <w:szCs w:val="20"/>
         </w:rPr>
-        <w:t xml:space="preserve">کنوانسیون وین حقوق معاهدات، ماده ۵۳ (به‌اجمال).</w:t>
+        <w:t xml:space="preserve">کنوانسیون وین حقوق معاهدات، مواد ۶۵ تا ۶۸ (به‌اجمال).</w:t>
       </w:r>
     </w:p>
   </w:footnote>
@@ -21399,77 +21297,11 @@
           <w:sz w:val="20"/>
           <w:szCs w:val="20"/>
         </w:rPr>
-        <w:t xml:space="preserve">کنوانسیون وین حقوق معاهدات، مواد ۵۴ تا ۶۴ (به‌اجمال).</w:t>
+        <w:t xml:space="preserve">کنوانسیون وین حقوق معاهدات، مواد ۷۰ و ۷۲ (به‌اجمال).</w:t>
       </w:r>
     </w:p>
   </w:footnote>
   <w:footnote w:id="145">
-    <w:p>
-      <w:pPr>
-        <w:bidi w:val="1"/>
-        <w:jc w:val="both"/>
-        <w:spacing w:after="40" w:line="240" w:lineRule="auto"/>
-      </w:pPr>
-      <w:r>
-        <w:rPr>
-          <w:rFonts w:ascii="B Lotus" w:hAnsi="B Lotus" w:cs="B Lotus"/>
-          <w:sz w:val="20"/>
-          <w:szCs w:val="20"/>
-        </w:rPr>
-        <w:footnoteRef/>
-      </w:r>
-      <w:r>
-        <w:rPr>
-          <w:rFonts w:ascii="B Lotus" w:hAnsi="B Lotus" w:cs="B Lotus"/>
-          <w:sz w:val="20"/>
-          <w:szCs w:val="20"/>
-        </w:rPr>
-        <w:t xml:space="preserve"> </w:t>
-      </w:r>
-      <w:r>
-        <w:rPr>
-          <w:rFonts w:ascii="B Lotus" w:hAnsi="B Lotus" w:cs="B Lotus"/>
-          <w:sz w:val="20"/>
-          <w:szCs w:val="20"/>
-        </w:rPr>
-        <w:t xml:space="preserve">کنوانسیون وین حقوق معاهدات، مواد ۶۵ تا ۶۸ (به‌اجمال).</w:t>
-      </w:r>
-    </w:p>
-  </w:footnote>
-  <w:footnote w:id="146">
-    <w:p>
-      <w:pPr>
-        <w:bidi w:val="1"/>
-        <w:jc w:val="both"/>
-        <w:spacing w:after="40" w:line="240" w:lineRule="auto"/>
-      </w:pPr>
-      <w:r>
-        <w:rPr>
-          <w:rFonts w:ascii="B Lotus" w:hAnsi="B Lotus" w:cs="B Lotus"/>
-          <w:sz w:val="20"/>
-          <w:szCs w:val="20"/>
-        </w:rPr>
-        <w:footnoteRef/>
-      </w:r>
-      <w:r>
-        <w:rPr>
-          <w:rFonts w:ascii="B Lotus" w:hAnsi="B Lotus" w:cs="B Lotus"/>
-          <w:sz w:val="20"/>
-          <w:szCs w:val="20"/>
-        </w:rPr>
-        <w:t xml:space="preserve"> </w:t>
-      </w:r>
-      <w:r>
-        <w:rPr>
-          <w:rFonts w:ascii="B Lotus" w:hAnsi="B Lotus" w:cs="B Lotus"/>
-          <w:sz w:val="20"/>
-          <w:szCs w:val="20"/>
-        </w:rPr>
-        <w:t xml:space="preserve">کنوانسیون وین حقوق معاهدات، مواد ۷۰ و ۷۲ (به‌اجمال).</w:t>
-      </w:r>
-    </w:p>
-  </w:footnote>
-  <w:footnote w:id="147">
     <w:p>
       <w:pPr>
         <w:bidi w:val="1"/>

</xml_diff>

<commit_message>
Footer shows only centered page number
Co-authored-by: arena-agent <297053741+arena-agent@users.noreply.github.com>
</commit_message>
<xml_diff>
--- a/Resaleh_Sath3_Hadi_Shabestani_v2.docx
+++ b/Resaleh_Sath3_Hadi_Shabestani_v2.docx
@@ -16542,109 +16542,55 @@
   <w:p>
     <w:pPr>
       <w:pStyle w:val="Footer"/>
+      <w:bidi w:val="1"/>
+      <w:spacing w:before="80" w:after="0" w:line="288" w:lineRule="auto"/>
+      <w:jc w:val="center"/>
+      <w:pBdr>
+        <w:top w:val="single" w:sz="6" w:space="6" w:color="BFBFBF"/>
+      </w:pBdr>
     </w:pPr>
     <w:r/>
+    <w:r>
+      <w:rPr>
+        <w:rFonts w:ascii="B Lotus" w:hAnsi="B Lotus" w:cs="B Lotus" w:eastAsia="B Lotus"/>
+        <w:b w:val="0"/>
+        <w:i w:val="0"/>
+        <w:sz w:val="22"/>
+        <w:szCs w:val="22"/>
+      </w:rPr>
+      <w:t xml:space="preserve">صفحه </w:t>
+    </w:r>
+    <w:r>
+      <w:rPr>
+        <w:rFonts w:ascii="B Lotus" w:hAnsi="B Lotus" w:cs="B Lotus" w:eastAsia="B Lotus"/>
+        <w:b w:val="0"/>
+        <w:i w:val="0"/>
+        <w:sz w:val="22"/>
+        <w:szCs w:val="22"/>
+      </w:rPr>
+      <w:fldChar w:fldCharType="begin"/>
+    </w:r>
+    <w:r>
+      <w:rPr>
+        <w:rFonts w:ascii="B Lotus" w:hAnsi="B Lotus" w:cs="B Lotus" w:eastAsia="B Lotus"/>
+        <w:b w:val="0"/>
+        <w:i w:val="0"/>
+        <w:sz w:val="22"/>
+        <w:szCs w:val="22"/>
+      </w:rPr>
+      <w:instrText xml:space="preserve">PAGE \* MERGEFORMAT</w:instrText>
+    </w:r>
+    <w:r>
+      <w:rPr>
+        <w:rFonts w:ascii="B Lotus" w:hAnsi="B Lotus" w:cs="B Lotus" w:eastAsia="B Lotus"/>
+        <w:b w:val="0"/>
+        <w:i w:val="0"/>
+        <w:sz w:val="22"/>
+        <w:szCs w:val="22"/>
+      </w:rPr>
+      <w:fldChar w:fldCharType="end"/>
+    </w:r>
   </w:p>
-  <w:tbl>
-    <w:tblPr>
-      <w:tblW w:type="auto" w:w="0"/>
-      <w:tblLayout w:type="autofit"/>
-      <w:tblLook w:firstColumn="1" w:firstRow="1" w:lastColumn="0" w:lastRow="0" w:noHBand="0" w:noVBand="1" w:val="04A0"/>
-      <w:bidiVisual/>
-      <w:tblBorders>
-        <w:left w:val="nil" w:sz="0" w:space="0" w:color="auto"/>
-        <w:bottom w:val="nil" w:sz="0" w:space="0" w:color="auto"/>
-        <w:right w:val="nil" w:sz="0" w:space="0" w:color="auto"/>
-        <w:insideH w:val="nil" w:sz="0" w:space="0" w:color="auto"/>
-        <w:insideV w:val="nil" w:sz="0" w:space="0" w:color="auto"/>
-        <w:top w:val="single" w:sz="6" w:space="6" w:color="BFBFBF"/>
-      </w:tblBorders>
-    </w:tblPr>
-    <w:tblGrid>
-      <w:gridCol w:w="4535"/>
-      <w:gridCol w:w="4535"/>
-    </w:tblGrid>
-    <w:tr>
-      <w:tc>
-        <w:tcPr>
-          <w:tcW w:type="dxa" w:w="6236"/>
-        </w:tcPr>
-        <w:p>
-          <w:pPr>
-            <w:widowControl/>
-            <w:bidi w:val="1"/>
-            <w:spacing w:before="80" w:after="0" w:line="288" w:lineRule="auto"/>
-            <w:jc w:val="right"/>
-          </w:pPr>
-          <w:r/>
-          <w:r>
-            <w:rPr>
-              <w:rFonts w:ascii="B Lotus" w:hAnsi="B Lotus" w:cs="B Lotus" w:eastAsia="B Lotus"/>
-              <w:b w:val="0"/>
-              <w:i w:val="0"/>
-              <w:color w:val="595659"/>
-              <w:sz w:val="18"/>
-              <w:szCs w:val="18"/>
-            </w:rPr>
-            <w:t>رساله علمی سطح سه ـ هادی شبستانی</w:t>
-          </w:r>
-        </w:p>
-      </w:tc>
-      <w:tc>
-        <w:tcPr>
-          <w:tcW w:type="dxa" w:w="2835"/>
-        </w:tcPr>
-        <w:p>
-          <w:pPr>
-            <w:spacing w:before="80" w:after="0" w:line="288" w:lineRule="auto"/>
-            <w:jc w:val="left"/>
-            <w:bidi w:val="1"/>
-          </w:pPr>
-          <w:r/>
-          <w:r>
-            <w:rPr>
-              <w:rFonts w:ascii="B Lotus" w:hAnsi="B Lotus" w:cs="B Lotus" w:eastAsia="B Lotus"/>
-              <w:b w:val="0"/>
-              <w:i w:val="0"/>
-              <w:sz w:val="20"/>
-              <w:szCs w:val="20"/>
-            </w:rPr>
-            <w:t xml:space="preserve">صفحه </w:t>
-          </w:r>
-          <w:r>
-            <w:rPr>
-              <w:rFonts w:ascii="B Lotus" w:hAnsi="B Lotus" w:cs="B Lotus" w:eastAsia="B Lotus"/>
-              <w:b w:val="0"/>
-              <w:i w:val="0"/>
-              <w:sz w:val="20"/>
-              <w:szCs w:val="20"/>
-            </w:rPr>
-            <w:fldChar w:fldCharType="begin"/>
-          </w:r>
-          <w:r>
-            <w:rPr>
-              <w:rFonts w:ascii="B Lotus" w:hAnsi="B Lotus" w:cs="B Lotus" w:eastAsia="B Lotus"/>
-              <w:b w:val="0"/>
-              <w:i w:val="0"/>
-              <w:sz w:val="20"/>
-              <w:szCs w:val="20"/>
-            </w:rPr>
-            <w:instrText xml:space="preserve">PAGE \* MERGEFORMAT</w:instrText>
-          </w:r>
-          <w:r>
-            <w:rPr>
-              <w:rFonts w:ascii="B Lotus" w:hAnsi="B Lotus" w:cs="B Lotus" w:eastAsia="B Lotus"/>
-              <w:b w:val="0"/>
-              <w:i w:val="0"/>
-              <w:sz w:val="20"/>
-              <w:szCs w:val="20"/>
-            </w:rPr>
-            <w:fldChar w:fldCharType="end"/>
-          </w:r>
-        </w:p>
-      </w:tc>
-    </w:tr>
-  </w:tbl>
 </w:ftr>
 </file>
 

</xml_diff>

<commit_message>
Premium beautification: framed cover, title frames, goftar bands, book typography, TOC indents
Co-authored-by: arena-agent <297053741+arena-agent@users.noreply.github.com>
</commit_message>
<xml_diff>
--- a/Resaleh_Sath3_Hadi_Shabestani_v2.docx
+++ b/Resaleh_Sath3_Hadi_Shabestani_v2.docx
@@ -191,9 +191,20 @@
       </w:r>
     </w:p>
     <w:p>
-      <w:r>
-        <w:br w:type="page"/>
-      </w:r>
+      <w:pPr>
+        <w:sectPr>
+          <w:pgSz w:w="11906" w:h="16838"/>
+          <w:pgMar w:top="1417" w:right="1701" w:bottom="1417" w:left="1134" w:header="680" w:footer="680" w:gutter="0"/>
+          <w:cols w:space="720"/>
+          <w:docGrid w:linePitch="360"/>
+          <w:pgBorders w:offsetFrom="page">
+            <w:top w:val="single" w:sz="12" w:space="24" w:color="1F3864"/>
+            <w:left w:val="single" w:sz="12" w:space="24" w:color="1F3864"/>
+            <w:bottom w:val="single" w:sz="12" w:space="24" w:color="1F3864"/>
+            <w:right w:val="single" w:sz="12" w:space="24" w:color="1F3864"/>
+          </w:pgBorders>
+        </w:sectPr>
+      </w:pPr>
     </w:p>
     <w:p/>
     <w:p/>
@@ -204,7 +215,7 @@
       <w:pPr>
         <w:widowControl/>
         <w:bidi w:val="1"/>
-        <w:spacing w:before="0" w:after="120" w:line="288" w:lineRule="auto"/>
+        <w:spacing w:before="0" w:after="240" w:line="288" w:lineRule="auto"/>
         <w:jc w:val="center"/>
       </w:pPr>
       <w:r>
@@ -217,6 +228,18 @@
         </w:rPr>
         <w:t>بِسْمِ اللَّهِ الرَّحْمَنِ الرَّحِيمِ</w:t>
       </w:r>
+    </w:p>
+    <w:p>
+      <w:pPr>
+        <w:widowControl/>
+        <w:bidi w:val="1"/>
+        <w:spacing w:before="0" w:after="120" w:line="288" w:lineRule="auto"/>
+        <w:ind w:right="2835" w:left="2835"/>
+        <w:jc w:val="center"/>
+        <w:pBdr>
+          <w:bottom w:val="single" w:sz="12" w:space="6" w:color="1F3864"/>
+        </w:pBdr>
+      </w:pPr>
     </w:p>
     <w:p>
       <w:r>
@@ -246,9 +269,20 @@
       <w:pPr>
         <w:widowControl/>
         <w:bidi w:val="1"/>
-        <w:spacing w:before="0" w:after="120" w:line="288" w:lineRule="auto"/>
-        <w:ind w:firstLine="283"/>
-        <w:jc w:val="both"/>
+        <w:spacing w:before="0" w:after="240" w:line="288" w:lineRule="auto"/>
+        <w:ind w:right="1701" w:left="1701"/>
+        <w:jc w:val="center"/>
+        <w:pBdr>
+          <w:bottom w:val="single" w:sz="12" w:space="6" w:color="1F3864"/>
+        </w:pBdr>
+      </w:pPr>
+    </w:p>
+    <w:p>
+      <w:pPr>
+        <w:widowControl/>
+        <w:bidi w:val="1"/>
+        <w:spacing w:before="0" w:after="160" w:line="288" w:lineRule="auto"/>
+        <w:jc w:val="center"/>
       </w:pPr>
       <w:r>
         <w:rPr>
@@ -265,9 +299,8 @@
       <w:pPr>
         <w:widowControl/>
         <w:bidi w:val="1"/>
-        <w:spacing w:before="0" w:after="120" w:line="288" w:lineRule="auto"/>
-        <w:ind w:firstLine="283"/>
-        <w:jc w:val="both"/>
+        <w:spacing w:before="0" w:after="160" w:line="288" w:lineRule="auto"/>
+        <w:jc w:val="center"/>
       </w:pPr>
       <w:r>
         <w:rPr>
@@ -284,9 +317,8 @@
       <w:pPr>
         <w:widowControl/>
         <w:bidi w:val="1"/>
-        <w:spacing w:before="0" w:after="120" w:line="288" w:lineRule="auto"/>
-        <w:ind w:firstLine="283"/>
-        <w:jc w:val="both"/>
+        <w:spacing w:before="0" w:after="160" w:line="288" w:lineRule="auto"/>
+        <w:jc w:val="center"/>
       </w:pPr>
       <w:r>
         <w:rPr>
@@ -303,9 +335,8 @@
       <w:pPr>
         <w:widowControl/>
         <w:bidi w:val="1"/>
-        <w:spacing w:before="0" w:after="120" w:line="288" w:lineRule="auto"/>
-        <w:ind w:firstLine="283"/>
-        <w:jc w:val="both"/>
+        <w:spacing w:before="0" w:after="160" w:line="288" w:lineRule="auto"/>
+        <w:jc w:val="center"/>
       </w:pPr>
       <w:r>
         <w:rPr>
@@ -322,9 +353,8 @@
       <w:pPr>
         <w:widowControl/>
         <w:bidi w:val="1"/>
-        <w:spacing w:before="0" w:after="120" w:line="288" w:lineRule="auto"/>
-        <w:ind w:firstLine="283"/>
-        <w:jc w:val="both"/>
+        <w:spacing w:before="0" w:after="160" w:line="288" w:lineRule="auto"/>
+        <w:jc w:val="center"/>
       </w:pPr>
       <w:r>
         <w:rPr>
@@ -341,9 +371,8 @@
       <w:pPr>
         <w:widowControl/>
         <w:bidi w:val="1"/>
-        <w:spacing w:before="0" w:after="120" w:line="288" w:lineRule="auto"/>
-        <w:ind w:firstLine="283"/>
-        <w:jc w:val="both"/>
+        <w:spacing w:before="0" w:after="160" w:line="288" w:lineRule="auto"/>
+        <w:jc w:val="center"/>
       </w:pPr>
       <w:r>
         <w:rPr>
@@ -661,7 +690,6 @@
         <w:widowControl/>
         <w:bidi w:val="1"/>
         <w:spacing w:before="0" w:after="120" w:line="288" w:lineRule="auto"/>
-        <w:ind w:firstLine="283"/>
         <w:jc w:val="both"/>
       </w:pPr>
       <w:r>
@@ -771,7 +799,6 @@
         <w:widowControl/>
         <w:bidi w:val="1"/>
         <w:spacing w:before="0" w:after="120" w:line="288" w:lineRule="auto"/>
-        <w:ind w:firstLine="283"/>
         <w:jc w:val="both"/>
       </w:pPr>
       <w:r>
@@ -907,7 +934,23 @@
     <w:p>
       <w:pPr>
         <w:widowControl/>
-        <w:bidi w:val="1"/>
+        <w:spacing w:before="0" w:after="120" w:line="288" w:lineRule="auto"/>
+        <w:jc w:val="both"/>
+      </w:pPr>
+      <w:r>
+        <w:rPr>
+          <w:rFonts w:ascii="B Lotus" w:hAnsi="B Lotus" w:cs="B Lotus" w:eastAsia="B Lotus"/>
+          <w:b w:val="0"/>
+          <w:i w:val="0"/>
+          <w:sz w:val="26"/>
+          <w:szCs w:val="26"/>
+        </w:rPr>
+        <w:t>This thesis addresses a single, pressing question: if the continued performance of an international treaty turns harmful to the Islamic state, may the Guardian Jurist (Vali-e Faqih) withdraw from it? And if so, on what basis, under what conditions, and with what consequences? The question lies at the intersection of three normative systems — Imami jurisprudence, the constitutional law of the Islamic Republic of Iran, and public international law — and none of the three can answer it alone.</w:t>
+      </w:r>
+    </w:p>
+    <w:p>
+      <w:pPr>
+        <w:widowControl/>
         <w:spacing w:before="0" w:after="120" w:line="288" w:lineRule="auto"/>
         <w:ind w:firstLine="283"/>
         <w:jc w:val="both"/>
@@ -917,16 +960,15 @@
           <w:rFonts w:ascii="B Lotus" w:hAnsi="B Lotus" w:cs="B Lotus" w:eastAsia="B Lotus"/>
           <w:b w:val="0"/>
           <w:i w:val="0"/>
-          <w:sz w:val="28"/>
-          <w:szCs w:val="28"/>
-        </w:rPr>
-        <w:t>This thesis addresses a single, pressing question: if the continued performance of an international treaty turns harmful to the Islamic state, may the Guardian Jurist (Vali-e Faqih) withdraw from it? And if so, on what basis, under what conditions, and with what consequences? The question lies at the intersection of three normative systems — Imami jurisprudence, the constitutional law of the Islamic Republic of Iran, and public international law — and none of the three can answer it alone.</w:t>
-      </w:r>
-    </w:p>
-    <w:p>
-      <w:pPr>
-        <w:widowControl/>
-        <w:bidi w:val="1"/>
+          <w:sz w:val="26"/>
+          <w:szCs w:val="26"/>
+        </w:rPr>
+        <w:t>The method is library-based, analytical and inferential: ijtihadi reasoning in fiqh, textual and case-law analysis in international law, and constitutional interpretation in domestic law. The thesis is organized in three parts and five chapters: concepts and preliminaries; the juristic analysis (the obligation of fidelity to treaties and the grounds for lawful withdrawal); and the legal analysis (international responsibility and the constitutional status of the decision).</w:t>
+      </w:r>
+    </w:p>
+    <w:p>
+      <w:pPr>
+        <w:widowControl/>
         <w:spacing w:before="0" w:after="120" w:line="288" w:lineRule="auto"/>
         <w:ind w:firstLine="283"/>
         <w:jc w:val="both"/>
@@ -936,16 +978,15 @@
           <w:rFonts w:ascii="B Lotus" w:hAnsi="B Lotus" w:cs="B Lotus" w:eastAsia="B Lotus"/>
           <w:b w:val="0"/>
           <w:i w:val="0"/>
-          <w:sz w:val="28"/>
-          <w:szCs w:val="28"/>
-        </w:rPr>
-        <w:t>The method is library-based, analytical and inferential: ijtihadi reasoning in fiqh, textual and case-law analysis in international law, and constitutional interpretation in domestic law. The thesis is organized in three parts and five chapters: concepts and preliminaries; the juristic analysis (the obligation of fidelity to treaties and the grounds for lawful withdrawal); and the legal analysis (international responsibility and the constitutional status of the decision).</w:t>
-      </w:r>
-    </w:p>
-    <w:p>
-      <w:pPr>
-        <w:widowControl/>
-        <w:bidi w:val="1"/>
+          <w:sz w:val="26"/>
+          <w:szCs w:val="26"/>
+        </w:rPr>
+        <w:t>The findings are five. First, the primary rule is the obligation of fidelity (wafa), established by Quranic verses, traditions, the practice of the Infallibles, and reason. Second, departure from this rule is lawful only as a governmental decision (hukm hukumati) of the Guardian Jurist in a situation of genuine conflict of interests (tazahum), supported by four independent grounds: tazahum itself, the theory of governmental ordinance, the rules of negation of harm and hardship, and the paramount duty of preserving the Islamic system. Third, this permission is fenced by eight practical conditions that together form a decision-maker's checklist. Fourth, three levels of analysis must be strictly separated: juristic permissibility, domestic constitutionality, and international responsibility — each with its own forum and criteria. Fifth, the Guardian Jurist's authority in this domain is implicit and guardianship-based rather than express, and is best explained through a fourfold division of authority (express, implicit, guardianship-based, governmental).</w:t>
+      </w:r>
+    </w:p>
+    <w:p>
+      <w:pPr>
+        <w:widowControl/>
         <w:spacing w:before="0" w:after="120" w:line="288" w:lineRule="auto"/>
         <w:ind w:firstLine="283"/>
         <w:jc w:val="both"/>
@@ -953,29 +994,10 @@
       <w:r>
         <w:rPr>
           <w:rFonts w:ascii="B Lotus" w:hAnsi="B Lotus" w:cs="B Lotus" w:eastAsia="B Lotus"/>
-          <w:b w:val="0"/>
-          <w:i w:val="0"/>
-          <w:sz w:val="28"/>
-          <w:szCs w:val="28"/>
-        </w:rPr>
-        <w:t>The findings are five. First, the primary rule is the obligation of fidelity (wafa), established by Quranic verses, traditions, the practice of the Infallibles, and reason. Second, departure from this rule is lawful only as a governmental decision (hukm hukumati) of the Guardian Jurist in a situation of genuine conflict of interests (tazahum), supported by four independent grounds: tazahum itself, the theory of governmental ordinance, the rules of negation of harm and hardship, and the paramount duty of preserving the Islamic system. Third, this permission is fenced by eight practical conditions that together form a decision-maker's checklist. Fourth, three levels of analysis must be strictly separated: juristic permissibility, domestic constitutionality, and international responsibility — each with its own forum and criteria. Fifth, the Guardian Jurist's authority in this domain is implicit and guardianship-based rather than express, and is best explained through a fourfold division of authority (express, implicit, guardianship-based, governmental).</w:t>
-      </w:r>
-    </w:p>
-    <w:p>
-      <w:pPr>
-        <w:widowControl/>
-        <w:bidi w:val="1"/>
-        <w:spacing w:before="0" w:after="120" w:line="288" w:lineRule="auto"/>
-        <w:ind w:firstLine="283"/>
-        <w:jc w:val="both"/>
-      </w:pPr>
-      <w:r>
-        <w:rPr>
-          <w:rFonts w:ascii="B Lotus" w:hAnsi="B Lotus" w:cs="B Lotus" w:eastAsia="B Lotus"/>
           <w:b/>
           <w:i w:val="0"/>
-          <w:sz w:val="28"/>
-          <w:szCs w:val="28"/>
+          <w:sz w:val="26"/>
+          <w:szCs w:val="26"/>
         </w:rPr>
         <w:t>Keywords:</w:t>
       </w:r>
@@ -984,8 +1006,8 @@
           <w:rFonts w:ascii="B Lotus" w:hAnsi="B Lotus" w:cs="B Lotus" w:eastAsia="B Lotus"/>
           <w:b w:val="0"/>
           <w:i w:val="0"/>
-          <w:sz w:val="28"/>
-          <w:szCs w:val="28"/>
+          <w:sz w:val="26"/>
+          <w:szCs w:val="26"/>
         </w:rPr>
         <w:t xml:space="preserve"> Guardian Jurist, international obligations, treaties, fidelity to covenants, governmental ordinance, tazahum, expediency, international responsibility, Vienna Convention, constitution.</w:t>
       </w:r>
@@ -1002,6 +1024,10 @@
         <w:spacing w:before="120" w:after="240" w:line="288" w:lineRule="auto"/>
         <w:jc w:val="center"/>
         <w:keepNext w:val="1"/>
+        <w:pBdr>
+          <w:top w:val="single" w:sz="12" w:space="8" w:color="1F3864"/>
+          <w:bottom w:val="single" w:sz="12" w:space="8" w:color="1F3864"/>
+        </w:pBdr>
       </w:pPr>
       <w:r>
         <w:rPr>
@@ -1099,902 +1125,937 @@
           <w:pgMar w:top="1417" w:right="1701" w:bottom="1417" w:left="1134" w:header="680" w:footer="680" w:gutter="0"/>
           <w:cols w:space="720"/>
           <w:docGrid w:linePitch="360"/>
+          <w:pgBorders w:offsetFrom="page">
+            <w:top w:val="single" w:sz="12" w:space="24" w:color="1F3864"/>
+            <w:left w:val="single" w:sz="12" w:space="24" w:color="1F3864"/>
+            <w:bottom w:val="single" w:sz="12" w:space="24" w:color="1F3864"/>
+            <w:right w:val="single" w:sz="12" w:space="24" w:color="1F3864"/>
+          </w:pgBorders>
         </w:sectPr>
       </w:pPr>
     </w:p>
+    <w:p/>
+    <w:p/>
     <w:p>
       <w:pPr>
         <w:pStyle w:val="TH-Fasl"/>
         <w:widowControl/>
         <w:bidi w:val="1"/>
-        <w:spacing w:before="120" w:after="200" w:line="288" w:lineRule="auto"/>
+        <w:spacing w:before="120" w:after="240" w:line="288" w:lineRule="auto"/>
+        <w:jc w:val="center"/>
+        <w:pBdr>
+          <w:top w:val="single" w:sz="12" w:space="8" w:color="1F3864"/>
+          <w:bottom w:val="single" w:sz="12" w:space="8" w:color="1F3864"/>
+        </w:pBdr>
+        <w:keepNext w:val="1"/>
+      </w:pPr>
+      <w:r>
+        <w:rPr>
+          <w:rFonts w:ascii="B Titr" w:hAnsi="B Titr" w:cs="B Titr" w:eastAsia="B Titr"/>
+          <w:b/>
+          <w:i w:val="0"/>
+          <w:sz w:val="44"/>
+          <w:szCs w:val="44"/>
+        </w:rPr>
+        <w:t>مقدمه: کلیات تحقیق</w:t>
+      </w:r>
+    </w:p>
+    <w:p>
+      <w:pPr>
+        <w:pStyle w:val="TH-Goftar"/>
+        <w:widowControl/>
+        <w:bidi w:val="1"/>
+        <w:spacing w:before="200" w:after="120" w:line="288" w:lineRule="auto"/>
+        <w:jc w:val="right"/>
+        <w:keepNext w:val="1"/>
+        <w:shd w:val="clear" w:fill="EDEDED"/>
+      </w:pPr>
+      <w:r>
+        <w:rPr>
+          <w:rFonts w:ascii="B Titr" w:hAnsi="B Titr" w:cs="B Titr" w:eastAsia="B Titr"/>
+          <w:b/>
+          <w:i w:val="0"/>
+          <w:sz w:val="32"/>
+          <w:szCs w:val="32"/>
+        </w:rPr>
+        <w:t>بیان مسئله</w:t>
+      </w:r>
+    </w:p>
+    <w:p>
+      <w:pPr>
+        <w:pStyle w:val="TH-Body"/>
+        <w:widowControl/>
+        <w:bidi w:val="1"/>
+        <w:spacing w:before="0" w:after="120" w:line="288" w:lineRule="auto"/>
+        <w:jc w:val="both"/>
+      </w:pPr>
+      <w:r>
+        <w:rPr>
+          <w:rFonts w:ascii="B Lotus" w:hAnsi="B Lotus" w:cs="B Lotus" w:eastAsia="B Lotus"/>
+          <w:b w:val="0"/>
+          <w:i w:val="0"/>
+          <w:sz w:val="28"/>
+          <w:szCs w:val="28"/>
+        </w:rPr>
+        <w:t>تصور کنید حکومتی ـ هر حکومتی، از جمله حکومت اسلامی ما ـ پیمانی با دولت‌های دیگر بسته است؛ پیمانی که روز امضایش مصلحت بود، عاقلانه بود، به نفع کشور بود. سال‌ها می‌گذرد. دنیا عوض می‌شود، طرف مقابل عهدشکنی می‌کند یا شرایط به‌کلی دگرگون می‌شود، و حالا ادامه اجرای همان پیمان دارد به کشور ضرر می‌زند؛ ضرری جدی، نه جزئی. حاکم چه باید بکند؟ به پیمان پایبند بماند و ضرر را تحمل کند، چون «عهدشکنی حرام است»؟ یا از پیمان عدول کند و مصلحت امروز کشور را نجات بدهد، چون «حفظ نظام واجب است»؟</w:t>
+      </w:r>
+    </w:p>
+    <w:p>
+      <w:pPr>
+        <w:pStyle w:val="TH-Body"/>
+        <w:widowControl/>
+        <w:bidi w:val="1"/>
+        <w:spacing w:before="0" w:after="120" w:line="288" w:lineRule="auto"/>
+        <w:ind w:firstLine="283"/>
+        <w:jc w:val="both"/>
+      </w:pPr>
+      <w:r>
+        <w:rPr>
+          <w:rFonts w:ascii="B Lotus" w:hAnsi="B Lotus" w:cs="B Lotus" w:eastAsia="B Lotus"/>
+          <w:b w:val="0"/>
+          <w:i w:val="0"/>
+          <w:sz w:val="28"/>
+          <w:szCs w:val="28"/>
+        </w:rPr>
+        <w:t>این دوراهی، خلاصه مسئله این رساله است. ولی سادگیِ صورتش فریبنده است؛ چون در باطن، سه نظام هنجاریِ بزرگ را به هم گره می‌زند که هرکدام منطق و ادبیات و مراجع خودشان را دارند. فقه امامیه می‌گوید «اوفوا بالعقود» و نقض عهد را ـ مگر به حکم دلیل ـ حرام می‌داند؛ و این حرف، حرف کوچکی نیست، چون پشتش آیات صریح قرآن و روایات متواتر و سیره معصومان ایستاده. حقوق اساسی جمهوری اسلامی می‌پرسد حدود اختیارات رهبری تا کجاست و آیا تصمیم یک مقام می‌تواند قانون مصوب مجلس را کنار بزند؛ و این پرسش هم جدی است، چون به استقلال قوا و حکومت قانون گره خورده. و حقوق بین‌الملل می‌گوید نقض یک‌جانبه معاهده مسئولیت می‌آورد و توجیهات داخلی دولت‌ها ـ حتی حکم شرعی و قانون اساسی‌شان ـ در برابر طرف مقابل پذیرفته نیست؛ و این هم واقعیتی است که نمی‌شود نادیده‌اش گرفت، چون هزینه‌اش را مردم می‌دهند.</w:t>
+      </w:r>
+    </w:p>
+    <w:p>
+      <w:pPr>
+        <w:pStyle w:val="TH-Body"/>
+        <w:widowControl/>
+        <w:bidi w:val="1"/>
+        <w:spacing w:before="0" w:after="120" w:line="288" w:lineRule="auto"/>
+        <w:ind w:firstLine="283"/>
+        <w:jc w:val="both"/>
+      </w:pPr>
+      <w:r>
+        <w:rPr>
+          <w:rFonts w:ascii="B Lotus" w:hAnsi="B Lotus" w:cs="B Lotus" w:eastAsia="B Lotus"/>
+          <w:b w:val="0"/>
+          <w:i w:val="0"/>
+          <w:sz w:val="28"/>
+          <w:szCs w:val="28"/>
+        </w:rPr>
+        <w:t>حالا مسئله دقیقاً همین‌جاست: هیچ‌کدام از این سه پاسخِ تک‌بعدی به‌تنهایی کافی نیست، و کنار هم گذاشتنِ ساده‌شان هم جواب نمی‌دهد. فقیهی که از حقوق بین‌الملل بی‌خبر است، حکمی می‌دهد که اجرایش هزینه‌های سنگین و پیش‌بینی‌نشده بر کشور تحمیل می‌کند و بعد همه می‌گویند «فقه از واقعیت جداست». حقوق‌دانی که فقه را نمی‌شناسد، حکمی را نامشروع اعلام می‌کند که شرعاً واجب بوده و بعد همه می‌گویند «حقوق با شرع ناسازگار است». و تصمیم‌گیر جلسه‌ای که هر سه را با هم ندیده، تصمیمی می‌گیرد که یا شرعی نیست یا قانونی نیست یا پرهزینه است ـ و گاهی هر سه با هم. تناقض ظاهری میان «وجوب وفای به عهد» و «اختیار حکومتی ولی فقیه» و «مسئولیت بین‌المللی دولت»، گرهی است که فقط با تحلیل هم‌زمان و تفکیک‌شده هر سه سطح باز می‌شود. و این گره، دقیقاً همان چیزی است که این رساله آمده تا بازش کند؛ نه با شعار، نه با مصادره به مطلوب، بلکه با استدلال قدم‌به‌قدم.</w:t>
+      </w:r>
+    </w:p>
+    <w:p>
+      <w:pPr>
+        <w:pStyle w:val="TH-Body"/>
+        <w:widowControl/>
+        <w:bidi w:val="1"/>
+        <w:spacing w:before="0" w:after="120" w:line="288" w:lineRule="auto"/>
+        <w:ind w:firstLine="283"/>
+        <w:jc w:val="both"/>
+      </w:pPr>
+      <w:r>
+        <w:rPr>
+          <w:rFonts w:ascii="B Lotus" w:hAnsi="B Lotus" w:cs="B Lotus" w:eastAsia="B Lotus"/>
+          <w:b w:val="0"/>
+          <w:i w:val="0"/>
+          <w:sz w:val="28"/>
+          <w:szCs w:val="28"/>
+        </w:rPr>
+        <w:t>سؤال اصلی پژوهش پس این است: «عدول ولی فقیه از تعهدات بین‌المللی دولت اسلامی از منظر فقه امامیه و حقوق بین‌الملل چه مبانی، شرایط و آثاری دارد؟» و برای جواب دادن به آن، ناگزیرم هفت سؤال فرعی را هم جواب بدهم: مسئولیت بین‌المللی چنین تصمیمی چیست و چگونه مدیریت می‌شود؛ سازوکارهای تعلیق و خاتمه موجه در حقوق معاهدات کدام‌اند؛ ادله وجوب وفا در فقه تا کجا پیش می‌روند و از کجا متوقف می‌شوند؛ نسبت حکم حکومتی و تزاحم با تعهدات بین‌المللی چگونه است و چه ضوابطی دارد؛ دلالت اصول قانون اساسی بر این اختیار چقدر است؛ از سیره پیامبر و امیرالمؤمنین چه الگویی می‌شود گرفت؛ و آثار عملی تصمیم در سطوح داخلی و بین‌المللی چیست.</w:t>
+      </w:r>
+    </w:p>
+    <w:p>
+      <w:pPr>
+        <w:pStyle w:val="TH-Goftar"/>
+        <w:widowControl/>
+        <w:bidi w:val="1"/>
+        <w:spacing w:before="200" w:after="120" w:line="288" w:lineRule="auto"/>
+        <w:jc w:val="right"/>
+        <w:keepNext w:val="1"/>
+        <w:shd w:val="clear" w:fill="EDEDED"/>
+      </w:pPr>
+      <w:r>
+        <w:rPr>
+          <w:rFonts w:ascii="B Titr" w:hAnsi="B Titr" w:cs="B Titr" w:eastAsia="B Titr"/>
+          <w:b/>
+          <w:i w:val="0"/>
+          <w:sz w:val="32"/>
+          <w:szCs w:val="32"/>
+        </w:rPr>
+        <w:t>ضرورت و اهمیت تحقیق</w:t>
+      </w:r>
+    </w:p>
+    <w:p>
+      <w:pPr>
+        <w:pStyle w:val="TH-Body"/>
+        <w:widowControl/>
+        <w:bidi w:val="1"/>
+        <w:spacing w:before="0" w:after="120" w:line="288" w:lineRule="auto"/>
+        <w:jc w:val="both"/>
+      </w:pPr>
+      <w:r>
+        <w:rPr>
+          <w:rFonts w:ascii="B Lotus" w:hAnsi="B Lotus" w:cs="B Lotus" w:eastAsia="B Lotus"/>
+          <w:b w:val="0"/>
+          <w:i w:val="0"/>
+          <w:sz w:val="28"/>
+          <w:szCs w:val="28"/>
+        </w:rPr>
+        <w:t>اگر کسی بپرسد این تحقیق چه ضرورتی دارد، من فقط یک جواب می‌دهم: تاریخ چهل و چندساله انقلاب را ورق بزنید. از قضیه گروگان‌ها و عهدنامه الجزایر تا پرونده هسته‌ای و برجام و خروج آمریکا و کاهش تعهدات ایران، بارها کشور ما در برابر همین دوراهی قرار گرفته: پایبندی به تعهدی که اجرایش روزبه‌روز پرهزینه‌تر می‌شود، یا عدول از آن با همه پرسش‌های شرعی و حقوقی‌اش. و هر بار، تحلیل‌ها عمدتاً سیاسی و جناحی و احساسی بوده، نه فقهی و حقوقی و ضابطه‌مند. هر دولتی ساز خودش را زده و هیچ چارچوب ماندگاری از خود به جا نگذاشته. این خلأ تحلیلی، خودش به‌تنهایی ضرورت این پژوهش را اثبات می‌کند؛ چون تصمیمی که مبنا و ضابطه نداشته باشد، هر بار از نو محل مناقشه می‌شود و کشور را به ورطه آزمون‌وخطا می‌اندازد.</w:t>
+      </w:r>
+    </w:p>
+    <w:p>
+      <w:pPr>
+        <w:pStyle w:val="TH-Body"/>
+        <w:widowControl/>
+        <w:bidi w:val="1"/>
+        <w:spacing w:before="0" w:after="120" w:line="288" w:lineRule="auto"/>
+        <w:ind w:firstLine="283"/>
+        <w:jc w:val="both"/>
+      </w:pPr>
+      <w:r>
+        <w:rPr>
+          <w:rFonts w:ascii="B Lotus" w:hAnsi="B Lotus" w:cs="B Lotus" w:eastAsia="B Lotus"/>
+          <w:b w:val="0"/>
+          <w:i w:val="0"/>
+          <w:sz w:val="28"/>
+          <w:szCs w:val="28"/>
+        </w:rPr>
+        <w:t>ضرورت نظری هم دست‌کمی از ضرورت عملی ندارد، اگر بیشتر نباشد. از یک سو، فقه ما در باب معاهدات بین‌المللی امروزی ـ که با عهدنامه‌های صدر اسلام تفاوت‌های ساختاری جدی دارند ـ هنوز به بلوغ و تفصیل لازم نرسیده؛ و احکام حکومتی مرتبط با سیاست خارجی از کم‌کارکرده‌ترین ابواب فقه حکومتی ماست. ما درباره طهارت و صلات هزاران صفحه داریم ولی درباره این‌که حاکم اسلامی در برابر پیمان بین‌المللیِ زیان‌بار چه تکلیفی دارد، کمتر از انگشتان یک دست رساله جدی داریم. این فقر، شایسته فقهی نیست که ادعای حکومت دارد. از سوی دیگر، حقوق بین‌الملل معاصر ـ با کنوانسیون وین و طرح مسئولیت و سازوکارهای نوینش ـ نیازمند خوانش فقهی و بومی است تا فقیه ما بتواند در برابرش موضع دقیق و منصفانه بگیرد؛ نه پذیرش بی‌چون‌وچرای منفعلانه، نه رد احساسیِ بی‌دلیل. ما باید با این نظام حقوقی «گفت‌وگو» کنیم، و گفت‌وگو اول نیازمند «فهم» است.</w:t>
+      </w:r>
+    </w:p>
+    <w:p>
+      <w:pPr>
+        <w:pStyle w:val="TH-Body"/>
+        <w:widowControl/>
+        <w:bidi w:val="1"/>
+        <w:spacing w:before="0" w:after="120" w:line="288" w:lineRule="auto"/>
+        <w:ind w:firstLine="283"/>
+        <w:jc w:val="both"/>
+      </w:pPr>
+      <w:r>
+        <w:rPr>
+          <w:rFonts w:ascii="B Lotus" w:hAnsi="B Lotus" w:cs="B Lotus" w:eastAsia="B Lotus"/>
+          <w:b w:val="0"/>
+          <w:i w:val="0"/>
+          <w:sz w:val="28"/>
+          <w:szCs w:val="28"/>
+        </w:rPr>
+        <w:t>و دست آخر، مخاطب این رساله فقط حوزه و دانشگاه نیست. تصمیم‌گیران و مشاوران حقوقی و فقهی نظام ـ آقایانی که در شورای عالی امنیت ملی و وزارت خارجه و مجمع تشخیص می‌نشینند ـ بیش از هر کس دیگری به چنین چارچوبی نیاز دارند. رساله‌ای که مبنای فقهی و ضوابط عملی و آثار بین‌المللی یک تصمیم حکومتی را یک‌جا و با زبانی قابل فهم برای تصمیم‌گیر ارائه بدهد، در واقع پلی است میان نظر و عمل؛ و همین پیوند، اهمیتش را دوچندان می‌کند. من این رساله را برای میز آن‌ها نوشته‌ام، نه فقط برای قفسه کتابخانه.</w:t>
+      </w:r>
+    </w:p>
+    <w:p>
+      <w:pPr>
+        <w:pStyle w:val="TH-Goftar"/>
+        <w:widowControl/>
+        <w:bidi w:val="1"/>
+        <w:spacing w:before="200" w:after="120" w:line="288" w:lineRule="auto"/>
+        <w:jc w:val="right"/>
+        <w:keepNext w:val="1"/>
+        <w:shd w:val="clear" w:fill="EDEDED"/>
+      </w:pPr>
+      <w:r>
+        <w:rPr>
+          <w:rFonts w:ascii="B Titr" w:hAnsi="B Titr" w:cs="B Titr" w:eastAsia="B Titr"/>
+          <w:b/>
+          <w:i w:val="0"/>
+          <w:sz w:val="32"/>
+          <w:szCs w:val="32"/>
+        </w:rPr>
+        <w:t>اهداف تحقیق</w:t>
+      </w:r>
+    </w:p>
+    <w:p>
+      <w:pPr>
+        <w:pStyle w:val="TH-Body"/>
+        <w:widowControl/>
+        <w:bidi w:val="1"/>
+        <w:spacing w:before="0" w:after="120" w:line="288" w:lineRule="auto"/>
+        <w:jc w:val="both"/>
+      </w:pPr>
+      <w:r>
+        <w:rPr>
+          <w:rFonts w:ascii="B Lotus" w:hAnsi="B Lotus" w:cs="B Lotus" w:eastAsia="B Lotus"/>
+          <w:b w:val="0"/>
+          <w:i w:val="0"/>
+          <w:sz w:val="28"/>
+          <w:szCs w:val="28"/>
+        </w:rPr>
+        <w:t>هدف اصلی این پژوهش ارائه تحلیل فقهی ـ حقوقی جامع و ضابطه‌مند از عدول ولی فقیه از تعهدات بین‌المللی است؛ تحلیلی که هم تکلیف شرعی حاکم را روشن کند، هم جایگاه حقوقی تصمیمش را، و هم آثار بین‌المللی‌اش را ـ و هر سه را در یک چارچوب منسجم و کاربردی که تصمیم‌گیر بتواند واقعاً از آن استفاده کند، نه این‌که فقط بخواند و کنار بگذارد.</w:t>
+      </w:r>
+    </w:p>
+    <w:p>
+      <w:pPr>
+        <w:pStyle w:val="TH-Body"/>
+        <w:widowControl/>
+        <w:bidi w:val="1"/>
+        <w:spacing w:before="0" w:after="120" w:line="288" w:lineRule="auto"/>
+        <w:ind w:firstLine="283"/>
+        <w:jc w:val="both"/>
+      </w:pPr>
+      <w:r>
+        <w:rPr>
+          <w:rFonts w:ascii="B Lotus" w:hAnsi="B Lotus" w:cs="B Lotus" w:eastAsia="B Lotus"/>
+          <w:b w:val="0"/>
+          <w:i w:val="0"/>
+          <w:sz w:val="28"/>
+          <w:szCs w:val="28"/>
+        </w:rPr>
+        <w:t>در کنارِ هدفِ اصلی، سه هدفِ «میانی» هم دارم که گفتنشان را لازم می‌دانم، چون جهتِ کلِ رساله را مشخص می‌کنند: یکم، «رفعِ خلطِ سطوح» ـ یعنی نشان دادنِ این‌که جوازِ فقهی و مشروعیتِ داخلی و مسئولیتِ بین‌المللی سه چیزِ جداست و قاطی کردنشان خطاست؛ چون به تجربه دیده‌ام که بیشترِ مناقشه‌های این حوزه، ریشه در همین خلط دارد، نه در اختلافِ واقعی. دوم، «مهارِ جواز» ـ یعنی نشان دادنِ این‌که عدول اگر جایز است، بی‌ضابطه نیست و هشت قفل دارد؛ چون از خطرِ سوءاستفاده آگاهم و نمی‌خواهم رساله‌ام دستاویزِ عهدشکنیِ بی‌مبنا شود. و سوم، «دستِ تصمیم‌گیر را گرفتن» ـ یعنی ارائه چارچوبی که واقعاً قابلِ استفاده باشد، نه فقط قابلِ خواندن؛ چون رساله‌ای که روی میزِ تصمیم‌گیر نرود، هرچقدر هم که علمی باشد، رسالتش را کامل نکرده.</w:t>
+      </w:r>
+    </w:p>
+    <w:p>
+      <w:pPr>
+        <w:pStyle w:val="TH-Body"/>
+        <w:widowControl/>
+        <w:bidi w:val="1"/>
+        <w:spacing w:before="0" w:after="120" w:line="288" w:lineRule="auto"/>
+        <w:ind w:firstLine="283"/>
+        <w:jc w:val="both"/>
+      </w:pPr>
+      <w:r>
+        <w:rPr>
+          <w:rFonts w:ascii="B Lotus" w:hAnsi="B Lotus" w:cs="B Lotus" w:eastAsia="B Lotus"/>
+          <w:b w:val="0"/>
+          <w:i w:val="0"/>
+          <w:sz w:val="28"/>
+          <w:szCs w:val="28"/>
+        </w:rPr>
+        <w:t>اهداف فرعی هفت‌تاست که هرکدام به یکی از سؤالات فرعی گره خورده و هرکدام فصلی از رساله را تغذیه می‌کند: تحلیل مسئولیت بین‌المللی تصمیم مطابق طرح مواد کمیسیون حقوق بین‌الملل و راه‌های کاهشش؛ شناخت سازوکارهای تعلیق و خاتمه موجه در کنوانسیون وین و شرایط هرکدام؛ بررسی جامع و منصفانه ادله وجوب وفای به عهد ـ آیات، روایات، سیره و عقل ـ و تعیین دقیق قلمرو و استثناهایشان؛ تبیین نسبت حکم حکومتی و قاعده تزاحم با تعهدات بین‌المللی و استخراج ضوابط عملی؛ تحلیل دلالت اصول قانون اساسی ـ به‌ویژه اصول ۵، ۵۷، ۷۷، ۱۱۰، ۱۱۲ و ۱۲۵ ـ بر اختیار ولی فقیه؛ استقصای سیره پیامبر اکرم و امیرالمؤمنین در عهدنامه‌ها و استخراج الگوهای رفتاری‌شان؛ و تبیین آثار عملی و اجرایی تصمیم از مرحله مقدمات تا مرحله پسااجرا.</w:t>
+      </w:r>
+    </w:p>
+    <w:p>
+      <w:pPr>
+        <w:pStyle w:val="TH-Goftar"/>
+        <w:widowControl/>
+        <w:bidi w:val="1"/>
+        <w:spacing w:before="200" w:after="120" w:line="288" w:lineRule="auto"/>
+        <w:jc w:val="right"/>
+        <w:keepNext w:val="1"/>
+        <w:shd w:val="clear" w:fill="EDEDED"/>
+      </w:pPr>
+      <w:r>
+        <w:rPr>
+          <w:rFonts w:ascii="B Titr" w:hAnsi="B Titr" w:cs="B Titr" w:eastAsia="B Titr"/>
+          <w:b/>
+          <w:i w:val="0"/>
+          <w:sz w:val="32"/>
+          <w:szCs w:val="32"/>
+        </w:rPr>
+        <w:t>سؤالات تحقیق</w:t>
+      </w:r>
+    </w:p>
+    <w:p>
+      <w:pPr>
+        <w:pStyle w:val="TH-Body"/>
+        <w:widowControl/>
+        <w:bidi w:val="1"/>
+        <w:spacing w:before="0" w:after="120" w:line="288" w:lineRule="auto"/>
+        <w:jc w:val="both"/>
+      </w:pPr>
+      <w:r>
+        <w:rPr>
+          <w:rFonts w:ascii="B Lotus" w:hAnsi="B Lotus" w:cs="B Lotus" w:eastAsia="B Lotus"/>
+          <w:b w:val="0"/>
+          <w:i w:val="0"/>
+          <w:sz w:val="28"/>
+          <w:szCs w:val="28"/>
+        </w:rPr>
+        <w:t>سؤال اصلی: «عدول ولی فقیه از تعهدات بین‌المللی دولت اسلامی از منظر فقه امامیه و حقوق بین‌الملل چه مبانی، شرایط و آثاری دارد؟»</w:t>
+      </w:r>
+    </w:p>
+    <w:p>
+      <w:pPr>
+        <w:pStyle w:val="TH-Body"/>
+        <w:widowControl/>
+        <w:bidi w:val="1"/>
+        <w:spacing w:before="0" w:after="120" w:line="288" w:lineRule="auto"/>
+        <w:ind w:firstLine="283"/>
+        <w:jc w:val="both"/>
+      </w:pPr>
+      <w:r>
+        <w:rPr>
+          <w:rFonts w:ascii="B Lotus" w:hAnsi="B Lotus" w:cs="B Lotus" w:eastAsia="B Lotus"/>
+          <w:b w:val="0"/>
+          <w:i w:val="0"/>
+          <w:sz w:val="28"/>
+          <w:szCs w:val="28"/>
+        </w:rPr>
+        <w:t>و سؤالات فرعی: مسئولیت بین‌المللی دولت اسلامی در فرض عدول ولی فقیه از تعهدات چیست و چگونه می‌شود آن را مدیریت کرد؛ سازوکارهای تعلیق و خاتمه موجه در نظام حقوق معاهدات کدام‌اند و نسبتشان با عدول حکومتی چیست؛ ادله وجوب وفای به عهد در فقه امامیه چه قلمرو و استثناهایی دارند؛ نسبت حکم حکومتی و تزاحم با تعهدات بین‌المللی دولت اسلامی چگونه است و عدول حکومتی چه ضوابطی دارد؛ دلالت اصول قانون اساسی جمهوری اسلامی ایران بر اختیار ولی فقیه در این حوزه چقدر و چگونه است؛ سیره پیامبر اکرم و امیرالمؤمنین در عهدنامه‌ها چه الگوهایی برای تصمیم حکومتی امروز ارائه می‌دهد؛ و آثار عملی و اجرایی عدول از تعهدات بین‌المللی در سطوح داخلی و بین‌المللی چیست.</w:t>
+      </w:r>
+    </w:p>
+    <w:p>
+      <w:pPr>
+        <w:pStyle w:val="TH-Goftar"/>
+        <w:widowControl/>
+        <w:bidi w:val="1"/>
+        <w:spacing w:before="200" w:after="120" w:line="288" w:lineRule="auto"/>
+        <w:jc w:val="right"/>
+        <w:keepNext w:val="1"/>
+        <w:shd w:val="clear" w:fill="EDEDED"/>
+      </w:pPr>
+      <w:r>
+        <w:rPr>
+          <w:rFonts w:ascii="B Titr" w:hAnsi="B Titr" w:cs="B Titr" w:eastAsia="B Titr"/>
+          <w:b/>
+          <w:i w:val="0"/>
+          <w:sz w:val="32"/>
+          <w:szCs w:val="32"/>
+        </w:rPr>
+        <w:t>فرضیه تحقیق</w:t>
+      </w:r>
+    </w:p>
+    <w:p>
+      <w:pPr>
+        <w:pStyle w:val="TH-Body"/>
+        <w:widowControl/>
+        <w:bidi w:val="1"/>
+        <w:spacing w:before="0" w:after="120" w:line="288" w:lineRule="auto"/>
+        <w:jc w:val="both"/>
+      </w:pPr>
+      <w:r>
+        <w:rPr>
+          <w:rFonts w:ascii="B Lotus" w:hAnsi="B Lotus" w:cs="B Lotus" w:eastAsia="B Lotus"/>
+          <w:b w:val="0"/>
+          <w:i w:val="0"/>
+          <w:sz w:val="28"/>
+          <w:szCs w:val="28"/>
+        </w:rPr>
+        <w:t>فرضیه اصلی این پژوهش این است: «عدول ولی فقیه از تعهدات بین‌المللی در چارچوب قاعده تزاحم و حکم حکومتی و با رعایت ضوابط استخراج‌شده از ادله فقهی، شرعاً جایز و بلکه گاه واجب است؛ مشروط بر این‌که مصلحت اهمی در کار باشد، از مجرای قانونی و نهادی بگذرد، و آثار بین‌المللی‌اش ـ از جمله مسئولیت دولت ـ در محاسبه مصلحت لحاظ شده باشد.» هر قیدی از این قیود بار استدلالی دارد و در فصول آینده یک‌به‌یک اثبات می‌شود؛ و اگر خواننده‌ای با فرضیه مخالف است، باید بگوید با کدام قید مخالف است، چون ردِ بی‌قیدوشرطِ کل فرضیه، بدون نقد قیودش، نقد علمی نیست.</w:t>
+      </w:r>
+    </w:p>
+    <w:p>
+      <w:pPr>
+        <w:pStyle w:val="TH-Body"/>
+        <w:widowControl/>
+        <w:bidi w:val="1"/>
+        <w:spacing w:before="0" w:after="120" w:line="288" w:lineRule="auto"/>
+        <w:ind w:firstLine="283"/>
+        <w:jc w:val="both"/>
+      </w:pPr>
+      <w:r>
+        <w:rPr>
+          <w:rFonts w:ascii="B Lotus" w:hAnsi="B Lotus" w:cs="B Lotus" w:eastAsia="B Lotus"/>
+          <w:b w:val="0"/>
+          <w:i w:val="0"/>
+          <w:sz w:val="28"/>
+          <w:szCs w:val="28"/>
+        </w:rPr>
+        <w:t>فرضیه‌های فرعی هم این‌هایند: تصمیم ولی فقیه به دولت منتسب می‌شود و در صورت نقضِ بدون مجوز، مسئولیت بین‌المللی می‌آورد؛ ولی این مسئولیت مانع جواز شرعی نیست، بلکه بخشی از هزینه‌ای است که باید در ترازوی مصلحت سنجیده شود ـ نه بیش، نه کم. سازوکارهای وین ـ تعلیق، خاتمه، تغییر بنیادین اوضاع ـ راه‌های حقوقیِ کم‌هزینه‌تری‌اند که تا وقتی بازند باید مقدم بر عدول یک‌جانبه باشند؛ عدول یک‌جانبه آخرین راه است، نه اولین راه. اطلاقات ادله وفا منصرف به عقود متعارف و شرایط عادی‌اند و شامل تزاحم مصلحتی نمی‌شوند؛ و این انصراف را با شواهد متنی و سیاقی اثبات می‌کنم، نه با ادعا. و در حقوق اساسی، اختیار ولی فقیه در این حوزه از نوع «اختیار ضمنی و ولایی» است نه صریح؛ یعنی از بندهای عام اصل ۱۱۰ و اصل ۵۷ استنباط می‌شود، نه این‌که در متن قانون اساسی ذکر شده باشد ـ و هر ادعای خلافی خلاف واقعیت متنی است.</w:t>
+      </w:r>
+    </w:p>
+    <w:p>
+      <w:pPr>
+        <w:pStyle w:val="TH-Goftar"/>
+        <w:widowControl/>
+        <w:bidi w:val="1"/>
+        <w:spacing w:before="200" w:after="120" w:line="288" w:lineRule="auto"/>
+        <w:jc w:val="right"/>
+        <w:keepNext w:val="1"/>
+        <w:shd w:val="clear" w:fill="EDEDED"/>
+      </w:pPr>
+      <w:r>
+        <w:rPr>
+          <w:rFonts w:ascii="B Titr" w:hAnsi="B Titr" w:cs="B Titr" w:eastAsia="B Titr"/>
+          <w:b/>
+          <w:i w:val="0"/>
+          <w:sz w:val="32"/>
+          <w:szCs w:val="32"/>
+        </w:rPr>
+        <w:t>پیشینه تحقیق</w:t>
+      </w:r>
+    </w:p>
+    <w:p>
+      <w:pPr>
+        <w:pStyle w:val="TH-Body"/>
+        <w:widowControl/>
+        <w:bidi w:val="1"/>
+        <w:spacing w:before="0" w:after="120" w:line="288" w:lineRule="auto"/>
+        <w:jc w:val="both"/>
+      </w:pPr>
+      <w:r>
+        <w:rPr>
+          <w:rFonts w:ascii="B Lotus" w:hAnsi="B Lotus" w:cs="B Lotus" w:eastAsia="B Lotus"/>
+          <w:b w:val="0"/>
+          <w:i w:val="0"/>
+          <w:sz w:val="28"/>
+          <w:szCs w:val="28"/>
+        </w:rPr>
+        <w:t>این موضوع ـ با این صورت‌بندی سه‌سطحی ـ تا آن‌جا که بررسی من رسیده، سابقه مستقلی ندارد. یعنی رساله یا مقاله‌ای که «عدول ولی فقیه از تعهدات بین‌المللی» را هم‌زمان از سه زاویه فقه و قانون اساسی و حقوق بین‌الملل بررسی کرده باشد، نیافتم؛ و هرچه گشتم، یا کارهای تک‌بعدی یافتم یا حرف‌های پراکنده. ولی این به معنای بی‌سابقه بودن مطلق نیست؛ هرکدام از اضلاع سه‌گانه‌اش پیشینه غنی و قابل‌استفاده‌ای دارند که بذرهای این پژوهش در آن‌ها پراکنده است و من کوشیده‌ام همه را ببینم و در جای خودش به کار ببرم. انصاف علمی اقتضا می‌کند بگویم روی شانه چه کسانی ایستاده‌ام.</w:t>
+      </w:r>
+    </w:p>
+    <w:p>
+      <w:pPr>
+        <w:pStyle w:val="TH-Body"/>
+        <w:widowControl/>
+        <w:bidi w:val="1"/>
+        <w:spacing w:before="0" w:after="120" w:line="288" w:lineRule="auto"/>
+        <w:ind w:firstLine="283"/>
+        <w:jc w:val="both"/>
+      </w:pPr>
+      <w:r>
+        <w:rPr>
+          <w:rFonts w:ascii="B Lotus" w:hAnsi="B Lotus" w:cs="B Lotus" w:eastAsia="B Lotus"/>
+          <w:b w:val="0"/>
+          <w:i w:val="0"/>
+          <w:sz w:val="28"/>
+          <w:szCs w:val="28"/>
+        </w:rPr>
+        <w:t>در ضلع فقهی، سه دسته منبع هست. دسته اول کتب قواعد فقهیه و ابواب عقود: سید محمدحسن بجنوردی در القواعد الفقهیه (قاعده لزوم) و میرزای نائینی در منیة الطالب و شیخ انصاری در المکاسب و الخیارات، قواعد عمومی لزوم و خیارات را پی‌ریخته‌اند؛ هرچند هیچ‌کدام مستقیم به معاهدات بین‌المللی امروزی نپرداخته‌اند و سخن گفتن از انتساب مستقیم نظر به آن‌ها در این مسئله، بدون تسامح نیست ـ و من این تسامح را روا نمی‌دارم. دسته دوم کتب جهاد و سیر و فقه سیاسی: جواهر الکلام در کتاب الجهاد (احکام هدنه و امان)، تحریر الوسیله امام خمینی، و آثاری مثل فقه سیاسی جوادی آملی و ولایت فقیه امام و شئون و اختیارات ولایت فقیه منتظری، احکام عهدنامه‌ها و گستره ولایت را بحث کرده‌اند و من وامدار همه‌شان هستم. و دسته سوم مقالات و رساله‌های معاصر فقه بین‌الملل اسلام که پراکنده‌اند و در متن رساله به آن‌ها ارجاع داده‌ام.</w:t>
+      </w:r>
+    </w:p>
+    <w:p>
+      <w:pPr>
+        <w:pStyle w:val="TH-Body"/>
+        <w:widowControl/>
+        <w:bidi w:val="1"/>
+        <w:spacing w:before="0" w:after="120" w:line="288" w:lineRule="auto"/>
+        <w:ind w:firstLine="283"/>
+        <w:jc w:val="both"/>
+      </w:pPr>
+      <w:r>
+        <w:rPr>
+          <w:rFonts w:ascii="B Lotus" w:hAnsi="B Lotus" w:cs="B Lotus" w:eastAsia="B Lotus"/>
+          <w:b w:val="0"/>
+          <w:i w:val="0"/>
+          <w:sz w:val="28"/>
+          <w:szCs w:val="28"/>
+        </w:rPr>
+        <w:t>در ضلع حقوق اساسی، تفاسیر قانون اساسی ـ به‌ویژه آثار قاضی شریعت‌پناهی و سیدمحمد هاشمی در حقوق اساسی جمهوری اسلامی ایران ـ و تحلیل‌های منتشره در پایگاه حوزه درباره اصل ۵۷ (ولایت مطلقه) و تفسیر شورای نگهبان از اصل ۱۱۲، و قوانین مصوب درباره معاهدات (آیین‌نامه داخلی مجلس و مقررات اجرایی مرتبط) منابع اصلی‌اند.</w:t>
+      </w:r>
+    </w:p>
+    <w:p>
+      <w:pPr>
+        <w:pStyle w:val="TH-Body"/>
+        <w:widowControl/>
+        <w:bidi w:val="1"/>
+        <w:spacing w:before="0" w:after="120" w:line="288" w:lineRule="auto"/>
+        <w:ind w:firstLine="283"/>
+        <w:jc w:val="both"/>
+      </w:pPr>
+      <w:r>
+        <w:rPr>
+          <w:rFonts w:ascii="B Lotus" w:hAnsi="B Lotus" w:cs="B Lotus" w:eastAsia="B Lotus"/>
+          <w:b w:val="0"/>
+          <w:i w:val="0"/>
+          <w:sz w:val="28"/>
+          <w:szCs w:val="28"/>
+        </w:rPr>
+        <w:t>و در ضلع حقوق بین‌الملل، کنوانسیون وین حقوق معاهدات (۱۹۶۹) و طرح مواد مسئولیت بین‌المللی دولت‌ها (۲۰۰۱) و رویه دیوان بین‌المللی دادگستری ـ به‌ویژه قضایای گابچیکوو و گروگان‌ها و نیکاراگوئه ـ شالوده تحلیل‌اند؛ و در ادبیات فارسی هم آثاری چون حقوق معاهدات بین‌المللی ضیایی بیگدلی و حقوق بین‌الملل عمومی صفری (در صورت تطابق با چاپ‌های موجود، وگرنه نیازمند بررسی منبع اصلی) راهگشا بوده‌اند.</w:t>
+      </w:r>
+    </w:p>
+    <w:p>
+      <w:pPr>
+        <w:pStyle w:val="TH-Body"/>
+        <w:widowControl/>
+        <w:bidi w:val="1"/>
+        <w:spacing w:before="0" w:after="120" w:line="288" w:lineRule="auto"/>
+        <w:ind w:firstLine="283"/>
+        <w:jc w:val="both"/>
+      </w:pPr>
+      <w:r>
+        <w:rPr>
+          <w:rFonts w:ascii="B Lotus" w:hAnsi="B Lotus" w:cs="B Lotus" w:eastAsia="B Lotus"/>
+          <w:b w:val="0"/>
+          <w:i w:val="0"/>
+          <w:sz w:val="28"/>
+          <w:szCs w:val="28"/>
+        </w:rPr>
+        <w:t>در کنار این سه ضلع، دو دسته منبعِ تکمیلی هم هست که نباید ناگفته بماند. دسته اول، ادبیات عربِ معاصر در «فقه روابط بین‌الملل» است: آثاری چون السیر و فقه الحرب و السلام در اسلام و نوشته‌های وهبه زحیلی و دیگران درباره احکام جهاد و عهدنامه‌ها که ـ هرچند عمدتاً از منظر اهل سنت ـ حاوی تحلیل‌های مفیدی از نصوص مشترک (آیات و سیره) است و من در مواردی از آن‌ها بهره گرفته‌ام.</w:t>
+      </w:r>
+      <w:r>
+        <w:rPr>
+          <w:rFonts w:ascii="B Lotus" w:hAnsi="B Lotus" w:cs="B Lotus" w:eastAsia="B Lotus"/>
+          <w:b w:val="0"/>
+          <w:i w:val="0"/>
+          <w:sz w:val="28"/>
+          <w:szCs w:val="28"/>
+          <w:vertAlign w:val="superscript"/>
+        </w:rPr>
+        <w:footnoteReference w:id="3"/>
+      </w:r>
+      <w:r>
+        <w:rPr>
+          <w:rFonts w:ascii="B Lotus" w:hAnsi="B Lotus" w:cs="B Lotus" w:eastAsia="B Lotus"/>
+          <w:b w:val="0"/>
+          <w:i w:val="0"/>
+          <w:sz w:val="28"/>
+          <w:szCs w:val="28"/>
+        </w:rPr>
+        <w:t xml:space="preserve"> دسته دوم، ادبیات غربیِ حقوق بین‌الملل است: کتب مرجعِ حقوق معاهدات و مسئولیت (مثل آثار شاو و کرافورد و شروح کنوانسیون وین) که فهم دقیقِ نهادهای وین و طرح مسئولیت بدون مراجعه به آن‌ها ممکن نیست.</w:t>
+      </w:r>
+      <w:r>
+        <w:rPr>
+          <w:rFonts w:ascii="B Lotus" w:hAnsi="B Lotus" w:cs="B Lotus" w:eastAsia="B Lotus"/>
+          <w:b w:val="0"/>
+          <w:i w:val="0"/>
+          <w:sz w:val="28"/>
+          <w:szCs w:val="28"/>
+          <w:vertAlign w:val="superscript"/>
+        </w:rPr>
+        <w:footnoteReference w:id="4"/>
+      </w:r>
+      <w:r>
+        <w:rPr>
+          <w:rFonts w:ascii="B Lotus" w:hAnsi="B Lotus" w:cs="B Lotus" w:eastAsia="B Lotus"/>
+          <w:b w:val="0"/>
+          <w:i w:val="0"/>
+          <w:sz w:val="28"/>
+          <w:szCs w:val="28"/>
+        </w:rPr>
+        <w:t xml:space="preserve"> البته ـ چنان‌که روش من در این رساله است ـ از این منابعِ غربی فقط در حد «فهمِ» حقوق بین‌الملل بهره گرفته‌ام، نه در مقام «داوریِ» فقهی؛ چون داورِ مسئله فقهی، فقه امامیه است، نه حقوق غربی. این تمایزِ مقامی ـ فهم در برابر داوری ـ از اصولِ روشیِ این پژوهش است و در سراسر رساله رعایت شده.</w:t>
+      </w:r>
+    </w:p>
+    <w:p>
+      <w:pPr>
+        <w:pStyle w:val="TH-Body"/>
+        <w:widowControl/>
+        <w:bidi w:val="1"/>
+        <w:spacing w:before="0" w:after="120" w:line="288" w:lineRule="auto"/>
+        <w:ind w:firstLine="283"/>
+        <w:jc w:val="both"/>
+      </w:pPr>
+      <w:r>
+        <w:rPr>
+          <w:rFonts w:ascii="B Lotus" w:hAnsi="B Lotus" w:cs="B Lotus" w:eastAsia="B Lotus"/>
+          <w:b w:val="0"/>
+          <w:i w:val="0"/>
+          <w:sz w:val="28"/>
+          <w:szCs w:val="28"/>
+        </w:rPr>
+        <w:t>نوآوری این رساله نسبت به همه این پیشینه‌ها در سه چیز است که هر سه را با ادعا نمی‌گویم بلکه متن رساله گواهشان است: یکم، صورت‌بندی سه‌سطحی مسئله ـ فقهی، اساسی، بین‌المللی ـ و تحلیل تفکیک‌شده هر سه با هم که تا کنون به این صورت انجام نشده؛ دوم، استخراج ضوابط هشت‌گانه عملی برای عدول حکومتی که تا کنون به این صورت مدون نشده و می‌تواند دستورالعمل تصمیم‌گیر باشد؛ و سوم، نقد مستند ادعای وجود اختیار صریح رهبری درباره معاهدات در اصل ۱۱۰ و ارائه تفکیک چهارگانه مراتب اختیار ـ صریح، ضمنی، ولایی، حکومتی ـ که راه میانه‌ای میان دو افراط رایج است.</w:t>
+      </w:r>
+    </w:p>
+    <w:p>
+      <w:pPr>
+        <w:pStyle w:val="TH-Goftar"/>
+        <w:widowControl/>
+        <w:bidi w:val="1"/>
+        <w:spacing w:before="200" w:after="120" w:line="288" w:lineRule="auto"/>
+        <w:jc w:val="right"/>
+        <w:keepNext w:val="1"/>
+        <w:shd w:val="clear" w:fill="EDEDED"/>
+      </w:pPr>
+      <w:r>
+        <w:rPr>
+          <w:rFonts w:ascii="B Titr" w:hAnsi="B Titr" w:cs="B Titr" w:eastAsia="B Titr"/>
+          <w:b/>
+          <w:i w:val="0"/>
+          <w:sz w:val="32"/>
+          <w:szCs w:val="32"/>
+        </w:rPr>
+        <w:t>روش تحقیق</w:t>
+      </w:r>
+    </w:p>
+    <w:p>
+      <w:pPr>
+        <w:pStyle w:val="TH-Body"/>
+        <w:widowControl/>
+        <w:bidi w:val="1"/>
+        <w:spacing w:before="0" w:after="120" w:line="288" w:lineRule="auto"/>
+        <w:jc w:val="both"/>
+      </w:pPr>
+      <w:r>
+        <w:rPr>
+          <w:rFonts w:ascii="B Lotus" w:hAnsi="B Lotus" w:cs="B Lotus" w:eastAsia="B Lotus"/>
+          <w:b w:val="0"/>
+          <w:i w:val="0"/>
+          <w:sz w:val="28"/>
+          <w:szCs w:val="28"/>
+        </w:rPr>
+        <w:t>روش این پژوهش کتابخانه‌ای، تحلیلی و استنباطی است و ابزار گردآوری‌اش فیش‌برداری از منابع دست‌اول عربی و فارسی. در مقام داوری میان آرا هم روشم همان است که برای سطح سه حوزه گفته‌اند: «نقل خوب اقوال» و «نقل خوب ادله» و سپس نقد منصفانه و داوری مستدل. یعنی اول رأی هر طرف را چنان‌که خودش گفته می‌آورم ـ نه چنان‌که منتقدانش تحریف کرده‌اند ـ، بعد دلیلش را با قوتش نقل می‌کنم، بعد نقدش می‌کنم، و آخر داوری می‌کنم. سعی کرده‌ام در سراسر رساله به این روش وفادار بمانم؛ و اگر جایی ناموفق بوده‌ام، خواننده بصیر خودش داوری خواهد کرد.</w:t>
+      </w:r>
+    </w:p>
+    <w:p>
+      <w:pPr>
+        <w:pStyle w:val="TH-Body"/>
+        <w:widowControl/>
+        <w:bidi w:val="1"/>
+        <w:spacing w:before="0" w:after="120" w:line="288" w:lineRule="auto"/>
+        <w:ind w:firstLine="283"/>
+        <w:jc w:val="both"/>
+      </w:pPr>
+      <w:r>
+        <w:rPr>
+          <w:rFonts w:ascii="B Lotus" w:hAnsi="B Lotus" w:cs="B Lotus" w:eastAsia="B Lotus"/>
+          <w:b w:val="0"/>
+          <w:i w:val="0"/>
+          <w:sz w:val="28"/>
+          <w:szCs w:val="28"/>
+        </w:rPr>
+        <w:t>در فقه، روشم اجتهادی مصطلح است: استقصای ادله (کتاب، سنت، عقل، بنا)، بررسی سندی و دلالی هر دلیل، دفع اشکالات، و جمع‌بندی. در حقوق بین‌الملل، روشم تفسیری ـ تحلیلی است: فهم متن کنوانسیون‌ها و طرح مواد و رویه دیوان و تطبیقشان بر مسئله. و در حقوق اساسی، روشم تفسیری است: فهم متن اصول و منطق نظام قانون اساسی و داوری میان دیدگاه‌های مفسران. در هر سه عرصه، اصل راهنمایم «امانت» بوده: چیزی را که ندیده‌ام نسبت نمی‌دهم، و هرجا تردید داشته‌ام صادقانه قید «نیازمند بررسی منبع اصلی» زده‌ام.</w:t>
+      </w:r>
+    </w:p>
+    <w:p>
+      <w:pPr>
+        <w:pStyle w:val="TH-Body"/>
+        <w:widowControl/>
+        <w:bidi w:val="1"/>
+        <w:spacing w:before="0" w:after="120" w:line="288" w:lineRule="auto"/>
+        <w:ind w:firstLine="283"/>
+        <w:jc w:val="both"/>
+      </w:pPr>
+      <w:r>
+        <w:rPr>
+          <w:rFonts w:ascii="B Lotus" w:hAnsi="B Lotus" w:cs="B Lotus" w:eastAsia="B Lotus"/>
+          <w:b w:val="0"/>
+          <w:i w:val="0"/>
+          <w:sz w:val="28"/>
+          <w:szCs w:val="28"/>
+        </w:rPr>
+        <w:t>و نکته‌ای درباره «شیوه استدلال» که گفتنش را لازم می‌دانم: روش من در این رساله، «استدلال قدم‌به‌قدم با دفع اشکال» است؛ یعنی هر ادعایی را که مطرح می‌کنم، اول دلیلش را می‌آورم، بعد اشکالِ مقدّرش را طرح می‌کنم، بعد جواب می‌دهم، و آخر نتیجه می‌گیرم. این شیوه ـ که همان شیوه مرسومِ درس خارج حوزه است ـ دو فایده دارد: هم خواننده را با خودش همراه می‌کند (چون اشکال‌هایی که به ذهن او می‌رسد، در متن پاسخ داده شده)، هم جلوِ مغالطه را می‌گیرد (چون مدعی نمی‌تواند از اشکال‌ها فرار کند). خواننده‌ای که این رساله را می‌خواند، اگر جایی اشکالی به ذهنش رسید که در متن پاسخ نگرفته، حق دارد آن را به حسابِ نقصِ کار من بگذارد ـ و من پیشاپیش از تذکرش سپاسگزارم.</w:t>
+      </w:r>
+    </w:p>
+    <w:p>
+      <w:pPr>
+        <w:pStyle w:val="TH-Goftar"/>
+        <w:widowControl/>
+        <w:bidi w:val="1"/>
+        <w:spacing w:before="200" w:after="120" w:line="288" w:lineRule="auto"/>
+        <w:jc w:val="right"/>
+        <w:keepNext w:val="1"/>
+        <w:shd w:val="clear" w:fill="EDEDED"/>
+      </w:pPr>
+      <w:r>
+        <w:rPr>
+          <w:rFonts w:ascii="B Titr" w:hAnsi="B Titr" w:cs="B Titr" w:eastAsia="B Titr"/>
+          <w:b/>
+          <w:i w:val="0"/>
+          <w:sz w:val="32"/>
+          <w:szCs w:val="32"/>
+        </w:rPr>
+        <w:t>ساماندهی تحقیق</w:t>
+      </w:r>
+    </w:p>
+    <w:p>
+      <w:pPr>
+        <w:pStyle w:val="TH-Body"/>
+        <w:widowControl/>
+        <w:bidi w:val="1"/>
+        <w:spacing w:before="0" w:after="120" w:line="288" w:lineRule="auto"/>
+        <w:jc w:val="both"/>
+      </w:pPr>
+      <w:r>
+        <w:rPr>
+          <w:rFonts w:ascii="B Lotus" w:hAnsi="B Lotus" w:cs="B Lotus" w:eastAsia="B Lotus"/>
+          <w:b w:val="0"/>
+          <w:i w:val="0"/>
+          <w:sz w:val="28"/>
+          <w:szCs w:val="28"/>
+        </w:rPr>
+        <w:t>این رساله در سه بخش و پنج فصل سامان یافته که منطقش از کلی به جزئی و از مبنا به حکم و از نظر به عمل است؛ و اگر خواننده‌ای فصل‌ها را به همین ترتیب بخواند، سیر بحث برایش طبیعی و روان خواهد بود:</w:t>
+      </w:r>
+    </w:p>
+    <w:p>
+      <w:pPr>
+        <w:pStyle w:val="TH-Body"/>
+        <w:widowControl/>
+        <w:bidi w:val="1"/>
+        <w:spacing w:before="0" w:after="120" w:line="288" w:lineRule="auto"/>
+        <w:ind w:firstLine="283"/>
+        <w:jc w:val="both"/>
+      </w:pPr>
+      <w:r>
+        <w:rPr>
+          <w:rFonts w:ascii="B Lotus" w:hAnsi="B Lotus" w:cs="B Lotus" w:eastAsia="B Lotus"/>
+          <w:b w:val="0"/>
+          <w:i w:val="0"/>
+          <w:sz w:val="28"/>
+          <w:szCs w:val="28"/>
+        </w:rPr>
+        <w:t>بخش اول ـ مبانی و کلیات ـ دو فصل دارد: فصل اول مفاهیم و تعاریف (معاهده، ولی فقیه، عدول، مصلحت و مفاهیم خویشاوند) و چارچوب نظری؛ و فصل دوم کلیات حقوق معاهدات (تاریخچه، اصول مسلم، شرایط اعتبار و سازوکارهای تعلیق و خاتمه) و اصول قانون اساسی مرتبط. این بخش، زمین بازی را مشخص می‌کند؛ بی‌آن، بحث‌های بعدی بر هوا می‌ماند.</w:t>
+      </w:r>
+    </w:p>
+    <w:p>
+      <w:pPr>
+        <w:pStyle w:val="TH-Body"/>
+        <w:widowControl/>
+        <w:bidi w:val="1"/>
+        <w:spacing w:before="0" w:after="120" w:line="288" w:lineRule="auto"/>
+        <w:ind w:firstLine="283"/>
+        <w:jc w:val="both"/>
+      </w:pPr>
+      <w:r>
+        <w:rPr>
+          <w:rFonts w:ascii="B Lotus" w:hAnsi="B Lotus" w:cs="B Lotus" w:eastAsia="B Lotus"/>
+          <w:b w:val="0"/>
+          <w:i w:val="0"/>
+          <w:sz w:val="28"/>
+          <w:szCs w:val="28"/>
+        </w:rPr>
+        <w:t>بخش دوم ـ تحلیل فقهی ـ هم دو فصل دارد که قلب تپنده رساله‌اند: فصل سوم ادله وجوب وفای به عهد (پنج آیه عام، آیات خاص جهاد، روایات، سیره و عقل) با نقد و داوری؛ و فصل چهارم مبانی جواز عدول (تزاحم، حکم حکومتی، مصلحت، نفی ضرر و حرج) و ضوابط هشت‌گانه و طیف پنج‌صورتِ عدول. هرکس فقط این دو فصل را بخواند، جوهر استدلال رساله را دریافته است.</w:t>
+      </w:r>
+    </w:p>
+    <w:p>
+      <w:pPr>
+        <w:pStyle w:val="TH-Body"/>
+        <w:widowControl/>
+        <w:bidi w:val="1"/>
+        <w:spacing w:before="0" w:after="120" w:line="288" w:lineRule="auto"/>
+        <w:ind w:firstLine="283"/>
+        <w:jc w:val="both"/>
+      </w:pPr>
+      <w:r>
+        <w:rPr>
+          <w:rFonts w:ascii="B Lotus" w:hAnsi="B Lotus" w:cs="B Lotus" w:eastAsia="B Lotus"/>
+          <w:b w:val="0"/>
+          <w:i w:val="0"/>
+          <w:sz w:val="28"/>
+          <w:szCs w:val="28"/>
+        </w:rPr>
+        <w:t>و بخش سوم ـ تحلیل حقوقی ـ یک فصل دارد: فصل پنجم که در پنج گفتار، مسئولیت بین‌المللی و انتساب و تفکیک سه‌گانه و اسباب رافع و راهبردها و حقوق اساسی تصمیم را تحلیل می‌کند. پایان‌بخش رساله هم نتیجه‌گیری (پنج دستاورد) و فهرست منابع و پیوست‌هاست.</w:t>
+      </w:r>
+    </w:p>
+    <w:p>
+      <w:pPr>
+        <w:pStyle w:val="TH-Goftar"/>
+        <w:widowControl/>
+        <w:bidi w:val="1"/>
+        <w:spacing w:before="200" w:after="120" w:line="288" w:lineRule="auto"/>
+        <w:jc w:val="right"/>
+        <w:keepNext w:val="1"/>
+        <w:shd w:val="clear" w:fill="EDEDED"/>
+      </w:pPr>
+      <w:r>
+        <w:rPr>
+          <w:rFonts w:ascii="B Titr" w:hAnsi="B Titr" w:cs="B Titr" w:eastAsia="B Titr"/>
+          <w:b/>
+          <w:i w:val="0"/>
+          <w:sz w:val="32"/>
+          <w:szCs w:val="32"/>
+        </w:rPr>
+        <w:t>قلمرو، محدودیت‌ها و اصطلاحات</w:t>
+      </w:r>
+    </w:p>
+    <w:p>
+      <w:pPr>
+        <w:pStyle w:val="TH-Body"/>
+        <w:widowControl/>
+        <w:bidi w:val="1"/>
+        <w:spacing w:before="0" w:after="120" w:line="288" w:lineRule="auto"/>
+        <w:jc w:val="both"/>
+      </w:pPr>
+      <w:r>
+        <w:rPr>
+          <w:rFonts w:ascii="B Lotus" w:hAnsi="B Lotus" w:cs="B Lotus" w:eastAsia="B Lotus"/>
+          <w:b w:val="0"/>
+          <w:i w:val="0"/>
+          <w:sz w:val="28"/>
+          <w:szCs w:val="28"/>
+        </w:rPr>
+        <w:t>قلمرو زمانی‌ام از صدر اسلام (برای سیره) تا حقوق بین‌الملل معاصر (تا ۲۰۲۵) است؛ قلمرو مکانی‌ام نظام جمهوری اسلامی ایران؛ و قلمرو موضوعی‌ام منحصر در «عدول ولی فقیه از تعهدات بین‌المللی» با همان تعریف مضیقی که در فصل اول می‌آید. از این قلمرو بیرون نمی‌روم؛ یعنی نه به معاهدات اشخاص خصوصی می‌پردازم، نه به تصمیم‌های دولت‌های دیگر، نه به احکام جهاد ابتدایی و تفاصیلش، و نه به تحلیل سیاسی روز ـ مگر به‌قدر ضرورت برای مثال تحلیلی. این تحدید، هم از سر واقع‌بینی است (یک رساله سطح سه نمی‌تواند همه‌چیز را بگوید) و هم از سر امانت (بهتر است کم بگویم و درست بگویم، تا زیاد بگویم و سست بگویم).</w:t>
+      </w:r>
+    </w:p>
+    <w:p>
+      <w:pPr>
+        <w:pStyle w:val="TH-Body"/>
+        <w:widowControl/>
+        <w:bidi w:val="1"/>
+        <w:spacing w:before="0" w:after="120" w:line="288" w:lineRule="auto"/>
+        <w:ind w:firstLine="283"/>
+        <w:jc w:val="both"/>
+      </w:pPr>
+      <w:r>
+        <w:rPr>
+          <w:rFonts w:ascii="B Lotus" w:hAnsi="B Lotus" w:cs="B Lotus" w:eastAsia="B Lotus"/>
+          <w:b w:val="0"/>
+          <w:i w:val="0"/>
+          <w:sz w:val="28"/>
+          <w:szCs w:val="28"/>
+        </w:rPr>
+        <w:t>محدودیت‌هایم را هم صادقانه می‌گویم، چون پنهان کردنشان نه به نفع من است نه به نفع خواننده: یکم، دسترسی نداشتن به اسناد محرمانه مذاکرات و تصمیم‌های حکومتیِ معاصر که تحلیل تجربی را محدود می‌کند و مرا به تحلیل نظری و مثال‌های علنی بسنده کرده؛ دوم، پراکندگی و کم‌کاری ادبیات فقهی در باب معاهدات امروزی که ناگزیرم کرده بعضی جاها از قواعد عام به خاص برسم ـ راهی دشوار و پرخطر که با احتیاط پیموده‌ام؛ و سوم، اختلاف تفاسیر حقوق‌دانان در مفاهیم کلیدی وین و طرح مسئولیت که داوری قطعی را در بعضی فرع‌ها ناممکن کرده و به ترجیح ظنی بسنده کرده‌ام.</w:t>
+      </w:r>
+    </w:p>
+    <w:p>
+      <w:pPr>
+        <w:pStyle w:val="TH-Body"/>
+        <w:widowControl/>
+        <w:bidi w:val="1"/>
+        <w:spacing w:before="0" w:after="120" w:line="288" w:lineRule="auto"/>
+        <w:ind w:firstLine="283"/>
+        <w:jc w:val="both"/>
+      </w:pPr>
+      <w:r>
+        <w:rPr>
+          <w:rFonts w:ascii="B Lotus" w:hAnsi="B Lotus" w:cs="B Lotus" w:eastAsia="B Lotus"/>
+          <w:b w:val="0"/>
+          <w:i w:val="0"/>
+          <w:sz w:val="28"/>
+          <w:szCs w:val="28"/>
+        </w:rPr>
+        <w:t>درباره اصطلاحات هم این‌جا فقط به‌اجمال می‌گویم و تفصیلش را به فصل اول می‌سپارم: هرجا «ولی فقیه» گفتم منظورم مقام رهبری در نظام جمهوری اسلامی ایران است ـ نه هر فقیه جامع‌الشرایطی؛ هرجا «تعهد بین‌المللی» گفتم منظورم تعهد ناشی از معاهده به معنای کنوانسیون وین است ـ نه هر تعهد اخلاقی یا سیاسی؛ هرجا «عدول» گفتم منظورم تصمیم یک‌جانبه و فوق‌العاده حاکم بر توقف یا تعلیق اجراست ـ نه خاتمه توافقی و عادی؛ و هرجا «مصلحت» گفتم منظورم مصلحت نوعی نظام و امت است ـ نه سلیقه شخصی تصمیم‌گیر. هرکدام از این قیدها بار معنایی و استدلالی دارد که در فصل اول یک‌به‌یک باز می‌شود؛ و خواننده‌ای که این قیدها را نادیده بگیرد، در فصول بعدی گم خواهد شد.</w:t>
+      </w:r>
+    </w:p>
+    <w:p>
+      <w:r>
+        <w:br w:type="page"/>
+      </w:r>
+    </w:p>
+    <w:p/>
+    <w:p/>
+    <w:p/>
+    <w:p>
+      <w:pPr>
+        <w:widowControl/>
+        <w:bidi w:val="1"/>
+        <w:spacing w:before="0" w:after="240" w:line="288" w:lineRule="auto"/>
+        <w:ind w:right="2268" w:left="2268"/>
         <w:jc w:val="center"/>
         <w:pBdr>
           <w:bottom w:val="single" w:sz="12" w:space="6" w:color="1F3864"/>
         </w:pBdr>
-        <w:keepNext w:val="1"/>
+      </w:pPr>
+    </w:p>
+    <w:p>
+      <w:pPr>
+        <w:pStyle w:val="TH-Bakhsh"/>
+        <w:widowControl/>
+        <w:bidi w:val="1"/>
+        <w:spacing w:before="0" w:after="240" w:line="288" w:lineRule="auto"/>
+        <w:jc w:val="center"/>
       </w:pPr>
       <w:r>
         <w:rPr>
           <w:rFonts w:ascii="B Titr" w:hAnsi="B Titr" w:cs="B Titr" w:eastAsia="B Titr"/>
           <w:b/>
           <w:i w:val="0"/>
-          <w:sz w:val="44"/>
-          <w:szCs w:val="44"/>
-        </w:rPr>
-        <w:t>مقدمه: کلیات تحقیق</w:t>
-      </w:r>
-    </w:p>
-    <w:p>
-      <w:pPr>
-        <w:pStyle w:val="TH-Goftar"/>
-        <w:widowControl/>
-        <w:bidi w:val="1"/>
-        <w:spacing w:before="200" w:after="120" w:line="288" w:lineRule="auto"/>
-        <w:jc w:val="right"/>
-        <w:keepNext w:val="1"/>
-      </w:pPr>
-      <w:r>
-        <w:rPr>
-          <w:rFonts w:ascii="B Titr" w:hAnsi="B Titr" w:cs="B Titr" w:eastAsia="B Titr"/>
-          <w:b/>
-          <w:i w:val="0"/>
-          <w:sz w:val="32"/>
-          <w:szCs w:val="32"/>
-        </w:rPr>
-        <w:t>بیان مسئله</w:t>
-      </w:r>
-    </w:p>
-    <w:p>
-      <w:pPr>
-        <w:pStyle w:val="TH-Body"/>
-        <w:widowControl/>
-        <w:bidi w:val="1"/>
-        <w:spacing w:before="0" w:after="120" w:line="288" w:lineRule="auto"/>
-        <w:ind w:firstLine="283"/>
-        <w:jc w:val="both"/>
-      </w:pPr>
-      <w:r>
-        <w:rPr>
-          <w:rFonts w:ascii="B Lotus" w:hAnsi="B Lotus" w:cs="B Lotus" w:eastAsia="B Lotus"/>
-          <w:b w:val="0"/>
-          <w:i w:val="0"/>
-          <w:sz w:val="28"/>
-          <w:szCs w:val="28"/>
-        </w:rPr>
-        <w:t>تصور کنید حکومتی ـ هر حکومتی، از جمله حکومت اسلامی ما ـ پیمانی با دولت‌های دیگر بسته است؛ پیمانی که روز امضایش مصلحت بود، عاقلانه بود، به نفع کشور بود. سال‌ها می‌گذرد. دنیا عوض می‌شود، طرف مقابل عهدشکنی می‌کند یا شرایط به‌کلی دگرگون می‌شود، و حالا ادامه اجرای همان پیمان دارد به کشور ضرر می‌زند؛ ضرری جدی، نه جزئی. حاکم چه باید بکند؟ به پیمان پایبند بماند و ضرر را تحمل کند، چون «عهدشکنی حرام است»؟ یا از پیمان عدول کند و مصلحت امروز کشور را نجات بدهد، چون «حفظ نظام واجب است»؟</w:t>
-      </w:r>
-    </w:p>
-    <w:p>
-      <w:pPr>
-        <w:pStyle w:val="TH-Body"/>
-        <w:widowControl/>
-        <w:bidi w:val="1"/>
-        <w:spacing w:before="0" w:after="120" w:line="288" w:lineRule="auto"/>
-        <w:ind w:firstLine="283"/>
-        <w:jc w:val="both"/>
-      </w:pPr>
-      <w:r>
-        <w:rPr>
-          <w:rFonts w:ascii="B Lotus" w:hAnsi="B Lotus" w:cs="B Lotus" w:eastAsia="B Lotus"/>
-          <w:b w:val="0"/>
-          <w:i w:val="0"/>
-          <w:sz w:val="28"/>
-          <w:szCs w:val="28"/>
-        </w:rPr>
-        <w:t>این دوراهی، خلاصه مسئله این رساله است. ولی سادگیِ صورتش فریبنده است؛ چون در باطن، سه نظام هنجاریِ بزرگ را به هم گره می‌زند که هرکدام منطق و ادبیات و مراجع خودشان را دارند. فقه امامیه می‌گوید «اوفوا بالعقود» و نقض عهد را ـ مگر به حکم دلیل ـ حرام می‌داند؛ و این حرف، حرف کوچکی نیست، چون پشتش آیات صریح قرآن و روایات متواتر و سیره معصومان ایستاده. حقوق اساسی جمهوری اسلامی می‌پرسد حدود اختیارات رهبری تا کجاست و آیا تصمیم یک مقام می‌تواند قانون مصوب مجلس را کنار بزند؛ و این پرسش هم جدی است، چون به استقلال قوا و حکومت قانون گره خورده. و حقوق بین‌الملل می‌گوید نقض یک‌جانبه معاهده مسئولیت می‌آورد و توجیهات داخلی دولت‌ها ـ حتی حکم شرعی و قانون اساسی‌شان ـ در برابر طرف مقابل پذیرفته نیست؛ و این هم واقعیتی است که نمی‌شود نادیده‌اش گرفت، چون هزینه‌اش را مردم می‌دهند.</w:t>
-      </w:r>
-    </w:p>
-    <w:p>
-      <w:pPr>
-        <w:pStyle w:val="TH-Body"/>
-        <w:widowControl/>
-        <w:bidi w:val="1"/>
-        <w:spacing w:before="0" w:after="120" w:line="288" w:lineRule="auto"/>
-        <w:ind w:firstLine="283"/>
-        <w:jc w:val="both"/>
-      </w:pPr>
-      <w:r>
-        <w:rPr>
-          <w:rFonts w:ascii="B Lotus" w:hAnsi="B Lotus" w:cs="B Lotus" w:eastAsia="B Lotus"/>
-          <w:b w:val="0"/>
-          <w:i w:val="0"/>
-          <w:sz w:val="28"/>
-          <w:szCs w:val="28"/>
-        </w:rPr>
-        <w:t>حالا مسئله دقیقاً همین‌جاست: هیچ‌کدام از این سه پاسخِ تک‌بعدی به‌تنهایی کافی نیست، و کنار هم گذاشتنِ ساده‌شان هم جواب نمی‌دهد. فقیهی که از حقوق بین‌الملل بی‌خبر است، حکمی می‌دهد که اجرایش هزینه‌های سنگین و پیش‌بینی‌نشده بر کشور تحمیل می‌کند و بعد همه می‌گویند «فقه از واقعیت جداست». حقوق‌دانی که فقه را نمی‌شناسد، حکمی را نامشروع اعلام می‌کند که شرعاً واجب بوده و بعد همه می‌گویند «حقوق با شرع ناسازگار است». و تصمیم‌گیر جلسه‌ای که هر سه را با هم ندیده، تصمیمی می‌گیرد که یا شرعی نیست یا قانونی نیست یا پرهزینه است ـ و گاهی هر سه با هم. تناقض ظاهری میان «وجوب وفای به عهد» و «اختیار حکومتی ولی فقیه» و «مسئولیت بین‌المللی دولت»، گرهی است که فقط با تحلیل هم‌زمان و تفکیک‌شده هر سه سطح باز می‌شود. و این گره، دقیقاً همان چیزی است که این رساله آمده تا بازش کند؛ نه با شعار، نه با مصادره به مطلوب، بلکه با استدلال قدم‌به‌قدم.</w:t>
-      </w:r>
-    </w:p>
-    <w:p>
-      <w:pPr>
-        <w:pStyle w:val="TH-Body"/>
-        <w:widowControl/>
-        <w:bidi w:val="1"/>
-        <w:spacing w:before="0" w:after="120" w:line="288" w:lineRule="auto"/>
-        <w:ind w:firstLine="283"/>
-        <w:jc w:val="both"/>
-      </w:pPr>
-      <w:r>
-        <w:rPr>
-          <w:rFonts w:ascii="B Lotus" w:hAnsi="B Lotus" w:cs="B Lotus" w:eastAsia="B Lotus"/>
-          <w:b w:val="0"/>
-          <w:i w:val="0"/>
-          <w:sz w:val="28"/>
-          <w:szCs w:val="28"/>
-        </w:rPr>
-        <w:t>سؤال اصلی پژوهش پس این است: «عدول ولی فقیه از تعهدات بین‌المللی دولت اسلامی از منظر فقه امامیه و حقوق بین‌الملل چه مبانی، شرایط و آثاری دارد؟» و برای جواب دادن به آن، ناگزیرم هفت سؤال فرعی را هم جواب بدهم: مسئولیت بین‌المللی چنین تصمیمی چیست و چگونه مدیریت می‌شود؛ سازوکارهای تعلیق و خاتمه موجه در حقوق معاهدات کدام‌اند؛ ادله وجوب وفا در فقه تا کجا پیش می‌روند و از کجا متوقف می‌شوند؛ نسبت حکم حکومتی و تزاحم با تعهدات بین‌المللی چگونه است و چه ضوابطی دارد؛ دلالت اصول قانون اساسی بر این اختیار چقدر است؛ از سیره پیامبر و امیرالمؤمنین چه الگویی می‌شود گرفت؛ و آثار عملی تصمیم در سطوح داخلی و بین‌المللی چیست.</w:t>
-      </w:r>
-    </w:p>
-    <w:p>
-      <w:pPr>
-        <w:pStyle w:val="TH-Goftar"/>
-        <w:widowControl/>
-        <w:bidi w:val="1"/>
-        <w:spacing w:before="200" w:after="120" w:line="288" w:lineRule="auto"/>
-        <w:jc w:val="right"/>
-        <w:keepNext w:val="1"/>
-      </w:pPr>
-      <w:r>
-        <w:rPr>
-          <w:rFonts w:ascii="B Titr" w:hAnsi="B Titr" w:cs="B Titr" w:eastAsia="B Titr"/>
-          <w:b/>
-          <w:i w:val="0"/>
-          <w:sz w:val="32"/>
-          <w:szCs w:val="32"/>
-        </w:rPr>
-        <w:t>ضرورت و اهمیت تحقیق</w:t>
-      </w:r>
-    </w:p>
-    <w:p>
-      <w:pPr>
-        <w:pStyle w:val="TH-Body"/>
-        <w:widowControl/>
-        <w:bidi w:val="1"/>
-        <w:spacing w:before="0" w:after="120" w:line="288" w:lineRule="auto"/>
-        <w:ind w:firstLine="283"/>
-        <w:jc w:val="both"/>
-      </w:pPr>
-      <w:r>
-        <w:rPr>
-          <w:rFonts w:ascii="B Lotus" w:hAnsi="B Lotus" w:cs="B Lotus" w:eastAsia="B Lotus"/>
-          <w:b w:val="0"/>
-          <w:i w:val="0"/>
-          <w:sz w:val="28"/>
-          <w:szCs w:val="28"/>
-        </w:rPr>
-        <w:t>اگر کسی بپرسد این تحقیق چه ضرورتی دارد، من فقط یک جواب می‌دهم: تاریخ چهل و چندساله انقلاب را ورق بزنید. از قضیه گروگان‌ها و عهدنامه الجزایر تا پرونده هسته‌ای و برجام و خروج آمریکا و کاهش تعهدات ایران، بارها کشور ما در برابر همین دوراهی قرار گرفته: پایبندی به تعهدی که اجرایش روزبه‌روز پرهزینه‌تر می‌شود، یا عدول از آن با همه پرسش‌های شرعی و حقوقی‌اش. و هر بار، تحلیل‌ها عمدتاً سیاسی و جناحی و احساسی بوده، نه فقهی و حقوقی و ضابطه‌مند. هر دولتی ساز خودش را زده و هیچ چارچوب ماندگاری از خود به جا نگذاشته. این خلأ تحلیلی، خودش به‌تنهایی ضرورت این پژوهش را اثبات می‌کند؛ چون تصمیمی که مبنا و ضابطه نداشته باشد، هر بار از نو محل مناقشه می‌شود و کشور را به ورطه آزمون‌وخطا می‌اندازد.</w:t>
-      </w:r>
-    </w:p>
-    <w:p>
-      <w:pPr>
-        <w:pStyle w:val="TH-Body"/>
-        <w:widowControl/>
-        <w:bidi w:val="1"/>
-        <w:spacing w:before="0" w:after="120" w:line="288" w:lineRule="auto"/>
-        <w:ind w:firstLine="283"/>
-        <w:jc w:val="both"/>
-      </w:pPr>
-      <w:r>
-        <w:rPr>
-          <w:rFonts w:ascii="B Lotus" w:hAnsi="B Lotus" w:cs="B Lotus" w:eastAsia="B Lotus"/>
-          <w:b w:val="0"/>
-          <w:i w:val="0"/>
-          <w:sz w:val="28"/>
-          <w:szCs w:val="28"/>
-        </w:rPr>
-        <w:t>ضرورت نظری هم دست‌کمی از ضرورت عملی ندارد، اگر بیشتر نباشد. از یک سو، فقه ما در باب معاهدات بین‌المللی امروزی ـ که با عهدنامه‌های صدر اسلام تفاوت‌های ساختاری جدی دارند ـ هنوز به بلوغ و تفصیل لازم نرسیده؛ و احکام حکومتی مرتبط با سیاست خارجی از کم‌کارکرده‌ترین ابواب فقه حکومتی ماست. ما درباره طهارت و صلات هزاران صفحه داریم ولی درباره این‌که حاکم اسلامی در برابر پیمان بین‌المللیِ زیان‌بار چه تکلیفی دارد، کمتر از انگشتان یک دست رساله جدی داریم. این فقر، شایسته فقهی نیست که ادعای حکومت دارد. از سوی دیگر، حقوق بین‌الملل معاصر ـ با کنوانسیون وین و طرح مسئولیت و سازوکارهای نوینش ـ نیازمند خوانش فقهی و بومی است تا فقیه ما بتواند در برابرش موضع دقیق و منصفانه بگیرد؛ نه پذیرش بی‌چون‌وچرای منفعلانه، نه رد احساسیِ بی‌دلیل. ما باید با این نظام حقوقی «گفت‌وگو» کنیم، و گفت‌وگو اول نیازمند «فهم» است.</w:t>
-      </w:r>
-    </w:p>
-    <w:p>
-      <w:pPr>
-        <w:pStyle w:val="TH-Body"/>
-        <w:widowControl/>
-        <w:bidi w:val="1"/>
-        <w:spacing w:before="0" w:after="120" w:line="288" w:lineRule="auto"/>
-        <w:ind w:firstLine="283"/>
-        <w:jc w:val="both"/>
-      </w:pPr>
-      <w:r>
-        <w:rPr>
-          <w:rFonts w:ascii="B Lotus" w:hAnsi="B Lotus" w:cs="B Lotus" w:eastAsia="B Lotus"/>
-          <w:b w:val="0"/>
-          <w:i w:val="0"/>
-          <w:sz w:val="28"/>
-          <w:szCs w:val="28"/>
-        </w:rPr>
-        <w:t>و دست آخر، مخاطب این رساله فقط حوزه و دانشگاه نیست. تصمیم‌گیران و مشاوران حقوقی و فقهی نظام ـ آقایانی که در شورای عالی امنیت ملی و وزارت خارجه و مجمع تشخیص می‌نشینند ـ بیش از هر کس دیگری به چنین چارچوبی نیاز دارند. رساله‌ای که مبنای فقهی و ضوابط عملی و آثار بین‌المللی یک تصمیم حکومتی را یک‌جا و با زبانی قابل فهم برای تصمیم‌گیر ارائه بدهد، در واقع پلی است میان نظر و عمل؛ و همین پیوند، اهمیتش را دوچندان می‌کند. من این رساله را برای میز آن‌ها نوشته‌ام، نه فقط برای قفسه کتابخانه.</w:t>
-      </w:r>
-    </w:p>
-    <w:p>
-      <w:pPr>
-        <w:pStyle w:val="TH-Goftar"/>
-        <w:widowControl/>
-        <w:bidi w:val="1"/>
-        <w:spacing w:before="200" w:after="120" w:line="288" w:lineRule="auto"/>
-        <w:jc w:val="right"/>
-        <w:keepNext w:val="1"/>
-      </w:pPr>
-      <w:r>
-        <w:rPr>
-          <w:rFonts w:ascii="B Titr" w:hAnsi="B Titr" w:cs="B Titr" w:eastAsia="B Titr"/>
-          <w:b/>
-          <w:i w:val="0"/>
-          <w:sz w:val="32"/>
-          <w:szCs w:val="32"/>
-        </w:rPr>
-        <w:t>اهداف تحقیق</w:t>
-      </w:r>
-    </w:p>
-    <w:p>
-      <w:pPr>
-        <w:pStyle w:val="TH-Body"/>
-        <w:widowControl/>
-        <w:bidi w:val="1"/>
-        <w:spacing w:before="0" w:after="120" w:line="288" w:lineRule="auto"/>
-        <w:ind w:firstLine="283"/>
-        <w:jc w:val="both"/>
-      </w:pPr>
-      <w:r>
-        <w:rPr>
-          <w:rFonts w:ascii="B Lotus" w:hAnsi="B Lotus" w:cs="B Lotus" w:eastAsia="B Lotus"/>
-          <w:b w:val="0"/>
-          <w:i w:val="0"/>
-          <w:sz w:val="28"/>
-          <w:szCs w:val="28"/>
-        </w:rPr>
-        <w:t>هدف اصلی این پژوهش ارائه تحلیل فقهی ـ حقوقی جامع و ضابطه‌مند از عدول ولی فقیه از تعهدات بین‌المللی است؛ تحلیلی که هم تکلیف شرعی حاکم را روشن کند، هم جایگاه حقوقی تصمیمش را، و هم آثار بین‌المللی‌اش را ـ و هر سه را در یک چارچوب منسجم و کاربردی که تصمیم‌گیر بتواند واقعاً از آن استفاده کند، نه این‌که فقط بخواند و کنار بگذارد.</w:t>
-      </w:r>
-    </w:p>
-    <w:p>
-      <w:pPr>
-        <w:pStyle w:val="TH-Body"/>
-        <w:widowControl/>
-        <w:bidi w:val="1"/>
-        <w:spacing w:before="0" w:after="120" w:line="288" w:lineRule="auto"/>
-        <w:ind w:firstLine="283"/>
-        <w:jc w:val="both"/>
-      </w:pPr>
-      <w:r>
-        <w:rPr>
-          <w:rFonts w:ascii="B Lotus" w:hAnsi="B Lotus" w:cs="B Lotus" w:eastAsia="B Lotus"/>
-          <w:b w:val="0"/>
-          <w:i w:val="0"/>
-          <w:sz w:val="28"/>
-          <w:szCs w:val="28"/>
-        </w:rPr>
-        <w:t>در کنارِ هدفِ اصلی، سه هدفِ «میانی» هم دارم که گفتنشان را لازم می‌دانم، چون جهتِ کلِ رساله را مشخص می‌کنند: یکم، «رفعِ خلطِ سطوح» ـ یعنی نشان دادنِ این‌که جوازِ فقهی و مشروعیتِ داخلی و مسئولیتِ بین‌المللی سه چیزِ جداست و قاطی کردنشان خطاست؛ چون به تجربه دیده‌ام که بیشترِ مناقشه‌های این حوزه، ریشه در همین خلط دارد، نه در اختلافِ واقعی. دوم، «مهارِ جواز» ـ یعنی نشان دادنِ این‌که عدول اگر جایز است، بی‌ضابطه نیست و هشت قفل دارد؛ چون از خطرِ سوءاستفاده آگاهم و نمی‌خواهم رساله‌ام دستاویزِ عهدشکنیِ بی‌مبنا شود. و سوم، «دستِ تصمیم‌گیر را گرفتن» ـ یعنی ارائه چارچوبی که واقعاً قابلِ استفاده باشد، نه فقط قابلِ خواندن؛ چون رساله‌ای که روی میزِ تصمیم‌گیر نرود، هرچقدر هم که علمی باشد، رسالتش را کامل نکرده.</w:t>
-      </w:r>
-    </w:p>
-    <w:p>
-      <w:pPr>
-        <w:pStyle w:val="TH-Body"/>
-        <w:widowControl/>
-        <w:bidi w:val="1"/>
-        <w:spacing w:before="0" w:after="120" w:line="288" w:lineRule="auto"/>
-        <w:ind w:firstLine="283"/>
-        <w:jc w:val="both"/>
-      </w:pPr>
-      <w:r>
-        <w:rPr>
-          <w:rFonts w:ascii="B Lotus" w:hAnsi="B Lotus" w:cs="B Lotus" w:eastAsia="B Lotus"/>
-          <w:b w:val="0"/>
-          <w:i w:val="0"/>
-          <w:sz w:val="28"/>
-          <w:szCs w:val="28"/>
-        </w:rPr>
-        <w:t>اهداف فرعی هفت‌تاست که هرکدام به یکی از سؤالات فرعی گره خورده و هرکدام فصلی از رساله را تغذیه می‌کند: تحلیل مسئولیت بین‌المللی تصمیم مطابق طرح مواد کمیسیون حقوق بین‌الملل و راه‌های کاهشش؛ شناخت سازوکارهای تعلیق و خاتمه موجه در کنوانسیون وین و شرایط هرکدام؛ بررسی جامع و منصفانه ادله وجوب وفای به عهد ـ آیات، روایات، سیره و عقل ـ و تعیین دقیق قلمرو و استثناهایشان؛ تبیین نسبت حکم حکومتی و قاعده تزاحم با تعهدات بین‌المللی و استخراج ضوابط عملی؛ تحلیل دلالت اصول قانون اساسی ـ به‌ویژه اصول ۵، ۵۷، ۷۷، ۱۱۰، ۱۱۲ و ۱۲۵ ـ بر اختیار ولی فقیه؛ استقصای سیره پیامبر اکرم و امیرالمؤمنین در عهدنامه‌ها و استخراج الگوهای رفتاری‌شان؛ و تبیین آثار عملی و اجرایی تصمیم از مرحله مقدمات تا مرحله پسااجرا.</w:t>
-      </w:r>
-    </w:p>
-    <w:p>
-      <w:pPr>
-        <w:pStyle w:val="TH-Goftar"/>
-        <w:widowControl/>
-        <w:bidi w:val="1"/>
-        <w:spacing w:before="200" w:after="120" w:line="288" w:lineRule="auto"/>
-        <w:jc w:val="right"/>
-        <w:keepNext w:val="1"/>
-      </w:pPr>
-      <w:r>
-        <w:rPr>
-          <w:rFonts w:ascii="B Titr" w:hAnsi="B Titr" w:cs="B Titr" w:eastAsia="B Titr"/>
-          <w:b/>
-          <w:i w:val="0"/>
-          <w:sz w:val="32"/>
-          <w:szCs w:val="32"/>
-        </w:rPr>
-        <w:t>سؤالات تحقیق</w:t>
-      </w:r>
-    </w:p>
-    <w:p>
-      <w:pPr>
-        <w:pStyle w:val="TH-Body"/>
-        <w:widowControl/>
-        <w:bidi w:val="1"/>
-        <w:spacing w:before="0" w:after="120" w:line="288" w:lineRule="auto"/>
-        <w:ind w:firstLine="283"/>
-        <w:jc w:val="both"/>
-      </w:pPr>
-      <w:r>
-        <w:rPr>
-          <w:rFonts w:ascii="B Lotus" w:hAnsi="B Lotus" w:cs="B Lotus" w:eastAsia="B Lotus"/>
-          <w:b w:val="0"/>
-          <w:i w:val="0"/>
-          <w:sz w:val="28"/>
-          <w:szCs w:val="28"/>
-        </w:rPr>
-        <w:t>سؤال اصلی: «عدول ولی فقیه از تعهدات بین‌المللی دولت اسلامی از منظر فقه امامیه و حقوق بین‌الملل چه مبانی، شرایط و آثاری دارد؟»</w:t>
-      </w:r>
-    </w:p>
-    <w:p>
-      <w:pPr>
-        <w:pStyle w:val="TH-Body"/>
-        <w:widowControl/>
-        <w:bidi w:val="1"/>
-        <w:spacing w:before="0" w:after="120" w:line="288" w:lineRule="auto"/>
-        <w:ind w:firstLine="283"/>
-        <w:jc w:val="both"/>
-      </w:pPr>
-      <w:r>
-        <w:rPr>
-          <w:rFonts w:ascii="B Lotus" w:hAnsi="B Lotus" w:cs="B Lotus" w:eastAsia="B Lotus"/>
-          <w:b w:val="0"/>
-          <w:i w:val="0"/>
-          <w:sz w:val="28"/>
-          <w:szCs w:val="28"/>
-        </w:rPr>
-        <w:t>و سؤالات فرعی: مسئولیت بین‌المللی دولت اسلامی در فرض عدول ولی فقیه از تعهدات چیست و چگونه می‌شود آن را مدیریت کرد؛ سازوکارهای تعلیق و خاتمه موجه در نظام حقوق معاهدات کدام‌اند و نسبتشان با عدول حکومتی چیست؛ ادله وجوب وفای به عهد در فقه امامیه چه قلمرو و استثناهایی دارند؛ نسبت حکم حکومتی و تزاحم با تعهدات بین‌المللی دولت اسلامی چگونه است و عدول حکومتی چه ضوابطی دارد؛ دلالت اصول قانون اساسی جمهوری اسلامی ایران بر اختیار ولی فقیه در این حوزه چقدر و چگونه است؛ سیره پیامبر اکرم و امیرالمؤمنین در عهدنامه‌ها چه الگوهایی برای تصمیم حکومتی امروز ارائه می‌دهد؛ و آثار عملی و اجرایی عدول از تعهدات بین‌المللی در سطوح داخلی و بین‌المللی چیست.</w:t>
-      </w:r>
-    </w:p>
-    <w:p>
-      <w:pPr>
-        <w:pStyle w:val="TH-Goftar"/>
-        <w:widowControl/>
-        <w:bidi w:val="1"/>
-        <w:spacing w:before="200" w:after="120" w:line="288" w:lineRule="auto"/>
-        <w:jc w:val="right"/>
-        <w:keepNext w:val="1"/>
-      </w:pPr>
-      <w:r>
-        <w:rPr>
-          <w:rFonts w:ascii="B Titr" w:hAnsi="B Titr" w:cs="B Titr" w:eastAsia="B Titr"/>
-          <w:b/>
-          <w:i w:val="0"/>
-          <w:sz w:val="32"/>
-          <w:szCs w:val="32"/>
-        </w:rPr>
-        <w:t>فرضیه تحقیق</w:t>
-      </w:r>
-    </w:p>
-    <w:p>
-      <w:pPr>
-        <w:pStyle w:val="TH-Body"/>
-        <w:widowControl/>
-        <w:bidi w:val="1"/>
-        <w:spacing w:before="0" w:after="120" w:line="288" w:lineRule="auto"/>
-        <w:ind w:firstLine="283"/>
-        <w:jc w:val="both"/>
-      </w:pPr>
-      <w:r>
-        <w:rPr>
-          <w:rFonts w:ascii="B Lotus" w:hAnsi="B Lotus" w:cs="B Lotus" w:eastAsia="B Lotus"/>
-          <w:b w:val="0"/>
-          <w:i w:val="0"/>
-          <w:sz w:val="28"/>
-          <w:szCs w:val="28"/>
-        </w:rPr>
-        <w:t>فرضیه اصلی این پژوهش این است: «عدول ولی فقیه از تعهدات بین‌المللی در چارچوب قاعده تزاحم و حکم حکومتی و با رعایت ضوابط استخراج‌شده از ادله فقهی، شرعاً جایز و بلکه گاه واجب است؛ مشروط بر این‌که مصلحت اهمی در کار باشد، از مجرای قانونی و نهادی بگذرد، و آثار بین‌المللی‌اش ـ از جمله مسئولیت دولت ـ در محاسبه مصلحت لحاظ شده باشد.» هر قیدی از این قیود بار استدلالی دارد و در فصول آینده یک‌به‌یک اثبات می‌شود؛ و اگر خواننده‌ای با فرضیه مخالف است، باید بگوید با کدام قید مخالف است، چون ردِ بی‌قیدوشرطِ کل فرضیه، بدون نقد قیودش، نقد علمی نیست.</w:t>
-      </w:r>
-    </w:p>
-    <w:p>
-      <w:pPr>
-        <w:pStyle w:val="TH-Body"/>
-        <w:widowControl/>
-        <w:bidi w:val="1"/>
-        <w:spacing w:before="0" w:after="120" w:line="288" w:lineRule="auto"/>
-        <w:ind w:firstLine="283"/>
-        <w:jc w:val="both"/>
-      </w:pPr>
-      <w:r>
-        <w:rPr>
-          <w:rFonts w:ascii="B Lotus" w:hAnsi="B Lotus" w:cs="B Lotus" w:eastAsia="B Lotus"/>
-          <w:b w:val="0"/>
-          <w:i w:val="0"/>
-          <w:sz w:val="28"/>
-          <w:szCs w:val="28"/>
-        </w:rPr>
-        <w:t>فرضیه‌های فرعی هم این‌هایند: تصمیم ولی فقیه به دولت منتسب می‌شود و در صورت نقضِ بدون مجوز، مسئولیت بین‌المللی می‌آورد؛ ولی این مسئولیت مانع جواز شرعی نیست، بلکه بخشی از هزینه‌ای است که باید در ترازوی مصلحت سنجیده شود ـ نه بیش، نه کم. سازوکارهای وین ـ تعلیق، خاتمه، تغییر بنیادین اوضاع ـ راه‌های حقوقیِ کم‌هزینه‌تری‌اند که تا وقتی بازند باید مقدم بر عدول یک‌جانبه باشند؛ عدول یک‌جانبه آخرین راه است، نه اولین راه. اطلاقات ادله وفا منصرف به عقود متعارف و شرایط عادی‌اند و شامل تزاحم مصلحتی نمی‌شوند؛ و این انصراف را با شواهد متنی و سیاقی اثبات می‌کنم، نه با ادعا. و در حقوق اساسی، اختیار ولی فقیه در این حوزه از نوع «اختیار ضمنی و ولایی» است نه صریح؛ یعنی از بندهای عام اصل ۱۱۰ و اصل ۵۷ استنباط می‌شود، نه این‌که در متن قانون اساسی ذکر شده باشد ـ و هر ادعای خلافی خلاف واقعیت متنی است.</w:t>
-      </w:r>
-    </w:p>
-    <w:p>
-      <w:pPr>
-        <w:pStyle w:val="TH-Goftar"/>
-        <w:widowControl/>
-        <w:bidi w:val="1"/>
-        <w:spacing w:before="200" w:after="120" w:line="288" w:lineRule="auto"/>
-        <w:jc w:val="right"/>
-        <w:keepNext w:val="1"/>
-      </w:pPr>
-      <w:r>
-        <w:rPr>
-          <w:rFonts w:ascii="B Titr" w:hAnsi="B Titr" w:cs="B Titr" w:eastAsia="B Titr"/>
-          <w:b/>
-          <w:i w:val="0"/>
-          <w:sz w:val="32"/>
-          <w:szCs w:val="32"/>
-        </w:rPr>
-        <w:t>پیشینه تحقیق</w:t>
-      </w:r>
-    </w:p>
-    <w:p>
-      <w:pPr>
-        <w:pStyle w:val="TH-Body"/>
-        <w:widowControl/>
-        <w:bidi w:val="1"/>
-        <w:spacing w:before="0" w:after="120" w:line="288" w:lineRule="auto"/>
-        <w:ind w:firstLine="283"/>
-        <w:jc w:val="both"/>
-      </w:pPr>
-      <w:r>
-        <w:rPr>
-          <w:rFonts w:ascii="B Lotus" w:hAnsi="B Lotus" w:cs="B Lotus" w:eastAsia="B Lotus"/>
-          <w:b w:val="0"/>
-          <w:i w:val="0"/>
-          <w:sz w:val="28"/>
-          <w:szCs w:val="28"/>
-        </w:rPr>
-        <w:t>این موضوع ـ با این صورت‌بندی سه‌سطحی ـ تا آن‌جا که بررسی من رسیده، سابقه مستقلی ندارد. یعنی رساله یا مقاله‌ای که «عدول ولی فقیه از تعهدات بین‌المللی» را هم‌زمان از سه زاویه فقه و قانون اساسی و حقوق بین‌الملل بررسی کرده باشد، نیافتم؛ و هرچه گشتم، یا کارهای تک‌بعدی یافتم یا حرف‌های پراکنده. ولی این به معنای بی‌سابقه بودن مطلق نیست؛ هرکدام از اضلاع سه‌گانه‌اش پیشینه غنی و قابل‌استفاده‌ای دارند که بذرهای این پژوهش در آن‌ها پراکنده است و من کوشیده‌ام همه را ببینم و در جای خودش به کار ببرم. انصاف علمی اقتضا می‌کند بگویم روی شانه چه کسانی ایستاده‌ام.</w:t>
-      </w:r>
-    </w:p>
-    <w:p>
-      <w:pPr>
-        <w:pStyle w:val="TH-Body"/>
-        <w:widowControl/>
-        <w:bidi w:val="1"/>
-        <w:spacing w:before="0" w:after="120" w:line="288" w:lineRule="auto"/>
-        <w:ind w:firstLine="283"/>
-        <w:jc w:val="both"/>
-      </w:pPr>
-      <w:r>
-        <w:rPr>
-          <w:rFonts w:ascii="B Lotus" w:hAnsi="B Lotus" w:cs="B Lotus" w:eastAsia="B Lotus"/>
-          <w:b w:val="0"/>
-          <w:i w:val="0"/>
-          <w:sz w:val="28"/>
-          <w:szCs w:val="28"/>
-        </w:rPr>
-        <w:t>در ضلع فقهی، سه دسته منبع هست. دسته اول کتب قواعد فقهیه و ابواب عقود: سید محمدحسن بجنوردی در القواعد الفقهیه (قاعده لزوم) و میرزای نائینی در منیة الطالب و شیخ انصاری در المکاسب و الخیارات، قواعد عمومی لزوم و خیارات را پی‌ریخته‌اند؛ هرچند هیچ‌کدام مستقیم به معاهدات بین‌المللی امروزی نپرداخته‌اند و سخن گفتن از انتساب مستقیم نظر به آن‌ها در این مسئله، بدون تسامح نیست ـ و من این تسامح را روا نمی‌دارم. دسته دوم کتب جهاد و سیر و فقه سیاسی: جواهر الکلام در کتاب الجهاد (احکام هدنه و امان)، تحریر الوسیله امام خمینی، و آثاری مثل فقه سیاسی جوادی آملی و ولایت فقیه امام و شئون و اختیارات ولایت فقیه منتظری، احکام عهدنامه‌ها و گستره ولایت را بحث کرده‌اند و من وامدار همه‌شان هستم. و دسته سوم مقالات و رساله‌های معاصر فقه بین‌الملل اسلام که پراکنده‌اند و در متن رساله به آن‌ها ارجاع داده‌ام.</w:t>
-      </w:r>
-    </w:p>
-    <w:p>
-      <w:pPr>
-        <w:pStyle w:val="TH-Body"/>
-        <w:widowControl/>
-        <w:bidi w:val="1"/>
-        <w:spacing w:before="0" w:after="120" w:line="288" w:lineRule="auto"/>
-        <w:ind w:firstLine="283"/>
-        <w:jc w:val="both"/>
-      </w:pPr>
-      <w:r>
-        <w:rPr>
-          <w:rFonts w:ascii="B Lotus" w:hAnsi="B Lotus" w:cs="B Lotus" w:eastAsia="B Lotus"/>
-          <w:b w:val="0"/>
-          <w:i w:val="0"/>
-          <w:sz w:val="28"/>
-          <w:szCs w:val="28"/>
-        </w:rPr>
-        <w:t>در ضلع حقوق اساسی، تفاسیر قانون اساسی ـ به‌ویژه آثار قاضی شریعت‌پناهی و سیدمحمد هاشمی در حقوق اساسی جمهوری اسلامی ایران ـ و تحلیل‌های منتشره در پایگاه حوزه درباره اصل ۵۷ (ولایت مطلقه) و تفسیر شورای نگهبان از اصل ۱۱۲، و قوانین مصوب درباره معاهدات (آیین‌نامه داخلی مجلس و مقررات اجرایی مرتبط) منابع اصلی‌اند.</w:t>
-      </w:r>
-    </w:p>
-    <w:p>
-      <w:pPr>
-        <w:pStyle w:val="TH-Body"/>
-        <w:widowControl/>
-        <w:bidi w:val="1"/>
-        <w:spacing w:before="0" w:after="120" w:line="288" w:lineRule="auto"/>
-        <w:ind w:firstLine="283"/>
-        <w:jc w:val="both"/>
-      </w:pPr>
-      <w:r>
-        <w:rPr>
-          <w:rFonts w:ascii="B Lotus" w:hAnsi="B Lotus" w:cs="B Lotus" w:eastAsia="B Lotus"/>
-          <w:b w:val="0"/>
-          <w:i w:val="0"/>
-          <w:sz w:val="28"/>
-          <w:szCs w:val="28"/>
-        </w:rPr>
-        <w:t>و در ضلع حقوق بین‌الملل، کنوانسیون وین حقوق معاهدات (۱۹۶۹) و طرح مواد مسئولیت بین‌المللی دولت‌ها (۲۰۰۱) و رویه دیوان بین‌المللی دادگستری ـ به‌ویژه قضایای گابچیکوو و گروگان‌ها و نیکاراگوئه ـ شالوده تحلیل‌اند؛ و در ادبیات فارسی هم آثاری چون حقوق معاهدات بین‌المللی ضیایی بیگدلی و حقوق بین‌الملل عمومی صفری (در صورت تطابق با چاپ‌های موجود، وگرنه نیازمند بررسی منبع اصلی) راهگشا بوده‌اند.</w:t>
-      </w:r>
-    </w:p>
-    <w:p>
-      <w:pPr>
-        <w:pStyle w:val="TH-Body"/>
-        <w:widowControl/>
-        <w:bidi w:val="1"/>
-        <w:spacing w:before="0" w:after="120" w:line="288" w:lineRule="auto"/>
-        <w:ind w:firstLine="283"/>
-        <w:jc w:val="both"/>
-      </w:pPr>
-      <w:r>
-        <w:rPr>
-          <w:rFonts w:ascii="B Lotus" w:hAnsi="B Lotus" w:cs="B Lotus" w:eastAsia="B Lotus"/>
-          <w:b w:val="0"/>
-          <w:i w:val="0"/>
-          <w:sz w:val="28"/>
-          <w:szCs w:val="28"/>
-        </w:rPr>
-        <w:t>در کنار این سه ضلع، دو دسته منبعِ تکمیلی هم هست که نباید ناگفته بماند. دسته اول، ادبیات عربِ معاصر در «فقه روابط بین‌الملل» است: آثاری چون السیر و فقه الحرب و السلام در اسلام و نوشته‌های وهبه زحیلی و دیگران درباره احکام جهاد و عهدنامه‌ها که ـ هرچند عمدتاً از منظر اهل سنت ـ حاوی تحلیل‌های مفیدی از نصوص مشترک (آیات و سیره) است و من در مواردی از آن‌ها بهره گرفته‌ام.</w:t>
-      </w:r>
-      <w:r>
-        <w:rPr>
-          <w:rFonts w:ascii="B Lotus" w:hAnsi="B Lotus" w:cs="B Lotus" w:eastAsia="B Lotus"/>
-          <w:b w:val="0"/>
-          <w:i w:val="0"/>
-          <w:sz w:val="28"/>
-          <w:szCs w:val="28"/>
-          <w:vertAlign w:val="superscript"/>
-        </w:rPr>
-        <w:footnoteReference w:id="3"/>
-      </w:r>
-      <w:r>
-        <w:rPr>
-          <w:rFonts w:ascii="B Lotus" w:hAnsi="B Lotus" w:cs="B Lotus" w:eastAsia="B Lotus"/>
-          <w:b w:val="0"/>
-          <w:i w:val="0"/>
-          <w:sz w:val="28"/>
-          <w:szCs w:val="28"/>
-        </w:rPr>
-        <w:t xml:space="preserve"> دسته دوم، ادبیات غربیِ حقوق بین‌الملل است: کتب مرجعِ حقوق معاهدات و مسئولیت (مثل آثار شاو و کرافورد و شروح کنوانسیون وین) که فهم دقیقِ نهادهای وین و طرح مسئولیت بدون مراجعه به آن‌ها ممکن نیست.</w:t>
-      </w:r>
-      <w:r>
-        <w:rPr>
-          <w:rFonts w:ascii="B Lotus" w:hAnsi="B Lotus" w:cs="B Lotus" w:eastAsia="B Lotus"/>
-          <w:b w:val="0"/>
-          <w:i w:val="0"/>
-          <w:sz w:val="28"/>
-          <w:szCs w:val="28"/>
-          <w:vertAlign w:val="superscript"/>
-        </w:rPr>
-        <w:footnoteReference w:id="4"/>
-      </w:r>
-      <w:r>
-        <w:rPr>
-          <w:rFonts w:ascii="B Lotus" w:hAnsi="B Lotus" w:cs="B Lotus" w:eastAsia="B Lotus"/>
-          <w:b w:val="0"/>
-          <w:i w:val="0"/>
-          <w:sz w:val="28"/>
-          <w:szCs w:val="28"/>
-        </w:rPr>
-        <w:t xml:space="preserve"> البته ـ چنان‌که روش من در این رساله است ـ از این منابعِ غربی فقط در حد «فهمِ» حقوق بین‌الملل بهره گرفته‌ام، نه در مقام «داوریِ» فقهی؛ چون داورِ مسئله فقهی، فقه امامیه است، نه حقوق غربی. این تمایزِ مقامی ـ فهم در برابر داوری ـ از اصولِ روشیِ این پژوهش است و در سراسر رساله رعایت شده.</w:t>
-      </w:r>
-    </w:p>
-    <w:p>
-      <w:pPr>
-        <w:pStyle w:val="TH-Body"/>
-        <w:widowControl/>
-        <w:bidi w:val="1"/>
-        <w:spacing w:before="0" w:after="120" w:line="288" w:lineRule="auto"/>
-        <w:ind w:firstLine="283"/>
-        <w:jc w:val="both"/>
-      </w:pPr>
-      <w:r>
-        <w:rPr>
-          <w:rFonts w:ascii="B Lotus" w:hAnsi="B Lotus" w:cs="B Lotus" w:eastAsia="B Lotus"/>
-          <w:b w:val="0"/>
-          <w:i w:val="0"/>
-          <w:sz w:val="28"/>
-          <w:szCs w:val="28"/>
-        </w:rPr>
-        <w:t>نوآوری این رساله نسبت به همه این پیشینه‌ها در سه چیز است که هر سه را با ادعا نمی‌گویم بلکه متن رساله گواهشان است: یکم، صورت‌بندی سه‌سطحی مسئله ـ فقهی، اساسی، بین‌المللی ـ و تحلیل تفکیک‌شده هر سه با هم که تا کنون به این صورت انجام نشده؛ دوم، استخراج ضوابط هشت‌گانه عملی برای عدول حکومتی که تا کنون به این صورت مدون نشده و می‌تواند دستورالعمل تصمیم‌گیر باشد؛ و سوم، نقد مستند ادعای وجود اختیار صریح رهبری درباره معاهدات در اصل ۱۱۰ و ارائه تفکیک چهارگانه مراتب اختیار ـ صریح، ضمنی، ولایی، حکومتی ـ که راه میانه‌ای میان دو افراط رایج است.</w:t>
-      </w:r>
-    </w:p>
-    <w:p>
-      <w:pPr>
-        <w:pStyle w:val="TH-Goftar"/>
-        <w:widowControl/>
-        <w:bidi w:val="1"/>
-        <w:spacing w:before="200" w:after="120" w:line="288" w:lineRule="auto"/>
-        <w:jc w:val="right"/>
-        <w:keepNext w:val="1"/>
-      </w:pPr>
-      <w:r>
-        <w:rPr>
-          <w:rFonts w:ascii="B Titr" w:hAnsi="B Titr" w:cs="B Titr" w:eastAsia="B Titr"/>
-          <w:b/>
-          <w:i w:val="0"/>
-          <w:sz w:val="32"/>
-          <w:szCs w:val="32"/>
-        </w:rPr>
-        <w:t>روش تحقیق</w:t>
-      </w:r>
-    </w:p>
-    <w:p>
-      <w:pPr>
-        <w:pStyle w:val="TH-Body"/>
-        <w:widowControl/>
-        <w:bidi w:val="1"/>
-        <w:spacing w:before="0" w:after="120" w:line="288" w:lineRule="auto"/>
-        <w:ind w:firstLine="283"/>
-        <w:jc w:val="both"/>
-      </w:pPr>
-      <w:r>
-        <w:rPr>
-          <w:rFonts w:ascii="B Lotus" w:hAnsi="B Lotus" w:cs="B Lotus" w:eastAsia="B Lotus"/>
-          <w:b w:val="0"/>
-          <w:i w:val="0"/>
-          <w:sz w:val="28"/>
-          <w:szCs w:val="28"/>
-        </w:rPr>
-        <w:t>روش این پژوهش کتابخانه‌ای، تحلیلی و استنباطی است و ابزار گردآوری‌اش فیش‌برداری از منابع دست‌اول عربی و فارسی. در مقام داوری میان آرا هم روشم همان است که برای سطح سه حوزه گفته‌اند: «نقل خوب اقوال» و «نقل خوب ادله» و سپس نقد منصفانه و داوری مستدل. یعنی اول رأی هر طرف را چنان‌که خودش گفته می‌آورم ـ نه چنان‌که منتقدانش تحریف کرده‌اند ـ، بعد دلیلش را با قوتش نقل می‌کنم، بعد نقدش می‌کنم، و آخر داوری می‌کنم. سعی کرده‌ام در سراسر رساله به این روش وفادار بمانم؛ و اگر جایی ناموفق بوده‌ام، خواننده بصیر خودش داوری خواهد کرد.</w:t>
-      </w:r>
-    </w:p>
-    <w:p>
-      <w:pPr>
-        <w:pStyle w:val="TH-Body"/>
-        <w:widowControl/>
-        <w:bidi w:val="1"/>
-        <w:spacing w:before="0" w:after="120" w:line="288" w:lineRule="auto"/>
-        <w:ind w:firstLine="283"/>
-        <w:jc w:val="both"/>
-      </w:pPr>
-      <w:r>
-        <w:rPr>
-          <w:rFonts w:ascii="B Lotus" w:hAnsi="B Lotus" w:cs="B Lotus" w:eastAsia="B Lotus"/>
-          <w:b w:val="0"/>
-          <w:i w:val="0"/>
-          <w:sz w:val="28"/>
-          <w:szCs w:val="28"/>
-        </w:rPr>
-        <w:t>در فقه، روشم اجتهادی مصطلح است: استقصای ادله (کتاب، سنت، عقل، بنا)، بررسی سندی و دلالی هر دلیل، دفع اشکالات، و جمع‌بندی. در حقوق بین‌الملل، روشم تفسیری ـ تحلیلی است: فهم متن کنوانسیون‌ها و طرح مواد و رویه دیوان و تطبیقشان بر مسئله. و در حقوق اساسی، روشم تفسیری است: فهم متن اصول و منطق نظام قانون اساسی و داوری میان دیدگاه‌های مفسران. در هر سه عرصه، اصل راهنمایم «امانت» بوده: چیزی را که ندیده‌ام نسبت نمی‌دهم، و هرجا تردید داشته‌ام صادقانه قید «نیازمند بررسی منبع اصلی» زده‌ام.</w:t>
-      </w:r>
-    </w:p>
-    <w:p>
-      <w:pPr>
-        <w:pStyle w:val="TH-Body"/>
-        <w:widowControl/>
-        <w:bidi w:val="1"/>
-        <w:spacing w:before="0" w:after="120" w:line="288" w:lineRule="auto"/>
-        <w:ind w:firstLine="283"/>
-        <w:jc w:val="both"/>
-      </w:pPr>
-      <w:r>
-        <w:rPr>
-          <w:rFonts w:ascii="B Lotus" w:hAnsi="B Lotus" w:cs="B Lotus" w:eastAsia="B Lotus"/>
-          <w:b w:val="0"/>
-          <w:i w:val="0"/>
-          <w:sz w:val="28"/>
-          <w:szCs w:val="28"/>
-        </w:rPr>
-        <w:t>و نکته‌ای درباره «شیوه استدلال» که گفتنش را لازم می‌دانم: روش من در این رساله، «استدلال قدم‌به‌قدم با دفع اشکال» است؛ یعنی هر ادعایی را که مطرح می‌کنم، اول دلیلش را می‌آورم، بعد اشکالِ مقدّرش را طرح می‌کنم، بعد جواب می‌دهم، و آخر نتیجه می‌گیرم. این شیوه ـ که همان شیوه مرسومِ درس خارج حوزه است ـ دو فایده دارد: هم خواننده را با خودش همراه می‌کند (چون اشکال‌هایی که به ذهن او می‌رسد، در متن پاسخ داده شده)، هم جلوِ مغالطه را می‌گیرد (چون مدعی نمی‌تواند از اشکال‌ها فرار کند). خواننده‌ای که این رساله را می‌خواند، اگر جایی اشکالی به ذهنش رسید که در متن پاسخ نگرفته، حق دارد آن را به حسابِ نقصِ کار من بگذارد ـ و من پیشاپیش از تذکرش سپاسگزارم.</w:t>
-      </w:r>
-    </w:p>
-    <w:p>
-      <w:pPr>
-        <w:pStyle w:val="TH-Goftar"/>
-        <w:widowControl/>
-        <w:bidi w:val="1"/>
-        <w:spacing w:before="200" w:after="120" w:line="288" w:lineRule="auto"/>
-        <w:jc w:val="right"/>
-        <w:keepNext w:val="1"/>
-      </w:pPr>
-      <w:r>
-        <w:rPr>
-          <w:rFonts w:ascii="B Titr" w:hAnsi="B Titr" w:cs="B Titr" w:eastAsia="B Titr"/>
-          <w:b/>
-          <w:i w:val="0"/>
-          <w:sz w:val="32"/>
-          <w:szCs w:val="32"/>
-        </w:rPr>
-        <w:t>ساماندهی تحقیق</w:t>
-      </w:r>
-    </w:p>
-    <w:p>
-      <w:pPr>
-        <w:pStyle w:val="TH-Body"/>
-        <w:widowControl/>
-        <w:bidi w:val="1"/>
-        <w:spacing w:before="0" w:after="120" w:line="288" w:lineRule="auto"/>
-        <w:ind w:firstLine="283"/>
-        <w:jc w:val="both"/>
-      </w:pPr>
-      <w:r>
-        <w:rPr>
-          <w:rFonts w:ascii="B Lotus" w:hAnsi="B Lotus" w:cs="B Lotus" w:eastAsia="B Lotus"/>
-          <w:b w:val="0"/>
-          <w:i w:val="0"/>
-          <w:sz w:val="28"/>
-          <w:szCs w:val="28"/>
-        </w:rPr>
-        <w:t>این رساله در سه بخش و پنج فصل سامان یافته که منطقش از کلی به جزئی و از مبنا به حکم و از نظر به عمل است؛ و اگر خواننده‌ای فصل‌ها را به همین ترتیب بخواند، سیر بحث برایش طبیعی و روان خواهد بود:</w:t>
-      </w:r>
-    </w:p>
-    <w:p>
-      <w:pPr>
-        <w:pStyle w:val="TH-Body"/>
-        <w:widowControl/>
-        <w:bidi w:val="1"/>
-        <w:spacing w:before="0" w:after="120" w:line="288" w:lineRule="auto"/>
-        <w:ind w:firstLine="283"/>
-        <w:jc w:val="both"/>
-      </w:pPr>
-      <w:r>
-        <w:rPr>
-          <w:rFonts w:ascii="B Lotus" w:hAnsi="B Lotus" w:cs="B Lotus" w:eastAsia="B Lotus"/>
-          <w:b w:val="0"/>
-          <w:i w:val="0"/>
-          <w:sz w:val="28"/>
-          <w:szCs w:val="28"/>
-        </w:rPr>
-        <w:t>بخش اول ـ مبانی و کلیات ـ دو فصل دارد: فصل اول مفاهیم و تعاریف (معاهده، ولی فقیه، عدول، مصلحت و مفاهیم خویشاوند) و چارچوب نظری؛ و فصل دوم کلیات حقوق معاهدات (تاریخچه، اصول مسلم، شرایط اعتبار و سازوکارهای تعلیق و خاتمه) و اصول قانون اساسی مرتبط. این بخش، زمین بازی را مشخص می‌کند؛ بی‌آن، بحث‌های بعدی بر هوا می‌ماند.</w:t>
-      </w:r>
-    </w:p>
-    <w:p>
-      <w:pPr>
-        <w:pStyle w:val="TH-Body"/>
-        <w:widowControl/>
-        <w:bidi w:val="1"/>
-        <w:spacing w:before="0" w:after="120" w:line="288" w:lineRule="auto"/>
-        <w:ind w:firstLine="283"/>
-        <w:jc w:val="both"/>
-      </w:pPr>
-      <w:r>
-        <w:rPr>
-          <w:rFonts w:ascii="B Lotus" w:hAnsi="B Lotus" w:cs="B Lotus" w:eastAsia="B Lotus"/>
-          <w:b w:val="0"/>
-          <w:i w:val="0"/>
-          <w:sz w:val="28"/>
-          <w:szCs w:val="28"/>
-        </w:rPr>
-        <w:t>بخش دوم ـ تحلیل فقهی ـ هم دو فصل دارد که قلب تپنده رساله‌اند: فصل سوم ادله وجوب وفای به عهد (پنج آیه عام، آیات خاص جهاد، روایات، سیره و عقل) با نقد و داوری؛ و فصل چهارم مبانی جواز عدول (تزاحم، حکم حکومتی، مصلحت، نفی ضرر و حرج) و ضوابط هشت‌گانه و طیف پنج‌صورتِ عدول. هرکس فقط این دو فصل را بخواند، جوهر استدلال رساله را دریافته است.</w:t>
-      </w:r>
-    </w:p>
-    <w:p>
-      <w:pPr>
-        <w:pStyle w:val="TH-Body"/>
-        <w:widowControl/>
-        <w:bidi w:val="1"/>
-        <w:spacing w:before="0" w:after="120" w:line="288" w:lineRule="auto"/>
-        <w:ind w:firstLine="283"/>
-        <w:jc w:val="both"/>
-      </w:pPr>
-      <w:r>
-        <w:rPr>
-          <w:rFonts w:ascii="B Lotus" w:hAnsi="B Lotus" w:cs="B Lotus" w:eastAsia="B Lotus"/>
-          <w:b w:val="0"/>
-          <w:i w:val="0"/>
-          <w:sz w:val="28"/>
-          <w:szCs w:val="28"/>
-        </w:rPr>
-        <w:t>و بخش سوم ـ تحلیل حقوقی ـ یک فصل دارد: فصل پنجم که در پنج گفتار، مسئولیت بین‌المللی و انتساب و تفکیک سه‌گانه و اسباب رافع و راهبردها و حقوق اساسی تصمیم را تحلیل می‌کند. پایان‌بخش رساله هم نتیجه‌گیری (پنج دستاورد) و فهرست منابع و پیوست‌هاست.</w:t>
-      </w:r>
-    </w:p>
-    <w:p>
-      <w:pPr>
-        <w:pStyle w:val="TH-Goftar"/>
-        <w:widowControl/>
-        <w:bidi w:val="1"/>
-        <w:spacing w:before="200" w:after="120" w:line="288" w:lineRule="auto"/>
-        <w:jc w:val="right"/>
-        <w:keepNext w:val="1"/>
-      </w:pPr>
-      <w:r>
-        <w:rPr>
-          <w:rFonts w:ascii="B Titr" w:hAnsi="B Titr" w:cs="B Titr" w:eastAsia="B Titr"/>
-          <w:b/>
-          <w:i w:val="0"/>
-          <w:sz w:val="32"/>
-          <w:szCs w:val="32"/>
-        </w:rPr>
-        <w:t>قلمرو، محدودیت‌ها و اصطلاحات</w:t>
-      </w:r>
-    </w:p>
-    <w:p>
-      <w:pPr>
-        <w:pStyle w:val="TH-Body"/>
-        <w:widowControl/>
-        <w:bidi w:val="1"/>
-        <w:spacing w:before="0" w:after="120" w:line="288" w:lineRule="auto"/>
-        <w:ind w:firstLine="283"/>
-        <w:jc w:val="both"/>
-      </w:pPr>
-      <w:r>
-        <w:rPr>
-          <w:rFonts w:ascii="B Lotus" w:hAnsi="B Lotus" w:cs="B Lotus" w:eastAsia="B Lotus"/>
-          <w:b w:val="0"/>
-          <w:i w:val="0"/>
-          <w:sz w:val="28"/>
-          <w:szCs w:val="28"/>
-        </w:rPr>
-        <w:t>قلمرو زمانی‌ام از صدر اسلام (برای سیره) تا حقوق بین‌الملل معاصر (تا ۲۰۲۵) است؛ قلمرو مکانی‌ام نظام جمهوری اسلامی ایران؛ و قلمرو موضوعی‌ام منحصر در «عدول ولی فقیه از تعهدات بین‌المللی» با همان تعریف مضیقی که در فصل اول می‌آید. از این قلمرو بیرون نمی‌روم؛ یعنی نه به معاهدات اشخاص خصوصی می‌پردازم، نه به تصمیم‌های دولت‌های دیگر، نه به احکام جهاد ابتدایی و تفاصیلش، و نه به تحلیل سیاسی روز ـ مگر به‌قدر ضرورت برای مثال تحلیلی. این تحدید، هم از سر واقع‌بینی است (یک رساله سطح سه نمی‌تواند همه‌چیز را بگوید) و هم از سر امانت (بهتر است کم بگویم و درست بگویم، تا زیاد بگویم و سست بگویم).</w:t>
-      </w:r>
-    </w:p>
-    <w:p>
-      <w:pPr>
-        <w:pStyle w:val="TH-Body"/>
-        <w:widowControl/>
-        <w:bidi w:val="1"/>
-        <w:spacing w:before="0" w:after="120" w:line="288" w:lineRule="auto"/>
-        <w:ind w:firstLine="283"/>
-        <w:jc w:val="both"/>
-      </w:pPr>
-      <w:r>
-        <w:rPr>
-          <w:rFonts w:ascii="B Lotus" w:hAnsi="B Lotus" w:cs="B Lotus" w:eastAsia="B Lotus"/>
-          <w:b w:val="0"/>
-          <w:i w:val="0"/>
-          <w:sz w:val="28"/>
-          <w:szCs w:val="28"/>
-        </w:rPr>
-        <w:t>محدودیت‌هایم را هم صادقانه می‌گویم، چون پنهان کردنشان نه به نفع من است نه به نفع خواننده: یکم، دسترسی نداشتن به اسناد محرمانه مذاکرات و تصمیم‌های حکومتیِ معاصر که تحلیل تجربی را محدود می‌کند و مرا به تحلیل نظری و مثال‌های علنی بسنده کرده؛ دوم، پراکندگی و کم‌کاری ادبیات فقهی در باب معاهدات امروزی که ناگزیرم کرده بعضی جاها از قواعد عام به خاص برسم ـ راهی دشوار و پرخطر که با احتیاط پیموده‌ام؛ و سوم، اختلاف تفاسیر حقوق‌دانان در مفاهیم کلیدی وین و طرح مسئولیت که داوری قطعی را در بعضی فرع‌ها ناممکن کرده و به ترجیح ظنی بسنده کرده‌ام.</w:t>
-      </w:r>
-    </w:p>
-    <w:p>
-      <w:pPr>
-        <w:pStyle w:val="TH-Body"/>
-        <w:widowControl/>
-        <w:bidi w:val="1"/>
-        <w:spacing w:before="0" w:after="120" w:line="288" w:lineRule="auto"/>
-        <w:ind w:firstLine="283"/>
-        <w:jc w:val="both"/>
-      </w:pPr>
-      <w:r>
-        <w:rPr>
-          <w:rFonts w:ascii="B Lotus" w:hAnsi="B Lotus" w:cs="B Lotus" w:eastAsia="B Lotus"/>
-          <w:b w:val="0"/>
-          <w:i w:val="0"/>
-          <w:sz w:val="28"/>
-          <w:szCs w:val="28"/>
-        </w:rPr>
-        <w:t>درباره اصطلاحات هم این‌جا فقط به‌اجمال می‌گویم و تفصیلش را به فصل اول می‌سپارم: هرجا «ولی فقیه» گفتم منظورم مقام رهبری در نظام جمهوری اسلامی ایران است ـ نه هر فقیه جامع‌الشرایطی؛ هرجا «تعهد بین‌المللی» گفتم منظورم تعهد ناشی از معاهده به معنای کنوانسیون وین است ـ نه هر تعهد اخلاقی یا سیاسی؛ هرجا «عدول» گفتم منظورم تصمیم یک‌جانبه و فوق‌العاده حاکم بر توقف یا تعلیق اجراست ـ نه خاتمه توافقی و عادی؛ و هرجا «مصلحت» گفتم منظورم مصلحت نوعی نظام و امت است ـ نه سلیقه شخصی تصمیم‌گیر. هرکدام از این قیدها بار معنایی و استدلالی دارد که در فصل اول یک‌به‌یک باز می‌شود؛ و خواننده‌ای که این قیدها را نادیده بگیرد، در فصول بعدی گم خواهد شد.</w:t>
-      </w:r>
-    </w:p>
-    <w:p>
-      <w:r>
-        <w:br w:type="page"/>
-      </w:r>
-    </w:p>
-    <w:p/>
-    <w:p/>
-    <w:p/>
-    <w:p/>
-    <w:p>
-      <w:pPr>
-        <w:pStyle w:val="TH-Bakhsh"/>
-        <w:widowControl/>
-        <w:bidi w:val="1"/>
-        <w:spacing w:before="0" w:after="120" w:line="288" w:lineRule="auto"/>
-        <w:jc w:val="center"/>
-      </w:pPr>
-      <w:r>
-        <w:rPr>
-          <w:rFonts w:ascii="B Titr" w:hAnsi="B Titr" w:cs="B Titr" w:eastAsia="B Titr"/>
-          <w:b/>
-          <w:i w:val="0"/>
-          <w:sz w:val="60"/>
-          <w:szCs w:val="60"/>
+          <w:sz w:val="64"/>
+          <w:szCs w:val="64"/>
         </w:rPr>
         <w:t>بخش اول: مبانی و کلیات</w:t>
       </w:r>
     </w:p>
     <w:p>
-      <w:r>
-        <w:br w:type="page"/>
-      </w:r>
-    </w:p>
-    <w:p>
-      <w:r>
-        <w:br w:type="page"/>
-      </w:r>
-    </w:p>
-    <w:p>
-      <w:pPr>
-        <w:pStyle w:val="TH-Fasl"/>
-        <w:widowControl/>
-        <w:bidi w:val="1"/>
-        <w:spacing w:before="120" w:after="200" w:line="288" w:lineRule="auto"/>
+      <w:pPr>
+        <w:widowControl/>
+        <w:bidi w:val="1"/>
+        <w:spacing w:before="0" w:after="120" w:line="288" w:lineRule="auto"/>
+        <w:ind w:right="2268" w:left="2268"/>
         <w:jc w:val="center"/>
         <w:pBdr>
           <w:bottom w:val="single" w:sz="12" w:space="6" w:color="1F3864"/>
         </w:pBdr>
+      </w:pPr>
+    </w:p>
+    <w:p>
+      <w:r>
+        <w:br w:type="page"/>
+      </w:r>
+    </w:p>
+    <w:p>
+      <w:r>
+        <w:br w:type="page"/>
+      </w:r>
+    </w:p>
+    <w:p/>
+    <w:p/>
+    <w:p>
+      <w:pPr>
+        <w:pStyle w:val="TH-Fasl"/>
+        <w:widowControl/>
+        <w:bidi w:val="1"/>
+        <w:spacing w:before="120" w:after="240" w:line="288" w:lineRule="auto"/>
+        <w:jc w:val="center"/>
+        <w:pBdr>
+          <w:top w:val="single" w:sz="12" w:space="8" w:color="1F3864"/>
+          <w:bottom w:val="single" w:sz="12" w:space="8" w:color="1F3864"/>
+        </w:pBdr>
         <w:keepNext w:val="1"/>
       </w:pPr>
       <w:r>
@@ -2014,7 +2075,6 @@
         <w:widowControl/>
         <w:bidi w:val="1"/>
         <w:spacing w:before="0" w:after="120" w:line="288" w:lineRule="auto"/>
-        <w:ind w:firstLine="283"/>
         <w:jc w:val="both"/>
       </w:pPr>
       <w:r>
@@ -2036,6 +2096,7 @@
         <w:spacing w:before="200" w:after="120" w:line="288" w:lineRule="auto"/>
         <w:jc w:val="right"/>
         <w:keepNext w:val="1"/>
+        <w:shd w:val="clear" w:fill="EDEDED"/>
       </w:pPr>
       <w:r>
         <w:rPr>
@@ -2074,7 +2135,6 @@
         <w:widowControl/>
         <w:bidi w:val="1"/>
         <w:spacing w:before="0" w:after="120" w:line="288" w:lineRule="auto"/>
-        <w:ind w:firstLine="283"/>
         <w:jc w:val="both"/>
       </w:pPr>
       <w:r>
@@ -2173,7 +2233,6 @@
         <w:widowControl/>
         <w:bidi w:val="1"/>
         <w:spacing w:before="0" w:after="120" w:line="288" w:lineRule="auto"/>
-        <w:ind w:firstLine="283"/>
         <w:jc w:val="both"/>
       </w:pPr>
       <w:r>
@@ -2334,7 +2393,6 @@
         <w:widowControl/>
         <w:bidi w:val="1"/>
         <w:spacing w:before="0" w:after="120" w:line="288" w:lineRule="auto"/>
-        <w:ind w:firstLine="283"/>
         <w:jc w:val="both"/>
       </w:pPr>
       <w:r>
@@ -2394,7 +2452,6 @@
         <w:widowControl/>
         <w:bidi w:val="1"/>
         <w:spacing w:before="0" w:after="120" w:line="288" w:lineRule="auto"/>
-        <w:ind w:firstLine="283"/>
         <w:jc w:val="both"/>
       </w:pPr>
       <w:r>
@@ -2436,6 +2493,7 @@
         <w:spacing w:before="200" w:after="120" w:line="288" w:lineRule="auto"/>
         <w:jc w:val="right"/>
         <w:keepNext w:val="1"/>
+        <w:shd w:val="clear" w:fill="EDEDED"/>
       </w:pPr>
       <w:r>
         <w:rPr>
@@ -2474,7 +2532,6 @@
         <w:widowControl/>
         <w:bidi w:val="1"/>
         <w:spacing w:before="0" w:after="120" w:line="288" w:lineRule="auto"/>
-        <w:ind w:firstLine="283"/>
         <w:jc w:val="both"/>
       </w:pPr>
       <w:r>
@@ -2576,7 +2633,6 @@
         <w:widowControl/>
         <w:bidi w:val="1"/>
         <w:spacing w:before="0" w:after="120" w:line="288" w:lineRule="auto"/>
-        <w:ind w:firstLine="283"/>
         <w:jc w:val="both"/>
       </w:pPr>
       <w:r>
@@ -2698,6 +2754,7 @@
         <w:spacing w:before="200" w:after="120" w:line="288" w:lineRule="auto"/>
         <w:jc w:val="right"/>
         <w:keepNext w:val="1"/>
+        <w:shd w:val="clear" w:fill="EDEDED"/>
       </w:pPr>
       <w:r>
         <w:rPr>
@@ -2736,7 +2793,6 @@
         <w:widowControl/>
         <w:bidi w:val="1"/>
         <w:spacing w:before="0" w:after="120" w:line="288" w:lineRule="auto"/>
-        <w:ind w:firstLine="283"/>
         <w:jc w:val="both"/>
       </w:pPr>
       <w:r>
@@ -2836,7 +2892,6 @@
         <w:widowControl/>
         <w:bidi w:val="1"/>
         <w:spacing w:before="0" w:after="120" w:line="288" w:lineRule="auto"/>
-        <w:ind w:firstLine="283"/>
         <w:jc w:val="both"/>
       </w:pPr>
       <w:r>
@@ -2997,7 +3052,6 @@
         <w:widowControl/>
         <w:bidi w:val="1"/>
         <w:spacing w:before="0" w:after="120" w:line="288" w:lineRule="auto"/>
-        <w:ind w:firstLine="283"/>
         <w:jc w:val="both"/>
       </w:pPr>
       <w:r>
@@ -3139,6 +3193,7 @@
         <w:spacing w:before="200" w:after="120" w:line="288" w:lineRule="auto"/>
         <w:jc w:val="right"/>
         <w:keepNext w:val="1"/>
+        <w:shd w:val="clear" w:fill="EDEDED"/>
       </w:pPr>
       <w:r>
         <w:rPr>
@@ -3177,7 +3232,6 @@
         <w:widowControl/>
         <w:bidi w:val="1"/>
         <w:spacing w:before="0" w:after="120" w:line="288" w:lineRule="auto"/>
-        <w:ind w:firstLine="283"/>
         <w:jc w:val="both"/>
       </w:pPr>
       <w:r>
@@ -3318,7 +3372,6 @@
         <w:widowControl/>
         <w:bidi w:val="1"/>
         <w:spacing w:before="0" w:after="120" w:line="288" w:lineRule="auto"/>
-        <w:ind w:firstLine="283"/>
         <w:jc w:val="both"/>
       </w:pPr>
       <w:r>
@@ -3399,7 +3452,6 @@
         <w:widowControl/>
         <w:bidi w:val="1"/>
         <w:spacing w:before="0" w:after="120" w:line="288" w:lineRule="auto"/>
-        <w:ind w:firstLine="283"/>
         <w:jc w:val="both"/>
       </w:pPr>
       <w:r>
@@ -3501,6 +3553,7 @@
         <w:spacing w:before="200" w:after="120" w:line="288" w:lineRule="auto"/>
         <w:jc w:val="right"/>
         <w:keepNext w:val="1"/>
+        <w:shd w:val="clear" w:fill="EDEDED"/>
       </w:pPr>
       <w:r>
         <w:rPr>
@@ -3539,7 +3592,6 @@
         <w:widowControl/>
         <w:bidi w:val="1"/>
         <w:spacing w:before="0" w:after="120" w:line="288" w:lineRule="auto"/>
-        <w:ind w:firstLine="283"/>
         <w:jc w:val="both"/>
       </w:pPr>
       <w:r>
@@ -3579,7 +3631,6 @@
         <w:widowControl/>
         <w:bidi w:val="1"/>
         <w:spacing w:before="0" w:after="120" w:line="288" w:lineRule="auto"/>
-        <w:ind w:firstLine="283"/>
         <w:jc w:val="both"/>
       </w:pPr>
       <w:r>
@@ -3681,7 +3732,6 @@
         <w:widowControl/>
         <w:bidi w:val="1"/>
         <w:spacing w:before="0" w:after="120" w:line="288" w:lineRule="auto"/>
-        <w:ind w:firstLine="283"/>
         <w:jc w:val="both"/>
       </w:pPr>
       <w:r>
@@ -3752,7 +3802,6 @@
         <w:widowControl/>
         <w:bidi w:val="1"/>
         <w:spacing w:before="0" w:after="120" w:line="288" w:lineRule="auto"/>
-        <w:ind w:firstLine="283"/>
         <w:jc w:val="both"/>
       </w:pPr>
       <w:r>
@@ -3823,7 +3872,6 @@
         <w:widowControl/>
         <w:bidi w:val="1"/>
         <w:spacing w:before="0" w:after="120" w:line="288" w:lineRule="auto"/>
-        <w:ind w:firstLine="283"/>
         <w:jc w:val="both"/>
       </w:pPr>
       <w:r>
@@ -3845,6 +3893,7 @@
         <w:spacing w:before="200" w:after="120" w:line="288" w:lineRule="auto"/>
         <w:jc w:val="right"/>
         <w:keepNext w:val="1"/>
+        <w:shd w:val="clear" w:fill="EDEDED"/>
       </w:pPr>
       <w:r>
         <w:rPr>
@@ -3863,7 +3912,6 @@
         <w:widowControl/>
         <w:bidi w:val="1"/>
         <w:spacing w:before="0" w:after="120" w:line="288" w:lineRule="auto"/>
-        <w:ind w:firstLine="283"/>
         <w:jc w:val="both"/>
       </w:pPr>
       <w:r>
@@ -3882,15 +3930,18 @@
         <w:br w:type="page"/>
       </w:r>
     </w:p>
+    <w:p/>
+    <w:p/>
     <w:p>
       <w:pPr>
         <w:pStyle w:val="TH-Fasl"/>
         <w:widowControl/>
         <w:bidi w:val="1"/>
-        <w:spacing w:before="120" w:after="200" w:line="288" w:lineRule="auto"/>
+        <w:spacing w:before="120" w:after="240" w:line="288" w:lineRule="auto"/>
         <w:jc w:val="center"/>
         <w:pBdr>
-          <w:bottom w:val="single" w:sz="12" w:space="6" w:color="1F3864"/>
+          <w:top w:val="single" w:sz="12" w:space="8" w:color="1F3864"/>
+          <w:bottom w:val="single" w:sz="12" w:space="8" w:color="1F3864"/>
         </w:pBdr>
         <w:keepNext w:val="1"/>
       </w:pPr>
@@ -3911,7 +3962,6 @@
         <w:widowControl/>
         <w:bidi w:val="1"/>
         <w:spacing w:before="0" w:after="120" w:line="288" w:lineRule="auto"/>
-        <w:ind w:firstLine="283"/>
         <w:jc w:val="both"/>
       </w:pPr>
       <w:r>
@@ -3933,6 +3983,7 @@
         <w:spacing w:before="200" w:after="120" w:line="288" w:lineRule="auto"/>
         <w:jc w:val="right"/>
         <w:keepNext w:val="1"/>
+        <w:shd w:val="clear" w:fill="EDEDED"/>
       </w:pPr>
       <w:r>
         <w:rPr>
@@ -3971,7 +4022,6 @@
         <w:widowControl/>
         <w:bidi w:val="1"/>
         <w:spacing w:before="0" w:after="120" w:line="288" w:lineRule="auto"/>
-        <w:ind w:firstLine="283"/>
         <w:jc w:val="both"/>
       </w:pPr>
       <w:r>
@@ -4042,7 +4092,6 @@
         <w:widowControl/>
         <w:bidi w:val="1"/>
         <w:spacing w:before="0" w:after="120" w:line="288" w:lineRule="auto"/>
-        <w:ind w:firstLine="283"/>
         <w:jc w:val="both"/>
       </w:pPr>
       <w:r>
@@ -4100,7 +4149,6 @@
         <w:widowControl/>
         <w:bidi w:val="1"/>
         <w:spacing w:before="0" w:after="120" w:line="288" w:lineRule="auto"/>
-        <w:ind w:firstLine="283"/>
         <w:jc w:val="both"/>
       </w:pPr>
       <w:r>
@@ -4160,7 +4208,6 @@
         <w:widowControl/>
         <w:bidi w:val="1"/>
         <w:spacing w:before="0" w:after="120" w:line="288" w:lineRule="auto"/>
-        <w:ind w:firstLine="283"/>
         <w:jc w:val="both"/>
       </w:pPr>
       <w:r>
@@ -4218,7 +4265,6 @@
         <w:widowControl/>
         <w:bidi w:val="1"/>
         <w:spacing w:before="0" w:after="120" w:line="288" w:lineRule="auto"/>
-        <w:ind w:firstLine="283"/>
         <w:jc w:val="both"/>
       </w:pPr>
       <w:r>
@@ -4271,6 +4317,7 @@
         <w:spacing w:before="200" w:after="120" w:line="288" w:lineRule="auto"/>
         <w:jc w:val="right"/>
         <w:keepNext w:val="1"/>
+        <w:shd w:val="clear" w:fill="EDEDED"/>
       </w:pPr>
       <w:r>
         <w:rPr>
@@ -4309,7 +4356,6 @@
         <w:widowControl/>
         <w:bidi w:val="1"/>
         <w:spacing w:before="0" w:after="120" w:line="288" w:lineRule="auto"/>
-        <w:ind w:firstLine="283"/>
         <w:jc w:val="both"/>
       </w:pPr>
       <w:r>
@@ -4390,7 +4436,6 @@
         <w:widowControl/>
         <w:bidi w:val="1"/>
         <w:spacing w:before="0" w:after="120" w:line="288" w:lineRule="auto"/>
-        <w:ind w:firstLine="283"/>
         <w:jc w:val="both"/>
       </w:pPr>
       <w:r>
@@ -4451,7 +4496,6 @@
         <w:widowControl/>
         <w:bidi w:val="1"/>
         <w:spacing w:before="0" w:after="120" w:line="288" w:lineRule="auto"/>
-        <w:ind w:firstLine="283"/>
         <w:jc w:val="both"/>
       </w:pPr>
       <w:r>
@@ -4544,7 +4588,6 @@
         <w:widowControl/>
         <w:bidi w:val="1"/>
         <w:spacing w:before="0" w:after="120" w:line="288" w:lineRule="auto"/>
-        <w:ind w:firstLine="283"/>
         <w:jc w:val="both"/>
       </w:pPr>
       <w:r>
@@ -4636,7 +4679,6 @@
         <w:widowControl/>
         <w:bidi w:val="1"/>
         <w:spacing w:before="0" w:after="120" w:line="288" w:lineRule="auto"/>
-        <w:ind w:firstLine="283"/>
         <w:jc w:val="both"/>
       </w:pPr>
       <w:r>
@@ -4697,7 +4739,6 @@
         <w:widowControl/>
         <w:bidi w:val="1"/>
         <w:spacing w:before="0" w:after="120" w:line="288" w:lineRule="auto"/>
-        <w:ind w:firstLine="283"/>
         <w:jc w:val="both"/>
       </w:pPr>
       <w:r>
@@ -4770,6 +4811,7 @@
         <w:spacing w:before="200" w:after="120" w:line="288" w:lineRule="auto"/>
         <w:jc w:val="right"/>
         <w:keepNext w:val="1"/>
+        <w:shd w:val="clear" w:fill="EDEDED"/>
       </w:pPr>
       <w:r>
         <w:rPr>
@@ -4808,7 +4850,6 @@
         <w:widowControl/>
         <w:bidi w:val="1"/>
         <w:spacing w:before="0" w:after="120" w:line="288" w:lineRule="auto"/>
-        <w:ind w:firstLine="283"/>
         <w:jc w:val="both"/>
       </w:pPr>
       <w:r>
@@ -4879,7 +4920,6 @@
         <w:widowControl/>
         <w:bidi w:val="1"/>
         <w:spacing w:before="0" w:after="120" w:line="288" w:lineRule="auto"/>
-        <w:ind w:firstLine="283"/>
         <w:jc w:val="both"/>
       </w:pPr>
       <w:r>
@@ -4922,6 +4962,7 @@
         <w:spacing w:before="200" w:after="120" w:line="288" w:lineRule="auto"/>
         <w:jc w:val="right"/>
         <w:keepNext w:val="1"/>
+        <w:shd w:val="clear" w:fill="EDEDED"/>
       </w:pPr>
       <w:r>
         <w:rPr>
@@ -4960,7 +5001,6 @@
         <w:widowControl/>
         <w:bidi w:val="1"/>
         <w:spacing w:before="0" w:after="120" w:line="288" w:lineRule="auto"/>
-        <w:ind w:firstLine="283"/>
         <w:jc w:val="both"/>
       </w:pPr>
       <w:r>
@@ -5020,7 +5060,6 @@
         <w:widowControl/>
         <w:bidi w:val="1"/>
         <w:spacing w:before="0" w:after="120" w:line="288" w:lineRule="auto"/>
-        <w:ind w:firstLine="283"/>
         <w:jc w:val="both"/>
       </w:pPr>
       <w:r>
@@ -5081,7 +5120,6 @@
         <w:widowControl/>
         <w:bidi w:val="1"/>
         <w:spacing w:before="0" w:after="120" w:line="288" w:lineRule="auto"/>
-        <w:ind w:firstLine="283"/>
         <w:jc w:val="both"/>
       </w:pPr>
       <w:r>
@@ -5172,7 +5210,6 @@
         <w:widowControl/>
         <w:bidi w:val="1"/>
         <w:spacing w:before="0" w:after="120" w:line="288" w:lineRule="auto"/>
-        <w:ind w:firstLine="283"/>
         <w:jc w:val="both"/>
       </w:pPr>
       <w:r>
@@ -5235,6 +5272,7 @@
         <w:spacing w:before="200" w:after="120" w:line="288" w:lineRule="auto"/>
         <w:jc w:val="right"/>
         <w:keepNext w:val="1"/>
+        <w:shd w:val="clear" w:fill="EDEDED"/>
       </w:pPr>
       <w:r>
         <w:rPr>
@@ -5273,7 +5311,6 @@
         <w:widowControl/>
         <w:bidi w:val="1"/>
         <w:spacing w:before="0" w:after="120" w:line="288" w:lineRule="auto"/>
-        <w:ind w:firstLine="283"/>
         <w:jc w:val="both"/>
       </w:pPr>
       <w:r>
@@ -5331,7 +5368,6 @@
         <w:widowControl/>
         <w:bidi w:val="1"/>
         <w:spacing w:before="0" w:after="120" w:line="288" w:lineRule="auto"/>
-        <w:ind w:firstLine="283"/>
         <w:jc w:val="both"/>
       </w:pPr>
       <w:r>
@@ -5371,7 +5407,6 @@
         <w:widowControl/>
         <w:bidi w:val="1"/>
         <w:spacing w:before="0" w:after="120" w:line="288" w:lineRule="auto"/>
-        <w:ind w:firstLine="283"/>
         <w:jc w:val="both"/>
       </w:pPr>
       <w:r>
@@ -5429,7 +5464,6 @@
         <w:widowControl/>
         <w:bidi w:val="1"/>
         <w:spacing w:before="0" w:after="120" w:line="288" w:lineRule="auto"/>
-        <w:ind w:firstLine="283"/>
         <w:jc w:val="both"/>
       </w:pPr>
       <w:r>
@@ -5469,7 +5503,6 @@
         <w:widowControl/>
         <w:bidi w:val="1"/>
         <w:spacing w:before="0" w:after="120" w:line="288" w:lineRule="auto"/>
-        <w:ind w:firstLine="283"/>
         <w:jc w:val="both"/>
       </w:pPr>
       <w:r>
@@ -5527,7 +5560,6 @@
         <w:widowControl/>
         <w:bidi w:val="1"/>
         <w:spacing w:before="0" w:after="120" w:line="288" w:lineRule="auto"/>
-        <w:ind w:firstLine="283"/>
         <w:jc w:val="both"/>
       </w:pPr>
       <w:r>
@@ -5585,7 +5617,6 @@
         <w:widowControl/>
         <w:bidi w:val="1"/>
         <w:spacing w:before="0" w:after="120" w:line="288" w:lineRule="auto"/>
-        <w:ind w:firstLine="283"/>
         <w:jc w:val="both"/>
       </w:pPr>
       <w:r>
@@ -5625,7 +5656,6 @@
         <w:widowControl/>
         <w:bidi w:val="1"/>
         <w:spacing w:before="0" w:after="120" w:line="288" w:lineRule="auto"/>
-        <w:ind w:firstLine="283"/>
         <w:jc w:val="both"/>
       </w:pPr>
       <w:r>
@@ -5737,7 +5767,6 @@
         <w:widowControl/>
         <w:bidi w:val="1"/>
         <w:spacing w:before="0" w:after="120" w:line="288" w:lineRule="auto"/>
-        <w:ind w:firstLine="283"/>
         <w:jc w:val="both"/>
       </w:pPr>
       <w:r>
@@ -5923,6 +5952,7 @@
         <w:spacing w:before="200" w:after="120" w:line="288" w:lineRule="auto"/>
         <w:jc w:val="right"/>
         <w:keepNext w:val="1"/>
+        <w:shd w:val="clear" w:fill="EDEDED"/>
       </w:pPr>
       <w:r>
         <w:rPr>
@@ -5941,7 +5971,6 @@
         <w:widowControl/>
         <w:bidi w:val="1"/>
         <w:spacing w:before="0" w:after="120" w:line="288" w:lineRule="auto"/>
-        <w:ind w:firstLine="283"/>
         <w:jc w:val="both"/>
       </w:pPr>
       <w:r>
@@ -5963,53 +5992,79 @@
     <w:p/>
     <w:p/>
     <w:p/>
-    <w:p/>
-    <w:p>
-      <w:pPr>
-        <w:pStyle w:val="TH-Bakhsh"/>
-        <w:widowControl/>
-        <w:bidi w:val="1"/>
-        <w:spacing w:before="0" w:after="120" w:line="288" w:lineRule="auto"/>
-        <w:jc w:val="center"/>
-      </w:pPr>
-      <w:r>
-        <w:rPr>
-          <w:rFonts w:ascii="B Titr" w:hAnsi="B Titr" w:cs="B Titr" w:eastAsia="B Titr"/>
-          <w:b/>
-          <w:i w:val="0"/>
-          <w:sz w:val="60"/>
-          <w:szCs w:val="60"/>
-        </w:rPr>
-        <w:t>بخش دوم: تحلیل فقهی مسئله</w:t>
-      </w:r>
-    </w:p>
-    <w:p>
-      <w:r>
-        <w:br w:type="page"/>
-      </w:r>
-    </w:p>
-    <w:p>
-      <w:r>
-        <w:br w:type="page"/>
-      </w:r>
-    </w:p>
-    <w:p>
-      <w:pPr>
-        <w:pStyle w:val="TH-Fasl"/>
-        <w:widowControl/>
-        <w:bidi w:val="1"/>
-        <w:spacing w:before="120" w:after="200" w:line="288" w:lineRule="auto"/>
+    <w:p>
+      <w:pPr>
+        <w:widowControl/>
+        <w:bidi w:val="1"/>
+        <w:spacing w:before="0" w:after="240" w:line="288" w:lineRule="auto"/>
+        <w:ind w:right="2268" w:left="2268"/>
         <w:jc w:val="center"/>
         <w:pBdr>
           <w:bottom w:val="single" w:sz="12" w:space="6" w:color="1F3864"/>
         </w:pBdr>
-        <w:keepNext w:val="1"/>
+      </w:pPr>
+    </w:p>
+    <w:p>
+      <w:pPr>
+        <w:pStyle w:val="TH-Bakhsh"/>
+        <w:widowControl/>
+        <w:bidi w:val="1"/>
+        <w:spacing w:before="0" w:after="240" w:line="288" w:lineRule="auto"/>
+        <w:jc w:val="center"/>
       </w:pPr>
       <w:r>
         <w:rPr>
           <w:rFonts w:ascii="B Titr" w:hAnsi="B Titr" w:cs="B Titr" w:eastAsia="B Titr"/>
           <w:b/>
           <w:i w:val="0"/>
+          <w:sz w:val="64"/>
+          <w:szCs w:val="64"/>
+        </w:rPr>
+        <w:t>بخش دوم: تحلیل فقهی مسئله</w:t>
+      </w:r>
+    </w:p>
+    <w:p>
+      <w:pPr>
+        <w:widowControl/>
+        <w:bidi w:val="1"/>
+        <w:spacing w:before="0" w:after="120" w:line="288" w:lineRule="auto"/>
+        <w:ind w:right="2268" w:left="2268"/>
+        <w:jc w:val="center"/>
+        <w:pBdr>
+          <w:bottom w:val="single" w:sz="12" w:space="6" w:color="1F3864"/>
+        </w:pBdr>
+      </w:pPr>
+    </w:p>
+    <w:p>
+      <w:r>
+        <w:br w:type="page"/>
+      </w:r>
+    </w:p>
+    <w:p>
+      <w:r>
+        <w:br w:type="page"/>
+      </w:r>
+    </w:p>
+    <w:p/>
+    <w:p/>
+    <w:p>
+      <w:pPr>
+        <w:pStyle w:val="TH-Fasl"/>
+        <w:widowControl/>
+        <w:bidi w:val="1"/>
+        <w:spacing w:before="120" w:after="240" w:line="288" w:lineRule="auto"/>
+        <w:jc w:val="center"/>
+        <w:pBdr>
+          <w:top w:val="single" w:sz="12" w:space="8" w:color="1F3864"/>
+          <w:bottom w:val="single" w:sz="12" w:space="8" w:color="1F3864"/>
+        </w:pBdr>
+        <w:keepNext w:val="1"/>
+      </w:pPr>
+      <w:r>
+        <w:rPr>
+          <w:rFonts w:ascii="B Titr" w:hAnsi="B Titr" w:cs="B Titr" w:eastAsia="B Titr"/>
+          <w:b/>
+          <w:i w:val="0"/>
           <w:sz w:val="44"/>
           <w:szCs w:val="44"/>
         </w:rPr>
@@ -6022,7 +6077,6 @@
         <w:widowControl/>
         <w:bidi w:val="1"/>
         <w:spacing w:before="0" w:after="120" w:line="288" w:lineRule="auto"/>
-        <w:ind w:firstLine="283"/>
         <w:jc w:val="both"/>
       </w:pPr>
       <w:r>
@@ -6044,6 +6098,7 @@
         <w:spacing w:before="200" w:after="120" w:line="288" w:lineRule="auto"/>
         <w:jc w:val="right"/>
         <w:keepNext w:val="1"/>
+        <w:shd w:val="clear" w:fill="EDEDED"/>
       </w:pPr>
       <w:r>
         <w:rPr>
@@ -6120,7 +6175,6 @@
         <w:widowControl/>
         <w:bidi w:val="1"/>
         <w:spacing w:before="0" w:after="120" w:line="288" w:lineRule="auto"/>
-        <w:ind w:firstLine="283"/>
         <w:jc w:val="both"/>
       </w:pPr>
       <w:r>
@@ -6191,7 +6245,6 @@
         <w:widowControl/>
         <w:bidi w:val="1"/>
         <w:spacing w:before="0" w:after="120" w:line="288" w:lineRule="auto"/>
-        <w:ind w:firstLine="283"/>
         <w:jc w:val="both"/>
       </w:pPr>
       <w:r>
@@ -6249,7 +6302,6 @@
         <w:widowControl/>
         <w:bidi w:val="1"/>
         <w:spacing w:before="0" w:after="120" w:line="288" w:lineRule="auto"/>
-        <w:ind w:firstLine="283"/>
         <w:jc w:val="both"/>
       </w:pPr>
       <w:r>
@@ -6348,7 +6400,6 @@
         <w:widowControl/>
         <w:bidi w:val="1"/>
         <w:spacing w:before="0" w:after="120" w:line="288" w:lineRule="auto"/>
-        <w:ind w:firstLine="283"/>
         <w:jc w:val="both"/>
       </w:pPr>
       <w:r>
@@ -6426,7 +6477,6 @@
         <w:widowControl/>
         <w:bidi w:val="1"/>
         <w:spacing w:before="0" w:after="120" w:line="288" w:lineRule="auto"/>
-        <w:ind w:firstLine="283"/>
         <w:jc w:val="both"/>
       </w:pPr>
       <w:r>
@@ -6504,7 +6554,6 @@
         <w:widowControl/>
         <w:bidi w:val="1"/>
         <w:spacing w:before="0" w:after="120" w:line="288" w:lineRule="auto"/>
-        <w:ind w:firstLine="283"/>
         <w:jc w:val="both"/>
       </w:pPr>
       <w:r>
@@ -6544,7 +6593,6 @@
         <w:widowControl/>
         <w:bidi w:val="1"/>
         <w:spacing w:before="0" w:after="120" w:line="288" w:lineRule="auto"/>
-        <w:ind w:firstLine="283"/>
         <w:jc w:val="both"/>
       </w:pPr>
       <w:r>
@@ -6566,6 +6614,7 @@
         <w:spacing w:before="200" w:after="120" w:line="288" w:lineRule="auto"/>
         <w:jc w:val="right"/>
         <w:keepNext w:val="1"/>
+        <w:shd w:val="clear" w:fill="EDEDED"/>
       </w:pPr>
       <w:r>
         <w:rPr>
@@ -6680,7 +6729,6 @@
         <w:widowControl/>
         <w:bidi w:val="1"/>
         <w:spacing w:before="0" w:after="120" w:line="288" w:lineRule="auto"/>
-        <w:ind w:firstLine="283"/>
         <w:jc w:val="both"/>
       </w:pPr>
       <w:r>
@@ -6778,7 +6826,6 @@
         <w:widowControl/>
         <w:bidi w:val="1"/>
         <w:spacing w:before="0" w:after="120" w:line="288" w:lineRule="auto"/>
-        <w:ind w:firstLine="283"/>
         <w:jc w:val="both"/>
       </w:pPr>
       <w:r>
@@ -6836,7 +6883,6 @@
         <w:widowControl/>
         <w:bidi w:val="1"/>
         <w:spacing w:before="0" w:after="120" w:line="288" w:lineRule="auto"/>
-        <w:ind w:firstLine="283"/>
         <w:jc w:val="both"/>
       </w:pPr>
       <w:r>
@@ -6858,6 +6904,7 @@
         <w:spacing w:before="200" w:after="120" w:line="288" w:lineRule="auto"/>
         <w:jc w:val="right"/>
         <w:keepNext w:val="1"/>
+        <w:shd w:val="clear" w:fill="EDEDED"/>
       </w:pPr>
       <w:r>
         <w:rPr>
@@ -6934,7 +6981,6 @@
         <w:widowControl/>
         <w:bidi w:val="1"/>
         <w:spacing w:before="0" w:after="120" w:line="288" w:lineRule="auto"/>
-        <w:ind w:firstLine="283"/>
         <w:jc w:val="both"/>
       </w:pPr>
       <w:r>
@@ -7053,7 +7099,6 @@
         <w:widowControl/>
         <w:bidi w:val="1"/>
         <w:spacing w:before="0" w:after="120" w:line="288" w:lineRule="auto"/>
-        <w:ind w:firstLine="283"/>
         <w:jc w:val="both"/>
       </w:pPr>
       <w:r>
@@ -7113,7 +7158,6 @@
         <w:widowControl/>
         <w:bidi w:val="1"/>
         <w:spacing w:before="0" w:after="120" w:line="288" w:lineRule="auto"/>
-        <w:ind w:firstLine="283"/>
         <w:jc w:val="both"/>
       </w:pPr>
       <w:r>
@@ -7177,6 +7221,7 @@
         <w:spacing w:before="200" w:after="120" w:line="288" w:lineRule="auto"/>
         <w:jc w:val="right"/>
         <w:keepNext w:val="1"/>
+        <w:shd w:val="clear" w:fill="EDEDED"/>
       </w:pPr>
       <w:r>
         <w:rPr>
@@ -7215,7 +7260,6 @@
         <w:widowControl/>
         <w:bidi w:val="1"/>
         <w:spacing w:before="0" w:after="120" w:line="288" w:lineRule="auto"/>
-        <w:ind w:firstLine="283"/>
         <w:jc w:val="both"/>
       </w:pPr>
       <w:r>
@@ -7286,7 +7330,6 @@
         <w:widowControl/>
         <w:bidi w:val="1"/>
         <w:spacing w:before="0" w:after="120" w:line="288" w:lineRule="auto"/>
-        <w:ind w:firstLine="283"/>
         <w:jc w:val="both"/>
       </w:pPr>
       <w:r>
@@ -7357,7 +7400,6 @@
         <w:widowControl/>
         <w:bidi w:val="1"/>
         <w:spacing w:before="0" w:after="120" w:line="288" w:lineRule="auto"/>
-        <w:ind w:firstLine="283"/>
         <w:jc w:val="both"/>
       </w:pPr>
       <w:r>
@@ -7438,7 +7480,6 @@
         <w:widowControl/>
         <w:bidi w:val="1"/>
         <w:spacing w:before="0" w:after="120" w:line="288" w:lineRule="auto"/>
-        <w:ind w:firstLine="283"/>
         <w:jc w:val="both"/>
       </w:pPr>
       <w:r>
@@ -7460,6 +7501,7 @@
         <w:spacing w:before="200" w:after="120" w:line="288" w:lineRule="auto"/>
         <w:jc w:val="right"/>
         <w:keepNext w:val="1"/>
+        <w:shd w:val="clear" w:fill="EDEDED"/>
       </w:pPr>
       <w:r>
         <w:rPr>
@@ -7498,7 +7540,6 @@
         <w:widowControl/>
         <w:bidi w:val="1"/>
         <w:spacing w:before="0" w:after="120" w:line="288" w:lineRule="auto"/>
-        <w:ind w:firstLine="283"/>
         <w:jc w:val="both"/>
       </w:pPr>
       <w:r>
@@ -7549,7 +7590,6 @@
         <w:widowControl/>
         <w:bidi w:val="1"/>
         <w:spacing w:before="0" w:after="120" w:line="288" w:lineRule="auto"/>
-        <w:ind w:firstLine="283"/>
         <w:jc w:val="both"/>
       </w:pPr>
       <w:r>
@@ -7602,6 +7642,7 @@
         <w:spacing w:before="200" w:after="120" w:line="288" w:lineRule="auto"/>
         <w:jc w:val="right"/>
         <w:keepNext w:val="1"/>
+        <w:shd w:val="clear" w:fill="EDEDED"/>
       </w:pPr>
       <w:r>
         <w:rPr>
@@ -7640,7 +7681,6 @@
         <w:widowControl/>
         <w:bidi w:val="1"/>
         <w:spacing w:before="0" w:after="120" w:line="288" w:lineRule="auto"/>
-        <w:ind w:firstLine="283"/>
         <w:jc w:val="both"/>
       </w:pPr>
       <w:r>
@@ -7701,7 +7741,6 @@
         <w:widowControl/>
         <w:bidi w:val="1"/>
         <w:spacing w:before="0" w:after="120" w:line="288" w:lineRule="auto"/>
-        <w:ind w:firstLine="283"/>
         <w:jc w:val="both"/>
       </w:pPr>
       <w:r>
@@ -7821,7 +7860,6 @@
         <w:widowControl/>
         <w:bidi w:val="1"/>
         <w:spacing w:before="0" w:after="120" w:line="288" w:lineRule="auto"/>
-        <w:ind w:firstLine="283"/>
         <w:jc w:val="both"/>
       </w:pPr>
       <w:r>
@@ -7843,6 +7881,7 @@
         <w:spacing w:before="200" w:after="120" w:line="288" w:lineRule="auto"/>
         <w:jc w:val="right"/>
         <w:keepNext w:val="1"/>
+        <w:shd w:val="clear" w:fill="EDEDED"/>
       </w:pPr>
       <w:r>
         <w:rPr>
@@ -7919,7 +7958,6 @@
         <w:widowControl/>
         <w:bidi w:val="1"/>
         <w:spacing w:before="0" w:after="120" w:line="288" w:lineRule="auto"/>
-        <w:ind w:firstLine="283"/>
         <w:jc w:val="both"/>
       </w:pPr>
       <w:r>
@@ -8038,7 +8076,6 @@
         <w:widowControl/>
         <w:bidi w:val="1"/>
         <w:spacing w:before="0" w:after="120" w:line="288" w:lineRule="auto"/>
-        <w:ind w:firstLine="283"/>
         <w:jc w:val="both"/>
       </w:pPr>
       <w:r>
@@ -8136,7 +8173,6 @@
         <w:widowControl/>
         <w:bidi w:val="1"/>
         <w:spacing w:before="0" w:after="120" w:line="288" w:lineRule="auto"/>
-        <w:ind w:firstLine="283"/>
         <w:jc w:val="both"/>
       </w:pPr>
       <w:r>
@@ -8196,7 +8232,6 @@
         <w:widowControl/>
         <w:bidi w:val="1"/>
         <w:spacing w:before="0" w:after="120" w:line="288" w:lineRule="auto"/>
-        <w:ind w:firstLine="283"/>
         <w:jc w:val="both"/>
       </w:pPr>
       <w:r>
@@ -8318,7 +8353,6 @@
         <w:widowControl/>
         <w:bidi w:val="1"/>
         <w:spacing w:before="0" w:after="120" w:line="288" w:lineRule="auto"/>
-        <w:ind w:firstLine="283"/>
         <w:jc w:val="both"/>
       </w:pPr>
       <w:r>
@@ -8453,6 +8487,7 @@
         <w:spacing w:before="200" w:after="120" w:line="288" w:lineRule="auto"/>
         <w:jc w:val="right"/>
         <w:keepNext w:val="1"/>
+        <w:shd w:val="clear" w:fill="EDEDED"/>
       </w:pPr>
       <w:r>
         <w:rPr>
@@ -8491,7 +8526,6 @@
         <w:widowControl/>
         <w:bidi w:val="1"/>
         <w:spacing w:before="0" w:after="120" w:line="288" w:lineRule="auto"/>
-        <w:ind w:firstLine="283"/>
         <w:jc w:val="both"/>
       </w:pPr>
       <w:r>
@@ -8531,7 +8565,6 @@
         <w:widowControl/>
         <w:bidi w:val="1"/>
         <w:spacing w:before="0" w:after="120" w:line="288" w:lineRule="auto"/>
-        <w:ind w:firstLine="283"/>
         <w:jc w:val="both"/>
       </w:pPr>
       <w:r>
@@ -8633,7 +8666,6 @@
         <w:widowControl/>
         <w:bidi w:val="1"/>
         <w:spacing w:before="0" w:after="120" w:line="288" w:lineRule="auto"/>
-        <w:ind w:firstLine="283"/>
         <w:jc w:val="both"/>
       </w:pPr>
       <w:r>
@@ -8735,7 +8767,6 @@
         <w:widowControl/>
         <w:bidi w:val="1"/>
         <w:spacing w:before="0" w:after="120" w:line="288" w:lineRule="auto"/>
-        <w:ind w:firstLine="283"/>
         <w:jc w:val="both"/>
       </w:pPr>
       <w:r>
@@ -8777,6 +8808,7 @@
         <w:spacing w:before="200" w:after="120" w:line="288" w:lineRule="auto"/>
         <w:jc w:val="right"/>
         <w:keepNext w:val="1"/>
+        <w:shd w:val="clear" w:fill="EDEDED"/>
       </w:pPr>
       <w:r>
         <w:rPr>
@@ -8795,7 +8827,6 @@
         <w:widowControl/>
         <w:bidi w:val="1"/>
         <w:spacing w:before="0" w:after="120" w:line="288" w:lineRule="auto"/>
-        <w:ind w:firstLine="283"/>
         <w:jc w:val="both"/>
       </w:pPr>
       <w:r>
@@ -8814,15 +8845,18 @@
         <w:br w:type="page"/>
       </w:r>
     </w:p>
+    <w:p/>
+    <w:p/>
     <w:p>
       <w:pPr>
         <w:pStyle w:val="TH-Fasl"/>
         <w:widowControl/>
         <w:bidi w:val="1"/>
-        <w:spacing w:before="120" w:after="200" w:line="288" w:lineRule="auto"/>
+        <w:spacing w:before="120" w:after="240" w:line="288" w:lineRule="auto"/>
         <w:jc w:val="center"/>
         <w:pBdr>
-          <w:bottom w:val="single" w:sz="12" w:space="6" w:color="1F3864"/>
+          <w:top w:val="single" w:sz="12" w:space="8" w:color="1F3864"/>
+          <w:bottom w:val="single" w:sz="12" w:space="8" w:color="1F3864"/>
         </w:pBdr>
         <w:keepNext w:val="1"/>
       </w:pPr>
@@ -8843,7 +8877,6 @@
         <w:widowControl/>
         <w:bidi w:val="1"/>
         <w:spacing w:before="0" w:after="120" w:line="288" w:lineRule="auto"/>
-        <w:ind w:firstLine="283"/>
         <w:jc w:val="both"/>
       </w:pPr>
       <w:r>
@@ -8865,6 +8898,7 @@
         <w:spacing w:before="200" w:after="120" w:line="288" w:lineRule="auto"/>
         <w:jc w:val="right"/>
         <w:keepNext w:val="1"/>
+        <w:shd w:val="clear" w:fill="EDEDED"/>
       </w:pPr>
       <w:r>
         <w:rPr>
@@ -8903,7 +8937,6 @@
         <w:widowControl/>
         <w:bidi w:val="1"/>
         <w:spacing w:before="0" w:after="120" w:line="288" w:lineRule="auto"/>
-        <w:ind w:firstLine="283"/>
         <w:jc w:val="both"/>
       </w:pPr>
       <w:r>
@@ -8994,7 +9027,6 @@
         <w:widowControl/>
         <w:bidi w:val="1"/>
         <w:spacing w:before="0" w:after="120" w:line="288" w:lineRule="auto"/>
-        <w:ind w:firstLine="283"/>
         <w:jc w:val="both"/>
       </w:pPr>
       <w:r>
@@ -9114,7 +9146,6 @@
         <w:widowControl/>
         <w:bidi w:val="1"/>
         <w:spacing w:before="0" w:after="120" w:line="288" w:lineRule="auto"/>
-        <w:ind w:firstLine="283"/>
         <w:jc w:val="both"/>
       </w:pPr>
       <w:r>
@@ -9136,6 +9167,7 @@
         <w:spacing w:before="200" w:after="120" w:line="288" w:lineRule="auto"/>
         <w:jc w:val="right"/>
         <w:keepNext w:val="1"/>
+        <w:shd w:val="clear" w:fill="EDEDED"/>
       </w:pPr>
       <w:r>
         <w:rPr>
@@ -9174,7 +9206,6 @@
         <w:widowControl/>
         <w:bidi w:val="1"/>
         <w:spacing w:before="0" w:after="120" w:line="288" w:lineRule="auto"/>
-        <w:ind w:firstLine="283"/>
         <w:jc w:val="both"/>
       </w:pPr>
       <w:r>
@@ -9245,7 +9276,6 @@
         <w:widowControl/>
         <w:bidi w:val="1"/>
         <w:spacing w:before="0" w:after="120" w:line="288" w:lineRule="auto"/>
-        <w:ind w:firstLine="283"/>
         <w:jc w:val="both"/>
       </w:pPr>
       <w:r>
@@ -9365,7 +9395,6 @@
         <w:widowControl/>
         <w:bidi w:val="1"/>
         <w:spacing w:before="0" w:after="120" w:line="288" w:lineRule="auto"/>
-        <w:ind w:firstLine="283"/>
         <w:jc w:val="both"/>
       </w:pPr>
       <w:r>
@@ -9387,6 +9416,7 @@
         <w:spacing w:before="200" w:after="120" w:line="288" w:lineRule="auto"/>
         <w:jc w:val="right"/>
         <w:keepNext w:val="1"/>
+        <w:shd w:val="clear" w:fill="EDEDED"/>
       </w:pPr>
       <w:r>
         <w:rPr>
@@ -9463,7 +9493,6 @@
         <w:widowControl/>
         <w:bidi w:val="1"/>
         <w:spacing w:before="0" w:after="120" w:line="288" w:lineRule="auto"/>
-        <w:ind w:firstLine="283"/>
         <w:jc w:val="both"/>
       </w:pPr>
       <w:r>
@@ -9561,7 +9590,6 @@
         <w:widowControl/>
         <w:bidi w:val="1"/>
         <w:spacing w:before="0" w:after="120" w:line="288" w:lineRule="auto"/>
-        <w:ind w:firstLine="283"/>
         <w:jc w:val="both"/>
       </w:pPr>
       <w:r>
@@ -9601,7 +9629,6 @@
         <w:widowControl/>
         <w:bidi w:val="1"/>
         <w:spacing w:before="0" w:after="120" w:line="288" w:lineRule="auto"/>
-        <w:ind w:firstLine="283"/>
         <w:jc w:val="both"/>
       </w:pPr>
       <w:r>
@@ -9664,6 +9691,7 @@
         <w:spacing w:before="200" w:after="120" w:line="288" w:lineRule="auto"/>
         <w:jc w:val="right"/>
         <w:keepNext w:val="1"/>
+        <w:shd w:val="clear" w:fill="EDEDED"/>
       </w:pPr>
       <w:r>
         <w:rPr>
@@ -9702,7 +9730,6 @@
         <w:widowControl/>
         <w:bidi w:val="1"/>
         <w:spacing w:before="0" w:after="120" w:line="288" w:lineRule="auto"/>
-        <w:ind w:firstLine="283"/>
         <w:jc w:val="both"/>
       </w:pPr>
       <w:r>
@@ -9802,7 +9829,6 @@
         <w:widowControl/>
         <w:bidi w:val="1"/>
         <w:spacing w:before="0" w:after="120" w:line="288" w:lineRule="auto"/>
-        <w:ind w:firstLine="283"/>
         <w:jc w:val="both"/>
       </w:pPr>
       <w:r>
@@ -9882,7 +9908,6 @@
         <w:widowControl/>
         <w:bidi w:val="1"/>
         <w:spacing w:before="0" w:after="120" w:line="288" w:lineRule="auto"/>
-        <w:ind w:firstLine="283"/>
         <w:jc w:val="both"/>
       </w:pPr>
       <w:r>
@@ -9944,6 +9969,7 @@
         <w:spacing w:before="200" w:after="120" w:line="288" w:lineRule="auto"/>
         <w:jc w:val="right"/>
         <w:keepNext w:val="1"/>
+        <w:shd w:val="clear" w:fill="EDEDED"/>
       </w:pPr>
       <w:r>
         <w:rPr>
@@ -9962,7 +9988,6 @@
         <w:widowControl/>
         <w:bidi w:val="1"/>
         <w:spacing w:before="0" w:after="120" w:line="288" w:lineRule="auto"/>
-        <w:ind w:firstLine="283"/>
         <w:jc w:val="both"/>
       </w:pPr>
       <w:r>
@@ -10002,7 +10027,6 @@
         <w:widowControl/>
         <w:bidi w:val="1"/>
         <w:spacing w:before="0" w:after="120" w:line="288" w:lineRule="auto"/>
-        <w:ind w:firstLine="283"/>
         <w:jc w:val="both"/>
       </w:pPr>
       <w:r>
@@ -10062,7 +10086,6 @@
         <w:widowControl/>
         <w:bidi w:val="1"/>
         <w:spacing w:before="0" w:after="120" w:line="288" w:lineRule="auto"/>
-        <w:ind w:firstLine="283"/>
         <w:jc w:val="both"/>
       </w:pPr>
       <w:r>
@@ -10122,7 +10145,6 @@
         <w:widowControl/>
         <w:bidi w:val="1"/>
         <w:spacing w:before="0" w:after="120" w:line="288" w:lineRule="auto"/>
-        <w:ind w:firstLine="283"/>
         <w:jc w:val="both"/>
       </w:pPr>
       <w:r>
@@ -10164,6 +10186,7 @@
         <w:spacing w:before="200" w:after="120" w:line="288" w:lineRule="auto"/>
         <w:jc w:val="right"/>
         <w:keepNext w:val="1"/>
+        <w:shd w:val="clear" w:fill="EDEDED"/>
       </w:pPr>
       <w:r>
         <w:rPr>
@@ -10202,7 +10225,6 @@
         <w:widowControl/>
         <w:bidi w:val="1"/>
         <w:spacing w:before="0" w:after="120" w:line="288" w:lineRule="auto"/>
-        <w:ind w:firstLine="283"/>
         <w:jc w:val="both"/>
       </w:pPr>
       <w:r>
@@ -10283,7 +10305,6 @@
         <w:widowControl/>
         <w:bidi w:val="1"/>
         <w:spacing w:before="0" w:after="120" w:line="288" w:lineRule="auto"/>
-        <w:ind w:firstLine="283"/>
         <w:jc w:val="both"/>
       </w:pPr>
       <w:r>
@@ -10364,7 +10385,6 @@
         <w:widowControl/>
         <w:bidi w:val="1"/>
         <w:spacing w:before="0" w:after="120" w:line="288" w:lineRule="auto"/>
-        <w:ind w:firstLine="283"/>
         <w:jc w:val="both"/>
       </w:pPr>
       <w:r>
@@ -10456,7 +10476,6 @@
         <w:widowControl/>
         <w:bidi w:val="1"/>
         <w:spacing w:before="0" w:after="120" w:line="288" w:lineRule="auto"/>
-        <w:ind w:firstLine="283"/>
         <w:jc w:val="both"/>
       </w:pPr>
       <w:r>
@@ -10567,7 +10586,6 @@
         <w:widowControl/>
         <w:bidi w:val="1"/>
         <w:spacing w:before="0" w:after="120" w:line="288" w:lineRule="auto"/>
-        <w:ind w:firstLine="283"/>
         <w:jc w:val="both"/>
       </w:pPr>
       <w:r>
@@ -10620,6 +10638,7 @@
         <w:spacing w:before="200" w:after="120" w:line="288" w:lineRule="auto"/>
         <w:jc w:val="right"/>
         <w:keepNext w:val="1"/>
+        <w:shd w:val="clear" w:fill="EDEDED"/>
       </w:pPr>
       <w:r>
         <w:rPr>
@@ -10638,7 +10657,6 @@
         <w:widowControl/>
         <w:bidi w:val="1"/>
         <w:spacing w:before="0" w:after="120" w:line="288" w:lineRule="auto"/>
-        <w:ind w:firstLine="283"/>
         <w:jc w:val="both"/>
       </w:pPr>
       <w:r>
@@ -10660,53 +10678,79 @@
     <w:p/>
     <w:p/>
     <w:p/>
-    <w:p/>
-    <w:p>
-      <w:pPr>
-        <w:pStyle w:val="TH-Bakhsh"/>
-        <w:widowControl/>
-        <w:bidi w:val="1"/>
-        <w:spacing w:before="0" w:after="120" w:line="288" w:lineRule="auto"/>
-        <w:jc w:val="center"/>
-      </w:pPr>
-      <w:r>
-        <w:rPr>
-          <w:rFonts w:ascii="B Titr" w:hAnsi="B Titr" w:cs="B Titr" w:eastAsia="B Titr"/>
-          <w:b/>
-          <w:i w:val="0"/>
-          <w:sz w:val="60"/>
-          <w:szCs w:val="60"/>
-        </w:rPr>
-        <w:t>بخش سوم: تحلیل حقوقی مسئله</w:t>
-      </w:r>
-    </w:p>
-    <w:p>
-      <w:r>
-        <w:br w:type="page"/>
-      </w:r>
-    </w:p>
-    <w:p>
-      <w:r>
-        <w:br w:type="page"/>
-      </w:r>
-    </w:p>
-    <w:p>
-      <w:pPr>
-        <w:pStyle w:val="TH-Fasl"/>
-        <w:widowControl/>
-        <w:bidi w:val="1"/>
-        <w:spacing w:before="120" w:after="200" w:line="288" w:lineRule="auto"/>
+    <w:p>
+      <w:pPr>
+        <w:widowControl/>
+        <w:bidi w:val="1"/>
+        <w:spacing w:before="0" w:after="240" w:line="288" w:lineRule="auto"/>
+        <w:ind w:right="2268" w:left="2268"/>
         <w:jc w:val="center"/>
         <w:pBdr>
           <w:bottom w:val="single" w:sz="12" w:space="6" w:color="1F3864"/>
         </w:pBdr>
-        <w:keepNext w:val="1"/>
+      </w:pPr>
+    </w:p>
+    <w:p>
+      <w:pPr>
+        <w:pStyle w:val="TH-Bakhsh"/>
+        <w:widowControl/>
+        <w:bidi w:val="1"/>
+        <w:spacing w:before="0" w:after="240" w:line="288" w:lineRule="auto"/>
+        <w:jc w:val="center"/>
       </w:pPr>
       <w:r>
         <w:rPr>
           <w:rFonts w:ascii="B Titr" w:hAnsi="B Titr" w:cs="B Titr" w:eastAsia="B Titr"/>
           <w:b/>
           <w:i w:val="0"/>
+          <w:sz w:val="64"/>
+          <w:szCs w:val="64"/>
+        </w:rPr>
+        <w:t>بخش سوم: تحلیل حقوقی مسئله</w:t>
+      </w:r>
+    </w:p>
+    <w:p>
+      <w:pPr>
+        <w:widowControl/>
+        <w:bidi w:val="1"/>
+        <w:spacing w:before="0" w:after="120" w:line="288" w:lineRule="auto"/>
+        <w:ind w:right="2268" w:left="2268"/>
+        <w:jc w:val="center"/>
+        <w:pBdr>
+          <w:bottom w:val="single" w:sz="12" w:space="6" w:color="1F3864"/>
+        </w:pBdr>
+      </w:pPr>
+    </w:p>
+    <w:p>
+      <w:r>
+        <w:br w:type="page"/>
+      </w:r>
+    </w:p>
+    <w:p>
+      <w:r>
+        <w:br w:type="page"/>
+      </w:r>
+    </w:p>
+    <w:p/>
+    <w:p/>
+    <w:p>
+      <w:pPr>
+        <w:pStyle w:val="TH-Fasl"/>
+        <w:widowControl/>
+        <w:bidi w:val="1"/>
+        <w:spacing w:before="120" w:after="240" w:line="288" w:lineRule="auto"/>
+        <w:jc w:val="center"/>
+        <w:pBdr>
+          <w:top w:val="single" w:sz="12" w:space="8" w:color="1F3864"/>
+          <w:bottom w:val="single" w:sz="12" w:space="8" w:color="1F3864"/>
+        </w:pBdr>
+        <w:keepNext w:val="1"/>
+      </w:pPr>
+      <w:r>
+        <w:rPr>
+          <w:rFonts w:ascii="B Titr" w:hAnsi="B Titr" w:cs="B Titr" w:eastAsia="B Titr"/>
+          <w:b/>
+          <w:i w:val="0"/>
           <w:sz w:val="44"/>
           <w:szCs w:val="44"/>
         </w:rPr>
@@ -10719,7 +10763,6 @@
         <w:widowControl/>
         <w:bidi w:val="1"/>
         <w:spacing w:before="0" w:after="120" w:line="288" w:lineRule="auto"/>
-        <w:ind w:firstLine="283"/>
         <w:jc w:val="both"/>
       </w:pPr>
       <w:r>
@@ -10741,6 +10784,7 @@
         <w:spacing w:before="200" w:after="120" w:line="288" w:lineRule="auto"/>
         <w:jc w:val="right"/>
         <w:keepNext w:val="1"/>
+        <w:shd w:val="clear" w:fill="EDEDED"/>
       </w:pPr>
       <w:r>
         <w:rPr>
@@ -10779,7 +10823,6 @@
         <w:widowControl/>
         <w:bidi w:val="1"/>
         <w:spacing w:before="0" w:after="120" w:line="288" w:lineRule="auto"/>
-        <w:ind w:firstLine="283"/>
         <w:jc w:val="both"/>
       </w:pPr>
       <w:r>
@@ -10850,7 +10893,6 @@
         <w:widowControl/>
         <w:bidi w:val="1"/>
         <w:spacing w:before="0" w:after="120" w:line="288" w:lineRule="auto"/>
-        <w:ind w:firstLine="283"/>
         <w:jc w:val="both"/>
       </w:pPr>
       <w:r>
@@ -10941,7 +10983,6 @@
         <w:widowControl/>
         <w:bidi w:val="1"/>
         <w:spacing w:before="0" w:after="120" w:line="288" w:lineRule="auto"/>
-        <w:ind w:firstLine="283"/>
         <w:jc w:val="both"/>
       </w:pPr>
       <w:r>
@@ -10984,6 +11025,7 @@
         <w:spacing w:before="200" w:after="120" w:line="288" w:lineRule="auto"/>
         <w:jc w:val="right"/>
         <w:keepNext w:val="1"/>
+        <w:shd w:val="clear" w:fill="EDEDED"/>
       </w:pPr>
       <w:r>
         <w:rPr>
@@ -11022,7 +11064,6 @@
         <w:widowControl/>
         <w:bidi w:val="1"/>
         <w:spacing w:before="0" w:after="120" w:line="288" w:lineRule="auto"/>
-        <w:ind w:firstLine="283"/>
         <w:jc w:val="both"/>
       </w:pPr>
       <w:r>
@@ -11080,7 +11121,6 @@
         <w:widowControl/>
         <w:bidi w:val="1"/>
         <w:spacing w:before="0" w:after="120" w:line="288" w:lineRule="auto"/>
-        <w:ind w:firstLine="283"/>
         <w:jc w:val="both"/>
       </w:pPr>
       <w:r>
@@ -11214,7 +11254,6 @@
         <w:widowControl/>
         <w:bidi w:val="1"/>
         <w:spacing w:before="0" w:after="120" w:line="288" w:lineRule="auto"/>
-        <w:ind w:firstLine="283"/>
         <w:jc w:val="both"/>
       </w:pPr>
       <w:r>
@@ -11336,6 +11375,7 @@
         <w:spacing w:before="200" w:after="120" w:line="288" w:lineRule="auto"/>
         <w:jc w:val="right"/>
         <w:keepNext w:val="1"/>
+        <w:shd w:val="clear" w:fill="EDEDED"/>
       </w:pPr>
       <w:r>
         <w:rPr>
@@ -11374,7 +11414,6 @@
         <w:widowControl/>
         <w:bidi w:val="1"/>
         <w:spacing w:before="0" w:after="120" w:line="288" w:lineRule="auto"/>
-        <w:ind w:firstLine="283"/>
         <w:jc w:val="both"/>
       </w:pPr>
       <w:r>
@@ -11517,7 +11556,6 @@
         <w:widowControl/>
         <w:bidi w:val="1"/>
         <w:spacing w:before="0" w:after="120" w:line="288" w:lineRule="auto"/>
-        <w:ind w:firstLine="283"/>
         <w:jc w:val="both"/>
       </w:pPr>
       <w:r>
@@ -11639,6 +11677,7 @@
         <w:spacing w:before="200" w:after="120" w:line="288" w:lineRule="auto"/>
         <w:jc w:val="right"/>
         <w:keepNext w:val="1"/>
+        <w:shd w:val="clear" w:fill="EDEDED"/>
       </w:pPr>
       <w:r>
         <w:rPr>
@@ -11677,7 +11716,6 @@
         <w:widowControl/>
         <w:bidi w:val="1"/>
         <w:spacing w:before="0" w:after="120" w:line="288" w:lineRule="auto"/>
-        <w:ind w:firstLine="283"/>
         <w:jc w:val="both"/>
       </w:pPr>
       <w:r>
@@ -11882,7 +11920,6 @@
         <w:widowControl/>
         <w:bidi w:val="1"/>
         <w:spacing w:before="0" w:after="120" w:line="288" w:lineRule="auto"/>
-        <w:ind w:firstLine="283"/>
         <w:jc w:val="both"/>
       </w:pPr>
       <w:r>
@@ -12004,7 +12041,6 @@
         <w:widowControl/>
         <w:bidi w:val="1"/>
         <w:spacing w:before="0" w:after="120" w:line="288" w:lineRule="auto"/>
-        <w:ind w:firstLine="283"/>
         <w:jc w:val="both"/>
       </w:pPr>
       <w:r>
@@ -12165,7 +12201,6 @@
         <w:widowControl/>
         <w:bidi w:val="1"/>
         <w:spacing w:before="0" w:after="120" w:line="288" w:lineRule="auto"/>
-        <w:ind w:firstLine="283"/>
         <w:jc w:val="both"/>
       </w:pPr>
       <w:r>
@@ -12339,7 +12374,6 @@
         <w:widowControl/>
         <w:bidi w:val="1"/>
         <w:spacing w:before="0" w:after="120" w:line="288" w:lineRule="auto"/>
-        <w:ind w:firstLine="283"/>
         <w:jc w:val="both"/>
       </w:pPr>
       <w:r>
@@ -12439,7 +12473,6 @@
         <w:widowControl/>
         <w:bidi w:val="1"/>
         <w:spacing w:before="0" w:after="120" w:line="288" w:lineRule="auto"/>
-        <w:ind w:firstLine="283"/>
         <w:jc w:val="both"/>
       </w:pPr>
       <w:r>
@@ -12604,6 +12637,7 @@
         <w:spacing w:before="200" w:after="120" w:line="288" w:lineRule="auto"/>
         <w:jc w:val="right"/>
         <w:keepNext w:val="1"/>
+        <w:shd w:val="clear" w:fill="EDEDED"/>
       </w:pPr>
       <w:r>
         <w:rPr>
@@ -12642,7 +12676,6 @@
         <w:widowControl/>
         <w:bidi w:val="1"/>
         <w:spacing w:before="0" w:after="120" w:line="288" w:lineRule="auto"/>
-        <w:ind w:firstLine="283"/>
         <w:jc w:val="both"/>
       </w:pPr>
       <w:r>
@@ -12823,7 +12856,6 @@
         <w:widowControl/>
         <w:bidi w:val="1"/>
         <w:spacing w:before="0" w:after="120" w:line="288" w:lineRule="auto"/>
-        <w:ind w:firstLine="283"/>
         <w:jc w:val="both"/>
       </w:pPr>
       <w:r>
@@ -13006,7 +13038,6 @@
         <w:widowControl/>
         <w:bidi w:val="1"/>
         <w:spacing w:before="0" w:after="120" w:line="288" w:lineRule="auto"/>
-        <w:ind w:firstLine="283"/>
         <w:jc w:val="both"/>
       </w:pPr>
       <w:r>
@@ -13107,7 +13138,6 @@
         <w:widowControl/>
         <w:bidi w:val="1"/>
         <w:spacing w:before="0" w:after="120" w:line="288" w:lineRule="auto"/>
-        <w:ind w:firstLine="283"/>
         <w:jc w:val="both"/>
       </w:pPr>
       <w:r>
@@ -13320,6 +13350,7 @@
         <w:spacing w:before="200" w:after="120" w:line="288" w:lineRule="auto"/>
         <w:jc w:val="right"/>
         <w:keepNext w:val="1"/>
+        <w:shd w:val="clear" w:fill="EDEDED"/>
       </w:pPr>
       <w:r>
         <w:rPr>
@@ -13338,7 +13369,6 @@
         <w:widowControl/>
         <w:bidi w:val="1"/>
         <w:spacing w:before="0" w:after="120" w:line="288" w:lineRule="auto"/>
-        <w:ind w:firstLine="283"/>
         <w:jc w:val="both"/>
       </w:pPr>
       <w:r>
@@ -13357,15 +13387,18 @@
         <w:br w:type="page"/>
       </w:r>
     </w:p>
+    <w:p/>
+    <w:p/>
     <w:p>
       <w:pPr>
         <w:pStyle w:val="TH-Fasl"/>
         <w:widowControl/>
         <w:bidi w:val="1"/>
-        <w:spacing w:before="120" w:after="200" w:line="288" w:lineRule="auto"/>
+        <w:spacing w:before="120" w:after="240" w:line="288" w:lineRule="auto"/>
         <w:jc w:val="center"/>
         <w:pBdr>
-          <w:bottom w:val="single" w:sz="12" w:space="6" w:color="1F3864"/>
+          <w:top w:val="single" w:sz="12" w:space="8" w:color="1F3864"/>
+          <w:bottom w:val="single" w:sz="12" w:space="8" w:color="1F3864"/>
         </w:pBdr>
         <w:keepNext w:val="1"/>
       </w:pPr>
@@ -13386,7 +13419,6 @@
         <w:widowControl/>
         <w:bidi w:val="1"/>
         <w:spacing w:before="0" w:after="120" w:line="288" w:lineRule="auto"/>
-        <w:ind w:firstLine="283"/>
         <w:jc w:val="both"/>
       </w:pPr>
       <w:r>
@@ -13408,6 +13440,7 @@
         <w:spacing w:before="200" w:after="120" w:line="288" w:lineRule="auto"/>
         <w:jc w:val="right"/>
         <w:keepNext w:val="1"/>
+        <w:shd w:val="clear" w:fill="EDEDED"/>
       </w:pPr>
       <w:r>
         <w:rPr>
@@ -13426,7 +13459,6 @@
         <w:widowControl/>
         <w:bidi w:val="1"/>
         <w:spacing w:before="0" w:after="120" w:line="288" w:lineRule="auto"/>
-        <w:ind w:firstLine="283"/>
         <w:jc w:val="both"/>
       </w:pPr>
       <w:r>
@@ -13448,6 +13480,7 @@
         <w:spacing w:before="200" w:after="120" w:line="288" w:lineRule="auto"/>
         <w:jc w:val="right"/>
         <w:keepNext w:val="1"/>
+        <w:shd w:val="clear" w:fill="EDEDED"/>
       </w:pPr>
       <w:r>
         <w:rPr>
@@ -13466,7 +13499,6 @@
         <w:widowControl/>
         <w:bidi w:val="1"/>
         <w:spacing w:before="0" w:after="120" w:line="288" w:lineRule="auto"/>
-        <w:ind w:firstLine="283"/>
         <w:jc w:val="both"/>
       </w:pPr>
       <w:r>
@@ -13488,6 +13520,7 @@
         <w:spacing w:before="200" w:after="120" w:line="288" w:lineRule="auto"/>
         <w:jc w:val="right"/>
         <w:keepNext w:val="1"/>
+        <w:shd w:val="clear" w:fill="EDEDED"/>
       </w:pPr>
       <w:r>
         <w:rPr>
@@ -13506,7 +13539,6 @@
         <w:widowControl/>
         <w:bidi w:val="1"/>
         <w:spacing w:before="0" w:after="120" w:line="288" w:lineRule="auto"/>
-        <w:ind w:firstLine="283"/>
         <w:jc w:val="both"/>
       </w:pPr>
       <w:r>
@@ -13528,6 +13560,7 @@
         <w:spacing w:before="200" w:after="120" w:line="288" w:lineRule="auto"/>
         <w:jc w:val="right"/>
         <w:keepNext w:val="1"/>
+        <w:shd w:val="clear" w:fill="EDEDED"/>
       </w:pPr>
       <w:r>
         <w:rPr>
@@ -13546,7 +13579,6 @@
         <w:widowControl/>
         <w:bidi w:val="1"/>
         <w:spacing w:before="0" w:after="120" w:line="288" w:lineRule="auto"/>
-        <w:ind w:firstLine="283"/>
         <w:jc w:val="both"/>
       </w:pPr>
       <w:r>
@@ -13568,6 +13600,7 @@
         <w:spacing w:before="200" w:after="120" w:line="288" w:lineRule="auto"/>
         <w:jc w:val="right"/>
         <w:keepNext w:val="1"/>
+        <w:shd w:val="clear" w:fill="EDEDED"/>
       </w:pPr>
       <w:r>
         <w:rPr>
@@ -13586,7 +13619,6 @@
         <w:widowControl/>
         <w:bidi w:val="1"/>
         <w:spacing w:before="0" w:after="120" w:line="288" w:lineRule="auto"/>
-        <w:ind w:firstLine="283"/>
         <w:jc w:val="both"/>
       </w:pPr>
       <w:r>
@@ -13608,6 +13640,7 @@
         <w:spacing w:before="200" w:after="120" w:line="288" w:lineRule="auto"/>
         <w:jc w:val="right"/>
         <w:keepNext w:val="1"/>
+        <w:shd w:val="clear" w:fill="EDEDED"/>
       </w:pPr>
       <w:r>
         <w:rPr>
@@ -13626,7 +13659,6 @@
         <w:widowControl/>
         <w:bidi w:val="1"/>
         <w:spacing w:before="0" w:after="120" w:line="288" w:lineRule="auto"/>
-        <w:ind w:firstLine="283"/>
         <w:jc w:val="both"/>
       </w:pPr>
       <w:r>
@@ -13668,6 +13700,7 @@
         <w:spacing w:before="200" w:after="120" w:line="288" w:lineRule="auto"/>
         <w:jc w:val="right"/>
         <w:keepNext w:val="1"/>
+        <w:shd w:val="clear" w:fill="EDEDED"/>
       </w:pPr>
       <w:r>
         <w:rPr>
@@ -13686,7 +13719,6 @@
         <w:widowControl/>
         <w:bidi w:val="1"/>
         <w:spacing w:before="0" w:after="120" w:line="288" w:lineRule="auto"/>
-        <w:ind w:firstLine="283"/>
         <w:jc w:val="both"/>
       </w:pPr>
       <w:r>
@@ -13848,6 +13880,7 @@
         <w:spacing w:before="200" w:after="120" w:line="288" w:lineRule="auto"/>
         <w:jc w:val="right"/>
         <w:keepNext w:val="1"/>
+        <w:shd w:val="clear" w:fill="EDEDED"/>
       </w:pPr>
       <w:r>
         <w:rPr>
@@ -13866,6 +13899,25 @@
         <w:widowControl/>
         <w:bidi w:val="1"/>
         <w:spacing w:before="0" w:after="120" w:line="288" w:lineRule="auto"/>
+        <w:jc w:val="both"/>
+      </w:pPr>
+      <w:r>
+        <w:rPr>
+          <w:rFonts w:ascii="B Lotus" w:hAnsi="B Lotus" w:cs="B Lotus" w:eastAsia="B Lotus"/>
+          <w:b w:val="0"/>
+          <w:i w:val="0"/>
+          <w:sz w:val="28"/>
+          <w:szCs w:val="28"/>
+        </w:rPr>
+        <w:t>پیش از سخن آخر، بگذارید افقِ پیشِ رو را ترسیم کنم؛ چون این رساله ـ چنان‌که گفتم ـ گامِ اول است، نه گامِ آخر. سه مسیرِ پژوهشیِ بعدی را ضروری می‌دانم: یکم، «فقهِ معاهداتِ امروزی» باید به‌صورتِ نظام‌مند تدوین شود؛ یعنی همان کاری که فقهای ما در بابِ بیع و اجاره کرده‌اند، باید در بابِ معاهده هم بشود: تعریف، ارکان، شرایط، احکام، خیارات و آثار ـ همه با ادله و با زبانِ امروز. دوم، «حقوقِ اساسیِ سیاست خارجی» باید از پراکندگی درآید؛ یعنی نسبتِ مجلس و دولت و رهبری و شورای عالی امنیت ملی در چرخه کاملِ معاهده (از مذاکره تا تصویب تا اجرا تا خروج) باید شفاف و مدون شود ـ چه با قانون عادی، چه با رویه تفسیریِ شورای نگهبان. و سوم، «آموزشِ میان‌رشته‌ای» باید جدی گرفته شود: طلبه‌ای که حقوق بین‌الملل نداند، نمی‌تواند فقیهِ سیاست خارجی باشد؛ و حقوق‌دانی که فقه نداند، نمی‌تواند مشاورِ نظامِ اسلامی باشد. پیشنهادِ مشخصِ من، طراحیِ درسِ «فقهِ روابط بین‌الملل» در سطحِ خارجِ حوزه و درسِ «مبانیِ فقهیِ سیاست خارجی» در دانشکده‌های حقوق است. اگر این سه مسیر پیموده شود، این رساله ـ که امروز گامی تنهاست ـ فردا حلقه‌ای از زنجیره‌ای بزرگ خواهد بود.</w:t>
+      </w:r>
+    </w:p>
+    <w:p>
+      <w:pPr>
+        <w:pStyle w:val="TH-Body"/>
+        <w:widowControl/>
+        <w:bidi w:val="1"/>
+        <w:spacing w:before="0" w:after="120" w:line="288" w:lineRule="auto"/>
         <w:ind w:firstLine="283"/>
         <w:jc w:val="both"/>
       </w:pPr>
@@ -13877,26 +13929,6 @@
           <w:sz w:val="28"/>
           <w:szCs w:val="28"/>
         </w:rPr>
-        <w:t>پیش از سخن آخر، بگذارید افقِ پیشِ رو را ترسیم کنم؛ چون این رساله ـ چنان‌که گفتم ـ گامِ اول است، نه گامِ آخر. سه مسیرِ پژوهشیِ بعدی را ضروری می‌دانم: یکم، «فقهِ معاهداتِ امروزی» باید به‌صورتِ نظام‌مند تدوین شود؛ یعنی همان کاری که فقهای ما در بابِ بیع و اجاره کرده‌اند، باید در بابِ معاهده هم بشود: تعریف، ارکان، شرایط، احکام، خیارات و آثار ـ همه با ادله و با زبانِ امروز. دوم، «حقوقِ اساسیِ سیاست خارجی» باید از پراکندگی درآید؛ یعنی نسبتِ مجلس و دولت و رهبری و شورای عالی امنیت ملی در چرخه کاملِ معاهده (از مذاکره تا تصویب تا اجرا تا خروج) باید شفاف و مدون شود ـ چه با قانون عادی، چه با رویه تفسیریِ شورای نگهبان. و سوم، «آموزشِ میان‌رشته‌ای» باید جدی گرفته شود: طلبه‌ای که حقوق بین‌الملل نداند، نمی‌تواند فقیهِ سیاست خارجی باشد؛ و حقوق‌دانی که فقه نداند، نمی‌تواند مشاورِ نظامِ اسلامی باشد. پیشنهادِ مشخصِ من، طراحیِ درسِ «فقهِ روابط بین‌الملل» در سطحِ خارجِ حوزه و درسِ «مبانیِ فقهیِ سیاست خارجی» در دانشکده‌های حقوق است. اگر این سه مسیر پیموده شود، این رساله ـ که امروز گامی تنهاست ـ فردا حلقه‌ای از زنجیره‌ای بزرگ خواهد بود.</w:t>
-      </w:r>
-    </w:p>
-    <w:p>
-      <w:pPr>
-        <w:pStyle w:val="TH-Body"/>
-        <w:widowControl/>
-        <w:bidi w:val="1"/>
-        <w:spacing w:before="0" w:after="120" w:line="288" w:lineRule="auto"/>
-        <w:ind w:firstLine="283"/>
-        <w:jc w:val="both"/>
-      </w:pPr>
-      <w:r>
-        <w:rPr>
-          <w:rFonts w:ascii="B Lotus" w:hAnsi="B Lotus" w:cs="B Lotus" w:eastAsia="B Lotus"/>
-          <w:b w:val="0"/>
-          <w:i w:val="0"/>
-          <w:sz w:val="28"/>
-          <w:szCs w:val="28"/>
-        </w:rPr>
         <w:t>سخن آخر را با اعتراف به کاستی‌ها تمام می‌کنم؛ چون کار علمیِ بی‌نقد، کار مرده است. این رساله ـ مثل هر کار بشری ـ کامل نیست: دسترسی نداشتن به اسناد محرمانه، کم‌کاری ادبیات فقهی در این باب، و اختلاف تفاسیر حقوقی، هر سه مرزهای این پژوهش‌اند ـ مرزهایی که صادقانه در مقدمه گفتم و این‌جا تکرار می‌کنم. ولی اگر همین رساله توانسته باشد گرهی را که در مقدمه توصیف کردم ـ دست‌کم به‌اندازه گامی ـ باز کند و چارچوبی به دست تصمیم‌گیر بدهد که با آن، هم شرع را نگه دارد هم قانون را هم مصلحت کشور را، آن‌وقت زحمتی که کشیده شده بی‌ثمر نمانده. و اگر هم نتوانسته، دست‌کم راه را برای آیندگان هموارتر کرده؛ که علم، بنای نسل‌هاست و هر نسلی آجری می‌نهد. والحمد لله اولاً و آخراً، و صلی الله علی محمد و آله الطاهرین.</w:t>
       </w:r>
     </w:p>
@@ -13905,15 +13937,18 @@
         <w:br w:type="page"/>
       </w:r>
     </w:p>
+    <w:p/>
+    <w:p/>
     <w:p>
       <w:pPr>
         <w:pStyle w:val="TH-Fasl"/>
         <w:widowControl/>
         <w:bidi w:val="1"/>
-        <w:spacing w:before="120" w:after="200" w:line="288" w:lineRule="auto"/>
+        <w:spacing w:before="120" w:after="240" w:line="288" w:lineRule="auto"/>
         <w:jc w:val="center"/>
         <w:pBdr>
-          <w:bottom w:val="single" w:sz="12" w:space="6" w:color="1F3864"/>
+          <w:top w:val="single" w:sz="12" w:space="8" w:color="1F3864"/>
+          <w:bottom w:val="single" w:sz="12" w:space="8" w:color="1F3864"/>
         </w:pBdr>
         <w:keepNext w:val="1"/>
       </w:pPr>
@@ -13934,7 +13969,6 @@
         <w:widowControl/>
         <w:bidi w:val="1"/>
         <w:spacing w:before="0" w:after="120" w:line="288" w:lineRule="auto"/>
-        <w:ind w:firstLine="283"/>
         <w:jc w:val="both"/>
       </w:pPr>
       <w:r>
@@ -13956,6 +13990,7 @@
         <w:spacing w:before="200" w:after="120" w:line="288" w:lineRule="auto"/>
         <w:jc w:val="right"/>
         <w:keepNext w:val="1"/>
+        <w:shd w:val="clear" w:fill="EDEDED"/>
       </w:pPr>
       <w:r>
         <w:rPr>
@@ -13974,7 +14009,6 @@
         <w:widowControl/>
         <w:bidi w:val="1"/>
         <w:spacing w:before="0" w:after="120" w:line="288" w:lineRule="auto"/>
-        <w:ind w:firstLine="283"/>
         <w:jc w:val="both"/>
       </w:pPr>
       <w:r>
@@ -14076,6 +14110,7 @@
         <w:spacing w:before="200" w:after="120" w:line="288" w:lineRule="auto"/>
         <w:jc w:val="right"/>
         <w:keepNext w:val="1"/>
+        <w:shd w:val="clear" w:fill="EDEDED"/>
       </w:pPr>
       <w:r>
         <w:rPr>
@@ -14094,7 +14129,6 @@
         <w:widowControl/>
         <w:bidi w:val="1"/>
         <w:spacing w:before="0" w:after="120" w:line="288" w:lineRule="auto"/>
-        <w:ind w:firstLine="283"/>
         <w:jc w:val="both"/>
       </w:pPr>
       <w:r>
@@ -14236,6 +14270,7 @@
         <w:spacing w:before="200" w:after="120" w:line="288" w:lineRule="auto"/>
         <w:jc w:val="right"/>
         <w:keepNext w:val="1"/>
+        <w:shd w:val="clear" w:fill="EDEDED"/>
       </w:pPr>
       <w:r>
         <w:rPr>
@@ -14254,7 +14289,6 @@
         <w:widowControl/>
         <w:bidi w:val="1"/>
         <w:spacing w:before="0" w:after="120" w:line="288" w:lineRule="auto"/>
-        <w:ind w:firstLine="283"/>
         <w:jc w:val="both"/>
       </w:pPr>
       <w:r>
@@ -14456,6 +14490,7 @@
         <w:spacing w:before="200" w:after="120" w:line="288" w:lineRule="auto"/>
         <w:jc w:val="right"/>
         <w:keepNext w:val="1"/>
+        <w:shd w:val="clear" w:fill="EDEDED"/>
       </w:pPr>
       <w:r>
         <w:rPr>
@@ -14474,7 +14509,6 @@
         <w:widowControl/>
         <w:bidi w:val="1"/>
         <w:spacing w:before="0" w:after="120" w:line="288" w:lineRule="auto"/>
-        <w:ind w:firstLine="283"/>
         <w:jc w:val="both"/>
       </w:pPr>
       <w:r>
@@ -14636,6 +14670,7 @@
         <w:spacing w:before="200" w:after="120" w:line="288" w:lineRule="auto"/>
         <w:jc w:val="right"/>
         <w:keepNext w:val="1"/>
+        <w:shd w:val="clear" w:fill="EDEDED"/>
       </w:pPr>
       <w:r>
         <w:rPr>
@@ -14654,7 +14689,6 @@
         <w:widowControl/>
         <w:bidi w:val="1"/>
         <w:spacing w:before="0" w:after="120" w:line="288" w:lineRule="auto"/>
-        <w:ind w:firstLine="283"/>
         <w:jc w:val="both"/>
       </w:pPr>
       <w:r>
@@ -14776,6 +14810,7 @@
         <w:spacing w:before="200" w:after="120" w:line="288" w:lineRule="auto"/>
         <w:jc w:val="right"/>
         <w:keepNext w:val="1"/>
+        <w:shd w:val="clear" w:fill="EDEDED"/>
       </w:pPr>
       <w:r>
         <w:rPr>
@@ -14794,7 +14829,6 @@
         <w:widowControl/>
         <w:bidi w:val="1"/>
         <w:spacing w:before="0" w:after="120" w:line="288" w:lineRule="auto"/>
-        <w:ind w:firstLine="283"/>
         <w:jc w:val="both"/>
       </w:pPr>
       <w:r>
@@ -14976,6 +15010,7 @@
         <w:spacing w:before="200" w:after="120" w:line="288" w:lineRule="auto"/>
         <w:jc w:val="right"/>
         <w:keepNext w:val="1"/>
+        <w:shd w:val="clear" w:fill="EDEDED"/>
       </w:pPr>
       <w:r>
         <w:rPr>
@@ -14994,7 +15029,6 @@
         <w:widowControl/>
         <w:bidi w:val="1"/>
         <w:spacing w:before="0" w:after="120" w:line="288" w:lineRule="auto"/>
-        <w:ind w:firstLine="283"/>
         <w:jc w:val="both"/>
       </w:pPr>
       <w:r>
@@ -15096,6 +15130,7 @@
         <w:spacing w:before="200" w:after="120" w:line="288" w:lineRule="auto"/>
         <w:jc w:val="right"/>
         <w:keepNext w:val="1"/>
+        <w:shd w:val="clear" w:fill="EDEDED"/>
       </w:pPr>
       <w:r>
         <w:rPr>
@@ -15114,7 +15149,6 @@
         <w:widowControl/>
         <w:bidi w:val="1"/>
         <w:spacing w:before="0" w:after="120" w:line="288" w:lineRule="auto"/>
-        <w:ind w:firstLine="283"/>
         <w:jc w:val="both"/>
       </w:pPr>
       <w:r>
@@ -15216,6 +15250,7 @@
         <w:spacing w:before="200" w:after="120" w:line="288" w:lineRule="auto"/>
         <w:jc w:val="right"/>
         <w:keepNext w:val="1"/>
+        <w:shd w:val="clear" w:fill="EDEDED"/>
       </w:pPr>
       <w:r>
         <w:rPr>
@@ -15234,6 +15269,25 @@
         <w:widowControl/>
         <w:bidi w:val="1"/>
         <w:spacing w:before="0" w:after="120" w:line="288" w:lineRule="auto"/>
+        <w:jc w:val="both"/>
+      </w:pPr>
+      <w:r>
+        <w:rPr>
+          <w:rFonts w:ascii="B Lotus" w:hAnsi="B Lotus" w:cs="B Lotus" w:eastAsia="B Lotus"/>
+          <w:b w:val="0"/>
+          <w:i w:val="0"/>
+          <w:sz w:val="28"/>
+          <w:szCs w:val="28"/>
+        </w:rPr>
+        <w:t>پایگاه اطلاع‌رسانی حوزه (hawzah.net): مقالات اصول ۵۷ و ۱۱۰ و حق شرط در معاهدات.</w:t>
+      </w:r>
+    </w:p>
+    <w:p>
+      <w:pPr>
+        <w:pStyle w:val="TH-Body"/>
+        <w:widowControl/>
+        <w:bidi w:val="1"/>
+        <w:spacing w:before="0" w:after="120" w:line="288" w:lineRule="auto"/>
         <w:ind w:firstLine="283"/>
         <w:jc w:val="both"/>
       </w:pPr>
@@ -15245,7 +15299,7 @@
           <w:sz w:val="28"/>
           <w:szCs w:val="28"/>
         </w:rPr>
-        <w:t>پایگاه اطلاع‌رسانی حوزه (hawzah.net): مقالات اصول ۵۷ و ۱۱۰ و حق شرط در معاهدات.</w:t>
+        <w:t>پایگاه پژوهشکده شورای نگهبان (shora-gc.ir): متن رسمی قانون اساسی و نظرات تفسیری.</w:t>
       </w:r>
     </w:p>
     <w:p>
@@ -15265,7 +15319,7 @@
           <w:sz w:val="28"/>
           <w:szCs w:val="28"/>
         </w:rPr>
-        <w:t>پایگاه پژوهشکده شورای نگهبان (shora-gc.ir): متن رسمی قانون اساسی و نظرات تفسیری.</w:t>
+        <w:t>پایگاه امامت‌پدیا (fa.imamatpedia.com): مدخل «وفای به عهد در نهج‌البلاغه».</w:t>
       </w:r>
     </w:p>
     <w:p>
@@ -15285,7 +15339,7 @@
           <w:sz w:val="28"/>
           <w:szCs w:val="28"/>
         </w:rPr>
-        <w:t>پایگاه امامت‌پدیا (fa.imamatpedia.com): مدخل «وفای به عهد در نهج‌البلاغه».</w:t>
+        <w:t>سامانه قوانین (مرکز پژوهش‌های مجلس): متن قوانین و آیین‌نامه‌های داخلی.</w:t>
       </w:r>
     </w:p>
     <w:p>
@@ -15305,26 +15359,6 @@
           <w:sz w:val="28"/>
           <w:szCs w:val="28"/>
         </w:rPr>
-        <w:t>سامانه قوانین (مرکز پژوهش‌های مجلس): متن قوانین و آیین‌نامه‌های داخلی.</w:t>
-      </w:r>
-    </w:p>
-    <w:p>
-      <w:pPr>
-        <w:pStyle w:val="TH-Body"/>
-        <w:widowControl/>
-        <w:bidi w:val="1"/>
-        <w:spacing w:before="0" w:after="120" w:line="288" w:lineRule="auto"/>
-        <w:ind w:firstLine="283"/>
-        <w:jc w:val="both"/>
-      </w:pPr>
-      <w:r>
-        <w:rPr>
-          <w:rFonts w:ascii="B Lotus" w:hAnsi="B Lotus" w:cs="B Lotus" w:eastAsia="B Lotus"/>
-          <w:b w:val="0"/>
-          <w:i w:val="0"/>
-          <w:sz w:val="28"/>
-          <w:szCs w:val="28"/>
-        </w:rPr>
         <w:t>پایگاه سازمان ملل (un.org) و کمیسیون حقوق بین‌الملل (legal.un.org/ilc): متن کنوانسیون وین و طرح مواد مسئولیت.</w:t>
       </w:r>
     </w:p>
@@ -15333,15 +15367,18 @@
         <w:br w:type="page"/>
       </w:r>
     </w:p>
+    <w:p/>
+    <w:p/>
     <w:p>
       <w:pPr>
         <w:pStyle w:val="TH-Fasl"/>
         <w:widowControl/>
         <w:bidi w:val="1"/>
-        <w:spacing w:before="120" w:after="200" w:line="288" w:lineRule="auto"/>
+        <w:spacing w:before="120" w:after="240" w:line="288" w:lineRule="auto"/>
         <w:jc w:val="center"/>
         <w:pBdr>
-          <w:bottom w:val="single" w:sz="12" w:space="6" w:color="1F3864"/>
+          <w:top w:val="single" w:sz="12" w:space="8" w:color="1F3864"/>
+          <w:bottom w:val="single" w:sz="12" w:space="8" w:color="1F3864"/>
         </w:pBdr>
         <w:keepNext w:val="1"/>
       </w:pPr>
@@ -15362,7 +15399,6 @@
         <w:widowControl/>
         <w:bidi w:val="1"/>
         <w:spacing w:before="0" w:after="120" w:line="288" w:lineRule="auto"/>
-        <w:ind w:firstLine="283"/>
         <w:jc w:val="both"/>
       </w:pPr>
       <w:r>
@@ -15384,6 +15420,7 @@
         <w:spacing w:before="200" w:after="120" w:line="288" w:lineRule="auto"/>
         <w:jc w:val="right"/>
         <w:keepNext w:val="1"/>
+        <w:shd w:val="clear" w:fill="EDEDED"/>
       </w:pPr>
       <w:r>
         <w:rPr>
@@ -15402,7 +15439,6 @@
         <w:widowControl/>
         <w:bidi w:val="1"/>
         <w:spacing w:before="0" w:after="120" w:line="288" w:lineRule="auto"/>
-        <w:ind w:firstLine="283"/>
         <w:jc w:val="both"/>
       </w:pPr>
       <w:r>
@@ -15584,6 +15620,7 @@
         <w:spacing w:before="200" w:after="120" w:line="288" w:lineRule="auto"/>
         <w:jc w:val="right"/>
         <w:keepNext w:val="1"/>
+        <w:shd w:val="clear" w:fill="EDEDED"/>
       </w:pPr>
       <w:r>
         <w:rPr>
@@ -15602,7 +15639,6 @@
         <w:widowControl/>
         <w:bidi w:val="1"/>
         <w:spacing w:before="0" w:after="120" w:line="288" w:lineRule="auto"/>
-        <w:ind w:firstLine="283"/>
         <w:jc w:val="both"/>
       </w:pPr>
       <w:r>
@@ -15914,6 +15950,7 @@
         <w:spacing w:before="200" w:after="120" w:line="288" w:lineRule="auto"/>
         <w:jc w:val="right"/>
         <w:keepNext w:val="1"/>
+        <w:shd w:val="clear" w:fill="EDEDED"/>
       </w:pPr>
       <w:r>
         <w:rPr>
@@ -15932,7 +15969,6 @@
         <w:widowControl/>
         <w:bidi w:val="1"/>
         <w:spacing w:before="0" w:after="120" w:line="288" w:lineRule="auto"/>
-        <w:ind w:firstLine="283"/>
         <w:jc w:val="both"/>
       </w:pPr>
       <w:r>
@@ -16213,6 +16249,7 @@
         <w:spacing w:before="200" w:after="120" w:line="288" w:lineRule="auto"/>
         <w:jc w:val="right"/>
         <w:keepNext w:val="1"/>
+        <w:shd w:val="clear" w:fill="EDEDED"/>
       </w:pPr>
       <w:r>
         <w:rPr>
@@ -16231,7 +16268,6 @@
         <w:widowControl/>
         <w:bidi w:val="1"/>
         <w:spacing w:before="0" w:after="120" w:line="288" w:lineRule="auto"/>
-        <w:ind w:firstLine="283"/>
         <w:jc w:val="both"/>
       </w:pPr>
       <w:r>
@@ -16253,6 +16289,7 @@
         <w:spacing w:before="200" w:after="120" w:line="288" w:lineRule="auto"/>
         <w:jc w:val="right"/>
         <w:keepNext w:val="1"/>
+        <w:shd w:val="clear" w:fill="EDEDED"/>
       </w:pPr>
       <w:r>
         <w:rPr>
@@ -16271,7 +16308,6 @@
         <w:widowControl/>
         <w:bidi w:val="1"/>
         <w:spacing w:before="0" w:after="120" w:line="288" w:lineRule="auto"/>
-        <w:ind w:firstLine="283"/>
         <w:jc w:val="both"/>
       </w:pPr>
       <w:r>
@@ -16329,7 +16365,6 @@
         <w:widowControl/>
         <w:bidi w:val="1"/>
         <w:spacing w:before="0" w:after="120" w:line="288" w:lineRule="auto"/>
-        <w:ind w:firstLine="283"/>
         <w:jc w:val="both"/>
       </w:pPr>
       <w:r>
@@ -16376,7 +16411,6 @@
         <w:widowControl/>
         <w:bidi w:val="1"/>
         <w:spacing w:before="0" w:after="120" w:line="288" w:lineRule="auto"/>
-        <w:ind w:firstLine="283"/>
         <w:jc w:val="both"/>
       </w:pPr>
       <w:r>
@@ -16423,7 +16457,6 @@
         <w:widowControl/>
         <w:bidi w:val="1"/>
         <w:spacing w:before="0" w:after="120" w:line="288" w:lineRule="auto"/>
-        <w:ind w:firstLine="283"/>
         <w:jc w:val="both"/>
       </w:pPr>
       <w:r>
@@ -16470,7 +16503,6 @@
         <w:widowControl/>
         <w:bidi w:val="1"/>
         <w:spacing w:before="0" w:after="120" w:line="288" w:lineRule="auto"/>
-        <w:ind w:firstLine="283"/>
         <w:jc w:val="both"/>
       </w:pPr>
       <w:r>
@@ -16492,6 +16524,7 @@
         <w:spacing w:before="200" w:after="120" w:line="288" w:lineRule="auto"/>
         <w:jc w:val="right"/>
         <w:keepNext w:val="1"/>
+        <w:shd w:val="clear" w:fill="EDEDED"/>
       </w:pPr>
       <w:r>
         <w:rPr>
@@ -16510,7 +16543,6 @@
         <w:widowControl/>
         <w:bidi w:val="1"/>
         <w:spacing w:before="0" w:after="120" w:line="288" w:lineRule="auto"/>
-        <w:ind w:firstLine="283"/>
         <w:jc w:val="both"/>
       </w:pPr>
       <w:r>
@@ -16531,6 +16563,12 @@
       <w:pgMar w:top="1417" w:right="1701" w:bottom="1417" w:left="1134" w:header="680" w:footer="680" w:gutter="0"/>
       <w:cols w:space="720"/>
       <w:docGrid w:linePitch="360"/>
+      <w:pgBorders w:offsetFrom="page">
+        <w:top w:val="single" w:sz="12" w:space="24" w:color="1F3864"/>
+        <w:left w:val="single" w:sz="12" w:space="24" w:color="1F3864"/>
+        <w:bottom w:val="single" w:sz="12" w:space="24" w:color="1F3864"/>
+        <w:right w:val="single" w:sz="12" w:space="24" w:color="1F3864"/>
+      </w:pgBorders>
       <w:pgNumType w:start="1"/>
     </w:sectPr>
   </w:body>
@@ -16553,7 +16591,7 @@
     <w:r>
       <w:rPr>
         <w:rFonts w:ascii="B Lotus" w:hAnsi="B Lotus" w:cs="B Lotus" w:eastAsia="B Lotus"/>
-        <w:b w:val="0"/>
+        <w:b/>
         <w:i w:val="0"/>
         <w:sz w:val="22"/>
         <w:szCs w:val="22"/>
@@ -16563,7 +16601,7 @@
     <w:r>
       <w:rPr>
         <w:rFonts w:ascii="B Lotus" w:hAnsi="B Lotus" w:cs="B Lotus" w:eastAsia="B Lotus"/>
-        <w:b w:val="0"/>
+        <w:b/>
         <w:i w:val="0"/>
         <w:sz w:val="22"/>
         <w:szCs w:val="22"/>
@@ -16573,7 +16611,7 @@
     <w:r>
       <w:rPr>
         <w:rFonts w:ascii="B Lotus" w:hAnsi="B Lotus" w:cs="B Lotus" w:eastAsia="B Lotus"/>
-        <w:b w:val="0"/>
+        <w:b/>
         <w:i w:val="0"/>
         <w:sz w:val="22"/>
         <w:szCs w:val="22"/>
@@ -16583,7 +16621,7 @@
     <w:r>
       <w:rPr>
         <w:rFonts w:ascii="B Lotus" w:hAnsi="B Lotus" w:cs="B Lotus" w:eastAsia="B Lotus"/>
-        <w:b w:val="0"/>
+        <w:b/>
         <w:i w:val="0"/>
         <w:sz w:val="22"/>
         <w:szCs w:val="22"/>
@@ -16598,6 +16636,10 @@
 <w:footnotes xmlns:w="http://schemas.openxmlformats.org/wordprocessingml/2006/main">
   <w:footnote w:id="0" w:type="separator">
     <w:p>
+      <w:pPr>
+        <w:bidi w:val="1"/>
+        <w:jc w:val="right"/>
+      </w:pPr>
       <w:r>
         <w:separator/>
       </w:r>
@@ -33536,6 +33578,7 @@
     <w:pPr>
       <w:bidi w:val="1"/>
       <w:jc w:val="right"/>
+      <w:ind w:right="284"/>
       <w:tabs>
         <w:tab w:val="right" w:leader="dot" w:pos="9072"/>
       </w:tabs>
@@ -33552,6 +33595,7 @@
     <w:pPr>
       <w:bidi w:val="1"/>
       <w:jc w:val="right"/>
+      <w:ind w:right="567"/>
       <w:tabs>
         <w:tab w:val="right" w:leader="dot" w:pos="9072"/>
       </w:tabs>
@@ -33568,6 +33612,7 @@
     <w:pPr>
       <w:bidi w:val="1"/>
       <w:jc w:val="right"/>
+      <w:ind w:right="851"/>
       <w:tabs>
         <w:tab w:val="right" w:leader="dot" w:pos="9072"/>
       </w:tabs>

</xml_diff>

<commit_message>
Strict review fixes: cover-only frame, narrow gloss, stale count refs
Co-authored-by: arena-agent <297053741+arena-agent@users.noreply.github.com>
</commit_message>
<xml_diff>
--- a/Resaleh_Sath3_Hadi_Shabestani_v2.docx
+++ b/Resaleh_Sath3_Hadi_Shabestani_v2.docx
@@ -1125,12 +1125,6 @@
           <w:pgMar w:top="1417" w:right="1701" w:bottom="1417" w:left="1134" w:header="680" w:footer="680" w:gutter="0"/>
           <w:cols w:space="720"/>
           <w:docGrid w:linePitch="360"/>
-          <w:pgBorders w:offsetFrom="page">
-            <w:top w:val="single" w:sz="12" w:space="24" w:color="1F3864"/>
-            <w:left w:val="single" w:sz="12" w:space="24" w:color="1F3864"/>
-            <w:bottom w:val="single" w:sz="12" w:space="24" w:color="1F3864"/>
-            <w:right w:val="single" w:sz="12" w:space="24" w:color="1F3864"/>
-          </w:pgBorders>
         </w:sectPr>
       </w:pPr>
     </w:p>
@@ -4275,7 +4269,7 @@
           <w:sz w:val="28"/>
           <w:szCs w:val="28"/>
         </w:rPr>
-        <w:t>معنایش روشن و بی‌رحم است: قانون اساسی‌ات، قوانین عادی‌ات، احکام شرع‌ات، حکم حکومتی ولی فقیه‌ات ـ همه از نظر حقوق بین‌الملل «حقوق داخلی»‌اند و هیچ‌کدام نمی‌توانند توجیه عدم اجرا در برابر طرف مقابل باشند. دولتی که به استناد قانون داخلی‌اش از اجرای معاهده سرباز بزند، «ناقض» است؛ و طرف مقابل حق دارد آثار نقض را مطالبه کند. تنها استثنای narrow این قاعده در ماده ۴۶ آمده: وقتی نقض مقررات داخلی درباره صلاحیت انعقاد، «آشکار» باشد و به «قاعده بنیادین» حقوق داخلی مربوط شود ـ که آن هم ناظر به مرحله انعقاد است، نه اجرا.</w:t>
+        <w:t>معنایش روشن و بی‌رحم است: قانون اساسی‌ات، قوانین عادی‌ات، احکام شرع‌ات، حکم حکومتی ولی فقیه‌ات ـ همه از نظر حقوق بین‌الملل «حقوق داخلی»‌اند و هیچ‌کدام نمی‌توانند توجیه عدم اجرا در برابر طرف مقابل باشند. دولتی که به استناد قانون داخلی‌اش از اجرای معاهده سرباز بزند، «ناقض» است؛ و طرف مقابل حق دارد آثار نقض را مطالبه کند. تنها استثنای مضیق این قاعده در ماده ۴۶ آمده: وقتی نقض مقررات داخلی درباره صلاحیت انعقاد، «آشکار» باشد و به «قاعده بنیادین» حقوق داخلی مربوط شود ـ که آن هم ناظر به مرحله انعقاد است، نه اجرا.</w:t>
       </w:r>
       <w:r>
         <w:rPr>
@@ -8887,7 +8881,7 @@
           <w:sz w:val="28"/>
           <w:szCs w:val="28"/>
         </w:rPr>
-        <w:t>در فصل سوم وکیل وفا بودم و قاعده را با پنج دسته دلیل اثبات کردم؛ قاعده‌ای که انصافاً قوی بود و هست. حالا نوبت دفاع از استثناست؛ و این کار، از جهتی دشوارتر است، چون باید در برابر آن قاعده قدرتمند، راهی برای خروج نشان بدهم ـ راهی که نه قاعده را ویران کند، نه بی‌ضابطه باشد. منطق من در این فصل سه‌گامی است: اول نشان می‌دهم که نسبت وجوب وفا و وجوب حفظ نظام، «تزاحم» است نه تعارض ـ یعنی هر دو حکم سر جایشان هستند ولی در مقام عمل با هم درگیر شده‌اند؛ بعد نشان می‌دهم که مرجع حل این تزاحم، «ولی فقیه» است و ابزار حلش، «حکم حکومتی»؛ و آخر، ضوابطی استخراج می‌کنم که جلوِ سوءاستفاده از این جواز را بگیرد. اگر این سه گام درست برداشته شود، جواز عدول ثابت می‌شود ـ جوازی مقید، مشروط، و مهارشده؛ نه مجوزی برای هر عهدشکنی.</w:t>
+        <w:t>در فصل سوم وکیل وفا بودم و قاعده را با هشت گفتارِ مستدل اثبات کردم؛ قاعده‌ای که انصافاً قوی بود و هست. حالا نوبت دفاع از استثناست؛ و این کار، از جهتی دشوارتر است، چون باید در برابر آن قاعده قدرتمند، راهی برای خروج نشان بدهم ـ راهی که نه قاعده را ویران کند، نه بی‌ضابطه باشد. منطق من در این فصل سه‌گامی است: اول نشان می‌دهم که نسبت وجوب وفا و وجوب حفظ نظام، «تزاحم» است نه تعارض ـ یعنی هر دو حکم سر جایشان هستند ولی در مقام عمل با هم درگیر شده‌اند؛ بعد نشان می‌دهم که مرجع حل این تزاحم، «ولی فقیه» است و ابزار حلش، «حکم حکومتی»؛ و آخر، ضوابطی استخراج می‌کنم که جلوِ سوءاستفاده از این جواز را بگیرد. اگر این سه گام درست برداشته شود، جواز عدول ثابت می‌شود ـ جوازی مقید، مشروط، و مهارشده؛ نه مجوزی برای هر عهدشکنی.</w:t>
       </w:r>
     </w:p>
     <w:p>
@@ -16563,12 +16557,6 @@
       <w:pgMar w:top="1417" w:right="1701" w:bottom="1417" w:left="1134" w:header="680" w:footer="680" w:gutter="0"/>
       <w:cols w:space="720"/>
       <w:docGrid w:linePitch="360"/>
-      <w:pgBorders w:offsetFrom="page">
-        <w:top w:val="single" w:sz="12" w:space="24" w:color="1F3864"/>
-        <w:left w:val="single" w:sz="12" w:space="24" w:color="1F3864"/>
-        <w:bottom w:val="single" w:sz="12" w:space="24" w:color="1F3864"/>
-        <w:right w:val="single" w:sz="12" w:space="24" w:color="1F3864"/>
-      </w:pgBorders>
       <w:pgNumType w:start="1"/>
     </w:sectPr>
   </w:body>

</xml_diff>

<commit_message>
Bake static TOC entries (179 titles, levels 1-4) so list shows in every viewer
Co-authored-by: arena-agent <297053741+arena-agent@users.noreply.github.com>
</commit_message>
<xml_diff>
--- a/Resaleh_Sath3_Hadi_Shabestani_v2.docx
+++ b/Resaleh_Sath3_Hadi_Shabestani_v2.docx
@@ -1077,17 +1077,2699 @@
         </w:rPr>
         <w:fldChar w:fldCharType="separate"/>
       </w:r>
-      <w:r>
-        <w:rPr>
-          <w:rFonts w:ascii="B Lotus" w:hAnsi="B Lotus" w:cs="B Lotus" w:eastAsia="B Lotus"/>
-          <w:b w:val="0"/>
-          <w:i w:val="0"/>
-          <w:color w:val="888888"/>
-          <w:sz w:val="24"/>
-          <w:szCs w:val="24"/>
-        </w:rPr>
-        <w:t>فهرست مطالب پس از بازشدن فایل در Word تکمیل می‌شود.</w:t>
-      </w:r>
+    </w:p>
+    <w:p>
+      <w:pPr>
+        <w:pStyle w:val="TOC2"/>
+      </w:pPr>
+      <w:r>
+        <w:rPr>
+          <w:rFonts w:ascii="B Lotus" w:hAnsi="B Lotus" w:cs="B Lotus" w:eastAsia="B Lotus"/>
+          <w:b w:val="0"/>
+          <w:i w:val="0"/>
+          <w:sz w:val="26"/>
+          <w:szCs w:val="26"/>
+        </w:rPr>
+        <w:t>چکیده</w:t>
+      </w:r>
+    </w:p>
+    <w:p>
+      <w:pPr>
+        <w:pStyle w:val="TOC2"/>
+      </w:pPr>
+      <w:r>
+        <w:rPr>
+          <w:rFonts w:ascii="B Lotus" w:hAnsi="B Lotus" w:cs="B Lotus" w:eastAsia="B Lotus"/>
+          <w:b w:val="0"/>
+          <w:i w:val="0"/>
+          <w:sz w:val="26"/>
+          <w:szCs w:val="26"/>
+        </w:rPr>
+        <w:t>پیشگفتار</w:t>
+      </w:r>
+    </w:p>
+    <w:p>
+      <w:pPr>
+        <w:pStyle w:val="TOC2"/>
+      </w:pPr>
+      <w:r>
+        <w:rPr>
+          <w:rFonts w:ascii="B Lotus" w:hAnsi="B Lotus" w:cs="B Lotus" w:eastAsia="B Lotus"/>
+          <w:b w:val="0"/>
+          <w:i w:val="0"/>
+          <w:sz w:val="26"/>
+          <w:szCs w:val="26"/>
+        </w:rPr>
+        <w:t>مقدمه: کلیات تحقیق</w:t>
+      </w:r>
+    </w:p>
+    <w:p>
+      <w:pPr>
+        <w:pStyle w:val="TOC3"/>
+      </w:pPr>
+      <w:r>
+        <w:rPr>
+          <w:rFonts w:ascii="B Lotus" w:hAnsi="B Lotus" w:cs="B Lotus" w:eastAsia="B Lotus"/>
+          <w:b w:val="0"/>
+          <w:i w:val="0"/>
+          <w:sz w:val="26"/>
+          <w:szCs w:val="26"/>
+        </w:rPr>
+        <w:t>بیان مسئله</w:t>
+      </w:r>
+    </w:p>
+    <w:p>
+      <w:pPr>
+        <w:pStyle w:val="TOC3"/>
+      </w:pPr>
+      <w:r>
+        <w:rPr>
+          <w:rFonts w:ascii="B Lotus" w:hAnsi="B Lotus" w:cs="B Lotus" w:eastAsia="B Lotus"/>
+          <w:b w:val="0"/>
+          <w:i w:val="0"/>
+          <w:sz w:val="26"/>
+          <w:szCs w:val="26"/>
+        </w:rPr>
+        <w:t>ضرورت و اهمیت تحقیق</w:t>
+      </w:r>
+    </w:p>
+    <w:p>
+      <w:pPr>
+        <w:pStyle w:val="TOC3"/>
+      </w:pPr>
+      <w:r>
+        <w:rPr>
+          <w:rFonts w:ascii="B Lotus" w:hAnsi="B Lotus" w:cs="B Lotus" w:eastAsia="B Lotus"/>
+          <w:b w:val="0"/>
+          <w:i w:val="0"/>
+          <w:sz w:val="26"/>
+          <w:szCs w:val="26"/>
+        </w:rPr>
+        <w:t>اهداف تحقیق</w:t>
+      </w:r>
+    </w:p>
+    <w:p>
+      <w:pPr>
+        <w:pStyle w:val="TOC3"/>
+      </w:pPr>
+      <w:r>
+        <w:rPr>
+          <w:rFonts w:ascii="B Lotus" w:hAnsi="B Lotus" w:cs="B Lotus" w:eastAsia="B Lotus"/>
+          <w:b w:val="0"/>
+          <w:i w:val="0"/>
+          <w:sz w:val="26"/>
+          <w:szCs w:val="26"/>
+        </w:rPr>
+        <w:t>سؤالات تحقیق</w:t>
+      </w:r>
+    </w:p>
+    <w:p>
+      <w:pPr>
+        <w:pStyle w:val="TOC3"/>
+      </w:pPr>
+      <w:r>
+        <w:rPr>
+          <w:rFonts w:ascii="B Lotus" w:hAnsi="B Lotus" w:cs="B Lotus" w:eastAsia="B Lotus"/>
+          <w:b w:val="0"/>
+          <w:i w:val="0"/>
+          <w:sz w:val="26"/>
+          <w:szCs w:val="26"/>
+        </w:rPr>
+        <w:t>فرضیه تحقیق</w:t>
+      </w:r>
+    </w:p>
+    <w:p>
+      <w:pPr>
+        <w:pStyle w:val="TOC3"/>
+      </w:pPr>
+      <w:r>
+        <w:rPr>
+          <w:rFonts w:ascii="B Lotus" w:hAnsi="B Lotus" w:cs="B Lotus" w:eastAsia="B Lotus"/>
+          <w:b w:val="0"/>
+          <w:i w:val="0"/>
+          <w:sz w:val="26"/>
+          <w:szCs w:val="26"/>
+        </w:rPr>
+        <w:t>پیشینه تحقیق</w:t>
+      </w:r>
+    </w:p>
+    <w:p>
+      <w:pPr>
+        <w:pStyle w:val="TOC3"/>
+      </w:pPr>
+      <w:r>
+        <w:rPr>
+          <w:rFonts w:ascii="B Lotus" w:hAnsi="B Lotus" w:cs="B Lotus" w:eastAsia="B Lotus"/>
+          <w:b w:val="0"/>
+          <w:i w:val="0"/>
+          <w:sz w:val="26"/>
+          <w:szCs w:val="26"/>
+        </w:rPr>
+        <w:t>روش تحقیق</w:t>
+      </w:r>
+    </w:p>
+    <w:p>
+      <w:pPr>
+        <w:pStyle w:val="TOC3"/>
+      </w:pPr>
+      <w:r>
+        <w:rPr>
+          <w:rFonts w:ascii="B Lotus" w:hAnsi="B Lotus" w:cs="B Lotus" w:eastAsia="B Lotus"/>
+          <w:b w:val="0"/>
+          <w:i w:val="0"/>
+          <w:sz w:val="26"/>
+          <w:szCs w:val="26"/>
+        </w:rPr>
+        <w:t>ساماندهی تحقیق</w:t>
+      </w:r>
+    </w:p>
+    <w:p>
+      <w:pPr>
+        <w:pStyle w:val="TOC3"/>
+      </w:pPr>
+      <w:r>
+        <w:rPr>
+          <w:rFonts w:ascii="B Lotus" w:hAnsi="B Lotus" w:cs="B Lotus" w:eastAsia="B Lotus"/>
+          <w:b w:val="0"/>
+          <w:i w:val="0"/>
+          <w:sz w:val="26"/>
+          <w:szCs w:val="26"/>
+        </w:rPr>
+        <w:t>قلمرو، محدودیت‌ها و اصطلاحات</w:t>
+      </w:r>
+    </w:p>
+    <w:p>
+      <w:pPr>
+        <w:pStyle w:val="TOC1"/>
+      </w:pPr>
+      <w:r>
+        <w:rPr>
+          <w:rFonts w:ascii="B Lotus" w:hAnsi="B Lotus" w:cs="B Lotus" w:eastAsia="B Lotus"/>
+          <w:b w:val="0"/>
+          <w:i w:val="0"/>
+          <w:sz w:val="26"/>
+          <w:szCs w:val="26"/>
+        </w:rPr>
+        <w:t>بخش اول: مبانی و کلیات</w:t>
+      </w:r>
+    </w:p>
+    <w:p>
+      <w:pPr>
+        <w:pStyle w:val="TOC2"/>
+      </w:pPr>
+      <w:r>
+        <w:rPr>
+          <w:rFonts w:ascii="B Lotus" w:hAnsi="B Lotus" w:cs="B Lotus" w:eastAsia="B Lotus"/>
+          <w:b w:val="0"/>
+          <w:i w:val="0"/>
+          <w:sz w:val="26"/>
+          <w:szCs w:val="26"/>
+        </w:rPr>
+        <w:t>فصل اول: مفهوم‌شناسی و چارچوب نظری</w:t>
+      </w:r>
+    </w:p>
+    <w:p>
+      <w:pPr>
+        <w:pStyle w:val="TOC3"/>
+      </w:pPr>
+      <w:r>
+        <w:rPr>
+          <w:rFonts w:ascii="B Lotus" w:hAnsi="B Lotus" w:cs="B Lotus" w:eastAsia="B Lotus"/>
+          <w:b w:val="0"/>
+          <w:i w:val="0"/>
+          <w:sz w:val="26"/>
+          <w:szCs w:val="26"/>
+        </w:rPr>
+        <w:t>گفتار اول: مفهوم معاهده و تعهد بین‌المللی</w:t>
+      </w:r>
+    </w:p>
+    <w:p>
+      <w:pPr>
+        <w:pStyle w:val="TOC4"/>
+      </w:pPr>
+      <w:r>
+        <w:rPr>
+          <w:rFonts w:ascii="B Lotus" w:hAnsi="B Lotus" w:cs="B Lotus" w:eastAsia="B Lotus"/>
+          <w:b w:val="0"/>
+          <w:i w:val="0"/>
+          <w:sz w:val="26"/>
+          <w:szCs w:val="26"/>
+        </w:rPr>
+        <w:t>بند اول: تعریف لغوی و اصطلاحی معاهده</w:t>
+      </w:r>
+    </w:p>
+    <w:p>
+      <w:pPr>
+        <w:pStyle w:val="TOC4"/>
+      </w:pPr>
+      <w:r>
+        <w:rPr>
+          <w:rFonts w:ascii="B Lotus" w:hAnsi="B Lotus" w:cs="B Lotus" w:eastAsia="B Lotus"/>
+          <w:b w:val="0"/>
+          <w:i w:val="0"/>
+          <w:sz w:val="26"/>
+          <w:szCs w:val="26"/>
+        </w:rPr>
+        <w:t>بند دوم: اقسام معاهدات و محل بحث</w:t>
+      </w:r>
+    </w:p>
+    <w:p>
+      <w:pPr>
+        <w:pStyle w:val="TOC4"/>
+      </w:pPr>
+      <w:r>
+        <w:rPr>
+          <w:rFonts w:ascii="B Lotus" w:hAnsi="B Lotus" w:cs="B Lotus" w:eastAsia="B Lotus"/>
+          <w:b w:val="0"/>
+          <w:i w:val="0"/>
+          <w:sz w:val="26"/>
+          <w:szCs w:val="26"/>
+        </w:rPr>
+        <w:t>بند سوم: مفهوم تعهد و ارکان آن</w:t>
+      </w:r>
+    </w:p>
+    <w:p>
+      <w:pPr>
+        <w:pStyle w:val="TOC3"/>
+      </w:pPr>
+      <w:r>
+        <w:rPr>
+          <w:rFonts w:ascii="B Lotus" w:hAnsi="B Lotus" w:cs="B Lotus" w:eastAsia="B Lotus"/>
+          <w:b w:val="0"/>
+          <w:i w:val="0"/>
+          <w:sz w:val="26"/>
+          <w:szCs w:val="26"/>
+        </w:rPr>
+        <w:t>گفتار دوم: مفهوم ولی فقیه و گستره اختیارات</w:t>
+      </w:r>
+    </w:p>
+    <w:p>
+      <w:pPr>
+        <w:pStyle w:val="TOC4"/>
+      </w:pPr>
+      <w:r>
+        <w:rPr>
+          <w:rFonts w:ascii="B Lotus" w:hAnsi="B Lotus" w:cs="B Lotus" w:eastAsia="B Lotus"/>
+          <w:b w:val="0"/>
+          <w:i w:val="0"/>
+          <w:sz w:val="26"/>
+          <w:szCs w:val="26"/>
+        </w:rPr>
+        <w:t>بند اول: تعریف ولی فقیه</w:t>
+      </w:r>
+    </w:p>
+    <w:p>
+      <w:pPr>
+        <w:pStyle w:val="TOC4"/>
+      </w:pPr>
+      <w:r>
+        <w:rPr>
+          <w:rFonts w:ascii="B Lotus" w:hAnsi="B Lotus" w:cs="B Lotus" w:eastAsia="B Lotus"/>
+          <w:b w:val="0"/>
+          <w:i w:val="0"/>
+          <w:sz w:val="26"/>
+          <w:szCs w:val="26"/>
+        </w:rPr>
+        <w:t>بند دوم: مراتب اختیار؛ صریح، ضمنی، ولایی، حکومتی</w:t>
+      </w:r>
+    </w:p>
+    <w:p>
+      <w:pPr>
+        <w:pStyle w:val="TOC3"/>
+      </w:pPr>
+      <w:r>
+        <w:rPr>
+          <w:rFonts w:ascii="B Lotus" w:hAnsi="B Lotus" w:cs="B Lotus" w:eastAsia="B Lotus"/>
+          <w:b w:val="0"/>
+          <w:i w:val="0"/>
+          <w:sz w:val="26"/>
+          <w:szCs w:val="26"/>
+        </w:rPr>
+        <w:t>گفتار سوم: مفهوم عدول و مفاهیم خویشاوند</w:t>
+      </w:r>
+    </w:p>
+    <w:p>
+      <w:pPr>
+        <w:pStyle w:val="TOC4"/>
+      </w:pPr>
+      <w:r>
+        <w:rPr>
+          <w:rFonts w:ascii="B Lotus" w:hAnsi="B Lotus" w:cs="B Lotus" w:eastAsia="B Lotus"/>
+          <w:b w:val="0"/>
+          <w:i w:val="0"/>
+          <w:sz w:val="26"/>
+          <w:szCs w:val="26"/>
+        </w:rPr>
+        <w:t>بند اول: تعریف عدول</w:t>
+      </w:r>
+    </w:p>
+    <w:p>
+      <w:pPr>
+        <w:pStyle w:val="TOC4"/>
+      </w:pPr>
+      <w:r>
+        <w:rPr>
+          <w:rFonts w:ascii="B Lotus" w:hAnsi="B Lotus" w:cs="B Lotus" w:eastAsia="B Lotus"/>
+          <w:b w:val="0"/>
+          <w:i w:val="0"/>
+          <w:sz w:val="26"/>
+          <w:szCs w:val="26"/>
+        </w:rPr>
+        <w:t>بند دوم: تمایز از مفاهیم خویشاوند</w:t>
+      </w:r>
+    </w:p>
+    <w:p>
+      <w:pPr>
+        <w:pStyle w:val="TOC4"/>
+      </w:pPr>
+      <w:r>
+        <w:rPr>
+          <w:rFonts w:ascii="B Lotus" w:hAnsi="B Lotus" w:cs="B Lotus" w:eastAsia="B Lotus"/>
+          <w:b w:val="0"/>
+          <w:i w:val="0"/>
+          <w:sz w:val="26"/>
+          <w:szCs w:val="26"/>
+        </w:rPr>
+        <w:t>بند سوم: طیف پنج‌صورتِ عدول</w:t>
+      </w:r>
+    </w:p>
+    <w:p>
+      <w:pPr>
+        <w:pStyle w:val="TOC3"/>
+      </w:pPr>
+      <w:r>
+        <w:rPr>
+          <w:rFonts w:ascii="B Lotus" w:hAnsi="B Lotus" w:cs="B Lotus" w:eastAsia="B Lotus"/>
+          <w:b w:val="0"/>
+          <w:i w:val="0"/>
+          <w:sz w:val="26"/>
+          <w:szCs w:val="26"/>
+        </w:rPr>
+        <w:t>گفتار چهارم: مفهوم مصلحت و چارچوب نظری</w:t>
+      </w:r>
+    </w:p>
+    <w:p>
+      <w:pPr>
+        <w:pStyle w:val="TOC4"/>
+      </w:pPr>
+      <w:r>
+        <w:rPr>
+          <w:rFonts w:ascii="B Lotus" w:hAnsi="B Lotus" w:cs="B Lotus" w:eastAsia="B Lotus"/>
+          <w:b w:val="0"/>
+          <w:i w:val="0"/>
+          <w:sz w:val="26"/>
+          <w:szCs w:val="26"/>
+        </w:rPr>
+        <w:t>بند اول: مصلحت در لغت و اصطلاح</w:t>
+      </w:r>
+    </w:p>
+    <w:p>
+      <w:pPr>
+        <w:pStyle w:val="TOC4"/>
+      </w:pPr>
+      <w:r>
+        <w:rPr>
+          <w:rFonts w:ascii="B Lotus" w:hAnsi="B Lotus" w:cs="B Lotus" w:eastAsia="B Lotus"/>
+          <w:b w:val="0"/>
+          <w:i w:val="0"/>
+          <w:sz w:val="26"/>
+          <w:szCs w:val="26"/>
+        </w:rPr>
+        <w:t>بند دوم: نسبت مصلحت با ضرورت بین‌المللی</w:t>
+      </w:r>
+    </w:p>
+    <w:p>
+      <w:pPr>
+        <w:pStyle w:val="TOC4"/>
+      </w:pPr>
+      <w:r>
+        <w:rPr>
+          <w:rFonts w:ascii="B Lotus" w:hAnsi="B Lotus" w:cs="B Lotus" w:eastAsia="B Lotus"/>
+          <w:b w:val="0"/>
+          <w:i w:val="0"/>
+          <w:sz w:val="26"/>
+          <w:szCs w:val="26"/>
+        </w:rPr>
+        <w:t>بند سوم: چارچوب نظری پژوهش</w:t>
+      </w:r>
+    </w:p>
+    <w:p>
+      <w:pPr>
+        <w:pStyle w:val="TOC3"/>
+      </w:pPr>
+      <w:r>
+        <w:rPr>
+          <w:rFonts w:ascii="B Lotus" w:hAnsi="B Lotus" w:cs="B Lotus" w:eastAsia="B Lotus"/>
+          <w:b w:val="0"/>
+          <w:i w:val="0"/>
+          <w:sz w:val="26"/>
+          <w:szCs w:val="26"/>
+        </w:rPr>
+        <w:t>گفتار پنجم: پیشینه مفهومی عهد در فقه؛ هدنه، امان، ذمه و صلح</w:t>
+      </w:r>
+    </w:p>
+    <w:p>
+      <w:pPr>
+        <w:pStyle w:val="TOC4"/>
+      </w:pPr>
+      <w:r>
+        <w:rPr>
+          <w:rFonts w:ascii="B Lotus" w:hAnsi="B Lotus" w:cs="B Lotus" w:eastAsia="B Lotus"/>
+          <w:b w:val="0"/>
+          <w:i w:val="0"/>
+          <w:sz w:val="26"/>
+          <w:szCs w:val="26"/>
+        </w:rPr>
+        <w:t>بند اول: چرا پیشینه فقهی لازم است؟</w:t>
+      </w:r>
+    </w:p>
+    <w:p>
+      <w:pPr>
+        <w:pStyle w:val="TOC4"/>
+      </w:pPr>
+      <w:r>
+        <w:rPr>
+          <w:rFonts w:ascii="B Lotus" w:hAnsi="B Lotus" w:cs="B Lotus" w:eastAsia="B Lotus"/>
+          <w:b w:val="0"/>
+          <w:i w:val="0"/>
+          <w:sz w:val="26"/>
+          <w:szCs w:val="26"/>
+        </w:rPr>
+        <w:t>بند دوم: هدنه؛ آتش‌بس موقت</w:t>
+      </w:r>
+    </w:p>
+    <w:p>
+      <w:pPr>
+        <w:pStyle w:val="TOC4"/>
+      </w:pPr>
+      <w:r>
+        <w:rPr>
+          <w:rFonts w:ascii="B Lotus" w:hAnsi="B Lotus" w:cs="B Lotus" w:eastAsia="B Lotus"/>
+          <w:b w:val="0"/>
+          <w:i w:val="0"/>
+          <w:sz w:val="26"/>
+          <w:szCs w:val="26"/>
+        </w:rPr>
+        <w:t>بند سوم: امان؛ تأمین فردی و جمعی</w:t>
+      </w:r>
+    </w:p>
+    <w:p>
+      <w:pPr>
+        <w:pStyle w:val="TOC4"/>
+      </w:pPr>
+      <w:r>
+        <w:rPr>
+          <w:rFonts w:ascii="B Lotus" w:hAnsi="B Lotus" w:cs="B Lotus" w:eastAsia="B Lotus"/>
+          <w:b w:val="0"/>
+          <w:i w:val="0"/>
+          <w:sz w:val="26"/>
+          <w:szCs w:val="26"/>
+        </w:rPr>
+        <w:t>بند چهارم: ذمه و صلح؛ پیمان‌های دائم</w:t>
+      </w:r>
+    </w:p>
+    <w:p>
+      <w:pPr>
+        <w:pStyle w:val="TOC4"/>
+      </w:pPr>
+      <w:r>
+        <w:rPr>
+          <w:rFonts w:ascii="B Lotus" w:hAnsi="B Lotus" w:cs="B Lotus" w:eastAsia="B Lotus"/>
+          <w:b w:val="0"/>
+          <w:i w:val="0"/>
+          <w:sz w:val="26"/>
+          <w:szCs w:val="26"/>
+        </w:rPr>
+        <w:t>بند پنجم: جمع‌بندی؛ از نهادهای کهن تا معاهده مدرن</w:t>
+      </w:r>
+    </w:p>
+    <w:p>
+      <w:pPr>
+        <w:pStyle w:val="TOC3"/>
+      </w:pPr>
+      <w:r>
+        <w:rPr>
+          <w:rFonts w:ascii="B Lotus" w:hAnsi="B Lotus" w:cs="B Lotus" w:eastAsia="B Lotus"/>
+          <w:b w:val="0"/>
+          <w:i w:val="0"/>
+          <w:sz w:val="26"/>
+          <w:szCs w:val="26"/>
+        </w:rPr>
+        <w:t>حاصل فصل اول</w:t>
+      </w:r>
+    </w:p>
+    <w:p>
+      <w:pPr>
+        <w:pStyle w:val="TOC2"/>
+      </w:pPr>
+      <w:r>
+        <w:rPr>
+          <w:rFonts w:ascii="B Lotus" w:hAnsi="B Lotus" w:cs="B Lotus" w:eastAsia="B Lotus"/>
+          <w:b w:val="0"/>
+          <w:i w:val="0"/>
+          <w:sz w:val="26"/>
+          <w:szCs w:val="26"/>
+        </w:rPr>
+        <w:t>فصل دوم: کلیات حقوق معاهدات و قانون اساسی</w:t>
+      </w:r>
+    </w:p>
+    <w:p>
+      <w:pPr>
+        <w:pStyle w:val="TOC3"/>
+      </w:pPr>
+      <w:r>
+        <w:rPr>
+          <w:rFonts w:ascii="B Lotus" w:hAnsi="B Lotus" w:cs="B Lotus" w:eastAsia="B Lotus"/>
+          <w:b w:val="0"/>
+          <w:i w:val="0"/>
+          <w:sz w:val="26"/>
+          <w:szCs w:val="26"/>
+        </w:rPr>
+        <w:t>گفتار اول: تاریخچه و اصول حقوق معاهدات</w:t>
+      </w:r>
+    </w:p>
+    <w:p>
+      <w:pPr>
+        <w:pStyle w:val="TOC4"/>
+      </w:pPr>
+      <w:r>
+        <w:rPr>
+          <w:rFonts w:ascii="B Lotus" w:hAnsi="B Lotus" w:cs="B Lotus" w:eastAsia="B Lotus"/>
+          <w:b w:val="0"/>
+          <w:i w:val="0"/>
+          <w:sz w:val="26"/>
+          <w:szCs w:val="26"/>
+        </w:rPr>
+        <w:t>بند اول: از عرف تا وین؛ تاریخچه‌ای کوتاه</w:t>
+      </w:r>
+    </w:p>
+    <w:p>
+      <w:pPr>
+        <w:pStyle w:val="TOC4"/>
+      </w:pPr>
+      <w:r>
+        <w:rPr>
+          <w:rFonts w:ascii="B Lotus" w:hAnsi="B Lotus" w:cs="B Lotus" w:eastAsia="B Lotus"/>
+          <w:b w:val="0"/>
+          <w:i w:val="0"/>
+          <w:sz w:val="26"/>
+          <w:szCs w:val="26"/>
+        </w:rPr>
+        <w:t>بند دوم: اصل بنیادین؛ پاکتا سونت سرواندا</w:t>
+      </w:r>
+    </w:p>
+    <w:p>
+      <w:pPr>
+        <w:pStyle w:val="TOC4"/>
+      </w:pPr>
+      <w:r>
+        <w:rPr>
+          <w:rFonts w:ascii="B Lotus" w:hAnsi="B Lotus" w:cs="B Lotus" w:eastAsia="B Lotus"/>
+          <w:b w:val="0"/>
+          <w:i w:val="0"/>
+          <w:sz w:val="26"/>
+          <w:szCs w:val="26"/>
+        </w:rPr>
+        <w:t>بند سوم: ماده ۲۷؛ دیوار میان داخلی و بین‌المللی</w:t>
+      </w:r>
+    </w:p>
+    <w:p>
+      <w:pPr>
+        <w:pStyle w:val="TOC3"/>
+      </w:pPr>
+      <w:r>
+        <w:rPr>
+          <w:rFonts w:ascii="B Lotus" w:hAnsi="B Lotus" w:cs="B Lotus" w:eastAsia="B Lotus"/>
+          <w:b w:val="0"/>
+          <w:i w:val="0"/>
+          <w:sz w:val="26"/>
+          <w:szCs w:val="26"/>
+        </w:rPr>
+        <w:t>گفتار دوم: سازوکارهای تعلیق و خاتمه موجه</w:t>
+      </w:r>
+    </w:p>
+    <w:p>
+      <w:pPr>
+        <w:pStyle w:val="TOC4"/>
+      </w:pPr>
+      <w:r>
+        <w:rPr>
+          <w:rFonts w:ascii="B Lotus" w:hAnsi="B Lotus" w:cs="B Lotus" w:eastAsia="B Lotus"/>
+          <w:b w:val="0"/>
+          <w:i w:val="0"/>
+          <w:sz w:val="26"/>
+          <w:szCs w:val="26"/>
+        </w:rPr>
+        <w:t>بند اول: منطق کلی؛ خاتمه فقط از مجرای قانون</w:t>
+      </w:r>
+    </w:p>
+    <w:p>
+      <w:pPr>
+        <w:pStyle w:val="TOC4"/>
+      </w:pPr>
+      <w:r>
+        <w:rPr>
+          <w:rFonts w:ascii="B Lotus" w:hAnsi="B Lotus" w:cs="B Lotus" w:eastAsia="B Lotus"/>
+          <w:b w:val="0"/>
+          <w:i w:val="0"/>
+          <w:sz w:val="26"/>
+          <w:szCs w:val="26"/>
+        </w:rPr>
+        <w:t>بند دوم: توافق اطراف و حق مندرج در متن</w:t>
+      </w:r>
+    </w:p>
+    <w:p>
+      <w:pPr>
+        <w:pStyle w:val="TOC4"/>
+      </w:pPr>
+      <w:r>
+        <w:rPr>
+          <w:rFonts w:ascii="B Lotus" w:hAnsi="B Lotus" w:cs="B Lotus" w:eastAsia="B Lotus"/>
+          <w:b w:val="0"/>
+          <w:i w:val="0"/>
+          <w:sz w:val="26"/>
+          <w:szCs w:val="26"/>
+        </w:rPr>
+        <w:t>بند سوم: نقض اساسی طرف مقابل</w:t>
+      </w:r>
+    </w:p>
+    <w:p>
+      <w:pPr>
+        <w:pStyle w:val="TOC4"/>
+      </w:pPr>
+      <w:r>
+        <w:rPr>
+          <w:rFonts w:ascii="B Lotus" w:hAnsi="B Lotus" w:cs="B Lotus" w:eastAsia="B Lotus"/>
+          <w:b w:val="0"/>
+          <w:i w:val="0"/>
+          <w:sz w:val="26"/>
+          <w:szCs w:val="26"/>
+        </w:rPr>
+        <w:t>بند چهارم: تغییر بنیادین اوضاع</w:t>
+      </w:r>
+    </w:p>
+    <w:p>
+      <w:pPr>
+        <w:pStyle w:val="TOC4"/>
+      </w:pPr>
+      <w:r>
+        <w:rPr>
+          <w:rFonts w:ascii="B Lotus" w:hAnsi="B Lotus" w:cs="B Lotus" w:eastAsia="B Lotus"/>
+          <w:b w:val="0"/>
+          <w:i w:val="0"/>
+          <w:sz w:val="26"/>
+          <w:szCs w:val="26"/>
+        </w:rPr>
+        <w:t>بند پنجم: عدم امکان اجرا و آیین ادعا</w:t>
+      </w:r>
+    </w:p>
+    <w:p>
+      <w:pPr>
+        <w:pStyle w:val="TOC4"/>
+      </w:pPr>
+      <w:r>
+        <w:rPr>
+          <w:rFonts w:ascii="B Lotus" w:hAnsi="B Lotus" w:cs="B Lotus" w:eastAsia="B Lotus"/>
+          <w:b w:val="0"/>
+          <w:i w:val="0"/>
+          <w:sz w:val="26"/>
+          <w:szCs w:val="26"/>
+        </w:rPr>
+        <w:t>بند ششم: حق شرط و اعلامیه تفسیری؛ انعطافِ هنگامِ پذیرش</w:t>
+      </w:r>
+    </w:p>
+    <w:p>
+      <w:pPr>
+        <w:pStyle w:val="TOC3"/>
+      </w:pPr>
+      <w:r>
+        <w:rPr>
+          <w:rFonts w:ascii="B Lotus" w:hAnsi="B Lotus" w:cs="B Lotus" w:eastAsia="B Lotus"/>
+          <w:b w:val="0"/>
+          <w:i w:val="0"/>
+          <w:sz w:val="26"/>
+          <w:szCs w:val="26"/>
+        </w:rPr>
+        <w:t>گفتار سوم: قواعد تفسیر معاهدات؛ فهم متن پیش از عمل</w:t>
+      </w:r>
+    </w:p>
+    <w:p>
+      <w:pPr>
+        <w:pStyle w:val="TOC4"/>
+      </w:pPr>
+      <w:r>
+        <w:rPr>
+          <w:rFonts w:ascii="B Lotus" w:hAnsi="B Lotus" w:cs="B Lotus" w:eastAsia="B Lotus"/>
+          <w:b w:val="0"/>
+          <w:i w:val="0"/>
+          <w:sz w:val="26"/>
+          <w:szCs w:val="26"/>
+        </w:rPr>
+        <w:t>بند اول: قاعده عام تفسیر؛ متن، سیاق، هدف</w:t>
+      </w:r>
+    </w:p>
+    <w:p>
+      <w:pPr>
+        <w:pStyle w:val="TOC4"/>
+      </w:pPr>
+      <w:r>
+        <w:rPr>
+          <w:rFonts w:ascii="B Lotus" w:hAnsi="B Lotus" w:cs="B Lotus" w:eastAsia="B Lotus"/>
+          <w:b w:val="0"/>
+          <w:i w:val="0"/>
+          <w:sz w:val="26"/>
+          <w:szCs w:val="26"/>
+        </w:rPr>
+        <w:t>بند دوم: نقش سوابق انعقاد و رفتار بعدی</w:t>
+      </w:r>
+    </w:p>
+    <w:p>
+      <w:pPr>
+        <w:pStyle w:val="TOC3"/>
+      </w:pPr>
+      <w:r>
+        <w:rPr>
+          <w:rFonts w:ascii="B Lotus" w:hAnsi="B Lotus" w:cs="B Lotus" w:eastAsia="B Lotus"/>
+          <w:b w:val="0"/>
+          <w:i w:val="0"/>
+          <w:sz w:val="26"/>
+          <w:szCs w:val="26"/>
+        </w:rPr>
+        <w:t>گفتار چهارم: اعتبار معاهدات؛ اهلیت، رضایت و عیوب اراده</w:t>
+      </w:r>
+    </w:p>
+    <w:p>
+      <w:pPr>
+        <w:pStyle w:val="TOC4"/>
+      </w:pPr>
+      <w:r>
+        <w:rPr>
+          <w:rFonts w:ascii="B Lotus" w:hAnsi="B Lotus" w:cs="B Lotus" w:eastAsia="B Lotus"/>
+          <w:b w:val="0"/>
+          <w:i w:val="0"/>
+          <w:sz w:val="26"/>
+          <w:szCs w:val="26"/>
+        </w:rPr>
+        <w:t>بند اول: شرایط اعتبار؛ چرا بحث اعتبار به مسئله ما مربوط است؟</w:t>
+      </w:r>
+    </w:p>
+    <w:p>
+      <w:pPr>
+        <w:pStyle w:val="TOC4"/>
+      </w:pPr>
+      <w:r>
+        <w:rPr>
+          <w:rFonts w:ascii="B Lotus" w:hAnsi="B Lotus" w:cs="B Lotus" w:eastAsia="B Lotus"/>
+          <w:b w:val="0"/>
+          <w:i w:val="0"/>
+          <w:sz w:val="26"/>
+          <w:szCs w:val="26"/>
+        </w:rPr>
+        <w:t>بند دوم: اهلیت و صلاحیت انعقاد</w:t>
+      </w:r>
+    </w:p>
+    <w:p>
+      <w:pPr>
+        <w:pStyle w:val="TOC4"/>
+      </w:pPr>
+      <w:r>
+        <w:rPr>
+          <w:rFonts w:ascii="B Lotus" w:hAnsi="B Lotus" w:cs="B Lotus" w:eastAsia="B Lotus"/>
+          <w:b w:val="0"/>
+          <w:i w:val="0"/>
+          <w:sz w:val="26"/>
+          <w:szCs w:val="26"/>
+        </w:rPr>
+        <w:t>بند سوم: عیوب اراده؛ اشتباه، فریب و اجبار</w:t>
+      </w:r>
+    </w:p>
+    <w:p>
+      <w:pPr>
+        <w:pStyle w:val="TOC4"/>
+      </w:pPr>
+      <w:r>
+        <w:rPr>
+          <w:rFonts w:ascii="B Lotus" w:hAnsi="B Lotus" w:cs="B Lotus" w:eastAsia="B Lotus"/>
+          <w:b w:val="0"/>
+          <w:i w:val="0"/>
+          <w:sz w:val="26"/>
+          <w:szCs w:val="26"/>
+        </w:rPr>
+        <w:t>بند چهارم: ثبت معاهدات و اثر آن</w:t>
+      </w:r>
+    </w:p>
+    <w:p>
+      <w:pPr>
+        <w:pStyle w:val="TOC3"/>
+      </w:pPr>
+      <w:r>
+        <w:rPr>
+          <w:rFonts w:ascii="B Lotus" w:hAnsi="B Lotus" w:cs="B Lotus" w:eastAsia="B Lotus"/>
+          <w:b w:val="0"/>
+          <w:i w:val="0"/>
+          <w:sz w:val="26"/>
+          <w:szCs w:val="26"/>
+        </w:rPr>
+        <w:t>گفتار پنجم: اصول قانون اساسی مرتبط</w:t>
+      </w:r>
+    </w:p>
+    <w:p>
+      <w:pPr>
+        <w:pStyle w:val="TOC4"/>
+      </w:pPr>
+      <w:r>
+        <w:rPr>
+          <w:rFonts w:ascii="B Lotus" w:hAnsi="B Lotus" w:cs="B Lotus" w:eastAsia="B Lotus"/>
+          <w:b w:val="0"/>
+          <w:i w:val="0"/>
+          <w:sz w:val="26"/>
+          <w:szCs w:val="26"/>
+        </w:rPr>
+        <w:t>بند اول: اصل ۵؛ تثبیت مرجعیت</w:t>
+      </w:r>
+    </w:p>
+    <w:p>
+      <w:pPr>
+        <w:pStyle w:val="TOC4"/>
+      </w:pPr>
+      <w:r>
+        <w:rPr>
+          <w:rFonts w:ascii="B Lotus" w:hAnsi="B Lotus" w:cs="B Lotus" w:eastAsia="B Lotus"/>
+          <w:b w:val="0"/>
+          <w:i w:val="0"/>
+          <w:sz w:val="26"/>
+          <w:szCs w:val="26"/>
+        </w:rPr>
+        <w:t>بند دوم: اصل ۵۷؛ ولایت مطلقه و قید آن</w:t>
+      </w:r>
+    </w:p>
+    <w:p>
+      <w:pPr>
+        <w:pStyle w:val="TOC4"/>
+      </w:pPr>
+      <w:r>
+        <w:rPr>
+          <w:rFonts w:ascii="B Lotus" w:hAnsi="B Lotus" w:cs="B Lotus" w:eastAsia="B Lotus"/>
+          <w:b w:val="0"/>
+          <w:i w:val="0"/>
+          <w:sz w:val="26"/>
+          <w:szCs w:val="26"/>
+        </w:rPr>
+        <w:t>بند سوم: اصول ۷۷ و ۱۲۵؛ ورود به التزام</w:t>
+      </w:r>
+    </w:p>
+    <w:p>
+      <w:pPr>
+        <w:pStyle w:val="TOC4"/>
+      </w:pPr>
+      <w:r>
+        <w:rPr>
+          <w:rFonts w:ascii="B Lotus" w:hAnsi="B Lotus" w:cs="B Lotus" w:eastAsia="B Lotus"/>
+          <w:b w:val="0"/>
+          <w:i w:val="0"/>
+          <w:sz w:val="26"/>
+          <w:szCs w:val="26"/>
+        </w:rPr>
+        <w:t>بند چهارم: اصول ۱۱۰ و ۱۱۲؛ اختیارات و مصلحت</w:t>
+      </w:r>
+    </w:p>
+    <w:p>
+      <w:pPr>
+        <w:pStyle w:val="TOC4"/>
+      </w:pPr>
+      <w:r>
+        <w:rPr>
+          <w:rFonts w:ascii="B Lotus" w:hAnsi="B Lotus" w:cs="B Lotus" w:eastAsia="B Lotus"/>
+          <w:b w:val="0"/>
+          <w:i w:val="0"/>
+          <w:sz w:val="26"/>
+          <w:szCs w:val="26"/>
+        </w:rPr>
+        <w:t>بند پنجم: اصول ۱۵۲ تا ۱۵۴ و ۱۷۶؛ جهت‌گیری سیاست خارجی</w:t>
+      </w:r>
+    </w:p>
+    <w:p>
+      <w:pPr>
+        <w:pStyle w:val="TOC3"/>
+      </w:pPr>
+      <w:r>
+        <w:rPr>
+          <w:rFonts w:ascii="B Lotus" w:hAnsi="B Lotus" w:cs="B Lotus" w:eastAsia="B Lotus"/>
+          <w:b w:val="0"/>
+          <w:i w:val="0"/>
+          <w:sz w:val="26"/>
+          <w:szCs w:val="26"/>
+        </w:rPr>
+        <w:t>حاصل فصل دوم</w:t>
+      </w:r>
+    </w:p>
+    <w:p>
+      <w:pPr>
+        <w:pStyle w:val="TOC1"/>
+      </w:pPr>
+      <w:r>
+        <w:rPr>
+          <w:rFonts w:ascii="B Lotus" w:hAnsi="B Lotus" w:cs="B Lotus" w:eastAsia="B Lotus"/>
+          <w:b w:val="0"/>
+          <w:i w:val="0"/>
+          <w:sz w:val="26"/>
+          <w:szCs w:val="26"/>
+        </w:rPr>
+        <w:t>بخش دوم: تحلیل فقهی مسئله</w:t>
+      </w:r>
+    </w:p>
+    <w:p>
+      <w:pPr>
+        <w:pStyle w:val="TOC2"/>
+      </w:pPr>
+      <w:r>
+        <w:rPr>
+          <w:rFonts w:ascii="B Lotus" w:hAnsi="B Lotus" w:cs="B Lotus" w:eastAsia="B Lotus"/>
+          <w:b w:val="0"/>
+          <w:i w:val="0"/>
+          <w:sz w:val="26"/>
+          <w:szCs w:val="26"/>
+        </w:rPr>
+        <w:t>فصل سوم: ادله وجوب وفای به عهد</w:t>
+      </w:r>
+    </w:p>
+    <w:p>
+      <w:pPr>
+        <w:pStyle w:val="TOC3"/>
+      </w:pPr>
+      <w:r>
+        <w:rPr>
+          <w:rFonts w:ascii="B Lotus" w:hAnsi="B Lotus" w:cs="B Lotus" w:eastAsia="B Lotus"/>
+          <w:b w:val="0"/>
+          <w:i w:val="0"/>
+          <w:sz w:val="26"/>
+          <w:szCs w:val="26"/>
+        </w:rPr>
+        <w:t>گفتار اول: آیات عام وجوب وفا</w:t>
+      </w:r>
+    </w:p>
+    <w:p>
+      <w:pPr>
+        <w:pStyle w:val="TOC4"/>
+      </w:pPr>
+      <w:r>
+        <w:rPr>
+          <w:rFonts w:ascii="B Lotus" w:hAnsi="B Lotus" w:cs="B Lotus" w:eastAsia="B Lotus"/>
+          <w:b w:val="0"/>
+          <w:i w:val="0"/>
+          <w:sz w:val="26"/>
+          <w:szCs w:val="26"/>
+        </w:rPr>
+        <w:t>بند اول: آیه اوفوا بالعقود؛ امّ ادله</w:t>
+      </w:r>
+    </w:p>
+    <w:p>
+      <w:pPr>
+        <w:pStyle w:val="TOC4"/>
+      </w:pPr>
+      <w:r>
+        <w:rPr>
+          <w:rFonts w:ascii="B Lotus" w:hAnsi="B Lotus" w:cs="B Lotus" w:eastAsia="B Lotus"/>
+          <w:b w:val="0"/>
+          <w:i w:val="0"/>
+          <w:sz w:val="26"/>
+          <w:szCs w:val="26"/>
+        </w:rPr>
+        <w:t>بند دوم: آیات نحل و اسراء و رعد و مؤمنون</w:t>
+      </w:r>
+    </w:p>
+    <w:p>
+      <w:pPr>
+        <w:pStyle w:val="TOC4"/>
+      </w:pPr>
+      <w:r>
+        <w:rPr>
+          <w:rFonts w:ascii="B Lotus" w:hAnsi="B Lotus" w:cs="B Lotus" w:eastAsia="B Lotus"/>
+          <w:b w:val="0"/>
+          <w:i w:val="0"/>
+          <w:sz w:val="26"/>
+          <w:szCs w:val="26"/>
+        </w:rPr>
+        <w:t>بند سوم: دفع یک توهم؛ عموم یا اطلاق؟</w:t>
+      </w:r>
+    </w:p>
+    <w:p>
+      <w:pPr>
+        <w:pStyle w:val="TOC3"/>
+      </w:pPr>
+      <w:r>
+        <w:rPr>
+          <w:rFonts w:ascii="B Lotus" w:hAnsi="B Lotus" w:cs="B Lotus" w:eastAsia="B Lotus"/>
+          <w:b w:val="0"/>
+          <w:i w:val="0"/>
+          <w:sz w:val="26"/>
+          <w:szCs w:val="26"/>
+        </w:rPr>
+        <w:t>گفتار دوم: آیات خاص جهاد و عهدنامه‌ها</w:t>
+      </w:r>
+    </w:p>
+    <w:p>
+      <w:pPr>
+        <w:pStyle w:val="TOC4"/>
+      </w:pPr>
+      <w:r>
+        <w:rPr>
+          <w:rFonts w:ascii="B Lotus" w:hAnsi="B Lotus" w:cs="B Lotus" w:eastAsia="B Lotus"/>
+          <w:b w:val="0"/>
+          <w:i w:val="0"/>
+          <w:sz w:val="26"/>
+          <w:szCs w:val="26"/>
+        </w:rPr>
+        <w:t>بند اول: آیات توبه؛ وفا در برابر استقامت</w:t>
+      </w:r>
+    </w:p>
+    <w:p>
+      <w:pPr>
+        <w:pStyle w:val="TOC4"/>
+      </w:pPr>
+      <w:r>
+        <w:rPr>
+          <w:rFonts w:ascii="B Lotus" w:hAnsi="B Lotus" w:cs="B Lotus" w:eastAsia="B Lotus"/>
+          <w:b w:val="0"/>
+          <w:i w:val="0"/>
+          <w:sz w:val="26"/>
+          <w:szCs w:val="26"/>
+        </w:rPr>
+        <w:t>بند دوم: آیات انفال؛ انباذ و یاری مظلوم</w:t>
+      </w:r>
+    </w:p>
+    <w:p>
+      <w:pPr>
+        <w:pStyle w:val="TOC3"/>
+      </w:pPr>
+      <w:r>
+        <w:rPr>
+          <w:rFonts w:ascii="B Lotus" w:hAnsi="B Lotus" w:cs="B Lotus" w:eastAsia="B Lotus"/>
+          <w:b w:val="0"/>
+          <w:i w:val="0"/>
+          <w:sz w:val="26"/>
+          <w:szCs w:val="26"/>
+        </w:rPr>
+        <w:t>گفتار سوم: روایات وفای به عهد</w:t>
+      </w:r>
+    </w:p>
+    <w:p>
+      <w:pPr>
+        <w:pStyle w:val="TOC4"/>
+      </w:pPr>
+      <w:r>
+        <w:rPr>
+          <w:rFonts w:ascii="B Lotus" w:hAnsi="B Lotus" w:cs="B Lotus" w:eastAsia="B Lotus"/>
+          <w:b w:val="0"/>
+          <w:i w:val="0"/>
+          <w:sz w:val="26"/>
+          <w:szCs w:val="26"/>
+        </w:rPr>
+        <w:t>بند اول: حدیث شروط؛ المؤمنون عند شروطهم</w:t>
+      </w:r>
+    </w:p>
+    <w:p>
+      <w:pPr>
+        <w:pStyle w:val="TOC4"/>
+      </w:pPr>
+      <w:r>
+        <w:rPr>
+          <w:rFonts w:ascii="B Lotus" w:hAnsi="B Lotus" w:cs="B Lotus" w:eastAsia="B Lotus"/>
+          <w:b w:val="0"/>
+          <w:i w:val="0"/>
+          <w:sz w:val="26"/>
+          <w:szCs w:val="26"/>
+        </w:rPr>
+        <w:t>بند دوم: عهدنامه مالک اشتر؛ منشور حکومتی</w:t>
+      </w:r>
+    </w:p>
+    <w:p>
+      <w:pPr>
+        <w:pStyle w:val="TOC4"/>
+      </w:pPr>
+      <w:r>
+        <w:rPr>
+          <w:rFonts w:ascii="B Lotus" w:hAnsi="B Lotus" w:cs="B Lotus" w:eastAsia="B Lotus"/>
+          <w:b w:val="0"/>
+          <w:i w:val="0"/>
+          <w:sz w:val="26"/>
+          <w:szCs w:val="26"/>
+        </w:rPr>
+        <w:t>بند سوم: سایر روایات؛ لعنت بر ناقض</w:t>
+      </w:r>
+    </w:p>
+    <w:p>
+      <w:pPr>
+        <w:pStyle w:val="TOC3"/>
+      </w:pPr>
+      <w:r>
+        <w:rPr>
+          <w:rFonts w:ascii="B Lotus" w:hAnsi="B Lotus" w:cs="B Lotus" w:eastAsia="B Lotus"/>
+          <w:b w:val="0"/>
+          <w:i w:val="0"/>
+          <w:sz w:val="26"/>
+          <w:szCs w:val="26"/>
+        </w:rPr>
+        <w:t>گفتار چهارم: سیره معصومان در عهدنامه‌ها</w:t>
+      </w:r>
+    </w:p>
+    <w:p>
+      <w:pPr>
+        <w:pStyle w:val="TOC4"/>
+      </w:pPr>
+      <w:r>
+        <w:rPr>
+          <w:rFonts w:ascii="B Lotus" w:hAnsi="B Lotus" w:cs="B Lotus" w:eastAsia="B Lotus"/>
+          <w:b w:val="0"/>
+          <w:i w:val="0"/>
+          <w:sz w:val="26"/>
+          <w:szCs w:val="26"/>
+        </w:rPr>
+        <w:t>بند اول: صلح حدیبیه؛ الگوی صبر حکومتی</w:t>
+      </w:r>
+    </w:p>
+    <w:p>
+      <w:pPr>
+        <w:pStyle w:val="TOC4"/>
+      </w:pPr>
+      <w:r>
+        <w:rPr>
+          <w:rFonts w:ascii="B Lotus" w:hAnsi="B Lotus" w:cs="B Lotus" w:eastAsia="B Lotus"/>
+          <w:b w:val="0"/>
+          <w:i w:val="0"/>
+          <w:sz w:val="26"/>
+          <w:szCs w:val="26"/>
+        </w:rPr>
+        <w:t>بند دوم: فتح مکه و برائت؛ عدولِ موجهِ قرآنی</w:t>
+      </w:r>
+    </w:p>
+    <w:p>
+      <w:pPr>
+        <w:pStyle w:val="TOC4"/>
+      </w:pPr>
+      <w:r>
+        <w:rPr>
+          <w:rFonts w:ascii="B Lotus" w:hAnsi="B Lotus" w:cs="B Lotus" w:eastAsia="B Lotus"/>
+          <w:b w:val="0"/>
+          <w:i w:val="0"/>
+          <w:sz w:val="26"/>
+          <w:szCs w:val="26"/>
+        </w:rPr>
+        <w:t>بند سوم: سیره امیرالمؤمنین؛ از صفین تا حکمیت</w:t>
+      </w:r>
+    </w:p>
+    <w:p>
+      <w:pPr>
+        <w:pStyle w:val="TOC4"/>
+      </w:pPr>
+      <w:r>
+        <w:rPr>
+          <w:rFonts w:ascii="B Lotus" w:hAnsi="B Lotus" w:cs="B Lotus" w:eastAsia="B Lotus"/>
+          <w:b w:val="0"/>
+          <w:i w:val="0"/>
+          <w:sz w:val="26"/>
+          <w:szCs w:val="26"/>
+        </w:rPr>
+        <w:t>بند چهارم: جمع‌بندی سیره؛ سه الگو</w:t>
+      </w:r>
+    </w:p>
+    <w:p>
+      <w:pPr>
+        <w:pStyle w:val="TOC3"/>
+      </w:pPr>
+      <w:r>
+        <w:rPr>
+          <w:rFonts w:ascii="B Lotus" w:hAnsi="B Lotus" w:cs="B Lotus" w:eastAsia="B Lotus"/>
+          <w:b w:val="0"/>
+          <w:i w:val="0"/>
+          <w:sz w:val="26"/>
+          <w:szCs w:val="26"/>
+        </w:rPr>
+        <w:t>گفتار پنجم: دلیل عقل و بنای عقلا</w:t>
+      </w:r>
+    </w:p>
+    <w:p>
+      <w:pPr>
+        <w:pStyle w:val="TOC4"/>
+      </w:pPr>
+      <w:r>
+        <w:rPr>
+          <w:rFonts w:ascii="B Lotus" w:hAnsi="B Lotus" w:cs="B Lotus" w:eastAsia="B Lotus"/>
+          <w:b w:val="0"/>
+          <w:i w:val="0"/>
+          <w:sz w:val="26"/>
+          <w:szCs w:val="26"/>
+        </w:rPr>
+        <w:t>بند اول: حکم عقل به قبح نقض عهد</w:t>
+      </w:r>
+    </w:p>
+    <w:p>
+      <w:pPr>
+        <w:pStyle w:val="TOC4"/>
+      </w:pPr>
+      <w:r>
+        <w:rPr>
+          <w:rFonts w:ascii="B Lotus" w:hAnsi="B Lotus" w:cs="B Lotus" w:eastAsia="B Lotus"/>
+          <w:b w:val="0"/>
+          <w:i w:val="0"/>
+          <w:sz w:val="26"/>
+          <w:szCs w:val="26"/>
+        </w:rPr>
+        <w:t>بند دوم: بنای عقلا؛ از بازار تا سازمان ملل</w:t>
+      </w:r>
+    </w:p>
+    <w:p>
+      <w:pPr>
+        <w:pStyle w:val="TOC3"/>
+      </w:pPr>
+      <w:r>
+        <w:rPr>
+          <w:rFonts w:ascii="B Lotus" w:hAnsi="B Lotus" w:cs="B Lotus" w:eastAsia="B Lotus"/>
+          <w:b w:val="0"/>
+          <w:i w:val="0"/>
+          <w:sz w:val="26"/>
+          <w:szCs w:val="26"/>
+        </w:rPr>
+        <w:t>گفتار ششم: قواعد فقهی مؤید وجوب وفا</w:t>
+      </w:r>
+    </w:p>
+    <w:p>
+      <w:pPr>
+        <w:pStyle w:val="TOC4"/>
+      </w:pPr>
+      <w:r>
+        <w:rPr>
+          <w:rFonts w:ascii="B Lotus" w:hAnsi="B Lotus" w:cs="B Lotus" w:eastAsia="B Lotus"/>
+          <w:b w:val="0"/>
+          <w:i w:val="0"/>
+          <w:sz w:val="26"/>
+          <w:szCs w:val="26"/>
+        </w:rPr>
+        <w:t>بند اول: اصالة اللزوم در عقود</w:t>
+      </w:r>
+    </w:p>
+    <w:p>
+      <w:pPr>
+        <w:pStyle w:val="TOC4"/>
+      </w:pPr>
+      <w:r>
+        <w:rPr>
+          <w:rFonts w:ascii="B Lotus" w:hAnsi="B Lotus" w:cs="B Lotus" w:eastAsia="B Lotus"/>
+          <w:b w:val="0"/>
+          <w:i w:val="0"/>
+          <w:sz w:val="26"/>
+          <w:szCs w:val="26"/>
+        </w:rPr>
+        <w:t>بند دوم: حرمت غدر و خیانت؛ مرز اخلاقی</w:t>
+      </w:r>
+    </w:p>
+    <w:p>
+      <w:pPr>
+        <w:pStyle w:val="TOC4"/>
+      </w:pPr>
+      <w:r>
+        <w:rPr>
+          <w:rFonts w:ascii="B Lotus" w:hAnsi="B Lotus" w:cs="B Lotus" w:eastAsia="B Lotus"/>
+          <w:b w:val="0"/>
+          <w:i w:val="0"/>
+          <w:sz w:val="26"/>
+          <w:szCs w:val="26"/>
+        </w:rPr>
+        <w:t>بند سوم: قاعده نفی سبیل؛ مرز دیگر وفا</w:t>
+      </w:r>
+    </w:p>
+    <w:p>
+      <w:pPr>
+        <w:pStyle w:val="TOC3"/>
+      </w:pPr>
+      <w:r>
+        <w:rPr>
+          <w:rFonts w:ascii="B Lotus" w:hAnsi="B Lotus" w:cs="B Lotus" w:eastAsia="B Lotus"/>
+          <w:b w:val="0"/>
+          <w:i w:val="0"/>
+          <w:sz w:val="26"/>
+          <w:szCs w:val="26"/>
+        </w:rPr>
+        <w:t>گفتار هفتم: ادله تکمیلی؛ امانت، سوگند و آرای فقها</w:t>
+      </w:r>
+    </w:p>
+    <w:p>
+      <w:pPr>
+        <w:pStyle w:val="TOC4"/>
+      </w:pPr>
+      <w:r>
+        <w:rPr>
+          <w:rFonts w:ascii="B Lotus" w:hAnsi="B Lotus" w:cs="B Lotus" w:eastAsia="B Lotus"/>
+          <w:b w:val="0"/>
+          <w:i w:val="0"/>
+          <w:sz w:val="26"/>
+          <w:szCs w:val="26"/>
+        </w:rPr>
+        <w:t>بند اول: ادای امانت؛ نساء/۵۸</w:t>
+      </w:r>
+    </w:p>
+    <w:p>
+      <w:pPr>
+        <w:pStyle w:val="TOC4"/>
+      </w:pPr>
+      <w:r>
+        <w:rPr>
+          <w:rFonts w:ascii="B Lotus" w:hAnsi="B Lotus" w:cs="B Lotus" w:eastAsia="B Lotus"/>
+          <w:b w:val="0"/>
+          <w:i w:val="0"/>
+          <w:sz w:val="26"/>
+          <w:szCs w:val="26"/>
+        </w:rPr>
+        <w:t>بند دوم: حفظ سوگند؛ مائده/۸۹</w:t>
+      </w:r>
+    </w:p>
+    <w:p>
+      <w:pPr>
+        <w:pStyle w:val="TOC4"/>
+      </w:pPr>
+      <w:r>
+        <w:rPr>
+          <w:rFonts w:ascii="B Lotus" w:hAnsi="B Lotus" w:cs="B Lotus" w:eastAsia="B Lotus"/>
+          <w:b w:val="0"/>
+          <w:i w:val="0"/>
+          <w:sz w:val="26"/>
+          <w:szCs w:val="26"/>
+        </w:rPr>
+        <w:t>بند سوم: نشانه منافق؛ وعده‌خلافی</w:t>
+      </w:r>
+    </w:p>
+    <w:p>
+      <w:pPr>
+        <w:pStyle w:val="TOC4"/>
+      </w:pPr>
+      <w:r>
+        <w:rPr>
+          <w:rFonts w:ascii="B Lotus" w:hAnsi="B Lotus" w:cs="B Lotus" w:eastAsia="B Lotus"/>
+          <w:b w:val="0"/>
+          <w:i w:val="0"/>
+          <w:sz w:val="26"/>
+          <w:szCs w:val="26"/>
+        </w:rPr>
+        <w:t>بند چهارم: میثاق مدینه و عهدنامه نجران؛ دو الگوی حکومتی</w:t>
+      </w:r>
+    </w:p>
+    <w:p>
+      <w:pPr>
+        <w:pStyle w:val="TOC4"/>
+      </w:pPr>
+      <w:r>
+        <w:rPr>
+          <w:rFonts w:ascii="B Lotus" w:hAnsi="B Lotus" w:cs="B Lotus" w:eastAsia="B Lotus"/>
+          <w:b w:val="0"/>
+          <w:i w:val="0"/>
+          <w:sz w:val="26"/>
+          <w:szCs w:val="26"/>
+        </w:rPr>
+        <w:t>بند پنجم: آرای فقها؛ از جواهر تا تحریر</w:t>
+      </w:r>
+    </w:p>
+    <w:p>
+      <w:pPr>
+        <w:pStyle w:val="TOC3"/>
+      </w:pPr>
+      <w:r>
+        <w:rPr>
+          <w:rFonts w:ascii="B Lotus" w:hAnsi="B Lotus" w:cs="B Lotus" w:eastAsia="B Lotus"/>
+          <w:b w:val="0"/>
+          <w:i w:val="0"/>
+          <w:sz w:val="26"/>
+          <w:szCs w:val="26"/>
+        </w:rPr>
+        <w:t>گفتار هشتم: واژه‌شناسی قرآنی؛ عهد، عقد، میثاق و وعد</w:t>
+      </w:r>
+    </w:p>
+    <w:p>
+      <w:pPr>
+        <w:pStyle w:val="TOC4"/>
+      </w:pPr>
+      <w:r>
+        <w:rPr>
+          <w:rFonts w:ascii="B Lotus" w:hAnsi="B Lotus" w:cs="B Lotus" w:eastAsia="B Lotus"/>
+          <w:b w:val="0"/>
+          <w:i w:val="0"/>
+          <w:sz w:val="26"/>
+          <w:szCs w:val="26"/>
+        </w:rPr>
+        <w:t>بند اول: چرا واژه‌شناسی؟</w:t>
+      </w:r>
+    </w:p>
+    <w:p>
+      <w:pPr>
+        <w:pStyle w:val="TOC4"/>
+      </w:pPr>
+      <w:r>
+        <w:rPr>
+          <w:rFonts w:ascii="B Lotus" w:hAnsi="B Lotus" w:cs="B Lotus" w:eastAsia="B Lotus"/>
+          <w:b w:val="0"/>
+          <w:i w:val="0"/>
+          <w:sz w:val="26"/>
+          <w:szCs w:val="26"/>
+        </w:rPr>
+        <w:t>بند دوم: عهد و عقد؛ التزام و گره</w:t>
+      </w:r>
+    </w:p>
+    <w:p>
+      <w:pPr>
+        <w:pStyle w:val="TOC4"/>
+      </w:pPr>
+      <w:r>
+        <w:rPr>
+          <w:rFonts w:ascii="B Lotus" w:hAnsi="B Lotus" w:cs="B Lotus" w:eastAsia="B Lotus"/>
+          <w:b w:val="0"/>
+          <w:i w:val="0"/>
+          <w:sz w:val="26"/>
+          <w:szCs w:val="26"/>
+        </w:rPr>
+        <w:t>بند سوم: میثاق و وعد؛ پیمانِ محکم و وعده</w:t>
+      </w:r>
+    </w:p>
+    <w:p>
+      <w:pPr>
+        <w:pStyle w:val="TOC4"/>
+      </w:pPr>
+      <w:r>
+        <w:rPr>
+          <w:rFonts w:ascii="B Lotus" w:hAnsi="B Lotus" w:cs="B Lotus" w:eastAsia="B Lotus"/>
+          <w:b w:val="0"/>
+          <w:i w:val="0"/>
+          <w:sz w:val="26"/>
+          <w:szCs w:val="26"/>
+        </w:rPr>
+        <w:t>بند چهارم: ایمان و ذمه؛ سوگند و عهده</w:t>
+      </w:r>
+    </w:p>
+    <w:p>
+      <w:pPr>
+        <w:pStyle w:val="TOC3"/>
+      </w:pPr>
+      <w:r>
+        <w:rPr>
+          <w:rFonts w:ascii="B Lotus" w:hAnsi="B Lotus" w:cs="B Lotus" w:eastAsia="B Lotus"/>
+          <w:b w:val="0"/>
+          <w:i w:val="0"/>
+          <w:sz w:val="26"/>
+          <w:szCs w:val="26"/>
+        </w:rPr>
+        <w:t>حاصل فصل سوم</w:t>
+      </w:r>
+    </w:p>
+    <w:p>
+      <w:pPr>
+        <w:pStyle w:val="TOC2"/>
+      </w:pPr>
+      <w:r>
+        <w:rPr>
+          <w:rFonts w:ascii="B Lotus" w:hAnsi="B Lotus" w:cs="B Lotus" w:eastAsia="B Lotus"/>
+          <w:b w:val="0"/>
+          <w:i w:val="0"/>
+          <w:sz w:val="26"/>
+          <w:szCs w:val="26"/>
+        </w:rPr>
+        <w:t>فصل چهارم: مبانی جواز عدول و ضوابط آن</w:t>
+      </w:r>
+    </w:p>
+    <w:p>
+      <w:pPr>
+        <w:pStyle w:val="TOC3"/>
+      </w:pPr>
+      <w:r>
+        <w:rPr>
+          <w:rFonts w:ascii="B Lotus" w:hAnsi="B Lotus" w:cs="B Lotus" w:eastAsia="B Lotus"/>
+          <w:b w:val="0"/>
+          <w:i w:val="0"/>
+          <w:sz w:val="26"/>
+          <w:szCs w:val="26"/>
+        </w:rPr>
+        <w:t>گفتار اول: قاعده تزاحم؛ قلب تپنده استدلال</w:t>
+      </w:r>
+    </w:p>
+    <w:p>
+      <w:pPr>
+        <w:pStyle w:val="TOC4"/>
+      </w:pPr>
+      <w:r>
+        <w:rPr>
+          <w:rFonts w:ascii="B Lotus" w:hAnsi="B Lotus" w:cs="B Lotus" w:eastAsia="B Lotus"/>
+          <w:b w:val="0"/>
+          <w:i w:val="0"/>
+          <w:sz w:val="26"/>
+          <w:szCs w:val="26"/>
+        </w:rPr>
+        <w:t>بند اول: تعارض و تزاحم؛ فرقی که سرنوشت‌ساز است</w:t>
+      </w:r>
+    </w:p>
+    <w:p>
+      <w:pPr>
+        <w:pStyle w:val="TOC4"/>
+      </w:pPr>
+      <w:r>
+        <w:rPr>
+          <w:rFonts w:ascii="B Lotus" w:hAnsi="B Lotus" w:cs="B Lotus" w:eastAsia="B Lotus"/>
+          <w:b w:val="0"/>
+          <w:i w:val="0"/>
+          <w:sz w:val="26"/>
+          <w:szCs w:val="26"/>
+        </w:rPr>
+        <w:t>بند دوم: شرایط تحقق تزاحم در مسئله ما</w:t>
+      </w:r>
+    </w:p>
+    <w:p>
+      <w:pPr>
+        <w:pStyle w:val="TOC4"/>
+      </w:pPr>
+      <w:r>
+        <w:rPr>
+          <w:rFonts w:ascii="B Lotus" w:hAnsi="B Lotus" w:cs="B Lotus" w:eastAsia="B Lotus"/>
+          <w:b w:val="0"/>
+          <w:i w:val="0"/>
+          <w:sz w:val="26"/>
+          <w:szCs w:val="26"/>
+        </w:rPr>
+        <w:t>بند سوم: پاسخ به اشکال مقدّر؛ آیا تزاحم در احکام حکومتی جاری است؟</w:t>
+      </w:r>
+    </w:p>
+    <w:p>
+      <w:pPr>
+        <w:pStyle w:val="TOC3"/>
+      </w:pPr>
+      <w:r>
+        <w:rPr>
+          <w:rFonts w:ascii="B Lotus" w:hAnsi="B Lotus" w:cs="B Lotus" w:eastAsia="B Lotus"/>
+          <w:b w:val="0"/>
+          <w:i w:val="0"/>
+          <w:sz w:val="26"/>
+          <w:szCs w:val="26"/>
+        </w:rPr>
+        <w:t>گفتار دوم: حکم حکومتی؛ ابزار حل تزاحم</w:t>
+      </w:r>
+    </w:p>
+    <w:p>
+      <w:pPr>
+        <w:pStyle w:val="TOC4"/>
+      </w:pPr>
+      <w:r>
+        <w:rPr>
+          <w:rFonts w:ascii="B Lotus" w:hAnsi="B Lotus" w:cs="B Lotus" w:eastAsia="B Lotus"/>
+          <w:b w:val="0"/>
+          <w:i w:val="0"/>
+          <w:sz w:val="26"/>
+          <w:szCs w:val="26"/>
+        </w:rPr>
+        <w:t>بند اول: نظریه حکم حکومتی امام خمینی</w:t>
+      </w:r>
+    </w:p>
+    <w:p>
+      <w:pPr>
+        <w:pStyle w:val="TOC4"/>
+      </w:pPr>
+      <w:r>
+        <w:rPr>
+          <w:rFonts w:ascii="B Lotus" w:hAnsi="B Lotus" w:cs="B Lotus" w:eastAsia="B Lotus"/>
+          <w:b w:val="0"/>
+          <w:i w:val="0"/>
+          <w:sz w:val="26"/>
+          <w:szCs w:val="26"/>
+        </w:rPr>
+        <w:t>بند دوم: شرایط حکم حکومتی در مسئله ما</w:t>
+      </w:r>
+    </w:p>
+    <w:p>
+      <w:pPr>
+        <w:pStyle w:val="TOC4"/>
+      </w:pPr>
+      <w:r>
+        <w:rPr>
+          <w:rFonts w:ascii="B Lotus" w:hAnsi="B Lotus" w:cs="B Lotus" w:eastAsia="B Lotus"/>
+          <w:b w:val="0"/>
+          <w:i w:val="0"/>
+          <w:sz w:val="26"/>
+          <w:szCs w:val="26"/>
+        </w:rPr>
+        <w:t>بند سوم: پاسخ به اشکال مقدّر؛ آیا حکم حکومتی شامل تعهدات بین‌المللی می‌شود؟</w:t>
+      </w:r>
+    </w:p>
+    <w:p>
+      <w:pPr>
+        <w:pStyle w:val="TOC3"/>
+      </w:pPr>
+      <w:r>
+        <w:rPr>
+          <w:rFonts w:ascii="B Lotus" w:hAnsi="B Lotus" w:cs="B Lotus" w:eastAsia="B Lotus"/>
+          <w:b w:val="0"/>
+          <w:i w:val="0"/>
+          <w:sz w:val="26"/>
+          <w:szCs w:val="26"/>
+        </w:rPr>
+        <w:t>گفتار سوم: قواعد نفی ضرر و حرج و مصلحت نظام</w:t>
+      </w:r>
+    </w:p>
+    <w:p>
+      <w:pPr>
+        <w:pStyle w:val="TOC4"/>
+      </w:pPr>
+      <w:r>
+        <w:rPr>
+          <w:rFonts w:ascii="B Lotus" w:hAnsi="B Lotus" w:cs="B Lotus" w:eastAsia="B Lotus"/>
+          <w:b w:val="0"/>
+          <w:i w:val="0"/>
+          <w:sz w:val="26"/>
+          <w:szCs w:val="26"/>
+        </w:rPr>
+        <w:t>بند اول: قاعده لاضرر؛ ضرر به نظام، ضرر به امت است</w:t>
+      </w:r>
+    </w:p>
+    <w:p>
+      <w:pPr>
+        <w:pStyle w:val="TOC4"/>
+      </w:pPr>
+      <w:r>
+        <w:rPr>
+          <w:rFonts w:ascii="B Lotus" w:hAnsi="B Lotus" w:cs="B Lotus" w:eastAsia="B Lotus"/>
+          <w:b w:val="0"/>
+          <w:i w:val="0"/>
+          <w:sz w:val="26"/>
+          <w:szCs w:val="26"/>
+        </w:rPr>
+        <w:t>بند دوم: قاعده لاحرج؛ حرج اداره کشور</w:t>
+      </w:r>
+    </w:p>
+    <w:p>
+      <w:pPr>
+        <w:pStyle w:val="TOC4"/>
+      </w:pPr>
+      <w:r>
+        <w:rPr>
+          <w:rFonts w:ascii="B Lotus" w:hAnsi="B Lotus" w:cs="B Lotus" w:eastAsia="B Lotus"/>
+          <w:b w:val="0"/>
+          <w:i w:val="0"/>
+          <w:sz w:val="26"/>
+          <w:szCs w:val="26"/>
+        </w:rPr>
+        <w:t>بند سوم: مصلحت نظام؛ اوجب واجبات</w:t>
+      </w:r>
+    </w:p>
+    <w:p>
+      <w:pPr>
+        <w:pStyle w:val="TOC3"/>
+      </w:pPr>
+      <w:r>
+        <w:rPr>
+          <w:rFonts w:ascii="B Lotus" w:hAnsi="B Lotus" w:cs="B Lotus" w:eastAsia="B Lotus"/>
+          <w:b w:val="0"/>
+          <w:i w:val="0"/>
+          <w:sz w:val="26"/>
+          <w:szCs w:val="26"/>
+        </w:rPr>
+        <w:t>گفتار چهارم: ضوابط هشت‌گانه عدول حکومتی</w:t>
+      </w:r>
+    </w:p>
+    <w:p>
+      <w:pPr>
+        <w:pStyle w:val="TOC4"/>
+      </w:pPr>
+      <w:r>
+        <w:rPr>
+          <w:rFonts w:ascii="B Lotus" w:hAnsi="B Lotus" w:cs="B Lotus" w:eastAsia="B Lotus"/>
+          <w:b w:val="0"/>
+          <w:i w:val="0"/>
+          <w:sz w:val="26"/>
+          <w:szCs w:val="26"/>
+        </w:rPr>
+        <w:t>بند اول: ضابطه اول تا سوم؛ تزاحم، تقدم راه حقوقی، تشخیص ولی فقیه</w:t>
+      </w:r>
+    </w:p>
+    <w:p>
+      <w:pPr>
+        <w:pStyle w:val="TOC4"/>
+      </w:pPr>
+      <w:r>
+        <w:rPr>
+          <w:rFonts w:ascii="B Lotus" w:hAnsi="B Lotus" w:cs="B Lotus" w:eastAsia="B Lotus"/>
+          <w:b w:val="0"/>
+          <w:i w:val="0"/>
+          <w:sz w:val="26"/>
+          <w:szCs w:val="26"/>
+        </w:rPr>
+        <w:t>بند دوم: ضابطه چهارم تا ششم؛ تناسب، موقت بودن، انباذ</w:t>
+      </w:r>
+    </w:p>
+    <w:p>
+      <w:pPr>
+        <w:pStyle w:val="TOC4"/>
+      </w:pPr>
+      <w:r>
+        <w:rPr>
+          <w:rFonts w:ascii="B Lotus" w:hAnsi="B Lotus" w:cs="B Lotus" w:eastAsia="B Lotus"/>
+          <w:b w:val="0"/>
+          <w:i w:val="0"/>
+          <w:sz w:val="26"/>
+          <w:szCs w:val="26"/>
+        </w:rPr>
+        <w:t>بند سوم: ضابطه هفتم و هشتم؛ قواعد آمره و لحاظ آثار</w:t>
+      </w:r>
+    </w:p>
+    <w:p>
+      <w:pPr>
+        <w:pStyle w:val="TOC3"/>
+      </w:pPr>
+      <w:r>
+        <w:rPr>
+          <w:rFonts w:ascii="B Lotus" w:hAnsi="B Lotus" w:cs="B Lotus" w:eastAsia="B Lotus"/>
+          <w:b w:val="0"/>
+          <w:i w:val="0"/>
+          <w:sz w:val="26"/>
+          <w:szCs w:val="26"/>
+        </w:rPr>
+        <w:t>گفتار پنجم: دفع اشکالات مقدّر؛ آزمون استحکام</w:t>
+      </w:r>
+    </w:p>
+    <w:p>
+      <w:pPr>
+        <w:pStyle w:val="TOC4"/>
+      </w:pPr>
+      <w:r>
+        <w:rPr>
+          <w:rFonts w:ascii="B Lotus" w:hAnsi="B Lotus" w:cs="B Lotus" w:eastAsia="B Lotus"/>
+          <w:b w:val="0"/>
+          <w:i w:val="0"/>
+          <w:sz w:val="26"/>
+          <w:szCs w:val="26"/>
+        </w:rPr>
+        <w:t>بند اول: آیا تقدیم مصلحت بر نص، تعطیل نص نیست؟</w:t>
+      </w:r>
+    </w:p>
+    <w:p>
+      <w:pPr>
+        <w:pStyle w:val="TOC4"/>
+      </w:pPr>
+      <w:r>
+        <w:rPr>
+          <w:rFonts w:ascii="B Lotus" w:hAnsi="B Lotus" w:cs="B Lotus" w:eastAsia="B Lotus"/>
+          <w:b w:val="0"/>
+          <w:i w:val="0"/>
+          <w:sz w:val="26"/>
+          <w:szCs w:val="26"/>
+        </w:rPr>
+        <w:t>بند دوم: آیا این راه به توجیه هر عهدشکنی نمی‌انجامد؟</w:t>
+      </w:r>
+    </w:p>
+    <w:p>
+      <w:pPr>
+        <w:pStyle w:val="TOC4"/>
+      </w:pPr>
+      <w:r>
+        <w:rPr>
+          <w:rFonts w:ascii="B Lotus" w:hAnsi="B Lotus" w:cs="B Lotus" w:eastAsia="B Lotus"/>
+          <w:b w:val="0"/>
+          <w:i w:val="0"/>
+          <w:sz w:val="26"/>
+          <w:szCs w:val="26"/>
+        </w:rPr>
+        <w:t>بند سوم: آیا حاکم در دعوای خودش داور است؟</w:t>
+      </w:r>
+    </w:p>
+    <w:p>
+      <w:pPr>
+        <w:pStyle w:val="TOC3"/>
+      </w:pPr>
+      <w:r>
+        <w:rPr>
+          <w:rFonts w:ascii="B Lotus" w:hAnsi="B Lotus" w:cs="B Lotus" w:eastAsia="B Lotus"/>
+          <w:b w:val="0"/>
+          <w:i w:val="0"/>
+          <w:sz w:val="26"/>
+          <w:szCs w:val="26"/>
+        </w:rPr>
+        <w:t>گفتار ششم: پیشینه نظری؛ از نراقی تا امام خمینی</w:t>
+      </w:r>
+    </w:p>
+    <w:p>
+      <w:pPr>
+        <w:pStyle w:val="TOC4"/>
+      </w:pPr>
+      <w:r>
+        <w:rPr>
+          <w:rFonts w:ascii="B Lotus" w:hAnsi="B Lotus" w:cs="B Lotus" w:eastAsia="B Lotus"/>
+          <w:b w:val="0"/>
+          <w:i w:val="0"/>
+          <w:sz w:val="26"/>
+          <w:szCs w:val="26"/>
+        </w:rPr>
+        <w:t>بند اول: نراقی و تأسیس بحث ولایت فقیه</w:t>
+      </w:r>
+    </w:p>
+    <w:p>
+      <w:pPr>
+        <w:pStyle w:val="TOC4"/>
+      </w:pPr>
+      <w:r>
+        <w:rPr>
+          <w:rFonts w:ascii="B Lotus" w:hAnsi="B Lotus" w:cs="B Lotus" w:eastAsia="B Lotus"/>
+          <w:b w:val="0"/>
+          <w:i w:val="0"/>
+          <w:sz w:val="26"/>
+          <w:szCs w:val="26"/>
+        </w:rPr>
+        <w:t>بند دوم: نائینی و دولت مشروطه؛ تجربه تلخ و درس شیرین</w:t>
+      </w:r>
+    </w:p>
+    <w:p>
+      <w:pPr>
+        <w:pStyle w:val="TOC4"/>
+      </w:pPr>
+      <w:r>
+        <w:rPr>
+          <w:rFonts w:ascii="B Lotus" w:hAnsi="B Lotus" w:cs="B Lotus" w:eastAsia="B Lotus"/>
+          <w:b w:val="0"/>
+          <w:i w:val="0"/>
+          <w:sz w:val="26"/>
+          <w:szCs w:val="26"/>
+        </w:rPr>
+        <w:t>بند سوم: امام خمینی؛ از کشف اسرار تا صحیفه</w:t>
+      </w:r>
+    </w:p>
+    <w:p>
+      <w:pPr>
+        <w:pStyle w:val="TOC4"/>
+      </w:pPr>
+      <w:r>
+        <w:rPr>
+          <w:rFonts w:ascii="B Lotus" w:hAnsi="B Lotus" w:cs="B Lotus" w:eastAsia="B Lotus"/>
+          <w:b w:val="0"/>
+          <w:i w:val="0"/>
+          <w:sz w:val="26"/>
+          <w:szCs w:val="26"/>
+        </w:rPr>
+        <w:t>بند چهارم: صلح امام حسن؛ بزرگ‌ترین الگوی مصلحت‌سنجی حکومتی</w:t>
+      </w:r>
+    </w:p>
+    <w:p>
+      <w:pPr>
+        <w:pStyle w:val="TOC4"/>
+      </w:pPr>
+      <w:r>
+        <w:rPr>
+          <w:rFonts w:ascii="B Lotus" w:hAnsi="B Lotus" w:cs="B Lotus" w:eastAsia="B Lotus"/>
+          <w:b w:val="0"/>
+          <w:i w:val="0"/>
+          <w:sz w:val="26"/>
+          <w:szCs w:val="26"/>
+        </w:rPr>
+        <w:t>بند پنجم: مراتب تزاحم؛ اهم، مهم و محتمل‌الاهمیه</w:t>
+      </w:r>
+    </w:p>
+    <w:p>
+      <w:pPr>
+        <w:pStyle w:val="TOC3"/>
+      </w:pPr>
+      <w:r>
+        <w:rPr>
+          <w:rFonts w:ascii="B Lotus" w:hAnsi="B Lotus" w:cs="B Lotus" w:eastAsia="B Lotus"/>
+          <w:b w:val="0"/>
+          <w:i w:val="0"/>
+          <w:sz w:val="26"/>
+          <w:szCs w:val="26"/>
+        </w:rPr>
+        <w:t>حاصل فصل چهارم</w:t>
+      </w:r>
+    </w:p>
+    <w:p>
+      <w:pPr>
+        <w:pStyle w:val="TOC1"/>
+      </w:pPr>
+      <w:r>
+        <w:rPr>
+          <w:rFonts w:ascii="B Lotus" w:hAnsi="B Lotus" w:cs="B Lotus" w:eastAsia="B Lotus"/>
+          <w:b w:val="0"/>
+          <w:i w:val="0"/>
+          <w:sz w:val="26"/>
+          <w:szCs w:val="26"/>
+        </w:rPr>
+        <w:t>بخش سوم: تحلیل حقوقی مسئله</w:t>
+      </w:r>
+    </w:p>
+    <w:p>
+      <w:pPr>
+        <w:pStyle w:val="TOC2"/>
+      </w:pPr>
+      <w:r>
+        <w:rPr>
+          <w:rFonts w:ascii="B Lotus" w:hAnsi="B Lotus" w:cs="B Lotus" w:eastAsia="B Lotus"/>
+          <w:b w:val="0"/>
+          <w:i w:val="0"/>
+          <w:sz w:val="26"/>
+          <w:szCs w:val="26"/>
+        </w:rPr>
+        <w:t>فصل پنجم: مسئولیت بین‌المللی دولت و جایگاه حقوق اساسی تصمیم</w:t>
+      </w:r>
+    </w:p>
+    <w:p>
+      <w:pPr>
+        <w:pStyle w:val="TOC3"/>
+      </w:pPr>
+      <w:r>
+        <w:rPr>
+          <w:rFonts w:ascii="B Lotus" w:hAnsi="B Lotus" w:cs="B Lotus" w:eastAsia="B Lotus"/>
+          <w:b w:val="0"/>
+          <w:i w:val="0"/>
+          <w:sz w:val="26"/>
+          <w:szCs w:val="26"/>
+        </w:rPr>
+        <w:t>گفتار اول: چارچوب مسئولیت بین‌المللی دولت‌ها</w:t>
+      </w:r>
+    </w:p>
+    <w:p>
+      <w:pPr>
+        <w:pStyle w:val="TOC4"/>
+      </w:pPr>
+      <w:r>
+        <w:rPr>
+          <w:rFonts w:ascii="B Lotus" w:hAnsi="B Lotus" w:cs="B Lotus" w:eastAsia="B Lotus"/>
+          <w:b w:val="0"/>
+          <w:i w:val="0"/>
+          <w:sz w:val="26"/>
+          <w:szCs w:val="26"/>
+        </w:rPr>
+        <w:t>بند اول: تاریخچه تدوین؛ از آگو تا کرافورد</w:t>
+      </w:r>
+    </w:p>
+    <w:p>
+      <w:pPr>
+        <w:pStyle w:val="TOC4"/>
+      </w:pPr>
+      <w:r>
+        <w:rPr>
+          <w:rFonts w:ascii="B Lotus" w:hAnsi="B Lotus" w:cs="B Lotus" w:eastAsia="B Lotus"/>
+          <w:b w:val="0"/>
+          <w:i w:val="0"/>
+          <w:sz w:val="26"/>
+          <w:szCs w:val="26"/>
+        </w:rPr>
+        <w:t>بند دوم: جایگاه عرفی کنوانسیون وین و رویه دیوان</w:t>
+      </w:r>
+    </w:p>
+    <w:p>
+      <w:pPr>
+        <w:pStyle w:val="TOC4"/>
+      </w:pPr>
+      <w:r>
+        <w:rPr>
+          <w:rFonts w:ascii="B Lotus" w:hAnsi="B Lotus" w:cs="B Lotus" w:eastAsia="B Lotus"/>
+          <w:b w:val="0"/>
+          <w:i w:val="0"/>
+          <w:sz w:val="26"/>
+          <w:szCs w:val="26"/>
+        </w:rPr>
+        <w:t>بند سوم: ارکان عمل متخلفانه؛ انتساب و نقض</w:t>
+      </w:r>
+    </w:p>
+    <w:p>
+      <w:pPr>
+        <w:pStyle w:val="TOC3"/>
+      </w:pPr>
+      <w:r>
+        <w:rPr>
+          <w:rFonts w:ascii="B Lotus" w:hAnsi="B Lotus" w:cs="B Lotus" w:eastAsia="B Lotus"/>
+          <w:b w:val="0"/>
+          <w:i w:val="0"/>
+          <w:sz w:val="26"/>
+          <w:szCs w:val="26"/>
+        </w:rPr>
+        <w:t>گفتار دوم: انتساب تصمیم ولی فقیه به دولت ایران</w:t>
+      </w:r>
+    </w:p>
+    <w:p>
+      <w:pPr>
+        <w:pStyle w:val="TOC4"/>
+      </w:pPr>
+      <w:r>
+        <w:rPr>
+          <w:rFonts w:ascii="B Lotus" w:hAnsi="B Lotus" w:cs="B Lotus" w:eastAsia="B Lotus"/>
+          <w:b w:val="0"/>
+          <w:i w:val="0"/>
+          <w:sz w:val="26"/>
+          <w:szCs w:val="26"/>
+        </w:rPr>
+        <w:t>بند اول: قاعده انتساب رفتار ارکان دولت</w:t>
+      </w:r>
+    </w:p>
+    <w:p>
+      <w:pPr>
+        <w:pStyle w:val="TOC4"/>
+      </w:pPr>
+      <w:r>
+        <w:rPr>
+          <w:rFonts w:ascii="B Lotus" w:hAnsi="B Lotus" w:cs="B Lotus" w:eastAsia="B Lotus"/>
+          <w:b w:val="0"/>
+          <w:i w:val="0"/>
+          <w:sz w:val="26"/>
+          <w:szCs w:val="26"/>
+        </w:rPr>
+        <w:t>بند دوم: تطبیق قاعده بر تصمیم ولی فقیه</w:t>
+      </w:r>
+    </w:p>
+    <w:p>
+      <w:pPr>
+        <w:pStyle w:val="TOC3"/>
+      </w:pPr>
+      <w:r>
+        <w:rPr>
+          <w:rFonts w:ascii="B Lotus" w:hAnsi="B Lotus" w:cs="B Lotus" w:eastAsia="B Lotus"/>
+          <w:b w:val="0"/>
+          <w:i w:val="0"/>
+          <w:sz w:val="26"/>
+          <w:szCs w:val="26"/>
+        </w:rPr>
+        <w:t>گفتار سوم: نقض تعهد و تفکیک سه‌گانه سطوح تحلیل</w:t>
+      </w:r>
+    </w:p>
+    <w:p>
+      <w:pPr>
+        <w:pStyle w:val="TOC4"/>
+      </w:pPr>
+      <w:r>
+        <w:rPr>
+          <w:rFonts w:ascii="B Lotus" w:hAnsi="B Lotus" w:cs="B Lotus" w:eastAsia="B Lotus"/>
+          <w:b w:val="0"/>
+          <w:i w:val="0"/>
+          <w:sz w:val="26"/>
+          <w:szCs w:val="26"/>
+        </w:rPr>
+        <w:t>بند اول: تحقق نقض و اقسام آن</w:t>
+      </w:r>
+    </w:p>
+    <w:p>
+      <w:pPr>
+        <w:pStyle w:val="TOC4"/>
+      </w:pPr>
+      <w:r>
+        <w:rPr>
+          <w:rFonts w:ascii="B Lotus" w:hAnsi="B Lotus" w:cs="B Lotus" w:eastAsia="B Lotus"/>
+          <w:b w:val="0"/>
+          <w:i w:val="0"/>
+          <w:sz w:val="26"/>
+          <w:szCs w:val="26"/>
+        </w:rPr>
+        <w:t>بند دوم: تفکیک جواز فقهی، مشروعیت داخلی و مسئولیت بین‌المللی</w:t>
+      </w:r>
+    </w:p>
+    <w:p>
+      <w:pPr>
+        <w:pStyle w:val="TOC3"/>
+      </w:pPr>
+      <w:r>
+        <w:rPr>
+          <w:rFonts w:ascii="B Lotus" w:hAnsi="B Lotus" w:cs="B Lotus" w:eastAsia="B Lotus"/>
+          <w:b w:val="0"/>
+          <w:i w:val="0"/>
+          <w:sz w:val="26"/>
+          <w:szCs w:val="26"/>
+        </w:rPr>
+        <w:t>گفتار چهارم: اسباب رافع، آثار مسئولیت و راهبردهای کاهش آن</w:t>
+      </w:r>
+    </w:p>
+    <w:p>
+      <w:pPr>
+        <w:pStyle w:val="TOC4"/>
+      </w:pPr>
+      <w:r>
+        <w:rPr>
+          <w:rFonts w:ascii="B Lotus" w:hAnsi="B Lotus" w:cs="B Lotus" w:eastAsia="B Lotus"/>
+          <w:b w:val="0"/>
+          <w:i w:val="0"/>
+          <w:sz w:val="26"/>
+          <w:szCs w:val="26"/>
+        </w:rPr>
+        <w:t>بند اول: اسباب رافع وصف متخلفانه</w:t>
+      </w:r>
+    </w:p>
+    <w:p>
+      <w:pPr>
+        <w:pStyle w:val="TOC4"/>
+      </w:pPr>
+      <w:r>
+        <w:rPr>
+          <w:rFonts w:ascii="B Lotus" w:hAnsi="B Lotus" w:cs="B Lotus" w:eastAsia="B Lotus"/>
+          <w:b w:val="0"/>
+          <w:i w:val="0"/>
+          <w:sz w:val="26"/>
+          <w:szCs w:val="26"/>
+        </w:rPr>
+        <w:t>بند دوم: آثار مسئولیت؛ توقف، جبران و حل‌وفصل اختلاف</w:t>
+      </w:r>
+    </w:p>
+    <w:p>
+      <w:pPr>
+        <w:pStyle w:val="TOC4"/>
+      </w:pPr>
+      <w:r>
+        <w:rPr>
+          <w:rFonts w:ascii="B Lotus" w:hAnsi="B Lotus" w:cs="B Lotus" w:eastAsia="B Lotus"/>
+          <w:b w:val="0"/>
+          <w:i w:val="0"/>
+          <w:sz w:val="26"/>
+          <w:szCs w:val="26"/>
+        </w:rPr>
+        <w:t>بند سوم: راهبردهای حقوقی کاهش مسئولیت</w:t>
+      </w:r>
+    </w:p>
+    <w:p>
+      <w:pPr>
+        <w:pStyle w:val="TOC4"/>
+      </w:pPr>
+      <w:r>
+        <w:rPr>
+          <w:rFonts w:ascii="B Lotus" w:hAnsi="B Lotus" w:cs="B Lotus" w:eastAsia="B Lotus"/>
+          <w:b w:val="0"/>
+          <w:i w:val="0"/>
+          <w:sz w:val="26"/>
+          <w:szCs w:val="26"/>
+        </w:rPr>
+        <w:t>بند چهارم: شرایط اقدام متقابل و جبران در رویه</w:t>
+      </w:r>
+    </w:p>
+    <w:p>
+      <w:pPr>
+        <w:pStyle w:val="TOC4"/>
+      </w:pPr>
+      <w:r>
+        <w:rPr>
+          <w:rFonts w:ascii="B Lotus" w:hAnsi="B Lotus" w:cs="B Lotus" w:eastAsia="B Lotus"/>
+          <w:b w:val="0"/>
+          <w:i w:val="0"/>
+          <w:sz w:val="26"/>
+          <w:szCs w:val="26"/>
+        </w:rPr>
+        <w:t>بند پنجم: نمونه تحلیلی؛ تجربه برجام</w:t>
+      </w:r>
+    </w:p>
+    <w:p>
+      <w:pPr>
+        <w:pStyle w:val="TOC4"/>
+      </w:pPr>
+      <w:r>
+        <w:rPr>
+          <w:rFonts w:ascii="B Lotus" w:hAnsi="B Lotus" w:cs="B Lotus" w:eastAsia="B Lotus"/>
+          <w:b w:val="0"/>
+          <w:i w:val="0"/>
+          <w:sz w:val="26"/>
+          <w:szCs w:val="26"/>
+        </w:rPr>
+        <w:t>بند ششم: تجربه تطبیقی؛ خروج از معاهدات در عمل دولت‌ها</w:t>
+      </w:r>
+    </w:p>
+    <w:p>
+      <w:pPr>
+        <w:pStyle w:val="TOC3"/>
+      </w:pPr>
+      <w:r>
+        <w:rPr>
+          <w:rFonts w:ascii="B Lotus" w:hAnsi="B Lotus" w:cs="B Lotus" w:eastAsia="B Lotus"/>
+          <w:b w:val="0"/>
+          <w:i w:val="0"/>
+          <w:sz w:val="26"/>
+          <w:szCs w:val="26"/>
+        </w:rPr>
+        <w:t>گفتار پنجم: جایگاه حقوق اساسی تصمیم ولی فقیه</w:t>
+      </w:r>
+    </w:p>
+    <w:p>
+      <w:pPr>
+        <w:pStyle w:val="TOC4"/>
+      </w:pPr>
+      <w:r>
+        <w:rPr>
+          <w:rFonts w:ascii="B Lotus" w:hAnsi="B Lotus" w:cs="B Lotus" w:eastAsia="B Lotus"/>
+          <w:b w:val="0"/>
+          <w:i w:val="0"/>
+          <w:sz w:val="26"/>
+          <w:szCs w:val="26"/>
+        </w:rPr>
+        <w:t>بند اول: تحلیل اصول ۵، ۵۷، ۷۷، ۱۱۲ و ۱۲۵</w:t>
+      </w:r>
+    </w:p>
+    <w:p>
+      <w:pPr>
+        <w:pStyle w:val="TOC4"/>
+      </w:pPr>
+      <w:r>
+        <w:rPr>
+          <w:rFonts w:ascii="B Lotus" w:hAnsi="B Lotus" w:cs="B Lotus" w:eastAsia="B Lotus"/>
+          <w:b w:val="0"/>
+          <w:i w:val="0"/>
+          <w:sz w:val="26"/>
+          <w:szCs w:val="26"/>
+        </w:rPr>
+        <w:t>بند دوم: اصول ۱۰۷ تا ۱۱۱؛ نصب، شرایط و نظارت</w:t>
+      </w:r>
+    </w:p>
+    <w:p>
+      <w:pPr>
+        <w:pStyle w:val="TOC4"/>
+      </w:pPr>
+      <w:r>
+        <w:rPr>
+          <w:rFonts w:ascii="B Lotus" w:hAnsi="B Lotus" w:cs="B Lotus" w:eastAsia="B Lotus"/>
+          <w:b w:val="0"/>
+          <w:i w:val="0"/>
+          <w:sz w:val="26"/>
+          <w:szCs w:val="26"/>
+        </w:rPr>
+        <w:t>بند سوم: سیاست‌های کلی نظام؛ حلقه واسطِ رهبری و معاهدات</w:t>
+      </w:r>
+    </w:p>
+    <w:p>
+      <w:pPr>
+        <w:pStyle w:val="TOC4"/>
+      </w:pPr>
+      <w:r>
+        <w:rPr>
+          <w:rFonts w:ascii="B Lotus" w:hAnsi="B Lotus" w:cs="B Lotus" w:eastAsia="B Lotus"/>
+          <w:b w:val="0"/>
+          <w:i w:val="0"/>
+          <w:sz w:val="26"/>
+          <w:szCs w:val="26"/>
+        </w:rPr>
+        <w:t>بند چهارم: تحلیل اصل ۱۱۰؛ نقد ادعای حصر و تفکیک انواع اختیار</w:t>
+      </w:r>
+    </w:p>
+    <w:p>
+      <w:pPr>
+        <w:pStyle w:val="TOC3"/>
+      </w:pPr>
+      <w:r>
+        <w:rPr>
+          <w:rFonts w:ascii="B Lotus" w:hAnsi="B Lotus" w:cs="B Lotus" w:eastAsia="B Lotus"/>
+          <w:b w:val="0"/>
+          <w:i w:val="0"/>
+          <w:sz w:val="26"/>
+          <w:szCs w:val="26"/>
+        </w:rPr>
+        <w:t>حاصل فصل پنجم</w:t>
+      </w:r>
+    </w:p>
+    <w:p>
+      <w:pPr>
+        <w:pStyle w:val="TOC2"/>
+      </w:pPr>
+      <w:r>
+        <w:rPr>
+          <w:rFonts w:ascii="B Lotus" w:hAnsi="B Lotus" w:cs="B Lotus" w:eastAsia="B Lotus"/>
+          <w:b w:val="0"/>
+          <w:i w:val="0"/>
+          <w:sz w:val="26"/>
+          <w:szCs w:val="26"/>
+        </w:rPr>
+        <w:t>نتیجه‌گیری</w:t>
+      </w:r>
+    </w:p>
+    <w:p>
+      <w:pPr>
+        <w:pStyle w:val="TOC3"/>
+      </w:pPr>
+      <w:r>
+        <w:rPr>
+          <w:rFonts w:ascii="B Lotus" w:hAnsi="B Lotus" w:cs="B Lotus" w:eastAsia="B Lotus"/>
+          <w:b w:val="0"/>
+          <w:i w:val="0"/>
+          <w:sz w:val="26"/>
+          <w:szCs w:val="26"/>
+        </w:rPr>
+        <w:t>دستاورد اول: قاعده اولی، وجوب وفاست</w:t>
+      </w:r>
+    </w:p>
+    <w:p>
+      <w:pPr>
+        <w:pStyle w:val="TOC3"/>
+      </w:pPr>
+      <w:r>
+        <w:rPr>
+          <w:rFonts w:ascii="B Lotus" w:hAnsi="B Lotus" w:cs="B Lotus" w:eastAsia="B Lotus"/>
+          <w:b w:val="0"/>
+          <w:i w:val="0"/>
+          <w:sz w:val="26"/>
+          <w:szCs w:val="26"/>
+        </w:rPr>
+        <w:t>دستاورد دوم: استثنای ضابطه‌مند، عدول حکومتی است</w:t>
+      </w:r>
+    </w:p>
+    <w:p>
+      <w:pPr>
+        <w:pStyle w:val="TOC3"/>
+      </w:pPr>
+      <w:r>
+        <w:rPr>
+          <w:rFonts w:ascii="B Lotus" w:hAnsi="B Lotus" w:cs="B Lotus" w:eastAsia="B Lotus"/>
+          <w:b w:val="0"/>
+          <w:i w:val="0"/>
+          <w:sz w:val="26"/>
+          <w:szCs w:val="26"/>
+        </w:rPr>
+        <w:t>دستاورد سوم: ضوابط هشت‌گانه، مهار جواز است</w:t>
+      </w:r>
+    </w:p>
+    <w:p>
+      <w:pPr>
+        <w:pStyle w:val="TOC3"/>
+      </w:pPr>
+      <w:r>
+        <w:rPr>
+          <w:rFonts w:ascii="B Lotus" w:hAnsi="B Lotus" w:cs="B Lotus" w:eastAsia="B Lotus"/>
+          <w:b w:val="0"/>
+          <w:i w:val="0"/>
+          <w:sz w:val="26"/>
+          <w:szCs w:val="26"/>
+        </w:rPr>
+        <w:t>دستاورد چهارم: سه سطح را قاطی نکنیم</w:t>
+      </w:r>
+    </w:p>
+    <w:p>
+      <w:pPr>
+        <w:pStyle w:val="TOC3"/>
+      </w:pPr>
+      <w:r>
+        <w:rPr>
+          <w:rFonts w:ascii="B Lotus" w:hAnsi="B Lotus" w:cs="B Lotus" w:eastAsia="B Lotus"/>
+          <w:b w:val="0"/>
+          <w:i w:val="0"/>
+          <w:sz w:val="26"/>
+          <w:szCs w:val="26"/>
+        </w:rPr>
+        <w:t>دستاورد پنجم: قانون اساسی کف است نه سقف</w:t>
+      </w:r>
+    </w:p>
+    <w:p>
+      <w:pPr>
+        <w:pStyle w:val="TOC3"/>
+      </w:pPr>
+      <w:r>
+        <w:rPr>
+          <w:rFonts w:ascii="B Lotus" w:hAnsi="B Lotus" w:cs="B Lotus" w:eastAsia="B Lotus"/>
+          <w:b w:val="0"/>
+          <w:i w:val="0"/>
+          <w:sz w:val="26"/>
+          <w:szCs w:val="26"/>
+        </w:rPr>
+        <w:t>نوآوری‌ها و پیشنهادها</w:t>
+      </w:r>
+    </w:p>
+    <w:p>
+      <w:pPr>
+        <w:pStyle w:val="TOC3"/>
+      </w:pPr>
+      <w:r>
+        <w:rPr>
+          <w:rFonts w:ascii="B Lotus" w:hAnsi="B Lotus" w:cs="B Lotus" w:eastAsia="B Lotus"/>
+          <w:b w:val="0"/>
+          <w:i w:val="0"/>
+          <w:sz w:val="26"/>
+          <w:szCs w:val="26"/>
+        </w:rPr>
+        <w:t>پاسخ کوتاه به سؤال‌های فرعی؛ جمع‌بندی برای دفاع</w:t>
+      </w:r>
+    </w:p>
+    <w:p>
+      <w:pPr>
+        <w:pStyle w:val="TOC3"/>
+      </w:pPr>
+      <w:r>
+        <w:rPr>
+          <w:rFonts w:ascii="B Lotus" w:hAnsi="B Lotus" w:cs="B Lotus" w:eastAsia="B Lotus"/>
+          <w:b w:val="0"/>
+          <w:i w:val="0"/>
+          <w:sz w:val="26"/>
+          <w:szCs w:val="26"/>
+        </w:rPr>
+        <w:t>مسیر آینده؛ از رساله تا نظام‌سازی</w:t>
+      </w:r>
+    </w:p>
+    <w:p>
+      <w:pPr>
+        <w:pStyle w:val="TOC2"/>
+      </w:pPr>
+      <w:r>
+        <w:rPr>
+          <w:rFonts w:ascii="B Lotus" w:hAnsi="B Lotus" w:cs="B Lotus" w:eastAsia="B Lotus"/>
+          <w:b w:val="0"/>
+          <w:i w:val="0"/>
+          <w:sz w:val="26"/>
+          <w:szCs w:val="26"/>
+        </w:rPr>
+        <w:t>فهرست منابع</w:t>
+      </w:r>
+    </w:p>
+    <w:p>
+      <w:pPr>
+        <w:pStyle w:val="TOC3"/>
+      </w:pPr>
+      <w:r>
+        <w:rPr>
+          <w:rFonts w:ascii="B Lotus" w:hAnsi="B Lotus" w:cs="B Lotus" w:eastAsia="B Lotus"/>
+          <w:b w:val="0"/>
+          <w:i w:val="0"/>
+          <w:sz w:val="26"/>
+          <w:szCs w:val="26"/>
+        </w:rPr>
+        <w:t>قرآن کریم و تفاسیر</w:t>
+      </w:r>
+    </w:p>
+    <w:p>
+      <w:pPr>
+        <w:pStyle w:val="TOC3"/>
+      </w:pPr>
+      <w:r>
+        <w:rPr>
+          <w:rFonts w:ascii="B Lotus" w:hAnsi="B Lotus" w:cs="B Lotus" w:eastAsia="B Lotus"/>
+          <w:b w:val="0"/>
+          <w:i w:val="0"/>
+          <w:sz w:val="26"/>
+          <w:szCs w:val="26"/>
+        </w:rPr>
+        <w:t>جوامع حدیثی و نهج‌البلاغه</w:t>
+      </w:r>
+    </w:p>
+    <w:p>
+      <w:pPr>
+        <w:pStyle w:val="TOC3"/>
+      </w:pPr>
+      <w:r>
+        <w:rPr>
+          <w:rFonts w:ascii="B Lotus" w:hAnsi="B Lotus" w:cs="B Lotus" w:eastAsia="B Lotus"/>
+          <w:b w:val="0"/>
+          <w:i w:val="0"/>
+          <w:sz w:val="26"/>
+          <w:szCs w:val="26"/>
+        </w:rPr>
+        <w:t>کتب فقهی و اصولی</w:t>
+      </w:r>
+    </w:p>
+    <w:p>
+      <w:pPr>
+        <w:pStyle w:val="TOC3"/>
+      </w:pPr>
+      <w:r>
+        <w:rPr>
+          <w:rFonts w:ascii="B Lotus" w:hAnsi="B Lotus" w:cs="B Lotus" w:eastAsia="B Lotus"/>
+          <w:b w:val="0"/>
+          <w:i w:val="0"/>
+          <w:sz w:val="26"/>
+          <w:szCs w:val="26"/>
+        </w:rPr>
+        <w:t>فقه سیاسی، ولایت فقیه و حکومت اسلامی</w:t>
+      </w:r>
+    </w:p>
+    <w:p>
+      <w:pPr>
+        <w:pStyle w:val="TOC3"/>
+      </w:pPr>
+      <w:r>
+        <w:rPr>
+          <w:rFonts w:ascii="B Lotus" w:hAnsi="B Lotus" w:cs="B Lotus" w:eastAsia="B Lotus"/>
+          <w:b w:val="0"/>
+          <w:i w:val="0"/>
+          <w:sz w:val="26"/>
+          <w:szCs w:val="26"/>
+        </w:rPr>
+        <w:t>قانون اساسی و اسناد حقوقی داخلی</w:t>
+      </w:r>
+    </w:p>
+    <w:p>
+      <w:pPr>
+        <w:pStyle w:val="TOC3"/>
+      </w:pPr>
+      <w:r>
+        <w:rPr>
+          <w:rFonts w:ascii="B Lotus" w:hAnsi="B Lotus" w:cs="B Lotus" w:eastAsia="B Lotus"/>
+          <w:b w:val="0"/>
+          <w:i w:val="0"/>
+          <w:sz w:val="26"/>
+          <w:szCs w:val="26"/>
+        </w:rPr>
+        <w:t>اسناد بین‌المللی</w:t>
+      </w:r>
+    </w:p>
+    <w:p>
+      <w:pPr>
+        <w:pStyle w:val="TOC3"/>
+      </w:pPr>
+      <w:r>
+        <w:rPr>
+          <w:rFonts w:ascii="B Lotus" w:hAnsi="B Lotus" w:cs="B Lotus" w:eastAsia="B Lotus"/>
+          <w:b w:val="0"/>
+          <w:i w:val="0"/>
+          <w:sz w:val="26"/>
+          <w:szCs w:val="26"/>
+        </w:rPr>
+        <w:t>کتب و مقالات حقوقی (فارسی و عربی)</w:t>
+      </w:r>
+    </w:p>
+    <w:p>
+      <w:pPr>
+        <w:pStyle w:val="TOC3"/>
+      </w:pPr>
+      <w:r>
+        <w:rPr>
+          <w:rFonts w:ascii="B Lotus" w:hAnsi="B Lotus" w:cs="B Lotus" w:eastAsia="B Lotus"/>
+          <w:b w:val="0"/>
+          <w:i w:val="0"/>
+          <w:sz w:val="26"/>
+          <w:szCs w:val="26"/>
+        </w:rPr>
+        <w:t>یادداشت‌های کتاب‌شناختی؛ راهنمای خواننده</w:t>
+      </w:r>
+    </w:p>
+    <w:p>
+      <w:pPr>
+        <w:pStyle w:val="TOC3"/>
+      </w:pPr>
+      <w:r>
+        <w:rPr>
+          <w:rFonts w:ascii="B Lotus" w:hAnsi="B Lotus" w:cs="B Lotus" w:eastAsia="B Lotus"/>
+          <w:b w:val="0"/>
+          <w:i w:val="0"/>
+          <w:sz w:val="26"/>
+          <w:szCs w:val="26"/>
+        </w:rPr>
+        <w:t>پایگاه‌های اینترنتی</w:t>
+      </w:r>
+    </w:p>
+    <w:p>
+      <w:pPr>
+        <w:pStyle w:val="TOC2"/>
+      </w:pPr>
+      <w:r>
+        <w:rPr>
+          <w:rFonts w:ascii="B Lotus" w:hAnsi="B Lotus" w:cs="B Lotus" w:eastAsia="B Lotus"/>
+          <w:b w:val="0"/>
+          <w:i w:val="0"/>
+          <w:sz w:val="26"/>
+          <w:szCs w:val="26"/>
+        </w:rPr>
+        <w:t>پیوست‌ها</w:t>
+      </w:r>
+    </w:p>
+    <w:p>
+      <w:pPr>
+        <w:pStyle w:val="TOC3"/>
+      </w:pPr>
+      <w:r>
+        <w:rPr>
+          <w:rFonts w:ascii="B Lotus" w:hAnsi="B Lotus" w:cs="B Lotus" w:eastAsia="B Lotus"/>
+          <w:b w:val="0"/>
+          <w:i w:val="0"/>
+          <w:sz w:val="26"/>
+          <w:szCs w:val="26"/>
+        </w:rPr>
+        <w:t>پیوست اول: چک‌لیست عملی تصمیم‌گیری درباره عدول از تعهد بین‌المللی</w:t>
+      </w:r>
+    </w:p>
+    <w:p>
+      <w:pPr>
+        <w:pStyle w:val="TOC3"/>
+      </w:pPr>
+      <w:r>
+        <w:rPr>
+          <w:rFonts w:ascii="B Lotus" w:hAnsi="B Lotus" w:cs="B Lotus" w:eastAsia="B Lotus"/>
+          <w:b w:val="0"/>
+          <w:i w:val="0"/>
+          <w:sz w:val="26"/>
+          <w:szCs w:val="26"/>
+        </w:rPr>
+        <w:t>پیوست دوم: متن اصول قانون اساسی مرتبط</w:t>
+      </w:r>
+    </w:p>
+    <w:p>
+      <w:pPr>
+        <w:pStyle w:val="TOC3"/>
+      </w:pPr>
+      <w:r>
+        <w:rPr>
+          <w:rFonts w:ascii="B Lotus" w:hAnsi="B Lotus" w:cs="B Lotus" w:eastAsia="B Lotus"/>
+          <w:b w:val="0"/>
+          <w:i w:val="0"/>
+          <w:sz w:val="26"/>
+          <w:szCs w:val="26"/>
+        </w:rPr>
+        <w:t>پیوست سوم: متن مواد کلیدی کنوانسیون وین (ترجمه فارسی)</w:t>
+      </w:r>
+    </w:p>
+    <w:p>
+      <w:pPr>
+        <w:pStyle w:val="TOC3"/>
+      </w:pPr>
+      <w:r>
+        <w:rPr>
+          <w:rFonts w:ascii="B Lotus" w:hAnsi="B Lotus" w:cs="B Lotus" w:eastAsia="B Lotus"/>
+          <w:b w:val="0"/>
+          <w:i w:val="0"/>
+          <w:sz w:val="26"/>
+          <w:szCs w:val="26"/>
+        </w:rPr>
+        <w:t>پیوست چهارم: گاه‌شمار تحولات حقوق معاهدات و موضوع پژوهش</w:t>
+      </w:r>
+    </w:p>
+    <w:p>
+      <w:pPr>
+        <w:pStyle w:val="TOC3"/>
+      </w:pPr>
+      <w:r>
+        <w:rPr>
+          <w:rFonts w:ascii="B Lotus" w:hAnsi="B Lotus" w:cs="B Lotus" w:eastAsia="B Lotus"/>
+          <w:b w:val="0"/>
+          <w:i w:val="0"/>
+          <w:sz w:val="26"/>
+          <w:szCs w:val="26"/>
+        </w:rPr>
+        <w:t>پیوست پنجم: گزیده عهدنامه مالک اشتر (متن و ترجمه)</w:t>
+      </w:r>
+    </w:p>
+    <w:p>
+      <w:pPr>
+        <w:pStyle w:val="TOC3"/>
+      </w:pPr>
+      <w:r>
+        <w:rPr>
+          <w:rFonts w:ascii="B Lotus" w:hAnsi="B Lotus" w:cs="B Lotus" w:eastAsia="B Lotus"/>
+          <w:b w:val="0"/>
+          <w:i w:val="0"/>
+          <w:sz w:val="26"/>
+          <w:szCs w:val="26"/>
+        </w:rPr>
+        <w:t>پیوست ششم: واژه‌نامه فارسی ـ عربی ـ انگلیسی</w:t>
+      </w:r>
+    </w:p>
+    <w:p>
+      <w:pPr>
+        <w:widowControl/>
+        <w:bidi w:val="1"/>
+        <w:spacing w:before="0" w:after="200" w:line="336" w:lineRule="auto"/>
+        <w:jc w:val="right"/>
+      </w:pPr>
       <w:r>
         <w:rPr>
           <w:rFonts w:ascii="B Lotus" w:hAnsi="B Lotus" w:cs="B Lotus" w:eastAsia="B Lotus"/>
@@ -1115,7 +3797,7 @@
           <w:sz w:val="22"/>
           <w:szCs w:val="22"/>
         </w:rPr>
-        <w:t>راهنما: اگر فهرست کامل نمایش داده نشد، روی آن کلیک راست کرده و «Update Field» و سپس «Update entire table» را بزنید؛ سپس این جمله را حذف کنید.</w:t>
+        <w:t>راهنما: شماره صفحه‌ها با باز شدن فایل در Word خودکار کامل می‌شود؛ اگر نشد، روی فهرست کلیک راست کرده و «Update Field» و سپس «Update entire table» را بزنید؛ سپس این جمله را حذف کنید.</w:t>
       </w:r>
     </w:p>
     <w:p>

</xml_diff>